<commit_message>
trying to set ref.docx
</commit_message>
<xml_diff>
--- a/manuscript/manuscript.docx
+++ b/manuscript/manuscript.docx
@@ -150,1897 +150,7 @@
     </w:sdt>
     <w:p>
       <w:pPr>
-        <w:pStyle w:val="SourceCode"/>
-      </w:pPr>
-      <w:r>
-        <w:br/>
-      </w:r>
-      <w:r>
-        <w:rPr>
-          <w:rStyle w:val="VerbatimChar"/>
-        </w:rPr>
-        <w:t xml:space="preserve">SAMPLING FOR MODEL 'anon_model' NOW (CHAIN 1).</w:t>
-      </w:r>
-      <w:r>
-        <w:br/>
-      </w:r>
-      <w:r>
-        <w:rPr>
-          <w:rStyle w:val="VerbatimChar"/>
-        </w:rPr>
-        <w:t xml:space="preserve">Chain 1: </w:t>
-      </w:r>
-      <w:r>
-        <w:br/>
-      </w:r>
-      <w:r>
-        <w:rPr>
-          <w:rStyle w:val="VerbatimChar"/>
-        </w:rPr>
-        <w:t xml:space="preserve">Chain 1: Gradient evaluation took 3.8e-05 seconds</w:t>
-      </w:r>
-      <w:r>
-        <w:br/>
-      </w:r>
-      <w:r>
-        <w:rPr>
-          <w:rStyle w:val="VerbatimChar"/>
-        </w:rPr>
-        <w:t xml:space="preserve">Chain 1: 1000 transitions using 10 leapfrog steps per transition would take 0.38 seconds.</w:t>
-      </w:r>
-      <w:r>
-        <w:br/>
-      </w:r>
-      <w:r>
-        <w:rPr>
-          <w:rStyle w:val="VerbatimChar"/>
-        </w:rPr>
-        <w:t xml:space="preserve">Chain 1: Adjust your expectations accordingly!</w:t>
-      </w:r>
-      <w:r>
-        <w:br/>
-      </w:r>
-      <w:r>
-        <w:rPr>
-          <w:rStyle w:val="VerbatimChar"/>
-        </w:rPr>
-        <w:t xml:space="preserve">Chain 1: </w:t>
-      </w:r>
-      <w:r>
-        <w:br/>
-      </w:r>
-      <w:r>
-        <w:rPr>
-          <w:rStyle w:val="VerbatimChar"/>
-        </w:rPr>
-        <w:t xml:space="preserve">Chain 1: </w:t>
-      </w:r>
-      <w:r>
-        <w:br/>
-      </w:r>
-      <w:r>
-        <w:rPr>
-          <w:rStyle w:val="VerbatimChar"/>
-        </w:rPr>
-        <w:t xml:space="preserve">Chain 1: Iteration:    1 / 4000 [  0%]  (Warmup)</w:t>
-      </w:r>
-      <w:r>
-        <w:br/>
-      </w:r>
-      <w:r>
-        <w:rPr>
-          <w:rStyle w:val="VerbatimChar"/>
-        </w:rPr>
-        <w:t xml:space="preserve">Chain 1: Iteration:  400 / 4000 [ 10%]  (Warmup)</w:t>
-      </w:r>
-      <w:r>
-        <w:br/>
-      </w:r>
-      <w:r>
-        <w:rPr>
-          <w:rStyle w:val="VerbatimChar"/>
-        </w:rPr>
-        <w:t xml:space="preserve">Chain 1: Iteration:  800 / 4000 [ 20%]  (Warmup)</w:t>
-      </w:r>
-      <w:r>
-        <w:br/>
-      </w:r>
-      <w:r>
-        <w:rPr>
-          <w:rStyle w:val="VerbatimChar"/>
-        </w:rPr>
-        <w:t xml:space="preserve">Chain 1: Iteration: 1200 / 4000 [ 30%]  (Warmup)</w:t>
-      </w:r>
-      <w:r>
-        <w:br/>
-      </w:r>
-      <w:r>
-        <w:rPr>
-          <w:rStyle w:val="VerbatimChar"/>
-        </w:rPr>
-        <w:t xml:space="preserve">Chain 1: Iteration: 1600 / 4000 [ 40%]  (Warmup)</w:t>
-      </w:r>
-      <w:r>
-        <w:br/>
-      </w:r>
-      <w:r>
-        <w:rPr>
-          <w:rStyle w:val="VerbatimChar"/>
-        </w:rPr>
-        <w:t xml:space="preserve">Chain 1: Iteration: 2000 / 4000 [ 50%]  (Warmup)</w:t>
-      </w:r>
-      <w:r>
-        <w:br/>
-      </w:r>
-      <w:r>
-        <w:rPr>
-          <w:rStyle w:val="VerbatimChar"/>
-        </w:rPr>
-        <w:t xml:space="preserve">Chain 1: Iteration: 2001 / 4000 [ 50%]  (Sampling)</w:t>
-      </w:r>
-      <w:r>
-        <w:br/>
-      </w:r>
-      <w:r>
-        <w:rPr>
-          <w:rStyle w:val="VerbatimChar"/>
-        </w:rPr>
-        <w:t xml:space="preserve">Chain 1: Iteration: 2400 / 4000 [ 60%]  (Sampling)</w:t>
-      </w:r>
-      <w:r>
-        <w:br/>
-      </w:r>
-      <w:r>
-        <w:rPr>
-          <w:rStyle w:val="VerbatimChar"/>
-        </w:rPr>
-        <w:t xml:space="preserve">Chain 1: Iteration: 2800 / 4000 [ 70%]  (Sampling)</w:t>
-      </w:r>
-      <w:r>
-        <w:br/>
-      </w:r>
-      <w:r>
-        <w:rPr>
-          <w:rStyle w:val="VerbatimChar"/>
-        </w:rPr>
-        <w:t xml:space="preserve">Chain 1: Iteration: 3200 / 4000 [ 80%]  (Sampling)</w:t>
-      </w:r>
-      <w:r>
-        <w:br/>
-      </w:r>
-      <w:r>
-        <w:rPr>
-          <w:rStyle w:val="VerbatimChar"/>
-        </w:rPr>
-        <w:t xml:space="preserve">Chain 1: Iteration: 3600 / 4000 [ 90%]  (Sampling)</w:t>
-      </w:r>
-      <w:r>
-        <w:br/>
-      </w:r>
-      <w:r>
-        <w:rPr>
-          <w:rStyle w:val="VerbatimChar"/>
-        </w:rPr>
-        <w:t xml:space="preserve">Chain 1: Iteration: 4000 / 4000 [100%]  (Sampling)</w:t>
-      </w:r>
-      <w:r>
-        <w:br/>
-      </w:r>
-      <w:r>
-        <w:rPr>
-          <w:rStyle w:val="VerbatimChar"/>
-        </w:rPr>
-        <w:t xml:space="preserve">Chain 1: </w:t>
-      </w:r>
-      <w:r>
-        <w:br/>
-      </w:r>
-      <w:r>
-        <w:rPr>
-          <w:rStyle w:val="VerbatimChar"/>
-        </w:rPr>
-        <w:t xml:space="preserve">Chain 1:  Elapsed Time: 0.341 seconds (Warm-up)</w:t>
-      </w:r>
-      <w:r>
-        <w:br/>
-      </w:r>
-      <w:r>
-        <w:rPr>
-          <w:rStyle w:val="VerbatimChar"/>
-        </w:rPr>
-        <w:t xml:space="preserve">Chain 1:                0.365 seconds (Sampling)</w:t>
-      </w:r>
-      <w:r>
-        <w:br/>
-      </w:r>
-      <w:r>
-        <w:rPr>
-          <w:rStyle w:val="VerbatimChar"/>
-        </w:rPr>
-        <w:t xml:space="preserve">Chain 1:                0.706 seconds (Total)</w:t>
-      </w:r>
-      <w:r>
-        <w:br/>
-      </w:r>
-      <w:r>
-        <w:rPr>
-          <w:rStyle w:val="VerbatimChar"/>
-        </w:rPr>
-        <w:t xml:space="preserve">Chain 1: </w:t>
-      </w:r>
-      <w:r>
-        <w:br/>
-      </w:r>
-      <w:r>
-        <w:br/>
-      </w:r>
-      <w:r>
-        <w:rPr>
-          <w:rStyle w:val="VerbatimChar"/>
-        </w:rPr>
-        <w:t xml:space="preserve">SAMPLING FOR MODEL 'anon_model' NOW (CHAIN 2).</w:t>
-      </w:r>
-      <w:r>
-        <w:br/>
-      </w:r>
-      <w:r>
-        <w:rPr>
-          <w:rStyle w:val="VerbatimChar"/>
-        </w:rPr>
-        <w:t xml:space="preserve">Chain 2: </w:t>
-      </w:r>
-      <w:r>
-        <w:br/>
-      </w:r>
-      <w:r>
-        <w:rPr>
-          <w:rStyle w:val="VerbatimChar"/>
-        </w:rPr>
-        <w:t xml:space="preserve">Chain 2: Gradient evaluation took 3e-06 seconds</w:t>
-      </w:r>
-      <w:r>
-        <w:br/>
-      </w:r>
-      <w:r>
-        <w:rPr>
-          <w:rStyle w:val="VerbatimChar"/>
-        </w:rPr>
-        <w:t xml:space="preserve">Chain 2: 1000 transitions using 10 leapfrog steps per transition would take 0.03 seconds.</w:t>
-      </w:r>
-      <w:r>
-        <w:br/>
-      </w:r>
-      <w:r>
-        <w:rPr>
-          <w:rStyle w:val="VerbatimChar"/>
-        </w:rPr>
-        <w:t xml:space="preserve">Chain 2: Adjust your expectations accordingly!</w:t>
-      </w:r>
-      <w:r>
-        <w:br/>
-      </w:r>
-      <w:r>
-        <w:rPr>
-          <w:rStyle w:val="VerbatimChar"/>
-        </w:rPr>
-        <w:t xml:space="preserve">Chain 2: </w:t>
-      </w:r>
-      <w:r>
-        <w:br/>
-      </w:r>
-      <w:r>
-        <w:rPr>
-          <w:rStyle w:val="VerbatimChar"/>
-        </w:rPr>
-        <w:t xml:space="preserve">Chain 2: </w:t>
-      </w:r>
-      <w:r>
-        <w:br/>
-      </w:r>
-      <w:r>
-        <w:rPr>
-          <w:rStyle w:val="VerbatimChar"/>
-        </w:rPr>
-        <w:t xml:space="preserve">Chain 2: Iteration:    1 / 4000 [  0%]  (Warmup)</w:t>
-      </w:r>
-      <w:r>
-        <w:br/>
-      </w:r>
-      <w:r>
-        <w:rPr>
-          <w:rStyle w:val="VerbatimChar"/>
-        </w:rPr>
-        <w:t xml:space="preserve">Chain 2: Iteration:  400 / 4000 [ 10%]  (Warmup)</w:t>
-      </w:r>
-      <w:r>
-        <w:br/>
-      </w:r>
-      <w:r>
-        <w:rPr>
-          <w:rStyle w:val="VerbatimChar"/>
-        </w:rPr>
-        <w:t xml:space="preserve">Chain 2: Iteration:  800 / 4000 [ 20%]  (Warmup)</w:t>
-      </w:r>
-      <w:r>
-        <w:br/>
-      </w:r>
-      <w:r>
-        <w:rPr>
-          <w:rStyle w:val="VerbatimChar"/>
-        </w:rPr>
-        <w:t xml:space="preserve">Chain 2: Iteration: 1200 / 4000 [ 30%]  (Warmup)</w:t>
-      </w:r>
-      <w:r>
-        <w:br/>
-      </w:r>
-      <w:r>
-        <w:rPr>
-          <w:rStyle w:val="VerbatimChar"/>
-        </w:rPr>
-        <w:t xml:space="preserve">Chain 2: Iteration: 1600 / 4000 [ 40%]  (Warmup)</w:t>
-      </w:r>
-      <w:r>
-        <w:br/>
-      </w:r>
-      <w:r>
-        <w:rPr>
-          <w:rStyle w:val="VerbatimChar"/>
-        </w:rPr>
-        <w:t xml:space="preserve">Chain 2: Iteration: 2000 / 4000 [ 50%]  (Warmup)</w:t>
-      </w:r>
-      <w:r>
-        <w:br/>
-      </w:r>
-      <w:r>
-        <w:rPr>
-          <w:rStyle w:val="VerbatimChar"/>
-        </w:rPr>
-        <w:t xml:space="preserve">Chain 2: Iteration: 2001 / 4000 [ 50%]  (Sampling)</w:t>
-      </w:r>
-      <w:r>
-        <w:br/>
-      </w:r>
-      <w:r>
-        <w:rPr>
-          <w:rStyle w:val="VerbatimChar"/>
-        </w:rPr>
-        <w:t xml:space="preserve">Chain 2: Iteration: 2400 / 4000 [ 60%]  (Sampling)</w:t>
-      </w:r>
-      <w:r>
-        <w:br/>
-      </w:r>
-      <w:r>
-        <w:rPr>
-          <w:rStyle w:val="VerbatimChar"/>
-        </w:rPr>
-        <w:t xml:space="preserve">Chain 2: Iteration: 2800 / 4000 [ 70%]  (Sampling)</w:t>
-      </w:r>
-      <w:r>
-        <w:br/>
-      </w:r>
-      <w:r>
-        <w:rPr>
-          <w:rStyle w:val="VerbatimChar"/>
-        </w:rPr>
-        <w:t xml:space="preserve">Chain 2: Iteration: 3200 / 4000 [ 80%]  (Sampling)</w:t>
-      </w:r>
-      <w:r>
-        <w:br/>
-      </w:r>
-      <w:r>
-        <w:rPr>
-          <w:rStyle w:val="VerbatimChar"/>
-        </w:rPr>
-        <w:t xml:space="preserve">Chain 2: Iteration: 3600 / 4000 [ 90%]  (Sampling)</w:t>
-      </w:r>
-      <w:r>
-        <w:br/>
-      </w:r>
-      <w:r>
-        <w:rPr>
-          <w:rStyle w:val="VerbatimChar"/>
-        </w:rPr>
-        <w:t xml:space="preserve">Chain 2: Iteration: 4000 / 4000 [100%]  (Sampling)</w:t>
-      </w:r>
-      <w:r>
-        <w:br/>
-      </w:r>
-      <w:r>
-        <w:rPr>
-          <w:rStyle w:val="VerbatimChar"/>
-        </w:rPr>
-        <w:t xml:space="preserve">Chain 2: </w:t>
-      </w:r>
-      <w:r>
-        <w:br/>
-      </w:r>
-      <w:r>
-        <w:rPr>
-          <w:rStyle w:val="VerbatimChar"/>
-        </w:rPr>
-        <w:t xml:space="preserve">Chain 2:  Elapsed Time: 0.32 seconds (Warm-up)</w:t>
-      </w:r>
-      <w:r>
-        <w:br/>
-      </w:r>
-      <w:r>
-        <w:rPr>
-          <w:rStyle w:val="VerbatimChar"/>
-        </w:rPr>
-        <w:t xml:space="preserve">Chain 2:                0.335 seconds (Sampling)</w:t>
-      </w:r>
-      <w:r>
-        <w:br/>
-      </w:r>
-      <w:r>
-        <w:rPr>
-          <w:rStyle w:val="VerbatimChar"/>
-        </w:rPr>
-        <w:t xml:space="preserve">Chain 2:                0.655 seconds (Total)</w:t>
-      </w:r>
-      <w:r>
-        <w:br/>
-      </w:r>
-      <w:r>
-        <w:rPr>
-          <w:rStyle w:val="VerbatimChar"/>
-        </w:rPr>
-        <w:t xml:space="preserve">Chain 2: </w:t>
-      </w:r>
-      <w:r>
-        <w:br/>
-      </w:r>
-      <w:r>
-        <w:br/>
-      </w:r>
-      <w:r>
-        <w:rPr>
-          <w:rStyle w:val="VerbatimChar"/>
-        </w:rPr>
-        <w:t xml:space="preserve">SAMPLING FOR MODEL 'anon_model' NOW (CHAIN 3).</w:t>
-      </w:r>
-      <w:r>
-        <w:br/>
-      </w:r>
-      <w:r>
-        <w:rPr>
-          <w:rStyle w:val="VerbatimChar"/>
-        </w:rPr>
-        <w:t xml:space="preserve">Chain 3: </w:t>
-      </w:r>
-      <w:r>
-        <w:br/>
-      </w:r>
-      <w:r>
-        <w:rPr>
-          <w:rStyle w:val="VerbatimChar"/>
-        </w:rPr>
-        <w:t xml:space="preserve">Chain 3: Gradient evaluation took 3e-06 seconds</w:t>
-      </w:r>
-      <w:r>
-        <w:br/>
-      </w:r>
-      <w:r>
-        <w:rPr>
-          <w:rStyle w:val="VerbatimChar"/>
-        </w:rPr>
-        <w:t xml:space="preserve">Chain 3: 1000 transitions using 10 leapfrog steps per transition would take 0.03 seconds.</w:t>
-      </w:r>
-      <w:r>
-        <w:br/>
-      </w:r>
-      <w:r>
-        <w:rPr>
-          <w:rStyle w:val="VerbatimChar"/>
-        </w:rPr>
-        <w:t xml:space="preserve">Chain 3: Adjust your expectations accordingly!</w:t>
-      </w:r>
-      <w:r>
-        <w:br/>
-      </w:r>
-      <w:r>
-        <w:rPr>
-          <w:rStyle w:val="VerbatimChar"/>
-        </w:rPr>
-        <w:t xml:space="preserve">Chain 3: </w:t>
-      </w:r>
-      <w:r>
-        <w:br/>
-      </w:r>
-      <w:r>
-        <w:rPr>
-          <w:rStyle w:val="VerbatimChar"/>
-        </w:rPr>
-        <w:t xml:space="preserve">Chain 3: </w:t>
-      </w:r>
-      <w:r>
-        <w:br/>
-      </w:r>
-      <w:r>
-        <w:rPr>
-          <w:rStyle w:val="VerbatimChar"/>
-        </w:rPr>
-        <w:t xml:space="preserve">Chain 3: Iteration:    1 / 4000 [  0%]  (Warmup)</w:t>
-      </w:r>
-      <w:r>
-        <w:br/>
-      </w:r>
-      <w:r>
-        <w:rPr>
-          <w:rStyle w:val="VerbatimChar"/>
-        </w:rPr>
-        <w:t xml:space="preserve">Chain 3: Iteration:  400 / 4000 [ 10%]  (Warmup)</w:t>
-      </w:r>
-      <w:r>
-        <w:br/>
-      </w:r>
-      <w:r>
-        <w:rPr>
-          <w:rStyle w:val="VerbatimChar"/>
-        </w:rPr>
-        <w:t xml:space="preserve">Chain 3: Iteration:  800 / 4000 [ 20%]  (Warmup)</w:t>
-      </w:r>
-      <w:r>
-        <w:br/>
-      </w:r>
-      <w:r>
-        <w:rPr>
-          <w:rStyle w:val="VerbatimChar"/>
-        </w:rPr>
-        <w:t xml:space="preserve">Chain 3: Iteration: 1200 / 4000 [ 30%]  (Warmup)</w:t>
-      </w:r>
-      <w:r>
-        <w:br/>
-      </w:r>
-      <w:r>
-        <w:rPr>
-          <w:rStyle w:val="VerbatimChar"/>
-        </w:rPr>
-        <w:t xml:space="preserve">Chain 3: Iteration: 1600 / 4000 [ 40%]  (Warmup)</w:t>
-      </w:r>
-      <w:r>
-        <w:br/>
-      </w:r>
-      <w:r>
-        <w:rPr>
-          <w:rStyle w:val="VerbatimChar"/>
-        </w:rPr>
-        <w:t xml:space="preserve">Chain 3: Iteration: 2000 / 4000 [ 50%]  (Warmup)</w:t>
-      </w:r>
-      <w:r>
-        <w:br/>
-      </w:r>
-      <w:r>
-        <w:rPr>
-          <w:rStyle w:val="VerbatimChar"/>
-        </w:rPr>
-        <w:t xml:space="preserve">Chain 3: Iteration: 2001 / 4000 [ 50%]  (Sampling)</w:t>
-      </w:r>
-      <w:r>
-        <w:br/>
-      </w:r>
-      <w:r>
-        <w:rPr>
-          <w:rStyle w:val="VerbatimChar"/>
-        </w:rPr>
-        <w:t xml:space="preserve">Chain 3: Iteration: 2400 / 4000 [ 60%]  (Sampling)</w:t>
-      </w:r>
-      <w:r>
-        <w:br/>
-      </w:r>
-      <w:r>
-        <w:rPr>
-          <w:rStyle w:val="VerbatimChar"/>
-        </w:rPr>
-        <w:t xml:space="preserve">Chain 3: Iteration: 2800 / 4000 [ 70%]  (Sampling)</w:t>
-      </w:r>
-      <w:r>
-        <w:br/>
-      </w:r>
-      <w:r>
-        <w:rPr>
-          <w:rStyle w:val="VerbatimChar"/>
-        </w:rPr>
-        <w:t xml:space="preserve">Chain 3: Iteration: 3200 / 4000 [ 80%]  (Sampling)</w:t>
-      </w:r>
-      <w:r>
-        <w:br/>
-      </w:r>
-      <w:r>
-        <w:rPr>
-          <w:rStyle w:val="VerbatimChar"/>
-        </w:rPr>
-        <w:t xml:space="preserve">Chain 3: Iteration: 3600 / 4000 [ 90%]  (Sampling)</w:t>
-      </w:r>
-      <w:r>
-        <w:br/>
-      </w:r>
-      <w:r>
-        <w:rPr>
-          <w:rStyle w:val="VerbatimChar"/>
-        </w:rPr>
-        <w:t xml:space="preserve">Chain 3: Iteration: 4000 / 4000 [100%]  (Sampling)</w:t>
-      </w:r>
-      <w:r>
-        <w:br/>
-      </w:r>
-      <w:r>
-        <w:rPr>
-          <w:rStyle w:val="VerbatimChar"/>
-        </w:rPr>
-        <w:t xml:space="preserve">Chain 3: </w:t>
-      </w:r>
-      <w:r>
-        <w:br/>
-      </w:r>
-      <w:r>
-        <w:rPr>
-          <w:rStyle w:val="VerbatimChar"/>
-        </w:rPr>
-        <w:t xml:space="preserve">Chain 3:  Elapsed Time: 0.35 seconds (Warm-up)</w:t>
-      </w:r>
-      <w:r>
-        <w:br/>
-      </w:r>
-      <w:r>
-        <w:rPr>
-          <w:rStyle w:val="VerbatimChar"/>
-        </w:rPr>
-        <w:t xml:space="preserve">Chain 3:                0.365 seconds (Sampling)</w:t>
-      </w:r>
-      <w:r>
-        <w:br/>
-      </w:r>
-      <w:r>
-        <w:rPr>
-          <w:rStyle w:val="VerbatimChar"/>
-        </w:rPr>
-        <w:t xml:space="preserve">Chain 3:                0.715 seconds (Total)</w:t>
-      </w:r>
-      <w:r>
-        <w:br/>
-      </w:r>
-      <w:r>
-        <w:rPr>
-          <w:rStyle w:val="VerbatimChar"/>
-        </w:rPr>
-        <w:t xml:space="preserve">Chain 3: </w:t>
-      </w:r>
-      <w:r>
-        <w:br/>
-      </w:r>
-      <w:r>
-        <w:br/>
-      </w:r>
-      <w:r>
-        <w:rPr>
-          <w:rStyle w:val="VerbatimChar"/>
-        </w:rPr>
-        <w:t xml:space="preserve">SAMPLING FOR MODEL 'anon_model' NOW (CHAIN 4).</w:t>
-      </w:r>
-      <w:r>
-        <w:br/>
-      </w:r>
-      <w:r>
-        <w:rPr>
-          <w:rStyle w:val="VerbatimChar"/>
-        </w:rPr>
-        <w:t xml:space="preserve">Chain 4: </w:t>
-      </w:r>
-      <w:r>
-        <w:br/>
-      </w:r>
-      <w:r>
-        <w:rPr>
-          <w:rStyle w:val="VerbatimChar"/>
-        </w:rPr>
-        <w:t xml:space="preserve">Chain 4: Gradient evaluation took 3e-06 seconds</w:t>
-      </w:r>
-      <w:r>
-        <w:br/>
-      </w:r>
-      <w:r>
-        <w:rPr>
-          <w:rStyle w:val="VerbatimChar"/>
-        </w:rPr>
-        <w:t xml:space="preserve">Chain 4: 1000 transitions using 10 leapfrog steps per transition would take 0.03 seconds.</w:t>
-      </w:r>
-      <w:r>
-        <w:br/>
-      </w:r>
-      <w:r>
-        <w:rPr>
-          <w:rStyle w:val="VerbatimChar"/>
-        </w:rPr>
-        <w:t xml:space="preserve">Chain 4: Adjust your expectations accordingly!</w:t>
-      </w:r>
-      <w:r>
-        <w:br/>
-      </w:r>
-      <w:r>
-        <w:rPr>
-          <w:rStyle w:val="VerbatimChar"/>
-        </w:rPr>
-        <w:t xml:space="preserve">Chain 4: </w:t>
-      </w:r>
-      <w:r>
-        <w:br/>
-      </w:r>
-      <w:r>
-        <w:rPr>
-          <w:rStyle w:val="VerbatimChar"/>
-        </w:rPr>
-        <w:t xml:space="preserve">Chain 4: </w:t>
-      </w:r>
-      <w:r>
-        <w:br/>
-      </w:r>
-      <w:r>
-        <w:rPr>
-          <w:rStyle w:val="VerbatimChar"/>
-        </w:rPr>
-        <w:t xml:space="preserve">Chain 4: Iteration:    1 / 4000 [  0%]  (Warmup)</w:t>
-      </w:r>
-      <w:r>
-        <w:br/>
-      </w:r>
-      <w:r>
-        <w:rPr>
-          <w:rStyle w:val="VerbatimChar"/>
-        </w:rPr>
-        <w:t xml:space="preserve">Chain 4: Iteration:  400 / 4000 [ 10%]  (Warmup)</w:t>
-      </w:r>
-      <w:r>
-        <w:br/>
-      </w:r>
-      <w:r>
-        <w:rPr>
-          <w:rStyle w:val="VerbatimChar"/>
-        </w:rPr>
-        <w:t xml:space="preserve">Chain 4: Iteration:  800 / 4000 [ 20%]  (Warmup)</w:t>
-      </w:r>
-      <w:r>
-        <w:br/>
-      </w:r>
-      <w:r>
-        <w:rPr>
-          <w:rStyle w:val="VerbatimChar"/>
-        </w:rPr>
-        <w:t xml:space="preserve">Chain 4: Iteration: 1200 / 4000 [ 30%]  (Warmup)</w:t>
-      </w:r>
-      <w:r>
-        <w:br/>
-      </w:r>
-      <w:r>
-        <w:rPr>
-          <w:rStyle w:val="VerbatimChar"/>
-        </w:rPr>
-        <w:t xml:space="preserve">Chain 4: Iteration: 1600 / 4000 [ 40%]  (Warmup)</w:t>
-      </w:r>
-      <w:r>
-        <w:br/>
-      </w:r>
-      <w:r>
-        <w:rPr>
-          <w:rStyle w:val="VerbatimChar"/>
-        </w:rPr>
-        <w:t xml:space="preserve">Chain 4: Iteration: 2000 / 4000 [ 50%]  (Warmup)</w:t>
-      </w:r>
-      <w:r>
-        <w:br/>
-      </w:r>
-      <w:r>
-        <w:rPr>
-          <w:rStyle w:val="VerbatimChar"/>
-        </w:rPr>
-        <w:t xml:space="preserve">Chain 4: Iteration: 2001 / 4000 [ 50%]  (Sampling)</w:t>
-      </w:r>
-      <w:r>
-        <w:br/>
-      </w:r>
-      <w:r>
-        <w:rPr>
-          <w:rStyle w:val="VerbatimChar"/>
-        </w:rPr>
-        <w:t xml:space="preserve">Chain 4: Iteration: 2400 / 4000 [ 60%]  (Sampling)</w:t>
-      </w:r>
-      <w:r>
-        <w:br/>
-      </w:r>
-      <w:r>
-        <w:rPr>
-          <w:rStyle w:val="VerbatimChar"/>
-        </w:rPr>
-        <w:t xml:space="preserve">Chain 4: Iteration: 2800 / 4000 [ 70%]  (Sampling)</w:t>
-      </w:r>
-      <w:r>
-        <w:br/>
-      </w:r>
-      <w:r>
-        <w:rPr>
-          <w:rStyle w:val="VerbatimChar"/>
-        </w:rPr>
-        <w:t xml:space="preserve">Chain 4: Iteration: 3200 / 4000 [ 80%]  (Sampling)</w:t>
-      </w:r>
-      <w:r>
-        <w:br/>
-      </w:r>
-      <w:r>
-        <w:rPr>
-          <w:rStyle w:val="VerbatimChar"/>
-        </w:rPr>
-        <w:t xml:space="preserve">Chain 4: Iteration: 3600 / 4000 [ 90%]  (Sampling)</w:t>
-      </w:r>
-      <w:r>
-        <w:br/>
-      </w:r>
-      <w:r>
-        <w:rPr>
-          <w:rStyle w:val="VerbatimChar"/>
-        </w:rPr>
-        <w:t xml:space="preserve">Chain 4: Iteration: 4000 / 4000 [100%]  (Sampling)</w:t>
-      </w:r>
-      <w:r>
-        <w:br/>
-      </w:r>
-      <w:r>
-        <w:rPr>
-          <w:rStyle w:val="VerbatimChar"/>
-        </w:rPr>
-        <w:t xml:space="preserve">Chain 4: </w:t>
-      </w:r>
-      <w:r>
-        <w:br/>
-      </w:r>
-      <w:r>
-        <w:rPr>
-          <w:rStyle w:val="VerbatimChar"/>
-        </w:rPr>
-        <w:t xml:space="preserve">Chain 4:  Elapsed Time: 0.361 seconds (Warm-up)</w:t>
-      </w:r>
-      <w:r>
-        <w:br/>
-      </w:r>
-      <w:r>
-        <w:rPr>
-          <w:rStyle w:val="VerbatimChar"/>
-        </w:rPr>
-        <w:t xml:space="preserve">Chain 4:                0.327 seconds (Sampling)</w:t>
-      </w:r>
-      <w:r>
-        <w:br/>
-      </w:r>
-      <w:r>
-        <w:rPr>
-          <w:rStyle w:val="VerbatimChar"/>
-        </w:rPr>
-        <w:t xml:space="preserve">Chain 4:                0.688 seconds (Total)</w:t>
-      </w:r>
-      <w:r>
-        <w:br/>
-      </w:r>
-      <w:r>
-        <w:rPr>
-          <w:rStyle w:val="VerbatimChar"/>
-        </w:rPr>
-        <w:t xml:space="preserve">Chain 4: </w:t>
-      </w:r>
-    </w:p>
-    <w:p>
-      <w:pPr>
-        <w:pStyle w:val="FirstParagraph"/>
-      </w:pPr>
-      <w:r>
-        <w:drawing>
-          <wp:inline>
-            <wp:extent cx="5943600" cy="3200400"/>
-            <wp:effectExtent b="0" l="0" r="0" t="0"/>
-            <wp:docPr descr="" title="" id="21" name="Picture"/>
-            <a:graphic>
-              <a:graphicData uri="http://schemas.openxmlformats.org/drawingml/2006/picture">
-                <pic:pic>
-                  <pic:nvPicPr>
-                    <pic:cNvPr descr="manuscript_files/figure-docx/test_ref-1.png" id="22" name="Picture"/>
-                    <pic:cNvPicPr>
-                      <a:picLocks noChangeArrowheads="1" noChangeAspect="1"/>
-                    </pic:cNvPicPr>
-                  </pic:nvPicPr>
-                  <pic:blipFill>
-                    <a:blip r:embed="rId20"/>
-                    <a:stretch>
-                      <a:fillRect/>
-                    </a:stretch>
-                  </pic:blipFill>
-                  <pic:spPr bwMode="auto">
-                    <a:xfrm>
-                      <a:off x="0" y="0"/>
-                      <a:ext cx="5943600" cy="3200400"/>
-                    </a:xfrm>
-                    <a:prstGeom prst="rect">
-                      <a:avLst/>
-                    </a:prstGeom>
-                    <a:noFill/>
-                    <a:ln w="9525">
-                      <a:noFill/>
-                      <a:headEnd/>
-                      <a:tailEnd/>
-                    </a:ln>
-                  </pic:spPr>
-                </pic:pic>
-              </a:graphicData>
-            </a:graphic>
-          </wp:inline>
-        </w:drawing>
-      </w:r>
-    </w:p>
-    <w:p>
-      <w:pPr>
-        <w:pStyle w:val="SourceCode"/>
-      </w:pPr>
-      <w:r>
-        <w:br/>
-      </w:r>
-      <w:r>
-        <w:rPr>
-          <w:rStyle w:val="VerbatimChar"/>
-        </w:rPr>
-        <w:t xml:space="preserve">SAMPLING FOR MODEL 'anon_model' NOW (CHAIN 1).</w:t>
-      </w:r>
-      <w:r>
-        <w:br/>
-      </w:r>
-      <w:r>
-        <w:rPr>
-          <w:rStyle w:val="VerbatimChar"/>
-        </w:rPr>
-        <w:t xml:space="preserve">Chain 1: </w:t>
-      </w:r>
-      <w:r>
-        <w:br/>
-      </w:r>
-      <w:r>
-        <w:rPr>
-          <w:rStyle w:val="VerbatimChar"/>
-        </w:rPr>
-        <w:t xml:space="preserve">Chain 1: Gradient evaluation took 3.7e-05 seconds</w:t>
-      </w:r>
-      <w:r>
-        <w:br/>
-      </w:r>
-      <w:r>
-        <w:rPr>
-          <w:rStyle w:val="VerbatimChar"/>
-        </w:rPr>
-        <w:t xml:space="preserve">Chain 1: 1000 transitions using 10 leapfrog steps per transition would take 0.37 seconds.</w:t>
-      </w:r>
-      <w:r>
-        <w:br/>
-      </w:r>
-      <w:r>
-        <w:rPr>
-          <w:rStyle w:val="VerbatimChar"/>
-        </w:rPr>
-        <w:t xml:space="preserve">Chain 1: Adjust your expectations accordingly!</w:t>
-      </w:r>
-      <w:r>
-        <w:br/>
-      </w:r>
-      <w:r>
-        <w:rPr>
-          <w:rStyle w:val="VerbatimChar"/>
-        </w:rPr>
-        <w:t xml:space="preserve">Chain 1: </w:t>
-      </w:r>
-      <w:r>
-        <w:br/>
-      </w:r>
-      <w:r>
-        <w:rPr>
-          <w:rStyle w:val="VerbatimChar"/>
-        </w:rPr>
-        <w:t xml:space="preserve">Chain 1: </w:t>
-      </w:r>
-      <w:r>
-        <w:br/>
-      </w:r>
-      <w:r>
-        <w:rPr>
-          <w:rStyle w:val="VerbatimChar"/>
-        </w:rPr>
-        <w:t xml:space="preserve">Chain 1: Iteration:    1 / 4000 [  0%]  (Warmup)</w:t>
-      </w:r>
-      <w:r>
-        <w:br/>
-      </w:r>
-      <w:r>
-        <w:rPr>
-          <w:rStyle w:val="VerbatimChar"/>
-        </w:rPr>
-        <w:t xml:space="preserve">Chain 1: Iteration:  400 / 4000 [ 10%]  (Warmup)</w:t>
-      </w:r>
-      <w:r>
-        <w:br/>
-      </w:r>
-      <w:r>
-        <w:rPr>
-          <w:rStyle w:val="VerbatimChar"/>
-        </w:rPr>
-        <w:t xml:space="preserve">Chain 1: Iteration:  800 / 4000 [ 20%]  (Warmup)</w:t>
-      </w:r>
-      <w:r>
-        <w:br/>
-      </w:r>
-      <w:r>
-        <w:rPr>
-          <w:rStyle w:val="VerbatimChar"/>
-        </w:rPr>
-        <w:t xml:space="preserve">Chain 1: Iteration: 1200 / 4000 [ 30%]  (Warmup)</w:t>
-      </w:r>
-      <w:r>
-        <w:br/>
-      </w:r>
-      <w:r>
-        <w:rPr>
-          <w:rStyle w:val="VerbatimChar"/>
-        </w:rPr>
-        <w:t xml:space="preserve">Chain 1: Iteration: 1600 / 4000 [ 40%]  (Warmup)</w:t>
-      </w:r>
-      <w:r>
-        <w:br/>
-      </w:r>
-      <w:r>
-        <w:rPr>
-          <w:rStyle w:val="VerbatimChar"/>
-        </w:rPr>
-        <w:t xml:space="preserve">Chain 1: Iteration: 2000 / 4000 [ 50%]  (Warmup)</w:t>
-      </w:r>
-      <w:r>
-        <w:br/>
-      </w:r>
-      <w:r>
-        <w:rPr>
-          <w:rStyle w:val="VerbatimChar"/>
-        </w:rPr>
-        <w:t xml:space="preserve">Chain 1: Iteration: 2001 / 4000 [ 50%]  (Sampling)</w:t>
-      </w:r>
-      <w:r>
-        <w:br/>
-      </w:r>
-      <w:r>
-        <w:rPr>
-          <w:rStyle w:val="VerbatimChar"/>
-        </w:rPr>
-        <w:t xml:space="preserve">Chain 1: Iteration: 2400 / 4000 [ 60%]  (Sampling)</w:t>
-      </w:r>
-      <w:r>
-        <w:br/>
-      </w:r>
-      <w:r>
-        <w:rPr>
-          <w:rStyle w:val="VerbatimChar"/>
-        </w:rPr>
-        <w:t xml:space="preserve">Chain 1: Iteration: 2800 / 4000 [ 70%]  (Sampling)</w:t>
-      </w:r>
-      <w:r>
-        <w:br/>
-      </w:r>
-      <w:r>
-        <w:rPr>
-          <w:rStyle w:val="VerbatimChar"/>
-        </w:rPr>
-        <w:t xml:space="preserve">Chain 1: Iteration: 3200 / 4000 [ 80%]  (Sampling)</w:t>
-      </w:r>
-      <w:r>
-        <w:br/>
-      </w:r>
-      <w:r>
-        <w:rPr>
-          <w:rStyle w:val="VerbatimChar"/>
-        </w:rPr>
-        <w:t xml:space="preserve">Chain 1: Iteration: 3600 / 4000 [ 90%]  (Sampling)</w:t>
-      </w:r>
-      <w:r>
-        <w:br/>
-      </w:r>
-      <w:r>
-        <w:rPr>
-          <w:rStyle w:val="VerbatimChar"/>
-        </w:rPr>
-        <w:t xml:space="preserve">Chain 1: Iteration: 4000 / 4000 [100%]  (Sampling)</w:t>
-      </w:r>
-      <w:r>
-        <w:br/>
-      </w:r>
-      <w:r>
-        <w:rPr>
-          <w:rStyle w:val="VerbatimChar"/>
-        </w:rPr>
-        <w:t xml:space="preserve">Chain 1: </w:t>
-      </w:r>
-      <w:r>
-        <w:br/>
-      </w:r>
-      <w:r>
-        <w:rPr>
-          <w:rStyle w:val="VerbatimChar"/>
-        </w:rPr>
-        <w:t xml:space="preserve">Chain 1:  Elapsed Time: 0.034 seconds (Warm-up)</w:t>
-      </w:r>
-      <w:r>
-        <w:br/>
-      </w:r>
-      <w:r>
-        <w:rPr>
-          <w:rStyle w:val="VerbatimChar"/>
-        </w:rPr>
-        <w:t xml:space="preserve">Chain 1:                0.028 seconds (Sampling)</w:t>
-      </w:r>
-      <w:r>
-        <w:br/>
-      </w:r>
-      <w:r>
-        <w:rPr>
-          <w:rStyle w:val="VerbatimChar"/>
-        </w:rPr>
-        <w:t xml:space="preserve">Chain 1:                0.062 seconds (Total)</w:t>
-      </w:r>
-      <w:r>
-        <w:br/>
-      </w:r>
-      <w:r>
-        <w:rPr>
-          <w:rStyle w:val="VerbatimChar"/>
-        </w:rPr>
-        <w:t xml:space="preserve">Chain 1: </w:t>
-      </w:r>
-      <w:r>
-        <w:br/>
-      </w:r>
-      <w:r>
-        <w:br/>
-      </w:r>
-      <w:r>
-        <w:rPr>
-          <w:rStyle w:val="VerbatimChar"/>
-        </w:rPr>
-        <w:t xml:space="preserve">SAMPLING FOR MODEL 'anon_model' NOW (CHAIN 2).</w:t>
-      </w:r>
-      <w:r>
-        <w:br/>
-      </w:r>
-      <w:r>
-        <w:rPr>
-          <w:rStyle w:val="VerbatimChar"/>
-        </w:rPr>
-        <w:t xml:space="preserve">Chain 2: </w:t>
-      </w:r>
-      <w:r>
-        <w:br/>
-      </w:r>
-      <w:r>
-        <w:rPr>
-          <w:rStyle w:val="VerbatimChar"/>
-        </w:rPr>
-        <w:t xml:space="preserve">Chain 2: Gradient evaluation took 2e-06 seconds</w:t>
-      </w:r>
-      <w:r>
-        <w:br/>
-      </w:r>
-      <w:r>
-        <w:rPr>
-          <w:rStyle w:val="VerbatimChar"/>
-        </w:rPr>
-        <w:t xml:space="preserve">Chain 2: 1000 transitions using 10 leapfrog steps per transition would take 0.02 seconds.</w:t>
-      </w:r>
-      <w:r>
-        <w:br/>
-      </w:r>
-      <w:r>
-        <w:rPr>
-          <w:rStyle w:val="VerbatimChar"/>
-        </w:rPr>
-        <w:t xml:space="preserve">Chain 2: Adjust your expectations accordingly!</w:t>
-      </w:r>
-      <w:r>
-        <w:br/>
-      </w:r>
-      <w:r>
-        <w:rPr>
-          <w:rStyle w:val="VerbatimChar"/>
-        </w:rPr>
-        <w:t xml:space="preserve">Chain 2: </w:t>
-      </w:r>
-      <w:r>
-        <w:br/>
-      </w:r>
-      <w:r>
-        <w:rPr>
-          <w:rStyle w:val="VerbatimChar"/>
-        </w:rPr>
-        <w:t xml:space="preserve">Chain 2: </w:t>
-      </w:r>
-      <w:r>
-        <w:br/>
-      </w:r>
-      <w:r>
-        <w:rPr>
-          <w:rStyle w:val="VerbatimChar"/>
-        </w:rPr>
-        <w:t xml:space="preserve">Chain 2: Iteration:    1 / 4000 [  0%]  (Warmup)</w:t>
-      </w:r>
-      <w:r>
-        <w:br/>
-      </w:r>
-      <w:r>
-        <w:rPr>
-          <w:rStyle w:val="VerbatimChar"/>
-        </w:rPr>
-        <w:t xml:space="preserve">Chain 2: Iteration:  400 / 4000 [ 10%]  (Warmup)</w:t>
-      </w:r>
-      <w:r>
-        <w:br/>
-      </w:r>
-      <w:r>
-        <w:rPr>
-          <w:rStyle w:val="VerbatimChar"/>
-        </w:rPr>
-        <w:t xml:space="preserve">Chain 2: Iteration:  800 / 4000 [ 20%]  (Warmup)</w:t>
-      </w:r>
-      <w:r>
-        <w:br/>
-      </w:r>
-      <w:r>
-        <w:rPr>
-          <w:rStyle w:val="VerbatimChar"/>
-        </w:rPr>
-        <w:t xml:space="preserve">Chain 2: Iteration: 1200 / 4000 [ 30%]  (Warmup)</w:t>
-      </w:r>
-      <w:r>
-        <w:br/>
-      </w:r>
-      <w:r>
-        <w:rPr>
-          <w:rStyle w:val="VerbatimChar"/>
-        </w:rPr>
-        <w:t xml:space="preserve">Chain 2: Iteration: 1600 / 4000 [ 40%]  (Warmup)</w:t>
-      </w:r>
-      <w:r>
-        <w:br/>
-      </w:r>
-      <w:r>
-        <w:rPr>
-          <w:rStyle w:val="VerbatimChar"/>
-        </w:rPr>
-        <w:t xml:space="preserve">Chain 2: Iteration: 2000 / 4000 [ 50%]  (Warmup)</w:t>
-      </w:r>
-      <w:r>
-        <w:br/>
-      </w:r>
-      <w:r>
-        <w:rPr>
-          <w:rStyle w:val="VerbatimChar"/>
-        </w:rPr>
-        <w:t xml:space="preserve">Chain 2: Iteration: 2001 / 4000 [ 50%]  (Sampling)</w:t>
-      </w:r>
-      <w:r>
-        <w:br/>
-      </w:r>
-      <w:r>
-        <w:rPr>
-          <w:rStyle w:val="VerbatimChar"/>
-        </w:rPr>
-        <w:t xml:space="preserve">Chain 2: Iteration: 2400 / 4000 [ 60%]  (Sampling)</w:t>
-      </w:r>
-      <w:r>
-        <w:br/>
-      </w:r>
-      <w:r>
-        <w:rPr>
-          <w:rStyle w:val="VerbatimChar"/>
-        </w:rPr>
-        <w:t xml:space="preserve">Chain 2: Iteration: 2800 / 4000 [ 70%]  (Sampling)</w:t>
-      </w:r>
-      <w:r>
-        <w:br/>
-      </w:r>
-      <w:r>
-        <w:rPr>
-          <w:rStyle w:val="VerbatimChar"/>
-        </w:rPr>
-        <w:t xml:space="preserve">Chain 2: Iteration: 3200 / 4000 [ 80%]  (Sampling)</w:t>
-      </w:r>
-      <w:r>
-        <w:br/>
-      </w:r>
-      <w:r>
-        <w:rPr>
-          <w:rStyle w:val="VerbatimChar"/>
-        </w:rPr>
-        <w:t xml:space="preserve">Chain 2: Iteration: 3600 / 4000 [ 90%]  (Sampling)</w:t>
-      </w:r>
-      <w:r>
-        <w:br/>
-      </w:r>
-      <w:r>
-        <w:rPr>
-          <w:rStyle w:val="VerbatimChar"/>
-        </w:rPr>
-        <w:t xml:space="preserve">Chain 2: Iteration: 4000 / 4000 [100%]  (Sampling)</w:t>
-      </w:r>
-      <w:r>
-        <w:br/>
-      </w:r>
-      <w:r>
-        <w:rPr>
-          <w:rStyle w:val="VerbatimChar"/>
-        </w:rPr>
-        <w:t xml:space="preserve">Chain 2: </w:t>
-      </w:r>
-      <w:r>
-        <w:br/>
-      </w:r>
-      <w:r>
-        <w:rPr>
-          <w:rStyle w:val="VerbatimChar"/>
-        </w:rPr>
-        <w:t xml:space="preserve">Chain 2:  Elapsed Time: 0.038 seconds (Warm-up)</w:t>
-      </w:r>
-      <w:r>
-        <w:br/>
-      </w:r>
-      <w:r>
-        <w:rPr>
-          <w:rStyle w:val="VerbatimChar"/>
-        </w:rPr>
-        <w:t xml:space="preserve">Chain 2:                0.03 seconds (Sampling)</w:t>
-      </w:r>
-      <w:r>
-        <w:br/>
-      </w:r>
-      <w:r>
-        <w:rPr>
-          <w:rStyle w:val="VerbatimChar"/>
-        </w:rPr>
-        <w:t xml:space="preserve">Chain 2:                0.068 seconds (Total)</w:t>
-      </w:r>
-      <w:r>
-        <w:br/>
-      </w:r>
-      <w:r>
-        <w:rPr>
-          <w:rStyle w:val="VerbatimChar"/>
-        </w:rPr>
-        <w:t xml:space="preserve">Chain 2: </w:t>
-      </w:r>
-      <w:r>
-        <w:br/>
-      </w:r>
-      <w:r>
-        <w:br/>
-      </w:r>
-      <w:r>
-        <w:rPr>
-          <w:rStyle w:val="VerbatimChar"/>
-        </w:rPr>
-        <w:t xml:space="preserve">SAMPLING FOR MODEL 'anon_model' NOW (CHAIN 3).</w:t>
-      </w:r>
-      <w:r>
-        <w:br/>
-      </w:r>
-      <w:r>
-        <w:rPr>
-          <w:rStyle w:val="VerbatimChar"/>
-        </w:rPr>
-        <w:t xml:space="preserve">Chain 3: </w:t>
-      </w:r>
-      <w:r>
-        <w:br/>
-      </w:r>
-      <w:r>
-        <w:rPr>
-          <w:rStyle w:val="VerbatimChar"/>
-        </w:rPr>
-        <w:t xml:space="preserve">Chain 3: Gradient evaluation took 1e-06 seconds</w:t>
-      </w:r>
-      <w:r>
-        <w:br/>
-      </w:r>
-      <w:r>
-        <w:rPr>
-          <w:rStyle w:val="VerbatimChar"/>
-        </w:rPr>
-        <w:t xml:space="preserve">Chain 3: 1000 transitions using 10 leapfrog steps per transition would take 0.01 seconds.</w:t>
-      </w:r>
-      <w:r>
-        <w:br/>
-      </w:r>
-      <w:r>
-        <w:rPr>
-          <w:rStyle w:val="VerbatimChar"/>
-        </w:rPr>
-        <w:t xml:space="preserve">Chain 3: Adjust your expectations accordingly!</w:t>
-      </w:r>
-      <w:r>
-        <w:br/>
-      </w:r>
-      <w:r>
-        <w:rPr>
-          <w:rStyle w:val="VerbatimChar"/>
-        </w:rPr>
-        <w:t xml:space="preserve">Chain 3: </w:t>
-      </w:r>
-      <w:r>
-        <w:br/>
-      </w:r>
-      <w:r>
-        <w:rPr>
-          <w:rStyle w:val="VerbatimChar"/>
-        </w:rPr>
-        <w:t xml:space="preserve">Chain 3: </w:t>
-      </w:r>
-      <w:r>
-        <w:br/>
-      </w:r>
-      <w:r>
-        <w:rPr>
-          <w:rStyle w:val="VerbatimChar"/>
-        </w:rPr>
-        <w:t xml:space="preserve">Chain 3: Iteration:    1 / 4000 [  0%]  (Warmup)</w:t>
-      </w:r>
-      <w:r>
-        <w:br/>
-      </w:r>
-      <w:r>
-        <w:rPr>
-          <w:rStyle w:val="VerbatimChar"/>
-        </w:rPr>
-        <w:t xml:space="preserve">Chain 3: Iteration:  400 / 4000 [ 10%]  (Warmup)</w:t>
-      </w:r>
-      <w:r>
-        <w:br/>
-      </w:r>
-      <w:r>
-        <w:rPr>
-          <w:rStyle w:val="VerbatimChar"/>
-        </w:rPr>
-        <w:t xml:space="preserve">Chain 3: Iteration:  800 / 4000 [ 20%]  (Warmup)</w:t>
-      </w:r>
-      <w:r>
-        <w:br/>
-      </w:r>
-      <w:r>
-        <w:rPr>
-          <w:rStyle w:val="VerbatimChar"/>
-        </w:rPr>
-        <w:t xml:space="preserve">Chain 3: Iteration: 1200 / 4000 [ 30%]  (Warmup)</w:t>
-      </w:r>
-      <w:r>
-        <w:br/>
-      </w:r>
-      <w:r>
-        <w:rPr>
-          <w:rStyle w:val="VerbatimChar"/>
-        </w:rPr>
-        <w:t xml:space="preserve">Chain 3: Iteration: 1600 / 4000 [ 40%]  (Warmup)</w:t>
-      </w:r>
-      <w:r>
-        <w:br/>
-      </w:r>
-      <w:r>
-        <w:rPr>
-          <w:rStyle w:val="VerbatimChar"/>
-        </w:rPr>
-        <w:t xml:space="preserve">Chain 3: Iteration: 2000 / 4000 [ 50%]  (Warmup)</w:t>
-      </w:r>
-      <w:r>
-        <w:br/>
-      </w:r>
-      <w:r>
-        <w:rPr>
-          <w:rStyle w:val="VerbatimChar"/>
-        </w:rPr>
-        <w:t xml:space="preserve">Chain 3: Iteration: 2001 / 4000 [ 50%]  (Sampling)</w:t>
-      </w:r>
-      <w:r>
-        <w:br/>
-      </w:r>
-      <w:r>
-        <w:rPr>
-          <w:rStyle w:val="VerbatimChar"/>
-        </w:rPr>
-        <w:t xml:space="preserve">Chain 3: Iteration: 2400 / 4000 [ 60%]  (Sampling)</w:t>
-      </w:r>
-      <w:r>
-        <w:br/>
-      </w:r>
-      <w:r>
-        <w:rPr>
-          <w:rStyle w:val="VerbatimChar"/>
-        </w:rPr>
-        <w:t xml:space="preserve">Chain 3: Iteration: 2800 / 4000 [ 70%]  (Sampling)</w:t>
-      </w:r>
-      <w:r>
-        <w:br/>
-      </w:r>
-      <w:r>
-        <w:rPr>
-          <w:rStyle w:val="VerbatimChar"/>
-        </w:rPr>
-        <w:t xml:space="preserve">Chain 3: Iteration: 3200 / 4000 [ 80%]  (Sampling)</w:t>
-      </w:r>
-      <w:r>
-        <w:br/>
-      </w:r>
-      <w:r>
-        <w:rPr>
-          <w:rStyle w:val="VerbatimChar"/>
-        </w:rPr>
-        <w:t xml:space="preserve">Chain 3: Iteration: 3600 / 4000 [ 90%]  (Sampling)</w:t>
-      </w:r>
-      <w:r>
-        <w:br/>
-      </w:r>
-      <w:r>
-        <w:rPr>
-          <w:rStyle w:val="VerbatimChar"/>
-        </w:rPr>
-        <w:t xml:space="preserve">Chain 3: Iteration: 4000 / 4000 [100%]  (Sampling)</w:t>
-      </w:r>
-      <w:r>
-        <w:br/>
-      </w:r>
-      <w:r>
-        <w:rPr>
-          <w:rStyle w:val="VerbatimChar"/>
-        </w:rPr>
-        <w:t xml:space="preserve">Chain 3: </w:t>
-      </w:r>
-      <w:r>
-        <w:br/>
-      </w:r>
-      <w:r>
-        <w:rPr>
-          <w:rStyle w:val="VerbatimChar"/>
-        </w:rPr>
-        <w:t xml:space="preserve">Chain 3:  Elapsed Time: 0.036 seconds (Warm-up)</w:t>
-      </w:r>
-      <w:r>
-        <w:br/>
-      </w:r>
-      <w:r>
-        <w:rPr>
-          <w:rStyle w:val="VerbatimChar"/>
-        </w:rPr>
-        <w:t xml:space="preserve">Chain 3:                0.03 seconds (Sampling)</w:t>
-      </w:r>
-      <w:r>
-        <w:br/>
-      </w:r>
-      <w:r>
-        <w:rPr>
-          <w:rStyle w:val="VerbatimChar"/>
-        </w:rPr>
-        <w:t xml:space="preserve">Chain 3:                0.066 seconds (Total)</w:t>
-      </w:r>
-      <w:r>
-        <w:br/>
-      </w:r>
-      <w:r>
-        <w:rPr>
-          <w:rStyle w:val="VerbatimChar"/>
-        </w:rPr>
-        <w:t xml:space="preserve">Chain 3: </w:t>
-      </w:r>
-      <w:r>
-        <w:br/>
-      </w:r>
-      <w:r>
-        <w:br/>
-      </w:r>
-      <w:r>
-        <w:rPr>
-          <w:rStyle w:val="VerbatimChar"/>
-        </w:rPr>
-        <w:t xml:space="preserve">SAMPLING FOR MODEL 'anon_model' NOW (CHAIN 4).</w:t>
-      </w:r>
-      <w:r>
-        <w:br/>
-      </w:r>
-      <w:r>
-        <w:rPr>
-          <w:rStyle w:val="VerbatimChar"/>
-        </w:rPr>
-        <w:t xml:space="preserve">Chain 4: </w:t>
-      </w:r>
-      <w:r>
-        <w:br/>
-      </w:r>
-      <w:r>
-        <w:rPr>
-          <w:rStyle w:val="VerbatimChar"/>
-        </w:rPr>
-        <w:t xml:space="preserve">Chain 4: Gradient evaluation took 1e-06 seconds</w:t>
-      </w:r>
-      <w:r>
-        <w:br/>
-      </w:r>
-      <w:r>
-        <w:rPr>
-          <w:rStyle w:val="VerbatimChar"/>
-        </w:rPr>
-        <w:t xml:space="preserve">Chain 4: 1000 transitions using 10 leapfrog steps per transition would take 0.01 seconds.</w:t>
-      </w:r>
-      <w:r>
-        <w:br/>
-      </w:r>
-      <w:r>
-        <w:rPr>
-          <w:rStyle w:val="VerbatimChar"/>
-        </w:rPr>
-        <w:t xml:space="preserve">Chain 4: Adjust your expectations accordingly!</w:t>
-      </w:r>
-      <w:r>
-        <w:br/>
-      </w:r>
-      <w:r>
-        <w:rPr>
-          <w:rStyle w:val="VerbatimChar"/>
-        </w:rPr>
-        <w:t xml:space="preserve">Chain 4: </w:t>
-      </w:r>
-      <w:r>
-        <w:br/>
-      </w:r>
-      <w:r>
-        <w:rPr>
-          <w:rStyle w:val="VerbatimChar"/>
-        </w:rPr>
-        <w:t xml:space="preserve">Chain 4: </w:t>
-      </w:r>
-      <w:r>
-        <w:br/>
-      </w:r>
-      <w:r>
-        <w:rPr>
-          <w:rStyle w:val="VerbatimChar"/>
-        </w:rPr>
-        <w:t xml:space="preserve">Chain 4: Iteration:    1 / 4000 [  0%]  (Warmup)</w:t>
-      </w:r>
-      <w:r>
-        <w:br/>
-      </w:r>
-      <w:r>
-        <w:rPr>
-          <w:rStyle w:val="VerbatimChar"/>
-        </w:rPr>
-        <w:t xml:space="preserve">Chain 4: Iteration:  400 / 4000 [ 10%]  (Warmup)</w:t>
-      </w:r>
-      <w:r>
-        <w:br/>
-      </w:r>
-      <w:r>
-        <w:rPr>
-          <w:rStyle w:val="VerbatimChar"/>
-        </w:rPr>
-        <w:t xml:space="preserve">Chain 4: Iteration:  800 / 4000 [ 20%]  (Warmup)</w:t>
-      </w:r>
-      <w:r>
-        <w:br/>
-      </w:r>
-      <w:r>
-        <w:rPr>
-          <w:rStyle w:val="VerbatimChar"/>
-        </w:rPr>
-        <w:t xml:space="preserve">Chain 4: Iteration: 1200 / 4000 [ 30%]  (Warmup)</w:t>
-      </w:r>
-      <w:r>
-        <w:br/>
-      </w:r>
-      <w:r>
-        <w:rPr>
-          <w:rStyle w:val="VerbatimChar"/>
-        </w:rPr>
-        <w:t xml:space="preserve">Chain 4: Iteration: 1600 / 4000 [ 40%]  (Warmup)</w:t>
-      </w:r>
-      <w:r>
-        <w:br/>
-      </w:r>
-      <w:r>
-        <w:rPr>
-          <w:rStyle w:val="VerbatimChar"/>
-        </w:rPr>
-        <w:t xml:space="preserve">Chain 4: Iteration: 2000 / 4000 [ 50%]  (Warmup)</w:t>
-      </w:r>
-      <w:r>
-        <w:br/>
-      </w:r>
-      <w:r>
-        <w:rPr>
-          <w:rStyle w:val="VerbatimChar"/>
-        </w:rPr>
-        <w:t xml:space="preserve">Chain 4: Iteration: 2001 / 4000 [ 50%]  (Sampling)</w:t>
-      </w:r>
-      <w:r>
-        <w:br/>
-      </w:r>
-      <w:r>
-        <w:rPr>
-          <w:rStyle w:val="VerbatimChar"/>
-        </w:rPr>
-        <w:t xml:space="preserve">Chain 4: Iteration: 2400 / 4000 [ 60%]  (Sampling)</w:t>
-      </w:r>
-      <w:r>
-        <w:br/>
-      </w:r>
-      <w:r>
-        <w:rPr>
-          <w:rStyle w:val="VerbatimChar"/>
-        </w:rPr>
-        <w:t xml:space="preserve">Chain 4: Iteration: 2800 / 4000 [ 70%]  (Sampling)</w:t>
-      </w:r>
-      <w:r>
-        <w:br/>
-      </w:r>
-      <w:r>
-        <w:rPr>
-          <w:rStyle w:val="VerbatimChar"/>
-        </w:rPr>
-        <w:t xml:space="preserve">Chain 4: Iteration: 3200 / 4000 [ 80%]  (Sampling)</w:t>
-      </w:r>
-      <w:r>
-        <w:br/>
-      </w:r>
-      <w:r>
-        <w:rPr>
-          <w:rStyle w:val="VerbatimChar"/>
-        </w:rPr>
-        <w:t xml:space="preserve">Chain 4: Iteration: 3600 / 4000 [ 90%]  (Sampling)</w:t>
-      </w:r>
-      <w:r>
-        <w:br/>
-      </w:r>
-      <w:r>
-        <w:rPr>
-          <w:rStyle w:val="VerbatimChar"/>
-        </w:rPr>
-        <w:t xml:space="preserve">Chain 4: Iteration: 4000 / 4000 [100%]  (Sampling)</w:t>
-      </w:r>
-      <w:r>
-        <w:br/>
-      </w:r>
-      <w:r>
-        <w:rPr>
-          <w:rStyle w:val="VerbatimChar"/>
-        </w:rPr>
-        <w:t xml:space="preserve">Chain 4: </w:t>
-      </w:r>
-      <w:r>
-        <w:br/>
-      </w:r>
-      <w:r>
-        <w:rPr>
-          <w:rStyle w:val="VerbatimChar"/>
-        </w:rPr>
-        <w:t xml:space="preserve">Chain 4:  Elapsed Time: 0.036 seconds (Warm-up)</w:t>
-      </w:r>
-      <w:r>
-        <w:br/>
-      </w:r>
-      <w:r>
-        <w:rPr>
-          <w:rStyle w:val="VerbatimChar"/>
-        </w:rPr>
-        <w:t xml:space="preserve">Chain 4:                0.029 seconds (Sampling)</w:t>
-      </w:r>
-      <w:r>
-        <w:br/>
-      </w:r>
-      <w:r>
-        <w:rPr>
-          <w:rStyle w:val="VerbatimChar"/>
-        </w:rPr>
-        <w:t xml:space="preserve">Chain 4:                0.065 seconds (Total)</w:t>
-      </w:r>
-      <w:r>
-        <w:br/>
-      </w:r>
-      <w:r>
-        <w:rPr>
-          <w:rStyle w:val="VerbatimChar"/>
-        </w:rPr>
-        <w:t xml:space="preserve">Chain 4: </w:t>
-      </w:r>
-    </w:p>
-    <w:p>
-      <w:pPr>
-        <w:pStyle w:val="SourceCode"/>
-      </w:pPr>
-      <w:r>
-        <w:rPr>
-          <w:rStyle w:val="VerbatimChar"/>
-        </w:rPr>
-        <w:t xml:space="preserve">Warning: There were 2 divergent transitions after warmup. See</w:t>
-      </w:r>
-      <w:r>
-        <w:br/>
-      </w:r>
-      <w:r>
-        <w:rPr>
-          <w:rStyle w:val="VerbatimChar"/>
-        </w:rPr>
-        <w:t xml:space="preserve">https://mc-stan.org/misc/warnings.html#divergent-transitions-after-warmup</w:t>
-      </w:r>
-      <w:r>
-        <w:br/>
-      </w:r>
-      <w:r>
-        <w:rPr>
-          <w:rStyle w:val="VerbatimChar"/>
-        </w:rPr>
-        <w:t xml:space="preserve">to find out why this is a problem and how to eliminate them.</w:t>
-      </w:r>
-    </w:p>
-    <w:p>
-      <w:pPr>
-        <w:pStyle w:val="SourceCode"/>
-      </w:pPr>
-      <w:r>
-        <w:rPr>
-          <w:rStyle w:val="VerbatimChar"/>
-        </w:rPr>
-        <w:t xml:space="preserve">Warning: Examine the pairs() plot to diagnose sampling problems</w:t>
-      </w:r>
-    </w:p>
-    <w:p>
-      <w:pPr>
-        <w:pStyle w:val="FirstParagraph"/>
-      </w:pPr>
-      <w:r>
-        <w:drawing>
-          <wp:inline>
-            <wp:extent cx="5943600" cy="3200400"/>
-            <wp:effectExtent b="0" l="0" r="0" t="0"/>
-            <wp:docPr descr="" title="" id="24" name="Picture"/>
-            <a:graphic>
-              <a:graphicData uri="http://schemas.openxmlformats.org/drawingml/2006/picture">
-                <pic:pic>
-                  <pic:nvPicPr>
-                    <pic:cNvPr descr="manuscript_files/figure-docx/test_ref-2.png" id="25" name="Picture"/>
-                    <pic:cNvPicPr>
-                      <a:picLocks noChangeArrowheads="1" noChangeAspect="1"/>
-                    </pic:cNvPicPr>
-                  </pic:nvPicPr>
-                  <pic:blipFill>
-                    <a:blip r:embed="rId23"/>
-                    <a:stretch>
-                      <a:fillRect/>
-                    </a:stretch>
-                  </pic:blipFill>
-                  <pic:spPr bwMode="auto">
-                    <a:xfrm>
-                      <a:off x="0" y="0"/>
-                      <a:ext cx="5943600" cy="3200400"/>
-                    </a:xfrm>
-                    <a:prstGeom prst="rect">
-                      <a:avLst/>
-                    </a:prstGeom>
-                    <a:noFill/>
-                    <a:ln w="9525">
-                      <a:noFill/>
-                      <a:headEnd/>
-                      <a:tailEnd/>
-                    </a:ln>
-                  </pic:spPr>
-                </pic:pic>
-              </a:graphicData>
-            </a:graphic>
-          </wp:inline>
-        </w:drawing>
-      </w:r>
-    </w:p>
-    <w:p>
-      <w:pPr>
-        <w:pStyle w:val="SourceCode"/>
+        <w:pStyle w:val="Source Code"/>
       </w:pPr>
       <w:r>
         <w:rPr>
@@ -2130,7 +240,7 @@
         <w:rPr>
           <w:rStyle w:val="VerbatimChar"/>
         </w:rPr>
-        <w:t xml:space="preserve">sd(Intercept)     1.92      0.55     1.04     3.20 1.00     1903     3364</w:t>
+        <w:t xml:space="preserve">sd(Intercept)     1.94      0.55     1.05     3.19 1.00     1796     3188</w:t>
       </w:r>
       <w:r>
         <w:br/>
@@ -2160,7 +270,7 @@
         <w:rPr>
           <w:rStyle w:val="VerbatimChar"/>
         </w:rPr>
-        <w:t xml:space="preserve">Intercept    -2.08      0.63    -3.39    -0.91 1.00     1890     2727</w:t>
+        <w:t xml:space="preserve">Intercept    -2.10      0.65    -3.44    -0.87 1.00     1843     3230</w:t>
       </w:r>
       <w:r>
         <w:br/>
@@ -2223,7 +333,7 @@
         <w:t xml:space="preserve">scale reduction factor on split chains (at convergence, Rhat = 1).</w:t>
       </w:r>
     </w:p>
-    <w:bookmarkStart w:id="28" w:name="notes"/>
+    <w:bookmarkStart w:id="22" w:name="notes"/>
     <w:p>
       <w:pPr>
         <w:pStyle w:val="Heading 1"/>
@@ -2246,7 +356,7 @@
       <w:r>
         <w:t xml:space="preserve"> </w:t>
       </w:r>
-      <w:hyperlink r:id="rId26">
+      <w:hyperlink r:id="rId20">
         <w:r>
           <w:rPr>
             <w:rStyle w:val="Hyperlink"/>
@@ -2269,7 +379,7 @@
       <w:r>
         <w:t xml:space="preserve"> </w:t>
       </w:r>
-      <w:hyperlink r:id="rId27">
+      <w:hyperlink r:id="rId21">
         <w:r>
           <w:rPr>
             <w:rStyle w:val="Hyperlink"/>
@@ -2284,8 +394,8 @@
         <w:t xml:space="preserve">for structure</w:t>
       </w:r>
     </w:p>
-    <w:bookmarkEnd w:id="28"/>
-    <w:bookmarkStart w:id="29" w:name="abstract"/>
+    <w:bookmarkEnd w:id="22"/>
+    <w:bookmarkStart w:id="23" w:name="abstract"/>
     <w:p>
       <w:pPr>
         <w:pStyle w:val="Heading 1"/>
@@ -2294,8 +404,8 @@
         <w:t xml:space="preserve">Abstract</w:t>
       </w:r>
     </w:p>
-    <w:bookmarkEnd w:id="29"/>
-    <w:bookmarkStart w:id="30" w:name="background"/>
+    <w:bookmarkEnd w:id="23"/>
+    <w:bookmarkStart w:id="24" w:name="background"/>
     <w:p>
       <w:pPr>
         <w:pStyle w:val="Heading 1"/>
@@ -2328,8 +438,8 @@
         <w:t xml:space="preserve">☐ Aim of this study</w:t>
       </w:r>
     </w:p>
-    <w:bookmarkEnd w:id="30"/>
-    <w:bookmarkStart w:id="31" w:name="methods"/>
+    <w:bookmarkEnd w:id="24"/>
+    <w:bookmarkStart w:id="25" w:name="methods"/>
     <w:p>
       <w:pPr>
         <w:pStyle w:val="Heading 1"/>
@@ -2410,8 +520,8 @@
         <w:t xml:space="preserve">☐ Method to assess robustness of synthesized results</w:t>
       </w:r>
     </w:p>
-    <w:bookmarkEnd w:id="31"/>
-    <w:bookmarkStart w:id="32" w:name="results"/>
+    <w:bookmarkEnd w:id="25"/>
+    <w:bookmarkStart w:id="26" w:name="results"/>
     <w:p>
       <w:pPr>
         <w:pStyle w:val="Heading 1"/>
@@ -2480,8 +590,8 @@
         <w:t xml:space="preserve">☐ Forest plots</w:t>
       </w:r>
     </w:p>
-    <w:bookmarkEnd w:id="32"/>
-    <w:bookmarkStart w:id="33" w:name="discussion"/>
+    <w:bookmarkEnd w:id="26"/>
+    <w:bookmarkStart w:id="27" w:name="discussion"/>
     <w:p>
       <w:pPr>
         <w:pStyle w:val="Heading 1"/>
@@ -2526,8 +636,8 @@
         <w:t xml:space="preserve">☐ Study limitations &amp; strengths</w:t>
       </w:r>
     </w:p>
-    <w:bookmarkEnd w:id="33"/>
-    <w:bookmarkStart w:id="34" w:name="conclusions"/>
+    <w:bookmarkEnd w:id="27"/>
+    <w:bookmarkStart w:id="28" w:name="conclusions"/>
     <w:p>
       <w:pPr>
         <w:pStyle w:val="Heading 1"/>
@@ -2560,8 +670,8 @@
         <w:t xml:space="preserve">☐ Implications of results: policy, (scientific?) practice, future research needs</w:t>
       </w:r>
     </w:p>
-    <w:bookmarkEnd w:id="34"/>
-    <w:bookmarkStart w:id="35" w:name="list-of-abbreviations"/>
+    <w:bookmarkEnd w:id="28"/>
+    <w:bookmarkStart w:id="31" w:name="list-of-abbreviations"/>
     <w:p>
       <w:pPr>
         <w:pStyle w:val="Heading 1"/>
@@ -2575,10 +685,69 @@
         <w:pStyle w:val="FirstParagraph"/>
       </w:pPr>
       <w:r>
-        <w:t xml:space="preserve">Normal text example</w:t>
-      </w:r>
-    </w:p>
-    <w:bookmarkEnd w:id="35"/>
+        <w:t xml:space="preserve">Normal text example exapsi</w:t>
+      </w:r>
+    </w:p>
+    <w:bookmarkStart w:id="30" w:name="setting-priors"/>
+    <w:p>
+      <w:pPr>
+        <w:pStyle w:val="Heading2"/>
+      </w:pPr>
+      <w:r>
+        <w:t xml:space="preserve">Setting Priors</w:t>
+      </w:r>
+    </w:p>
+    <w:p>
+      <w:pPr>
+        <w:pStyle w:val="FirstParagraph"/>
+      </w:pPr>
+      <w:r>
+        <w:t xml:space="preserve">First, we need to define the priors.</w:t>
+      </w:r>
+      <w:r>
+        <w:t xml:space="preserve"> </w:t>
+      </w:r>
+      <w:r>
+        <w:t xml:space="preserve">In Bayesian statistics, a prior distribution represents our initial belief about an unknown parameter before observing any data.</w:t>
+      </w:r>
+      <w:r>
+        <w:t xml:space="preserve"> </w:t>
+      </w:r>
+      <w:r>
+        <w:t xml:space="preserve">It’s a probability distribution reflecting our knowledge or assumptions about the parameter’s possible values.</w:t>
+      </w:r>
+      <w:r>
+        <w:t xml:space="preserve"> </w:t>
+      </w:r>
+      <w:r>
+        <w:t xml:space="preserve">This prior distribution is then combined with the likelihood function (based on observed data) to produce a posterior distribution, which represents our updated belief after considering the data.</w:t>
+      </w:r>
+      <w:r>
+        <w:t xml:space="preserve"> </w:t>
+      </w:r>
+      <w:r>
+        <w:t xml:space="preserve">You can read more about choosing prior distributions in Bayesian statistics in this</w:t>
+      </w:r>
+      <w:r>
+        <w:t xml:space="preserve"> </w:t>
+      </w:r>
+      <w:hyperlink r:id="rId29">
+        <w:r>
+          <w:rPr>
+            <w:rStyle w:val="Hyperlink"/>
+          </w:rPr>
+          <w:t xml:space="preserve">book chapter</w:t>
+        </w:r>
+      </w:hyperlink>
+      <w:r>
+        <w:t xml:space="preserve">.</w:t>
+      </w:r>
+      <w:r>
+        <w:br/>
+      </w:r>
+    </w:p>
+    <w:bookmarkEnd w:id="30"/>
+    <w:bookmarkEnd w:id="31"/>
     <w:sectPr>
       <w:headerReference r:id="rId9" w:type="default"/>
       <w:footerReference r:id="rId10" w:type="default"/>
@@ -3648,60 +1817,24 @@
       </w14:textFill>
     </w:rPr>
   </w:style>
-  <w:style w:styleId="Imported Style 1" w:type="numbering">
-    <w:name w:val="Imported Style 1"/>
-    <w:pPr>
-      <w:numPr>
-        <w:numId w:val="1"/>
-      </w:numPr>
-    </w:pPr>
-  </w:style>
-  <w:style w:styleId="Link" w:type="character">
-    <w:name w:val="Link"/>
-    <w:rPr>
-      <w:outline w:val="0"/>
-      <w:color w:val="0000ff"/>
-      <w:u w:color="0000ff" w:val="single"/>
-      <w14:textFill>
-        <w14:solidFill>
-          <w14:srgbClr w14:val="0000FF"/>
-        </w14:solidFill>
-      </w14:textFill>
-    </w:rPr>
-  </w:style>
-  <w:style w:styleId="Hyperlink.0" w:type="character">
-    <w:name w:val="Hyperlink.0"/>
-    <w:basedOn w:val="Link"/>
-    <w:next w:val="Hyperlink.0"/>
-    <w:rPr>
-      <w:outline w:val="0"/>
-      <w:color w:val="000000"/>
-      <w:u w:color="000000"/>
-      <w14:textFill>
-        <w14:solidFill>
-          <w14:srgbClr w14:val="000000"/>
-        </w14:solidFill>
-      </w14:textFill>
-    </w:rPr>
-  </w:style>
-  <w:style w:styleId="Word Default Style" w:type="paragraph">
-    <w:name w:val="Word Default Style"/>
-    <w:next w:val="Word Default Style"/>
+  <w:style w:styleId="Source Code" w:type="paragraph">
+    <w:name w:val="Source Code"/>
+    <w:next w:val="Source Code"/>
     <w:pPr>
       <w:keepNext w:val="0"/>
       <w:keepLines w:val="0"/>
       <w:pageBreakBefore w:val="0"/>
       <w:widowControl w:val="1"/>
-      <w:shd w:color="auto" w:fill="auto" w:val="clear"/>
+      <w:shd w:color="auto" w:fill="f1f3f5" w:val="clear"/>
       <w:suppressAutoHyphens w:val="0"/>
       <w:bidi w:val="0"/>
-      <w:spacing w:after="0" w:before="0" w:line="240" w:lineRule="auto"/>
+      <w:spacing w:after="200" w:before="200" w:line="240" w:lineRule="auto"/>
       <w:ind w:firstLine="0" w:left="0" w:right="0"/>
       <w:jc w:val="left"/>
       <w:outlineLvl w:val="9"/>
     </w:pPr>
     <w:rPr>
-      <w:rFonts w:ascii="Helvetica Neue" w:cs="Arial Unicode MS" w:eastAsia="Arial Unicode MS" w:hAnsi="Helvetica Neue"/>
+      <w:rFonts w:ascii="Courier New" w:cs="Arial Unicode MS" w:eastAsia="Arial Unicode MS" w:hAnsi="Courier New"/>
       <w:b w:val="0"/>
       <w:bCs w:val="0"/>
       <w:i w:val="0"/>
@@ -3717,10 +1850,10 @@
       <w:position w:val="0"/>
       <w:sz w:val="24"/>
       <w:szCs w:val="24"/>
-      <w:u w:val="none"/>
+      <w:u w:color="000000" w:val="none"/>
       <w:shd w:color="auto" w:fill="auto" w:val="nil"/>
       <w:vertAlign w:val="baseline"/>
-      <w:lang w:val="de-DE"/>
+      <w:lang w:val="en-US"/>
       <w14:textFill>
         <w14:solidFill>
           <w14:srgbClr w14:val="000000"/>
@@ -3728,14 +1861,52 @@
       </w14:textFill>
     </w:rPr>
   </w:style>
-  <w:style w:type="paragraph" w:customStyle="1" w:styleId="SourceCode">
-    <w:name w:val="Source Code"/>
-    <w:basedOn w:val="Normal"/>
-    <w:link w:val="VerbatimChar"/>
+  <w:style w:styleId="Imported Style 1" w:type="numbering">
+    <w:name w:val="Imported Style 1"/>
     <w:pPr>
-      <w:wordWrap w:val="off"/>
-      <w:shd w:val="clear" w:fill="f1f3f5"/>
+      <w:numPr>
+        <w:numId w:val="1"/>
+      </w:numPr>
     </w:pPr>
+  </w:style>
+  <w:style w:styleId="Link" w:type="character">
+    <w:name w:val="Link"/>
+    <w:rPr>
+      <w:outline w:val="0"/>
+      <w:color w:val="0000ff"/>
+      <w:u w:color="0000ff" w:val="single"/>
+      <w14:textFill>
+        <w14:solidFill>
+          <w14:srgbClr w14:val="0000FF"/>
+        </w14:solidFill>
+      </w14:textFill>
+    </w:rPr>
+  </w:style>
+  <w:style w:styleId="Hyperlink.0" w:type="character">
+    <w:name w:val="Hyperlink.0"/>
+    <w:basedOn w:val="Link"/>
+    <w:next w:val="Hyperlink.0"/>
+    <w:rPr>
+      <w:outline w:val="0"/>
+      <w:color w:val="000000"/>
+      <w:u w:color="000000"/>
+      <w14:textFill>
+        <w14:solidFill>
+          <w14:srgbClr w14:val="000000"/>
+        </w14:solidFill>
+      </w14:textFill>
+    </w:rPr>
+  </w:style>
+  <w:style w:styleId="None" w:type="character">
+    <w:name w:val="None"/>
+  </w:style>
+  <w:style w:styleId="Hyperlink.1" w:type="character">
+    <w:name w:val="Hyperlink.1"/>
+    <w:basedOn w:val="None"/>
+    <w:next w:val="Hyperlink.1"/>
+    <w:rPr>
+      <w:rFonts w:ascii="Helvetica Neue" w:cs="Helvetica Neue" w:eastAsia="Helvetica Neue" w:hAnsi="Helvetica Neue"/>
+    </w:rPr>
   </w:style>
   <w:style w:type="character" w:customStyle="1" w:styleId="KeywordTok">
     <w:name w:val="KeywordTok"/>

</xml_diff>

<commit_message>
add authors and table for abbreviations (test)
</commit_message>
<xml_diff>
--- a/manuscript/manuscript.docx
+++ b/manuscript/manuscript.docx
@@ -94,6 +94,34 @@
       </w:r>
       <w:r>
         <w:t xml:space="preserve">Sell</w:t>
+      </w:r>
+    </w:p>
+    <w:p>
+      <w:pPr>
+        <w:pStyle w:val="Author"/>
+      </w:pPr>
+      <w:r>
+        <w:t xml:space="preserve">Margaux</w:t>
+      </w:r>
+      <w:r>
+        <w:t xml:space="preserve"> </w:t>
+      </w:r>
+      <w:r>
+        <w:t xml:space="preserve">Sanchez</w:t>
+      </w:r>
+    </w:p>
+    <w:p>
+      <w:pPr>
+        <w:pStyle w:val="Author"/>
+      </w:pPr>
+      <w:r>
+        <w:t xml:space="preserve">Philippe</w:t>
+      </w:r>
+      <w:r>
+        <w:t xml:space="preserve"> </w:t>
+      </w:r>
+      <w:r>
+        <w:t xml:space="preserve">Palmont</w:t>
       </w:r>
     </w:p>
     <w:p>
@@ -148,192 +176,7 @@
         </w:p>
       </w:sdtContent>
     </w:sdt>
-    <w:p>
-      <w:pPr>
-        <w:pStyle w:val="SourceCode"/>
-      </w:pPr>
-      <w:r>
-        <w:rPr>
-          <w:rStyle w:val="VerbatimChar"/>
-        </w:rPr>
-        <w:t xml:space="preserve"> Family: gaussian </w:t>
-      </w:r>
-      <w:r>
-        <w:br/>
-      </w:r>
-      <w:r>
-        <w:rPr>
-          <w:rStyle w:val="VerbatimChar"/>
-        </w:rPr>
-        <w:t xml:space="preserve">  Links: mu = identity; sigma = identity </w:t>
-      </w:r>
-      <w:r>
-        <w:br/>
-      </w:r>
-      <w:r>
-        <w:rPr>
-          <w:rStyle w:val="VerbatimChar"/>
-        </w:rPr>
-        <w:t xml:space="preserve">Formula: beta_ln | se(se_beta_ln) ~ 1 + (1 | author_year) </w:t>
-      </w:r>
-      <w:r>
-        <w:br/>
-      </w:r>
-      <w:r>
-        <w:rPr>
-          <w:rStyle w:val="VerbatimChar"/>
-        </w:rPr>
-        <w:t xml:space="preserve">   Data: data (Number of observations: 12) </w:t>
-      </w:r>
-      <w:r>
-        <w:br/>
-      </w:r>
-      <w:r>
-        <w:rPr>
-          <w:rStyle w:val="VerbatimChar"/>
-        </w:rPr>
-        <w:t xml:space="preserve">  Draws: 4 chains, each with iter = 4000; warmup = 2000; thin = 1;</w:t>
-      </w:r>
-      <w:r>
-        <w:br/>
-      </w:r>
-      <w:r>
-        <w:rPr>
-          <w:rStyle w:val="VerbatimChar"/>
-        </w:rPr>
-        <w:t xml:space="preserve">         total post-warmup draws = 8000</w:t>
-      </w:r>
-      <w:r>
-        <w:br/>
-      </w:r>
-      <w:r>
-        <w:br/>
-      </w:r>
-      <w:r>
-        <w:rPr>
-          <w:rStyle w:val="VerbatimChar"/>
-        </w:rPr>
-        <w:t xml:space="preserve">Multilevel Hyperparameters:</w:t>
-      </w:r>
-      <w:r>
-        <w:br/>
-      </w:r>
-      <w:r>
-        <w:rPr>
-          <w:rStyle w:val="VerbatimChar"/>
-        </w:rPr>
-        <w:t xml:space="preserve">~author_year (Number of levels: 12) </w:t>
-      </w:r>
-      <w:r>
-        <w:br/>
-      </w:r>
-      <w:r>
-        <w:rPr>
-          <w:rStyle w:val="VerbatimChar"/>
-        </w:rPr>
-        <w:t xml:space="preserve">              Estimate Est.Error l-95% CI u-95% CI Rhat Bulk_ESS Tail_ESS</w:t>
-      </w:r>
-      <w:r>
-        <w:br/>
-      </w:r>
-      <w:r>
-        <w:rPr>
-          <w:rStyle w:val="VerbatimChar"/>
-        </w:rPr>
-        <w:t xml:space="preserve">sd(Intercept)     1.94      0.55     1.05     3.19 1.00     1796     3188</w:t>
-      </w:r>
-      <w:r>
-        <w:br/>
-      </w:r>
-      <w:r>
-        <w:br/>
-      </w:r>
-      <w:r>
-        <w:rPr>
-          <w:rStyle w:val="VerbatimChar"/>
-        </w:rPr>
-        <w:t xml:space="preserve">Regression Coefficients:</w:t>
-      </w:r>
-      <w:r>
-        <w:br/>
-      </w:r>
-      <w:r>
-        <w:rPr>
-          <w:rStyle w:val="VerbatimChar"/>
-        </w:rPr>
-        <w:t xml:space="preserve">          Estimate Est.Error l-95% CI u-95% CI Rhat Bulk_ESS Tail_ESS</w:t>
-      </w:r>
-      <w:r>
-        <w:br/>
-      </w:r>
-      <w:r>
-        <w:rPr>
-          <w:rStyle w:val="VerbatimChar"/>
-        </w:rPr>
-        <w:t xml:space="preserve">Intercept    -2.10      0.65    -3.44    -0.87 1.00     1843     3230</w:t>
-      </w:r>
-      <w:r>
-        <w:br/>
-      </w:r>
-      <w:r>
-        <w:br/>
-      </w:r>
-      <w:r>
-        <w:rPr>
-          <w:rStyle w:val="VerbatimChar"/>
-        </w:rPr>
-        <w:t xml:space="preserve">Further Distributional Parameters:</w:t>
-      </w:r>
-      <w:r>
-        <w:br/>
-      </w:r>
-      <w:r>
-        <w:rPr>
-          <w:rStyle w:val="VerbatimChar"/>
-        </w:rPr>
-        <w:t xml:space="preserve">      Estimate Est.Error l-95% CI u-95% CI Rhat Bulk_ESS Tail_ESS</w:t>
-      </w:r>
-      <w:r>
-        <w:br/>
-      </w:r>
-      <w:r>
-        <w:rPr>
-          <w:rStyle w:val="VerbatimChar"/>
-        </w:rPr>
-        <w:t xml:space="preserve">sigma     0.00      0.00     0.00     0.00   NA       NA       NA</w:t>
-      </w:r>
-      <w:r>
-        <w:br/>
-      </w:r>
-      <w:r>
-        <w:br/>
-      </w:r>
-      <w:r>
-        <w:rPr>
-          <w:rStyle w:val="VerbatimChar"/>
-        </w:rPr>
-        <w:t xml:space="preserve">Draws were sampled using sampling(NUTS). For each parameter, Bulk_ESS</w:t>
-      </w:r>
-      <w:r>
-        <w:br/>
-      </w:r>
-      <w:r>
-        <w:rPr>
-          <w:rStyle w:val="VerbatimChar"/>
-        </w:rPr>
-        <w:t xml:space="preserve">and Tail_ESS are effective sample size measures, and Rhat is the potential</w:t>
-      </w:r>
-      <w:r>
-        <w:br/>
-      </w:r>
-      <w:r>
-        <w:rPr>
-          <w:rStyle w:val="VerbatimChar"/>
-        </w:rPr>
-        <w:t xml:space="preserve">scale reduction factor on split chains (at convergence, Rhat = 1).</w:t>
-      </w:r>
-    </w:p>
-    <w:bookmarkStart w:id="22" w:name="notes"/>
+    <w:bookmarkStart w:id="23" w:name="notes"/>
     <w:p>
       <w:pPr>
         <w:pStyle w:val="Heading1"/>
@@ -403,13 +246,24 @@
         </w:numPr>
       </w:pPr>
       <w:r>
-        <w:t xml:space="preserve">Reference</w:t>
+        <w:t xml:space="preserve">Using</w:t>
       </w:r>
       <w:r>
         <w:t xml:space="preserve"> </w:t>
       </w:r>
-      <w:r>
-        <w:t xml:space="preserve">(1)</w:t>
+      <w:hyperlink r:id="rId22">
+        <w:r>
+          <w:rPr>
+            <w:rStyle w:val="Hyperlink"/>
+          </w:rPr>
+          <w:t xml:space="preserve">raRoB tool</w:t>
+        </w:r>
+      </w:hyperlink>
+      <w:r>
+        <w:t xml:space="preserve"> </w:t>
+      </w:r>
+      <w:r>
+        <w:t xml:space="preserve">for Risk of Bias Assessment</w:t>
       </w:r>
     </w:p>
     <w:p>
@@ -421,11 +275,17 @@
         </w:numPr>
       </w:pPr>
       <w:r>
-        <w:t xml:space="preserve">testtest?</w:t>
-      </w:r>
-    </w:p>
-    <w:bookmarkEnd w:id="22"/>
-    <w:bookmarkStart w:id="23" w:name="abstract"/>
+        <w:t xml:space="preserve">Test reference</w:t>
+      </w:r>
+      <w:r>
+        <w:t xml:space="preserve"> </w:t>
+      </w:r>
+      <w:r>
+        <w:t xml:space="preserve">(1)</w:t>
+      </w:r>
+    </w:p>
+    <w:bookmarkEnd w:id="23"/>
+    <w:bookmarkStart w:id="24" w:name="abstract"/>
     <w:p>
       <w:pPr>
         <w:pStyle w:val="Heading1"/>
@@ -434,8 +294,8 @@
         <w:t xml:space="preserve">Abstract</w:t>
       </w:r>
     </w:p>
-    <w:bookmarkEnd w:id="23"/>
-    <w:bookmarkStart w:id="24" w:name="background"/>
+    <w:bookmarkEnd w:id="24"/>
+    <w:bookmarkStart w:id="25" w:name="background"/>
     <w:p>
       <w:pPr>
         <w:pStyle w:val="Heading1"/>
@@ -468,8 +328,8 @@
         <w:t xml:space="preserve">☐ Aim of this study</w:t>
       </w:r>
     </w:p>
-    <w:bookmarkEnd w:id="24"/>
-    <w:bookmarkStart w:id="25" w:name="methods"/>
+    <w:bookmarkEnd w:id="25"/>
+    <w:bookmarkStart w:id="26" w:name="methods"/>
     <w:p>
       <w:pPr>
         <w:pStyle w:val="Heading1"/>
@@ -550,8 +410,8 @@
         <w:t xml:space="preserve">☐ Method to assess robustness of synthesized results</w:t>
       </w:r>
     </w:p>
-    <w:bookmarkEnd w:id="25"/>
-    <w:bookmarkStart w:id="26" w:name="results"/>
+    <w:bookmarkEnd w:id="26"/>
+    <w:bookmarkStart w:id="27" w:name="results"/>
     <w:p>
       <w:pPr>
         <w:pStyle w:val="Heading1"/>
@@ -620,8 +480,8 @@
         <w:t xml:space="preserve">☐ Forest plots</w:t>
       </w:r>
     </w:p>
-    <w:bookmarkEnd w:id="26"/>
-    <w:bookmarkStart w:id="27" w:name="discussion"/>
+    <w:bookmarkEnd w:id="27"/>
+    <w:bookmarkStart w:id="28" w:name="discussion"/>
     <w:p>
       <w:pPr>
         <w:pStyle w:val="Heading1"/>
@@ -666,8 +526,8 @@
         <w:t xml:space="preserve">☐ Study limitations &amp; strengths</w:t>
       </w:r>
     </w:p>
-    <w:bookmarkEnd w:id="27"/>
-    <w:bookmarkStart w:id="28" w:name="conclusions"/>
+    <w:bookmarkEnd w:id="28"/>
+    <w:bookmarkStart w:id="29" w:name="conclusions"/>
     <w:p>
       <w:pPr>
         <w:pStyle w:val="Heading1"/>
@@ -700,84 +560,162 @@
         <w:t xml:space="preserve">☐ Implications of results: policy, (scientific?) practice, future research needs</w:t>
       </w:r>
     </w:p>
-    <w:bookmarkEnd w:id="28"/>
-    <w:bookmarkStart w:id="32" w:name="list-of-abbreviations"/>
+    <w:bookmarkEnd w:id="29"/>
+    <w:bookmarkStart w:id="30" w:name="list-of-abbreviations"/>
     <w:p>
       <w:pPr>
         <w:pStyle w:val="Heading1"/>
       </w:pPr>
       <w:r>
-        <w:t xml:space="preserve">List of abbreviations</w:t>
-      </w:r>
-    </w:p>
-    <w:p>
-      <w:pPr>
-        <w:pStyle w:val="Compact"/>
-        <w:numPr>
-          <w:ilvl w:val="0"/>
-          <w:numId w:val="1007"/>
-        </w:numPr>
-      </w:pPr>
-      <w:r>
-        <w:t xml:space="preserve">Text example</w:t>
-      </w:r>
-    </w:p>
-    <w:bookmarkStart w:id="31" w:name="title-2"/>
-    <w:p>
-      <w:pPr>
-        <w:pStyle w:val="Heading2"/>
-      </w:pPr>
-      <w:r>
-        <w:t xml:space="preserve">5.1 Title 2</w:t>
-      </w:r>
-    </w:p>
-    <w:p>
-      <w:pPr>
-        <w:pStyle w:val="FirstParagraph"/>
-      </w:pPr>
-      <w:r>
-        <w:t xml:space="preserve">Text example</w:t>
-      </w:r>
-    </w:p>
-    <w:bookmarkStart w:id="30" w:name="title-3"/>
-    <w:p>
-      <w:pPr>
-        <w:pStyle w:val="Heading3"/>
-      </w:pPr>
-      <w:r>
-        <w:t xml:space="preserve">5.1.1 Title 3</w:t>
-      </w:r>
-    </w:p>
-    <w:p>
-      <w:pPr>
-        <w:pStyle w:val="FirstParagraph"/>
-      </w:pPr>
-      <w:r>
-        <w:t xml:space="preserve">Text example</w:t>
-      </w:r>
-    </w:p>
-    <w:bookmarkStart w:id="29" w:name="title-4"/>
-    <w:p>
-      <w:pPr>
-        <w:pStyle w:val="Heading4"/>
-      </w:pPr>
-      <w:r>
-        <w:t xml:space="preserve">5.1.1.1 Title 4</w:t>
-      </w:r>
-    </w:p>
-    <w:p>
-      <w:pPr>
-        <w:pStyle w:val="FirstParagraph"/>
-      </w:pPr>
-      <w:r>
-        <w:t xml:space="preserve">Text example</w:t>
-      </w:r>
-    </w:p>
-    <w:bookmarkEnd w:id="29"/>
+        <w:t xml:space="preserve">List of Abbreviations</w:t>
+      </w:r>
+    </w:p>
+    <w:tbl>
+      <w:tblPr>
+        <w:tblStyle w:val="Table"/>
+        <w:tblW w:type="auto" w:w="0"/>
+        <w:tblLook w:firstRow="1" w:lastRow="0" w:firstColumn="0" w:lastColumn="0" w:noHBand="0" w:noVBand="0" w:val="0020"/>
+      </w:tblPr>
+      <w:tblGrid>
+        <w:gridCol w:w="3960"/>
+        <w:gridCol w:w="3960"/>
+      </w:tblGrid>
+      <w:tr>
+        <w:trPr>
+          <w:tblHeader w:val="on"/>
+        </w:trPr>
+        <w:tc>
+          <w:tcPr/>
+          <w:p>
+            <w:pPr>
+              <w:pStyle w:val="Compact"/>
+              <w:jc w:val="left"/>
+            </w:pPr>
+            <w:r>
+              <w:t xml:space="preserve">Abbreviation</w:t>
+            </w:r>
+          </w:p>
+        </w:tc>
+        <w:tc>
+          <w:tcPr/>
+          <w:p>
+            <w:pPr>
+              <w:pStyle w:val="Compact"/>
+              <w:jc w:val="left"/>
+            </w:pPr>
+            <w:r>
+              <w:t xml:space="preserve">Meaning</w:t>
+            </w:r>
+          </w:p>
+        </w:tc>
+      </w:tr>
+      <w:tr>
+        <w:tc>
+          <w:tcPr/>
+          <w:p>
+            <w:pPr>
+              <w:pStyle w:val="Compact"/>
+              <w:jc w:val="left"/>
+            </w:pPr>
+            <w:r>
+              <w:t xml:space="preserve">EBD</w:t>
+            </w:r>
+          </w:p>
+        </w:tc>
+        <w:tc>
+          <w:tcPr/>
+          <w:p>
+            <w:pPr>
+              <w:pStyle w:val="Compact"/>
+              <w:jc w:val="left"/>
+            </w:pPr>
+            <w:r>
+              <w:t xml:space="preserve">Environmental Burden of Disease</w:t>
+            </w:r>
+          </w:p>
+        </w:tc>
+      </w:tr>
+      <w:tr>
+        <w:tc>
+          <w:tcPr/>
+          <w:p>
+            <w:pPr>
+              <w:pStyle w:val="Compact"/>
+              <w:jc w:val="left"/>
+            </w:pPr>
+            <w:r>
+              <w:t xml:space="preserve">YLL</w:t>
+            </w:r>
+          </w:p>
+        </w:tc>
+        <w:tc>
+          <w:tcPr/>
+          <w:p>
+            <w:pPr>
+              <w:pStyle w:val="Compact"/>
+              <w:jc w:val="left"/>
+            </w:pPr>
+            <w:r>
+              <w:t xml:space="preserve">Years of Life Lost</w:t>
+            </w:r>
+          </w:p>
+        </w:tc>
+      </w:tr>
+      <w:tr>
+        <w:tc>
+          <w:tcPr/>
+          <w:p>
+            <w:pPr>
+              <w:pStyle w:val="Compact"/>
+              <w:jc w:val="left"/>
+            </w:pPr>
+            <w:r>
+              <w:t xml:space="preserve">YLD</w:t>
+            </w:r>
+          </w:p>
+        </w:tc>
+        <w:tc>
+          <w:tcPr/>
+          <w:p>
+            <w:pPr>
+              <w:pStyle w:val="Compact"/>
+              <w:jc w:val="left"/>
+            </w:pPr>
+            <w:r>
+              <w:t xml:space="preserve">Years Lived with Disability</w:t>
+            </w:r>
+          </w:p>
+        </w:tc>
+      </w:tr>
+      <w:tr>
+        <w:tc>
+          <w:tcPr/>
+          <w:p>
+            <w:pPr>
+              <w:pStyle w:val="Compact"/>
+              <w:jc w:val="left"/>
+            </w:pPr>
+            <w:r>
+              <w:t xml:space="preserve">DALY</w:t>
+            </w:r>
+          </w:p>
+        </w:tc>
+        <w:tc>
+          <w:tcPr/>
+          <w:p>
+            <w:pPr>
+              <w:pStyle w:val="Compact"/>
+              <w:jc w:val="left"/>
+            </w:pPr>
+            <w:r>
+              <w:t xml:space="preserve">Disability-adjusted Life Year</w:t>
+            </w:r>
+          </w:p>
+        </w:tc>
+      </w:tr>
+    </w:tbl>
     <w:bookmarkEnd w:id="30"/>
-    <w:bookmarkEnd w:id="31"/>
-    <w:bookmarkEnd w:id="32"/>
-    <w:bookmarkStart w:id="36" w:name="bibliography"/>
+    <w:bookmarkStart w:id="34" w:name="bibliography"/>
     <w:p>
       <w:pPr>
         <w:pStyle w:val="Heading1"/>
@@ -786,8 +724,8 @@
         <w:t xml:space="preserve">References</w:t>
       </w:r>
     </w:p>
-    <w:bookmarkStart w:id="35" w:name="refs"/>
-    <w:bookmarkStart w:id="34" w:name="ref-cao2010DoesBackgroundPostnatal"/>
+    <w:bookmarkStart w:id="33" w:name="refs"/>
+    <w:bookmarkStart w:id="32" w:name="ref-cao2010DoesBackgroundPostnatal"/>
     <w:p>
       <w:pPr>
         <w:pStyle w:val="Bibliography"/>
@@ -807,7 +745,7 @@
       <w:r>
         <w:t xml:space="preserve"> </w:t>
       </w:r>
-      <w:hyperlink r:id="rId33">
+      <w:hyperlink r:id="rId31">
         <w:r>
           <w:rPr>
             <w:rStyle w:val="Hyperlink"/>
@@ -822,9 +760,9 @@
         <w:t xml:space="preserve"> </w:t>
       </w:r>
     </w:p>
+    <w:bookmarkEnd w:id="32"/>
+    <w:bookmarkEnd w:id="33"/>
     <w:bookmarkEnd w:id="34"/>
-    <w:bookmarkEnd w:id="35"/>
-    <w:bookmarkEnd w:id="36"/>
     <w:sectPr>
       <w:headerReference r:id="rId9" w:type="default"/>
       <w:footerReference r:id="rId10" w:type="default"/>
@@ -1524,9 +1462,6 @@
     <w:abstractNumId w:val="991"/>
   </w:num>
   <w:num w:numId="1006">
-    <w:abstractNumId w:val="991"/>
-  </w:num>
-  <w:num w:numId="1007">
     <w:abstractNumId w:val="991"/>
   </w:num>
 </w:numbering>

</xml_diff>

<commit_message>
version sent to Dietrich 15 Jan
</commit_message>
<xml_diff>
--- a/manuscript/manuscript.docx
+++ b/manuscript/manuscript.docx
@@ -7,103 +7,7 @@
         <w:pStyle w:val="Title"/>
       </w:pPr>
       <w:r>
-        <w:t xml:space="preserve">Lead</w:t>
-      </w:r>
-      <w:r>
-        <w:t xml:space="preserve"> </w:t>
-      </w:r>
-      <w:r>
-        <w:t xml:space="preserve">Exposure</w:t>
-      </w:r>
-      <w:r>
-        <w:t xml:space="preserve"> </w:t>
-      </w:r>
-      <w:r>
-        <w:t xml:space="preserve">and</w:t>
-      </w:r>
-      <w:r>
-        <w:t xml:space="preserve"> </w:t>
-      </w:r>
-      <w:r>
-        <w:t xml:space="preserve">IQ</w:t>
-      </w:r>
-      <w:r>
-        <w:t xml:space="preserve"> </w:t>
-      </w:r>
-      <w:r>
-        <w:t xml:space="preserve">Loss</w:t>
-      </w:r>
-      <w:r>
-        <w:t xml:space="preserve"> </w:t>
-      </w:r>
-      <w:r>
-        <w:t xml:space="preserve">in</w:t>
-      </w:r>
-      <w:r>
-        <w:t xml:space="preserve"> </w:t>
-      </w:r>
-      <w:r>
-        <w:t xml:space="preserve">Children:</w:t>
-      </w:r>
-      <w:r>
-        <w:t xml:space="preserve"> </w:t>
-      </w:r>
-      <w:r>
-        <w:t xml:space="preserve">a</w:t>
-      </w:r>
-      <w:r>
-        <w:t xml:space="preserve"> </w:t>
-      </w:r>
-      <w:r>
-        <w:t xml:space="preserve">Bayesian</w:t>
-      </w:r>
-      <w:r>
-        <w:t xml:space="preserve"> </w:t>
-      </w:r>
-      <w:r>
-        <w:t xml:space="preserve">and</w:t>
-      </w:r>
-      <w:r>
-        <w:t xml:space="preserve"> </w:t>
-      </w:r>
-      <w:r>
-        <w:t xml:space="preserve">Frequentist</w:t>
-      </w:r>
-      <w:r>
-        <w:t xml:space="preserve"> </w:t>
-      </w:r>
-      <w:r>
-        <w:t xml:space="preserve">Meta</w:t>
-      </w:r>
-      <w:r>
-        <w:t xml:space="preserve"> </w:t>
-      </w:r>
-      <w:r>
-        <w:t xml:space="preserve">Analysis</w:t>
-      </w:r>
-      <w:r>
-        <w:t xml:space="preserve"> </w:t>
-      </w:r>
-      <w:r>
-        <w:t xml:space="preserve">of</w:t>
-      </w:r>
-      <w:r>
-        <w:t xml:space="preserve"> </w:t>
-      </w:r>
-      <w:r>
-        <w:t xml:space="preserve">Recent</w:t>
-      </w:r>
-      <w:r>
-        <w:t xml:space="preserve"> </w:t>
-      </w:r>
-      <w:r>
-        <w:t xml:space="preserve">Epidemiological</w:t>
-      </w:r>
-      <w:r>
-        <w:t xml:space="preserve"> </w:t>
-      </w:r>
-      <w:r>
-        <w:t xml:space="preserve">Studies</w:t>
+        <w:t xml:space="preserve">Lead Exposure and IQ Loss in Children: a Bayesian and Frequentist Meta Analysis of Recent Epidemiological Studies</w:t>
       </w:r>
     </w:p>
     <w:p>
@@ -111,13 +15,7 @@
         <w:pStyle w:val="Author"/>
       </w:pPr>
       <w:r>
-        <w:t xml:space="preserve">Paulina</w:t>
-      </w:r>
-      <w:r>
-        <w:t xml:space="preserve"> </w:t>
-      </w:r>
-      <w:r>
-        <w:t xml:space="preserve">Sell</w:t>
+        <w:t xml:space="preserve">Paulina Sell</w:t>
       </w:r>
     </w:p>
     <w:p>
@@ -125,13 +23,7 @@
         <w:pStyle w:val="Author"/>
       </w:pPr>
       <w:r>
-        <w:t xml:space="preserve">Margaux</w:t>
-      </w:r>
-      <w:r>
-        <w:t xml:space="preserve"> </w:t>
-      </w:r>
-      <w:r>
-        <w:t xml:space="preserve">Sanchez</w:t>
+        <w:t xml:space="preserve">Margaux Sanchez</w:t>
       </w:r>
     </w:p>
     <w:p>
@@ -139,13 +31,7 @@
         <w:pStyle w:val="Author"/>
       </w:pPr>
       <w:r>
-        <w:t xml:space="preserve">Philippe</w:t>
-      </w:r>
-      <w:r>
-        <w:t xml:space="preserve"> </w:t>
-      </w:r>
-      <w:r>
-        <w:t xml:space="preserve">Palmont</w:t>
+        <w:t xml:space="preserve">Philippe Palmont</w:t>
       </w:r>
     </w:p>
     <w:p>
@@ -153,13 +39,7 @@
         <w:pStyle w:val="Author"/>
       </w:pPr>
       <w:r>
-        <w:t xml:space="preserve">Dietrich</w:t>
-      </w:r>
-      <w:r>
-        <w:t xml:space="preserve"> </w:t>
-      </w:r>
-      <w:r>
-        <w:t xml:space="preserve">Plass</w:t>
+        <w:t xml:space="preserve">Dietrich Plass</w:t>
       </w:r>
     </w:p>
     <w:bookmarkStart w:id="23" w:name="notes"/>
@@ -286,416 +166,7 @@
         </w:numPr>
       </w:pPr>
       <w:r>
-        <w:t xml:space="preserve">☒ Intro: Lead, health effects, burden of disease</w:t>
-      </w:r>
-    </w:p>
-    <w:p>
-      <w:pPr>
-        <w:pStyle w:val="Compact"/>
-        <w:numPr>
-          <w:ilvl w:val="0"/>
-          <w:numId w:val="1002"/>
-        </w:numPr>
-      </w:pPr>
-      <w:r>
-        <w:t xml:space="preserve">☒ Currently used ERFs</w:t>
-      </w:r>
-    </w:p>
-    <w:p>
-      <w:pPr>
-        <w:pStyle w:val="Compact"/>
-        <w:numPr>
-          <w:ilvl w:val="0"/>
-          <w:numId w:val="1002"/>
-        </w:numPr>
-      </w:pPr>
-      <w:r>
-        <w:t xml:space="preserve">☒ Rationale for methodological comparison (BMA - FMA)</w:t>
-      </w:r>
-    </w:p>
-    <w:p>
-      <w:pPr>
-        <w:pStyle w:val="Compact"/>
-        <w:numPr>
-          <w:ilvl w:val="0"/>
-          <w:numId w:val="1002"/>
-        </w:numPr>
-      </w:pPr>
-      <w:r>
-        <w:t xml:space="preserve">☒ Aim of this study</w:t>
-      </w:r>
-      <w:r>
-        <w:br/>
-      </w:r>
-    </w:p>
-    <w:p>
-      <w:pPr>
-        <w:pStyle w:val="FirstParagraph"/>
-      </w:pPr>
-      <w:r>
-        <w:t xml:space="preserve">Lead (Pb) is a pervasive environmental pollutant originating from anthropogenic and natural sources.</w:t>
-      </w:r>
-      <w:r>
-        <w:t xml:space="preserve"> </w:t>
-      </w:r>
-      <w:r>
-        <w:t xml:space="preserve">Although concentrations have declined in past decades following the phase-out of leaded gasoline, lead remains present in the environment and human blood</w:t>
-      </w:r>
-      <w:r>
-        <w:t xml:space="preserve"> </w:t>
-      </w:r>
-      <w:r>
-        <w:t xml:space="preserve">(1,2)</w:t>
-      </w:r>
-      <w:r>
-        <w:t xml:space="preserve">.</w:t>
-      </w:r>
-      <w:r>
-        <w:t xml:space="preserve"> </w:t>
-      </w:r>
-      <w:r>
-        <w:t xml:space="preserve">The main exposure pathways in Europe are dietary products, drinking water, and indoor dust</w:t>
-      </w:r>
-      <w:r>
-        <w:t xml:space="preserve"> </w:t>
-      </w:r>
-      <w:r>
-        <w:t xml:space="preserve">(3,4)</w:t>
-      </w:r>
-      <w:r>
-        <w:t xml:space="preserve">.</w:t>
-      </w:r>
-      <w:r>
-        <w:t xml:space="preserve"> </w:t>
-      </w:r>
-      <w:r>
-        <w:t xml:space="preserve">The Global Burden of Disease Study 2023 estimated that 3.4 Million (95% Confidence Interval (CI): 2.7; 4.0 Million) Disability-Adjusted Life Years (DALYs) were attributable to lead exposure in 2023 in the European Union (EU)</w:t>
-      </w:r>
-      <w:r>
-        <w:t xml:space="preserve"> </w:t>
-      </w:r>
-      <w:r>
-        <w:t xml:space="preserve">(5)</w:t>
-      </w:r>
-      <w:r>
-        <w:t xml:space="preserve">.</w:t>
-      </w:r>
-    </w:p>
-    <w:p>
-      <w:pPr>
-        <w:pStyle w:val="BodyText"/>
-      </w:pPr>
-      <w:r>
-        <w:t xml:space="preserve">Among the various adverse health outcomes associated with low lead exposure, including</w:t>
-      </w:r>
-      <w:r>
-        <w:t xml:space="preserve"> </w:t>
-      </w:r>
-      <w:r>
-        <w:t xml:space="preserve">infertility in women</w:t>
-      </w:r>
-      <w:r>
-        <w:t xml:space="preserve"> </w:t>
-      </w:r>
-      <w:r>
-        <w:t xml:space="preserve">(6)</w:t>
-      </w:r>
-      <w:r>
-        <w:t xml:space="preserve">,</w:t>
-      </w:r>
-      <w:r>
-        <w:t xml:space="preserve"> </w:t>
-      </w:r>
-      <w:r>
-        <w:t xml:space="preserve">attention-deficit/hyperactivity disorder in children</w:t>
-      </w:r>
-      <w:r>
-        <w:t xml:space="preserve"> </w:t>
-      </w:r>
-      <w:r>
-        <w:t xml:space="preserve">(7)</w:t>
-      </w:r>
-      <w:r>
-        <w:t xml:space="preserve"> </w:t>
-      </w:r>
-      <w:r>
-        <w:t xml:space="preserve">,</w:t>
-      </w:r>
-      <w:r>
-        <w:t xml:space="preserve"> </w:t>
-      </w:r>
-      <w:r>
-        <w:t xml:space="preserve">antisocial behavior</w:t>
-      </w:r>
-      <w:r>
-        <w:t xml:space="preserve"> </w:t>
-      </w:r>
-      <w:r>
-        <w:t xml:space="preserve">(8)</w:t>
-      </w:r>
-      <w:r>
-        <w:t xml:space="preserve">,</w:t>
-      </w:r>
-      <w:r>
-        <w:t xml:space="preserve"> </w:t>
-      </w:r>
-      <w:r>
-        <w:t xml:space="preserve">decreased kidney function</w:t>
-      </w:r>
-      <w:r>
-        <w:t xml:space="preserve"> </w:t>
-      </w:r>
-      <w:r>
-        <w:t xml:space="preserve">(9)</w:t>
-      </w:r>
-      <w:r>
-        <w:t xml:space="preserve">,</w:t>
-      </w:r>
-      <w:r>
-        <w:t xml:space="preserve"> </w:t>
-      </w:r>
-      <w:r>
-        <w:t xml:space="preserve">liver disease</w:t>
-      </w:r>
-      <w:r>
-        <w:t xml:space="preserve"> </w:t>
-      </w:r>
-      <w:r>
-        <w:t xml:space="preserve">(10)</w:t>
-      </w:r>
-      <w:r>
-        <w:t xml:space="preserve">,</w:t>
-      </w:r>
-      <w:r>
-        <w:t xml:space="preserve"> </w:t>
-      </w:r>
-      <w:r>
-        <w:t xml:space="preserve">coronary artery atherosclerosis</w:t>
-      </w:r>
-      <w:r>
-        <w:t xml:space="preserve"> </w:t>
-      </w:r>
-      <w:r>
-        <w:t xml:space="preserve">(11)</w:t>
-      </w:r>
-      <w:r>
-        <w:t xml:space="preserve"> </w:t>
-      </w:r>
-      <w:r>
-        <w:t xml:space="preserve">and</w:t>
-      </w:r>
-      <w:r>
-        <w:t xml:space="preserve"> </w:t>
-      </w:r>
-      <w:r>
-        <w:t xml:space="preserve">cardiovascular mortality</w:t>
-      </w:r>
-      <w:r>
-        <w:t xml:space="preserve"> </w:t>
-      </w:r>
-      <w:r>
-        <w:t xml:space="preserve">(12)</w:t>
-      </w:r>
-      <w:r>
-        <w:t xml:space="preserve">,</w:t>
-      </w:r>
-      <w:r>
-        <w:t xml:space="preserve"> </w:t>
-      </w:r>
-      <w:r>
-        <w:t xml:space="preserve">impaired intellectual development in children represents a particularly critical endpoint for public health policy</w:t>
-      </w:r>
-      <w:r>
-        <w:t xml:space="preserve"> </w:t>
-      </w:r>
-      <w:r>
-        <w:t xml:space="preserve">(13)</w:t>
-      </w:r>
-      <w:r>
-        <w:t xml:space="preserve">.</w:t>
-      </w:r>
-      <w:r>
-        <w:t xml:space="preserve"> </w:t>
-      </w:r>
-      <w:r>
-        <w:t xml:space="preserve">The effects of lead on the IQ score (intelligence quotient) are lifelong and therefore lead to substantial societal costs</w:t>
-      </w:r>
-      <w:r>
-        <w:t xml:space="preserve"> </w:t>
-      </w:r>
-      <w:r>
-        <w:t xml:space="preserve">(14)</w:t>
-      </w:r>
-      <w:r>
-        <w:t xml:space="preserve">.</w:t>
-      </w:r>
-      <w:r>
-        <w:t xml:space="preserve"> </w:t>
-      </w:r>
-      <w:r>
-        <w:t xml:space="preserve">Children are especially vulnerable to lead neurotoxicity due to their developing nervous systems and relatively high exposure per body mass.</w:t>
-      </w:r>
-      <w:r>
-        <w:t xml:space="preserve"> </w:t>
-      </w:r>
-      <w:r>
-        <w:t xml:space="preserve">Importantly, there is no evidence for a threshold concentration below which lead’s detrimental effects on the intellectual development can be assumed to be negligible</w:t>
-      </w:r>
-      <w:r>
-        <w:t xml:space="preserve"> </w:t>
-      </w:r>
-      <w:r>
-        <w:t xml:space="preserve">(15)</w:t>
-      </w:r>
-      <w:r>
-        <w:t xml:space="preserve">.</w:t>
-      </w:r>
-    </w:p>
-    <w:p>
-      <w:pPr>
-        <w:pStyle w:val="BodyText"/>
-      </w:pPr>
-      <w:r>
-        <w:t xml:space="preserve">It is essential to continue to accurately characterize the exposure-response relationship of lead exposure and IQ loss not only because lead concentrations today are lower than at the time when previous studies were conducted, but also because of substantive criticism concerning the existing evidence base.</w:t>
-      </w:r>
-      <w:r>
-        <w:br/>
-      </w:r>
-      <w:r>
-        <w:t xml:space="preserve">Current burden of disease assessments on lead-related IQ loss at national and global scales</w:t>
-      </w:r>
-      <w:r>
-        <w:t xml:space="preserve"> </w:t>
-      </w:r>
-      <w:r>
-        <w:t xml:space="preserve">(5,14,16–18)</w:t>
-      </w:r>
-      <w:r>
-        <w:t xml:space="preserve"> </w:t>
-      </w:r>
-      <w:r>
-        <w:t xml:space="preserve">predominantly rely on exposure-response functions (ERFs) from two studies: the pooled analysis by Lanphear et al. (2005) or its subsequent re-analysis by Crump et al. (2013)</w:t>
-      </w:r>
-      <w:r>
-        <w:t xml:space="preserve"> </w:t>
-      </w:r>
-      <w:r>
-        <w:t xml:space="preserve">(13,19)</w:t>
-      </w:r>
-      <w:r>
-        <w:t xml:space="preserve">.</w:t>
-      </w:r>
-      <w:r>
-        <w:t xml:space="preserve"> </w:t>
-      </w:r>
-      <w:r>
-        <w:t xml:space="preserve">While these are important landmark studies shaping the course of research on health effects of lead exposure in children, methodological issues and errors in the Lanphear et al. 2005 article have been raised</w:t>
-      </w:r>
-      <w:r>
-        <w:t xml:space="preserve"> </w:t>
-      </w:r>
-      <w:r>
-        <w:t xml:space="preserve">(13,20)</w:t>
-      </w:r>
-      <w:r>
-        <w:t xml:space="preserve"> </w:t>
-      </w:r>
-      <w:r>
-        <w:t xml:space="preserve">and the stepwise backward-elimination covariate selection approach employed by Crump et al. (2013), which is central to their findings, has received substantial criticism</w:t>
-      </w:r>
-      <w:r>
-        <w:t xml:space="preserve"> </w:t>
-      </w:r>
-      <w:r>
-        <w:t xml:space="preserve">(21–23)</w:t>
-      </w:r>
-      <w:r>
-        <w:t xml:space="preserve">.</w:t>
-      </w:r>
-      <w:r>
-        <w:t xml:space="preserve"> </w:t>
-      </w:r>
-      <w:r>
-        <w:t xml:space="preserve">These limitations warrant reconsideration of their continued use as evidence base.</w:t>
-      </w:r>
-    </w:p>
-    <w:p>
-      <w:pPr>
-        <w:pStyle w:val="BodyText"/>
-      </w:pPr>
-      <w:r>
-        <w:t xml:space="preserve">Another motivation to conduct an updated meta analysis today, is that while Lanphear et al. investigated low BLL (&lt;10 µg/dL) exposures in their study, BLL in the EU have decreased even further and now mostly lie below 5 µg/dL (</w:t>
-      </w:r>
-      <w:hyperlink r:id="rId25">
-        <w:r>
-          <w:rPr>
-            <w:rStyle w:val="Hyperlink"/>
-          </w:rPr>
-          <w:t xml:space="preserve">HBM4EU Dashboard</w:t>
-        </w:r>
-      </w:hyperlink>
-      <w:r>
-        <w:t xml:space="preserve">).</w:t>
-      </w:r>
-      <w:r>
-        <w:t xml:space="preserve"> </w:t>
-      </w:r>
-      <w:r>
-        <w:t xml:space="preserve">In order to provide more relevant risk estimates, a synthesis of new epidemiological studies is needed.</w:t>
-      </w:r>
-      <w:r>
-        <w:t xml:space="preserve"> </w:t>
-      </w:r>
-      <w:r>
-        <w:t xml:space="preserve">The pooled exposure-response relationship can then be applied to risk assessments and used by policymakers.</w:t>
-      </w:r>
-      <w:r>
-        <w:br/>
-      </w:r>
-      <w:r>
-        <w:t xml:space="preserve">Beyond updating the evidence base, there is also a methodological opportunity to enhance the utility of meta-analytic findings.</w:t>
-      </w:r>
-      <w:r>
-        <w:t xml:space="preserve"> </w:t>
-      </w:r>
-      <w:r>
-        <w:t xml:space="preserve">While frequentist meta-analysis has been a conventional approach in environmental epidemiology, Bayesian meta-analysis offers distinct advantages.</w:t>
-      </w:r>
-      <w:r>
-        <w:t xml:space="preserve"> </w:t>
-      </w:r>
-      <w:r>
-        <w:t xml:space="preserve">Specifically, the posterior distributions generated by Bayesian approaches offer consistent and holistic (?) quantification of uncertainty that can be directly incorporated into probabilistic Burden of Disease studies.</w:t>
-      </w:r>
-      <w:r>
-        <w:t xml:space="preserve"> </w:t>
-      </w:r>
-      <w:r>
-        <w:t xml:space="preserve">As probabilistic methods become increasingly adopted in contemporary risk assessment and policy evaluation, having exposure-response estimates in a format that integrates seamlessly with these frameworks represents a practical advancement beyond purely methodological considerations.</w:t>
-      </w:r>
-    </w:p>
-    <w:p>
-      <w:pPr>
-        <w:pStyle w:val="BodyText"/>
-      </w:pPr>
-      <w:r>
-        <w:t xml:space="preserve">The aim of this study is to summarize and quantitatively pool the available epidemiological literature on childrens blood lead levels and neurodevelopment (operationalized as IQ score).</w:t>
-      </w:r>
-      <w:r>
-        <w:t xml:space="preserve"> </w:t>
-      </w:r>
-      <w:r>
-        <w:t xml:space="preserve">We conduct both a frequentist meta-analysis—representing the established approach widely used in epidemiology—and compare it to a Bayesian meta-analysis, evaluating how methodological choices influence risk estimates and their applicability to probabilistic burden of disease assessment.</w:t>
-      </w:r>
-    </w:p>
-    <w:bookmarkEnd w:id="26"/>
-    <w:bookmarkStart w:id="27" w:name="methods"/>
-    <w:p>
-      <w:pPr>
-        <w:pStyle w:val="Heading1"/>
-      </w:pPr>
-      <w:r>
-        <w:t xml:space="preserve">2. Methods</w:t>
+        <w:t xml:space="preserve">Intro: Lead, health effects, burden of disease</w:t>
       </w:r>
     </w:p>
     <w:p>
@@ -707,145 +178,7 @@
         </w:numPr>
       </w:pPr>
       <w:r>
-        <w:t xml:space="preserve">☐ Overview: systematic review and meta analysis, comparing a frequentist to a Bayesian approach</w:t>
-      </w:r>
-    </w:p>
-    <w:p>
-      <w:pPr>
-        <w:pStyle w:val="Compact"/>
-        <w:numPr>
-          <w:ilvl w:val="0"/>
-          <w:numId w:val="1003"/>
-        </w:numPr>
-      </w:pPr>
-      <w:r>
-        <w:t xml:space="preserve">☐ Inclusion &amp; exclusion criteria, databases, search strategy, screening process</w:t>
-      </w:r>
-    </w:p>
-    <w:p>
-      <w:pPr>
-        <w:pStyle w:val="Compact"/>
-        <w:numPr>
-          <w:ilvl w:val="0"/>
-          <w:numId w:val="1003"/>
-        </w:numPr>
-      </w:pPr>
-      <w:r>
-        <w:t xml:space="preserve">☐ Risk of bias analysis method</w:t>
-      </w:r>
-    </w:p>
-    <w:p>
-      <w:pPr>
-        <w:pStyle w:val="Compact"/>
-        <w:numPr>
-          <w:ilvl w:val="0"/>
-          <w:numId w:val="1003"/>
-        </w:numPr>
-      </w:pPr>
-      <w:r>
-        <w:t xml:space="preserve">☐ Description &amp; rationale of harmonization of reported effect measures</w:t>
-      </w:r>
-    </w:p>
-    <w:p>
-      <w:pPr>
-        <w:pStyle w:val="Compact"/>
-        <w:numPr>
-          <w:ilvl w:val="0"/>
-          <w:numId w:val="1003"/>
-        </w:numPr>
-      </w:pPr>
-      <w:r>
-        <w:t xml:space="preserve">☐ Description of meta analysis methodology (frequentist &amp; Bayesian), models and software used, heterogeneity identification</w:t>
-      </w:r>
-    </w:p>
-    <w:p>
-      <w:pPr>
-        <w:pStyle w:val="Compact"/>
-        <w:numPr>
-          <w:ilvl w:val="0"/>
-          <w:numId w:val="1003"/>
-        </w:numPr>
-      </w:pPr>
-      <w:r>
-        <w:t xml:space="preserve">☐ Sensitivity analysis</w:t>
-      </w:r>
-      <w:r>
-        <w:br/>
-      </w:r>
-    </w:p>
-    <w:p>
-      <w:pPr>
-        <w:pStyle w:val="FirstParagraph"/>
-      </w:pPr>
-      <w:r>
-        <w:t xml:space="preserve">In order to quantitatively synthesize the available epidemiological literature on the association of childrens blood lead levels and their IQ, we conducted a systematic review and meta analysis.</w:t>
-      </w:r>
-      <w:r>
-        <w:t xml:space="preserve"> </w:t>
-      </w:r>
-      <w:r>
-        <w:t xml:space="preserve">We compare a frequentist meta analysis approach to a Bayesian approach that has specific advantages and has gained popularity in recent years but is still not widely used in the field of epidemiology.</w:t>
-      </w:r>
-      <w:r>
-        <w:br/>
-      </w:r>
-      <w:r>
-        <w:t xml:space="preserve">(Information on literature review)</w:t>
-      </w:r>
-      <w:r>
-        <w:br/>
-      </w:r>
-      <w:r>
-        <w:t xml:space="preserve">We conducted a Risk of Bias assessment using a rapid Risk of Bias (raROB) tool with a specific focus on human observational epidemiological studies</w:t>
-      </w:r>
-      <w:r>
-        <w:t xml:space="preserve"> </w:t>
-      </w:r>
-      <w:r>
-        <w:t xml:space="preserve">(24)</w:t>
-      </w:r>
-      <w:r>
-        <w:t xml:space="preserve">.</w:t>
-      </w:r>
-      <w:r>
-        <w:t xml:space="preserve"> </w:t>
-      </w:r>
-      <w:r>
-        <w:t xml:space="preserve">Each included publications risk of bias was appraised by answering 15 items in the domains selection, exposure, outcome, confounding, follow-up, analysis, and selective reporting.</w:t>
-      </w:r>
-      <w:r>
-        <w:t xml:space="preserve"> </w:t>
-      </w:r>
-      <w:r>
-        <w:t xml:space="preserve">The overall risk of bias for each individual study is then categorized as either low, moderate or high.</w:t>
-      </w:r>
-      <w:r>
-        <w:t xml:space="preserve"> </w:t>
-      </w:r>
-      <w:r>
-        <w:t xml:space="preserve">Each publication was first assessed by one researcher and then consensus with a large language model (LLM) was sought.</w:t>
-      </w:r>
-      <w:r>
-        <w:t xml:space="preserve"> </w:t>
-      </w:r>
-      <w:r>
-        <w:t xml:space="preserve">This was done by uploading the publications and the list of all raRoB items.</w:t>
-      </w:r>
-      <w:r>
-        <w:t xml:space="preserve"> </w:t>
-      </w:r>
-      <w:r>
-        <w:t xml:space="preserve">If there were any deviations in the judgement of the researcher and the LLM, the corresponding item was revisited by the researcher and they made the final decision on each item.</w:t>
-      </w:r>
-    </w:p>
-    <w:bookmarkEnd w:id="27"/>
-    <w:bookmarkStart w:id="28" w:name="results"/>
-    <w:p>
-      <w:pPr>
-        <w:pStyle w:val="Heading1"/>
-      </w:pPr>
-      <w:r>
-        <w:t xml:space="preserve">3. Results</w:t>
+        <w:t xml:space="preserve">Currently used ERFs</w:t>
       </w:r>
     </w:p>
     <w:p>
@@ -857,77 +190,7 @@
         </w:numPr>
       </w:pPr>
       <w:r>
-        <w:t xml:space="preserve">☐ Cite studies that might appear to meet inclusion criteria, but were excluded &amp; explain why</w:t>
-      </w:r>
-    </w:p>
-    <w:p>
-      <w:pPr>
-        <w:pStyle w:val="Compact"/>
-        <w:numPr>
-          <w:ilvl w:val="0"/>
-          <w:numId w:val="1004"/>
-        </w:numPr>
-      </w:pPr>
-      <w:r>
-        <w:t xml:space="preserve">☐ Study characteristics (table), including original and harmonized effect measures</w:t>
-      </w:r>
-    </w:p>
-    <w:p>
-      <w:pPr>
-        <w:pStyle w:val="Compact"/>
-        <w:numPr>
-          <w:ilvl w:val="0"/>
-          <w:numId w:val="1004"/>
-        </w:numPr>
-      </w:pPr>
-      <w:r>
-        <w:t xml:space="preserve">☐ Flow diagram, description of (fulltext) screening results</w:t>
-      </w:r>
-    </w:p>
-    <w:p>
-      <w:pPr>
-        <w:pStyle w:val="Compact"/>
-        <w:numPr>
-          <w:ilvl w:val="0"/>
-          <w:numId w:val="1004"/>
-        </w:numPr>
-      </w:pPr>
-      <w:r>
-        <w:t xml:space="preserve">☐ RoB results for each included study</w:t>
-      </w:r>
-    </w:p>
-    <w:p>
-      <w:pPr>
-        <w:pStyle w:val="Compact"/>
-        <w:numPr>
-          <w:ilvl w:val="0"/>
-          <w:numId w:val="1004"/>
-        </w:numPr>
-      </w:pPr>
-      <w:r>
-        <w:t xml:space="preserve">☐ Forest plots</w:t>
-      </w:r>
-    </w:p>
-    <w:p>
-      <w:pPr>
-        <w:pStyle w:val="Compact"/>
-        <w:numPr>
-          <w:ilvl w:val="0"/>
-          <w:numId w:val="1004"/>
-        </w:numPr>
-      </w:pPr>
-      <w:r>
-        <w:t xml:space="preserve">☐ Sensitivity analysis results</w:t>
-      </w:r>
-    </w:p>
-    <w:bookmarkEnd w:id="28"/>
-    <w:bookmarkStart w:id="29" w:name="discussion"/>
-    <w:p>
-      <w:pPr>
-        <w:pStyle w:val="Heading1"/>
-      </w:pPr>
-      <w:r>
-        <w:t xml:space="preserve">4. Discussion</w:t>
+        <w:t xml:space="preserve">Rationale for methodological comparison (BMA - FMA)</w:t>
       </w:r>
     </w:p>
     <w:p>
@@ -939,41 +202,388 @@
         </w:numPr>
       </w:pPr>
       <w:r>
-        <w:t xml:space="preserve">☐ General interpretation of results in light of evidence in literature</w:t>
-      </w:r>
-    </w:p>
-    <w:p>
-      <w:pPr>
-        <w:pStyle w:val="Compact"/>
-        <w:numPr>
-          <w:ilvl w:val="0"/>
-          <w:numId w:val="1005"/>
-        </w:numPr>
-      </w:pPr>
-      <w:r>
-        <w:t xml:space="preserve">☐ Discuss differences, similarities, strenghts and weaknesses of freq vs. Bayesian approach</w:t>
-      </w:r>
-    </w:p>
-    <w:p>
-      <w:pPr>
-        <w:pStyle w:val="Compact"/>
-        <w:numPr>
-          <w:ilvl w:val="0"/>
-          <w:numId w:val="1005"/>
-        </w:numPr>
-      </w:pPr>
-      <w:r>
-        <w:t xml:space="preserve">☐ Study limitations &amp; strengths</w:t>
-      </w:r>
-    </w:p>
-    <w:bookmarkEnd w:id="29"/>
-    <w:bookmarkStart w:id="30" w:name="conclusions"/>
+        <w:t xml:space="preserve">Aim of this study</w:t>
+      </w:r>
+      <w:r>
+        <w:br/>
+      </w:r>
+    </w:p>
+    <w:p>
+      <w:pPr>
+        <w:pStyle w:val="FirstParagraph"/>
+      </w:pPr>
+      <w:r>
+        <w:t xml:space="preserve">Lead (Pb) is a pervasive environmental pollutant originating from anthropogenic and natural sources.</w:t>
+      </w:r>
+      <w:r>
+        <w:t xml:space="preserve"> </w:t>
+      </w:r>
+      <w:r>
+        <w:t xml:space="preserve">Although concentrations have declined in past decades following the phase-out of leaded gasoline, lead remains present in the environment and human blood</w:t>
+      </w:r>
+      <w:r>
+        <w:t xml:space="preserve"> </w:t>
+      </w:r>
+      <w:r>
+        <w:t xml:space="preserve">(1,2)</w:t>
+      </w:r>
+      <w:r>
+        <w:t xml:space="preserve">.</w:t>
+      </w:r>
+      <w:r>
+        <w:t xml:space="preserve"> </w:t>
+      </w:r>
+      <w:r>
+        <w:t xml:space="preserve">In Europe, primary exposure pathways include dietary products, drinking water, and indoor dust</w:t>
+      </w:r>
+      <w:r>
+        <w:t xml:space="preserve"> </w:t>
+      </w:r>
+      <w:r>
+        <w:t xml:space="preserve">(3,4)</w:t>
+      </w:r>
+      <w:r>
+        <w:t xml:space="preserve">.</w:t>
+      </w:r>
+      <w:r>
+        <w:t xml:space="preserve"> </w:t>
+      </w:r>
+      <w:r>
+        <w:t xml:space="preserve">The Global Burden of Disease Study 2023 estimated that 3.4 million (95% Confidence Interval (CI): 2.7; 4.0 million) Disability-Adjusted Life Years (DALYs) were attributable to lead exposure in 2023 in the European Union (EU)</w:t>
+      </w:r>
+      <w:r>
+        <w:t xml:space="preserve"> </w:t>
+      </w:r>
+      <w:r>
+        <w:t xml:space="preserve">(5)</w:t>
+      </w:r>
+      <w:r>
+        <w:t xml:space="preserve">, underscoring the continued public health significance even of low-level exposure.</w:t>
+      </w:r>
+    </w:p>
+    <w:p>
+      <w:pPr>
+        <w:pStyle w:val="BodyText"/>
+      </w:pPr>
+      <w:r>
+        <w:t xml:space="preserve">Lead exposure is associated with multiple adverse health outcomes across the lifespan, including</w:t>
+      </w:r>
+      <w:r>
+        <w:t xml:space="preserve"> </w:t>
+      </w:r>
+      <w:r>
+        <w:t xml:space="preserve">decreased kidney function</w:t>
+      </w:r>
+      <w:r>
+        <w:t xml:space="preserve"> </w:t>
+      </w:r>
+      <w:r>
+        <w:t xml:space="preserve">(6)</w:t>
+      </w:r>
+      <w:r>
+        <w:t xml:space="preserve">,</w:t>
+      </w:r>
+      <w:r>
+        <w:t xml:space="preserve"> </w:t>
+      </w:r>
+      <w:r>
+        <w:t xml:space="preserve">liver disease</w:t>
+      </w:r>
+      <w:r>
+        <w:t xml:space="preserve"> </w:t>
+      </w:r>
+      <w:r>
+        <w:t xml:space="preserve">(7)</w:t>
+      </w:r>
+      <w:r>
+        <w:t xml:space="preserve">,</w:t>
+      </w:r>
+      <w:r>
+        <w:t xml:space="preserve"> </w:t>
+      </w:r>
+      <w:r>
+        <w:t xml:space="preserve">coronary artery atherosclerosis</w:t>
+      </w:r>
+      <w:r>
+        <w:t xml:space="preserve"> </w:t>
+      </w:r>
+      <w:r>
+        <w:t xml:space="preserve">(8)</w:t>
+      </w:r>
+      <w:r>
+        <w:t xml:space="preserve">,</w:t>
+      </w:r>
+      <w:r>
+        <w:t xml:space="preserve"> </w:t>
+      </w:r>
+      <w:r>
+        <w:t xml:space="preserve">cardiovascular mortality</w:t>
+      </w:r>
+      <w:r>
+        <w:t xml:space="preserve"> </w:t>
+      </w:r>
+      <w:r>
+        <w:t xml:space="preserve">(9)</w:t>
+      </w:r>
+      <w:r>
+        <w:t xml:space="preserve">,</w:t>
+      </w:r>
+      <w:r>
+        <w:t xml:space="preserve"> </w:t>
+      </w:r>
+      <w:r>
+        <w:t xml:space="preserve">infertility in women</w:t>
+      </w:r>
+      <w:r>
+        <w:t xml:space="preserve"> </w:t>
+      </w:r>
+      <w:r>
+        <w:t xml:space="preserve">(10)</w:t>
+      </w:r>
+      <w:r>
+        <w:t xml:space="preserve">,</w:t>
+      </w:r>
+      <w:r>
+        <w:t xml:space="preserve"> </w:t>
+      </w:r>
+      <w:r>
+        <w:t xml:space="preserve">attention-deficit/hyperactivity disorder in children</w:t>
+      </w:r>
+      <w:r>
+        <w:t xml:space="preserve"> </w:t>
+      </w:r>
+      <w:r>
+        <w:t xml:space="preserve">(11)</w:t>
+      </w:r>
+      <w:r>
+        <w:t xml:space="preserve">, and</w:t>
+      </w:r>
+      <w:r>
+        <w:t xml:space="preserve"> </w:t>
+      </w:r>
+      <w:r>
+        <w:t xml:space="preserve">antisocial behavior</w:t>
+      </w:r>
+      <w:r>
+        <w:t xml:space="preserve"> </w:t>
+      </w:r>
+      <w:r>
+        <w:t xml:space="preserve">(12)</w:t>
+      </w:r>
+      <w:r>
+        <w:t xml:space="preserve">.</w:t>
+      </w:r>
+      <w:r>
+        <w:t xml:space="preserve"> </w:t>
+      </w:r>
+      <w:r>
+        <w:t xml:space="preserve">Among these endpoints, impaired cognitive development in children — manifested as reduced IQ scores —</w:t>
+      </w:r>
+      <w:r>
+        <w:t xml:space="preserve"> </w:t>
+      </w:r>
+      <w:r>
+        <w:t xml:space="preserve">(13)</w:t>
+      </w:r>
+      <w:r>
+        <w:t xml:space="preserve"> </w:t>
+      </w:r>
+      <w:r>
+        <w:t xml:space="preserve">represents a particularly critical endpoint for public health policy.</w:t>
+      </w:r>
+      <w:r>
+        <w:t xml:space="preserve"> </w:t>
+      </w:r>
+      <w:r>
+        <w:t xml:space="preserve">Children are especially vulnerable to lead’s neurotoxicity due to their developing nervous systems and relatively high exposure per body mass.</w:t>
+      </w:r>
+      <w:r>
+        <w:t xml:space="preserve"> </w:t>
+      </w:r>
+      <w:r>
+        <w:t xml:space="preserve">Because lead-associated IQ decrements are irreversible and persist throughout life, they lead to substantial and enduring societal costs</w:t>
+      </w:r>
+      <w:r>
+        <w:t xml:space="preserve"> </w:t>
+      </w:r>
+      <w:r>
+        <w:t xml:space="preserve">(14)</w:t>
+      </w:r>
+      <w:r>
+        <w:t xml:space="preserve">, making continued efforts to accurately characterize the exposure-response relationship important for evidence-based policy.</w:t>
+      </w:r>
+    </w:p>
+    <w:p>
+      <w:pPr>
+        <w:pStyle w:val="BodyText"/>
+      </w:pPr>
+      <w:r>
+        <w:t xml:space="preserve">Contemporary blood lead levels (BLL) in the EU have declined markedly and now predominantly fall below 5 µg/dL (</w:t>
+      </w:r>
+      <w:hyperlink r:id="rId25">
+        <w:r>
+          <w:rPr>
+            <w:rStyle w:val="Hyperlink"/>
+          </w:rPr>
+          <w:t xml:space="preserve">HBM4EU Dashboard</w:t>
+        </w:r>
+      </w:hyperlink>
+      <w:r>
+        <w:t xml:space="preserve">), well below the concentrations examined in many earlier studies (&lt;10 µg/dL).</w:t>
+      </w:r>
+      <w:r>
+        <w:t xml:space="preserve"> </w:t>
+      </w:r>
+      <w:r>
+        <w:t xml:space="preserve">Importantly, there is no evidence for a threshold concentration below which the effects of lead on the IQ can be assumed to be negligible</w:t>
+      </w:r>
+      <w:r>
+        <w:t xml:space="preserve"> </w:t>
+      </w:r>
+      <w:r>
+        <w:t xml:space="preserve">(15)</w:t>
+      </w:r>
+      <w:r>
+        <w:t xml:space="preserve"> </w:t>
+      </w:r>
+      <w:r>
+        <w:t xml:space="preserve">There is evidence for a supralinear exposure-response relationship with steeper IQ decrements per unit increase in BLL at low concentrations compared to higher concentration ranges</w:t>
+      </w:r>
+      <w:r>
+        <w:t xml:space="preserve"> </w:t>
+      </w:r>
+      <w:r>
+        <w:t xml:space="preserve">(16,17)</w:t>
+      </w:r>
+      <w:r>
+        <w:t xml:space="preserve">.</w:t>
+      </w:r>
+      <w:r>
+        <w:t xml:space="preserve"> </w:t>
+      </w:r>
+      <w:r>
+        <w:t xml:space="preserve">These findings highlight the need for an updated quantitative synthesis that reflects both recent epidemiological evidence and the lower exposure range now predominant in European populations, incorporating contemporary data to inform risk assessment at currently relevant exposure levels.</w:t>
+      </w:r>
+    </w:p>
+    <w:p>
+      <w:pPr>
+        <w:pStyle w:val="BodyText"/>
+      </w:pPr>
+      <w:r>
+        <w:t xml:space="preserve">Existing burden of disease assessments at national and global scales</w:t>
+      </w:r>
+      <w:r>
+        <w:t xml:space="preserve"> </w:t>
+      </w:r>
+      <w:r>
+        <w:t xml:space="preserve">(5,14,18–20)</w:t>
+      </w:r>
+      <w:r>
+        <w:t xml:space="preserve"> </w:t>
+      </w:r>
+      <w:r>
+        <w:t xml:space="preserve">rely predominantly on two foundational studies: a pooled analysis of seven cohort-studies by Lanphear et al. (2005) or its subsequent re-analysis by Crump et al. (2013)</w:t>
+      </w:r>
+      <w:r>
+        <w:t xml:space="preserve"> </w:t>
+      </w:r>
+      <w:r>
+        <w:t xml:space="preserve">(13,17)</w:t>
+      </w:r>
+      <w:r>
+        <w:t xml:space="preserve">.</w:t>
+      </w:r>
+      <w:r>
+        <w:t xml:space="preserve"> </w:t>
+      </w:r>
+      <w:r>
+        <w:t xml:space="preserve">While these landmark studies have substantially shaped research and policy on childhood lead exposure, methodological issues and errors in the Lanphear et al. 2005 article have been raised</w:t>
+      </w:r>
+      <w:r>
+        <w:t xml:space="preserve"> </w:t>
+      </w:r>
+      <w:r>
+        <w:t xml:space="preserve">(13,21)</w:t>
+      </w:r>
+      <w:r>
+        <w:t xml:space="preserve"> </w:t>
+      </w:r>
+      <w:r>
+        <w:t xml:space="preserve">and the stepwise backward-elimination regression approach used by Crump et al. (2013), which is central to their findings, has received substantial criticism</w:t>
+      </w:r>
+      <w:r>
+        <w:t xml:space="preserve"> </w:t>
+      </w:r>
+      <w:r>
+        <w:t xml:space="preserve">(22–24)</w:t>
+      </w:r>
+      <w:r>
+        <w:t xml:space="preserve">.</w:t>
+      </w:r>
+      <w:r>
+        <w:t xml:space="preserve"> </w:t>
+      </w:r>
+      <w:r>
+        <w:t xml:space="preserve">These limitations, combined with the availability of more recent epidemiological data, underscore the need not only for updated evidence synthesis but also for (methodologically) robust approaches that can provide reliable exposure-response estimates for burden of disease and risk assessments.</w:t>
+      </w:r>
+    </w:p>
+    <w:p>
+      <w:pPr>
+        <w:pStyle w:val="BodyText"/>
+      </w:pPr>
+      <w:r>
+        <w:t xml:space="preserve">Methodological advances in meta-analysis offer an opportunity to enhance the utility of synthesized estimates for burden of disease and risk assessment applications.</w:t>
+      </w:r>
+      <w:r>
+        <w:t xml:space="preserve"> </w:t>
+      </w:r>
+      <w:r>
+        <w:t xml:space="preserve">While frequentist meta-analysis has been a conventional approach in environmental epidemiology, Bayesian meta-analysis provides a coherent framework for uncertainty quantification through posterior distributions that inherently incorporate both within-study and between-study variability</w:t>
+      </w:r>
+      <w:r>
+        <w:t xml:space="preserve"> </w:t>
+      </w:r>
+      <w:r>
+        <w:t xml:space="preserve">(25)</w:t>
+      </w:r>
+      <w:r>
+        <w:t xml:space="preserve">.</w:t>
+      </w:r>
+      <w:r>
+        <w:t xml:space="preserve"> </w:t>
+      </w:r>
+      <w:r>
+        <w:t xml:space="preserve">Unlike frequentist confidence intervals, which are often misinterpreted in probabilistic terms, Bayesian credible intervals directly represent the probability distribution of the parameter of interest, facilitating transparent communication of uncertainty.</w:t>
+      </w:r>
+      <w:r>
+        <w:t xml:space="preserve"> </w:t>
+      </w:r>
+      <w:r>
+        <w:t xml:space="preserve">Furthermore, Bayesian posterior distributions can be directly propagated into probabilistic burden of disease studies and risk assessments, providing seamless integration with the probabilistic frameworks increasingly adopted in public health decision-making.</w:t>
+      </w:r>
+      <w:r>
+        <w:t xml:space="preserve"> </w:t>
+      </w:r>
+      <w:r>
+        <w:t xml:space="preserve">By comparing frequentist and Bayesian approaches, we will explore how inferential framework and uncertainty quantification influence exposure-response estimates and their application.</w:t>
+      </w:r>
+    </w:p>
+    <w:p>
+      <w:pPr>
+        <w:pStyle w:val="BodyText"/>
+      </w:pPr>
+      <w:r>
+        <w:t xml:space="preserve">The aim of this study is twofold: first, to synthesize and quantitatively pool available epidemiological findings on the association between blood lead levels and IQ scores in children; and second, to conduct both a frequentist and Bayesian meta-analyses, comparing how these analytical frameworks influence exposure-response estimates, uncertainty characterization, and applicability to burden of disease and risk assessment.</w:t>
+      </w:r>
+    </w:p>
+    <w:bookmarkEnd w:id="26"/>
+    <w:bookmarkStart w:id="27" w:name="methods"/>
     <w:p>
       <w:pPr>
         <w:pStyle w:val="Heading1"/>
       </w:pPr>
       <w:r>
-        <w:t xml:space="preserve">5. Conclusions</w:t>
+        <w:t xml:space="preserve">2. Methods</w:t>
       </w:r>
     </w:p>
     <w:p>
@@ -985,7 +595,7 @@
         </w:numPr>
       </w:pPr>
       <w:r>
-        <w:t xml:space="preserve">☐ Conclusion, with reference to aim of study</w:t>
+        <w:t xml:space="preserve">Overview: systematic review and meta analysis, comparing a frequentist to a Bayesian approach</w:t>
       </w:r>
     </w:p>
     <w:p>
@@ -993,11 +603,289 @@
         <w:pStyle w:val="Compact"/>
         <w:numPr>
           <w:ilvl w:val="0"/>
-          <w:numId w:val="1006"/>
+          <w:numId w:val="1007"/>
         </w:numPr>
       </w:pPr>
       <w:r>
-        <w:t xml:space="preserve">☐ Implications of results: policy, (scientific?) practice, future research needs</w:t>
+        <w:t xml:space="preserve">Inclusion &amp; exclusion criteria, databases, search strategy, screening process</w:t>
+      </w:r>
+    </w:p>
+    <w:p>
+      <w:pPr>
+        <w:pStyle w:val="Compact"/>
+        <w:numPr>
+          <w:ilvl w:val="0"/>
+          <w:numId w:val="1008"/>
+        </w:numPr>
+      </w:pPr>
+      <w:r>
+        <w:t xml:space="preserve">Risk of bias analysis method</w:t>
+      </w:r>
+    </w:p>
+    <w:p>
+      <w:pPr>
+        <w:pStyle w:val="Compact"/>
+        <w:numPr>
+          <w:ilvl w:val="0"/>
+          <w:numId w:val="1009"/>
+        </w:numPr>
+      </w:pPr>
+      <w:r>
+        <w:t xml:space="preserve">Description &amp; rationale of harmonization of reported effect measures</w:t>
+      </w:r>
+    </w:p>
+    <w:p>
+      <w:pPr>
+        <w:pStyle w:val="Compact"/>
+        <w:numPr>
+          <w:ilvl w:val="0"/>
+          <w:numId w:val="1010"/>
+        </w:numPr>
+      </w:pPr>
+      <w:r>
+        <w:t xml:space="preserve">Description of meta analysis methodology (frequentist &amp; Bayesian), models and software used, heterogeneity identification</w:t>
+      </w:r>
+    </w:p>
+    <w:p>
+      <w:pPr>
+        <w:pStyle w:val="Compact"/>
+        <w:numPr>
+          <w:ilvl w:val="0"/>
+          <w:numId w:val="1011"/>
+        </w:numPr>
+      </w:pPr>
+      <w:r>
+        <w:t xml:space="preserve">Sensitivity analysis</w:t>
+      </w:r>
+      <w:r>
+        <w:br/>
+      </w:r>
+    </w:p>
+    <w:p>
+      <w:pPr>
+        <w:pStyle w:val="FirstParagraph"/>
+      </w:pPr>
+      <w:r>
+        <w:t xml:space="preserve">In order to quantitatively synthesize the available epidemiological literature on the association of children’s blood lead levels and their IQ, we conducted a systematic review and meta analysis.</w:t>
+      </w:r>
+      <w:r>
+        <w:t xml:space="preserve"> </w:t>
+      </w:r>
+      <w:r>
+        <w:t xml:space="preserve">We compare a frequentist meta analysis approach to a Bayesian approach that has specific advantages and has gained popularity in recent years but is still not widely used in the field of epidemiology.</w:t>
+      </w:r>
+      <w:r>
+        <w:br/>
+      </w:r>
+      <w:r>
+        <w:t xml:space="preserve">(Section on literature review)</w:t>
+      </w:r>
+      <w:r>
+        <w:br/>
+      </w:r>
+      <w:r>
+        <w:t xml:space="preserve">We conducted a Risk of Bias assessment using a rapid Risk of Bias (raROB) tool with a specific focus on human observational epidemiological studies</w:t>
+      </w:r>
+      <w:r>
+        <w:t xml:space="preserve"> </w:t>
+      </w:r>
+      <w:r>
+        <w:t xml:space="preserve">(26)</w:t>
+      </w:r>
+      <w:r>
+        <w:t xml:space="preserve">.</w:t>
+      </w:r>
+      <w:r>
+        <w:t xml:space="preserve"> </w:t>
+      </w:r>
+      <w:r>
+        <w:t xml:space="preserve">Each included publications risk of bias was appraised by answering 15 items in the domains selection, exposure, outcome, confounding, follow-up, analysis, and selective reporting.</w:t>
+      </w:r>
+      <w:r>
+        <w:t xml:space="preserve"> </w:t>
+      </w:r>
+      <w:r>
+        <w:t xml:space="preserve">The overall risk of bias for each individual study was then categorized as either low, moderate or high.</w:t>
+      </w:r>
+      <w:r>
+        <w:t xml:space="preserve"> </w:t>
+      </w:r>
+      <w:r>
+        <w:t xml:space="preserve">Each publication was first assessed by one researcher and then consensus with a large language model (LLM) was sought.</w:t>
+      </w:r>
+      <w:r>
+        <w:t xml:space="preserve"> </w:t>
+      </w:r>
+      <w:r>
+        <w:t xml:space="preserve">This was done by uploading the publications and the list of all raRoB items.</w:t>
+      </w:r>
+      <w:r>
+        <w:t xml:space="preserve"> </w:t>
+      </w:r>
+      <w:r>
+        <w:t xml:space="preserve">If there were any deviations in the judgement of the researcher and the LLM, the corresponding item was revisited by the researcher and they made the final decision on the respective item.</w:t>
+      </w:r>
+    </w:p>
+    <w:bookmarkEnd w:id="27"/>
+    <w:bookmarkStart w:id="28" w:name="results"/>
+    <w:p>
+      <w:pPr>
+        <w:pStyle w:val="Heading1"/>
+      </w:pPr>
+      <w:r>
+        <w:t xml:space="preserve">3. Results</w:t>
+      </w:r>
+    </w:p>
+    <w:p>
+      <w:pPr>
+        <w:pStyle w:val="Compact"/>
+        <w:numPr>
+          <w:ilvl w:val="0"/>
+          <w:numId w:val="1012"/>
+        </w:numPr>
+      </w:pPr>
+      <w:r>
+        <w:t xml:space="preserve">Cite studies that might appear to meet inclusion criteria, but were excluded &amp; explain why</w:t>
+      </w:r>
+    </w:p>
+    <w:p>
+      <w:pPr>
+        <w:pStyle w:val="Compact"/>
+        <w:numPr>
+          <w:ilvl w:val="0"/>
+          <w:numId w:val="1013"/>
+        </w:numPr>
+      </w:pPr>
+      <w:r>
+        <w:t xml:space="preserve">Study characteristics (table), including original and harmonized effect measures</w:t>
+      </w:r>
+    </w:p>
+    <w:p>
+      <w:pPr>
+        <w:pStyle w:val="Compact"/>
+        <w:numPr>
+          <w:ilvl w:val="0"/>
+          <w:numId w:val="1014"/>
+        </w:numPr>
+      </w:pPr>
+      <w:r>
+        <w:t xml:space="preserve">Flow diagram, description of (full text) screening results</w:t>
+      </w:r>
+    </w:p>
+    <w:p>
+      <w:pPr>
+        <w:pStyle w:val="Compact"/>
+        <w:numPr>
+          <w:ilvl w:val="0"/>
+          <w:numId w:val="1015"/>
+        </w:numPr>
+      </w:pPr>
+      <w:r>
+        <w:t xml:space="preserve">RoB results for each included study</w:t>
+      </w:r>
+    </w:p>
+    <w:p>
+      <w:pPr>
+        <w:pStyle w:val="Compact"/>
+        <w:numPr>
+          <w:ilvl w:val="0"/>
+          <w:numId w:val="1016"/>
+        </w:numPr>
+      </w:pPr>
+      <w:r>
+        <w:t xml:space="preserve">Forest plots</w:t>
+      </w:r>
+    </w:p>
+    <w:p>
+      <w:pPr>
+        <w:pStyle w:val="Compact"/>
+        <w:numPr>
+          <w:ilvl w:val="0"/>
+          <w:numId w:val="1017"/>
+        </w:numPr>
+      </w:pPr>
+      <w:r>
+        <w:t xml:space="preserve">Sensitivity analysis results</w:t>
+      </w:r>
+    </w:p>
+    <w:bookmarkEnd w:id="28"/>
+    <w:bookmarkStart w:id="29" w:name="discussion"/>
+    <w:p>
+      <w:pPr>
+        <w:pStyle w:val="Heading1"/>
+      </w:pPr>
+      <w:r>
+        <w:t xml:space="preserve">4. Discussion</w:t>
+      </w:r>
+    </w:p>
+    <w:p>
+      <w:pPr>
+        <w:pStyle w:val="Compact"/>
+        <w:numPr>
+          <w:ilvl w:val="0"/>
+          <w:numId w:val="1018"/>
+        </w:numPr>
+      </w:pPr>
+      <w:r>
+        <w:t xml:space="preserve">General interpretation of results in light of evidence in literature</w:t>
+      </w:r>
+    </w:p>
+    <w:p>
+      <w:pPr>
+        <w:pStyle w:val="Compact"/>
+        <w:numPr>
+          <w:ilvl w:val="0"/>
+          <w:numId w:val="1019"/>
+        </w:numPr>
+      </w:pPr>
+      <w:r>
+        <w:t xml:space="preserve">Discuss differences, similarities, strengths and weaknesses of freq vs. Bayesian approach</w:t>
+      </w:r>
+    </w:p>
+    <w:p>
+      <w:pPr>
+        <w:pStyle w:val="Compact"/>
+        <w:numPr>
+          <w:ilvl w:val="0"/>
+          <w:numId w:val="1020"/>
+        </w:numPr>
+      </w:pPr>
+      <w:r>
+        <w:t xml:space="preserve">Study limitations &amp; strengths</w:t>
+      </w:r>
+    </w:p>
+    <w:bookmarkEnd w:id="29"/>
+    <w:bookmarkStart w:id="30" w:name="conclusions"/>
+    <w:p>
+      <w:pPr>
+        <w:pStyle w:val="Heading1"/>
+      </w:pPr>
+      <w:r>
+        <w:t xml:space="preserve">5. Conclusions</w:t>
+      </w:r>
+    </w:p>
+    <w:p>
+      <w:pPr>
+        <w:pStyle w:val="Compact"/>
+        <w:numPr>
+          <w:ilvl w:val="0"/>
+          <w:numId w:val="1021"/>
+        </w:numPr>
+      </w:pPr>
+      <w:r>
+        <w:t xml:space="preserve">Conclusion, with reference to aim of study</w:t>
+      </w:r>
+    </w:p>
+    <w:p>
+      <w:pPr>
+        <w:pStyle w:val="Compact"/>
+        <w:numPr>
+          <w:ilvl w:val="0"/>
+          <w:numId w:val="1022"/>
+        </w:numPr>
+      </w:pPr>
+      <w:r>
+        <w:t xml:space="preserve">Implications of results: policy, (scientific?) practice, future research needs</w:t>
       </w:r>
     </w:p>
     <w:bookmarkEnd w:id="30"/>
@@ -1058,6 +946,58 @@
               <w:jc w:val="left"/>
             </w:pPr>
             <w:r>
+              <w:t xml:space="preserve">BLL</w:t>
+            </w:r>
+          </w:p>
+        </w:tc>
+        <w:tc>
+          <w:tcPr/>
+          <w:p>
+            <w:pPr>
+              <w:pStyle w:val="Compact"/>
+              <w:jc w:val="left"/>
+            </w:pPr>
+            <w:r>
+              <w:t xml:space="preserve">Blood lead levels</w:t>
+            </w:r>
+          </w:p>
+        </w:tc>
+      </w:tr>
+      <w:tr>
+        <w:tc>
+          <w:tcPr/>
+          <w:p>
+            <w:pPr>
+              <w:pStyle w:val="Compact"/>
+              <w:jc w:val="left"/>
+            </w:pPr>
+            <w:r>
+              <w:t xml:space="preserve">CI</w:t>
+            </w:r>
+          </w:p>
+        </w:tc>
+        <w:tc>
+          <w:tcPr/>
+          <w:p>
+            <w:pPr>
+              <w:pStyle w:val="Compact"/>
+              <w:jc w:val="left"/>
+            </w:pPr>
+            <w:r>
+              <w:t xml:space="preserve">Confidence interval</w:t>
+            </w:r>
+          </w:p>
+        </w:tc>
+      </w:tr>
+      <w:tr>
+        <w:tc>
+          <w:tcPr/>
+          <w:p>
+            <w:pPr>
+              <w:pStyle w:val="Compact"/>
+              <w:jc w:val="left"/>
+            </w:pPr>
+            <w:r>
               <w:t xml:space="preserve">EBD</w:t>
             </w:r>
           </w:p>
@@ -1071,6 +1011,58 @@
             </w:pPr>
             <w:r>
               <w:t xml:space="preserve">Environmental Burden of Disease</w:t>
+            </w:r>
+          </w:p>
+        </w:tc>
+      </w:tr>
+      <w:tr>
+        <w:tc>
+          <w:tcPr/>
+          <w:p>
+            <w:pPr>
+              <w:pStyle w:val="Compact"/>
+              <w:jc w:val="left"/>
+            </w:pPr>
+            <w:r>
+              <w:t xml:space="preserve">EU</w:t>
+            </w:r>
+          </w:p>
+        </w:tc>
+        <w:tc>
+          <w:tcPr/>
+          <w:p>
+            <w:pPr>
+              <w:pStyle w:val="Compact"/>
+              <w:jc w:val="left"/>
+            </w:pPr>
+            <w:r>
+              <w:t xml:space="preserve">European Union</w:t>
+            </w:r>
+          </w:p>
+        </w:tc>
+      </w:tr>
+      <w:tr>
+        <w:tc>
+          <w:tcPr/>
+          <w:p>
+            <w:pPr>
+              <w:pStyle w:val="Compact"/>
+              <w:jc w:val="left"/>
+            </w:pPr>
+            <w:r>
+              <w:t xml:space="preserve">IQ</w:t>
+            </w:r>
+          </w:p>
+        </w:tc>
+        <w:tc>
+          <w:tcPr/>
+          <w:p>
+            <w:pPr>
+              <w:pStyle w:val="Compact"/>
+              <w:jc w:val="left"/>
+            </w:pPr>
+            <w:r>
+              <w:t xml:space="preserve">Intelligence quotient</w:t>
             </w:r>
           </w:p>
         </w:tc>
@@ -1185,7 +1177,7 @@
       </w:r>
     </w:p>
     <w:bookmarkEnd w:id="32"/>
-    <w:bookmarkStart w:id="82" w:name="bibliography"/>
+    <w:bookmarkStart w:id="86" w:name="bibliography"/>
     <w:p>
       <w:pPr>
         <w:pStyle w:val="Heading1"/>
@@ -1194,7 +1186,7 @@
         <w:t xml:space="preserve">References</w:t>
       </w:r>
     </w:p>
-    <w:bookmarkStart w:id="81" w:name="refs"/>
+    <w:bookmarkStart w:id="85" w:name="refs"/>
     <w:bookmarkStart w:id="34" w:name="Xe38019c88c6d2792bb296bad7dc0a4dd55f1319"/>
     <w:p>
       <w:pPr>
@@ -1531,7 +1523,7 @@
       </w:r>
     </w:p>
     <w:bookmarkEnd w:id="42"/>
-    <w:bookmarkStart w:id="44" w:name="ref-chang2006LowBloodLead"/>
+    <w:bookmarkStart w:id="44" w:name="ref-harari2018BloodLeadLevels"/>
     <w:p>
       <w:pPr>
         <w:pStyle w:val="Bibliography"/>
@@ -1546,12 +1538,318 @@
         <w:t xml:space="preserve">	</w:t>
       </w:r>
       <w:r>
+        <w:t xml:space="preserve">Harari F, Sallsten G, Christensson A, Petkovic M, Hedblad B, Forsgard N, et al.</w:t>
+      </w:r>
+      <w:r>
+        <w:t xml:space="preserve"> </w:t>
+      </w:r>
+      <w:hyperlink r:id="rId43">
+        <w:r>
+          <w:rPr>
+            <w:rStyle w:val="Hyperlink"/>
+          </w:rPr>
+          <w:t xml:space="preserve">Blood</w:t>
+        </w:r>
+        <w:r>
+          <w:rPr>
+            <w:rStyle w:val="Hyperlink"/>
+          </w:rPr>
+          <w:t xml:space="preserve"> </w:t>
+        </w:r>
+        <w:r>
+          <w:rPr>
+            <w:rStyle w:val="Hyperlink"/>
+          </w:rPr>
+          <w:t xml:space="preserve">Lead Levels</w:t>
+        </w:r>
+        <w:r>
+          <w:rPr>
+            <w:rStyle w:val="Hyperlink"/>
+          </w:rPr>
+          <w:t xml:space="preserve"> </w:t>
+        </w:r>
+        <w:r>
+          <w:rPr>
+            <w:rStyle w:val="Hyperlink"/>
+          </w:rPr>
+          <w:t xml:space="preserve">and</w:t>
+        </w:r>
+        <w:r>
+          <w:rPr>
+            <w:rStyle w:val="Hyperlink"/>
+          </w:rPr>
+          <w:t xml:space="preserve"> </w:t>
+        </w:r>
+        <w:r>
+          <w:rPr>
+            <w:rStyle w:val="Hyperlink"/>
+          </w:rPr>
+          <w:t xml:space="preserve">Decreased Kidney Function</w:t>
+        </w:r>
+        <w:r>
+          <w:rPr>
+            <w:rStyle w:val="Hyperlink"/>
+          </w:rPr>
+          <w:t xml:space="preserve"> </w:t>
+        </w:r>
+        <w:r>
+          <w:rPr>
+            <w:rStyle w:val="Hyperlink"/>
+          </w:rPr>
+          <w:t xml:space="preserve">in a</w:t>
+        </w:r>
+        <w:r>
+          <w:rPr>
+            <w:rStyle w:val="Hyperlink"/>
+          </w:rPr>
+          <w:t xml:space="preserve"> </w:t>
+        </w:r>
+        <w:r>
+          <w:rPr>
+            <w:rStyle w:val="Hyperlink"/>
+          </w:rPr>
+          <w:t xml:space="preserve">Population-Based Cohort</w:t>
+        </w:r>
+      </w:hyperlink>
+      <w:r>
+        <w:t xml:space="preserve">. American Journal of Kidney Diseases. 2018 Sep;72(3):381–9.</w:t>
+      </w:r>
+      <w:r>
+        <w:t xml:space="preserve"> </w:t>
+      </w:r>
+    </w:p>
+    <w:bookmarkEnd w:id="44"/>
+    <w:bookmarkStart w:id="46" w:name="ref-wan2022ChronicLeadExposure"/>
+    <w:p>
+      <w:pPr>
+        <w:pStyle w:val="Bibliography"/>
+      </w:pPr>
+      <w:r>
+        <w:t xml:space="preserve">7.</w:t>
+      </w:r>
+      <w:r>
+        <w:t xml:space="preserve"> </w:t>
+      </w:r>
+      <w:r>
+        <w:t xml:space="preserve">	</w:t>
+      </w:r>
+      <w:r>
+        <w:t xml:space="preserve">Wan H, Wang Y, Zhang H, Zhang K, Chen Y, Chen C, et al.</w:t>
+      </w:r>
+      <w:r>
+        <w:t xml:space="preserve"> </w:t>
+      </w:r>
+      <w:hyperlink r:id="rId45">
+        <w:r>
+          <w:rPr>
+            <w:rStyle w:val="Hyperlink"/>
+          </w:rPr>
+          <w:t xml:space="preserve">Chronic lead exposure induces fatty liver disease associated with the variations of gut microbiota</w:t>
+        </w:r>
+      </w:hyperlink>
+      <w:r>
+        <w:t xml:space="preserve">. Ecotoxicology and Environmental Safety. 2022 Mar;232:113257.</w:t>
+      </w:r>
+      <w:r>
+        <w:t xml:space="preserve"> </w:t>
+      </w:r>
+    </w:p>
+    <w:bookmarkEnd w:id="46"/>
+    <w:bookmarkStart w:id="48" w:name="ref-rosengren2025ExposureLeadCoronary"/>
+    <w:p>
+      <w:pPr>
+        <w:pStyle w:val="Bibliography"/>
+      </w:pPr>
+      <w:r>
+        <w:t xml:space="preserve">8.</w:t>
+      </w:r>
+      <w:r>
+        <w:t xml:space="preserve"> </w:t>
+      </w:r>
+      <w:r>
+        <w:t xml:space="preserve">	</w:t>
+      </w:r>
+      <w:r>
+        <w:t xml:space="preserve">Rosengren E, Barregard L, Sallsten G, Fagerberg B, Engström G, Fagman E, et al.</w:t>
+      </w:r>
+      <w:r>
+        <w:t xml:space="preserve"> </w:t>
+      </w:r>
+      <w:hyperlink r:id="rId47">
+        <w:r>
+          <w:rPr>
+            <w:rStyle w:val="Hyperlink"/>
+          </w:rPr>
+          <w:t xml:space="preserve">Exposure to</w:t>
+        </w:r>
+        <w:r>
+          <w:rPr>
+            <w:rStyle w:val="Hyperlink"/>
+          </w:rPr>
+          <w:t xml:space="preserve"> </w:t>
+        </w:r>
+        <w:r>
+          <w:rPr>
+            <w:rStyle w:val="Hyperlink"/>
+          </w:rPr>
+          <w:t xml:space="preserve">Lead</w:t>
+        </w:r>
+        <w:r>
+          <w:rPr>
+            <w:rStyle w:val="Hyperlink"/>
+          </w:rPr>
+          <w:t xml:space="preserve"> </w:t>
+        </w:r>
+        <w:r>
+          <w:rPr>
+            <w:rStyle w:val="Hyperlink"/>
+          </w:rPr>
+          <w:t xml:space="preserve">and</w:t>
+        </w:r>
+        <w:r>
+          <w:rPr>
+            <w:rStyle w:val="Hyperlink"/>
+          </w:rPr>
+          <w:t xml:space="preserve"> </w:t>
+        </w:r>
+        <w:r>
+          <w:rPr>
+            <w:rStyle w:val="Hyperlink"/>
+          </w:rPr>
+          <w:t xml:space="preserve">Coronary Artery Atherosclerosis</w:t>
+        </w:r>
+        <w:r>
+          <w:rPr>
+            <w:rStyle w:val="Hyperlink"/>
+          </w:rPr>
+          <w:t xml:space="preserve">:</w:t>
+        </w:r>
+        <w:r>
+          <w:rPr>
+            <w:rStyle w:val="Hyperlink"/>
+          </w:rPr>
+          <w:t xml:space="preserve"> </w:t>
+        </w:r>
+        <w:r>
+          <w:rPr>
+            <w:rStyle w:val="Hyperlink"/>
+          </w:rPr>
+          <w:t xml:space="preserve">A Swedish Cross</w:t>
+        </w:r>
+        <w:r>
+          <w:rPr>
+            <w:rStyle w:val="Hyperlink"/>
+          </w:rPr>
+          <w:t xml:space="preserve">-</w:t>
+        </w:r>
+        <w:r>
+          <w:rPr>
+            <w:rStyle w:val="Hyperlink"/>
+          </w:rPr>
+          <w:t xml:space="preserve">Sectional Population</w:t>
+        </w:r>
+        <w:r>
+          <w:rPr>
+            <w:rStyle w:val="Hyperlink"/>
+          </w:rPr>
+          <w:t xml:space="preserve">-</w:t>
+        </w:r>
+        <w:r>
+          <w:rPr>
+            <w:rStyle w:val="Hyperlink"/>
+          </w:rPr>
+          <w:t xml:space="preserve">Based Study</w:t>
+        </w:r>
+      </w:hyperlink>
+      <w:r>
+        <w:t xml:space="preserve">. JAHA. 2025 Mar;14(5):e037633.</w:t>
+      </w:r>
+      <w:r>
+        <w:t xml:space="preserve"> </w:t>
+      </w:r>
+    </w:p>
+    <w:bookmarkEnd w:id="48"/>
+    <w:bookmarkStart w:id="50" w:name="ref-lanphear2018LowlevelLeadExposure"/>
+    <w:p>
+      <w:pPr>
+        <w:pStyle w:val="Bibliography"/>
+      </w:pPr>
+      <w:r>
+        <w:t xml:space="preserve">9.</w:t>
+      </w:r>
+      <w:r>
+        <w:t xml:space="preserve"> </w:t>
+      </w:r>
+      <w:r>
+        <w:t xml:space="preserve">	</w:t>
+      </w:r>
+      <w:r>
+        <w:t xml:space="preserve">Lanphear BP, Rauch S, Auinger P, Allen RW, Hornung RW.</w:t>
+      </w:r>
+      <w:r>
+        <w:t xml:space="preserve"> </w:t>
+      </w:r>
+      <w:hyperlink r:id="rId49">
+        <w:r>
+          <w:rPr>
+            <w:rStyle w:val="Hyperlink"/>
+          </w:rPr>
+          <w:t xml:space="preserve">Low-level lead exposure and mortality in</w:t>
+        </w:r>
+        <w:r>
+          <w:rPr>
+            <w:rStyle w:val="Hyperlink"/>
+          </w:rPr>
+          <w:t xml:space="preserve"> </w:t>
+        </w:r>
+        <w:r>
+          <w:rPr>
+            <w:rStyle w:val="Hyperlink"/>
+          </w:rPr>
+          <w:t xml:space="preserve">US</w:t>
+        </w:r>
+        <w:r>
+          <w:rPr>
+            <w:rStyle w:val="Hyperlink"/>
+          </w:rPr>
+          <w:t xml:space="preserve"> </w:t>
+        </w:r>
+        <w:r>
+          <w:rPr>
+            <w:rStyle w:val="Hyperlink"/>
+          </w:rPr>
+          <w:t xml:space="preserve">adults: A population-based cohort study</w:t>
+        </w:r>
+      </w:hyperlink>
+      <w:r>
+        <w:t xml:space="preserve">. The Lancet Public Health. 2018 Apr;3(4):e177–84.</w:t>
+      </w:r>
+      <w:r>
+        <w:t xml:space="preserve"> </w:t>
+      </w:r>
+    </w:p>
+    <w:bookmarkEnd w:id="50"/>
+    <w:bookmarkStart w:id="52" w:name="ref-chang2006LowBloodLead"/>
+    <w:p>
+      <w:pPr>
+        <w:pStyle w:val="Bibliography"/>
+      </w:pPr>
+      <w:r>
+        <w:t xml:space="preserve">10.</w:t>
+      </w:r>
+      <w:r>
+        <w:t xml:space="preserve"> </w:t>
+      </w:r>
+      <w:r>
+        <w:t xml:space="preserve">	</w:t>
+      </w:r>
+      <w:r>
         <w:t xml:space="preserve">Chang SH, Cheng BH, Lee SL, Chuang HY, Yang CY, Sung FC, et al.</w:t>
       </w:r>
       <w:r>
         <w:t xml:space="preserve"> </w:t>
       </w:r>
-      <w:hyperlink r:id="rId43">
+      <w:hyperlink r:id="rId51">
         <w:r>
           <w:rPr>
             <w:rStyle w:val="Hyperlink"/>
@@ -1566,14 +1864,14 @@
         <w:t xml:space="preserve"> </w:t>
       </w:r>
     </w:p>
-    <w:bookmarkEnd w:id="44"/>
-    <w:bookmarkStart w:id="46" w:name="Xadfdab0209e4a364d9fdcffecfddb00700d2db9"/>
+    <w:bookmarkEnd w:id="52"/>
+    <w:bookmarkStart w:id="54" w:name="Xadfdab0209e4a364d9fdcffecfddb00700d2db9"/>
     <w:p>
       <w:pPr>
         <w:pStyle w:val="Bibliography"/>
       </w:pPr>
       <w:r>
-        <w:t xml:space="preserve">7.</w:t>
+        <w:t xml:space="preserve">11.</w:t>
       </w:r>
       <w:r>
         <w:t xml:space="preserve"> </w:t>
@@ -1587,7 +1885,7 @@
       <w:r>
         <w:t xml:space="preserve"> </w:t>
       </w:r>
-      <w:hyperlink r:id="rId45">
+      <w:hyperlink r:id="rId53">
         <w:r>
           <w:rPr>
             <w:rStyle w:val="Hyperlink"/>
@@ -1722,14 +2020,14 @@
         <w:t xml:space="preserve"> </w:t>
       </w:r>
     </w:p>
-    <w:bookmarkEnd w:id="46"/>
-    <w:bookmarkStart w:id="48" w:name="ref-shaffer2025LeadExposureAntisocial"/>
+    <w:bookmarkEnd w:id="54"/>
+    <w:bookmarkStart w:id="56" w:name="ref-shaffer2025LeadExposureAntisocial"/>
     <w:p>
       <w:pPr>
         <w:pStyle w:val="Bibliography"/>
       </w:pPr>
       <w:r>
-        <w:t xml:space="preserve">8.</w:t>
+        <w:t xml:space="preserve">12.</w:t>
       </w:r>
       <w:r>
         <w:t xml:space="preserve"> </w:t>
@@ -1743,7 +2041,7 @@
       <w:r>
         <w:t xml:space="preserve"> </w:t>
       </w:r>
-      <w:hyperlink r:id="rId47">
+      <w:hyperlink r:id="rId55">
         <w:r>
           <w:rPr>
             <w:rStyle w:val="Hyperlink"/>
@@ -1777,312 +2075,6 @@
       </w:hyperlink>
       <w:r>
         <w:t xml:space="preserve">. Environment International. 2025;109786.</w:t>
-      </w:r>
-      <w:r>
-        <w:t xml:space="preserve"> </w:t>
-      </w:r>
-    </w:p>
-    <w:bookmarkEnd w:id="48"/>
-    <w:bookmarkStart w:id="50" w:name="ref-harari2018BloodLeadLevels"/>
-    <w:p>
-      <w:pPr>
-        <w:pStyle w:val="Bibliography"/>
-      </w:pPr>
-      <w:r>
-        <w:t xml:space="preserve">9.</w:t>
-      </w:r>
-      <w:r>
-        <w:t xml:space="preserve"> </w:t>
-      </w:r>
-      <w:r>
-        <w:t xml:space="preserve">	</w:t>
-      </w:r>
-      <w:r>
-        <w:t xml:space="preserve">Harari F, Sallsten G, Christensson A, Petkovic M, Hedblad B, Forsgard N, et al.</w:t>
-      </w:r>
-      <w:r>
-        <w:t xml:space="preserve"> </w:t>
-      </w:r>
-      <w:hyperlink r:id="rId49">
-        <w:r>
-          <w:rPr>
-            <w:rStyle w:val="Hyperlink"/>
-          </w:rPr>
-          <w:t xml:space="preserve">Blood</w:t>
-        </w:r>
-        <w:r>
-          <w:rPr>
-            <w:rStyle w:val="Hyperlink"/>
-          </w:rPr>
-          <w:t xml:space="preserve"> </w:t>
-        </w:r>
-        <w:r>
-          <w:rPr>
-            <w:rStyle w:val="Hyperlink"/>
-          </w:rPr>
-          <w:t xml:space="preserve">Lead Levels</w:t>
-        </w:r>
-        <w:r>
-          <w:rPr>
-            <w:rStyle w:val="Hyperlink"/>
-          </w:rPr>
-          <w:t xml:space="preserve"> </w:t>
-        </w:r>
-        <w:r>
-          <w:rPr>
-            <w:rStyle w:val="Hyperlink"/>
-          </w:rPr>
-          <w:t xml:space="preserve">and</w:t>
-        </w:r>
-        <w:r>
-          <w:rPr>
-            <w:rStyle w:val="Hyperlink"/>
-          </w:rPr>
-          <w:t xml:space="preserve"> </w:t>
-        </w:r>
-        <w:r>
-          <w:rPr>
-            <w:rStyle w:val="Hyperlink"/>
-          </w:rPr>
-          <w:t xml:space="preserve">Decreased Kidney Function</w:t>
-        </w:r>
-        <w:r>
-          <w:rPr>
-            <w:rStyle w:val="Hyperlink"/>
-          </w:rPr>
-          <w:t xml:space="preserve"> </w:t>
-        </w:r>
-        <w:r>
-          <w:rPr>
-            <w:rStyle w:val="Hyperlink"/>
-          </w:rPr>
-          <w:t xml:space="preserve">in a</w:t>
-        </w:r>
-        <w:r>
-          <w:rPr>
-            <w:rStyle w:val="Hyperlink"/>
-          </w:rPr>
-          <w:t xml:space="preserve"> </w:t>
-        </w:r>
-        <w:r>
-          <w:rPr>
-            <w:rStyle w:val="Hyperlink"/>
-          </w:rPr>
-          <w:t xml:space="preserve">Population-Based Cohort</w:t>
-        </w:r>
-      </w:hyperlink>
-      <w:r>
-        <w:t xml:space="preserve">. American Journal of Kidney Diseases. 2018 Sep;72(3):381–9.</w:t>
-      </w:r>
-      <w:r>
-        <w:t xml:space="preserve"> </w:t>
-      </w:r>
-    </w:p>
-    <w:bookmarkEnd w:id="50"/>
-    <w:bookmarkStart w:id="52" w:name="ref-wan2022ChronicLeadExposure"/>
-    <w:p>
-      <w:pPr>
-        <w:pStyle w:val="Bibliography"/>
-      </w:pPr>
-      <w:r>
-        <w:t xml:space="preserve">10.</w:t>
-      </w:r>
-      <w:r>
-        <w:t xml:space="preserve"> </w:t>
-      </w:r>
-      <w:r>
-        <w:t xml:space="preserve">	</w:t>
-      </w:r>
-      <w:r>
-        <w:t xml:space="preserve">Wan H, Wang Y, Zhang H, Zhang K, Chen Y, Chen C, et al.</w:t>
-      </w:r>
-      <w:r>
-        <w:t xml:space="preserve"> </w:t>
-      </w:r>
-      <w:hyperlink r:id="rId51">
-        <w:r>
-          <w:rPr>
-            <w:rStyle w:val="Hyperlink"/>
-          </w:rPr>
-          <w:t xml:space="preserve">Chronic lead exposure induces fatty liver disease associated with the variations of gut microbiota</w:t>
-        </w:r>
-      </w:hyperlink>
-      <w:r>
-        <w:t xml:space="preserve">. Ecotoxicology and Environmental Safety. 2022 Mar;232:113257.</w:t>
-      </w:r>
-      <w:r>
-        <w:t xml:space="preserve"> </w:t>
-      </w:r>
-    </w:p>
-    <w:bookmarkEnd w:id="52"/>
-    <w:bookmarkStart w:id="54" w:name="ref-rosengren2025ExposureLeadCoronary"/>
-    <w:p>
-      <w:pPr>
-        <w:pStyle w:val="Bibliography"/>
-      </w:pPr>
-      <w:r>
-        <w:t xml:space="preserve">11.</w:t>
-      </w:r>
-      <w:r>
-        <w:t xml:space="preserve"> </w:t>
-      </w:r>
-      <w:r>
-        <w:t xml:space="preserve">	</w:t>
-      </w:r>
-      <w:r>
-        <w:t xml:space="preserve">Rosengren E, Barregard L, Sallsten G, Fagerberg B, Engström G, Fagman E, et al.</w:t>
-      </w:r>
-      <w:r>
-        <w:t xml:space="preserve"> </w:t>
-      </w:r>
-      <w:hyperlink r:id="rId53">
-        <w:r>
-          <w:rPr>
-            <w:rStyle w:val="Hyperlink"/>
-          </w:rPr>
-          <w:t xml:space="preserve">Exposure to</w:t>
-        </w:r>
-        <w:r>
-          <w:rPr>
-            <w:rStyle w:val="Hyperlink"/>
-          </w:rPr>
-          <w:t xml:space="preserve"> </w:t>
-        </w:r>
-        <w:r>
-          <w:rPr>
-            <w:rStyle w:val="Hyperlink"/>
-          </w:rPr>
-          <w:t xml:space="preserve">Lead</w:t>
-        </w:r>
-        <w:r>
-          <w:rPr>
-            <w:rStyle w:val="Hyperlink"/>
-          </w:rPr>
-          <w:t xml:space="preserve"> </w:t>
-        </w:r>
-        <w:r>
-          <w:rPr>
-            <w:rStyle w:val="Hyperlink"/>
-          </w:rPr>
-          <w:t xml:space="preserve">and</w:t>
-        </w:r>
-        <w:r>
-          <w:rPr>
-            <w:rStyle w:val="Hyperlink"/>
-          </w:rPr>
-          <w:t xml:space="preserve"> </w:t>
-        </w:r>
-        <w:r>
-          <w:rPr>
-            <w:rStyle w:val="Hyperlink"/>
-          </w:rPr>
-          <w:t xml:space="preserve">Coronary Artery Atherosclerosis</w:t>
-        </w:r>
-        <w:r>
-          <w:rPr>
-            <w:rStyle w:val="Hyperlink"/>
-          </w:rPr>
-          <w:t xml:space="preserve">:</w:t>
-        </w:r>
-        <w:r>
-          <w:rPr>
-            <w:rStyle w:val="Hyperlink"/>
-          </w:rPr>
-          <w:t xml:space="preserve"> </w:t>
-        </w:r>
-        <w:r>
-          <w:rPr>
-            <w:rStyle w:val="Hyperlink"/>
-          </w:rPr>
-          <w:t xml:space="preserve">A Swedish Cross</w:t>
-        </w:r>
-        <w:r>
-          <w:rPr>
-            <w:rStyle w:val="Hyperlink"/>
-          </w:rPr>
-          <w:t xml:space="preserve">-</w:t>
-        </w:r>
-        <w:r>
-          <w:rPr>
-            <w:rStyle w:val="Hyperlink"/>
-          </w:rPr>
-          <w:t xml:space="preserve">Sectional Population</w:t>
-        </w:r>
-        <w:r>
-          <w:rPr>
-            <w:rStyle w:val="Hyperlink"/>
-          </w:rPr>
-          <w:t xml:space="preserve">-</w:t>
-        </w:r>
-        <w:r>
-          <w:rPr>
-            <w:rStyle w:val="Hyperlink"/>
-          </w:rPr>
-          <w:t xml:space="preserve">Based Study</w:t>
-        </w:r>
-      </w:hyperlink>
-      <w:r>
-        <w:t xml:space="preserve">. JAHA. 2025 Mar;14(5):e037633.</w:t>
-      </w:r>
-      <w:r>
-        <w:t xml:space="preserve"> </w:t>
-      </w:r>
-    </w:p>
-    <w:bookmarkEnd w:id="54"/>
-    <w:bookmarkStart w:id="56" w:name="ref-lanphear2018LowlevelLeadExposure"/>
-    <w:p>
-      <w:pPr>
-        <w:pStyle w:val="Bibliography"/>
-      </w:pPr>
-      <w:r>
-        <w:t xml:space="preserve">12.</w:t>
-      </w:r>
-      <w:r>
-        <w:t xml:space="preserve"> </w:t>
-      </w:r>
-      <w:r>
-        <w:t xml:space="preserve">	</w:t>
-      </w:r>
-      <w:r>
-        <w:t xml:space="preserve">Lanphear BP, Rauch S, Auinger P, Allen RW, Hornung RW.</w:t>
-      </w:r>
-      <w:r>
-        <w:t xml:space="preserve"> </w:t>
-      </w:r>
-      <w:hyperlink r:id="rId55">
-        <w:r>
-          <w:rPr>
-            <w:rStyle w:val="Hyperlink"/>
-          </w:rPr>
-          <w:t xml:space="preserve">Low-level lead exposure and mortality in</w:t>
-        </w:r>
-        <w:r>
-          <w:rPr>
-            <w:rStyle w:val="Hyperlink"/>
-          </w:rPr>
-          <w:t xml:space="preserve"> </w:t>
-        </w:r>
-        <w:r>
-          <w:rPr>
-            <w:rStyle w:val="Hyperlink"/>
-          </w:rPr>
-          <w:t xml:space="preserve">US</w:t>
-        </w:r>
-        <w:r>
-          <w:rPr>
-            <w:rStyle w:val="Hyperlink"/>
-          </w:rPr>
-          <w:t xml:space="preserve"> </w:t>
-        </w:r>
-        <w:r>
-          <w:rPr>
-            <w:rStyle w:val="Hyperlink"/>
-          </w:rPr>
-          <w:t xml:space="preserve">adults: A population-based cohort study</w:t>
-        </w:r>
-      </w:hyperlink>
-      <w:r>
-        <w:t xml:space="preserve">. The Lancet Public Health. 2018 Apr;3(4):e177–84.</w:t>
       </w:r>
       <w:r>
         <w:t xml:space="preserve"> </w:t>
@@ -2281,7 +2273,7 @@
       </w:r>
     </w:p>
     <w:bookmarkEnd w:id="62"/>
-    <w:bookmarkStart w:id="64" w:name="X93c1fc7f8e1220d02cbab90c02ac44248f2b23e"/>
+    <w:bookmarkStart w:id="64" w:name="Xa2086c2c3f6a9ac4b676f66b1cdbbd5efdb3b23"/>
     <w:p>
       <w:pPr>
         <w:pStyle w:val="Bibliography"/>
@@ -2296,12 +2288,251 @@
         <w:t xml:space="preserve">	</w:t>
       </w:r>
       <w:r>
+        <w:t xml:space="preserve">Canfield RL, Henderson CR, Cory-Slechta DA, Cox C, Jusko TA, Lanphear BP.</w:t>
+      </w:r>
+      <w:r>
+        <w:t xml:space="preserve"> </w:t>
+      </w:r>
+      <w:hyperlink r:id="rId63">
+        <w:r>
+          <w:rPr>
+            <w:rStyle w:val="Hyperlink"/>
+          </w:rPr>
+          <w:t xml:space="preserve">Intellectual</w:t>
+        </w:r>
+        <w:r>
+          <w:rPr>
+            <w:rStyle w:val="Hyperlink"/>
+          </w:rPr>
+          <w:t xml:space="preserve"> </w:t>
+        </w:r>
+        <w:r>
+          <w:rPr>
+            <w:rStyle w:val="Hyperlink"/>
+          </w:rPr>
+          <w:t xml:space="preserve">Impairment</w:t>
+        </w:r>
+        <w:r>
+          <w:rPr>
+            <w:rStyle w:val="Hyperlink"/>
+          </w:rPr>
+          <w:t xml:space="preserve"> </w:t>
+        </w:r>
+        <w:r>
+          <w:rPr>
+            <w:rStyle w:val="Hyperlink"/>
+          </w:rPr>
+          <w:t xml:space="preserve">in</w:t>
+        </w:r>
+        <w:r>
+          <w:rPr>
+            <w:rStyle w:val="Hyperlink"/>
+          </w:rPr>
+          <w:t xml:space="preserve"> </w:t>
+        </w:r>
+        <w:r>
+          <w:rPr>
+            <w:rStyle w:val="Hyperlink"/>
+          </w:rPr>
+          <w:t xml:space="preserve">Children</w:t>
+        </w:r>
+        <w:r>
+          <w:rPr>
+            <w:rStyle w:val="Hyperlink"/>
+          </w:rPr>
+          <w:t xml:space="preserve"> </w:t>
+        </w:r>
+        <w:r>
+          <w:rPr>
+            <w:rStyle w:val="Hyperlink"/>
+          </w:rPr>
+          <w:t xml:space="preserve">with</w:t>
+        </w:r>
+        <w:r>
+          <w:rPr>
+            <w:rStyle w:val="Hyperlink"/>
+          </w:rPr>
+          <w:t xml:space="preserve"> </w:t>
+        </w:r>
+        <w:r>
+          <w:rPr>
+            <w:rStyle w:val="Hyperlink"/>
+          </w:rPr>
+          <w:t xml:space="preserve">Blood Lead Concentrations</w:t>
+        </w:r>
+        <w:r>
+          <w:rPr>
+            <w:rStyle w:val="Hyperlink"/>
+          </w:rPr>
+          <w:t xml:space="preserve"> </w:t>
+        </w:r>
+        <w:r>
+          <w:rPr>
+            <w:rStyle w:val="Hyperlink"/>
+          </w:rPr>
+          <w:t xml:space="preserve">below 10</w:t>
+        </w:r>
+        <w:r>
+          <w:rPr>
+            <w:rStyle w:val="Hyperlink"/>
+          </w:rPr>
+          <w:t xml:space="preserve"> </w:t>
+        </w:r>
+        <m:oMath>
+          <m:r>
+            <m:t>μ</m:t>
+          </m:r>
+        </m:oMath>
+        <w:r>
+          <w:rPr>
+            <w:rStyle w:val="Hyperlink"/>
+          </w:rPr>
+          <w:t xml:space="preserve">g per</w:t>
+        </w:r>
+        <w:r>
+          <w:rPr>
+            <w:rStyle w:val="Hyperlink"/>
+          </w:rPr>
+          <w:t xml:space="preserve"> </w:t>
+        </w:r>
+        <w:r>
+          <w:rPr>
+            <w:rStyle w:val="Hyperlink"/>
+          </w:rPr>
+          <w:t xml:space="preserve">Deciliter</w:t>
+        </w:r>
+      </w:hyperlink>
+      <w:r>
+        <w:t xml:space="preserve">. N Engl J Med. 2003 Apr;348(16):1517–26.</w:t>
+      </w:r>
+      <w:r>
+        <w:t xml:space="preserve"> </w:t>
+      </w:r>
+    </w:p>
+    <w:bookmarkEnd w:id="64"/>
+    <w:bookmarkStart w:id="66" w:name="X9a8bad0b78f43066cb333fdedcdcad5d7017900"/>
+    <w:p>
+      <w:pPr>
+        <w:pStyle w:val="Bibliography"/>
+      </w:pPr>
+      <w:r>
+        <w:t xml:space="preserve">17.</w:t>
+      </w:r>
+      <w:r>
+        <w:t xml:space="preserve"> </w:t>
+      </w:r>
+      <w:r>
+        <w:t xml:space="preserve">	</w:t>
+      </w:r>
+      <w:r>
+        <w:t xml:space="preserve">Lanphear BP, Hornung R, Khoury J, Yolton K, Baghurst P, Bellinger DC, et al.</w:t>
+      </w:r>
+      <w:r>
+        <w:t xml:space="preserve"> </w:t>
+      </w:r>
+      <w:hyperlink r:id="rId65">
+        <w:r>
+          <w:rPr>
+            <w:rStyle w:val="Hyperlink"/>
+          </w:rPr>
+          <w:t xml:space="preserve">Low-</w:t>
+        </w:r>
+        <w:r>
+          <w:rPr>
+            <w:rStyle w:val="Hyperlink"/>
+          </w:rPr>
+          <w:t xml:space="preserve">Level Environmental Lead Exposure</w:t>
+        </w:r>
+        <w:r>
+          <w:rPr>
+            <w:rStyle w:val="Hyperlink"/>
+          </w:rPr>
+          <w:t xml:space="preserve"> </w:t>
+        </w:r>
+        <w:r>
+          <w:rPr>
+            <w:rStyle w:val="Hyperlink"/>
+          </w:rPr>
+          <w:t xml:space="preserve">and</w:t>
+        </w:r>
+        <w:r>
+          <w:rPr>
+            <w:rStyle w:val="Hyperlink"/>
+          </w:rPr>
+          <w:t xml:space="preserve"> </w:t>
+        </w:r>
+        <w:r>
+          <w:rPr>
+            <w:rStyle w:val="Hyperlink"/>
+          </w:rPr>
+          <w:t xml:space="preserve">Children</w:t>
+        </w:r>
+        <w:r>
+          <w:rPr>
+            <w:rStyle w:val="Hyperlink"/>
+          </w:rPr>
+          <w:t xml:space="preserve">’s</w:t>
+        </w:r>
+        <w:r>
+          <w:rPr>
+            <w:rStyle w:val="Hyperlink"/>
+          </w:rPr>
+          <w:t xml:space="preserve"> </w:t>
+        </w:r>
+        <w:r>
+          <w:rPr>
+            <w:rStyle w:val="Hyperlink"/>
+          </w:rPr>
+          <w:t xml:space="preserve">Intellectual Function</w:t>
+        </w:r>
+        <w:r>
+          <w:rPr>
+            <w:rStyle w:val="Hyperlink"/>
+          </w:rPr>
+          <w:t xml:space="preserve">:</w:t>
+        </w:r>
+        <w:r>
+          <w:rPr>
+            <w:rStyle w:val="Hyperlink"/>
+          </w:rPr>
+          <w:t xml:space="preserve"> </w:t>
+        </w:r>
+        <w:r>
+          <w:rPr>
+            <w:rStyle w:val="Hyperlink"/>
+          </w:rPr>
+          <w:t xml:space="preserve">An International Pooled Analysis</w:t>
+        </w:r>
+      </w:hyperlink>
+      <w:r>
+        <w:t xml:space="preserve">. Environmental Health Perspectives. 2005;113(7):894–9.</w:t>
+      </w:r>
+      <w:r>
+        <w:t xml:space="preserve"> </w:t>
+      </w:r>
+    </w:p>
+    <w:bookmarkEnd w:id="66"/>
+    <w:bookmarkStart w:id="68" w:name="X93c1fc7f8e1220d02cbab90c02ac44248f2b23e"/>
+    <w:p>
+      <w:pPr>
+        <w:pStyle w:val="Bibliography"/>
+      </w:pPr>
+      <w:r>
+        <w:t xml:space="preserve">18.</w:t>
+      </w:r>
+      <w:r>
+        <w:t xml:space="preserve"> </w:t>
+      </w:r>
+      <w:r>
+        <w:t xml:space="preserve">	</w:t>
+      </w:r>
+      <w:r>
         <w:t xml:space="preserve">Carrington C, Devleesschauwer B, Gibb HJ, Bolger PM.</w:t>
       </w:r>
       <w:r>
         <w:t xml:space="preserve"> </w:t>
       </w:r>
-      <w:hyperlink r:id="rId63">
+      <w:hyperlink r:id="rId67">
         <w:r>
           <w:rPr>
             <w:rStyle w:val="Hyperlink"/>
@@ -2316,14 +2547,14 @@
         <w:t xml:space="preserve"> </w:t>
       </w:r>
     </w:p>
-    <w:bookmarkEnd w:id="64"/>
-    <w:bookmarkStart w:id="66" w:name="ref-figueroa2024LossCognitiveFunction"/>
+    <w:bookmarkEnd w:id="68"/>
+    <w:bookmarkStart w:id="70" w:name="ref-figueroa2024LossCognitiveFunction"/>
     <w:p>
       <w:pPr>
         <w:pStyle w:val="Bibliography"/>
       </w:pPr>
       <w:r>
-        <w:t xml:space="preserve">17.</w:t>
+        <w:t xml:space="preserve">19.</w:t>
       </w:r>
       <w:r>
         <w:t xml:space="preserve"> </w:t>
@@ -2337,7 +2568,7 @@
       <w:r>
         <w:t xml:space="preserve"> </w:t>
       </w:r>
-      <w:hyperlink r:id="rId65">
+      <w:hyperlink r:id="rId69">
         <w:r>
           <w:rPr>
             <w:rStyle w:val="Hyperlink"/>
@@ -2376,14 +2607,14 @@
         <w:t xml:space="preserve"> </w:t>
       </w:r>
     </w:p>
-    <w:bookmarkEnd w:id="66"/>
-    <w:bookmarkStart w:id="68" w:name="ref-mcfarland2022HalfUSPopulation"/>
+    <w:bookmarkEnd w:id="70"/>
+    <w:bookmarkStart w:id="72" w:name="ref-mcfarland2022HalfUSPopulation"/>
     <w:p>
       <w:pPr>
         <w:pStyle w:val="Bibliography"/>
       </w:pPr>
       <w:r>
-        <w:t xml:space="preserve">18.</w:t>
+        <w:t xml:space="preserve">20.</w:t>
       </w:r>
       <w:r>
         <w:t xml:space="preserve"> </w:t>
@@ -2397,7 +2628,7 @@
       <w:r>
         <w:t xml:space="preserve"> </w:t>
       </w:r>
-      <w:hyperlink r:id="rId67">
+      <w:hyperlink r:id="rId71">
         <w:r>
           <w:rPr>
             <w:rStyle w:val="Hyperlink"/>
@@ -2436,14 +2667,14 @@
         <w:t xml:space="preserve"> </w:t>
       </w:r>
     </w:p>
-    <w:bookmarkEnd w:id="68"/>
-    <w:bookmarkStart w:id="70" w:name="X9a8bad0b78f43066cb333fdedcdcad5d7017900"/>
+    <w:bookmarkEnd w:id="72"/>
+    <w:bookmarkStart w:id="74" w:name="X33f03e29791f20cdbbbbf0729c723b16e55ed16"/>
     <w:p>
       <w:pPr>
         <w:pStyle w:val="Bibliography"/>
       </w:pPr>
       <w:r>
-        <w:t xml:space="preserve">19.</w:t>
+        <w:t xml:space="preserve">21.</w:t>
       </w:r>
       <w:r>
         <w:t xml:space="preserve"> </w:t>
@@ -2457,18 +2688,30 @@
       <w:r>
         <w:t xml:space="preserve"> </w:t>
       </w:r>
-      <w:hyperlink r:id="rId69">
-        <w:r>
-          <w:rPr>
-            <w:rStyle w:val="Hyperlink"/>
-          </w:rPr>
-          <w:t xml:space="preserve">Low-</w:t>
-        </w:r>
-        <w:r>
-          <w:rPr>
-            <w:rStyle w:val="Hyperlink"/>
-          </w:rPr>
-          <w:t xml:space="preserve">Level Environmental Lead Exposure</w:t>
+      <w:hyperlink r:id="rId73">
+        <w:r>
+          <w:rPr>
+            <w:rStyle w:val="Hyperlink"/>
+          </w:rPr>
+          <w:t xml:space="preserve">Erratum:</w:t>
+        </w:r>
+        <w:r>
+          <w:rPr>
+            <w:rStyle w:val="Hyperlink"/>
+          </w:rPr>
+          <w:t xml:space="preserve"> </w:t>
+        </w:r>
+        <w:r>
+          <w:rPr>
+            <w:rStyle w:val="Hyperlink"/>
+          </w:rPr>
+          <w:t xml:space="preserve">“</w:t>
+        </w:r>
+        <w:r>
+          <w:rPr>
+            <w:rStyle w:val="Hyperlink"/>
+          </w:rPr>
+          <w:t xml:space="preserve">Low-Level Environmental Lead Exposure</w:t>
         </w:r>
         <w:r>
           <w:rPr>
@@ -2530,22 +2773,28 @@
           </w:rPr>
           <w:t xml:space="preserve">An International Pooled Analysis</w:t>
         </w:r>
+        <w:r>
+          <w:rPr>
+            <w:rStyle w:val="Hyperlink"/>
+          </w:rPr>
+          <w:t xml:space="preserve">”</w:t>
+        </w:r>
       </w:hyperlink>
       <w:r>
-        <w:t xml:space="preserve">. Environmental Health Perspectives. 2005;113(7):894–9.</w:t>
-      </w:r>
-      <w:r>
-        <w:t xml:space="preserve"> </w:t>
-      </w:r>
-    </w:p>
-    <w:bookmarkEnd w:id="70"/>
-    <w:bookmarkStart w:id="72" w:name="X33f03e29791f20cdbbbbf0729c723b16e55ed16"/>
+        <w:t xml:space="preserve">. Environ Health Perspect. 2019 Sep;127(9):099001.</w:t>
+      </w:r>
+      <w:r>
+        <w:t xml:space="preserve"> </w:t>
+      </w:r>
+    </w:p>
+    <w:bookmarkEnd w:id="74"/>
+    <w:bookmarkStart w:id="76" w:name="X99fa6bd9cd2521340285769f289a6c9d4bfe17b"/>
     <w:p>
       <w:pPr>
         <w:pStyle w:val="Bibliography"/>
       </w:pPr>
       <w:r>
-        <w:t xml:space="preserve">20.</w:t>
+        <w:t xml:space="preserve">22.</w:t>
       </w:r>
       <w:r>
         <w:t xml:space="preserve"> </w:t>
@@ -2554,35 +2803,29 @@
         <w:t xml:space="preserve">	</w:t>
       </w:r>
       <w:r>
-        <w:t xml:space="preserve">Lanphear BP, Hornung R, Khoury J, Yolton K, Baghurst P, Bellinger DC, et al.</w:t>
-      </w:r>
-      <w:r>
-        <w:t xml:space="preserve"> </w:t>
-      </w:r>
-      <w:hyperlink r:id="rId71">
-        <w:r>
-          <w:rPr>
-            <w:rStyle w:val="Hyperlink"/>
-          </w:rPr>
-          <w:t xml:space="preserve">Erratum:</w:t>
-        </w:r>
-        <w:r>
-          <w:rPr>
-            <w:rStyle w:val="Hyperlink"/>
-          </w:rPr>
-          <w:t xml:space="preserve"> </w:t>
-        </w:r>
-        <w:r>
-          <w:rPr>
-            <w:rStyle w:val="Hyperlink"/>
-          </w:rPr>
-          <w:t xml:space="preserve">“</w:t>
-        </w:r>
-        <w:r>
-          <w:rPr>
-            <w:rStyle w:val="Hyperlink"/>
-          </w:rPr>
-          <w:t xml:space="preserve">Low-Level Environmental Lead Exposure</w:t>
+        <w:t xml:space="preserve">Thompson B.</w:t>
+      </w:r>
+      <w:r>
+        <w:t xml:space="preserve"> </w:t>
+      </w:r>
+      <w:hyperlink r:id="rId75">
+        <w:r>
+          <w:rPr>
+            <w:rStyle w:val="Hyperlink"/>
+          </w:rPr>
+          <w:t xml:space="preserve">Stepwise</w:t>
+        </w:r>
+        <w:r>
+          <w:rPr>
+            <w:rStyle w:val="Hyperlink"/>
+          </w:rPr>
+          <w:t xml:space="preserve"> </w:t>
+        </w:r>
+        <w:r>
+          <w:rPr>
+            <w:rStyle w:val="Hyperlink"/>
+          </w:rPr>
+          <w:t xml:space="preserve">Regression</w:t>
         </w:r>
         <w:r>
           <w:rPr>
@@ -2606,25 +2849,79 @@
           <w:rPr>
             <w:rStyle w:val="Hyperlink"/>
           </w:rPr>
-          <w:t xml:space="preserve">Children</w:t>
-        </w:r>
-        <w:r>
-          <w:rPr>
-            <w:rStyle w:val="Hyperlink"/>
-          </w:rPr>
-          <w:t xml:space="preserve">’s</w:t>
-        </w:r>
-        <w:r>
-          <w:rPr>
-            <w:rStyle w:val="Hyperlink"/>
-          </w:rPr>
-          <w:t xml:space="preserve"> </w:t>
-        </w:r>
-        <w:r>
-          <w:rPr>
-            <w:rStyle w:val="Hyperlink"/>
-          </w:rPr>
-          <w:t xml:space="preserve">Intellectual Function</w:t>
+          <w:t xml:space="preserve">Stepwise Discriminant Analysis Need Not Apply</w:t>
+        </w:r>
+        <w:r>
+          <w:rPr>
+            <w:rStyle w:val="Hyperlink"/>
+          </w:rPr>
+          <w:t xml:space="preserve"> </w:t>
+        </w:r>
+        <w:r>
+          <w:rPr>
+            <w:rStyle w:val="Hyperlink"/>
+          </w:rPr>
+          <w:t xml:space="preserve">here:</w:t>
+        </w:r>
+        <w:r>
+          <w:rPr>
+            <w:rStyle w:val="Hyperlink"/>
+          </w:rPr>
+          <w:t xml:space="preserve"> </w:t>
+        </w:r>
+        <w:r>
+          <w:rPr>
+            <w:rStyle w:val="Hyperlink"/>
+          </w:rPr>
+          <w:t xml:space="preserve">A Guidelines Editorial</w:t>
+        </w:r>
+      </w:hyperlink>
+      <w:r>
+        <w:t xml:space="preserve">. Educational and Psychological Measurement. 1995 Aug;55(4):525–34.</w:t>
+      </w:r>
+      <w:r>
+        <w:t xml:space="preserve"> </w:t>
+      </w:r>
+    </w:p>
+    <w:bookmarkEnd w:id="76"/>
+    <w:bookmarkStart w:id="78" w:name="Xec30ec7c912152a14c0f622040312567154bf15"/>
+    <w:p>
+      <w:pPr>
+        <w:pStyle w:val="Bibliography"/>
+      </w:pPr>
+      <w:r>
+        <w:t xml:space="preserve">23.</w:t>
+      </w:r>
+      <w:r>
+        <w:t xml:space="preserve"> </w:t>
+      </w:r>
+      <w:r>
+        <w:t xml:space="preserve">	</w:t>
+      </w:r>
+      <w:r>
+        <w:t xml:space="preserve">Harrell FE.</w:t>
+      </w:r>
+      <w:r>
+        <w:t xml:space="preserve"> </w:t>
+      </w:r>
+      <w:hyperlink r:id="rId77">
+        <w:r>
+          <w:rPr>
+            <w:rStyle w:val="Hyperlink"/>
+          </w:rPr>
+          <w:t xml:space="preserve">Regression</w:t>
+        </w:r>
+        <w:r>
+          <w:rPr>
+            <w:rStyle w:val="Hyperlink"/>
+          </w:rPr>
+          <w:t xml:space="preserve"> </w:t>
+        </w:r>
+        <w:r>
+          <w:rPr>
+            <w:rStyle w:val="Hyperlink"/>
+          </w:rPr>
+          <w:t xml:space="preserve">Modeling Strategies</w:t>
         </w:r>
         <w:r>
           <w:rPr>
@@ -2642,30 +2939,129 @@
           <w:rPr>
             <w:rStyle w:val="Hyperlink"/>
           </w:rPr>
-          <w:t xml:space="preserve">An International Pooled Analysis</w:t>
-        </w:r>
-        <w:r>
-          <w:rPr>
-            <w:rStyle w:val="Hyperlink"/>
-          </w:rPr>
-          <w:t xml:space="preserve">”</w:t>
+          <w:t xml:space="preserve">With Applications</w:t>
+        </w:r>
+        <w:r>
+          <w:rPr>
+            <w:rStyle w:val="Hyperlink"/>
+          </w:rPr>
+          <w:t xml:space="preserve"> </w:t>
+        </w:r>
+        <w:r>
+          <w:rPr>
+            <w:rStyle w:val="Hyperlink"/>
+          </w:rPr>
+          <w:t xml:space="preserve">to</w:t>
+        </w:r>
+        <w:r>
+          <w:rPr>
+            <w:rStyle w:val="Hyperlink"/>
+          </w:rPr>
+          <w:t xml:space="preserve"> </w:t>
+        </w:r>
+        <w:r>
+          <w:rPr>
+            <w:rStyle w:val="Hyperlink"/>
+          </w:rPr>
+          <w:t xml:space="preserve">Linear Models</w:t>
+        </w:r>
+        <w:r>
+          <w:rPr>
+            <w:rStyle w:val="Hyperlink"/>
+          </w:rPr>
+          <w:t xml:space="preserve">,</w:t>
+        </w:r>
+        <w:r>
+          <w:rPr>
+            <w:rStyle w:val="Hyperlink"/>
+          </w:rPr>
+          <w:t xml:space="preserve"> </w:t>
+        </w:r>
+        <w:r>
+          <w:rPr>
+            <w:rStyle w:val="Hyperlink"/>
+          </w:rPr>
+          <w:t xml:space="preserve">Logistic</w:t>
+        </w:r>
+        <w:r>
+          <w:rPr>
+            <w:rStyle w:val="Hyperlink"/>
+          </w:rPr>
+          <w:t xml:space="preserve"> </w:t>
+        </w:r>
+        <w:r>
+          <w:rPr>
+            <w:rStyle w:val="Hyperlink"/>
+          </w:rPr>
+          <w:t xml:space="preserve">and</w:t>
+        </w:r>
+        <w:r>
+          <w:rPr>
+            <w:rStyle w:val="Hyperlink"/>
+          </w:rPr>
+          <w:t xml:space="preserve"> </w:t>
+        </w:r>
+        <w:r>
+          <w:rPr>
+            <w:rStyle w:val="Hyperlink"/>
+          </w:rPr>
+          <w:t xml:space="preserve">Ordinal Regression</w:t>
+        </w:r>
+        <w:r>
+          <w:rPr>
+            <w:rStyle w:val="Hyperlink"/>
+          </w:rPr>
+          <w:t xml:space="preserve">, and</w:t>
+        </w:r>
+        <w:r>
+          <w:rPr>
+            <w:rStyle w:val="Hyperlink"/>
+          </w:rPr>
+          <w:t xml:space="preserve"> </w:t>
+        </w:r>
+        <w:r>
+          <w:rPr>
+            <w:rStyle w:val="Hyperlink"/>
+          </w:rPr>
+          <w:t xml:space="preserve">Survival Analysis</w:t>
         </w:r>
       </w:hyperlink>
       <w:r>
-        <w:t xml:space="preserve">. Environ Health Perspect. 2019 Sep;127(9):099001.</w:t>
-      </w:r>
-      <w:r>
-        <w:t xml:space="preserve"> </w:t>
-      </w:r>
-    </w:p>
-    <w:bookmarkEnd w:id="72"/>
-    <w:bookmarkStart w:id="74" w:name="X99fa6bd9cd2521340285769f289a6c9d4bfe17b"/>
+        <w:t xml:space="preserve">. Cham: Springer International Publishing; 2015. (Springer</w:t>
+      </w:r>
+      <w:r>
+        <w:t xml:space="preserve"> </w:t>
+      </w:r>
+      <w:r>
+        <w:t xml:space="preserve">Series</w:t>
+      </w:r>
+      <w:r>
+        <w:t xml:space="preserve"> </w:t>
+      </w:r>
+      <w:r>
+        <w:t xml:space="preserve">in</w:t>
+      </w:r>
+      <w:r>
+        <w:t xml:space="preserve"> </w:t>
+      </w:r>
+      <w:r>
+        <w:t xml:space="preserve">Statistics</w:t>
+      </w:r>
+      <w:r>
+        <w:t xml:space="preserve">).</w:t>
+      </w:r>
+      <w:r>
+        <w:t xml:space="preserve"> </w:t>
+      </w:r>
+    </w:p>
+    <w:bookmarkEnd w:id="78"/>
+    <w:bookmarkStart w:id="80" w:name="ref-smith2018StepAwayStepwise"/>
     <w:p>
       <w:pPr>
         <w:pStyle w:val="Bibliography"/>
       </w:pPr>
       <w:r>
-        <w:t xml:space="preserve">21.</w:t>
+        <w:t xml:space="preserve">24.</w:t>
       </w:r>
       <w:r>
         <w:t xml:space="preserve"> </w:t>
@@ -2674,94 +3070,34 @@
         <w:t xml:space="preserve">	</w:t>
       </w:r>
       <w:r>
-        <w:t xml:space="preserve">Thompson B.</w:t>
-      </w:r>
-      <w:r>
-        <w:t xml:space="preserve"> </w:t>
-      </w:r>
-      <w:hyperlink r:id="rId73">
-        <w:r>
-          <w:rPr>
-            <w:rStyle w:val="Hyperlink"/>
-          </w:rPr>
-          <w:t xml:space="preserve">Stepwise</w:t>
-        </w:r>
-        <w:r>
-          <w:rPr>
-            <w:rStyle w:val="Hyperlink"/>
-          </w:rPr>
-          <w:t xml:space="preserve"> </w:t>
-        </w:r>
-        <w:r>
-          <w:rPr>
-            <w:rStyle w:val="Hyperlink"/>
-          </w:rPr>
-          <w:t xml:space="preserve">Regression</w:t>
-        </w:r>
-        <w:r>
-          <w:rPr>
-            <w:rStyle w:val="Hyperlink"/>
-          </w:rPr>
-          <w:t xml:space="preserve"> </w:t>
-        </w:r>
-        <w:r>
-          <w:rPr>
-            <w:rStyle w:val="Hyperlink"/>
-          </w:rPr>
-          <w:t xml:space="preserve">and</w:t>
-        </w:r>
-        <w:r>
-          <w:rPr>
-            <w:rStyle w:val="Hyperlink"/>
-          </w:rPr>
-          <w:t xml:space="preserve"> </w:t>
-        </w:r>
-        <w:r>
-          <w:rPr>
-            <w:rStyle w:val="Hyperlink"/>
-          </w:rPr>
-          <w:t xml:space="preserve">Stepwise Discriminant Analysis Need Not Apply</w:t>
-        </w:r>
-        <w:r>
-          <w:rPr>
-            <w:rStyle w:val="Hyperlink"/>
-          </w:rPr>
-          <w:t xml:space="preserve"> </w:t>
-        </w:r>
-        <w:r>
-          <w:rPr>
-            <w:rStyle w:val="Hyperlink"/>
-          </w:rPr>
-          <w:t xml:space="preserve">here:</w:t>
-        </w:r>
-        <w:r>
-          <w:rPr>
-            <w:rStyle w:val="Hyperlink"/>
-          </w:rPr>
-          <w:t xml:space="preserve"> </w:t>
-        </w:r>
-        <w:r>
-          <w:rPr>
-            <w:rStyle w:val="Hyperlink"/>
-          </w:rPr>
-          <w:t xml:space="preserve">A Guidelines Editorial</w:t>
+        <w:t xml:space="preserve">Smith G.</w:t>
+      </w:r>
+      <w:r>
+        <w:t xml:space="preserve"> </w:t>
+      </w:r>
+      <w:hyperlink r:id="rId79">
+        <w:r>
+          <w:rPr>
+            <w:rStyle w:val="Hyperlink"/>
+          </w:rPr>
+          <w:t xml:space="preserve">Step away from stepwise</w:t>
         </w:r>
       </w:hyperlink>
       <w:r>
-        <w:t xml:space="preserve">. Educational and Psychological Measurement. 1995 Aug;55(4):525–34.</w:t>
-      </w:r>
-      <w:r>
-        <w:t xml:space="preserve"> </w:t>
-      </w:r>
-    </w:p>
-    <w:bookmarkEnd w:id="74"/>
-    <w:bookmarkStart w:id="76" w:name="Xec30ec7c912152a14c0f622040312567154bf15"/>
+        <w:t xml:space="preserve">. J Big Data. 2018 Dec;5(1):32.</w:t>
+      </w:r>
+      <w:r>
+        <w:t xml:space="preserve"> </w:t>
+      </w:r>
+    </w:p>
+    <w:bookmarkEnd w:id="80"/>
+    <w:bookmarkStart w:id="82" w:name="X035620408d1fb22c7ed381e74f0468c30df4612"/>
     <w:p>
       <w:pPr>
         <w:pStyle w:val="Bibliography"/>
       </w:pPr>
       <w:r>
-        <w:t xml:space="preserve">22.</w:t>
+        <w:t xml:space="preserve">25.</w:t>
       </w:r>
       <w:r>
         <w:t xml:space="preserve"> </w:t>
@@ -2770,29 +3106,29 @@
         <w:t xml:space="preserve">	</w:t>
       </w:r>
       <w:r>
-        <w:t xml:space="preserve">Harrell FE.</w:t>
-      </w:r>
-      <w:r>
-        <w:t xml:space="preserve"> </w:t>
-      </w:r>
-      <w:hyperlink r:id="rId75">
-        <w:r>
-          <w:rPr>
-            <w:rStyle w:val="Hyperlink"/>
-          </w:rPr>
-          <w:t xml:space="preserve">Regression</w:t>
-        </w:r>
-        <w:r>
-          <w:rPr>
-            <w:rStyle w:val="Hyperlink"/>
-          </w:rPr>
-          <w:t xml:space="preserve"> </w:t>
-        </w:r>
-        <w:r>
-          <w:rPr>
-            <w:rStyle w:val="Hyperlink"/>
-          </w:rPr>
-          <w:t xml:space="preserve">Modeling Strategies</w:t>
+        <w:t xml:space="preserve">Grant R, Di Tanna GL.</w:t>
+      </w:r>
+      <w:r>
+        <w:t xml:space="preserve"> </w:t>
+      </w:r>
+      <w:hyperlink r:id="rId81">
+        <w:r>
+          <w:rPr>
+            <w:rStyle w:val="Hyperlink"/>
+          </w:rPr>
+          <w:t xml:space="preserve">Bayesian</w:t>
+        </w:r>
+        <w:r>
+          <w:rPr>
+            <w:rStyle w:val="Hyperlink"/>
+          </w:rPr>
+          <w:t xml:space="preserve"> </w:t>
+        </w:r>
+        <w:r>
+          <w:rPr>
+            <w:rStyle w:val="Hyperlink"/>
+          </w:rPr>
+          <w:t xml:space="preserve">Meta-Analysis</w:t>
         </w:r>
         <w:r>
           <w:rPr>
@@ -2810,129 +3146,33 @@
           <w:rPr>
             <w:rStyle w:val="Hyperlink"/>
           </w:rPr>
-          <w:t xml:space="preserve">With Applications</w:t>
-        </w:r>
-        <w:r>
-          <w:rPr>
-            <w:rStyle w:val="Hyperlink"/>
-          </w:rPr>
-          <w:t xml:space="preserve"> </w:t>
-        </w:r>
-        <w:r>
-          <w:rPr>
-            <w:rStyle w:val="Hyperlink"/>
-          </w:rPr>
-          <w:t xml:space="preserve">to</w:t>
-        </w:r>
-        <w:r>
-          <w:rPr>
-            <w:rStyle w:val="Hyperlink"/>
-          </w:rPr>
-          <w:t xml:space="preserve"> </w:t>
-        </w:r>
-        <w:r>
-          <w:rPr>
-            <w:rStyle w:val="Hyperlink"/>
-          </w:rPr>
-          <w:t xml:space="preserve">Linear Models</w:t>
-        </w:r>
-        <w:r>
-          <w:rPr>
-            <w:rStyle w:val="Hyperlink"/>
-          </w:rPr>
-          <w:t xml:space="preserve">,</w:t>
-        </w:r>
-        <w:r>
-          <w:rPr>
-            <w:rStyle w:val="Hyperlink"/>
-          </w:rPr>
-          <w:t xml:space="preserve"> </w:t>
-        </w:r>
-        <w:r>
-          <w:rPr>
-            <w:rStyle w:val="Hyperlink"/>
-          </w:rPr>
-          <w:t xml:space="preserve">Logistic</w:t>
-        </w:r>
-        <w:r>
-          <w:rPr>
-            <w:rStyle w:val="Hyperlink"/>
-          </w:rPr>
-          <w:t xml:space="preserve"> </w:t>
-        </w:r>
-        <w:r>
-          <w:rPr>
-            <w:rStyle w:val="Hyperlink"/>
-          </w:rPr>
-          <w:t xml:space="preserve">and</w:t>
-        </w:r>
-        <w:r>
-          <w:rPr>
-            <w:rStyle w:val="Hyperlink"/>
-          </w:rPr>
-          <w:t xml:space="preserve"> </w:t>
-        </w:r>
-        <w:r>
-          <w:rPr>
-            <w:rStyle w:val="Hyperlink"/>
-          </w:rPr>
-          <w:t xml:space="preserve">Ordinal Regression</w:t>
-        </w:r>
-        <w:r>
-          <w:rPr>
-            <w:rStyle w:val="Hyperlink"/>
-          </w:rPr>
-          <w:t xml:space="preserve">, and</w:t>
-        </w:r>
-        <w:r>
-          <w:rPr>
-            <w:rStyle w:val="Hyperlink"/>
-          </w:rPr>
-          <w:t xml:space="preserve"> </w:t>
-        </w:r>
-        <w:r>
-          <w:rPr>
-            <w:rStyle w:val="Hyperlink"/>
-          </w:rPr>
-          <w:t xml:space="preserve">Survival Analysis</w:t>
+          <w:t xml:space="preserve">A Practical Introduction</w:t>
         </w:r>
       </w:hyperlink>
       <w:r>
-        <w:t xml:space="preserve">. Cham: Springer International Publishing; 2015. (Springer</w:t>
-      </w:r>
-      <w:r>
-        <w:t xml:space="preserve"> </w:t>
-      </w:r>
-      <w:r>
-        <w:t xml:space="preserve">Series</w:t>
-      </w:r>
-      <w:r>
-        <w:t xml:space="preserve"> </w:t>
-      </w:r>
-      <w:r>
-        <w:t xml:space="preserve">in</w:t>
-      </w:r>
-      <w:r>
-        <w:t xml:space="preserve"> </w:t>
-      </w:r>
-      <w:r>
-        <w:t xml:space="preserve">Statistics</w:t>
-      </w:r>
-      <w:r>
-        <w:t xml:space="preserve">).</w:t>
-      </w:r>
-      <w:r>
-        <w:t xml:space="preserve"> </w:t>
-      </w:r>
-    </w:p>
-    <w:bookmarkEnd w:id="76"/>
-    <w:bookmarkStart w:id="78" w:name="ref-smith2018StepAwayStepwise"/>
+        <w:t xml:space="preserve">. 1st ed. Boca Raton:</w:t>
+      </w:r>
+      <w:r>
+        <w:t xml:space="preserve"> </w:t>
+      </w:r>
+      <w:r>
+        <w:t xml:space="preserve">Chapman and Hall/CRC</w:t>
+      </w:r>
+      <w:r>
+        <w:t xml:space="preserve">; 2025.</w:t>
+      </w:r>
+      <w:r>
+        <w:t xml:space="preserve"> </w:t>
+      </w:r>
+    </w:p>
+    <w:bookmarkEnd w:id="82"/>
+    <w:bookmarkStart w:id="84" w:name="ref-plate2024DevelopmentToolRapid"/>
     <w:p>
       <w:pPr>
         <w:pStyle w:val="Bibliography"/>
       </w:pPr>
       <w:r>
-        <w:t xml:space="preserve">23.</w:t>
+        <w:t xml:space="preserve">26.</w:t>
       </w:r>
       <w:r>
         <w:t xml:space="preserve"> </w:t>
@@ -2941,65 +3181,29 @@
         <w:t xml:space="preserve">	</w:t>
       </w:r>
       <w:r>
-        <w:t xml:space="preserve">Smith G.</w:t>
-      </w:r>
-      <w:r>
-        <w:t xml:space="preserve"> </w:t>
-      </w:r>
-      <w:hyperlink r:id="rId77">
-        <w:r>
-          <w:rPr>
-            <w:rStyle w:val="Hyperlink"/>
-          </w:rPr>
-          <w:t xml:space="preserve">Step away from stepwise</w:t>
+        <w:t xml:space="preserve">Plate K, Knüppel S, Hornbacher A, Greiner M, Müller-Graf C.</w:t>
+      </w:r>
+      <w:r>
+        <w:t xml:space="preserve"> </w:t>
+      </w:r>
+      <w:hyperlink r:id="rId83">
+        <w:r>
+          <w:rPr>
+            <w:rStyle w:val="Hyperlink"/>
+          </w:rPr>
+          <w:t xml:space="preserve">Development of a tool for rapid assessment of the evidence of human observational epidemiological studies with focus on risk of bias in the context of public health and risk assessment</w:t>
         </w:r>
       </w:hyperlink>
       <w:r>
-        <w:t xml:space="preserve">. J Big Data. 2018 Dec;5(1):32.</w:t>
-      </w:r>
-      <w:r>
-        <w:t xml:space="preserve"> </w:t>
-      </w:r>
-    </w:p>
-    <w:bookmarkEnd w:id="78"/>
-    <w:bookmarkStart w:id="80" w:name="ref-plate2024DevelopmentToolRapid"/>
-    <w:p>
-      <w:pPr>
-        <w:pStyle w:val="Bibliography"/>
-      </w:pPr>
-      <w:r>
-        <w:t xml:space="preserve">24.</w:t>
-      </w:r>
-      <w:r>
-        <w:t xml:space="preserve"> </w:t>
-      </w:r>
-      <w:r>
-        <w:t xml:space="preserve">	</w:t>
-      </w:r>
-      <w:r>
-        <w:t xml:space="preserve">Plate K, Knüppel S, Hornbacher A, Greiner M, Müller-Graf C.</w:t>
-      </w:r>
-      <w:r>
-        <w:t xml:space="preserve"> </w:t>
-      </w:r>
-      <w:hyperlink r:id="rId79">
-        <w:r>
-          <w:rPr>
-            <w:rStyle w:val="Hyperlink"/>
-          </w:rPr>
-          <w:t xml:space="preserve">Development of a tool for rapid assessment of the evidence of human observational epidemiological studies with focus on risk of bias in the context of public health and risk assessment</w:t>
-        </w:r>
-      </w:hyperlink>
-      <w:r>
         <w:t xml:space="preserve">. EFS3. 2024 Jul;21(7).</w:t>
       </w:r>
       <w:r>
         <w:t xml:space="preserve"> </w:t>
       </w:r>
     </w:p>
-    <w:bookmarkEnd w:id="80"/>
-    <w:bookmarkEnd w:id="81"/>
-    <w:bookmarkEnd w:id="82"/>
+    <w:bookmarkEnd w:id="84"/>
+    <w:bookmarkEnd w:id="85"/>
+    <w:bookmarkEnd w:id="86"/>
     <w:sectPr>
       <w:footerReference r:id="rId9" w:type="default"/>
       <w:footnotePr>
@@ -3255,6 +3459,158 @@
       </w:rPr>
     </w:lvl>
   </w:abstractNum>
+  <w:abstractNum w:abstractNumId="993">
+    <w:nsid w:val="0000A993"/>
+    <w:multiLevelType w:val="multilevel"/>
+    <w:lvl w:ilvl="0">
+      <w:numFmt w:val="bullet"/>
+      <w:lvlText w:val="☒"/>
+      <w:lvlJc w:val="left"/>
+      <w:pPr>
+        <w:ind w:left="720" w:hanging="360"/>
+      </w:pPr>
+    </w:lvl>
+    <w:lvl w:ilvl="1">
+      <w:numFmt w:val="bullet"/>
+      <w:lvlText w:val="☒"/>
+      <w:lvlJc w:val="left"/>
+      <w:pPr>
+        <w:ind w:left="1440" w:hanging="360"/>
+      </w:pPr>
+    </w:lvl>
+    <w:lvl w:ilvl="2">
+      <w:numFmt w:val="bullet"/>
+      <w:lvlText w:val="☒"/>
+      <w:lvlJc w:val="left"/>
+      <w:pPr>
+        <w:ind w:left="2160" w:hanging="360"/>
+      </w:pPr>
+    </w:lvl>
+    <w:lvl w:ilvl="3">
+      <w:numFmt w:val="bullet"/>
+      <w:lvlText w:val="☒"/>
+      <w:lvlJc w:val="left"/>
+      <w:pPr>
+        <w:ind w:left="2880" w:hanging="360"/>
+      </w:pPr>
+    </w:lvl>
+    <w:lvl w:ilvl="4">
+      <w:numFmt w:val="bullet"/>
+      <w:lvlText w:val="☒"/>
+      <w:lvlJc w:val="left"/>
+      <w:pPr>
+        <w:ind w:left="3600" w:hanging="360"/>
+      </w:pPr>
+    </w:lvl>
+    <w:lvl w:ilvl="5">
+      <w:numFmt w:val="bullet"/>
+      <w:lvlText w:val="☒"/>
+      <w:lvlJc w:val="left"/>
+      <w:pPr>
+        <w:ind w:left="4320" w:hanging="360"/>
+      </w:pPr>
+    </w:lvl>
+    <w:lvl w:ilvl="6">
+      <w:numFmt w:val="bullet"/>
+      <w:lvlText w:val="☒"/>
+      <w:lvlJc w:val="left"/>
+      <w:pPr>
+        <w:ind w:left="5040" w:hanging="360"/>
+      </w:pPr>
+    </w:lvl>
+    <w:lvl w:ilvl="7">
+      <w:numFmt w:val="bullet"/>
+      <w:lvlText w:val="☒"/>
+      <w:lvlJc w:val="left"/>
+      <w:pPr>
+        <w:ind w:left="5760" w:hanging="360"/>
+      </w:pPr>
+    </w:lvl>
+    <w:lvl w:ilvl="8">
+      <w:numFmt w:val="bullet"/>
+      <w:lvlText w:val="☒"/>
+      <w:lvlJc w:val="left"/>
+      <w:pPr>
+        <w:ind w:left="6480" w:hanging="360"/>
+      </w:pPr>
+    </w:lvl>
+  </w:abstractNum>
+  <w:abstractNum w:abstractNumId="992">
+    <w:nsid w:val="0000A992"/>
+    <w:multiLevelType w:val="multilevel"/>
+    <w:lvl w:ilvl="0">
+      <w:numFmt w:val="bullet"/>
+      <w:lvlText w:val="☐"/>
+      <w:lvlJc w:val="left"/>
+      <w:pPr>
+        <w:ind w:left="720" w:hanging="360"/>
+      </w:pPr>
+    </w:lvl>
+    <w:lvl w:ilvl="1">
+      <w:numFmt w:val="bullet"/>
+      <w:lvlText w:val="☐"/>
+      <w:lvlJc w:val="left"/>
+      <w:pPr>
+        <w:ind w:left="1440" w:hanging="360"/>
+      </w:pPr>
+    </w:lvl>
+    <w:lvl w:ilvl="2">
+      <w:numFmt w:val="bullet"/>
+      <w:lvlText w:val="☐"/>
+      <w:lvlJc w:val="left"/>
+      <w:pPr>
+        <w:ind w:left="2160" w:hanging="360"/>
+      </w:pPr>
+    </w:lvl>
+    <w:lvl w:ilvl="3">
+      <w:numFmt w:val="bullet"/>
+      <w:lvlText w:val="☐"/>
+      <w:lvlJc w:val="left"/>
+      <w:pPr>
+        <w:ind w:left="2880" w:hanging="360"/>
+      </w:pPr>
+    </w:lvl>
+    <w:lvl w:ilvl="4">
+      <w:numFmt w:val="bullet"/>
+      <w:lvlText w:val="☐"/>
+      <w:lvlJc w:val="left"/>
+      <w:pPr>
+        <w:ind w:left="3600" w:hanging="360"/>
+      </w:pPr>
+    </w:lvl>
+    <w:lvl w:ilvl="5">
+      <w:numFmt w:val="bullet"/>
+      <w:lvlText w:val="☐"/>
+      <w:lvlJc w:val="left"/>
+      <w:pPr>
+        <w:ind w:left="4320" w:hanging="360"/>
+      </w:pPr>
+    </w:lvl>
+    <w:lvl w:ilvl="6">
+      <w:numFmt w:val="bullet"/>
+      <w:lvlText w:val="☐"/>
+      <w:lvlJc w:val="left"/>
+      <w:pPr>
+        <w:ind w:left="5040" w:hanging="360"/>
+      </w:pPr>
+    </w:lvl>
+    <w:lvl w:ilvl="7">
+      <w:numFmt w:val="bullet"/>
+      <w:lvlText w:val="☐"/>
+      <w:lvlJc w:val="left"/>
+      <w:pPr>
+        <w:ind w:left="5760" w:hanging="360"/>
+      </w:pPr>
+    </w:lvl>
+    <w:lvl w:ilvl="8">
+      <w:numFmt w:val="bullet"/>
+      <w:lvlText w:val="☐"/>
+      <w:lvlJc w:val="left"/>
+      <w:pPr>
+        <w:ind w:left="6480" w:hanging="360"/>
+      </w:pPr>
+    </w:lvl>
+  </w:abstractNum>
   <w:num w:numId="1000">
     <w:abstractNumId w:val="990"/>
   </w:num>
@@ -3262,19 +3618,67 @@
     <w:abstractNumId w:val="991"/>
   </w:num>
   <w:num w:numId="1002">
-    <w:abstractNumId w:val="991"/>
+    <w:abstractNumId w:val="993"/>
   </w:num>
   <w:num w:numId="1003">
-    <w:abstractNumId w:val="991"/>
+    <w:abstractNumId w:val="993"/>
   </w:num>
   <w:num w:numId="1004">
-    <w:abstractNumId w:val="991"/>
+    <w:abstractNumId w:val="993"/>
   </w:num>
   <w:num w:numId="1005">
-    <w:abstractNumId w:val="991"/>
+    <w:abstractNumId w:val="993"/>
   </w:num>
   <w:num w:numId="1006">
-    <w:abstractNumId w:val="991"/>
+    <w:abstractNumId w:val="992"/>
+  </w:num>
+  <w:num w:numId="1007">
+    <w:abstractNumId w:val="992"/>
+  </w:num>
+  <w:num w:numId="1008">
+    <w:abstractNumId w:val="992"/>
+  </w:num>
+  <w:num w:numId="1009">
+    <w:abstractNumId w:val="992"/>
+  </w:num>
+  <w:num w:numId="1010">
+    <w:abstractNumId w:val="992"/>
+  </w:num>
+  <w:num w:numId="1011">
+    <w:abstractNumId w:val="992"/>
+  </w:num>
+  <w:num w:numId="1012">
+    <w:abstractNumId w:val="992"/>
+  </w:num>
+  <w:num w:numId="1013">
+    <w:abstractNumId w:val="992"/>
+  </w:num>
+  <w:num w:numId="1014">
+    <w:abstractNumId w:val="992"/>
+  </w:num>
+  <w:num w:numId="1015">
+    <w:abstractNumId w:val="992"/>
+  </w:num>
+  <w:num w:numId="1016">
+    <w:abstractNumId w:val="992"/>
+  </w:num>
+  <w:num w:numId="1017">
+    <w:abstractNumId w:val="992"/>
+  </w:num>
+  <w:num w:numId="1018">
+    <w:abstractNumId w:val="992"/>
+  </w:num>
+  <w:num w:numId="1019">
+    <w:abstractNumId w:val="992"/>
+  </w:num>
+  <w:num w:numId="1020">
+    <w:abstractNumId w:val="992"/>
+  </w:num>
+  <w:num w:numId="1021">
+    <w:abstractNumId w:val="992"/>
+  </w:num>
+  <w:num w:numId="1022">
+    <w:abstractNumId w:val="992"/>
   </w:num>
 </w:numbering>
 </file>

</xml_diff>

<commit_message>
worked on section 2.3 Harmonization of Effect Estimates
</commit_message>
<xml_diff>
--- a/manuscript/manuscript.docx
+++ b/manuscript/manuscript.docx
@@ -7,7 +7,7 @@
         <w:pStyle w:val="Title"/>
       </w:pPr>
       <w:r>
-        <w:t xml:space="preserve">Lead Exposure and IQ Loss in Children: a Bayesian and Frequentist Meta Analysis of Recent Epidemiological Studies</w:t>
+        <w:t xml:space="preserve">Lead Exposure and IQ Loss in Children: a Bayesian and Frequentist Meta-Analysis of Recent Epidemiological Studies</w:t>
       </w:r>
     </w:p>
     <w:p>
@@ -577,7 +577,7 @@
       </w:r>
     </w:p>
     <w:bookmarkEnd w:id="26"/>
-    <w:bookmarkStart w:id="27" w:name="methods"/>
+    <w:bookmarkStart w:id="30" w:name="methods"/>
     <w:p>
       <w:pPr>
         <w:pStyle w:val="Heading1"/>
@@ -595,7 +595,7 @@
         </w:numPr>
       </w:pPr>
       <w:r>
-        <w:t xml:space="preserve">Overview: systematic review and meta analysis, comparing a frequentist to a Bayesian approach</w:t>
+        <w:t xml:space="preserve">Overview: systematic review and meta-analysis, comparing a frequentist to a Bayesian approach</w:t>
       </w:r>
     </w:p>
     <w:p>
@@ -643,7 +643,7 @@
         </w:numPr>
       </w:pPr>
       <w:r>
-        <w:t xml:space="preserve">Description of meta analysis methodology (frequentist &amp; Bayesian), models and software used, heterogeneity identification</w:t>
+        <w:t xml:space="preserve">Description of meta-analysis methodology (frequentist &amp; Bayesian), models and software used, heterogeneity identification</w:t>
       </w:r>
     </w:p>
     <w:p>
@@ -666,25 +666,48 @@
         <w:pStyle w:val="FirstParagraph"/>
       </w:pPr>
       <w:r>
-        <w:t xml:space="preserve">In order to quantitatively synthesize the available epidemiological literature on the association of children’s blood lead levels and their IQ, we conducted a systematic review and meta analysis.</w:t>
-      </w:r>
-      <w:r>
-        <w:t xml:space="preserve"> </w:t>
-      </w:r>
-      <w:r>
-        <w:t xml:space="preserve">We compare a frequentist meta analysis approach to a Bayesian approach that has specific advantages and has gained popularity in recent years but is still not widely used in the field of epidemiology.</w:t>
+        <w:t xml:space="preserve">In order to quantitatively synthesize the available epidemiological literature on the association of children’s blood lead levels and their IQ, we first conducted a systematic review and then a meta-analysis of the results, comparing a Bayesian to a frequentist approach.</w:t>
       </w:r>
       <w:r>
         <w:br/>
       </w:r>
+    </w:p>
+    <w:bookmarkStart w:id="27" w:name="literature-review"/>
+    <w:p>
+      <w:pPr>
+        <w:pStyle w:val="Heading2"/>
+      </w:pPr>
+      <w:r>
+        <w:t xml:space="preserve">2.1 Literature Review</w:t>
+      </w:r>
+    </w:p>
+    <w:p>
+      <w:pPr>
+        <w:pStyle w:val="FirstParagraph"/>
+      </w:pPr>
       <w:r>
         <w:t xml:space="preserve">(Section on literature review)</w:t>
       </w:r>
       <w:r>
         <w:br/>
       </w:r>
-      <w:r>
-        <w:t xml:space="preserve">We conducted a Risk of Bias assessment using a rapid Risk of Bias (raROB) tool with a specific focus on human observational epidemiological studies</w:t>
+    </w:p>
+    <w:bookmarkEnd w:id="27"/>
+    <w:bookmarkStart w:id="28" w:name="risk-of-bias-assessment"/>
+    <w:p>
+      <w:pPr>
+        <w:pStyle w:val="Heading2"/>
+      </w:pPr>
+      <w:r>
+        <w:t xml:space="preserve">2.2 Risk of Bias Assessment</w:t>
+      </w:r>
+    </w:p>
+    <w:p>
+      <w:pPr>
+        <w:pStyle w:val="FirstParagraph"/>
+      </w:pPr>
+      <w:r>
+        <w:t xml:space="preserve">To assess study quality, we conducted a Risk of Bias assessment using a rapid Risk of Bias (RoB) tool with a specific focus on human observational epidemiological studies</w:t>
       </w:r>
       <w:r>
         <w:t xml:space="preserve"> </w:t>
@@ -699,35 +722,440 @@
         <w:t xml:space="preserve"> </w:t>
       </w:r>
       <w:r>
-        <w:t xml:space="preserve">Each included publications risk of bias was appraised by answering 15 items in the domains selection, exposure, outcome, confounding, follow-up, analysis, and selective reporting.</w:t>
-      </w:r>
-      <w:r>
-        <w:t xml:space="preserve"> </w:t>
-      </w:r>
-      <w:r>
-        <w:t xml:space="preserve">The overall risk of bias for each individual study was then categorized as either low, moderate or high.</w:t>
-      </w:r>
-      <w:r>
-        <w:t xml:space="preserve"> </w:t>
-      </w:r>
-      <w:r>
-        <w:t xml:space="preserve">Each publication was first assessed by one researcher and then consensus with a large language model (LLM) was sought.</w:t>
-      </w:r>
-      <w:r>
-        <w:t xml:space="preserve"> </w:t>
-      </w:r>
-      <w:r>
-        <w:t xml:space="preserve">This was done by uploading the publications and the list of all raRoB items.</w:t>
-      </w:r>
-      <w:r>
-        <w:t xml:space="preserve"> </w:t>
-      </w:r>
-      <w:r>
-        <w:t xml:space="preserve">If there were any deviations in the judgement of the researcher and the LLM, the corresponding item was revisited by the researcher and they made the final decision on the respective item.</w:t>
-      </w:r>
-    </w:p>
-    <w:bookmarkEnd w:id="27"/>
-    <w:bookmarkStart w:id="28" w:name="results"/>
+        <w:t xml:space="preserve">Each included publication was assessed for RoB in the domains selection, exposure, outcome, confounding, follow-up, analysis, and selective reporting.</w:t>
+      </w:r>
+      <w:r>
+        <w:t xml:space="preserve"> </w:t>
+      </w:r>
+      <w:r>
+        <w:t xml:space="preserve">In total, 15 items were evaluated for each study.</w:t>
+      </w:r>
+      <w:r>
+        <w:t xml:space="preserve"> </w:t>
+      </w:r>
+      <w:r>
+        <w:t xml:space="preserve">The overall RoB for each individual study was then categorized by one researcher as either low, moderate or high, following two different summary metrics of the RoB tool (for more information, see</w:t>
+      </w:r>
+      <w:r>
+        <w:t xml:space="preserve"> </w:t>
+      </w:r>
+      <w:r>
+        <w:t xml:space="preserve">(26)</w:t>
+      </w:r>
+      <w:r>
+        <w:t xml:space="preserve">).</w:t>
+      </w:r>
+      <w:r>
+        <w:t xml:space="preserve"> </w:t>
+      </w:r>
+      <w:r>
+        <w:t xml:space="preserve">Each publication was first assessed by one researcher.</w:t>
+      </w:r>
+      <w:r>
+        <w:t xml:space="preserve"> </w:t>
+      </w:r>
+      <w:r>
+        <w:t xml:space="preserve">Subsequently, consensus with a large language model (LLM) was sought.</w:t>
+      </w:r>
+      <w:r>
+        <w:t xml:space="preserve"> </w:t>
+      </w:r>
+      <w:r>
+        <w:t xml:space="preserve">This was done by uploading the list of all raRoB items along with the respective publication.</w:t>
+      </w:r>
+      <w:r>
+        <w:t xml:space="preserve"> </w:t>
+      </w:r>
+      <w:r>
+        <w:t xml:space="preserve">Then, the LLm was promted to assess the study, using the raRoB items and possible answer categories.</w:t>
+      </w:r>
+      <w:r>
+        <w:t xml:space="preserve"> </w:t>
+      </w:r>
+      <w:r>
+        <w:t xml:space="preserve">If there were any deviations in the judgement of the researcher and the LLM, the respective item was revisited by the researcher and they made the final decision.</w:t>
+      </w:r>
+    </w:p>
+    <w:bookmarkEnd w:id="28"/>
+    <w:bookmarkStart w:id="29" w:name="harmonization-of-effect-estimates"/>
+    <w:p>
+      <w:pPr>
+        <w:pStyle w:val="Heading2"/>
+      </w:pPr>
+      <w:r>
+        <w:t xml:space="preserve">2.3 Harmonization of Effect Estimates</w:t>
+      </w:r>
+    </w:p>
+    <w:p>
+      <w:pPr>
+        <w:pStyle w:val="FirstParagraph"/>
+      </w:pPr>
+      <w:r>
+        <w:t xml:space="preserve">Within the literature on the health effects of lead exposure on the IQ, different assumptions were made on the shape of the association.</w:t>
+      </w:r>
+      <w:r>
+        <w:t xml:space="preserve"> </w:t>
+      </w:r>
+      <w:r>
+        <w:t xml:space="preserve">Some assumed a linear relationship</w:t>
+      </w:r>
+      <w:r>
+        <w:t xml:space="preserve"> </w:t>
+      </w:r>
+      <w:r>
+        <w:t xml:space="preserve">(27,28)</w:t>
+      </w:r>
+      <w:r>
+        <w:t xml:space="preserve">, but this shape has been suggested to be only valid in very low concentration ranges</w:t>
+      </w:r>
+      <w:r>
+        <w:t xml:space="preserve"> </w:t>
+      </w:r>
+      <w:r>
+        <w:t xml:space="preserve">(13)</w:t>
+      </w:r>
+      <w:r>
+        <w:t xml:space="preserve">.</w:t>
+      </w:r>
+      <w:r>
+        <w:t xml:space="preserve"> </w:t>
+      </w:r>
+      <w:r>
+        <w:t xml:space="preserve">Studies that tested different shapes of the exposure-response function found that a log-linear relationship (where BLL are transformed to a logarithmic scale) is a valid assumption</w:t>
+      </w:r>
+      <w:r>
+        <w:t xml:space="preserve"> </w:t>
+      </w:r>
+      <w:r>
+        <w:t xml:space="preserve">(13,29)</w:t>
+      </w:r>
+      <w:r>
+        <w:t xml:space="preserve">.</w:t>
+      </w:r>
+      <w:r>
+        <w:t xml:space="preserve"> </w:t>
+      </w:r>
+      <w:r>
+        <w:t xml:space="preserve">The general type of regression model used for a log-linear association is:</w:t>
+      </w:r>
+    </w:p>
+    <w:p>
+      <w:pPr>
+        <w:pStyle w:val="BodyText"/>
+      </w:pPr>
+      <m:oMathPara>
+        <m:oMathParaPr>
+          <m:jc m:val="center"/>
+        </m:oMathParaPr>
+        <m:oMath>
+          <m:r>
+            <m:t>y</m:t>
+          </m:r>
+          <m:r>
+            <m:rPr>
+              <m:sty m:val="p"/>
+            </m:rPr>
+            <m:t>=</m:t>
+          </m:r>
+          <m:r>
+            <m:t>α</m:t>
+          </m:r>
+          <m:r>
+            <m:rPr>
+              <m:sty m:val="p"/>
+            </m:rPr>
+            <m:t>+</m:t>
+          </m:r>
+          <m:r>
+            <m:t>β</m:t>
+          </m:r>
+          <m:r>
+            <m:rPr>
+              <m:sty m:val="p"/>
+            </m:rPr>
+            <m:t>*</m:t>
+          </m:r>
+          <m:r>
+            <m:t>l</m:t>
+          </m:r>
+          <m:r>
+            <m:t>o</m:t>
+          </m:r>
+          <m:sSub>
+            <m:e>
+              <m:r>
+                <m:t>g</m:t>
+              </m:r>
+            </m:e>
+            <m:sub>
+              <m:r>
+                <m:t>b</m:t>
+              </m:r>
+            </m:sub>
+          </m:sSub>
+          <m:d>
+            <m:dPr>
+              <m:begChr m:val="("/>
+              <m:sepChr m:val=""/>
+              <m:endChr m:val=")"/>
+              <m:grow/>
+            </m:dPr>
+            <m:e>
+              <m:r>
+                <m:t>X</m:t>
+              </m:r>
+            </m:e>
+          </m:d>
+          <m:r>
+            <m:rPr>
+              <m:sty m:val="p"/>
+            </m:rPr>
+            <m:t>+</m:t>
+          </m:r>
+          <m:r>
+            <m:t>ε</m:t>
+          </m:r>
+        </m:oMath>
+      </m:oMathPara>
+    </w:p>
+    <w:p>
+      <w:pPr>
+        <w:pStyle w:val="FirstParagraph"/>
+      </w:pPr>
+      <w:r>
+        <w:t xml:space="preserve">Where</w:t>
+      </w:r>
+      <w:r>
+        <w:t xml:space="preserve"> </w:t>
+      </w:r>
+      <m:oMath>
+        <m:r>
+          <m:t>y</m:t>
+        </m:r>
+      </m:oMath>
+      <w:r>
+        <w:t xml:space="preserve"> </w:t>
+      </w:r>
+      <w:r>
+        <w:t xml:space="preserve">is the IQ score,</w:t>
+      </w:r>
+      <w:r>
+        <w:t xml:space="preserve"> </w:t>
+      </w:r>
+      <m:oMath>
+        <m:r>
+          <m:t>α</m:t>
+        </m:r>
+      </m:oMath>
+      <w:r>
+        <w:t xml:space="preserve"> </w:t>
+      </w:r>
+      <w:r>
+        <w:t xml:space="preserve">is the</w:t>
+      </w:r>
+      <w:r>
+        <w:t xml:space="preserve"> </w:t>
+      </w:r>
+      <m:oMath>
+        <m:r>
+          <m:t>y</m:t>
+        </m:r>
+      </m:oMath>
+      <w:r>
+        <w:t xml:space="preserve">-intercept,</w:t>
+      </w:r>
+      <w:r>
+        <w:t xml:space="preserve"> </w:t>
+      </w:r>
+      <m:oMath>
+        <m:r>
+          <m:t>β</m:t>
+        </m:r>
+      </m:oMath>
+      <w:r>
+        <w:t xml:space="preserve"> </w:t>
+      </w:r>
+      <w:r>
+        <w:t xml:space="preserve">is the slope, and</w:t>
+      </w:r>
+      <w:r>
+        <w:t xml:space="preserve"> </w:t>
+      </w:r>
+      <m:oMath>
+        <m:r>
+          <m:t>l</m:t>
+        </m:r>
+        <m:r>
+          <m:t>o</m:t>
+        </m:r>
+        <m:sSub>
+          <m:e>
+            <m:r>
+              <m:t>g</m:t>
+            </m:r>
+          </m:e>
+          <m:sub>
+            <m:r>
+              <m:t>b</m:t>
+            </m:r>
+          </m:sub>
+        </m:sSub>
+        <m:d>
+          <m:dPr>
+            <m:begChr m:val="("/>
+            <m:sepChr m:val=""/>
+            <m:endChr m:val=")"/>
+            <m:grow/>
+          </m:dPr>
+          <m:e>
+            <m:r>
+              <m:t>X</m:t>
+            </m:r>
+          </m:e>
+        </m:d>
+      </m:oMath>
+      <w:r>
+        <w:t xml:space="preserve"> </w:t>
+      </w:r>
+      <w:r>
+        <w:t xml:space="preserve">is the log-transformed</w:t>
+      </w:r>
+      <w:r>
+        <w:t xml:space="preserve"> </w:t>
+      </w:r>
+      <m:oMath>
+        <m:r>
+          <m:t>B</m:t>
+        </m:r>
+        <m:r>
+          <m:t>L</m:t>
+        </m:r>
+        <m:r>
+          <m:t>L</m:t>
+        </m:r>
+        <m:d>
+          <m:dPr>
+            <m:begChr m:val="("/>
+            <m:sepChr m:val=""/>
+            <m:endChr m:val=")"/>
+            <m:grow/>
+          </m:dPr>
+          <m:e>
+            <m:r>
+              <m:t>X</m:t>
+            </m:r>
+          </m:e>
+        </m:d>
+      </m:oMath>
+      <w:r>
+        <w:t xml:space="preserve">, with the basis</w:t>
+      </w:r>
+      <w:r>
+        <w:t xml:space="preserve"> </w:t>
+      </w:r>
+      <m:oMath>
+        <m:r>
+          <m:t>b</m:t>
+        </m:r>
+      </m:oMath>
+      <w:r>
+        <w:t xml:space="preserve">.</w:t>
+      </w:r>
+    </w:p>
+    <w:p>
+      <w:pPr>
+        <w:pStyle w:val="BodyText"/>
+      </w:pPr>
+      <w:r>
+        <w:t xml:space="preserve">Since the logarithmic base used in the literature sometiemes varies between</w:t>
+      </w:r>
+      <w:r>
+        <w:t xml:space="preserve"> </w:t>
+      </w:r>
+      <m:oMath>
+        <m:r>
+          <m:t>e</m:t>
+        </m:r>
+      </m:oMath>
+      <w:r>
+        <w:t xml:space="preserve"> </w:t>
+      </w:r>
+      <w:r>
+        <w:t xml:space="preserve">(Euler’s number, approximately equal to 2.71828), 2 and 10, all identified effect measures will be harmonized to</w:t>
+      </w:r>
+      <w:r>
+        <w:t xml:space="preserve"> </w:t>
+      </w:r>
+      <m:oMath>
+        <m:r>
+          <m:t>l</m:t>
+        </m:r>
+        <m:r>
+          <m:t>o</m:t>
+        </m:r>
+        <m:sSub>
+          <m:e>
+            <m:r>
+              <m:t>g</m:t>
+            </m:r>
+          </m:e>
+          <m:sub>
+            <m:r>
+              <m:t>e</m:t>
+            </m:r>
+          </m:sub>
+        </m:sSub>
+        <m:d>
+          <m:dPr>
+            <m:begChr m:val="("/>
+            <m:sepChr m:val=""/>
+            <m:endChr m:val=")"/>
+            <m:grow/>
+          </m:dPr>
+          <m:e>
+            <m:r>
+              <m:t>B</m:t>
+            </m:r>
+            <m:r>
+              <m:t>L</m:t>
+            </m:r>
+            <m:r>
+              <m:t>L</m:t>
+            </m:r>
+          </m:e>
+        </m:d>
+      </m:oMath>
+      <w:r>
+        <w:t xml:space="preserve">, also called natural logarithm (ln).</w:t>
+      </w:r>
+      <w:r>
+        <w:t xml:space="preserve"> </w:t>
+      </w:r>
+      <w:r>
+        <w:t xml:space="preserve">When BLL untransformed -&gt; excluded because not a good approximation</w:t>
+      </w:r>
+      <w:r>
+        <w:t xml:space="preserve"> </w:t>
+      </w:r>
+      <w:r>
+        <w:t xml:space="preserve">In order to harmonize all estimates and their 95% CI, the template proposed by Rodriguez Barranco et al. (2017)</w:t>
+      </w:r>
+      <w:r>
+        <w:t xml:space="preserve"> </w:t>
+      </w:r>
+      <w:r>
+        <w:t xml:space="preserve">(30)</w:t>
+      </w:r>
+      <w:r>
+        <w:t xml:space="preserve"> </w:t>
+      </w:r>
+      <w:r>
+        <w:t xml:space="preserve">was used (link to suppl).</w:t>
+      </w:r>
+    </w:p>
+    <w:bookmarkEnd w:id="29"/>
+    <w:bookmarkEnd w:id="30"/>
+    <w:bookmarkStart w:id="31" w:name="results"/>
     <w:p>
       <w:pPr>
         <w:pStyle w:val="Heading1"/>
@@ -808,8 +1236,8 @@
         <w:t xml:space="preserve">Sensitivity analysis results</w:t>
       </w:r>
     </w:p>
-    <w:bookmarkEnd w:id="28"/>
-    <w:bookmarkStart w:id="29" w:name="discussion"/>
+    <w:bookmarkEnd w:id="31"/>
+    <w:bookmarkStart w:id="32" w:name="discussion"/>
     <w:p>
       <w:pPr>
         <w:pStyle w:val="Heading1"/>
@@ -854,8 +1282,8 @@
         <w:t xml:space="preserve">Study limitations &amp; strengths</w:t>
       </w:r>
     </w:p>
-    <w:bookmarkEnd w:id="29"/>
-    <w:bookmarkStart w:id="30" w:name="conclusions"/>
+    <w:bookmarkEnd w:id="32"/>
+    <w:bookmarkStart w:id="33" w:name="conclusions"/>
     <w:p>
       <w:pPr>
         <w:pStyle w:val="Heading1"/>
@@ -888,8 +1316,8 @@
         <w:t xml:space="preserve">Implications of results: policy, (scientific?) practice, future research needs</w:t>
       </w:r>
     </w:p>
-    <w:bookmarkEnd w:id="30"/>
-    <w:bookmarkStart w:id="31" w:name="list-of-abbreviations"/>
+    <w:bookmarkEnd w:id="33"/>
+    <w:bookmarkStart w:id="34" w:name="list-of-abbreviations"/>
     <w:p>
       <w:pPr>
         <w:pStyle w:val="Heading1"/>
@@ -1076,7 +1504,7 @@
               <w:jc w:val="left"/>
             </w:pPr>
             <w:r>
-              <w:t xml:space="preserve">YLL</w:t>
+              <w:t xml:space="preserve">LLM</w:t>
             </w:r>
           </w:p>
         </w:tc>
@@ -1088,7 +1516,7 @@
               <w:jc w:val="left"/>
             </w:pPr>
             <w:r>
-              <w:t xml:space="preserve">Years of Life Lost</w:t>
+              <w:t xml:space="preserve">Large language model</w:t>
             </w:r>
           </w:p>
         </w:tc>
@@ -1102,7 +1530,7 @@
               <w:jc w:val="left"/>
             </w:pPr>
             <w:r>
-              <w:t xml:space="preserve">YLD</w:t>
+              <w:t xml:space="preserve">RoB</w:t>
             </w:r>
           </w:p>
         </w:tc>
@@ -1114,7 +1542,7 @@
               <w:jc w:val="left"/>
             </w:pPr>
             <w:r>
-              <w:t xml:space="preserve">Years Lived with Disability</w:t>
+              <w:t xml:space="preserve">Risk of Bias</w:t>
             </w:r>
           </w:p>
         </w:tc>
@@ -1146,8 +1574,8 @@
         </w:tc>
       </w:tr>
     </w:tbl>
-    <w:bookmarkEnd w:id="31"/>
-    <w:bookmarkStart w:id="32" w:name="funding"/>
+    <w:bookmarkEnd w:id="34"/>
+    <w:bookmarkStart w:id="35" w:name="funding"/>
     <w:p>
       <w:pPr>
         <w:pStyle w:val="Heading1"/>
@@ -1176,8 +1604,8 @@
         <w:t xml:space="preserve">Neither the European Union nor the granting authority can be held responsible for them.</w:t>
       </w:r>
     </w:p>
-    <w:bookmarkEnd w:id="32"/>
-    <w:bookmarkStart w:id="86" w:name="bibliography"/>
+    <w:bookmarkEnd w:id="35"/>
+    <w:bookmarkStart w:id="97" w:name="bibliography"/>
     <w:p>
       <w:pPr>
         <w:pStyle w:val="Heading1"/>
@@ -1186,8 +1614,8 @@
         <w:t xml:space="preserve">References</w:t>
       </w:r>
     </w:p>
-    <w:bookmarkStart w:id="85" w:name="refs"/>
-    <w:bookmarkStart w:id="34" w:name="Xe38019c88c6d2792bb296bad7dc0a4dd55f1319"/>
+    <w:bookmarkStart w:id="96" w:name="refs"/>
+    <w:bookmarkStart w:id="37" w:name="Xe38019c88c6d2792bb296bad7dc0a4dd55f1319"/>
     <w:p>
       <w:pPr>
         <w:pStyle w:val="Bibliography"/>
@@ -1207,7 +1635,7 @@
       <w:r>
         <w:t xml:space="preserve"> </w:t>
       </w:r>
-      <w:hyperlink r:id="rId33">
+      <w:hyperlink r:id="rId36">
         <w:r>
           <w:rPr>
             <w:rStyle w:val="Hyperlink"/>
@@ -1246,8 +1674,8 @@
         <w:t xml:space="preserve"> </w:t>
       </w:r>
     </w:p>
-    <w:bookmarkEnd w:id="34"/>
-    <w:bookmarkStart w:id="36" w:name="ref-lacerda2023GlobalDecreaseBlood"/>
+    <w:bookmarkEnd w:id="37"/>
+    <w:bookmarkStart w:id="39" w:name="ref-lacerda2023GlobalDecreaseBlood"/>
     <w:p>
       <w:pPr>
         <w:pStyle w:val="Bibliography"/>
@@ -1267,7 +1695,7 @@
       <w:r>
         <w:t xml:space="preserve"> </w:t>
       </w:r>
-      <w:hyperlink r:id="rId35">
+      <w:hyperlink r:id="rId38">
         <w:r>
           <w:rPr>
             <w:rStyle w:val="Hyperlink"/>
@@ -1282,8 +1710,8 @@
         <w:t xml:space="preserve"> </w:t>
       </w:r>
     </w:p>
-    <w:bookmarkEnd w:id="36"/>
-    <w:bookmarkStart w:id="38" w:name="X4707f3a4b72a0982487545f9dc3d674642af108"/>
+    <w:bookmarkEnd w:id="39"/>
+    <w:bookmarkStart w:id="41" w:name="X4707f3a4b72a0982487545f9dc3d674642af108"/>
     <w:p>
       <w:pPr>
         <w:pStyle w:val="Bibliography"/>
@@ -1303,7 +1731,7 @@
       <w:r>
         <w:t xml:space="preserve"> </w:t>
       </w:r>
-      <w:hyperlink r:id="rId37">
+      <w:hyperlink r:id="rId40">
         <w:r>
           <w:rPr>
             <w:rStyle w:val="Hyperlink"/>
@@ -1342,8 +1770,8 @@
         <w:t xml:space="preserve"> </w:t>
       </w:r>
     </w:p>
-    <w:bookmarkEnd w:id="38"/>
-    <w:bookmarkStart w:id="40" w:name="ref-sy2024AssessmentLongTermExposure"/>
+    <w:bookmarkEnd w:id="41"/>
+    <w:bookmarkStart w:id="43" w:name="ref-sy2024AssessmentLongTermExposure"/>
     <w:p>
       <w:pPr>
         <w:pStyle w:val="Bibliography"/>
@@ -1363,7 +1791,7 @@
       <w:r>
         <w:t xml:space="preserve"> </w:t>
       </w:r>
-      <w:hyperlink r:id="rId39">
+      <w:hyperlink r:id="rId42">
         <w:r>
           <w:rPr>
             <w:rStyle w:val="Hyperlink"/>
@@ -1438,8 +1866,8 @@
         <w:t xml:space="preserve"> </w:t>
       </w:r>
     </w:p>
-    <w:bookmarkEnd w:id="40"/>
-    <w:bookmarkStart w:id="42" w:name="ref-brauer2024GlobalBurdenStrength"/>
+    <w:bookmarkEnd w:id="43"/>
+    <w:bookmarkStart w:id="45" w:name="ref-brauer2024GlobalBurdenStrength"/>
     <w:p>
       <w:pPr>
         <w:pStyle w:val="Bibliography"/>
@@ -1459,7 +1887,7 @@
       <w:r>
         <w:t xml:space="preserve"> </w:t>
       </w:r>
-      <w:hyperlink r:id="rId41">
+      <w:hyperlink r:id="rId44">
         <w:r>
           <w:rPr>
             <w:rStyle w:val="Hyperlink"/>
@@ -1522,8 +1950,8 @@
         <w:t xml:space="preserve"> </w:t>
       </w:r>
     </w:p>
-    <w:bookmarkEnd w:id="42"/>
-    <w:bookmarkStart w:id="44" w:name="ref-harari2018BloodLeadLevels"/>
+    <w:bookmarkEnd w:id="45"/>
+    <w:bookmarkStart w:id="47" w:name="ref-harari2018BloodLeadLevels"/>
     <w:p>
       <w:pPr>
         <w:pStyle w:val="Bibliography"/>
@@ -1543,7 +1971,7 @@
       <w:r>
         <w:t xml:space="preserve"> </w:t>
       </w:r>
-      <w:hyperlink r:id="rId43">
+      <w:hyperlink r:id="rId46">
         <w:r>
           <w:rPr>
             <w:rStyle w:val="Hyperlink"/>
@@ -1618,8 +2046,8 @@
         <w:t xml:space="preserve"> </w:t>
       </w:r>
     </w:p>
-    <w:bookmarkEnd w:id="44"/>
-    <w:bookmarkStart w:id="46" w:name="ref-wan2022ChronicLeadExposure"/>
+    <w:bookmarkEnd w:id="47"/>
+    <w:bookmarkStart w:id="49" w:name="ref-wan2022ChronicLeadExposure"/>
     <w:p>
       <w:pPr>
         <w:pStyle w:val="Bibliography"/>
@@ -1639,7 +2067,7 @@
       <w:r>
         <w:t xml:space="preserve"> </w:t>
       </w:r>
-      <w:hyperlink r:id="rId45">
+      <w:hyperlink r:id="rId48">
         <w:r>
           <w:rPr>
             <w:rStyle w:val="Hyperlink"/>
@@ -1654,8 +2082,8 @@
         <w:t xml:space="preserve"> </w:t>
       </w:r>
     </w:p>
-    <w:bookmarkEnd w:id="46"/>
-    <w:bookmarkStart w:id="48" w:name="ref-rosengren2025ExposureLeadCoronary"/>
+    <w:bookmarkEnd w:id="49"/>
+    <w:bookmarkStart w:id="51" w:name="ref-rosengren2025ExposureLeadCoronary"/>
     <w:p>
       <w:pPr>
         <w:pStyle w:val="Bibliography"/>
@@ -1675,7 +2103,7 @@
       <w:r>
         <w:t xml:space="preserve"> </w:t>
       </w:r>
-      <w:hyperlink r:id="rId47">
+      <w:hyperlink r:id="rId50">
         <w:r>
           <w:rPr>
             <w:rStyle w:val="Hyperlink"/>
@@ -1768,8 +2196,8 @@
         <w:t xml:space="preserve"> </w:t>
       </w:r>
     </w:p>
-    <w:bookmarkEnd w:id="48"/>
-    <w:bookmarkStart w:id="50" w:name="ref-lanphear2018LowlevelLeadExposure"/>
+    <w:bookmarkEnd w:id="51"/>
+    <w:bookmarkStart w:id="53" w:name="ref-lanphear2018LowlevelLeadExposure"/>
     <w:p>
       <w:pPr>
         <w:pStyle w:val="Bibliography"/>
@@ -1789,7 +2217,7 @@
       <w:r>
         <w:t xml:space="preserve"> </w:t>
       </w:r>
-      <w:hyperlink r:id="rId49">
+      <w:hyperlink r:id="rId52">
         <w:r>
           <w:rPr>
             <w:rStyle w:val="Hyperlink"/>
@@ -1828,8 +2256,8 @@
         <w:t xml:space="preserve"> </w:t>
       </w:r>
     </w:p>
-    <w:bookmarkEnd w:id="50"/>
-    <w:bookmarkStart w:id="52" w:name="ref-chang2006LowBloodLead"/>
+    <w:bookmarkEnd w:id="53"/>
+    <w:bookmarkStart w:id="55" w:name="ref-chang2006LowBloodLead"/>
     <w:p>
       <w:pPr>
         <w:pStyle w:val="Bibliography"/>
@@ -1849,7 +2277,7 @@
       <w:r>
         <w:t xml:space="preserve"> </w:t>
       </w:r>
-      <w:hyperlink r:id="rId51">
+      <w:hyperlink r:id="rId54">
         <w:r>
           <w:rPr>
             <w:rStyle w:val="Hyperlink"/>
@@ -1864,8 +2292,8 @@
         <w:t xml:space="preserve"> </w:t>
       </w:r>
     </w:p>
-    <w:bookmarkEnd w:id="52"/>
-    <w:bookmarkStart w:id="54" w:name="Xadfdab0209e4a364d9fdcffecfddb00700d2db9"/>
+    <w:bookmarkEnd w:id="55"/>
+    <w:bookmarkStart w:id="57" w:name="Xadfdab0209e4a364d9fdcffecfddb00700d2db9"/>
     <w:p>
       <w:pPr>
         <w:pStyle w:val="Bibliography"/>
@@ -1885,7 +2313,7 @@
       <w:r>
         <w:t xml:space="preserve"> </w:t>
       </w:r>
-      <w:hyperlink r:id="rId53">
+      <w:hyperlink r:id="rId56">
         <w:r>
           <w:rPr>
             <w:rStyle w:val="Hyperlink"/>
@@ -2020,8 +2448,8 @@
         <w:t xml:space="preserve"> </w:t>
       </w:r>
     </w:p>
-    <w:bookmarkEnd w:id="54"/>
-    <w:bookmarkStart w:id="56" w:name="ref-shaffer2025LeadExposureAntisocial"/>
+    <w:bookmarkEnd w:id="57"/>
+    <w:bookmarkStart w:id="59" w:name="ref-shaffer2025LeadExposureAntisocial"/>
     <w:p>
       <w:pPr>
         <w:pStyle w:val="Bibliography"/>
@@ -2041,7 +2469,7 @@
       <w:r>
         <w:t xml:space="preserve"> </w:t>
       </w:r>
-      <w:hyperlink r:id="rId55">
+      <w:hyperlink r:id="rId58">
         <w:r>
           <w:rPr>
             <w:rStyle w:val="Hyperlink"/>
@@ -2080,8 +2508,8 @@
         <w:t xml:space="preserve"> </w:t>
       </w:r>
     </w:p>
-    <w:bookmarkEnd w:id="56"/>
-    <w:bookmarkStart w:id="58" w:name="ref-crump2013StatisticalReevaluationData"/>
+    <w:bookmarkEnd w:id="59"/>
+    <w:bookmarkStart w:id="61" w:name="ref-crump2013StatisticalReevaluationData"/>
     <w:p>
       <w:pPr>
         <w:pStyle w:val="Bibliography"/>
@@ -2101,7 +2529,7 @@
       <w:r>
         <w:t xml:space="preserve"> </w:t>
       </w:r>
-      <w:hyperlink r:id="rId57">
+      <w:hyperlink r:id="rId60">
         <w:r>
           <w:rPr>
             <w:rStyle w:val="Hyperlink"/>
@@ -2140,8 +2568,8 @@
         <w:t xml:space="preserve"> </w:t>
       </w:r>
     </w:p>
-    <w:bookmarkEnd w:id="58"/>
-    <w:bookmarkStart w:id="60" w:name="ref-larsen2023GlobalHealthBurden"/>
+    <w:bookmarkEnd w:id="61"/>
+    <w:bookmarkStart w:id="63" w:name="ref-larsen2023GlobalHealthBurden"/>
     <w:p>
       <w:pPr>
         <w:pStyle w:val="Bibliography"/>
@@ -2161,7 +2589,7 @@
       <w:r>
         <w:t xml:space="preserve"> </w:t>
       </w:r>
-      <w:hyperlink r:id="rId59">
+      <w:hyperlink r:id="rId62">
         <w:r>
           <w:rPr>
             <w:rStyle w:val="Hyperlink"/>
@@ -2176,8 +2604,8 @@
         <w:t xml:space="preserve"> </w:t>
       </w:r>
     </w:p>
-    <w:bookmarkEnd w:id="60"/>
-    <w:bookmarkStart w:id="62" w:name="X5615fc1cb9c455a90da75660348bda09fd0f967"/>
+    <w:bookmarkEnd w:id="63"/>
+    <w:bookmarkStart w:id="65" w:name="X5615fc1cb9c455a90da75660348bda09fd0f967"/>
     <w:p>
       <w:pPr>
         <w:pStyle w:val="Bibliography"/>
@@ -2197,7 +2625,7 @@
       <w:r>
         <w:t xml:space="preserve"> </w:t>
       </w:r>
-      <w:hyperlink r:id="rId61">
+      <w:hyperlink r:id="rId64">
         <w:r>
           <w:rPr>
             <w:rStyle w:val="Hyperlink"/>
@@ -2272,8 +2700,8 @@
         <w:t xml:space="preserve"> </w:t>
       </w:r>
     </w:p>
-    <w:bookmarkEnd w:id="62"/>
-    <w:bookmarkStart w:id="64" w:name="Xa2086c2c3f6a9ac4b676f66b1cdbbd5efdb3b23"/>
+    <w:bookmarkEnd w:id="65"/>
+    <w:bookmarkStart w:id="67" w:name="Xa2086c2c3f6a9ac4b676f66b1cdbbd5efdb3b23"/>
     <w:p>
       <w:pPr>
         <w:pStyle w:val="Bibliography"/>
@@ -2293,7 +2721,7 @@
       <w:r>
         <w:t xml:space="preserve"> </w:t>
       </w:r>
-      <w:hyperlink r:id="rId63">
+      <w:hyperlink r:id="rId66">
         <w:r>
           <w:rPr>
             <w:rStyle w:val="Hyperlink"/>
@@ -2409,8 +2837,8 @@
         <w:t xml:space="preserve"> </w:t>
       </w:r>
     </w:p>
-    <w:bookmarkEnd w:id="64"/>
-    <w:bookmarkStart w:id="66" w:name="X9a8bad0b78f43066cb333fdedcdcad5d7017900"/>
+    <w:bookmarkEnd w:id="67"/>
+    <w:bookmarkStart w:id="69" w:name="X9a8bad0b78f43066cb333fdedcdcad5d7017900"/>
     <w:p>
       <w:pPr>
         <w:pStyle w:val="Bibliography"/>
@@ -2430,7 +2858,7 @@
       <w:r>
         <w:t xml:space="preserve"> </w:t>
       </w:r>
-      <w:hyperlink r:id="rId65">
+      <w:hyperlink r:id="rId68">
         <w:r>
           <w:rPr>
             <w:rStyle w:val="Hyperlink"/>
@@ -2511,8 +2939,8 @@
         <w:t xml:space="preserve"> </w:t>
       </w:r>
     </w:p>
-    <w:bookmarkEnd w:id="66"/>
-    <w:bookmarkStart w:id="68" w:name="X93c1fc7f8e1220d02cbab90c02ac44248f2b23e"/>
+    <w:bookmarkEnd w:id="69"/>
+    <w:bookmarkStart w:id="71" w:name="X93c1fc7f8e1220d02cbab90c02ac44248f2b23e"/>
     <w:p>
       <w:pPr>
         <w:pStyle w:val="Bibliography"/>
@@ -2532,7 +2960,7 @@
       <w:r>
         <w:t xml:space="preserve"> </w:t>
       </w:r>
-      <w:hyperlink r:id="rId67">
+      <w:hyperlink r:id="rId70">
         <w:r>
           <w:rPr>
             <w:rStyle w:val="Hyperlink"/>
@@ -2547,8 +2975,8 @@
         <w:t xml:space="preserve"> </w:t>
       </w:r>
     </w:p>
-    <w:bookmarkEnd w:id="68"/>
-    <w:bookmarkStart w:id="70" w:name="ref-figueroa2024LossCognitiveFunction"/>
+    <w:bookmarkEnd w:id="71"/>
+    <w:bookmarkStart w:id="73" w:name="ref-figueroa2024LossCognitiveFunction"/>
     <w:p>
       <w:pPr>
         <w:pStyle w:val="Bibliography"/>
@@ -2568,7 +2996,7 @@
       <w:r>
         <w:t xml:space="preserve"> </w:t>
       </w:r>
-      <w:hyperlink r:id="rId69">
+      <w:hyperlink r:id="rId72">
         <w:r>
           <w:rPr>
             <w:rStyle w:val="Hyperlink"/>
@@ -2607,8 +3035,8 @@
         <w:t xml:space="preserve"> </w:t>
       </w:r>
     </w:p>
-    <w:bookmarkEnd w:id="70"/>
-    <w:bookmarkStart w:id="72" w:name="ref-mcfarland2022HalfUSPopulation"/>
+    <w:bookmarkEnd w:id="73"/>
+    <w:bookmarkStart w:id="75" w:name="ref-mcfarland2022HalfUSPopulation"/>
     <w:p>
       <w:pPr>
         <w:pStyle w:val="Bibliography"/>
@@ -2628,7 +3056,7 @@
       <w:r>
         <w:t xml:space="preserve"> </w:t>
       </w:r>
-      <w:hyperlink r:id="rId71">
+      <w:hyperlink r:id="rId74">
         <w:r>
           <w:rPr>
             <w:rStyle w:val="Hyperlink"/>
@@ -2667,8 +3095,8 @@
         <w:t xml:space="preserve"> </w:t>
       </w:r>
     </w:p>
-    <w:bookmarkEnd w:id="72"/>
-    <w:bookmarkStart w:id="74" w:name="X33f03e29791f20cdbbbbf0729c723b16e55ed16"/>
+    <w:bookmarkEnd w:id="75"/>
+    <w:bookmarkStart w:id="77" w:name="X33f03e29791f20cdbbbbf0729c723b16e55ed16"/>
     <w:p>
       <w:pPr>
         <w:pStyle w:val="Bibliography"/>
@@ -2688,7 +3116,7 @@
       <w:r>
         <w:t xml:space="preserve"> </w:t>
       </w:r>
-      <w:hyperlink r:id="rId73">
+      <w:hyperlink r:id="rId76">
         <w:r>
           <w:rPr>
             <w:rStyle w:val="Hyperlink"/>
@@ -2787,8 +3215,8 @@
         <w:t xml:space="preserve"> </w:t>
       </w:r>
     </w:p>
-    <w:bookmarkEnd w:id="74"/>
-    <w:bookmarkStart w:id="76" w:name="X99fa6bd9cd2521340285769f289a6c9d4bfe17b"/>
+    <w:bookmarkEnd w:id="77"/>
+    <w:bookmarkStart w:id="79" w:name="X99fa6bd9cd2521340285769f289a6c9d4bfe17b"/>
     <w:p>
       <w:pPr>
         <w:pStyle w:val="Bibliography"/>
@@ -2808,7 +3236,7 @@
       <w:r>
         <w:t xml:space="preserve"> </w:t>
       </w:r>
-      <w:hyperlink r:id="rId75">
+      <w:hyperlink r:id="rId78">
         <w:r>
           <w:rPr>
             <w:rStyle w:val="Hyperlink"/>
@@ -2883,8 +3311,8 @@
         <w:t xml:space="preserve"> </w:t>
       </w:r>
     </w:p>
-    <w:bookmarkEnd w:id="76"/>
-    <w:bookmarkStart w:id="78" w:name="Xec30ec7c912152a14c0f622040312567154bf15"/>
+    <w:bookmarkEnd w:id="79"/>
+    <w:bookmarkStart w:id="81" w:name="Xec30ec7c912152a14c0f622040312567154bf15"/>
     <w:p>
       <w:pPr>
         <w:pStyle w:val="Bibliography"/>
@@ -2904,7 +3332,7 @@
       <w:r>
         <w:t xml:space="preserve"> </w:t>
       </w:r>
-      <w:hyperlink r:id="rId77">
+      <w:hyperlink r:id="rId80">
         <w:r>
           <w:rPr>
             <w:rStyle w:val="Hyperlink"/>
@@ -3054,8 +3482,8 @@
         <w:t xml:space="preserve"> </w:t>
       </w:r>
     </w:p>
-    <w:bookmarkEnd w:id="78"/>
-    <w:bookmarkStart w:id="80" w:name="ref-smith2018StepAwayStepwise"/>
+    <w:bookmarkEnd w:id="81"/>
+    <w:bookmarkStart w:id="83" w:name="ref-smith2018StepAwayStepwise"/>
     <w:p>
       <w:pPr>
         <w:pStyle w:val="Bibliography"/>
@@ -3075,7 +3503,7 @@
       <w:r>
         <w:t xml:space="preserve"> </w:t>
       </w:r>
-      <w:hyperlink r:id="rId79">
+      <w:hyperlink r:id="rId82">
         <w:r>
           <w:rPr>
             <w:rStyle w:val="Hyperlink"/>
@@ -3090,8 +3518,8 @@
         <w:t xml:space="preserve"> </w:t>
       </w:r>
     </w:p>
-    <w:bookmarkEnd w:id="80"/>
-    <w:bookmarkStart w:id="82" w:name="X035620408d1fb22c7ed381e74f0468c30df4612"/>
+    <w:bookmarkEnd w:id="83"/>
+    <w:bookmarkStart w:id="85" w:name="X035620408d1fb22c7ed381e74f0468c30df4612"/>
     <w:p>
       <w:pPr>
         <w:pStyle w:val="Bibliography"/>
@@ -3111,7 +3539,7 @@
       <w:r>
         <w:t xml:space="preserve"> </w:t>
       </w:r>
-      <w:hyperlink r:id="rId81">
+      <w:hyperlink r:id="rId84">
         <w:r>
           <w:rPr>
             <w:rStyle w:val="Hyperlink"/>
@@ -3165,8 +3593,8 @@
         <w:t xml:space="preserve"> </w:t>
       </w:r>
     </w:p>
-    <w:bookmarkEnd w:id="82"/>
-    <w:bookmarkStart w:id="84" w:name="ref-plate2024DevelopmentToolRapid"/>
+    <w:bookmarkEnd w:id="85"/>
+    <w:bookmarkStart w:id="87" w:name="ref-plate2024DevelopmentToolRapid"/>
     <w:p>
       <w:pPr>
         <w:pStyle w:val="Bibliography"/>
@@ -3186,7 +3614,7 @@
       <w:r>
         <w:t xml:space="preserve"> </w:t>
       </w:r>
-      <w:hyperlink r:id="rId83">
+      <w:hyperlink r:id="rId86">
         <w:r>
           <w:rPr>
             <w:rStyle w:val="Hyperlink"/>
@@ -3201,9 +3629,447 @@
         <w:t xml:space="preserve"> </w:t>
       </w:r>
     </w:p>
-    <w:bookmarkEnd w:id="84"/>
-    <w:bookmarkEnd w:id="85"/>
-    <w:bookmarkEnd w:id="86"/>
+    <w:bookmarkEnd w:id="87"/>
+    <w:bookmarkStart w:id="89" w:name="ref-halabicky2023LowLevelLead"/>
+    <w:p>
+      <w:pPr>
+        <w:pStyle w:val="Bibliography"/>
+      </w:pPr>
+      <w:r>
+        <w:t xml:space="preserve">27.</w:t>
+      </w:r>
+      <w:r>
+        <w:t xml:space="preserve"> </w:t>
+      </w:r>
+      <w:r>
+        <w:t xml:space="preserve">	</w:t>
+      </w:r>
+      <w:r>
+        <w:t xml:space="preserve">Halabicky OM, Pinto-Martin JA, Compton P, Liu J.</w:t>
+      </w:r>
+      <w:r>
+        <w:t xml:space="preserve"> </w:t>
+      </w:r>
+      <w:hyperlink r:id="rId88">
+        <w:r>
+          <w:rPr>
+            <w:rStyle w:val="Hyperlink"/>
+          </w:rPr>
+          <w:t xml:space="preserve">Low level lead exposure in early childhood and parental education on adolescent</w:t>
+        </w:r>
+        <w:r>
+          <w:rPr>
+            <w:rStyle w:val="Hyperlink"/>
+          </w:rPr>
+          <w:t xml:space="preserve"> </w:t>
+        </w:r>
+        <w:r>
+          <w:rPr>
+            <w:rStyle w:val="Hyperlink"/>
+          </w:rPr>
+          <w:t xml:space="preserve">IQ</w:t>
+        </w:r>
+        <w:r>
+          <w:rPr>
+            <w:rStyle w:val="Hyperlink"/>
+          </w:rPr>
+          <w:t xml:space="preserve"> </w:t>
+        </w:r>
+        <w:r>
+          <w:rPr>
+            <w:rStyle w:val="Hyperlink"/>
+          </w:rPr>
+          <w:t xml:space="preserve">and working memory: A cohort study</w:t>
+        </w:r>
+      </w:hyperlink>
+      <w:r>
+        <w:t xml:space="preserve">. Journal of Exposure Science &amp; Environmental Epidemiology. 2023;33(2):168–76.</w:t>
+      </w:r>
+      <w:r>
+        <w:t xml:space="preserve"> </w:t>
+      </w:r>
+    </w:p>
+    <w:bookmarkEnd w:id="89"/>
+    <w:bookmarkStart w:id="91" w:name="ref-chen2005IQBloodLead"/>
+    <w:p>
+      <w:pPr>
+        <w:pStyle w:val="Bibliography"/>
+      </w:pPr>
+      <w:r>
+        <w:t xml:space="preserve">28.</w:t>
+      </w:r>
+      <w:r>
+        <w:t xml:space="preserve"> </w:t>
+      </w:r>
+      <w:r>
+        <w:t xml:space="preserve">	</w:t>
+      </w:r>
+      <w:r>
+        <w:t xml:space="preserve">Chen A, Dietrich KN, Ware JH, Radcliffe J, Rogan WJ.</w:t>
+      </w:r>
+      <w:r>
+        <w:t xml:space="preserve"> </w:t>
+      </w:r>
+      <w:hyperlink r:id="rId90">
+        <w:r>
+          <w:rPr>
+            <w:rStyle w:val="Hyperlink"/>
+          </w:rPr>
+          <w:t xml:space="preserve">IQ</w:t>
+        </w:r>
+        <w:r>
+          <w:rPr>
+            <w:rStyle w:val="Hyperlink"/>
+          </w:rPr>
+          <w:t xml:space="preserve"> </w:t>
+        </w:r>
+        <w:r>
+          <w:rPr>
+            <w:rStyle w:val="Hyperlink"/>
+          </w:rPr>
+          <w:t xml:space="preserve">and</w:t>
+        </w:r>
+        <w:r>
+          <w:rPr>
+            <w:rStyle w:val="Hyperlink"/>
+          </w:rPr>
+          <w:t xml:space="preserve"> </w:t>
+        </w:r>
+        <w:r>
+          <w:rPr>
+            <w:rStyle w:val="Hyperlink"/>
+          </w:rPr>
+          <w:t xml:space="preserve">Blood Lead</w:t>
+        </w:r>
+        <w:r>
+          <w:rPr>
+            <w:rStyle w:val="Hyperlink"/>
+          </w:rPr>
+          <w:t xml:space="preserve"> </w:t>
+        </w:r>
+        <w:r>
+          <w:rPr>
+            <w:rStyle w:val="Hyperlink"/>
+          </w:rPr>
+          <w:t xml:space="preserve">from 2 to 7</w:t>
+        </w:r>
+        <w:r>
+          <w:rPr>
+            <w:rStyle w:val="Hyperlink"/>
+          </w:rPr>
+          <w:t xml:space="preserve"> </w:t>
+        </w:r>
+        <w:r>
+          <w:rPr>
+            <w:rStyle w:val="Hyperlink"/>
+          </w:rPr>
+          <w:t xml:space="preserve">Years</w:t>
+        </w:r>
+        <w:r>
+          <w:rPr>
+            <w:rStyle w:val="Hyperlink"/>
+          </w:rPr>
+          <w:t xml:space="preserve"> </w:t>
+        </w:r>
+        <w:r>
+          <w:rPr>
+            <w:rStyle w:val="Hyperlink"/>
+          </w:rPr>
+          <w:t xml:space="preserve">of</w:t>
+        </w:r>
+        <w:r>
+          <w:rPr>
+            <w:rStyle w:val="Hyperlink"/>
+          </w:rPr>
+          <w:t xml:space="preserve"> </w:t>
+        </w:r>
+        <w:r>
+          <w:rPr>
+            <w:rStyle w:val="Hyperlink"/>
+          </w:rPr>
+          <w:t xml:space="preserve">Age</w:t>
+        </w:r>
+        <w:r>
+          <w:rPr>
+            <w:rStyle w:val="Hyperlink"/>
+          </w:rPr>
+          <w:t xml:space="preserve">:</w:t>
+        </w:r>
+        <w:r>
+          <w:rPr>
+            <w:rStyle w:val="Hyperlink"/>
+          </w:rPr>
+          <w:t xml:space="preserve"> </w:t>
+        </w:r>
+        <w:r>
+          <w:rPr>
+            <w:rStyle w:val="Hyperlink"/>
+          </w:rPr>
+          <w:t xml:space="preserve">Are</w:t>
+        </w:r>
+        <w:r>
+          <w:rPr>
+            <w:rStyle w:val="Hyperlink"/>
+          </w:rPr>
+          <w:t xml:space="preserve"> </w:t>
+        </w:r>
+        <w:r>
+          <w:rPr>
+            <w:rStyle w:val="Hyperlink"/>
+          </w:rPr>
+          <w:t xml:space="preserve">the</w:t>
+        </w:r>
+        <w:r>
+          <w:rPr>
+            <w:rStyle w:val="Hyperlink"/>
+          </w:rPr>
+          <w:t xml:space="preserve"> </w:t>
+        </w:r>
+        <w:r>
+          <w:rPr>
+            <w:rStyle w:val="Hyperlink"/>
+          </w:rPr>
+          <w:t xml:space="preserve">Effects</w:t>
+        </w:r>
+        <w:r>
+          <w:rPr>
+            <w:rStyle w:val="Hyperlink"/>
+          </w:rPr>
+          <w:t xml:space="preserve"> </w:t>
+        </w:r>
+        <w:r>
+          <w:rPr>
+            <w:rStyle w:val="Hyperlink"/>
+          </w:rPr>
+          <w:t xml:space="preserve">in</w:t>
+        </w:r>
+        <w:r>
+          <w:rPr>
+            <w:rStyle w:val="Hyperlink"/>
+          </w:rPr>
+          <w:t xml:space="preserve"> </w:t>
+        </w:r>
+        <w:r>
+          <w:rPr>
+            <w:rStyle w:val="Hyperlink"/>
+          </w:rPr>
+          <w:t xml:space="preserve">Older Children</w:t>
+        </w:r>
+        <w:r>
+          <w:rPr>
+            <w:rStyle w:val="Hyperlink"/>
+          </w:rPr>
+          <w:t xml:space="preserve"> </w:t>
+        </w:r>
+        <w:r>
+          <w:rPr>
+            <w:rStyle w:val="Hyperlink"/>
+          </w:rPr>
+          <w:t xml:space="preserve">the</w:t>
+        </w:r>
+        <w:r>
+          <w:rPr>
+            <w:rStyle w:val="Hyperlink"/>
+          </w:rPr>
+          <w:t xml:space="preserve"> </w:t>
+        </w:r>
+        <w:r>
+          <w:rPr>
+            <w:rStyle w:val="Hyperlink"/>
+          </w:rPr>
+          <w:t xml:space="preserve">Residual</w:t>
+        </w:r>
+        <w:r>
+          <w:rPr>
+            <w:rStyle w:val="Hyperlink"/>
+          </w:rPr>
+          <w:t xml:space="preserve"> </w:t>
+        </w:r>
+        <w:r>
+          <w:rPr>
+            <w:rStyle w:val="Hyperlink"/>
+          </w:rPr>
+          <w:t xml:space="preserve">of</w:t>
+        </w:r>
+        <w:r>
+          <w:rPr>
+            <w:rStyle w:val="Hyperlink"/>
+          </w:rPr>
+          <w:t xml:space="preserve"> </w:t>
+        </w:r>
+        <w:r>
+          <w:rPr>
+            <w:rStyle w:val="Hyperlink"/>
+          </w:rPr>
+          <w:t xml:space="preserve">High Blood Lead Concentrations</w:t>
+        </w:r>
+        <w:r>
+          <w:rPr>
+            <w:rStyle w:val="Hyperlink"/>
+          </w:rPr>
+          <w:t xml:space="preserve"> </w:t>
+        </w:r>
+        <w:r>
+          <w:rPr>
+            <w:rStyle w:val="Hyperlink"/>
+          </w:rPr>
+          <w:t xml:space="preserve">in 2-</w:t>
+        </w:r>
+        <w:r>
+          <w:rPr>
+            <w:rStyle w:val="Hyperlink"/>
+          </w:rPr>
+          <w:t xml:space="preserve">Year-Olds</w:t>
+        </w:r>
+        <w:r>
+          <w:rPr>
+            <w:rStyle w:val="Hyperlink"/>
+          </w:rPr>
+          <w:t xml:space="preserve">?</w:t>
+        </w:r>
+      </w:hyperlink>
+      <w:r>
+        <w:t xml:space="preserve"> Environmental Health Perspectives. 2005;113(5):597–601.</w:t>
+      </w:r>
+      <w:r>
+        <w:t xml:space="preserve"> </w:t>
+      </w:r>
+    </w:p>
+    <w:bookmarkEnd w:id="91"/>
+    <w:bookmarkStart w:id="93" w:name="Xcf7993c3f58afaabaf73be6238c67f4f63053d9"/>
+    <w:p>
+      <w:pPr>
+        <w:pStyle w:val="Bibliography"/>
+      </w:pPr>
+      <w:r>
+        <w:t xml:space="preserve">29.</w:t>
+      </w:r>
+      <w:r>
+        <w:t xml:space="preserve"> </w:t>
+      </w:r>
+      <w:r>
+        <w:t xml:space="preserve">	</w:t>
+      </w:r>
+      <w:r>
+        <w:t xml:space="preserve">Schnaas L, Rothenberg Stephen J, Flores MF, Martinez S, Hernandez C, Osorio E, et al.</w:t>
+      </w:r>
+      <w:r>
+        <w:t xml:space="preserve"> </w:t>
+      </w:r>
+      <w:hyperlink r:id="rId92">
+        <w:r>
+          <w:rPr>
+            <w:rStyle w:val="Hyperlink"/>
+          </w:rPr>
+          <w:t xml:space="preserve">Reduced</w:t>
+        </w:r>
+        <w:r>
+          <w:rPr>
+            <w:rStyle w:val="Hyperlink"/>
+          </w:rPr>
+          <w:t xml:space="preserve"> </w:t>
+        </w:r>
+        <w:r>
+          <w:rPr>
+            <w:rStyle w:val="Hyperlink"/>
+          </w:rPr>
+          <w:t xml:space="preserve">Intellectual Development</w:t>
+        </w:r>
+        <w:r>
+          <w:rPr>
+            <w:rStyle w:val="Hyperlink"/>
+          </w:rPr>
+          <w:t xml:space="preserve"> </w:t>
+        </w:r>
+        <w:r>
+          <w:rPr>
+            <w:rStyle w:val="Hyperlink"/>
+          </w:rPr>
+          <w:t xml:space="preserve">in</w:t>
+        </w:r>
+        <w:r>
+          <w:rPr>
+            <w:rStyle w:val="Hyperlink"/>
+          </w:rPr>
+          <w:t xml:space="preserve"> </w:t>
+        </w:r>
+        <w:r>
+          <w:rPr>
+            <w:rStyle w:val="Hyperlink"/>
+          </w:rPr>
+          <w:t xml:space="preserve">Children</w:t>
+        </w:r>
+        <w:r>
+          <w:rPr>
+            <w:rStyle w:val="Hyperlink"/>
+          </w:rPr>
+          <w:t xml:space="preserve"> </w:t>
+        </w:r>
+        <w:r>
+          <w:rPr>
+            <w:rStyle w:val="Hyperlink"/>
+          </w:rPr>
+          <w:t xml:space="preserve">with</w:t>
+        </w:r>
+        <w:r>
+          <w:rPr>
+            <w:rStyle w:val="Hyperlink"/>
+          </w:rPr>
+          <w:t xml:space="preserve"> </w:t>
+        </w:r>
+        <w:r>
+          <w:rPr>
+            <w:rStyle w:val="Hyperlink"/>
+          </w:rPr>
+          <w:t xml:space="preserve">Prenatal Lead Exposure</w:t>
+        </w:r>
+      </w:hyperlink>
+      <w:r>
+        <w:t xml:space="preserve">. Environmental Health Perspectives. 2006;114(5):791–7.</w:t>
+      </w:r>
+      <w:r>
+        <w:t xml:space="preserve"> </w:t>
+      </w:r>
+    </w:p>
+    <w:bookmarkEnd w:id="93"/>
+    <w:bookmarkStart w:id="95" w:name="X8e5230fc5b64bf627de98b910f1e221b6fea14c"/>
+    <w:p>
+      <w:pPr>
+        <w:pStyle w:val="Bibliography"/>
+      </w:pPr>
+      <w:r>
+        <w:t xml:space="preserve">30.</w:t>
+      </w:r>
+      <w:r>
+        <w:t xml:space="preserve"> </w:t>
+      </w:r>
+      <w:r>
+        <w:t xml:space="preserve">	</w:t>
+      </w:r>
+      <w:r>
+        <w:t xml:space="preserve">Rodríguez-Barranco M, Tobías A, Redondo D, Molina-Portillo E, Sánchez MJ.</w:t>
+      </w:r>
+      <w:r>
+        <w:t xml:space="preserve"> </w:t>
+      </w:r>
+      <w:hyperlink r:id="rId94">
+        <w:r>
+          <w:rPr>
+            <w:rStyle w:val="Hyperlink"/>
+          </w:rPr>
+          <w:t xml:space="preserve">Standardizing effect size from linear regression models with log-transformed variables for meta-analysis</w:t>
+        </w:r>
+      </w:hyperlink>
+      <w:r>
+        <w:t xml:space="preserve">. BMC Med Res Methodol. 2017 Dec;17(1):44.</w:t>
+      </w:r>
+      <w:r>
+        <w:t xml:space="preserve"> </w:t>
+      </w:r>
+    </w:p>
+    <w:bookmarkEnd w:id="95"/>
+    <w:bookmarkEnd w:id="96"/>
+    <w:bookmarkEnd w:id="97"/>
     <w:sectPr>
       <w:footerReference r:id="rId9" w:type="default"/>
       <w:footnotePr>
@@ -3630,16 +4496,16 @@
     <w:abstractNumId w:val="993"/>
   </w:num>
   <w:num w:numId="1006">
-    <w:abstractNumId w:val="992"/>
+    <w:abstractNumId w:val="993"/>
   </w:num>
   <w:num w:numId="1007">
     <w:abstractNumId w:val="992"/>
   </w:num>
   <w:num w:numId="1008">
-    <w:abstractNumId w:val="992"/>
+    <w:abstractNumId w:val="993"/>
   </w:num>
   <w:num w:numId="1009">
-    <w:abstractNumId w:val="992"/>
+    <w:abstractNumId w:val="993"/>
   </w:num>
   <w:num w:numId="1010">
     <w:abstractNumId w:val="992"/>

</xml_diff>

<commit_message>
worked on results section
</commit_message>
<xml_diff>
--- a/manuscript/manuscript.docx
+++ b/manuscript/manuscript.docx
@@ -17,32 +17,101 @@
       <w:r>
         <w:t xml:space="preserve">Paulina Sell</w:t>
       </w:r>
-    </w:p>
-    <w:p>
-      <w:pPr>
-        <w:pStyle w:val="Author"/>
-      </w:pPr>
-      <w:r>
-        <w:t xml:space="preserve">Margaux Sanchez</w:t>
-      </w:r>
-    </w:p>
-    <w:p>
-      <w:pPr>
-        <w:pStyle w:val="Author"/>
-      </w:pPr>
-      <w:r>
-        <w:t xml:space="preserve">Philippe Palmont</w:t>
-      </w:r>
-    </w:p>
-    <w:p>
-      <w:pPr>
-        <w:pStyle w:val="Author"/>
-      </w:pPr>
-      <w:r>
-        <w:t xml:space="preserve">Dietrich Plass</w:t>
-      </w:r>
-    </w:p>
-    <w:bookmarkStart w:id="23" w:name="notes"/>
+      <w:r>
+        <w:rPr>
+          <w:vertAlign w:val="superscript"/>
+        </w:rPr>
+        <w:t xml:space="preserve">1,✉</w:t>
+      </w:r>
+      <w:r>
+        <w:t xml:space="preserve">, Margaux Sanchez</w:t>
+      </w:r>
+      <w:r>
+        <w:rPr>
+          <w:vertAlign w:val="superscript"/>
+        </w:rPr>
+        <w:t xml:space="preserve">2</w:t>
+      </w:r>
+      <w:r>
+        <w:t xml:space="preserve">, Philippe Palmont</w:t>
+      </w:r>
+      <w:r>
+        <w:rPr>
+          <w:vertAlign w:val="superscript"/>
+        </w:rPr>
+        <w:t xml:space="preserve">2</w:t>
+      </w:r>
+      <w:r>
+        <w:t xml:space="preserve">, and Dietrich Plass</w:t>
+      </w:r>
+      <w:r>
+        <w:rPr>
+          <w:vertAlign w:val="superscript"/>
+        </w:rPr>
+        <w:t xml:space="preserve">1</w:t>
+      </w:r>
+    </w:p>
+    <w:p>
+      <w:pPr>
+        <w:pStyle w:val="FirstParagraph"/>
+      </w:pPr>
+      <w:r>
+        <w:rPr>
+          <w:vertAlign w:val="superscript"/>
+        </w:rPr>
+        <w:t xml:space="preserve">1</w:t>
+      </w:r>
+      <w:r>
+        <w:t xml:space="preserve"> </w:t>
+      </w:r>
+      <w:r>
+        <w:t xml:space="preserve">Environmental Hygiene, German Environment Agency, Berlin, Germany</w:t>
+      </w:r>
+      <w:r>
+        <w:br/>
+      </w:r>
+      <w:r>
+        <w:rPr>
+          <w:vertAlign w:val="superscript"/>
+        </w:rPr>
+        <w:t xml:space="preserve">2</w:t>
+      </w:r>
+      <w:r>
+        <w:t xml:space="preserve"> </w:t>
+      </w:r>
+      <w:r>
+        <w:t xml:space="preserve">Agence nationale de sécurité sanitaire, Maisons-Alfort, France</w:t>
+      </w:r>
+    </w:p>
+    <w:p>
+      <w:pPr>
+        <w:pStyle w:val="BodyText"/>
+      </w:pPr>
+      <w:r>
+        <w:rPr>
+          <w:vertAlign w:val="superscript"/>
+        </w:rPr>
+        <w:t xml:space="preserve">✉</w:t>
+      </w:r>
+      <w:r>
+        <w:t xml:space="preserve"> </w:t>
+      </w:r>
+      <w:r>
+        <w:t xml:space="preserve">Correspondence:</w:t>
+      </w:r>
+      <w:r>
+        <w:t xml:space="preserve"> </w:t>
+      </w:r>
+      <w:hyperlink r:id="rId20">
+        <w:r>
+          <w:rPr>
+            <w:rStyle w:val="Hyperlink"/>
+          </w:rPr>
+          <w:t xml:space="preserve">Paulina Sell &lt;paulina.sell@uba.de&gt;</w:t>
+        </w:r>
+      </w:hyperlink>
+    </w:p>
+    <w:bookmarkStart w:id="24" w:name="notes"/>
     <w:p>
       <w:pPr>
         <w:pStyle w:val="Heading1"/>
@@ -65,7 +134,7 @@
       <w:r>
         <w:t xml:space="preserve"> </w:t>
       </w:r>
-      <w:hyperlink r:id="rId20">
+      <w:hyperlink r:id="rId21">
         <w:r>
           <w:rPr>
             <w:rStyle w:val="Hyperlink"/>
@@ -88,7 +157,7 @@
       <w:r>
         <w:t xml:space="preserve"> </w:t>
       </w:r>
-      <w:hyperlink r:id="rId21">
+      <w:hyperlink r:id="rId22">
         <w:r>
           <w:rPr>
             <w:rStyle w:val="Hyperlink"/>
@@ -117,7 +186,7 @@
       <w:r>
         <w:t xml:space="preserve"> </w:t>
       </w:r>
-      <w:hyperlink r:id="rId22">
+      <w:hyperlink r:id="rId23">
         <w:r>
           <w:rPr>
             <w:rStyle w:val="Hyperlink"/>
@@ -132,8 +201,8 @@
         <w:t xml:space="preserve">for Risk of Bias Assessment</w:t>
       </w:r>
     </w:p>
-    <w:bookmarkEnd w:id="23"/>
-    <w:bookmarkStart w:id="24" w:name="abstract"/>
+    <w:bookmarkEnd w:id="24"/>
+    <w:bookmarkStart w:id="25" w:name="abstract"/>
     <w:p>
       <w:pPr>
         <w:pStyle w:val="Heading1"/>
@@ -147,14 +216,410 @@
         <w:br w:type="page"/>
       </w:r>
     </w:p>
-    <w:bookmarkEnd w:id="24"/>
-    <w:bookmarkStart w:id="26" w:name="background"/>
+    <w:bookmarkEnd w:id="25"/>
+    <w:bookmarkStart w:id="27" w:name="background"/>
     <w:p>
       <w:pPr>
         <w:pStyle w:val="Heading1"/>
       </w:pPr>
       <w:r>
         <w:t xml:space="preserve">1. Background</w:t>
+      </w:r>
+    </w:p>
+    <w:p>
+      <w:pPr>
+        <w:pStyle w:val="FirstParagraph"/>
+      </w:pPr>
+      <w:r>
+        <w:t xml:space="preserve">Lead (Pb) is a pervasive environmental pollutant originating from anthropogenic and natural sources.</w:t>
+      </w:r>
+      <w:r>
+        <w:t xml:space="preserve"> </w:t>
+      </w:r>
+      <w:r>
+        <w:t xml:space="preserve">Although concentrations have declined globally in past decades following the phase-out of leaded gasoline, lead remains present in the environment and human blood</w:t>
+      </w:r>
+      <w:r>
+        <w:t xml:space="preserve"> </w:t>
+      </w:r>
+      <w:r>
+        <w:t xml:space="preserve">(1,2)</w:t>
+      </w:r>
+      <w:r>
+        <w:t xml:space="preserve">.</w:t>
+      </w:r>
+      <w:r>
+        <w:t xml:space="preserve"> </w:t>
+      </w:r>
+      <w:r>
+        <w:t xml:space="preserve">In Europe, primary exposure sources include dietary products, drinking water, and indoor dust</w:t>
+      </w:r>
+      <w:r>
+        <w:t xml:space="preserve"> </w:t>
+      </w:r>
+      <w:r>
+        <w:t xml:space="preserve">(3,4)</w:t>
+      </w:r>
+      <w:r>
+        <w:t xml:space="preserve">.</w:t>
+      </w:r>
+      <w:r>
+        <w:t xml:space="preserve"> </w:t>
+      </w:r>
+      <w:r>
+        <w:t xml:space="preserve">The most recent Global Burden of Disease Study estimated that in 2023, 3.4 million (95% Uncertainty Interval (UI): 2.7; 4.0 million) Disability-Adjusted Life Years (DALYs) were attributable to lead exposure in the European Union (EU)</w:t>
+      </w:r>
+      <w:r>
+        <w:t xml:space="preserve"> </w:t>
+      </w:r>
+      <w:r>
+        <w:t xml:space="preserve">(5)</w:t>
+      </w:r>
+      <w:r>
+        <w:t xml:space="preserve">.</w:t>
+      </w:r>
+      <w:r>
+        <w:t xml:space="preserve"> </w:t>
+      </w:r>
+      <w:r>
+        <w:t xml:space="preserve">This highlights the continued public health significance even of low-level exposure.</w:t>
+      </w:r>
+    </w:p>
+    <w:p>
+      <w:pPr>
+        <w:pStyle w:val="BodyText"/>
+      </w:pPr>
+      <w:r>
+        <w:t xml:space="preserve">Exposure to lead is associated with multiple adverse health outcomes across the human life course, including</w:t>
+      </w:r>
+      <w:r>
+        <w:t xml:space="preserve"> </w:t>
+      </w:r>
+      <w:r>
+        <w:t xml:space="preserve">decreased kidney function</w:t>
+      </w:r>
+      <w:r>
+        <w:t xml:space="preserve"> </w:t>
+      </w:r>
+      <w:r>
+        <w:t xml:space="preserve">(6)</w:t>
+      </w:r>
+      <w:r>
+        <w:t xml:space="preserve">,</w:t>
+      </w:r>
+      <w:r>
+        <w:t xml:space="preserve"> </w:t>
+      </w:r>
+      <w:r>
+        <w:t xml:space="preserve">liver disease</w:t>
+      </w:r>
+      <w:r>
+        <w:t xml:space="preserve"> </w:t>
+      </w:r>
+      <w:r>
+        <w:t xml:space="preserve">(7)</w:t>
+      </w:r>
+      <w:r>
+        <w:t xml:space="preserve">,</w:t>
+      </w:r>
+      <w:r>
+        <w:t xml:space="preserve"> </w:t>
+      </w:r>
+      <w:r>
+        <w:t xml:space="preserve">coronary artery atherosclerosis</w:t>
+      </w:r>
+      <w:r>
+        <w:t xml:space="preserve"> </w:t>
+      </w:r>
+      <w:r>
+        <w:t xml:space="preserve">(8)</w:t>
+      </w:r>
+      <w:r>
+        <w:t xml:space="preserve">,</w:t>
+      </w:r>
+      <w:r>
+        <w:t xml:space="preserve"> </w:t>
+      </w:r>
+      <w:r>
+        <w:t xml:space="preserve">cardiovascular mortality</w:t>
+      </w:r>
+      <w:r>
+        <w:t xml:space="preserve"> </w:t>
+      </w:r>
+      <w:r>
+        <w:t xml:space="preserve">(9)</w:t>
+      </w:r>
+      <w:r>
+        <w:t xml:space="preserve">,</w:t>
+      </w:r>
+      <w:r>
+        <w:t xml:space="preserve"> </w:t>
+      </w:r>
+      <w:r>
+        <w:t xml:space="preserve">infertility in women</w:t>
+      </w:r>
+      <w:r>
+        <w:t xml:space="preserve"> </w:t>
+      </w:r>
+      <w:r>
+        <w:t xml:space="preserve">(10)</w:t>
+      </w:r>
+      <w:r>
+        <w:t xml:space="preserve">,</w:t>
+      </w:r>
+      <w:r>
+        <w:t xml:space="preserve"> </w:t>
+      </w:r>
+      <w:r>
+        <w:t xml:space="preserve">attention-deficit/hyperactivity disorder in children</w:t>
+      </w:r>
+      <w:r>
+        <w:t xml:space="preserve"> </w:t>
+      </w:r>
+      <w:r>
+        <w:t xml:space="preserve">(11)</w:t>
+      </w:r>
+      <w:r>
+        <w:t xml:space="preserve">, and</w:t>
+      </w:r>
+      <w:r>
+        <w:t xml:space="preserve"> </w:t>
+      </w:r>
+      <w:r>
+        <w:t xml:space="preserve">antisocial behavior</w:t>
+      </w:r>
+      <w:r>
+        <w:t xml:space="preserve"> </w:t>
+      </w:r>
+      <w:r>
+        <w:t xml:space="preserve">(12)</w:t>
+      </w:r>
+      <w:r>
+        <w:t xml:space="preserve">.</w:t>
+      </w:r>
+      <w:r>
+        <w:t xml:space="preserve"> </w:t>
+      </w:r>
+      <w:r>
+        <w:t xml:space="preserve">Among these endpoints, impaired cognitive development in children — manifested as reduced IQ scores —</w:t>
+      </w:r>
+      <w:r>
+        <w:t xml:space="preserve"> </w:t>
+      </w:r>
+      <w:r>
+        <w:t xml:space="preserve">(13–16)</w:t>
+      </w:r>
+      <w:r>
+        <w:t xml:space="preserve"> </w:t>
+      </w:r>
+      <w:r>
+        <w:t xml:space="preserve">represents a particularly critical endpoint for public health policy.</w:t>
+      </w:r>
+      <w:r>
+        <w:t xml:space="preserve"> </w:t>
+      </w:r>
+      <w:r>
+        <w:t xml:space="preserve">Children are especially vulnerable to lead’s neurotoxic effects due to their developing nervous systems and relatively high exposure per body mass.</w:t>
+      </w:r>
+      <w:r>
+        <w:t xml:space="preserve"> </w:t>
+      </w:r>
+      <w:r>
+        <w:t xml:space="preserve">Because lead-associated IQ decrements are irreversible and persist throughout life, they lead to substantial and enduring societal costs</w:t>
+      </w:r>
+      <w:r>
+        <w:t xml:space="preserve"> </w:t>
+      </w:r>
+      <w:r>
+        <w:t xml:space="preserve">(17)</w:t>
+      </w:r>
+      <w:r>
+        <w:t xml:space="preserve">, making continued efforts to accurately characterize the exposure-response relationship important for evidence-based policy.</w:t>
+      </w:r>
+    </w:p>
+    <w:p>
+      <w:pPr>
+        <w:pStyle w:val="BodyText"/>
+      </w:pPr>
+      <w:r>
+        <w:t xml:space="preserve">Contemporary blood lead levels (BLL) in the EU have declined markedly and now predominantly fall below 5 µg/dL (</w:t>
+      </w:r>
+      <w:hyperlink r:id="rId26">
+        <w:r>
+          <w:rPr>
+            <w:rStyle w:val="Hyperlink"/>
+          </w:rPr>
+          <w:t xml:space="preserve">HBM4EU Dashboard</w:t>
+        </w:r>
+      </w:hyperlink>
+      <w:r>
+        <w:t xml:space="preserve">), well below the concentrations examined in many earlier studies (&lt;10 µg/dL).</w:t>
+      </w:r>
+      <w:r>
+        <w:t xml:space="preserve"> </w:t>
+      </w:r>
+      <w:r>
+        <w:t xml:space="preserve">Importantly, there is no evidence for a threshold concentration below which the effects of lead on the IQ can be assumed to be negligible</w:t>
+      </w:r>
+      <w:r>
+        <w:t xml:space="preserve"> </w:t>
+      </w:r>
+      <w:r>
+        <w:t xml:space="preserve">(18,19)</w:t>
+      </w:r>
+      <w:r>
+        <w:t xml:space="preserve">.</w:t>
+      </w:r>
+      <w:r>
+        <w:t xml:space="preserve"> </w:t>
+      </w:r>
+      <w:r>
+        <w:t xml:space="preserve">There is evidence for a supralinear exposure-response relationship with steeper IQ decrements per unit increase in BLL at low concentrations compared to higher concentration ranges</w:t>
+      </w:r>
+      <w:r>
+        <w:t xml:space="preserve"> </w:t>
+      </w:r>
+      <w:r>
+        <w:t xml:space="preserve">(16,20)</w:t>
+      </w:r>
+      <w:r>
+        <w:t xml:space="preserve">.</w:t>
+      </w:r>
+      <w:r>
+        <w:t xml:space="preserve"> </w:t>
+      </w:r>
+      <w:r>
+        <w:t xml:space="preserve">These findings highlight the need for an updated quantitative synthesis that reflects both recent epidemiological evidence and the lower exposure range now predominant in European populations, incorporating recent data to inform risk assessment at currently relevant exposure levels.</w:t>
+      </w:r>
+    </w:p>
+    <w:p>
+      <w:pPr>
+        <w:pStyle w:val="BodyText"/>
+      </w:pPr>
+      <w:r>
+        <w:t xml:space="preserve">Existing burden of disease assessments at national and global scales</w:t>
+      </w:r>
+      <w:r>
+        <w:t xml:space="preserve"> </w:t>
+      </w:r>
+      <w:r>
+        <w:t xml:space="preserve">(5,17,21–23)</w:t>
+      </w:r>
+      <w:r>
+        <w:t xml:space="preserve"> </w:t>
+      </w:r>
+      <w:r>
+        <w:t xml:space="preserve">rely predominantly on two foundational studies: a pooled analysis of seven cohort-studies by Lanphear et al. (2005) or the subsequent re-analysis by Crump et al. (2013)</w:t>
+      </w:r>
+      <w:r>
+        <w:t xml:space="preserve"> </w:t>
+      </w:r>
+      <w:r>
+        <w:t xml:space="preserve">(16,24)</w:t>
+      </w:r>
+      <w:r>
+        <w:t xml:space="preserve">.</w:t>
+      </w:r>
+      <w:r>
+        <w:t xml:space="preserve"> </w:t>
+      </w:r>
+      <w:r>
+        <w:t xml:space="preserve">While these landmark studies have substantially shaped research and policy on childhood lead exposure, methodological issues and errors in the Lanphear et al. 2005 article have been raised</w:t>
+      </w:r>
+      <w:r>
+        <w:t xml:space="preserve"> </w:t>
+      </w:r>
+      <w:r>
+        <w:t xml:space="preserve">(24,25)</w:t>
+      </w:r>
+      <w:r>
+        <w:t xml:space="preserve"> </w:t>
+      </w:r>
+      <w:r>
+        <w:t xml:space="preserve">and the stepwise backward-elimination regression approach used by Crump et al. (2013), which is central to their findings, has received substantial criticism</w:t>
+      </w:r>
+      <w:r>
+        <w:t xml:space="preserve"> </w:t>
+      </w:r>
+      <w:r>
+        <w:t xml:space="preserve">(26–28)</w:t>
+      </w:r>
+      <w:r>
+        <w:t xml:space="preserve">.</w:t>
+      </w:r>
+      <w:r>
+        <w:t xml:space="preserve"> </w:t>
+      </w:r>
+      <w:r>
+        <w:t xml:space="preserve">These limitations, combined with the availability of more recent epidemiological data, underscore the need not only for an updated evidence synthesis but also for methodologically robust approaches that can provide reliable exposure-response estimates for burden of disease and risk assessments.</w:t>
+      </w:r>
+    </w:p>
+    <w:p>
+      <w:pPr>
+        <w:pStyle w:val="BodyText"/>
+      </w:pPr>
+      <w:r>
+        <w:t xml:space="preserve">Methodological advances in meta-analysis offer an opportunity to enhance the utility of synthesized estimates for burden of disease and risk assessment applications.</w:t>
+      </w:r>
+      <w:r>
+        <w:t xml:space="preserve"> </w:t>
+      </w:r>
+      <w:r>
+        <w:t xml:space="preserve">While frequentist meta-analysis has been a conventional approach in environmental epidemiology, Bayesian meta-analysis provides a coherent framework for uncertainty quantification through posterior distributions that inherently incorporate both within-study and between-study variability</w:t>
+      </w:r>
+      <w:r>
+        <w:t xml:space="preserve"> </w:t>
+      </w:r>
+      <w:r>
+        <w:t xml:space="preserve">(29)</w:t>
+      </w:r>
+      <w:r>
+        <w:t xml:space="preserve">.</w:t>
+      </w:r>
+      <w:r>
+        <w:t xml:space="preserve"> </w:t>
+      </w:r>
+      <w:r>
+        <w:t xml:space="preserve">Unlike frequentist confidence intervals, which are often misinterpreted as probabilistic</w:t>
+      </w:r>
+      <w:r>
+        <w:t xml:space="preserve"> </w:t>
+      </w:r>
+      <w:r>
+        <w:t xml:space="preserve">(30)</w:t>
+      </w:r>
+      <w:r>
+        <w:t xml:space="preserve">, Bayesian credible intervals directly represent the probability distribution of the parameter of interest, facilitating transparent communication of uncertainty.</w:t>
+      </w:r>
+      <w:r>
+        <w:t xml:space="preserve"> </w:t>
+      </w:r>
+      <w:r>
+        <w:t xml:space="preserve">Furthermore, Bayesian posterior distributions can be directly propagated into probabilistic burden of disease and risk assessments, providing seamless integration with probabilistic frameworks in public health decision-making.</w:t>
+      </w:r>
+      <w:r>
+        <w:t xml:space="preserve"> </w:t>
+      </w:r>
+      <w:r>
+        <w:t xml:space="preserve">By comparing frequentist and Bayesian approaches, we will explore how inferential framework and uncertainty quantification influence exposure-response estimates and their application.</w:t>
+      </w:r>
+    </w:p>
+    <w:p>
+      <w:pPr>
+        <w:pStyle w:val="BodyText"/>
+      </w:pPr>
+      <w:r>
+        <w:t xml:space="preserve">The aim of this study is twofold: first, to synthesize and quantitatively pool available epidemiological findings on the association between blood lead levels and IQ scores in children; and second, to conduct both a frequentist and Bayesian meta-analyses, comparing how these analytical frameworks influence exposure-response estimates, uncertainty characterization, and applicability to burden of disease and risk assessment.</w:t>
+      </w:r>
+    </w:p>
+    <w:bookmarkEnd w:id="27"/>
+    <w:bookmarkStart w:id="43" w:name="methods"/>
+    <w:p>
+      <w:pPr>
+        <w:pStyle w:val="Heading1"/>
+      </w:pPr>
+      <w:r>
+        <w:t xml:space="preserve">2. Methods</w:t>
       </w:r>
     </w:p>
     <w:p>
@@ -166,7 +631,7 @@
         </w:numPr>
       </w:pPr>
       <w:r>
-        <w:t xml:space="preserve">Intro: Lead, health effects, burden of disease</w:t>
+        <w:t xml:space="preserve">Overview: systematic review and meta-analysis, comparing a frequentist to a Bayesian approach</w:t>
       </w:r>
     </w:p>
     <w:p>
@@ -178,7 +643,7 @@
         </w:numPr>
       </w:pPr>
       <w:r>
-        <w:t xml:space="preserve">Currently used ERFs</w:t>
+        <w:t xml:space="preserve">Inclusion &amp; exclusion criteria, databases, search strategy, screening process</w:t>
       </w:r>
     </w:p>
     <w:p>
@@ -190,7 +655,7 @@
         </w:numPr>
       </w:pPr>
       <w:r>
-        <w:t xml:space="preserve">Rationale for methodological comparison (BMA - FMA)</w:t>
+        <w:t xml:space="preserve">Risk of bias analysis method</w:t>
       </w:r>
     </w:p>
     <w:p>
@@ -202,406 +667,7 @@
         </w:numPr>
       </w:pPr>
       <w:r>
-        <w:t xml:space="preserve">Aim of this study</w:t>
-      </w:r>
-      <w:r>
-        <w:br/>
-      </w:r>
-    </w:p>
-    <w:p>
-      <w:pPr>
-        <w:pStyle w:val="FirstParagraph"/>
-      </w:pPr>
-      <w:r>
-        <w:t xml:space="preserve">Lead (Pb) is a pervasive environmental pollutant originating from anthropogenic and natural sources.</w:t>
-      </w:r>
-      <w:r>
-        <w:t xml:space="preserve"> </w:t>
-      </w:r>
-      <w:r>
-        <w:t xml:space="preserve">Although concentrations have declined globally in past decades following the phase-out of leaded gasoline, lead remains present in the environment and human blood</w:t>
-      </w:r>
-      <w:r>
-        <w:t xml:space="preserve"> </w:t>
-      </w:r>
-      <w:r>
-        <w:t xml:space="preserve">(1,2)</w:t>
-      </w:r>
-      <w:r>
-        <w:t xml:space="preserve">.</w:t>
-      </w:r>
-      <w:r>
-        <w:t xml:space="preserve"> </w:t>
-      </w:r>
-      <w:r>
-        <w:t xml:space="preserve">In Europe, primary exposure sources include dietary products, drinking water, and indoor dust</w:t>
-      </w:r>
-      <w:r>
-        <w:t xml:space="preserve"> </w:t>
-      </w:r>
-      <w:r>
-        <w:t xml:space="preserve">(3,4)</w:t>
-      </w:r>
-      <w:r>
-        <w:t xml:space="preserve">.</w:t>
-      </w:r>
-      <w:r>
-        <w:t xml:space="preserve"> </w:t>
-      </w:r>
-      <w:r>
-        <w:t xml:space="preserve">The most recent Global Burden of Disease Study estimated that in 2023, 3.4 million (95% Uncertainty Interval (UI): 2.7; 4.0 million) Disability-Adjusted Life Years (DALYs) were attributable to lead exposure in the European Union (EU)</w:t>
-      </w:r>
-      <w:r>
-        <w:t xml:space="preserve"> </w:t>
-      </w:r>
-      <w:r>
-        <w:t xml:space="preserve">(5)</w:t>
-      </w:r>
-      <w:r>
-        <w:t xml:space="preserve">.</w:t>
-      </w:r>
-      <w:r>
-        <w:t xml:space="preserve"> </w:t>
-      </w:r>
-      <w:r>
-        <w:t xml:space="preserve">This highlights the continued public health significance even of low-level exposure.</w:t>
-      </w:r>
-    </w:p>
-    <w:p>
-      <w:pPr>
-        <w:pStyle w:val="BodyText"/>
-      </w:pPr>
-      <w:r>
-        <w:t xml:space="preserve">Lead exposure is associated with multiple adverse health outcomes across the human life course, including</w:t>
-      </w:r>
-      <w:r>
-        <w:t xml:space="preserve"> </w:t>
-      </w:r>
-      <w:r>
-        <w:t xml:space="preserve">decreased kidney function</w:t>
-      </w:r>
-      <w:r>
-        <w:t xml:space="preserve"> </w:t>
-      </w:r>
-      <w:r>
-        <w:t xml:space="preserve">(6)</w:t>
-      </w:r>
-      <w:r>
-        <w:t xml:space="preserve">,</w:t>
-      </w:r>
-      <w:r>
-        <w:t xml:space="preserve"> </w:t>
-      </w:r>
-      <w:r>
-        <w:t xml:space="preserve">liver disease</w:t>
-      </w:r>
-      <w:r>
-        <w:t xml:space="preserve"> </w:t>
-      </w:r>
-      <w:r>
-        <w:t xml:space="preserve">(7)</w:t>
-      </w:r>
-      <w:r>
-        <w:t xml:space="preserve">,</w:t>
-      </w:r>
-      <w:r>
-        <w:t xml:space="preserve"> </w:t>
-      </w:r>
-      <w:r>
-        <w:t xml:space="preserve">coronary artery atherosclerosis</w:t>
-      </w:r>
-      <w:r>
-        <w:t xml:space="preserve"> </w:t>
-      </w:r>
-      <w:r>
-        <w:t xml:space="preserve">(8)</w:t>
-      </w:r>
-      <w:r>
-        <w:t xml:space="preserve">,</w:t>
-      </w:r>
-      <w:r>
-        <w:t xml:space="preserve"> </w:t>
-      </w:r>
-      <w:r>
-        <w:t xml:space="preserve">cardiovascular mortality</w:t>
-      </w:r>
-      <w:r>
-        <w:t xml:space="preserve"> </w:t>
-      </w:r>
-      <w:r>
-        <w:t xml:space="preserve">(9)</w:t>
-      </w:r>
-      <w:r>
-        <w:t xml:space="preserve">,</w:t>
-      </w:r>
-      <w:r>
-        <w:t xml:space="preserve"> </w:t>
-      </w:r>
-      <w:r>
-        <w:t xml:space="preserve">infertility in women</w:t>
-      </w:r>
-      <w:r>
-        <w:t xml:space="preserve"> </w:t>
-      </w:r>
-      <w:r>
-        <w:t xml:space="preserve">(10)</w:t>
-      </w:r>
-      <w:r>
-        <w:t xml:space="preserve">,</w:t>
-      </w:r>
-      <w:r>
-        <w:t xml:space="preserve"> </w:t>
-      </w:r>
-      <w:r>
-        <w:t xml:space="preserve">attention-deficit/hyperactivity disorder in children</w:t>
-      </w:r>
-      <w:r>
-        <w:t xml:space="preserve"> </w:t>
-      </w:r>
-      <w:r>
-        <w:t xml:space="preserve">(11)</w:t>
-      </w:r>
-      <w:r>
-        <w:t xml:space="preserve">, and</w:t>
-      </w:r>
-      <w:r>
-        <w:t xml:space="preserve"> </w:t>
-      </w:r>
-      <w:r>
-        <w:t xml:space="preserve">antisocial behavior</w:t>
-      </w:r>
-      <w:r>
-        <w:t xml:space="preserve"> </w:t>
-      </w:r>
-      <w:r>
-        <w:t xml:space="preserve">(12)</w:t>
-      </w:r>
-      <w:r>
-        <w:t xml:space="preserve">.</w:t>
-      </w:r>
-      <w:r>
-        <w:t xml:space="preserve"> </w:t>
-      </w:r>
-      <w:r>
-        <w:t xml:space="preserve">Among these endpoints, impaired cognitive development in children — manifested as reduced IQ scores —</w:t>
-      </w:r>
-      <w:r>
-        <w:t xml:space="preserve"> </w:t>
-      </w:r>
-      <w:r>
-        <w:t xml:space="preserve">(13–16)</w:t>
-      </w:r>
-      <w:r>
-        <w:t xml:space="preserve"> </w:t>
-      </w:r>
-      <w:r>
-        <w:t xml:space="preserve">represents a particularly critical endpoint for public health policy.</w:t>
-      </w:r>
-      <w:r>
-        <w:t xml:space="preserve"> </w:t>
-      </w:r>
-      <w:r>
-        <w:t xml:space="preserve">Children are especially vulnerable to lead’s neurotoxic effects due to their developing nervous systems and relatively high exposure per body mass.</w:t>
-      </w:r>
-      <w:r>
-        <w:t xml:space="preserve"> </w:t>
-      </w:r>
-      <w:r>
-        <w:t xml:space="preserve">Because lead-associated IQ decrements are irreversible and persist throughout life, they lead to substantial and enduring societal costs</w:t>
-      </w:r>
-      <w:r>
-        <w:t xml:space="preserve"> </w:t>
-      </w:r>
-      <w:r>
-        <w:t xml:space="preserve">(17)</w:t>
-      </w:r>
-      <w:r>
-        <w:t xml:space="preserve">, making continued efforts to accurately characterize the exposure-response relationship important for evidence-based policy.</w:t>
-      </w:r>
-    </w:p>
-    <w:p>
-      <w:pPr>
-        <w:pStyle w:val="BodyText"/>
-      </w:pPr>
-      <w:r>
-        <w:t xml:space="preserve">Contemporary blood lead levels (BLL) in the EU have declined markedly and now predominantly fall below 5 µg/dL (</w:t>
-      </w:r>
-      <w:hyperlink r:id="rId25">
-        <w:r>
-          <w:rPr>
-            <w:rStyle w:val="Hyperlink"/>
-          </w:rPr>
-          <w:t xml:space="preserve">HBM4EU Dashboard</w:t>
-        </w:r>
-      </w:hyperlink>
-      <w:r>
-        <w:t xml:space="preserve">), well below the concentrations examined in many earlier studies (&lt;10 µg/dL).</w:t>
-      </w:r>
-      <w:r>
-        <w:t xml:space="preserve"> </w:t>
-      </w:r>
-      <w:r>
-        <w:t xml:space="preserve">Importantly, there is no evidence for a threshold concentration below which the effects of lead on the IQ can be assumed to be negligible</w:t>
-      </w:r>
-      <w:r>
-        <w:t xml:space="preserve"> </w:t>
-      </w:r>
-      <w:r>
-        <w:t xml:space="preserve">(18,19)</w:t>
-      </w:r>
-      <w:r>
-        <w:t xml:space="preserve">.</w:t>
-      </w:r>
-      <w:r>
-        <w:t xml:space="preserve"> </w:t>
-      </w:r>
-      <w:r>
-        <w:t xml:space="preserve">There is evidence for a supralinear exposure-response relationship with steeper IQ decrements per unit increase in BLL at low concentrations compared to higher concentration ranges</w:t>
-      </w:r>
-      <w:r>
-        <w:t xml:space="preserve"> </w:t>
-      </w:r>
-      <w:r>
-        <w:t xml:space="preserve">(16,20)</w:t>
-      </w:r>
-      <w:r>
-        <w:t xml:space="preserve">.</w:t>
-      </w:r>
-      <w:r>
-        <w:t xml:space="preserve"> </w:t>
-      </w:r>
-      <w:r>
-        <w:t xml:space="preserve">These findings highlight the need for an updated quantitative synthesis that reflects both recent epidemiological evidence and the lower exposure range now predominant in European populations, incorporating recent data to inform risk assessment at currently relevant exposure levels.</w:t>
-      </w:r>
-    </w:p>
-    <w:p>
-      <w:pPr>
-        <w:pStyle w:val="BodyText"/>
-      </w:pPr>
-      <w:r>
-        <w:t xml:space="preserve">Existing burden of disease assessments at national and global scales</w:t>
-      </w:r>
-      <w:r>
-        <w:t xml:space="preserve"> </w:t>
-      </w:r>
-      <w:r>
-        <w:t xml:space="preserve">(5,17,21–23)</w:t>
-      </w:r>
-      <w:r>
-        <w:t xml:space="preserve"> </w:t>
-      </w:r>
-      <w:r>
-        <w:t xml:space="preserve">rely predominantly on two foundational studies: a pooled analysis of seven cohort-studies by Lanphear et al. (2005) or the subsequent re-analysis by Crump et al. (2013)</w:t>
-      </w:r>
-      <w:r>
-        <w:t xml:space="preserve"> </w:t>
-      </w:r>
-      <w:r>
-        <w:t xml:space="preserve">(16,24)</w:t>
-      </w:r>
-      <w:r>
-        <w:t xml:space="preserve">.</w:t>
-      </w:r>
-      <w:r>
-        <w:t xml:space="preserve"> </w:t>
-      </w:r>
-      <w:r>
-        <w:t xml:space="preserve">While these landmark studies have substantially shaped research and policy on childhood lead exposure, methodological issues and errors in the Lanphear et al. 2005 article have been raised</w:t>
-      </w:r>
-      <w:r>
-        <w:t xml:space="preserve"> </w:t>
-      </w:r>
-      <w:r>
-        <w:t xml:space="preserve">(24,25)</w:t>
-      </w:r>
-      <w:r>
-        <w:t xml:space="preserve"> </w:t>
-      </w:r>
-      <w:r>
-        <w:t xml:space="preserve">and the stepwise backward-elimination regression approach used by Crump et al. (2013), which is central to their findings, has received substantial criticism</w:t>
-      </w:r>
-      <w:r>
-        <w:t xml:space="preserve"> </w:t>
-      </w:r>
-      <w:r>
-        <w:t xml:space="preserve">(26–28)</w:t>
-      </w:r>
-      <w:r>
-        <w:t xml:space="preserve">.</w:t>
-      </w:r>
-      <w:r>
-        <w:t xml:space="preserve"> </w:t>
-      </w:r>
-      <w:r>
-        <w:t xml:space="preserve">These limitations, combined with the availability of more recent epidemiological data, underscore the need not only for an updated evidence synthesis but also for methodologically robust approaches that can provide reliable exposure-response estimates for burden of disease and risk assessments.</w:t>
-      </w:r>
-    </w:p>
-    <w:p>
-      <w:pPr>
-        <w:pStyle w:val="BodyText"/>
-      </w:pPr>
-      <w:r>
-        <w:t xml:space="preserve">Methodological advances in meta-analysis offer an opportunity to enhance the utility of synthesized estimates for burden of disease and risk assessment applications.</w:t>
-      </w:r>
-      <w:r>
-        <w:t xml:space="preserve"> </w:t>
-      </w:r>
-      <w:r>
-        <w:t xml:space="preserve">While frequentist meta-analysis has been a conventional approach in environmental epidemiology, Bayesian meta-analysis provides a coherent framework for uncertainty quantification through posterior distributions that inherently incorporate both within-study and between-study variability</w:t>
-      </w:r>
-      <w:r>
-        <w:t xml:space="preserve"> </w:t>
-      </w:r>
-      <w:r>
-        <w:t xml:space="preserve">(29)</w:t>
-      </w:r>
-      <w:r>
-        <w:t xml:space="preserve">.</w:t>
-      </w:r>
-      <w:r>
-        <w:t xml:space="preserve"> </w:t>
-      </w:r>
-      <w:r>
-        <w:t xml:space="preserve">Unlike frequentist confidence intervals, which are often misinterpreted as probabilistic</w:t>
-      </w:r>
-      <w:r>
-        <w:t xml:space="preserve"> </w:t>
-      </w:r>
-      <w:r>
-        <w:t xml:space="preserve">(30)</w:t>
-      </w:r>
-      <w:r>
-        <w:t xml:space="preserve">, Bayesian credible intervals directly represent the probability distribution of the parameter of interest, facilitating transparent communication of uncertainty.</w:t>
-      </w:r>
-      <w:r>
-        <w:t xml:space="preserve"> </w:t>
-      </w:r>
-      <w:r>
-        <w:t xml:space="preserve">Furthermore, Bayesian posterior distributions can be directly propagated into probabilistic burden of disease and risk assessments, providing seamless integration with probabilistic frameworks in public health decision-making.</w:t>
-      </w:r>
-      <w:r>
-        <w:t xml:space="preserve"> </w:t>
-      </w:r>
-      <w:r>
-        <w:t xml:space="preserve">By comparing frequentist and Bayesian approaches, we will explore how inferential framework and uncertainty quantification influence exposure-response estimates and their application.</w:t>
-      </w:r>
-    </w:p>
-    <w:p>
-      <w:pPr>
-        <w:pStyle w:val="BodyText"/>
-      </w:pPr>
-      <w:r>
-        <w:t xml:space="preserve">The aim of this study is twofold: first, to synthesize and quantitatively pool available epidemiological findings on the association between blood lead levels and IQ scores in children; and second, to conduct both a frequentist and Bayesian meta-analyses, comparing how these analytical frameworks influence exposure-response estimates, uncertainty characterization, and applicability to burden of disease and risk assessment.</w:t>
-      </w:r>
-    </w:p>
-    <w:bookmarkEnd w:id="26"/>
-    <w:bookmarkStart w:id="42" w:name="methods"/>
-    <w:p>
-      <w:pPr>
-        <w:pStyle w:val="Heading1"/>
-      </w:pPr>
-      <w:r>
-        <w:t xml:space="preserve">2. Methods</w:t>
+        <w:t xml:space="preserve">Description &amp; rationale of harmonization of reported effect measures</w:t>
       </w:r>
     </w:p>
     <w:p>
@@ -613,7 +679,23 @@
         </w:numPr>
       </w:pPr>
       <w:r>
-        <w:t xml:space="preserve">Overview: systematic review and meta-analysis, comparing a frequentist to a Bayesian approach</w:t>
+        <w:t xml:space="preserve">Description of meta-analysis methodology (frequentist &amp; Bayesian), models and software used,</w:t>
+      </w:r>
+      <w:r>
+        <w:t xml:space="preserve"> </w:t>
+      </w:r>
+      <w:r>
+        <w:rPr>
+          <w:b/>
+          <w:bCs/>
+        </w:rPr>
+        <w:t xml:space="preserve">heterogeneity</w:t>
+      </w:r>
+      <w:r>
+        <w:t xml:space="preserve"> </w:t>
+      </w:r>
+      <w:r>
+        <w:t xml:space="preserve">identification, prior choice</w:t>
       </w:r>
     </w:p>
     <w:p>
@@ -625,61 +707,13 @@
         </w:numPr>
       </w:pPr>
       <w:r>
-        <w:t xml:space="preserve">Inclusion &amp; exclusion criteria, databases, search strategy, screening process</w:t>
-      </w:r>
-    </w:p>
-    <w:p>
-      <w:pPr>
-        <w:pStyle w:val="Compact"/>
-        <w:numPr>
-          <w:ilvl w:val="0"/>
-          <w:numId w:val="1008"/>
-        </w:numPr>
-      </w:pPr>
-      <w:r>
-        <w:t xml:space="preserve">Risk of bias analysis method</w:t>
-      </w:r>
-    </w:p>
-    <w:p>
-      <w:pPr>
-        <w:pStyle w:val="Compact"/>
-        <w:numPr>
-          <w:ilvl w:val="0"/>
-          <w:numId w:val="1009"/>
-        </w:numPr>
-      </w:pPr>
-      <w:r>
-        <w:t xml:space="preserve">Description &amp; rationale of harmonization of reported effect measures</w:t>
-      </w:r>
-    </w:p>
-    <w:p>
-      <w:pPr>
-        <w:pStyle w:val="Compact"/>
-        <w:numPr>
-          <w:ilvl w:val="0"/>
-          <w:numId w:val="1010"/>
-        </w:numPr>
-      </w:pPr>
-      <w:r>
-        <w:t xml:space="preserve">Description of meta-analysis methodology (frequentist &amp; Bayesian), models and software used, heterogeneity identification</w:t>
-      </w:r>
-    </w:p>
-    <w:p>
-      <w:pPr>
-        <w:pStyle w:val="Compact"/>
-        <w:numPr>
-          <w:ilvl w:val="0"/>
-          <w:numId w:val="1011"/>
-        </w:numPr>
-      </w:pPr>
-      <w:r>
         <w:t xml:space="preserve">Sensitivity analysis</w:t>
       </w:r>
       <w:r>
         <w:br/>
       </w:r>
     </w:p>
-    <w:bookmarkStart w:id="28" w:name="literature-review"/>
+    <w:bookmarkStart w:id="29" w:name="literature-review"/>
     <w:p>
       <w:pPr>
         <w:pStyle w:val="Heading2"/>
@@ -734,30 +768,55 @@
         <w:pStyle w:val="BodyText"/>
       </w:pPr>
       <w:r>
-        <w:t xml:space="preserve">We conducted a literature review to identify recent studies investigating associations between prenatal or postnatal exposure to Pb and IQ loss in children.</w:t>
-      </w:r>
-      <w:r>
-        <w:t xml:space="preserve"> </w:t>
-      </w:r>
-      <w:r>
-        <w:t xml:space="preserve">This study was conducted wothin the EU-funded project Partnership for the Assessment of Risks from Chemicals (</w:t>
-      </w:r>
-      <w:hyperlink r:id="rId27">
-        <w:r>
-          <w:rPr>
-            <w:rStyle w:val="Hyperlink"/>
+        <w:t xml:space="preserve">We conducted a literature review to identify published studies investigating the association between postnatal (concurrent) exposure to Pb and IQ loss in children.</w:t>
+      </w:r>
+      <w:r>
+        <w:t xml:space="preserve"> </w:t>
+      </w:r>
+      <w:r>
+        <w:t xml:space="preserve">This study was conducted within the EU-funded project</w:t>
+      </w:r>
+      <w:r>
+        <w:t xml:space="preserve"> </w:t>
+      </w:r>
+      <w:r>
+        <w:rPr>
+          <w:i/>
+          <w:iCs/>
+        </w:rPr>
+        <w:t xml:space="preserve">Partnership for the Assessment of Risks from Chemicals (</w:t>
+      </w:r>
+      <w:hyperlink r:id="rId28">
+        <w:r>
+          <w:rPr>
+            <w:rStyle w:val="Hyperlink"/>
+            <w:i/>
+            <w:iCs/>
           </w:rPr>
           <w:t xml:space="preserve">PARC</w:t>
         </w:r>
       </w:hyperlink>
       <w:r>
-        <w:t xml:space="preserve">), and the literature review was conducted as the basis for multiple studies, including one on the association of (methyl)mercury and lead on IQ loss for different exposure timeframes.</w:t>
-      </w:r>
-      <w:r>
-        <w:t xml:space="preserve"> </w:t>
-      </w:r>
-      <w:r>
-        <w:t xml:space="preserve">Here, we will only report results for the literature we identified on concurrent lead exposure and IQ loss, but the flowcharts and supplementary material documenting the literature review does contain parts of the search for other associations and exposure timeframes.</w:t>
+        <w:rPr>
+          <w:i/>
+          <w:iCs/>
+        </w:rPr>
+        <w:t xml:space="preserve">)</w:t>
+      </w:r>
+      <w:r>
+        <w:t xml:space="preserve">.</w:t>
+      </w:r>
+      <w:r>
+        <w:t xml:space="preserve"> </w:t>
+      </w:r>
+      <w:r>
+        <w:t xml:space="preserve">The literature review presented here was used in multiple studies within PARC, including one on the association of (methyl)mercury and lead on IQ loss for multiple exposure timeframes.</w:t>
+      </w:r>
+      <w:r>
+        <w:t xml:space="preserve"> </w:t>
+      </w:r>
+      <w:r>
+        <w:t xml:space="preserve">Here, we will only report results for concurrent lead exposure and IQ loss, but the figures and tables documenting the literature review do contain parts of the search for other associations and exposure timeframes.</w:t>
       </w:r>
       <w:r>
         <w:br/>
@@ -769,7 +828,7 @@
         <w:t xml:space="preserve"> </w:t>
       </w:r>
       <w:r>
-        <w:t xml:space="preserve">We only considered studies published after 2005, as the previously-used ERFs in the literature were published before 2005</w:t>
+        <w:t xml:space="preserve">The year 2005 was chosen because, as described in the background section, burden of disease studies predominantely used a study published in 2005</w:t>
       </w:r>
       <w:r>
         <w:t xml:space="preserve"> </w:t>
@@ -781,13 +840,13 @@
         <w:t xml:space="preserve"> </w:t>
       </w:r>
       <w:r>
-        <w:t xml:space="preserve">and we aimed at finding updated studies on the association.</w:t>
-      </w:r>
-      <w:r>
-        <w:t xml:space="preserve"> </w:t>
-      </w:r>
-      <w:r>
-        <w:t xml:space="preserve">Also, as described in the backround section, lead concentrations have decreased significantly in the past decades and we aimed at identifying epidemiological studies conducted in populations with currently relevant exposure levels.</w:t>
+        <w:t xml:space="preserve">and we aimed at updating the evidence base with recently published studies.</w:t>
+      </w:r>
+      <w:r>
+        <w:t xml:space="preserve"> </w:t>
+      </w:r>
+      <w:r>
+        <w:t xml:space="preserve">Also, lead concentrations have decreased significantly in the past decades and we aimed at identifying epidemiological studies conducted in populations with currently relevant exposure levels.</w:t>
       </w:r>
       <w:r>
         <w:br/>
@@ -805,67 +864,79 @@
         <w:t xml:space="preserve"> </w:t>
       </w:r>
       <w:r>
-        <w:t xml:space="preserve">We prioritized references naming the substance in the title in order to decrease the volume of results.</w:t>
+        <w:t xml:space="preserve"> </w:t>
+      </w:r>
+      <w:r>
+        <w:t xml:space="preserve">All titles and abstracts were screened by two reviewers.</w:t>
+      </w:r>
+      <w:r>
+        <w:t xml:space="preserve"> </w:t>
+      </w:r>
+      <w:r>
+        <w:t xml:space="preserve">Any conflicts were resolved by a third person.</w:t>
+      </w:r>
+      <w:r>
+        <w:t xml:space="preserve"> </w:t>
+      </w:r>
+      <w:r>
+        <w:t xml:space="preserve">Full text was then assessed by one reviewer.</w:t>
+      </w:r>
+      <w:r>
+        <w:t xml:space="preserve"> </w:t>
+      </w:r>
+      <w:r>
+        <w:t xml:space="preserve">Publications were considered relevant according to predefined PECOTS – Population (children aged 0 to 11), Exposure (biological measures of Pb from all matrices), Comparator (no exposure or lower levels of exposure), Outcome (IQ), Timing of exposure (no restriction) and Setting (no restriction) (Table 2).</w:t>
+      </w:r>
+      <w:r>
+        <w:t xml:space="preserve"> </w:t>
+      </w:r>
+      <w:r>
+        <w:t xml:space="preserve">We excluded reviews and background articles that inventoried the literature with no new results.</w:t>
+      </w:r>
+      <w:r>
+        <w:t xml:space="preserve"> </w:t>
+      </w:r>
+      <w:r>
+        <w:t xml:space="preserve">We also excluded references written in languages other than English.</w:t>
       </w:r>
       <w:r>
         <w:br/>
       </w:r>
       <w:r>
-        <w:t xml:space="preserve">All titles and abstracts were screened by two reviewers.</w:t>
-      </w:r>
-      <w:r>
-        <w:t xml:space="preserve"> </w:t>
-      </w:r>
-      <w:r>
-        <w:t xml:space="preserve">Any conflicts were resolved by a third person.</w:t>
-      </w:r>
-      <w:r>
-        <w:t xml:space="preserve"> </w:t>
-      </w:r>
-      <w:r>
-        <w:t xml:space="preserve">Full text was then assessed by one reviewer.</w:t>
-      </w:r>
-      <w:r>
-        <w:t xml:space="preserve"> </w:t>
-      </w:r>
-      <w:r>
-        <w:t xml:space="preserve">Publications were considered relevant according to predefined PECOTS – Population (children aged 0 to 11 and , pregnant women and women of childbearing age), Exposure (biological measures of Pb, MeHg or Hg from all matrices), Comparator (no exposure or lower levels of exposure), Outcome (IQ or similar indicator), Timing of exposure (no restriction) and Setting (no restriction) (Table 2).</w:t>
-      </w:r>
-      <w:r>
-        <w:t xml:space="preserve"> </w:t>
-      </w:r>
-      <w:r>
-        <w:t xml:space="preserve">We excluded reviews and background articles that inventoried the literature with no new results.</w:t>
-      </w:r>
-      <w:r>
-        <w:t xml:space="preserve"> </w:t>
-      </w:r>
-      <w:r>
-        <w:t xml:space="preserve">We also excluded references written in languages other than English.</w:t>
-      </w:r>
-      <w:r>
-        <w:br/>
-      </w:r>
-      <w:r>
-        <w:t xml:space="preserve">From the publications considered relevant after the two-round screening, we collected several descriptive key data from these papers using a grid based on the one proposed by NTP OHAT (2015).</w:t>
-      </w:r>
-    </w:p>
-    <w:bookmarkEnd w:id="28"/>
-    <w:bookmarkStart w:id="29" w:name="data-extraction"/>
-    <w:p>
-      <w:pPr>
-        <w:pStyle w:val="Heading2"/>
-      </w:pPr>
-      <w:r>
-        <w:t xml:space="preserve">2.2 Data Extraction</w:t>
-      </w:r>
-    </w:p>
-    <w:p>
-      <w:pPr>
-        <w:pStyle w:val="FirstParagraph"/>
-      </w:pPr>
-      <w:r>
-        <w:t xml:space="preserve">For all studies, adjusted effect estimates were extracted and the set of confounders adjused for recorded.</w:t>
+        <w:t xml:space="preserve">As described above, the literature review was conducted with as the basis for multiple studies and thus had a larger scope.</w:t>
+      </w:r>
+      <w:r>
+        <w:t xml:space="preserve"> </w:t>
+      </w:r>
+      <w:r>
+        <w:t xml:space="preserve">For this study, only studies that used a continuous, log-transformed BLL scale were included, so that effect estimates could be harmonized.</w:t>
+      </w:r>
+      <w:r>
+        <w:t xml:space="preserve"> </w:t>
+      </w:r>
+      <w:r>
+        <w:t xml:space="preserve">The exposure timeframe for this study was restricted to concurrent, meaning that IQ and BLL measurement must be conducted at the same time.</w:t>
+      </w:r>
+      <w:r>
+        <w:t xml:space="preserve"> </w:t>
+      </w:r>
+      <w:r>
+        <w:t xml:space="preserve">Descriptive study data was extracted using a grid based on the one proposed by NTP OHAT</w:t>
+      </w:r>
+      <w:r>
+        <w:t xml:space="preserve"> </w:t>
+      </w:r>
+      <w:r>
+        <w:t xml:space="preserve">(33)</w:t>
+      </w:r>
+      <w:r>
+        <w:t xml:space="preserve">.</w:t>
+      </w:r>
+      <w:r>
+        <w:t xml:space="preserve"> </w:t>
+      </w:r>
+      <w:r>
+        <w:t xml:space="preserve">For all included studies, effect estimates from the most-adjusted model were extracted and the set of confounders adjused for recorded.</w:t>
       </w:r>
     </w:p>
     <w:bookmarkEnd w:id="29"/>
@@ -875,7 +946,7 @@
         <w:pStyle w:val="Heading2"/>
       </w:pPr>
       <w:r>
-        <w:t xml:space="preserve">2.3 Risk of Bias Assessment</w:t>
+        <w:t xml:space="preserve">2.2 Risk of Bias Assessment</w:t>
       </w:r>
     </w:p>
     <w:p>
@@ -889,7 +960,7 @@
         <w:t xml:space="preserve"> </w:t>
       </w:r>
       <w:r>
-        <w:t xml:space="preserve">(33)</w:t>
+        <w:t xml:space="preserve">(34)</w:t>
       </w:r>
       <w:r>
         <w:t xml:space="preserve">.</w:t>
@@ -904,19 +975,19 @@
         <w:t xml:space="preserve"> </w:t>
       </w:r>
       <w:r>
-        <w:t xml:space="preserve">In total, 15 items were evaluated for each study.‚</w:t>
-      </w:r>
-      <w:r>
-        <w:t xml:space="preserve"> </w:t>
-      </w:r>
-      <w:r>
-        <w:t xml:space="preserve">The overall RoB for each individual study was then categorized by one researcher as either low, moderate or high, following two different summary metrics of the RoB tool (for more information, see</w:t>
-      </w:r>
-      <w:r>
-        <w:t xml:space="preserve"> </w:t>
-      </w:r>
-      <w:r>
-        <w:t xml:space="preserve">(33)</w:t>
+        <w:t xml:space="preserve">In total, 15 items were evaluated for each study.</w:t>
+      </w:r>
+      <w:r>
+        <w:t xml:space="preserve"> </w:t>
+      </w:r>
+      <w:r>
+        <w:t xml:space="preserve">The overall RoB for each individual study was then categorized by one researcher as either low, moderate or high, following two different summary metrics provided by the RoB tool (for more information, see</w:t>
+      </w:r>
+      <w:r>
+        <w:t xml:space="preserve"> </w:t>
+      </w:r>
+      <w:r>
+        <w:t xml:space="preserve">(34)</w:t>
       </w:r>
       <w:r>
         <w:t xml:space="preserve">).</w:t>
@@ -959,7 +1030,7 @@
         <w:pStyle w:val="Heading2"/>
       </w:pPr>
       <w:r>
-        <w:t xml:space="preserve">2.4 Harmonization of Effect Estimates</w:t>
+        <w:t xml:space="preserve">2.3 Harmonization of Effect Estimates</w:t>
       </w:r>
     </w:p>
     <w:p>
@@ -967,7 +1038,7 @@
         <w:pStyle w:val="FirstParagraph"/>
       </w:pPr>
       <w:r>
-        <w:t xml:space="preserve">Studies investigating the association between lead exposure and childhood IQ have made different assumptions regarding the shape of the exposure-response relationship.</w:t>
+        <w:t xml:space="preserve">Studies investigating the association between lead exposure and IQ in children have made different assumptions regarding the shape of the exposure-response relationship.</w:t>
       </w:r>
       <w:r>
         <w:t xml:space="preserve"> </w:t>
@@ -979,10 +1050,10 @@
         <w:t xml:space="preserve"> </w:t>
       </w:r>
       <w:r>
-        <w:t xml:space="preserve">(34,35)</w:t>
-      </w:r>
-      <w:r>
-        <w:t xml:space="preserve">, this assumption may only be valid at very low concentration ranges</w:t>
+        <w:t xml:space="preserve">(35,36)</w:t>
+      </w:r>
+      <w:r>
+        <w:t xml:space="preserve">, this assumption may only be valid at very low concentrations</w:t>
       </w:r>
       <w:r>
         <w:t xml:space="preserve"> </w:t>
@@ -1003,7 +1074,7 @@
         <w:t xml:space="preserve"> </w:t>
       </w:r>
       <w:r>
-        <w:t xml:space="preserve">(24,36)</w:t>
+        <w:t xml:space="preserve">(24,37)</w:t>
       </w:r>
       <w:r>
         <w:t xml:space="preserve">.</w:t>
@@ -1211,7 +1282,7 @@
         <w:pStyle w:val="BodyText"/>
       </w:pPr>
       <w:r>
-        <w:t xml:space="preserve">Studies have used different logarithmic bases: the natural logarithm (</w:t>
+        <w:t xml:space="preserve">In the literature, different logarithmic bases are used to transform BLL: the natural logarithm (</w:t>
       </w:r>
       <m:oMath>
         <m:sSub>
@@ -1277,38 +1348,35 @@
         </m:sSub>
       </m:oMath>
       <w:r>
-        <w:t xml:space="preserve">) using the standardization framework proposed by Rodríguez-Barranco et al. (2017)</w:t>
-      </w:r>
-      <w:r>
-        <w:t xml:space="preserve"> </w:t>
-      </w:r>
-      <w:r>
-        <w:t xml:space="preserve">(37)</w:t>
-      </w:r>
-      <w:r>
-        <w:t xml:space="preserve">.</w:t>
-      </w:r>
-      <w:r>
-        <w:t xml:space="preserve"> </w:t>
-      </w:r>
-      <w:r>
-        <w:t xml:space="preserve">The transformations are fully documented in suppl. file x</w:t>
+        <w:t xml:space="preserve">).</w:t>
+      </w:r>
+      <w:r>
+        <w:t xml:space="preserve"> </w:t>
+      </w:r>
+      <w:r>
+        <w:t xml:space="preserve">The calculations are documented in suppl. file 1 (Screening documentation excel)</w:t>
       </w:r>
       <w:r>
         <w:br/>
       </w:r>
       <w:r>
-        <w:t xml:space="preserve">Studies that left BLL on the original (untransformed) linear scale were excluded from the meta-analysis, as transformation from linear to log-linear effect estimates could not be justified based on visual inspection (supplement: plots?).</w:t>
+        <w:t xml:space="preserve">In some publications, the BLL scale was left untransformed, so on a linear scale.</w:t>
+      </w:r>
+      <w:r>
+        <w:t xml:space="preserve"> </w:t>
+      </w:r>
+      <w:r>
+        <w:t xml:space="preserve">These were excluded from the meta-analysis, as transformation of effect estimates for linear BLL to log-linear could not be justified based on visual inspection (supplement: plots?).</w:t>
       </w:r>
     </w:p>
     <w:bookmarkEnd w:id="32"/>
-    <w:bookmarkStart w:id="38" w:name="meta-analysis-methodology"/>
+    <w:bookmarkStart w:id="39" w:name="meta-analysis-methodology"/>
     <w:p>
       <w:pPr>
         <w:pStyle w:val="Heading2"/>
       </w:pPr>
       <w:r>
-        <w:t xml:space="preserve">2.5 Meta-Analysis Methodology</w:t>
+        <w:t xml:space="preserve">2.4 Meta-Analysis Methodology</w:t>
       </w:r>
     </w:p>
     <w:p>
@@ -1316,19 +1384,19 @@
         <w:pStyle w:val="FirstParagraph"/>
       </w:pPr>
       <w:r>
-        <w:t xml:space="preserve">In order to quantitatively synthesize the available epidemiological literature on the association of children’s blood lead levels and their IQ, we conducted a meta-analysis of the results, comparing a Bayesian to a frequentist approach.</w:t>
+        <w:t xml:space="preserve">In order to quantitatively synthesize the available epidemiological literature on the association of children’s blood lead levels and IQ, we conducted a meta-analysis of the results, comparing a Bayesian to a frequentist approach.</w:t>
       </w:r>
       <w:r>
         <w:br/>
       </w:r>
       <w:r>
-        <w:t xml:space="preserve">In both approaches, the same studies and effect estimates were included and analogous models were chosen to enable comparison betwen the results.</w:t>
-      </w:r>
-      <w:r>
-        <w:t xml:space="preserve"> </w:t>
-      </w:r>
-      <w:r>
-        <w:t xml:space="preserve">We estimated pooled beta estimates for the absolute loss of IQ points per unit increase in</w:t>
+        <w:t xml:space="preserve">In both approaches, the same effect estimates from the identified publications were included and analogous models were chosen to enable comparison between the results.</w:t>
+      </w:r>
+      <w:r>
+        <w:t xml:space="preserve"> </w:t>
+      </w:r>
+      <w:r>
+        <w:t xml:space="preserve">We estimated pooled effect estimates for the loss of IQ points per continuous unit increase in</w:t>
       </w:r>
       <w:r>
         <w:t xml:space="preserve"> </w:t>
@@ -1357,12 +1425,6 @@
         <w:br/>
       </w:r>
       <w:r>
-        <w:t xml:space="preserve">Within studies, results from the most-adjusted models were chosen to enter the meta-analysis; unadjusted results were not considered.</w:t>
-      </w:r>
-      <w:r>
-        <w:br/>
-      </w:r>
-      <w:r>
         <w:t xml:space="preserve">R version 4.4.2 (2024-10-31)</w:t>
       </w:r>
       <w:r>
@@ -1375,13 +1437,13 @@
         <w:t xml:space="preserve"> </w:t>
       </w:r>
       <w:r>
-        <w:t xml:space="preserve">and Positron version 2026.01.0-147 were used for all computations.</w:t>
-      </w:r>
-      <w:r>
-        <w:t xml:space="preserve"> </w:t>
-      </w:r>
-      <w:r>
-        <w:t xml:space="preserve">All of the computational code for this study is publicly available on</w:t>
+        <w:t xml:space="preserve">was used for all computations.</w:t>
+      </w:r>
+      <w:r>
+        <w:t xml:space="preserve"> </w:t>
+      </w:r>
+      <w:r>
+        <w:t xml:space="preserve">All computational code for this study is publicly available on</w:t>
       </w:r>
       <w:r>
         <w:t xml:space="preserve"> </w:t>
@@ -1398,13 +1460,13 @@
         <w:t xml:space="preserve">.</w:t>
       </w:r>
     </w:p>
-    <w:bookmarkStart w:id="34" w:name="frequentist-meta-analysis"/>
+    <w:bookmarkStart w:id="35" w:name="bayesian-meta-analysis"/>
     <w:p>
       <w:pPr>
         <w:pStyle w:val="Heading3"/>
       </w:pPr>
       <w:r>
-        <w:t xml:space="preserve">2.5.1 Frequentist Meta-Analysis</w:t>
+        <w:t xml:space="preserve">2.4.1 Bayesian Meta-Analysis</w:t>
       </w:r>
     </w:p>
     <w:p>
@@ -1412,55 +1474,7 @@
         <w:pStyle w:val="FirstParagraph"/>
       </w:pPr>
       <w:r>
-        <w:t xml:space="preserve">For the frequentist meta-analysis, we employed a random-effects model using the restricted maximum-likelihood estimation from the R package</w:t>
-      </w:r>
-      <w:r>
-        <w:t xml:space="preserve"> </w:t>
-      </w:r>
-      <w:r>
-        <w:rPr>
-          <w:rStyle w:val="VerbatimChar"/>
-        </w:rPr>
-        <w:t xml:space="preserve">metafor</w:t>
-      </w:r>
-      <w:r>
-        <w:t xml:space="preserve"> </w:t>
-      </w:r>
-      <w:r>
-        <w:t xml:space="preserve">version 4.8-0</w:t>
-      </w:r>
-      <w:r>
-        <w:t xml:space="preserve"> </w:t>
-      </w:r>
-      <w:r>
-        <w:t xml:space="preserve">(39)</w:t>
-      </w:r>
-      <w:r>
-        <w:t xml:space="preserve">.</w:t>
-      </w:r>
-      <w:r>
-        <w:t xml:space="preserve"> </w:t>
-      </w:r>
-      <w:r>
-        <w:t xml:space="preserve">The I² statistic was used as a quantitative indication of heterogeneity.</w:t>
-      </w:r>
-    </w:p>
-    <w:bookmarkEnd w:id="34"/>
-    <w:bookmarkStart w:id="36" w:name="bayesian-meta-analysis"/>
-    <w:p>
-      <w:pPr>
-        <w:pStyle w:val="Heading3"/>
-      </w:pPr>
-      <w:r>
-        <w:t xml:space="preserve">2.5.2 Bayesian Meta-Analysis</w:t>
-      </w:r>
-    </w:p>
-    <w:p>
-      <w:pPr>
-        <w:pStyle w:val="FirstParagraph"/>
-      </w:pPr>
-      <w:r>
-        <w:t xml:space="preserve">To synthesize results across studies, we employed a Bayesian random-effects meta-analysis model with two hierarchical levels.</w:t>
+        <w:t xml:space="preserve">For the Bayesian approach, we employed a random-effects meta-analysis model with two hierarchical levels.</w:t>
       </w:r>
       <w:r>
         <w:t xml:space="preserve"> </w:t>
@@ -1559,7 +1573,7 @@
         <w:t xml:space="preserve"> </w:t>
       </w:r>
       <w:r>
-        <w:t xml:space="preserve">and between-study heterogeneity</w:t>
+        <w:t xml:space="preserve">and between-study standard deviation (heterogeneity)</w:t>
       </w:r>
       <w:r>
         <w:t xml:space="preserve"> </w:t>
@@ -1577,7 +1591,7 @@
       <w:pPr>
         <w:pStyle w:val="BodyText"/>
       </w:pPr>
-      <w:bookmarkStart w:id="35" w:name="eq-model"/>
+      <w:bookmarkStart w:id="34" w:name="eq-model"/>
       <m:oMathPara>
         <m:oMathParaPr>
           <m:jc m:val="center"/>
@@ -1755,7 +1769,7 @@
           </m:d>
         </m:oMath>
       </m:oMathPara>
-      <w:bookmarkEnd w:id="35"/>
+      <w:bookmarkEnd w:id="34"/>
     </w:p>
     <w:p>
       <w:pPr>
@@ -1896,62 +1910,321 @@
         <w:br/>
       </w:r>
     </w:p>
-    <w:bookmarkEnd w:id="36"/>
+    <w:p>
+      <w:pPr>
+        <w:pStyle w:val="BodyText"/>
+      </w:pPr>
+      <w:r>
+        <w:t xml:space="preserve">The Bayesian model was fit using the R package</w:t>
+      </w:r>
+      <w:r>
+        <w:t xml:space="preserve"> </w:t>
+      </w:r>
+      <w:r>
+        <w:rPr>
+          <w:rStyle w:val="VerbatimChar"/>
+        </w:rPr>
+        <w:t xml:space="preserve">brms</w:t>
+      </w:r>
+      <w:r>
+        <w:t xml:space="preserve"> </w:t>
+      </w:r>
+      <w:r>
+        <w:t xml:space="preserve">(39)</w:t>
+      </w:r>
+      <w:r>
+        <w:t xml:space="preserve"> </w:t>
+      </w:r>
+      <w:r>
+        <w:t xml:space="preserve">version 2.22.0.</w:t>
+      </w:r>
+      <w:r>
+        <w:t xml:space="preserve"> </w:t>
+      </w:r>
+      <w:r>
+        <w:t xml:space="preserve">Posterior draws were sampled using the Hamiltonian Monte Carlo algorithm</w:t>
+      </w:r>
+      <w:r>
+        <w:t xml:space="preserve"> </w:t>
+      </w:r>
+      <w:r>
+        <w:t xml:space="preserve">(40)</w:t>
+      </w:r>
+      <w:r>
+        <w:t xml:space="preserve"> </w:t>
+      </w:r>
+      <w:r>
+        <w:t xml:space="preserve">and the No-U-Turn Sampler (NUTS)</w:t>
+      </w:r>
+      <w:r>
+        <w:t xml:space="preserve"> </w:t>
+      </w:r>
+      <w:r>
+        <w:t xml:space="preserve">(41)</w:t>
+      </w:r>
+      <w:r>
+        <w:t xml:space="preserve">.</w:t>
+      </w:r>
+      <w:r>
+        <w:t xml:space="preserve"> </w:t>
+      </w:r>
+      <w:r>
+        <w:t xml:space="preserve">We ran four chains with 4,000 iterations each, of which 2,000 iterations were discarded as warmup, resulting in 8,000 total post-warmup draws.</w:t>
+      </w:r>
+      <w:r>
+        <w:t xml:space="preserve"> </w:t>
+      </w:r>
+      <w:r>
+        <w:t xml:space="preserve">Convergence was assessed using the Gelman-Rubin statistic (</w:t>
+      </w:r>
+      <m:oMath>
+        <m:acc>
+          <m:accPr>
+            <m:chr m:val="̂"/>
+          </m:accPr>
+          <m:e>
+            <m:r>
+              <m:t>R</m:t>
+            </m:r>
+          </m:e>
+        </m:acc>
+      </m:oMath>
+      <w:r>
+        <w:t xml:space="preserve">) and effective sample size (ESS).</w:t>
+      </w:r>
+      <w:r>
+        <w:t xml:space="preserve"> </w:t>
+      </w:r>
+      <w:r>
+        <w:t xml:space="preserve">As shown in</w:t>
+      </w:r>
+      <w:r>
+        <w:t xml:space="preserve"> </w:t>
+      </w:r>
+      <w:hyperlink w:anchor="eq-model">
+        <w:r>
+          <w:rPr>
+            <w:rStyle w:val="Hyperlink"/>
+          </w:rPr>
+          <w:t xml:space="preserve">Equation 2</w:t>
+        </w:r>
+      </w:hyperlink>
+      <w:r>
+        <w:t xml:space="preserve">, heterogeneity</w:t>
+      </w:r>
+      <w:r>
+        <w:t xml:space="preserve"> </w:t>
+      </w:r>
+      <m:oMath>
+        <m:r>
+          <m:t>τ</m:t>
+        </m:r>
+      </m:oMath>
+      <w:r>
+        <w:t xml:space="preserve"> </w:t>
+      </w:r>
+      <w:r>
+        <w:t xml:space="preserve">was modelled as a parameter directly and</w:t>
+      </w:r>
+      <w:r>
+        <w:t xml:space="preserve"> </w:t>
+      </w:r>
+      <m:oMath>
+        <m:sSup>
+          <m:e>
+            <m:r>
+              <m:t>I</m:t>
+            </m:r>
+          </m:e>
+          <m:sup>
+            <m:r>
+              <m:t>2</m:t>
+            </m:r>
+          </m:sup>
+        </m:sSup>
+      </m:oMath>
+      <w:r>
+        <w:t xml:space="preserve"> </w:t>
+      </w:r>
+      <w:r>
+        <w:t xml:space="preserve">was calculated using the typical within-study variance that is used in the frequentist approach so that it is comparable.</w:t>
+      </w:r>
+    </w:p>
+    <w:bookmarkEnd w:id="35"/>
     <w:bookmarkStart w:id="37" w:name="priors"/>
     <w:p>
       <w:pPr>
         <w:pStyle w:val="Heading3"/>
       </w:pPr>
       <w:r>
-        <w:t xml:space="preserve">2.5.3 Priors</w:t>
-      </w:r>
-    </w:p>
-    <w:p>
-      <w:pPr>
-        <w:pStyle w:val="Compact"/>
-        <w:numPr>
-          <w:ilvl w:val="0"/>
-          <w:numId w:val="1012"/>
-        </w:numPr>
-      </w:pPr>
-      <w:r>
-        <w:t xml:space="preserve">Parameters to be estimated: mu and tau (mu later called beta?)</w:t>
-      </w:r>
-    </w:p>
-    <w:p>
-      <w:pPr>
-        <w:pStyle w:val="Compact"/>
-        <w:numPr>
-          <w:ilvl w:val="0"/>
-          <w:numId w:val="1012"/>
-        </w:numPr>
-      </w:pPr>
-      <w:r>
-        <w:t xml:space="preserve">choice based on previous evidence, e.g.</w:t>
-      </w:r>
-      <w:r>
-        <w:t xml:space="preserve"> </w:t>
-      </w:r>
-      <w:r>
-        <w:t xml:space="preserve">(14)</w:t>
-      </w:r>
-    </w:p>
-    <w:p>
-      <w:pPr>
-        <w:pStyle w:val="Compact"/>
-        <w:numPr>
-          <w:ilvl w:val="0"/>
-          <w:numId w:val="1012"/>
-        </w:numPr>
-      </w:pPr>
-      <w:r>
-        <w:t xml:space="preserve">explain scale (log, µg/dL)</w:t>
+        <w:t xml:space="preserve">2.4.2 Priors</w:t>
       </w:r>
     </w:p>
     <w:p>
       <w:pPr>
         <w:pStyle w:val="FirstParagraph"/>
       </w:pPr>
+      <w:r>
+        <w:t xml:space="preserve">In Bayesian statistics, prior knowledge or assumptions from previously published studies, domain knowledge or beliefs are updated by the newly observed data and together result in a posterior distrbution.</w:t>
+      </w:r>
+      <w:r>
+        <w:t xml:space="preserve"> </w:t>
+      </w:r>
+      <w:r>
+        <w:t xml:space="preserve">Prior distributions must be chosen for all parameters to be estimated in the analysis, which in this case are the overall pooled effect estimate</w:t>
+      </w:r>
+      <w:r>
+        <w:t xml:space="preserve"> </w:t>
+      </w:r>
+      <m:oMath>
+        <m:r>
+          <m:t>μ</m:t>
+        </m:r>
+      </m:oMath>
+      <w:r>
+        <w:t xml:space="preserve"> </w:t>
+      </w:r>
+      <w:r>
+        <w:t xml:space="preserve">and between-study standard deviation (heterogeneity)</w:t>
+      </w:r>
+      <w:r>
+        <w:t xml:space="preserve"> </w:t>
+      </w:r>
+      <m:oMath>
+        <m:r>
+          <m:t>τ</m:t>
+        </m:r>
+      </m:oMath>
+      <w:r>
+        <w:t xml:space="preserve">.</w:t>
+      </w:r>
+      <w:r>
+        <w:t xml:space="preserve"> </w:t>
+      </w:r>
+      <w:r>
+        <w:t xml:space="preserve">For both parameters, weakly-informative / conservative priors were chosen so that the posterior distributions are softly being bounded to a realistic range.</w:t>
+      </w:r>
+      <w:r>
+        <w:t xml:space="preserve"> </w:t>
+      </w:r>
+      <w:r>
+        <w:t xml:space="preserve">Because the unit scale of the included effect estimates was harmonized to IQ shift per unit increase in</w:t>
+      </w:r>
+      <w:r>
+        <w:t xml:space="preserve"> </w:t>
+      </w:r>
+      <m:oMath>
+        <m:sSub>
+          <m:e>
+            <m:r>
+              <m:rPr>
+                <m:sty m:val="p"/>
+              </m:rPr>
+              <m:t>log</m:t>
+            </m:r>
+          </m:e>
+          <m:sub>
+            <m:r>
+              <m:t>e</m:t>
+            </m:r>
+          </m:sub>
+        </m:sSub>
+      </m:oMath>
+      <w:r>
+        <w:t xml:space="preserve">-transformed blood lead concentration (µg/dL), the priors will be specified on the same scale.</w:t>
+      </w:r>
+    </w:p>
+    <w:p>
+      <w:pPr>
+        <w:pStyle w:val="BodyText"/>
+      </w:pPr>
+      <w:r>
+        <w:t xml:space="preserve">For the overall pooled effect</w:t>
+      </w:r>
+      <w:r>
+        <w:t xml:space="preserve"> </w:t>
+      </w:r>
+      <m:oMath>
+        <m:r>
+          <m:t>μ</m:t>
+        </m:r>
+      </m:oMath>
+      <w:r>
+        <w:t xml:space="preserve">, a normally distributed prior centered at -1 with a standard deviation (SD) of 2 was chosen.</w:t>
+      </w:r>
+      <w:r>
+        <w:t xml:space="preserve"> </w:t>
+      </w:r>
+      <w:r>
+        <w:t xml:space="preserve">This translates to the assumption that the overall pooled effect lies between -5 and 3 with about 95% probability.</w:t>
+      </w:r>
+      <w:r>
+        <w:t xml:space="preserve"> </w:t>
+      </w:r>
+      <w:r>
+        <w:t xml:space="preserve">The center point of the prior was chosen to be -1 because the negative effects of lead on the developing nervous system and its toxicological mechanisms of action are well established in the scientific literature</w:t>
+      </w:r>
+      <w:r>
+        <w:t xml:space="preserve"> </w:t>
+      </w:r>
+      <w:r>
+        <w:t xml:space="preserve">(18)</w:t>
+      </w:r>
+      <w:r>
+        <w:t xml:space="preserve">.</w:t>
+      </w:r>
+      <w:r>
+        <w:br/>
+      </w:r>
+      <w:r>
+        <w:t xml:space="preserve">Since between-study standard deviation (heterogeneity)</w:t>
+      </w:r>
+      <w:r>
+        <w:t xml:space="preserve"> </w:t>
+      </w:r>
+      <m:oMath>
+        <m:r>
+          <m:t>τ</m:t>
+        </m:r>
+      </m:oMath>
+      <w:r>
+        <w:t xml:space="preserve"> </w:t>
+      </w:r>
+      <w:r>
+        <w:t xml:space="preserve">must by definition be positive, a truncated normal distribution centered at 0 with a SD of 2 was specified.</w:t>
+      </w:r>
+      <w:r>
+        <w:t xml:space="preserve"> </w:t>
+      </w:r>
+      <w:r>
+        <w:t xml:space="preserve">This translates to the assumption that</w:t>
+      </w:r>
+      <w:r>
+        <w:t xml:space="preserve"> </w:t>
+      </w:r>
+      <m:oMath>
+        <m:r>
+          <m:t>τ</m:t>
+        </m:r>
+      </m:oMath>
+      <w:r>
+        <w:t xml:space="preserve"> </w:t>
+      </w:r>
+      <w:r>
+        <w:t xml:space="preserve">is small, but due to its wide SD, the prior is still vague and thus weakly-informative.</w:t>
+      </w:r>
+      <w:r>
+        <w:t xml:space="preserve"> </w:t>
+      </w:r>
+      <w:r>
+        <w:t xml:space="preserve">In summary, the following priors were specified for the Bayesian model:</w:t>
+      </w:r>
+    </w:p>
+    <w:p>
+      <w:pPr>
+        <w:pStyle w:val="BodyText"/>
+      </w:pPr>
+      <w:bookmarkStart w:id="36" w:name="eq-priors"/>
       <m:oMathPara>
         <m:oMathParaPr>
           <m:jc m:val="center"/>
@@ -2053,6 +2326,7 @@
                     <m:r>
                       <m:rPr>
                         <m:sty m:val="p"/>
+                        <m:scr m:val="script"/>
                       </m:rPr>
                       <m:t>+</m:t>
                     </m:r>
@@ -2083,18 +2357,178 @@
               </m:e>
             </m:mr>
           </m:m>
+          <m:r>
+            <m:t>  </m:t>
+          </m:r>
+          <m:d>
+            <m:dPr>
+              <m:begChr m:val="("/>
+              <m:sepChr m:val=""/>
+              <m:endChr m:val=")"/>
+              <m:grow/>
+            </m:dPr>
+            <m:e>
+              <m:r>
+                <m:t>3</m:t>
+              </m:r>
+            </m:e>
+          </m:d>
         </m:oMath>
       </m:oMathPara>
+      <w:bookmarkEnd w:id="36"/>
+    </w:p>
+    <w:p>
+      <w:pPr>
+        <w:pStyle w:val="FirstParagraph"/>
+      </w:pPr>
+      <w:r>
+        <w:t xml:space="preserve">Prior and posterior predictive simulations were conducted using the</w:t>
+      </w:r>
+      <w:r>
+        <w:t xml:space="preserve"> </w:t>
+      </w:r>
+      <w:r>
+        <w:rPr>
+          <w:rStyle w:val="VerbatimChar"/>
+        </w:rPr>
+        <w:t xml:space="preserve">bayesplot</w:t>
+      </w:r>
+      <w:r>
+        <w:t xml:space="preserve"> </w:t>
+      </w:r>
+      <w:r>
+        <w:t xml:space="preserve">package</w:t>
+      </w:r>
+      <w:r>
+        <w:t xml:space="preserve"> </w:t>
+      </w:r>
+      <w:r>
+        <w:t xml:space="preserve">(42)</w:t>
+      </w:r>
+      <w:r>
+        <w:t xml:space="preserve">.</w:t>
+      </w:r>
     </w:p>
     <w:bookmarkEnd w:id="37"/>
+    <w:bookmarkStart w:id="38" w:name="frequentist-meta-analysis"/>
+    <w:p>
+      <w:pPr>
+        <w:pStyle w:val="Heading3"/>
+      </w:pPr>
+      <w:r>
+        <w:t xml:space="preserve">2.4.3 Frequentist Meta-Analysis</w:t>
+      </w:r>
+    </w:p>
+    <w:p>
+      <w:pPr>
+        <w:pStyle w:val="FirstParagraph"/>
+      </w:pPr>
+      <w:r>
+        <w:t xml:space="preserve">For the frequentist meta-analysis we employed a random-effects model, assuming the same multilevel structure as for the Bayesian model</w:t>
+      </w:r>
+      <w:r>
+        <w:t xml:space="preserve"> </w:t>
+      </w:r>
+      <w:hyperlink w:anchor="eq-model">
+        <w:r>
+          <w:rPr>
+            <w:rStyle w:val="Hyperlink"/>
+          </w:rPr>
+          <w:t xml:space="preserve">Equation 2</w:t>
+        </w:r>
+      </w:hyperlink>
+      <w:r>
+        <w:t xml:space="preserve">.</w:t>
+      </w:r>
+      <w:r>
+        <w:t xml:space="preserve"> </w:t>
+      </w:r>
+      <w:r>
+        <w:t xml:space="preserve">Parameters were estimated via the restricted maximum-likelihood (REML) estimation from the R package</w:t>
+      </w:r>
+      <w:r>
+        <w:t xml:space="preserve"> </w:t>
+      </w:r>
+      <w:r>
+        <w:rPr>
+          <w:rStyle w:val="VerbatimChar"/>
+        </w:rPr>
+        <w:t xml:space="preserve">metafor</w:t>
+      </w:r>
+      <w:r>
+        <w:t xml:space="preserve"> </w:t>
+      </w:r>
+      <w:r>
+        <w:t xml:space="preserve">version 4.8-0</w:t>
+      </w:r>
+      <w:r>
+        <w:t xml:space="preserve"> </w:t>
+      </w:r>
+      <w:r>
+        <w:t xml:space="preserve">(43)</w:t>
+      </w:r>
+      <w:r>
+        <w:t xml:space="preserve">.</w:t>
+      </w:r>
+      <w:r>
+        <w:t xml:space="preserve"> </w:t>
+      </w:r>
+      <w:r>
+        <w:t xml:space="preserve">The</w:t>
+      </w:r>
+      <w:r>
+        <w:t xml:space="preserve"> </w:t>
+      </w:r>
+      <m:oMath>
+        <m:sSup>
+          <m:e>
+            <m:r>
+              <m:t>I</m:t>
+            </m:r>
+          </m:e>
+          <m:sup>
+            <m:r>
+              <m:t>2</m:t>
+            </m:r>
+          </m:sup>
+        </m:sSup>
+      </m:oMath>
+      <w:r>
+        <w:t xml:space="preserve"> </w:t>
+      </w:r>
+      <w:r>
+        <w:t xml:space="preserve">statistic was calculated as a measure of heterogeneity, representing the proportion of total variation attributable to between-study heterogeneity</w:t>
+      </w:r>
+      <w:r>
+        <w:t xml:space="preserve"> </w:t>
+      </w:r>
+      <m:oMath>
+        <m:sSup>
+          <m:e>
+            <m:r>
+              <m:t>τ</m:t>
+            </m:r>
+          </m:e>
+          <m:sup>
+            <m:r>
+              <m:t>2</m:t>
+            </m:r>
+          </m:sup>
+        </m:sSup>
+      </m:oMath>
+      <w:r>
+        <w:t xml:space="preserve">.</w:t>
+      </w:r>
+    </w:p>
     <w:bookmarkEnd w:id="38"/>
-    <w:bookmarkStart w:id="41" w:name="sensitivity-analysis"/>
+    <w:bookmarkEnd w:id="39"/>
+    <w:bookmarkStart w:id="42" w:name="sensitivity-analysis"/>
     <w:p>
       <w:pPr>
         <w:pStyle w:val="Heading2"/>
       </w:pPr>
       <w:r>
-        <w:t xml:space="preserve">2.6 Sensitivity Analysis</w:t>
+        <w:t xml:space="preserve">2.5 Sensitivity Analysis</w:t>
       </w:r>
     </w:p>
     <w:p>
@@ -2108,7 +2542,7 @@
         <w:t xml:space="preserve"> </w:t>
       </w:r>
       <w:r>
-        <w:t xml:space="preserve">To examine the sensitivity of the results to possibly biased study results, we ran both the frequentist and Bayesian models again, excluding (1) studies with a high RoB and (2) with a high or medium RoB.</w:t>
+        <w:t xml:space="preserve">To examine the sensitivity of the results to possibly biased study estimates, we ran both the frequentist and Bayesian models again twice, excluding (1) studies with a high RoB and (2) with a high or medium RoB.</w:t>
       </w:r>
     </w:p>
     <w:p>
@@ -2378,14 +2812,14 @@
         <w:pStyle w:val="BodyText"/>
       </w:pPr>
       <w:r>
-        <w:t xml:space="preserve">More informative priors (more narrow):</w:t>
+        <w:t xml:space="preserve">More informative priors (less conservative):</w:t>
       </w:r>
     </w:p>
     <w:p>
       <w:pPr>
         <w:pStyle w:val="BodyText"/>
       </w:pPr>
-      <w:bookmarkStart w:id="39" w:name="eq-prior-sensitivity1"/>
+      <w:bookmarkStart w:id="40" w:name="eq-prior-sensitivity1"/>
       <m:oMathPara>
         <m:oMathParaPr>
           <m:jc m:val="center"/>
@@ -2529,27 +2963,27 @@
             </m:dPr>
             <m:e>
               <m:r>
-                <m:t>3</m:t>
+                <m:t>4</m:t>
               </m:r>
             </m:e>
           </m:d>
         </m:oMath>
       </m:oMathPara>
-      <w:bookmarkEnd w:id="39"/>
+      <w:bookmarkEnd w:id="40"/>
     </w:p>
     <w:p>
       <w:pPr>
         <w:pStyle w:val="FirstParagraph"/>
       </w:pPr>
       <w:r>
-        <w:t xml:space="preserve">Less informative priors (more broad):</w:t>
+        <w:t xml:space="preserve">Less informative priors (more conservative):</w:t>
       </w:r>
     </w:p>
     <w:p>
       <w:pPr>
         <w:pStyle w:val="BodyText"/>
       </w:pPr>
-      <w:bookmarkStart w:id="40" w:name="eq-prior-sensitivity2"/>
+      <w:bookmarkStart w:id="41" w:name="eq-prior-sensitivity2"/>
       <m:oMathPara>
         <m:oMathParaPr>
           <m:jc m:val="center"/>
@@ -2687,23 +3121,196 @@
             </m:dPr>
             <m:e>
               <m:r>
-                <m:t>4</m:t>
+                <m:t>5</m:t>
               </m:r>
             </m:e>
           </m:d>
         </m:oMath>
       </m:oMathPara>
-      <w:bookmarkEnd w:id="40"/>
-    </w:p>
-    <w:bookmarkEnd w:id="41"/>
+      <w:bookmarkEnd w:id="41"/>
+    </w:p>
     <w:bookmarkEnd w:id="42"/>
-    <w:bookmarkStart w:id="43" w:name="results"/>
+    <w:bookmarkEnd w:id="43"/>
+    <w:bookmarkStart w:id="48" w:name="results"/>
     <w:p>
       <w:pPr>
         <w:pStyle w:val="Heading1"/>
       </w:pPr>
       <w:r>
         <w:t xml:space="preserve">3. Results</w:t>
+      </w:r>
+    </w:p>
+    <w:bookmarkStart w:id="44" w:name="literature-review-1"/>
+    <w:p>
+      <w:pPr>
+        <w:pStyle w:val="Heading2"/>
+      </w:pPr>
+      <w:r>
+        <w:t xml:space="preserve">3.1 Literature Review</w:t>
+      </w:r>
+    </w:p>
+    <w:p>
+      <w:pPr>
+        <w:pStyle w:val="FirstParagraph"/>
+      </w:pPr>
+      <w:r>
+        <w:t xml:space="preserve">As described in the methods section, the systematic review was conducted with a larger scope, because it was used as a basis for multiple studies which is why it includes another substance (mercury, Hg).</w:t>
+      </w:r>
+      <w:r>
+        <w:t xml:space="preserve"> </w:t>
+      </w:r>
+      <w:r>
+        <w:t xml:space="preserve">The systematic search in PubMed and Scopus yielded 1,073 records for lead.</w:t>
+      </w:r>
+      <w:r>
+        <w:t xml:space="preserve"> </w:t>
+      </w:r>
+      <w:r>
+        <w:t xml:space="preserve">After duplicate removal, 974 records were abstract and title-screened (Pb &amp; Hg), which lead to 149 records to be screened in fulltext (Pb &amp; Hg).</w:t>
+      </w:r>
+      <w:r>
+        <w:t xml:space="preserve"> </w:t>
+      </w:r>
+      <w:r>
+        <w:t xml:space="preserve">After full text screening, 36 records remained for Pb.</w:t>
+      </w:r>
+      <w:r>
+        <w:t xml:space="preserve"> </w:t>
+      </w:r>
+      <w:r>
+        <w:t xml:space="preserve">These were then assessed for their eligibility for this study.</w:t>
+      </w:r>
+      <w:r>
+        <w:t xml:space="preserve"> </w:t>
+      </w:r>
+      <w:r>
+        <w:t xml:space="preserve">Twelve studies were excluded because they either transformed the BLL variable into categories or left it on a linear (untransformed) scale.</w:t>
+      </w:r>
+      <w:r>
+        <w:t xml:space="preserve"> </w:t>
+      </w:r>
+      <w:r>
+        <w:t xml:space="preserve">Four studies were excluded because they exclusively assessed the effects of prenatal lead exposure.</w:t>
+      </w:r>
+      <w:r>
+        <w:t xml:space="preserve"> </w:t>
+      </w:r>
+      <w:r>
+        <w:t xml:space="preserve">Four studies were excluded because the cohorts included in the study were already included in another study and would have been duplicate.</w:t>
+      </w:r>
+      <w:r>
+        <w:t xml:space="preserve"> </w:t>
+      </w:r>
+      <w:r>
+        <w:t xml:space="preserve">Four additional studies were excluded because they either solely reported effects of chemical mixtures, because they used non-linear models or failed to report essential statistics.</w:t>
+      </w:r>
+      <w:r>
+        <w:t xml:space="preserve"> </w:t>
+      </w:r>
+      <w:r>
+        <w:t xml:space="preserve">Finally, twelve studies were included in the meta-analysis.</w:t>
+      </w:r>
+      <w:r>
+        <w:t xml:space="preserve"> </w:t>
+      </w:r>
+      <w:r>
+        <w:t xml:space="preserve">In Figure X (PRISMA), the full screenind process is shown.</w:t>
+      </w:r>
+      <w:r>
+        <w:t xml:space="preserve"> </w:t>
+      </w:r>
+      <w:r>
+        <w:t xml:space="preserve">A file containing all extracted study data as well as detailed exclusion reasons can be found in suppl. file X (systeamtic review process excel).</w:t>
+      </w:r>
+    </w:p>
+    <w:bookmarkEnd w:id="44"/>
+    <w:bookmarkStart w:id="45" w:name="risk-of-bias"/>
+    <w:p>
+      <w:pPr>
+        <w:pStyle w:val="Heading2"/>
+      </w:pPr>
+      <w:r>
+        <w:t xml:space="preserve">3.2 Risk of Bias</w:t>
+      </w:r>
+    </w:p>
+    <w:bookmarkEnd w:id="45"/>
+    <w:bookmarkStart w:id="46" w:name="meta-analysis-results"/>
+    <w:p>
+      <w:pPr>
+        <w:pStyle w:val="Heading2"/>
+      </w:pPr>
+      <w:r>
+        <w:t xml:space="preserve">3.3 Meta Analysis Results</w:t>
+      </w:r>
+    </w:p>
+    <w:bookmarkEnd w:id="46"/>
+    <w:bookmarkStart w:id="47" w:name="sensitivity-analysis-results"/>
+    <w:p>
+      <w:pPr>
+        <w:pStyle w:val="Heading2"/>
+      </w:pPr>
+      <w:r>
+        <w:t xml:space="preserve">3.4 Sensitivity Analysis Results</w:t>
+      </w:r>
+    </w:p>
+    <w:p>
+      <w:pPr>
+        <w:pStyle w:val="Compact"/>
+        <w:numPr>
+          <w:ilvl w:val="0"/>
+          <w:numId w:val="1008"/>
+        </w:numPr>
+      </w:pPr>
+      <w:r>
+        <w:t xml:space="preserve">Cite studies that might appear to meet inclusion criteria, but were excluded &amp; explain why (no citation)</w:t>
+      </w:r>
+    </w:p>
+    <w:p>
+      <w:pPr>
+        <w:pStyle w:val="Compact"/>
+        <w:numPr>
+          <w:ilvl w:val="0"/>
+          <w:numId w:val="1009"/>
+        </w:numPr>
+      </w:pPr>
+      <w:r>
+        <w:t xml:space="preserve">Study characteristics (table), including original and harmonized effect measures</w:t>
+      </w:r>
+    </w:p>
+    <w:p>
+      <w:pPr>
+        <w:pStyle w:val="Compact"/>
+        <w:numPr>
+          <w:ilvl w:val="0"/>
+          <w:numId w:val="1010"/>
+        </w:numPr>
+      </w:pPr>
+      <w:r>
+        <w:t xml:space="preserve">Flow diagram, description of (full text) screening results</w:t>
+      </w:r>
+    </w:p>
+    <w:p>
+      <w:pPr>
+        <w:pStyle w:val="Compact"/>
+        <w:numPr>
+          <w:ilvl w:val="0"/>
+          <w:numId w:val="1011"/>
+        </w:numPr>
+      </w:pPr>
+      <w:r>
+        <w:t xml:space="preserve">RoB results for each included study</w:t>
+      </w:r>
+    </w:p>
+    <w:p>
+      <w:pPr>
+        <w:pStyle w:val="Compact"/>
+        <w:numPr>
+          <w:ilvl w:val="0"/>
+          <w:numId w:val="1012"/>
+        </w:numPr>
+      </w:pPr>
+      <w:r>
+        <w:t xml:space="preserve">Forest plots</w:t>
       </w:r>
     </w:p>
     <w:p>
@@ -2715,7 +3322,18 @@
         </w:numPr>
       </w:pPr>
       <w:r>
-        <w:t xml:space="preserve">Cite studies that might appear to meet inclusion criteria, but were excluded &amp; explain why</w:t>
+        <w:t xml:space="preserve">Sensitivity analysis results</w:t>
+      </w:r>
+    </w:p>
+    <w:bookmarkEnd w:id="47"/>
+    <w:bookmarkEnd w:id="48"/>
+    <w:bookmarkStart w:id="49" w:name="discussion"/>
+    <w:p>
+      <w:pPr>
+        <w:pStyle w:val="Heading1"/>
+      </w:pPr>
+      <w:r>
+        <w:t xml:space="preserve">4. Discussion</w:t>
       </w:r>
     </w:p>
     <w:p>
@@ -2727,7 +3345,7 @@
         </w:numPr>
       </w:pPr>
       <w:r>
-        <w:t xml:space="preserve">Study characteristics (table), including original and harmonized effect measures</w:t>
+        <w:t xml:space="preserve">General interpretation of results in light of evidence in literature</w:t>
       </w:r>
     </w:p>
     <w:p>
@@ -2739,7 +3357,7 @@
         </w:numPr>
       </w:pPr>
       <w:r>
-        <w:t xml:space="preserve">Flow diagram, description of (full text) screening results</w:t>
+        <w:t xml:space="preserve">Discuss differences, similarities, strengths and weaknesses of freq vs. Bayesian approach</w:t>
       </w:r>
     </w:p>
     <w:p>
@@ -2751,7 +3369,17 @@
         </w:numPr>
       </w:pPr>
       <w:r>
-        <w:t xml:space="preserve">RoB results for each included study</w:t>
+        <w:t xml:space="preserve">Study limitations &amp; strengths</w:t>
+      </w:r>
+    </w:p>
+    <w:bookmarkEnd w:id="49"/>
+    <w:bookmarkStart w:id="50" w:name="conclusions"/>
+    <w:p>
+      <w:pPr>
+        <w:pStyle w:val="Heading1"/>
+      </w:pPr>
+      <w:r>
+        <w:t xml:space="preserve">5. Conclusions</w:t>
       </w:r>
     </w:p>
     <w:p>
@@ -2763,7 +3391,7 @@
         </w:numPr>
       </w:pPr>
       <w:r>
-        <w:t xml:space="preserve">Forest plots</w:t>
+        <w:t xml:space="preserve">Conclusion, with reference to aim of study</w:t>
       </w:r>
     </w:p>
     <w:p>
@@ -2775,91 +3403,11 @@
         </w:numPr>
       </w:pPr>
       <w:r>
-        <w:t xml:space="preserve">Sensitivity analysis results</w:t>
-      </w:r>
-    </w:p>
-    <w:bookmarkEnd w:id="43"/>
-    <w:bookmarkStart w:id="44" w:name="discussion"/>
-    <w:p>
-      <w:pPr>
-        <w:pStyle w:val="Heading1"/>
-      </w:pPr>
-      <w:r>
-        <w:t xml:space="preserve">4. Discussion</w:t>
-      </w:r>
-    </w:p>
-    <w:p>
-      <w:pPr>
-        <w:pStyle w:val="Compact"/>
-        <w:numPr>
-          <w:ilvl w:val="0"/>
-          <w:numId w:val="1019"/>
-        </w:numPr>
-      </w:pPr>
-      <w:r>
-        <w:t xml:space="preserve">General interpretation of results in light of evidence in literature</w:t>
-      </w:r>
-    </w:p>
-    <w:p>
-      <w:pPr>
-        <w:pStyle w:val="Compact"/>
-        <w:numPr>
-          <w:ilvl w:val="0"/>
-          <w:numId w:val="1020"/>
-        </w:numPr>
-      </w:pPr>
-      <w:r>
-        <w:t xml:space="preserve">Discuss differences, similarities, strengths and weaknesses of freq vs. Bayesian approach</w:t>
-      </w:r>
-    </w:p>
-    <w:p>
-      <w:pPr>
-        <w:pStyle w:val="Compact"/>
-        <w:numPr>
-          <w:ilvl w:val="0"/>
-          <w:numId w:val="1021"/>
-        </w:numPr>
-      </w:pPr>
-      <w:r>
-        <w:t xml:space="preserve">Study limitations &amp; strengths</w:t>
-      </w:r>
-    </w:p>
-    <w:bookmarkEnd w:id="44"/>
-    <w:bookmarkStart w:id="45" w:name="conclusions"/>
-    <w:p>
-      <w:pPr>
-        <w:pStyle w:val="Heading1"/>
-      </w:pPr>
-      <w:r>
-        <w:t xml:space="preserve">5. Conclusions</w:t>
-      </w:r>
-    </w:p>
-    <w:p>
-      <w:pPr>
-        <w:pStyle w:val="Compact"/>
-        <w:numPr>
-          <w:ilvl w:val="0"/>
-          <w:numId w:val="1022"/>
-        </w:numPr>
-      </w:pPr>
-      <w:r>
-        <w:t xml:space="preserve">Conclusion, with reference to aim of study</w:t>
-      </w:r>
-    </w:p>
-    <w:p>
-      <w:pPr>
-        <w:pStyle w:val="Compact"/>
-        <w:numPr>
-          <w:ilvl w:val="0"/>
-          <w:numId w:val="1023"/>
-        </w:numPr>
-      </w:pPr>
-      <w:r>
         <w:t xml:space="preserve">Implications of results: policy, (scientific?) practice, future research needs</w:t>
       </w:r>
     </w:p>
-    <w:bookmarkEnd w:id="45"/>
-    <w:bookmarkStart w:id="46" w:name="list-of-abbreviations"/>
+    <w:bookmarkEnd w:id="50"/>
+    <w:bookmarkStart w:id="51" w:name="list-of-abbreviations"/>
     <w:p>
       <w:pPr>
         <w:pStyle w:val="Heading1"/>
@@ -3072,6 +3620,32 @@
               <w:jc w:val="left"/>
             </w:pPr>
             <w:r>
+              <w:t xml:space="preserve">REML</w:t>
+            </w:r>
+          </w:p>
+        </w:tc>
+        <w:tc>
+          <w:tcPr/>
+          <w:p>
+            <w:pPr>
+              <w:pStyle w:val="Compact"/>
+              <w:jc w:val="left"/>
+            </w:pPr>
+            <w:r>
+              <w:t xml:space="preserve">Restricted maximum-likelihood</w:t>
+            </w:r>
+          </w:p>
+        </w:tc>
+      </w:tr>
+      <w:tr>
+        <w:tc>
+          <w:tcPr/>
+          <w:p>
+            <w:pPr>
+              <w:pStyle w:val="Compact"/>
+              <w:jc w:val="left"/>
+            </w:pPr>
+            <w:r>
               <w:t xml:space="preserve">RoB</w:t>
             </w:r>
           </w:p>
@@ -3085,6 +3659,32 @@
             </w:pPr>
             <w:r>
               <w:t xml:space="preserve">Risk of Bias</w:t>
+            </w:r>
+          </w:p>
+        </w:tc>
+      </w:tr>
+      <w:tr>
+        <w:tc>
+          <w:tcPr/>
+          <w:p>
+            <w:pPr>
+              <w:pStyle w:val="Compact"/>
+              <w:jc w:val="left"/>
+            </w:pPr>
+            <w:r>
+              <w:t xml:space="preserve">SD</w:t>
+            </w:r>
+          </w:p>
+        </w:tc>
+        <w:tc>
+          <w:tcPr/>
+          <w:p>
+            <w:pPr>
+              <w:pStyle w:val="Compact"/>
+              <w:jc w:val="left"/>
+            </w:pPr>
+            <w:r>
+              <w:t xml:space="preserve">Standard deviation</w:t>
             </w:r>
           </w:p>
         </w:tc>
@@ -3168,13 +3768,73 @@
         </w:tc>
       </w:tr>
     </w:tbl>
-    <w:bookmarkEnd w:id="46"/>
-    <w:bookmarkStart w:id="47" w:name="funding"/>
+    <w:bookmarkEnd w:id="51"/>
+    <w:bookmarkStart w:id="52" w:name="acknowledgements"/>
     <w:p>
       <w:pPr>
         <w:pStyle w:val="Heading1"/>
       </w:pPr>
       <w:r>
+        <w:t xml:space="preserve">Acknowledgements</w:t>
+      </w:r>
+    </w:p>
+    <w:p>
+      <w:pPr>
+        <w:pStyle w:val="FirstParagraph"/>
+      </w:pPr>
+      <w:r>
+        <w:t xml:space="preserve">The authors thank</w:t>
+      </w:r>
+      <w:r>
+        <w:t xml:space="preserve"> </w:t>
+      </w:r>
+      <w:r>
+        <w:t xml:space="preserve">Rafiqa Benchrih (Department of Epidemiology and Public Health, Sciensano, Belgium),</w:t>
+      </w:r>
+      <w:r>
+        <w:t xml:space="preserve"> </w:t>
+      </w:r>
+      <w:r>
+        <w:t xml:space="preserve">Jurgen Buekers (Flemish Institute for Technological Research, VITO, Belgium),</w:t>
+      </w:r>
+      <w:r>
+        <w:t xml:space="preserve"> </w:t>
+      </w:r>
+      <w:r>
+        <w:t xml:space="preserve">Carla Martins (National School of Public Health, NOVA University of Lisbon, Portugal),</w:t>
+      </w:r>
+      <w:r>
+        <w:t xml:space="preserve"> </w:t>
+      </w:r>
+      <w:r>
+        <w:t xml:space="preserve">Emily Mc Vey (Institute for Public Health and the Environment, RIVM, The Netherlands),</w:t>
+      </w:r>
+      <w:r>
+        <w:t xml:space="preserve"> </w:t>
+      </w:r>
+      <w:r>
+        <w:t xml:space="preserve">Anthony Purece (Flemish Institute for Technological Research, VITO, Belgium) and</w:t>
+      </w:r>
+      <w:r>
+        <w:t xml:space="preserve"> </w:t>
+      </w:r>
+      <w:r>
+        <w:t xml:space="preserve">Sofie Thomsen (Technical University of Denmark, DTU, Denmark)</w:t>
+      </w:r>
+      <w:r>
+        <w:t xml:space="preserve"> </w:t>
+      </w:r>
+      <w:r>
+        <w:t xml:space="preserve">for their help in the screening process.</w:t>
+      </w:r>
+    </w:p>
+    <w:bookmarkEnd w:id="52"/>
+    <w:bookmarkStart w:id="53" w:name="funding"/>
+    <w:p>
+      <w:pPr>
+        <w:pStyle w:val="Heading1"/>
+      </w:pPr>
+      <w:r>
         <w:t xml:space="preserve">Funding</w:t>
       </w:r>
     </w:p>
@@ -3198,8 +3858,8 @@
         <w:t xml:space="preserve">Neither the European Union nor the granting authority can be held responsible for them.</w:t>
       </w:r>
     </w:p>
-    <w:bookmarkEnd w:id="47"/>
-    <w:bookmarkStart w:id="126" w:name="bibliography"/>
+    <w:bookmarkEnd w:id="53"/>
+    <w:bookmarkStart w:id="138" w:name="bibliography"/>
     <w:p>
       <w:pPr>
         <w:pStyle w:val="Heading1"/>
@@ -3208,8 +3868,8 @@
         <w:t xml:space="preserve">References</w:t>
       </w:r>
     </w:p>
-    <w:bookmarkStart w:id="125" w:name="refs"/>
-    <w:bookmarkStart w:id="49" w:name="Xe38019c88c6d2792bb296bad7dc0a4dd55f1319"/>
+    <w:bookmarkStart w:id="137" w:name="refs"/>
+    <w:bookmarkStart w:id="55" w:name="Xe38019c88c6d2792bb296bad7dc0a4dd55f1319"/>
     <w:p>
       <w:pPr>
         <w:pStyle w:val="Bibliography"/>
@@ -3229,7 +3889,7 @@
       <w:r>
         <w:t xml:space="preserve"> </w:t>
       </w:r>
-      <w:hyperlink r:id="rId48">
+      <w:hyperlink r:id="rId54">
         <w:r>
           <w:rPr>
             <w:rStyle w:val="Hyperlink"/>
@@ -3268,8 +3928,8 @@
         <w:t xml:space="preserve"> </w:t>
       </w:r>
     </w:p>
-    <w:bookmarkEnd w:id="49"/>
-    <w:bookmarkStart w:id="51" w:name="ref-lacerda2023GlobalDecreaseBlood"/>
+    <w:bookmarkEnd w:id="55"/>
+    <w:bookmarkStart w:id="57" w:name="ref-lacerda2023GlobalDecreaseBlood"/>
     <w:p>
       <w:pPr>
         <w:pStyle w:val="Bibliography"/>
@@ -3289,7 +3949,7 @@
       <w:r>
         <w:t xml:space="preserve"> </w:t>
       </w:r>
-      <w:hyperlink r:id="rId50">
+      <w:hyperlink r:id="rId56">
         <w:r>
           <w:rPr>
             <w:rStyle w:val="Hyperlink"/>
@@ -3304,8 +3964,8 @@
         <w:t xml:space="preserve"> </w:t>
       </w:r>
     </w:p>
-    <w:bookmarkEnd w:id="51"/>
-    <w:bookmarkStart w:id="53" w:name="X4707f3a4b72a0982487545f9dc3d674642af108"/>
+    <w:bookmarkEnd w:id="57"/>
+    <w:bookmarkStart w:id="59" w:name="X4707f3a4b72a0982487545f9dc3d674642af108"/>
     <w:p>
       <w:pPr>
         <w:pStyle w:val="Bibliography"/>
@@ -3325,7 +3985,7 @@
       <w:r>
         <w:t xml:space="preserve"> </w:t>
       </w:r>
-      <w:hyperlink r:id="rId52">
+      <w:hyperlink r:id="rId58">
         <w:r>
           <w:rPr>
             <w:rStyle w:val="Hyperlink"/>
@@ -3364,8 +4024,8 @@
         <w:t xml:space="preserve"> </w:t>
       </w:r>
     </w:p>
-    <w:bookmarkEnd w:id="53"/>
-    <w:bookmarkStart w:id="55" w:name="ref-sy2024AssessmentLongTermExposure"/>
+    <w:bookmarkEnd w:id="59"/>
+    <w:bookmarkStart w:id="61" w:name="ref-sy2024AssessmentLongTermExposure"/>
     <w:p>
       <w:pPr>
         <w:pStyle w:val="Bibliography"/>
@@ -3385,7 +4045,7 @@
       <w:r>
         <w:t xml:space="preserve"> </w:t>
       </w:r>
-      <w:hyperlink r:id="rId54">
+      <w:hyperlink r:id="rId60">
         <w:r>
           <w:rPr>
             <w:rStyle w:val="Hyperlink"/>
@@ -3460,8 +4120,8 @@
         <w:t xml:space="preserve"> </w:t>
       </w:r>
     </w:p>
-    <w:bookmarkEnd w:id="55"/>
-    <w:bookmarkStart w:id="57" w:name="ref-brauer2024GlobalBurdenStrength"/>
+    <w:bookmarkEnd w:id="61"/>
+    <w:bookmarkStart w:id="63" w:name="ref-brauer2024GlobalBurdenStrength"/>
     <w:p>
       <w:pPr>
         <w:pStyle w:val="Bibliography"/>
@@ -3481,7 +4141,7 @@
       <w:r>
         <w:t xml:space="preserve"> </w:t>
       </w:r>
-      <w:hyperlink r:id="rId56">
+      <w:hyperlink r:id="rId62">
         <w:r>
           <w:rPr>
             <w:rStyle w:val="Hyperlink"/>
@@ -3544,8 +4204,8 @@
         <w:t xml:space="preserve"> </w:t>
       </w:r>
     </w:p>
-    <w:bookmarkEnd w:id="57"/>
-    <w:bookmarkStart w:id="59" w:name="ref-harari2018BloodLeadLevels"/>
+    <w:bookmarkEnd w:id="63"/>
+    <w:bookmarkStart w:id="65" w:name="ref-harari2018BloodLeadLevels"/>
     <w:p>
       <w:pPr>
         <w:pStyle w:val="Bibliography"/>
@@ -3565,7 +4225,7 @@
       <w:r>
         <w:t xml:space="preserve"> </w:t>
       </w:r>
-      <w:hyperlink r:id="rId58">
+      <w:hyperlink r:id="rId64">
         <w:r>
           <w:rPr>
             <w:rStyle w:val="Hyperlink"/>
@@ -3640,8 +4300,8 @@
         <w:t xml:space="preserve"> </w:t>
       </w:r>
     </w:p>
-    <w:bookmarkEnd w:id="59"/>
-    <w:bookmarkStart w:id="61" w:name="ref-wan2022ChronicLeadExposure"/>
+    <w:bookmarkEnd w:id="65"/>
+    <w:bookmarkStart w:id="67" w:name="ref-wan2022ChronicLeadExposure"/>
     <w:p>
       <w:pPr>
         <w:pStyle w:val="Bibliography"/>
@@ -3661,7 +4321,7 @@
       <w:r>
         <w:t xml:space="preserve"> </w:t>
       </w:r>
-      <w:hyperlink r:id="rId60">
+      <w:hyperlink r:id="rId66">
         <w:r>
           <w:rPr>
             <w:rStyle w:val="Hyperlink"/>
@@ -3676,8 +4336,8 @@
         <w:t xml:space="preserve"> </w:t>
       </w:r>
     </w:p>
-    <w:bookmarkEnd w:id="61"/>
-    <w:bookmarkStart w:id="63" w:name="ref-rosengren2025ExposureLeadCoronary"/>
+    <w:bookmarkEnd w:id="67"/>
+    <w:bookmarkStart w:id="69" w:name="ref-rosengren2025ExposureLeadCoronary"/>
     <w:p>
       <w:pPr>
         <w:pStyle w:val="Bibliography"/>
@@ -3697,7 +4357,7 @@
       <w:r>
         <w:t xml:space="preserve"> </w:t>
       </w:r>
-      <w:hyperlink r:id="rId62">
+      <w:hyperlink r:id="rId68">
         <w:r>
           <w:rPr>
             <w:rStyle w:val="Hyperlink"/>
@@ -3790,8 +4450,8 @@
         <w:t xml:space="preserve"> </w:t>
       </w:r>
     </w:p>
-    <w:bookmarkEnd w:id="63"/>
-    <w:bookmarkStart w:id="65" w:name="ref-lanphear2018LowlevelLeadExposure"/>
+    <w:bookmarkEnd w:id="69"/>
+    <w:bookmarkStart w:id="71" w:name="ref-lanphear2018LowlevelLeadExposure"/>
     <w:p>
       <w:pPr>
         <w:pStyle w:val="Bibliography"/>
@@ -3811,7 +4471,7 @@
       <w:r>
         <w:t xml:space="preserve"> </w:t>
       </w:r>
-      <w:hyperlink r:id="rId64">
+      <w:hyperlink r:id="rId70">
         <w:r>
           <w:rPr>
             <w:rStyle w:val="Hyperlink"/>
@@ -3850,8 +4510,8 @@
         <w:t xml:space="preserve"> </w:t>
       </w:r>
     </w:p>
-    <w:bookmarkEnd w:id="65"/>
-    <w:bookmarkStart w:id="67" w:name="ref-chang2006LowBloodLead"/>
+    <w:bookmarkEnd w:id="71"/>
+    <w:bookmarkStart w:id="73" w:name="ref-chang2006LowBloodLead"/>
     <w:p>
       <w:pPr>
         <w:pStyle w:val="Bibliography"/>
@@ -3871,7 +4531,7 @@
       <w:r>
         <w:t xml:space="preserve"> </w:t>
       </w:r>
-      <w:hyperlink r:id="rId66">
+      <w:hyperlink r:id="rId72">
         <w:r>
           <w:rPr>
             <w:rStyle w:val="Hyperlink"/>
@@ -3886,8 +4546,8 @@
         <w:t xml:space="preserve"> </w:t>
       </w:r>
     </w:p>
-    <w:bookmarkEnd w:id="67"/>
-    <w:bookmarkStart w:id="69" w:name="Xadfdab0209e4a364d9fdcffecfddb00700d2db9"/>
+    <w:bookmarkEnd w:id="73"/>
+    <w:bookmarkStart w:id="75" w:name="Xadfdab0209e4a364d9fdcffecfddb00700d2db9"/>
     <w:p>
       <w:pPr>
         <w:pStyle w:val="Bibliography"/>
@@ -3907,7 +4567,7 @@
       <w:r>
         <w:t xml:space="preserve"> </w:t>
       </w:r>
-      <w:hyperlink r:id="rId68">
+      <w:hyperlink r:id="rId74">
         <w:r>
           <w:rPr>
             <w:rStyle w:val="Hyperlink"/>
@@ -4042,8 +4702,8 @@
         <w:t xml:space="preserve"> </w:t>
       </w:r>
     </w:p>
-    <w:bookmarkEnd w:id="69"/>
-    <w:bookmarkStart w:id="71" w:name="ref-shaffer2025LeadExposureAntisocial"/>
+    <w:bookmarkEnd w:id="75"/>
+    <w:bookmarkStart w:id="77" w:name="ref-shaffer2025LeadExposureAntisocial"/>
     <w:p>
       <w:pPr>
         <w:pStyle w:val="Bibliography"/>
@@ -4063,7 +4723,7 @@
       <w:r>
         <w:t xml:space="preserve"> </w:t>
       </w:r>
-      <w:hyperlink r:id="rId70">
+      <w:hyperlink r:id="rId76">
         <w:r>
           <w:rPr>
             <w:rStyle w:val="Hyperlink"/>
@@ -4102,8 +4762,8 @@
         <w:t xml:space="preserve"> </w:t>
       </w:r>
     </w:p>
-    <w:bookmarkEnd w:id="71"/>
-    <w:bookmarkStart w:id="73" w:name="X06097e4c5e52362623b7f1c040457eb7d553acc"/>
+    <w:bookmarkEnd w:id="77"/>
+    <w:bookmarkStart w:id="79" w:name="X06097e4c5e52362623b7f1c040457eb7d553acc"/>
     <w:p>
       <w:pPr>
         <w:pStyle w:val="Bibliography"/>
@@ -4123,7 +4783,7 @@
       <w:r>
         <w:t xml:space="preserve"> </w:t>
       </w:r>
-      <w:hyperlink r:id="rId72">
+      <w:hyperlink r:id="rId78">
         <w:r>
           <w:rPr>
             <w:rStyle w:val="Hyperlink"/>
@@ -4282,8 +4942,8 @@
         <w:t xml:space="preserve"> </w:t>
       </w:r>
     </w:p>
-    <w:bookmarkEnd w:id="73"/>
-    <w:bookmarkStart w:id="75" w:name="ref-needleman1990LowLevelLeadExposure"/>
+    <w:bookmarkEnd w:id="79"/>
+    <w:bookmarkStart w:id="81" w:name="ref-needleman1990LowLevelLeadExposure"/>
     <w:p>
       <w:pPr>
         <w:pStyle w:val="Bibliography"/>
@@ -4303,7 +4963,7 @@
       <w:r>
         <w:t xml:space="preserve"> </w:t>
       </w:r>
-      <w:hyperlink r:id="rId74">
+      <w:hyperlink r:id="rId80">
         <w:r>
           <w:rPr>
             <w:rStyle w:val="Hyperlink"/>
@@ -4414,8 +5074,8 @@
         <w:t xml:space="preserve"> </w:t>
       </w:r>
     </w:p>
-    <w:bookmarkEnd w:id="75"/>
-    <w:bookmarkStart w:id="77" w:name="ref-bellinger1992LowLevelLeadExposure"/>
+    <w:bookmarkEnd w:id="81"/>
+    <w:bookmarkStart w:id="83" w:name="ref-bellinger1992LowLevelLeadExposure"/>
     <w:p>
       <w:pPr>
         <w:pStyle w:val="Bibliography"/>
@@ -4435,7 +5095,7 @@
       <w:r>
         <w:t xml:space="preserve"> </w:t>
       </w:r>
-      <w:hyperlink r:id="rId76">
+      <w:hyperlink r:id="rId82">
         <w:r>
           <w:rPr>
             <w:rStyle w:val="Hyperlink"/>
@@ -4516,8 +5176,8 @@
         <w:t xml:space="preserve"> </w:t>
       </w:r>
     </w:p>
-    <w:bookmarkEnd w:id="77"/>
-    <w:bookmarkStart w:id="79" w:name="X9a8bad0b78f43066cb333fdedcdcad5d7017900"/>
+    <w:bookmarkEnd w:id="83"/>
+    <w:bookmarkStart w:id="85" w:name="X9a8bad0b78f43066cb333fdedcdcad5d7017900"/>
     <w:p>
       <w:pPr>
         <w:pStyle w:val="Bibliography"/>
@@ -4537,7 +5197,7 @@
       <w:r>
         <w:t xml:space="preserve"> </w:t>
       </w:r>
-      <w:hyperlink r:id="rId78">
+      <w:hyperlink r:id="rId84">
         <w:r>
           <w:rPr>
             <w:rStyle w:val="Hyperlink"/>
@@ -4618,8 +5278,8 @@
         <w:t xml:space="preserve"> </w:t>
       </w:r>
     </w:p>
-    <w:bookmarkEnd w:id="79"/>
-    <w:bookmarkStart w:id="81" w:name="ref-larsen2023GlobalHealthBurden"/>
+    <w:bookmarkEnd w:id="85"/>
+    <w:bookmarkStart w:id="87" w:name="ref-larsen2023GlobalHealthBurden"/>
     <w:p>
       <w:pPr>
         <w:pStyle w:val="Bibliography"/>
@@ -4639,7 +5299,7 @@
       <w:r>
         <w:t xml:space="preserve"> </w:t>
       </w:r>
-      <w:hyperlink r:id="rId80">
+      <w:hyperlink r:id="rId86">
         <w:r>
           <w:rPr>
             <w:rStyle w:val="Hyperlink"/>
@@ -4654,8 +5314,8 @@
         <w:t xml:space="preserve"> </w:t>
       </w:r>
     </w:p>
-    <w:bookmarkEnd w:id="81"/>
-    <w:bookmarkStart w:id="83" w:name="X5615fc1cb9c455a90da75660348bda09fd0f967"/>
+    <w:bookmarkEnd w:id="87"/>
+    <w:bookmarkStart w:id="89" w:name="X5615fc1cb9c455a90da75660348bda09fd0f967"/>
     <w:p>
       <w:pPr>
         <w:pStyle w:val="Bibliography"/>
@@ -4675,7 +5335,7 @@
       <w:r>
         <w:t xml:space="preserve"> </w:t>
       </w:r>
-      <w:hyperlink r:id="rId82">
+      <w:hyperlink r:id="rId88">
         <w:r>
           <w:rPr>
             <w:rStyle w:val="Hyperlink"/>
@@ -4750,8 +5410,8 @@
         <w:t xml:space="preserve"> </w:t>
       </w:r>
     </w:p>
-    <w:bookmarkEnd w:id="83"/>
-    <w:bookmarkStart w:id="85" w:name="ref-schwartz1994LowLevelLeadExposurea"/>
+    <w:bookmarkEnd w:id="89"/>
+    <w:bookmarkStart w:id="91" w:name="ref-schwartz1994LowLevelLeadExposure"/>
     <w:p>
       <w:pPr>
         <w:pStyle w:val="Bibliography"/>
@@ -4771,7 +5431,7 @@
       <w:r>
         <w:t xml:space="preserve"> </w:t>
       </w:r>
-      <w:hyperlink r:id="rId84">
+      <w:hyperlink r:id="rId90">
         <w:r>
           <w:rPr>
             <w:rStyle w:val="Hyperlink"/>
@@ -4908,8 +5568,8 @@
         <w:t xml:space="preserve"> </w:t>
       </w:r>
     </w:p>
-    <w:bookmarkEnd w:id="85"/>
-    <w:bookmarkStart w:id="87" w:name="Xa2086c2c3f6a9ac4b676f66b1cdbbd5efdb3b23"/>
+    <w:bookmarkEnd w:id="91"/>
+    <w:bookmarkStart w:id="93" w:name="Xa2086c2c3f6a9ac4b676f66b1cdbbd5efdb3b23"/>
     <w:p>
       <w:pPr>
         <w:pStyle w:val="Bibliography"/>
@@ -4929,7 +5589,7 @@
       <w:r>
         <w:t xml:space="preserve"> </w:t>
       </w:r>
-      <w:hyperlink r:id="rId86">
+      <w:hyperlink r:id="rId92">
         <w:r>
           <w:rPr>
             <w:rStyle w:val="Hyperlink"/>
@@ -5045,8 +5705,8 @@
         <w:t xml:space="preserve"> </w:t>
       </w:r>
     </w:p>
-    <w:bookmarkEnd w:id="87"/>
-    <w:bookmarkStart w:id="89" w:name="X93c1fc7f8e1220d02cbab90c02ac44248f2b23e"/>
+    <w:bookmarkEnd w:id="93"/>
+    <w:bookmarkStart w:id="95" w:name="X93c1fc7f8e1220d02cbab90c02ac44248f2b23e"/>
     <w:p>
       <w:pPr>
         <w:pStyle w:val="Bibliography"/>
@@ -5066,7 +5726,7 @@
       <w:r>
         <w:t xml:space="preserve"> </w:t>
       </w:r>
-      <w:hyperlink r:id="rId88">
+      <w:hyperlink r:id="rId94">
         <w:r>
           <w:rPr>
             <w:rStyle w:val="Hyperlink"/>
@@ -5081,8 +5741,8 @@
         <w:t xml:space="preserve"> </w:t>
       </w:r>
     </w:p>
-    <w:bookmarkEnd w:id="89"/>
-    <w:bookmarkStart w:id="91" w:name="ref-figueroa2024LossCognitiveFunction"/>
+    <w:bookmarkEnd w:id="95"/>
+    <w:bookmarkStart w:id="97" w:name="ref-figueroa2024LossCognitiveFunction"/>
     <w:p>
       <w:pPr>
         <w:pStyle w:val="Bibliography"/>
@@ -5102,7 +5762,7 @@
       <w:r>
         <w:t xml:space="preserve"> </w:t>
       </w:r>
-      <w:hyperlink r:id="rId90">
+      <w:hyperlink r:id="rId96">
         <w:r>
           <w:rPr>
             <w:rStyle w:val="Hyperlink"/>
@@ -5141,8 +5801,8 @@
         <w:t xml:space="preserve"> </w:t>
       </w:r>
     </w:p>
-    <w:bookmarkEnd w:id="91"/>
-    <w:bookmarkStart w:id="93" w:name="ref-mcfarland2022HalfUSPopulation"/>
+    <w:bookmarkEnd w:id="97"/>
+    <w:bookmarkStart w:id="99" w:name="ref-mcfarland2022HalfUSPopulation"/>
     <w:p>
       <w:pPr>
         <w:pStyle w:val="Bibliography"/>
@@ -5162,7 +5822,7 @@
       <w:r>
         <w:t xml:space="preserve"> </w:t>
       </w:r>
-      <w:hyperlink r:id="rId92">
+      <w:hyperlink r:id="rId98">
         <w:r>
           <w:rPr>
             <w:rStyle w:val="Hyperlink"/>
@@ -5201,8 +5861,8 @@
         <w:t xml:space="preserve"> </w:t>
       </w:r>
     </w:p>
-    <w:bookmarkEnd w:id="93"/>
-    <w:bookmarkStart w:id="95" w:name="ref-crump2013StatisticalReevaluationData"/>
+    <w:bookmarkEnd w:id="99"/>
+    <w:bookmarkStart w:id="101" w:name="ref-crump2013StatisticalReevaluationData"/>
     <w:p>
       <w:pPr>
         <w:pStyle w:val="Bibliography"/>
@@ -5222,7 +5882,7 @@
       <w:r>
         <w:t xml:space="preserve"> </w:t>
       </w:r>
-      <w:hyperlink r:id="rId94">
+      <w:hyperlink r:id="rId100">
         <w:r>
           <w:rPr>
             <w:rStyle w:val="Hyperlink"/>
@@ -5261,8 +5921,8 @@
         <w:t xml:space="preserve"> </w:t>
       </w:r>
     </w:p>
-    <w:bookmarkEnd w:id="95"/>
-    <w:bookmarkStart w:id="97" w:name="X33f03e29791f20cdbbbbf0729c723b16e55ed16"/>
+    <w:bookmarkEnd w:id="101"/>
+    <w:bookmarkStart w:id="103" w:name="X33f03e29791f20cdbbbbf0729c723b16e55ed16"/>
     <w:p>
       <w:pPr>
         <w:pStyle w:val="Bibliography"/>
@@ -5282,7 +5942,7 @@
       <w:r>
         <w:t xml:space="preserve"> </w:t>
       </w:r>
-      <w:hyperlink r:id="rId96">
+      <w:hyperlink r:id="rId102">
         <w:r>
           <w:rPr>
             <w:rStyle w:val="Hyperlink"/>
@@ -5381,8 +6041,8 @@
         <w:t xml:space="preserve"> </w:t>
       </w:r>
     </w:p>
-    <w:bookmarkEnd w:id="97"/>
-    <w:bookmarkStart w:id="99" w:name="X99fa6bd9cd2521340285769f289a6c9d4bfe17b"/>
+    <w:bookmarkEnd w:id="103"/>
+    <w:bookmarkStart w:id="105" w:name="X99fa6bd9cd2521340285769f289a6c9d4bfe17b"/>
     <w:p>
       <w:pPr>
         <w:pStyle w:val="Bibliography"/>
@@ -5402,7 +6062,7 @@
       <w:r>
         <w:t xml:space="preserve"> </w:t>
       </w:r>
-      <w:hyperlink r:id="rId98">
+      <w:hyperlink r:id="rId104">
         <w:r>
           <w:rPr>
             <w:rStyle w:val="Hyperlink"/>
@@ -5477,8 +6137,8 @@
         <w:t xml:space="preserve"> </w:t>
       </w:r>
     </w:p>
-    <w:bookmarkEnd w:id="99"/>
-    <w:bookmarkStart w:id="101" w:name="Xec30ec7c912152a14c0f622040312567154bf15"/>
+    <w:bookmarkEnd w:id="105"/>
+    <w:bookmarkStart w:id="107" w:name="Xec30ec7c912152a14c0f622040312567154bf15"/>
     <w:p>
       <w:pPr>
         <w:pStyle w:val="Bibliography"/>
@@ -5498,7 +6158,7 @@
       <w:r>
         <w:t xml:space="preserve"> </w:t>
       </w:r>
-      <w:hyperlink r:id="rId100">
+      <w:hyperlink r:id="rId106">
         <w:r>
           <w:rPr>
             <w:rStyle w:val="Hyperlink"/>
@@ -5648,8 +6308,8 @@
         <w:t xml:space="preserve"> </w:t>
       </w:r>
     </w:p>
-    <w:bookmarkEnd w:id="101"/>
-    <w:bookmarkStart w:id="103" w:name="ref-smith2018StepAwayStepwise"/>
+    <w:bookmarkEnd w:id="107"/>
+    <w:bookmarkStart w:id="109" w:name="ref-smith2018StepAwayStepwise"/>
     <w:p>
       <w:pPr>
         <w:pStyle w:val="Bibliography"/>
@@ -5669,7 +6329,7 @@
       <w:r>
         <w:t xml:space="preserve"> </w:t>
       </w:r>
-      <w:hyperlink r:id="rId102">
+      <w:hyperlink r:id="rId108">
         <w:r>
           <w:rPr>
             <w:rStyle w:val="Hyperlink"/>
@@ -5684,8 +6344,8 @@
         <w:t xml:space="preserve"> </w:t>
       </w:r>
     </w:p>
-    <w:bookmarkEnd w:id="103"/>
-    <w:bookmarkStart w:id="105" w:name="X035620408d1fb22c7ed381e74f0468c30df4612"/>
+    <w:bookmarkEnd w:id="109"/>
+    <w:bookmarkStart w:id="111" w:name="X035620408d1fb22c7ed381e74f0468c30df4612"/>
     <w:p>
       <w:pPr>
         <w:pStyle w:val="Bibliography"/>
@@ -5705,7 +6365,7 @@
       <w:r>
         <w:t xml:space="preserve"> </w:t>
       </w:r>
-      <w:hyperlink r:id="rId104">
+      <w:hyperlink r:id="rId110">
         <w:r>
           <w:rPr>
             <w:rStyle w:val="Hyperlink"/>
@@ -5759,8 +6419,8 @@
         <w:t xml:space="preserve"> </w:t>
       </w:r>
     </w:p>
-    <w:bookmarkEnd w:id="105"/>
-    <w:bookmarkStart w:id="107" w:name="X837f91f784566061977da85c17a5755a81dedde"/>
+    <w:bookmarkEnd w:id="111"/>
+    <w:bookmarkStart w:id="113" w:name="X837f91f784566061977da85c17a5755a81dedde"/>
     <w:p>
       <w:pPr>
         <w:pStyle w:val="Bibliography"/>
@@ -5780,7 +6440,7 @@
       <w:r>
         <w:t xml:space="preserve"> </w:t>
       </w:r>
-      <w:hyperlink r:id="rId106">
+      <w:hyperlink r:id="rId112">
         <w:r>
           <w:rPr>
             <w:rStyle w:val="Hyperlink"/>
@@ -5795,8 +6455,8 @@
         <w:t xml:space="preserve"> </w:t>
       </w:r>
     </w:p>
-    <w:bookmarkEnd w:id="107"/>
-    <w:bookmarkStart w:id="109" w:name="ref-page2021PRISMA2020Statement"/>
+    <w:bookmarkEnd w:id="113"/>
+    <w:bookmarkStart w:id="115" w:name="ref-page2021PRISMA2020Statement"/>
     <w:p>
       <w:pPr>
         <w:pStyle w:val="Bibliography"/>
@@ -5816,7 +6476,7 @@
       <w:r>
         <w:t xml:space="preserve"> </w:t>
       </w:r>
-      <w:hyperlink r:id="rId108">
+      <w:hyperlink r:id="rId114">
         <w:r>
           <w:rPr>
             <w:rStyle w:val="Hyperlink"/>
@@ -5855,8 +6515,8 @@
         <w:t xml:space="preserve"> </w:t>
       </w:r>
     </w:p>
-    <w:bookmarkEnd w:id="109"/>
-    <w:bookmarkStart w:id="111" w:name="X5cae6442bbe0e1f5d8df6cd5008aab2dbfb65a6"/>
+    <w:bookmarkEnd w:id="115"/>
+    <w:bookmarkStart w:id="117" w:name="X5cae6442bbe0e1f5d8df6cd5008aab2dbfb65a6"/>
     <w:p>
       <w:pPr>
         <w:pStyle w:val="Bibliography"/>
@@ -5876,7 +6536,7 @@
       <w:r>
         <w:t xml:space="preserve"> </w:t>
       </w:r>
-      <w:hyperlink r:id="rId110">
+      <w:hyperlink r:id="rId116">
         <w:r>
           <w:rPr>
             <w:rStyle w:val="Hyperlink"/>
@@ -5903,8 +6563,8 @@
         <w:t xml:space="preserve"> </w:t>
       </w:r>
     </w:p>
-    <w:bookmarkEnd w:id="111"/>
-    <w:bookmarkStart w:id="113" w:name="ref-plate2024DevelopmentToolRapid"/>
+    <w:bookmarkEnd w:id="117"/>
+    <w:bookmarkStart w:id="118" w:name="Xf5486a80753c915bf34b5d8f3ad5e46aac479a7"/>
     <w:p>
       <w:pPr>
         <w:pStyle w:val="Bibliography"/>
@@ -5919,12 +6579,79 @@
         <w:t xml:space="preserve">	</w:t>
       </w:r>
       <w:r>
+        <w:t xml:space="preserve">NTP OHAT. Handbook for</w:t>
+      </w:r>
+      <w:r>
+        <w:t xml:space="preserve"> </w:t>
+      </w:r>
+      <w:r>
+        <w:t xml:space="preserve">Conducting</w:t>
+      </w:r>
+      <w:r>
+        <w:t xml:space="preserve"> </w:t>
+      </w:r>
+      <w:r>
+        <w:t xml:space="preserve">a</w:t>
+      </w:r>
+      <w:r>
+        <w:t xml:space="preserve"> </w:t>
+      </w:r>
+      <w:r>
+        <w:t xml:space="preserve">Literature-Based Health Assessment Using OHAT Approach</w:t>
+      </w:r>
+      <w:r>
+        <w:t xml:space="preserve"> </w:t>
+      </w:r>
+      <w:r>
+        <w:t xml:space="preserve">for</w:t>
+      </w:r>
+      <w:r>
+        <w:t xml:space="preserve"> </w:t>
+      </w:r>
+      <w:r>
+        <w:t xml:space="preserve">Systematic Review</w:t>
+      </w:r>
+      <w:r>
+        <w:t xml:space="preserve"> </w:t>
+      </w:r>
+      <w:r>
+        <w:t xml:space="preserve">and</w:t>
+      </w:r>
+      <w:r>
+        <w:t xml:space="preserve"> </w:t>
+      </w:r>
+      <w:r>
+        <w:t xml:space="preserve">Evidence Integration</w:t>
+      </w:r>
+      <w:r>
+        <w:t xml:space="preserve">. 2019;</w:t>
+      </w:r>
+      <w:r>
+        <w:t xml:space="preserve"> </w:t>
+      </w:r>
+    </w:p>
+    <w:bookmarkEnd w:id="118"/>
+    <w:bookmarkStart w:id="120" w:name="ref-plate2024DevelopmentToolRapid"/>
+    <w:p>
+      <w:pPr>
+        <w:pStyle w:val="Bibliography"/>
+      </w:pPr>
+      <w:r>
+        <w:t xml:space="preserve">34.</w:t>
+      </w:r>
+      <w:r>
+        <w:t xml:space="preserve"> </w:t>
+      </w:r>
+      <w:r>
+        <w:t xml:space="preserve">	</w:t>
+      </w:r>
+      <w:r>
         <w:t xml:space="preserve">Plate K, Knüppel S, Hornbacher A, Greiner M, Müller-Graf C.</w:t>
       </w:r>
       <w:r>
         <w:t xml:space="preserve"> </w:t>
       </w:r>
-      <w:hyperlink r:id="rId112">
+      <w:hyperlink r:id="rId119">
         <w:r>
           <w:rPr>
             <w:rStyle w:val="Hyperlink"/>
@@ -5939,14 +6666,14 @@
         <w:t xml:space="preserve"> </w:t>
       </w:r>
     </w:p>
-    <w:bookmarkEnd w:id="113"/>
-    <w:bookmarkStart w:id="115" w:name="ref-halabicky2023LowLevelLead"/>
+    <w:bookmarkEnd w:id="120"/>
+    <w:bookmarkStart w:id="122" w:name="ref-halabicky2023LowLevelLead"/>
     <w:p>
       <w:pPr>
         <w:pStyle w:val="Bibliography"/>
       </w:pPr>
       <w:r>
-        <w:t xml:space="preserve">34.</w:t>
+        <w:t xml:space="preserve">35.</w:t>
       </w:r>
       <w:r>
         <w:t xml:space="preserve"> </w:t>
@@ -5960,7 +6687,7 @@
       <w:r>
         <w:t xml:space="preserve"> </w:t>
       </w:r>
-      <w:hyperlink r:id="rId114">
+      <w:hyperlink r:id="rId121">
         <w:r>
           <w:rPr>
             <w:rStyle w:val="Hyperlink"/>
@@ -5999,14 +6726,14 @@
         <w:t xml:space="preserve"> </w:t>
       </w:r>
     </w:p>
-    <w:bookmarkEnd w:id="115"/>
-    <w:bookmarkStart w:id="117" w:name="ref-chen2005IQBloodLead"/>
+    <w:bookmarkEnd w:id="122"/>
+    <w:bookmarkStart w:id="124" w:name="ref-chen2005IQBloodLead"/>
     <w:p>
       <w:pPr>
         <w:pStyle w:val="Bibliography"/>
       </w:pPr>
       <w:r>
-        <w:t xml:space="preserve">35.</w:t>
+        <w:t xml:space="preserve">36.</w:t>
       </w:r>
       <w:r>
         <w:t xml:space="preserve"> </w:t>
@@ -6020,7 +6747,7 @@
       <w:r>
         <w:t xml:space="preserve"> </w:t>
       </w:r>
-      <w:hyperlink r:id="rId116">
+      <w:hyperlink r:id="rId123">
         <w:r>
           <w:rPr>
             <w:rStyle w:val="Hyperlink"/>
@@ -6245,14 +6972,14 @@
         <w:t xml:space="preserve"> </w:t>
       </w:r>
     </w:p>
-    <w:bookmarkEnd w:id="117"/>
-    <w:bookmarkStart w:id="119" w:name="Xcf7993c3f58afaabaf73be6238c67f4f63053d9"/>
+    <w:bookmarkEnd w:id="124"/>
+    <w:bookmarkStart w:id="126" w:name="Xcf7993c3f58afaabaf73be6238c67f4f63053d9"/>
     <w:p>
       <w:pPr>
         <w:pStyle w:val="Bibliography"/>
       </w:pPr>
       <w:r>
-        <w:t xml:space="preserve">36.</w:t>
+        <w:t xml:space="preserve">37.</w:t>
       </w:r>
       <w:r>
         <w:t xml:space="preserve"> </w:t>
@@ -6266,7 +6993,7 @@
       <w:r>
         <w:t xml:space="preserve"> </w:t>
       </w:r>
-      <w:hyperlink r:id="rId118">
+      <w:hyperlink r:id="rId125">
         <w:r>
           <w:rPr>
             <w:rStyle w:val="Hyperlink"/>
@@ -6341,14 +7068,14 @@
         <w:t xml:space="preserve"> </w:t>
       </w:r>
     </w:p>
-    <w:bookmarkEnd w:id="119"/>
-    <w:bookmarkStart w:id="121" w:name="X8e5230fc5b64bf627de98b910f1e221b6fea14c"/>
+    <w:bookmarkEnd w:id="126"/>
+    <w:bookmarkStart w:id="127" w:name="X4bd034c52731e178b4de125c2c778bdc533803c"/>
     <w:p>
       <w:pPr>
         <w:pStyle w:val="Bibliography"/>
       </w:pPr>
       <w:r>
-        <w:t xml:space="preserve">37.</w:t>
+        <w:t xml:space="preserve">38.</w:t>
       </w:r>
       <w:r>
         <w:t xml:space="preserve"> </w:t>
@@ -6357,34 +7084,179 @@
         <w:t xml:space="preserve">	</w:t>
       </w:r>
       <w:r>
-        <w:t xml:space="preserve">Rodríguez-Barranco M, Tobías A, Redondo D, Molina-Portillo E, Sánchez MJ.</w:t>
-      </w:r>
-      <w:r>
-        <w:t xml:space="preserve"> </w:t>
-      </w:r>
-      <w:hyperlink r:id="rId120">
-        <w:r>
-          <w:rPr>
-            <w:rStyle w:val="Hyperlink"/>
-          </w:rPr>
-          <w:t xml:space="preserve">Standardizing effect size from linear regression models with log-transformed variables for meta-analysis</w:t>
+        <w:t xml:space="preserve">R Core Team. R:</w:t>
+      </w:r>
+      <w:r>
+        <w:t xml:space="preserve"> </w:t>
+      </w:r>
+      <w:r>
+        <w:t xml:space="preserve">A Language</w:t>
+      </w:r>
+      <w:r>
+        <w:t xml:space="preserve"> </w:t>
+      </w:r>
+      <w:r>
+        <w:t xml:space="preserve">and</w:t>
+      </w:r>
+      <w:r>
+        <w:t xml:space="preserve"> </w:t>
+      </w:r>
+      <w:r>
+        <w:t xml:space="preserve">Environment</w:t>
+      </w:r>
+      <w:r>
+        <w:t xml:space="preserve"> </w:t>
+      </w:r>
+      <w:r>
+        <w:t xml:space="preserve">for</w:t>
+      </w:r>
+      <w:r>
+        <w:t xml:space="preserve"> </w:t>
+      </w:r>
+      <w:r>
+        <w:t xml:space="preserve">Statistical Computing</w:t>
+      </w:r>
+      <w:r>
+        <w:t xml:space="preserve">. Vienna, Austria: R Foundation for Statistical Computing; 2024.</w:t>
+      </w:r>
+      <w:r>
+        <w:t xml:space="preserve"> </w:t>
+      </w:r>
+    </w:p>
+    <w:bookmarkEnd w:id="127"/>
+    <w:bookmarkStart w:id="129" w:name="ref-burkner2017BrmsPackageBayesian"/>
+    <w:p>
+      <w:pPr>
+        <w:pStyle w:val="Bibliography"/>
+      </w:pPr>
+      <w:r>
+        <w:t xml:space="preserve">39.</w:t>
+      </w:r>
+      <w:r>
+        <w:t xml:space="preserve"> </w:t>
+      </w:r>
+      <w:r>
+        <w:t xml:space="preserve">	</w:t>
+      </w:r>
+      <w:r>
+        <w:t xml:space="preserve">Bürkner PC.</w:t>
+      </w:r>
+      <w:r>
+        <w:t xml:space="preserve"> </w:t>
+      </w:r>
+      <w:hyperlink r:id="rId128">
+        <w:r>
+          <w:rPr>
+            <w:rStyle w:val="Hyperlink"/>
+            <w:b/>
+            <w:bCs/>
+          </w:rPr>
+          <w:t xml:space="preserve">Brms</w:t>
+        </w:r>
+        <w:r>
+          <w:rPr>
+            <w:rStyle w:val="Hyperlink"/>
+          </w:rPr>
+          <w:t xml:space="preserve"> </w:t>
+        </w:r>
+        <w:r>
+          <w:rPr>
+            <w:rStyle w:val="Hyperlink"/>
+          </w:rPr>
+          <w:t xml:space="preserve">:</w:t>
+        </w:r>
+        <w:r>
+          <w:rPr>
+            <w:rStyle w:val="Hyperlink"/>
+          </w:rPr>
+          <w:t xml:space="preserve"> </w:t>
+        </w:r>
+        <w:r>
+          <w:rPr>
+            <w:rStyle w:val="Hyperlink"/>
+          </w:rPr>
+          <w:t xml:space="preserve">An</w:t>
+        </w:r>
+        <w:r>
+          <w:rPr>
+            <w:rStyle w:val="Hyperlink"/>
+          </w:rPr>
+          <w:t xml:space="preserve"> </w:t>
+        </w:r>
+        <w:r>
+          <w:rPr>
+            <w:rStyle w:val="Hyperlink"/>
+            <w:i/>
+            <w:iCs/>
+          </w:rPr>
+          <w:t xml:space="preserve">R</w:t>
+        </w:r>
+        <w:r>
+          <w:rPr>
+            <w:rStyle w:val="Hyperlink"/>
+          </w:rPr>
+          <w:t xml:space="preserve"> </w:t>
+        </w:r>
+        <w:r>
+          <w:rPr>
+            <w:rStyle w:val="Hyperlink"/>
+          </w:rPr>
+          <w:t xml:space="preserve">Package</w:t>
+        </w:r>
+        <w:r>
+          <w:rPr>
+            <w:rStyle w:val="Hyperlink"/>
+          </w:rPr>
+          <w:t xml:space="preserve"> </w:t>
+        </w:r>
+        <w:r>
+          <w:rPr>
+            <w:rStyle w:val="Hyperlink"/>
+          </w:rPr>
+          <w:t xml:space="preserve">for</w:t>
+        </w:r>
+        <w:r>
+          <w:rPr>
+            <w:rStyle w:val="Hyperlink"/>
+          </w:rPr>
+          <w:t xml:space="preserve"> </w:t>
+        </w:r>
+        <w:r>
+          <w:rPr>
+            <w:rStyle w:val="Hyperlink"/>
+          </w:rPr>
+          <w:t xml:space="preserve">Bayesian Multilevel Models Using</w:t>
+        </w:r>
+        <w:r>
+          <w:rPr>
+            <w:rStyle w:val="Hyperlink"/>
+          </w:rPr>
+          <w:t xml:space="preserve"> </w:t>
+        </w:r>
+        <w:r>
+          <w:rPr>
+            <w:rStyle w:val="Hyperlink"/>
+            <w:i/>
+            <w:iCs/>
+          </w:rPr>
+          <w:t xml:space="preserve">Stan</w:t>
         </w:r>
       </w:hyperlink>
       <w:r>
-        <w:t xml:space="preserve">. BMC Med Res Methodol. 2017 Dec;17(1):44.</w:t>
-      </w:r>
-      <w:r>
-        <w:t xml:space="preserve"> </w:t>
-      </w:r>
-    </w:p>
-    <w:bookmarkEnd w:id="121"/>
-    <w:bookmarkStart w:id="122" w:name="X4bd034c52731e178b4de125c2c778bdc533803c"/>
+        <w:t xml:space="preserve">. J Stat Soft. 2017;80(1).</w:t>
+      </w:r>
+      <w:r>
+        <w:t xml:space="preserve"> </w:t>
+      </w:r>
+    </w:p>
+    <w:bookmarkEnd w:id="129"/>
+    <w:bookmarkStart w:id="131" w:name="X7a078cdffdd6e8b0aafa2bdbd48e4ff223eee2f"/>
     <w:p>
       <w:pPr>
         <w:pStyle w:val="Bibliography"/>
       </w:pPr>
       <w:r>
-        <w:t xml:space="preserve">38.</w:t>
+        <w:t xml:space="preserve">40.</w:t>
       </w:r>
       <w:r>
         <w:t xml:space="preserve"> </w:t>
@@ -6393,25 +7265,175 @@
         <w:t xml:space="preserve">	</w:t>
       </w:r>
       <w:r>
-        <w:t xml:space="preserve">R Core Team. R:</w:t>
-      </w:r>
-      <w:r>
-        <w:t xml:space="preserve"> </w:t>
-      </w:r>
-      <w:r>
-        <w:t xml:space="preserve">A Language</w:t>
-      </w:r>
-      <w:r>
-        <w:t xml:space="preserve"> </w:t>
-      </w:r>
-      <w:r>
-        <w:t xml:space="preserve">and</w:t>
-      </w:r>
-      <w:r>
-        <w:t xml:space="preserve"> </w:t>
-      </w:r>
-      <w:r>
-        <w:t xml:space="preserve">Environment</w:t>
+        <w:t xml:space="preserve">Betancourt M.</w:t>
+      </w:r>
+      <w:r>
+        <w:t xml:space="preserve"> </w:t>
+      </w:r>
+      <w:hyperlink r:id="rId130">
+        <w:r>
+          <w:rPr>
+            <w:rStyle w:val="Hyperlink"/>
+          </w:rPr>
+          <w:t xml:space="preserve">A</w:t>
+        </w:r>
+        <w:r>
+          <w:rPr>
+            <w:rStyle w:val="Hyperlink"/>
+          </w:rPr>
+          <w:t xml:space="preserve"> </w:t>
+        </w:r>
+        <w:r>
+          <w:rPr>
+            <w:rStyle w:val="Hyperlink"/>
+          </w:rPr>
+          <w:t xml:space="preserve">Conceptual Introduction</w:t>
+        </w:r>
+        <w:r>
+          <w:rPr>
+            <w:rStyle w:val="Hyperlink"/>
+          </w:rPr>
+          <w:t xml:space="preserve"> </w:t>
+        </w:r>
+        <w:r>
+          <w:rPr>
+            <w:rStyle w:val="Hyperlink"/>
+          </w:rPr>
+          <w:t xml:space="preserve">to</w:t>
+        </w:r>
+        <w:r>
+          <w:rPr>
+            <w:rStyle w:val="Hyperlink"/>
+          </w:rPr>
+          <w:t xml:space="preserve"> </w:t>
+        </w:r>
+        <w:r>
+          <w:rPr>
+            <w:rStyle w:val="Hyperlink"/>
+          </w:rPr>
+          <w:t xml:space="preserve">Hamiltonian Monte Carlo</w:t>
+        </w:r>
+      </w:hyperlink>
+      <w:r>
+        <w:t xml:space="preserve">. arXiv; 2017.</w:t>
+      </w:r>
+      <w:r>
+        <w:t xml:space="preserve"> </w:t>
+      </w:r>
+    </w:p>
+    <w:bookmarkEnd w:id="131"/>
+    <w:bookmarkStart w:id="133" w:name="ref-hoffman2011NoUTurnSamplerAdaptively"/>
+    <w:p>
+      <w:pPr>
+        <w:pStyle w:val="Bibliography"/>
+      </w:pPr>
+      <w:r>
+        <w:t xml:space="preserve">41.</w:t>
+      </w:r>
+      <w:r>
+        <w:t xml:space="preserve"> </w:t>
+      </w:r>
+      <w:r>
+        <w:t xml:space="preserve">	</w:t>
+      </w:r>
+      <w:r>
+        <w:t xml:space="preserve">Hoffman MD, Gelman A.</w:t>
+      </w:r>
+      <w:r>
+        <w:t xml:space="preserve"> </w:t>
+      </w:r>
+      <w:hyperlink r:id="rId132">
+        <w:r>
+          <w:rPr>
+            <w:rStyle w:val="Hyperlink"/>
+          </w:rPr>
+          <w:t xml:space="preserve">The</w:t>
+        </w:r>
+        <w:r>
+          <w:rPr>
+            <w:rStyle w:val="Hyperlink"/>
+          </w:rPr>
+          <w:t xml:space="preserve"> </w:t>
+        </w:r>
+        <w:r>
+          <w:rPr>
+            <w:rStyle w:val="Hyperlink"/>
+          </w:rPr>
+          <w:t xml:space="preserve">No-U-Turn Sampler</w:t>
+        </w:r>
+        <w:r>
+          <w:rPr>
+            <w:rStyle w:val="Hyperlink"/>
+          </w:rPr>
+          <w:t xml:space="preserve">:</w:t>
+        </w:r>
+        <w:r>
+          <w:rPr>
+            <w:rStyle w:val="Hyperlink"/>
+          </w:rPr>
+          <w:t xml:space="preserve"> </w:t>
+        </w:r>
+        <w:r>
+          <w:rPr>
+            <w:rStyle w:val="Hyperlink"/>
+          </w:rPr>
+          <w:t xml:space="preserve">Adaptively Setting Path Lengths</w:t>
+        </w:r>
+        <w:r>
+          <w:rPr>
+            <w:rStyle w:val="Hyperlink"/>
+          </w:rPr>
+          <w:t xml:space="preserve"> </w:t>
+        </w:r>
+        <w:r>
+          <w:rPr>
+            <w:rStyle w:val="Hyperlink"/>
+          </w:rPr>
+          <w:t xml:space="preserve">in</w:t>
+        </w:r>
+        <w:r>
+          <w:rPr>
+            <w:rStyle w:val="Hyperlink"/>
+          </w:rPr>
+          <w:t xml:space="preserve"> </w:t>
+        </w:r>
+        <w:r>
+          <w:rPr>
+            <w:rStyle w:val="Hyperlink"/>
+          </w:rPr>
+          <w:t xml:space="preserve">Hamiltonian Monte Carlo</w:t>
+        </w:r>
+      </w:hyperlink>
+      <w:r>
+        <w:t xml:space="preserve">. arXiv; 2011.</w:t>
+      </w:r>
+      <w:r>
+        <w:t xml:space="preserve"> </w:t>
+      </w:r>
+    </w:p>
+    <w:bookmarkEnd w:id="133"/>
+    <w:bookmarkStart w:id="134" w:name="X21bf392f662dc1b38e9a7fa4b314fc7a471696b"/>
+    <w:p>
+      <w:pPr>
+        <w:pStyle w:val="Bibliography"/>
+      </w:pPr>
+      <w:r>
+        <w:t xml:space="preserve">42.</w:t>
+      </w:r>
+      <w:r>
+        <w:t xml:space="preserve"> </w:t>
+      </w:r>
+      <w:r>
+        <w:t xml:space="preserve">	</w:t>
+      </w:r>
+      <w:r>
+        <w:t xml:space="preserve">Gabry J, Mahr T. Bayesplot:</w:t>
+      </w:r>
+      <w:r>
+        <w:t xml:space="preserve"> </w:t>
+      </w:r>
+      <w:r>
+        <w:t xml:space="preserve">Plotting</w:t>
       </w:r>
       <w:r>
         <w:t xml:space="preserve"> </w:t>
@@ -6423,23 +7445,23 @@
         <w:t xml:space="preserve"> </w:t>
       </w:r>
       <w:r>
-        <w:t xml:space="preserve">Statistical Computing</w:t>
-      </w:r>
-      <w:r>
-        <w:t xml:space="preserve">. Vienna, Austria: R Foundation for Statistical Computing; 2024.</w:t>
-      </w:r>
-      <w:r>
-        <w:t xml:space="preserve"> </w:t>
-      </w:r>
-    </w:p>
-    <w:bookmarkEnd w:id="122"/>
-    <w:bookmarkStart w:id="124" w:name="X111bb06244f8f2a1a6d0d2f1f41c24b71f248e6"/>
+        <w:t xml:space="preserve">Bayesian Models</w:t>
+      </w:r>
+      <w:r>
+        <w:t xml:space="preserve">. 2025.</w:t>
+      </w:r>
+      <w:r>
+        <w:t xml:space="preserve"> </w:t>
+      </w:r>
+    </w:p>
+    <w:bookmarkEnd w:id="134"/>
+    <w:bookmarkStart w:id="136" w:name="X111bb06244f8f2a1a6d0d2f1f41c24b71f248e6"/>
     <w:p>
       <w:pPr>
         <w:pStyle w:val="Bibliography"/>
       </w:pPr>
       <w:r>
-        <w:t xml:space="preserve">39.</w:t>
+        <w:t xml:space="preserve">43.</w:t>
       </w:r>
       <w:r>
         <w:t xml:space="preserve"> </w:t>
@@ -6453,7 +7475,7 @@
       <w:r>
         <w:t xml:space="preserve"> </w:t>
       </w:r>
-      <w:hyperlink r:id="rId123">
+      <w:hyperlink r:id="rId135">
         <w:r>
           <w:rPr>
             <w:rStyle w:val="Hyperlink"/>
@@ -6510,9 +7532,9 @@
         <w:t xml:space="preserve"> </w:t>
       </w:r>
     </w:p>
-    <w:bookmarkEnd w:id="124"/>
-    <w:bookmarkEnd w:id="125"/>
-    <w:bookmarkEnd w:id="126"/>
+    <w:bookmarkEnd w:id="136"/>
+    <w:bookmarkEnd w:id="137"/>
+    <w:bookmarkEnd w:id="138"/>
     <w:sectPr>
       <w:footerReference r:id="rId9" w:type="default"/>
       <w:footnotePr>
@@ -6939,16 +7961,16 @@
     <w:abstractNumId w:val="993"/>
   </w:num>
   <w:num w:numId="1006">
-    <w:abstractNumId w:val="993"/>
+    <w:abstractNumId w:val="992"/>
   </w:num>
   <w:num w:numId="1007">
-    <w:abstractNumId w:val="992"/>
+    <w:abstractNumId w:val="993"/>
   </w:num>
   <w:num w:numId="1008">
     <w:abstractNumId w:val="993"/>
   </w:num>
   <w:num w:numId="1009">
-    <w:abstractNumId w:val="993"/>
+    <w:abstractNumId w:val="992"/>
   </w:num>
   <w:num w:numId="1010">
     <w:abstractNumId w:val="992"/>
@@ -6957,7 +7979,7 @@
     <w:abstractNumId w:val="992"/>
   </w:num>
   <w:num w:numId="1012">
-    <w:abstractNumId w:val="991"/>
+    <w:abstractNumId w:val="992"/>
   </w:num>
   <w:num w:numId="1013">
     <w:abstractNumId w:val="992"/>
@@ -6975,21 +7997,6 @@
     <w:abstractNumId w:val="992"/>
   </w:num>
   <w:num w:numId="1018">
-    <w:abstractNumId w:val="992"/>
-  </w:num>
-  <w:num w:numId="1019">
-    <w:abstractNumId w:val="992"/>
-  </w:num>
-  <w:num w:numId="1020">
-    <w:abstractNumId w:val="992"/>
-  </w:num>
-  <w:num w:numId="1021">
-    <w:abstractNumId w:val="992"/>
-  </w:num>
-  <w:num w:numId="1022">
-    <w:abstractNumId w:val="992"/>
-  </w:num>
-  <w:num w:numId="1023">
     <w:abstractNumId w:val="992"/>
   </w:num>
 </w:numbering>

</xml_diff>

<commit_message>
version before fixing error in lucchini2019 ERF conversion
</commit_message>
<xml_diff>
--- a/manuscript/manuscript.docx
+++ b/manuscript/manuscript.docx
@@ -4342,10 +4342,13 @@
         <w:t xml:space="preserve"> </w:t>
       </w:r>
       <w:r>
-        <w:t xml:space="preserve">For example, one of the included studies that reported a very low effect has been conducted within populations that lived in an exposure hotspot (highly industrial area)</w:t>
-      </w:r>
-      <w:r>
-        <w:t xml:space="preserve">(48)</w:t>
+        <w:t xml:space="preserve">For example, one of the included studies that reported a very low effect has been conducted within a relatively low-exposed population</w:t>
+      </w:r>
+      <w:r>
+        <w:t xml:space="preserve"> </w:t>
+      </w:r>
+      <w:r>
+        <w:t xml:space="preserve">(42)</w:t>
       </w:r>
       <w:r>
         <w:t xml:space="preserve">.</w:t>
@@ -4354,7 +4357,7 @@
         <w:t xml:space="preserve"> </w:t>
       </w:r>
       <w:r>
-        <w:t xml:space="preserve">If there is little variation in exposure in the sample, a strong effect cannot be detected.</w:t>
+        <w:t xml:space="preserve">Missing variation in exposure in the sample limits the detectability of an effect.</w:t>
       </w:r>
       <w:r>
         <w:br/>

</xml_diff>

<commit_message>
worked on Bayesian forest plot
</commit_message>
<xml_diff>
--- a/manuscript/manuscript.docx
+++ b/manuscript/manuscript.docx
@@ -1001,7 +1001,7 @@
         <w:t xml:space="preserve"> </w:t>
       </w:r>
       <w:r>
-        <w:t xml:space="preserve">substance (Pb - including Mesh terms), outcome (IQ and neurodevelopment), population (children) and results (association, ERF) (Table 1).</w:t>
+        <w:t xml:space="preserve">substance (Pb - including Mesh terms), outcome (IQ and neurodevelopment), population (children) and results (association, ERF) (Tab. 1).</w:t>
       </w:r>
     </w:p>
     <w:p>
@@ -3057,7 +3057,7 @@
         <w:t xml:space="preserve"> </w:t>
       </w:r>
       <w:r>
-        <w:t xml:space="preserve">Study characteristics and regression coefficients are shown in table 2.</w:t>
+        <w:t xml:space="preserve">Study characteristics and regression coefficients are shown in Tab. 2.</w:t>
       </w:r>
     </w:p>
     <w:p>
@@ -3406,7 +3406,7 @@
         <w:t xml:space="preserve">The frequentist approach produced a comparable pooled estimate of -2.45 (95% confidence interval (CI): -3.7; -1.2).</w:t>
       </w:r>
       <w:r>
-        <w:t xml:space="preserve"> </w:t>
+        <w:br/>
       </w:r>
       <w:r>
         <w:t xml:space="preserve">Substantial between-study heterogeneity was observed under both frameworks.</w:t>
@@ -3663,13 +3663,19 @@
         <w:pStyle w:val="BodyText"/>
       </w:pPr>
       <w:r>
-        <w:t xml:space="preserve">The study estimates depicted in Fig. 2 are not the same in both approaches because the Bayesian model estimates a posterior distribution for every individual study that is influenced by all of the included studies as well as the priors.</w:t>
-      </w:r>
-      <w:r>
-        <w:t xml:space="preserve"> </w:t>
-      </w:r>
-      <w:r>
-        <w:t xml:space="preserve">This leads to a shrinkage of the mean coefficients towards the pooled effect and is comparable to the inverse-variance weighting in frequentist meta-analyses.</w:t>
+        <w:t xml:space="preserve">The single study estimates depicted in Fig. 2 are not the same in both approaches because the Bayesian model estimates a posterior distribution for every individual study, which is displayed in the forest plot.</w:t>
+      </w:r>
+      <w:r>
+        <w:t xml:space="preserve"> </w:t>
+      </w:r>
+      <w:r>
+        <w:t xml:space="preserve">The posterior distributions are influenced by all other included studies as well as the specified priors.</w:t>
+      </w:r>
+      <w:r>
+        <w:t xml:space="preserve"> </w:t>
+      </w:r>
+      <w:r>
+        <w:t xml:space="preserve">This leads to a shrinkage of the posterior means towards the pooled effect and is comparable to the inverse-variance weighting in frequentist meta-analyses.</w:t>
       </w:r>
     </w:p>
     <w:bookmarkEnd w:id="48"/>
@@ -3687,7 +3693,7 @@
         <w:pStyle w:val="FirstParagraph"/>
       </w:pPr>
       <w:r>
-        <w:t xml:space="preserve">We conducted two sets of sensitivity analyses, the results are shown in table 4.</w:t>
+        <w:t xml:space="preserve">We conducted two sets of sensitivity analyses, which the results are shown for in Tab. 4.</w:t>
       </w:r>
       <w:r>
         <w:t xml:space="preserve"> </w:t>
@@ -3826,7 +3832,7 @@
         </m:d>
       </m:oMath>
       <w:r>
-        <w:t xml:space="preserve">),the posterior mean</w:t>
+        <w:t xml:space="preserve">), the posterior mean of</w:t>
       </w:r>
       <w:r>
         <w:t xml:space="preserve"> </w:t>
@@ -3953,7 +3959,7 @@
         </m:d>
       </m:oMath>
       <w:r>
-        <w:t xml:space="preserve">), the posterior mean</w:t>
+        <w:t xml:space="preserve">), the posterior mean of</w:t>
       </w:r>
       <w:r>
         <w:t xml:space="preserve"> </w:t>
@@ -3967,31 +3973,19 @@
         <w:t xml:space="preserve"> </w:t>
       </w:r>
       <w:r>
-        <w:t xml:space="preserve">increases slightly.</w:t>
-      </w:r>
-      <w:r>
-        <w:t xml:space="preserve"> </w:t>
-      </w:r>
-      <w:r>
-        <w:t xml:space="preserve">In this case, more</w:t>
-      </w:r>
-      <w:r>
-        <w:t xml:space="preserve"> </w:t>
-      </w:r>
-      <w:r>
-        <w:t xml:space="preserve">“trust”</w:t>
-      </w:r>
-      <w:r>
-        <w:t xml:space="preserve"> </w:t>
-      </w:r>
-      <w:r>
-        <w:t xml:space="preserve">is given to studies reporting high effects with large uncertainty ranges.</w:t>
-      </w:r>
-      <w:r>
-        <w:t xml:space="preserve"> </w:t>
-      </w:r>
-      <w:r>
-        <w:t xml:space="preserve">The results of the prior sensitivity analysis strengthens the priors specified for the main analysis.</w:t>
+        <w:t xml:space="preserve">increases slightly compared to the main model.</w:t>
+      </w:r>
+      <w:r>
+        <w:t xml:space="preserve"> </w:t>
+      </w:r>
+      <w:r>
+        <w:t xml:space="preserve">Using this set of priors, more weight is given to studies reporting high effects with large uncertainty ranges.</w:t>
+      </w:r>
+      <w:r>
+        <w:t xml:space="preserve"> </w:t>
+      </w:r>
+      <w:r>
+        <w:t xml:space="preserve">The results of the prior sensitivity analysis support the specified set of priors in the main analysis.</w:t>
       </w:r>
       <w:r>
         <w:t xml:space="preserve"> </w:t>
@@ -4046,7 +4040,7 @@
         <w:t xml:space="preserve"> </w:t>
       </w:r>
       <w:r>
-        <w:t xml:space="preserve">For example, in previous studies, the effect of lead has been estimated for increases in defined exposure categories</w:t>
+        <w:t xml:space="preserve">For example, in previous studies, the effect of lead has been estimated for increases in exposure categories</w:t>
       </w:r>
       <w:r>
         <w:t xml:space="preserve"> </w:t>
@@ -4061,8 +4055,20 @@
         <w:t xml:space="preserve"> </w:t>
       </w:r>
       <w:r>
-        <w:t xml:space="preserve">Also, different coefficients like partial r</w:t>
-      </w:r>
+        <w:t xml:space="preserve">Also, different coefficients like partial</w:t>
+      </w:r>
+      <w:r>
+        <w:t xml:space="preserve"> </w:t>
+      </w:r>
+      <m:oMath>
+        <m:r>
+          <m:rPr>
+            <m:nor/>
+            <m:sty m:val="p"/>
+          </m:rPr>
+          <m:t>r</m:t>
+        </m:r>
+      </m:oMath>
       <w:r>
         <w:t xml:space="preserve"> </w:t>
       </w:r>
@@ -4085,7 +4091,7 @@
         <w:t xml:space="preserve"> </w:t>
       </w:r>
       <w:r>
-        <w:t xml:space="preserve">have been estimated in previous meta-analyses.</w:t>
+        <w:t xml:space="preserve">have been estimated in previous meta-analyses on the association of lead exposure on children’s IQ.</w:t>
       </w:r>
     </w:p>
     <w:p>
@@ -4093,19 +4099,19 @@
         <w:pStyle w:val="BodyText"/>
       </w:pPr>
       <w:r>
-        <w:t xml:space="preserve">We observed substantial heterogeneity in the studies included in this meta-analysis.</w:t>
-      </w:r>
-      <w:r>
-        <w:t xml:space="preserve"> </w:t>
-      </w:r>
-      <w:r>
-        <w:t xml:space="preserve">Multiple differences in study population (size, location, age, exposure range) and statistical methods, especially the covariates included in the statistical models (adjustment set) might have caused heterogeneity between the studies (see table 2).</w:t>
-      </w:r>
-      <w:r>
-        <w:t xml:space="preserve"> </w:t>
-      </w:r>
-      <w:r>
-        <w:t xml:space="preserve">For example, two of the studies that reported a very low effect has been conducted within a relatively low-exposed population</w:t>
+        <w:t xml:space="preserve">We estimated substantial heterogeneity in this meta-analysis.</w:t>
+      </w:r>
+      <w:r>
+        <w:t xml:space="preserve"> </w:t>
+      </w:r>
+      <w:r>
+        <w:t xml:space="preserve">Differences in study population (size, location, age, exposure range) and statistical methods, especially the covariates included in the statistical models (adjustment set) might explain the estimated between-study heterogeneity (see Tab. 2).</w:t>
+      </w:r>
+      <w:r>
+        <w:t xml:space="preserve"> </w:t>
+      </w:r>
+      <w:r>
+        <w:t xml:space="preserve">For example, two of the studies reporting very low effects have been conducted in a relatively low-exposed population</w:t>
       </w:r>
       <w:r>
         <w:t xml:space="preserve"> </w:t>
@@ -4120,13 +4126,13 @@
         <w:t xml:space="preserve"> </w:t>
       </w:r>
       <w:r>
-        <w:t xml:space="preserve">Missing variation in exposure variable limits the detectability of an effect and might result in a very low reported effect.</w:t>
+        <w:t xml:space="preserve">Missing variation in the exposure variable limits the detectability of an effect and might result in very low reported effects.</w:t>
       </w:r>
       <w:r>
         <w:br/>
       </w:r>
       <w:r>
-        <w:t xml:space="preserve">The included studies are based on population samples from multiple different regions (North America: 4, South America: 1, Europe: 3, Asia: 3, Australia: 1) and some populations have been sampled in hotspot regions with presumably higher lead concentrations</w:t>
+        <w:t xml:space="preserve">The included studies have been conducted in multiple different regions of the world (North America: 4, South America: 1, Europe: 3, Asia: 3, Australia: 1) and some populations have been sampled in hotspot regions with presumably higher lead concentrations</w:t>
       </w:r>
       <w:r>
         <w:t xml:space="preserve"> </w:t>
@@ -4147,7 +4153,7 @@
         <w:br/>
       </w:r>
       <w:r>
-        <w:t xml:space="preserve">Using an IQ test that has not been culturally adapted to the population it is used in, the IQ score results may be an underestimate of the true IQ.</w:t>
+        <w:t xml:space="preserve">Using an IQ test that has not been adapted to the population it is used for may result in underestimated IQ scores.</w:t>
       </w:r>
       <w:r>
         <w:t xml:space="preserve"> </w:t>
@@ -4233,40 +4239,108 @@
         <w:t xml:space="preserve">(5)</w:t>
       </w:r>
       <w:r>
+        <w:t xml:space="preserve">, that estimated the burden of disease in 204 countries and for several health risks, including lead exposure.</w:t>
+      </w:r>
+      <w:r>
+        <w:t xml:space="preserve"> </w:t>
+      </w:r>
+      <w:r>
+        <w:t xml:space="preserve">The main driver for the high RoB identified in the analysis of Crump et al. is the stepwise backward-elimination regression approach, which is central to their findings and has received substantial criticism</w:t>
+      </w:r>
+      <w:r>
+        <w:t xml:space="preserve"> </w:t>
+      </w:r>
+      <w:r>
+        <w:t xml:space="preserve">(51,55,56)</w:t>
+      </w:r>
+      <w:r>
         <w:t xml:space="preserve">.</w:t>
       </w:r>
       <w:r>
         <w:t xml:space="preserve"> </w:t>
       </w:r>
       <w:r>
-        <w:t xml:space="preserve">In this study, the burden of disease in 204 countries and for several health risks, including lead exposure was estimated.</w:t>
-      </w:r>
-      <w:r>
-        <w:t xml:space="preserve"> </w:t>
-      </w:r>
-      <w:r>
-        <w:t xml:space="preserve">The main driver for the high RoB identified in the analysis of Crump et al. is the stepwise backward-elimination regression approach, which is central to their findings and has received substantial criticism</w:t>
-      </w:r>
-      <w:r>
-        <w:t xml:space="preserve"> </w:t>
-      </w:r>
-      <w:r>
-        <w:t xml:space="preserve">(51,55,56)</w:t>
+        <w:t xml:space="preserve">This highlights the need for an updated evidence synthesis which we provide in this study.</w:t>
+      </w:r>
+    </w:p>
+    <w:p>
+      <w:pPr>
+        <w:pStyle w:val="BodyText"/>
+      </w:pPr>
+      <w:r>
+        <w:t xml:space="preserve">We do not only provide an updated effect measure for the association of lead and IQ, but additionally compare a more conventional, frequentist approach to meta-analysis to a Bayesian approach that is less used in the field of environmental epidemiology to date.</w:t>
+      </w:r>
+      <w:r>
+        <w:t xml:space="preserve"> </w:t>
+      </w:r>
+      <w:r>
+        <w:t xml:space="preserve">Pooled effects and measures of heterogeneity were largely consistent in both approaches.</w:t>
+      </w:r>
+      <w:r>
+        <w:t xml:space="preserve"> </w:t>
+      </w:r>
+      <w:r>
+        <w:t xml:space="preserve">Slightly lower mean pooled effects were estimated by the Bayesian model.</w:t>
+      </w:r>
+      <w:r>
+        <w:t xml:space="preserve"> </w:t>
+      </w:r>
+      <w:r>
+        <w:t xml:space="preserve">The prior sensitivity analyses shows that this is caused by posterior shrinkage of the study-level estimates, comparable to inverse-variance weighting in frequentist meta-analysis, together with the regularizing effect of the specified priors.</w:t>
+      </w:r>
+      <w:r>
+        <w:t xml:space="preserve"> </w:t>
+      </w:r>
+      <w:r>
+        <w:t xml:space="preserve">Importantly, this difference does not materially affect the overall interpretation of the association between lead exposure and IQ.</w:t>
+      </w:r>
+      <w:r>
+        <w:t xml:space="preserve"> </w:t>
+      </w:r>
+      <w:r>
+        <w:t xml:space="preserve">However, it illustrates that Bayesian meta-analysis can be less sensitive to outlier studies reporting large effects with substantial uncertainty, if priors (more specifically the prior for heterogeneity) reflecting plausible domain knowledge or expectations are specified.</w:t>
+      </w:r>
+      <w:r>
+        <w:t xml:space="preserve"> </w:t>
+      </w:r>
+      <w:r>
+        <w:t xml:space="preserve">In contrast, frequentist meta-analytic models implicitly rely on flat or non-informative priors, which result in greater sensitivity to outliers</w:t>
+      </w:r>
+      <w:r>
+        <w:t xml:space="preserve"> </w:t>
+      </w:r>
+      <w:r>
+        <w:t xml:space="preserve">(57)</w:t>
       </w:r>
       <w:r>
         <w:t xml:space="preserve">.</w:t>
       </w:r>
       <w:r>
-        <w:t xml:space="preserve"> </w:t>
-      </w:r>
-      <w:r>
-        <w:t xml:space="preserve">This highlights the need for an updated evidence synthesis which we provide in this study.</w:t>
-      </w:r>
-      <w:r>
         <w:br/>
       </w:r>
       <w:r>
-        <w:t xml:space="preserve">This study does not only provide an updated effect measure for the association of lead and IQ, but additionally compares a more conventional, frequentist approach to meta-analysis to a Bayesian approach that is less used in environmental epidemiology to date.</w:t>
+        <w:t xml:space="preserve">Conducting a Bayesian meta-analysis can be laborious compared to frequentist approaches, as it requires more statistical knowledge, explicit consideration of modelling assumptions, and in practice often more programming effort</w:t>
+      </w:r>
+      <w:r>
+        <w:t xml:space="preserve"> </w:t>
+      </w:r>
+      <w:r>
+        <w:t xml:space="preserve">(58)</w:t>
+      </w:r>
+      <w:r>
+        <w:t xml:space="preserve">.</w:t>
+      </w:r>
+      <w:r>
+        <w:t xml:space="preserve"> </w:t>
+      </w:r>
+      <w:r>
+        <w:t xml:space="preserve">While these might initially appear as disadvantages, they can equally be understood as methodological safeguards:</w:t>
+      </w:r>
+      <w:r>
+        <w:t xml:space="preserve"> </w:t>
+      </w:r>
+      <w:r>
+        <w:t xml:space="preserve">by requiring researchers to state their assumptions explicitly rather than accepting defaults embedded in software, the Bayesian approach encourages engagement with the data and the modelling assumptions being made.</w:t>
       </w:r>
     </w:p>
     <w:p>
@@ -4274,73 +4348,94 @@
         <w:pStyle w:val="BodyText"/>
       </w:pPr>
       <w:r>
-        <w:t xml:space="preserve">Pooled effects and measures of heterogeneity were largely consistent in both approaches.</w:t>
-      </w:r>
-      <w:r>
-        <w:t xml:space="preserve"> </w:t>
-      </w:r>
-      <w:r>
-        <w:t xml:space="preserve">Slightly lower mean pooled effects were estimated by the Bayesian model.</w:t>
-      </w:r>
-      <w:r>
-        <w:t xml:space="preserve"> </w:t>
-      </w:r>
-      <w:r>
-        <w:t xml:space="preserve">The prior sensitivity analyses shows that this is caused by posterior shrinkage of the study-level estimates, comparable to inverse-variance weighting in frequentist meta-analysis, together with the regularizing effect of the specified priors.</w:t>
-      </w:r>
-      <w:r>
-        <w:t xml:space="preserve"> </w:t>
-      </w:r>
-      <w:r>
-        <w:t xml:space="preserve">Importantly, this difference does not materially affect the overall interpretation of the association between lead exposure and IQ.</w:t>
-      </w:r>
-      <w:r>
-        <w:t xml:space="preserve"> </w:t>
-      </w:r>
-      <w:r>
-        <w:t xml:space="preserve">However, it illustrates that Bayesian meta-analysis can be less sensitive to outlier studies reporting large effects with substantial uncertainty, if priors (more specifically the prior for heterogeneity) reflecting plausible domain knowledge or expectations are specified.</w:t>
-      </w:r>
-      <w:r>
-        <w:t xml:space="preserve"> </w:t>
-      </w:r>
-      <w:r>
-        <w:t xml:space="preserve">In contrast, frequentist meta-analytic models implicitly rely on flat or non-informative priors, which result in greater sensitivity to outliers</w:t>
-      </w:r>
-      <w:r>
-        <w:t xml:space="preserve"> </w:t>
-      </w:r>
-      <w:r>
-        <w:t xml:space="preserve">(57)</w:t>
+        <w:t xml:space="preserve">The results of Bayesian models are inherently distributional, which is an important difference to point estimates (central estimate, CI) produced by frequentist models.</w:t>
+      </w:r>
+      <w:r>
+        <w:t xml:space="preserve"> </w:t>
+      </w:r>
+      <w:r>
+        <w:t xml:space="preserve">These distributional results offer distinct advantages, particularly for risk assessment and policy-making.</w:t>
+      </w:r>
+      <w:r>
+        <w:t xml:space="preserve"> </w:t>
+      </w:r>
+      <w:r>
+        <w:t xml:space="preserve">First, any credible interval can be derived from the posterior distribution according to the needs of researchers, decision-makers, or other stakeholders.</w:t>
+      </w:r>
+      <w:r>
+        <w:t xml:space="preserve"> </w:t>
+      </w:r>
+      <w:r>
+        <w:t xml:space="preserve">These allow direct probability statements about parameter values, unlike confidence intervals which are frequently but incorrectly interpreted probabilistically.</w:t>
+      </w:r>
+      <w:r>
+        <w:br/>
+      </w:r>
+      <w:r>
+        <w:t xml:space="preserve">Second, posterior distributions enable probabilistic comparisons across multiple health risks, such as calculating the probability that one risk exceeds another.</w:t>
+      </w:r>
+      <w:r>
+        <w:t xml:space="preserve"> </w:t>
+      </w:r>
+      <w:r>
+        <w:t xml:space="preserve">When meaningful thresholds of effect size or health risk are defined, exceedance probabilities can be directly obtained from the posterior distribution, providing an intuitive and policy-relevant summary of uncertainty.</w:t>
+      </w:r>
+      <w:r>
+        <w:br/>
+      </w:r>
+      <w:r>
+        <w:t xml:space="preserve">Posterior distributions of meta-analyses together with the specified statistical model can be used to predict theoretical future epidemiological studies.</w:t>
+      </w:r>
+      <w:r>
+        <w:t xml:space="preserve"> </w:t>
+      </w:r>
+      <w:r>
+        <w:t xml:space="preserve">This offers an additional way of representing between-study heterogeneity.</w:t>
+      </w:r>
+      <w:r>
+        <w:t xml:space="preserve"> </w:t>
+      </w:r>
+      <w:r>
+        <w:t xml:space="preserve">Also, the population-level health impact of an exposure under specified conditions can be estimated using the posterior distribution.</w:t>
+      </w:r>
+      <w:r>
+        <w:t xml:space="preserve"> </w:t>
+      </w:r>
+      <w:r>
+        <w:t xml:space="preserve">The latter application is known as Environmental Burden of Disease (EBD).</w:t>
+      </w:r>
+      <w:r>
+        <w:br/>
+      </w:r>
+      <w:r>
+        <w:t xml:space="preserve">In EBD studies, the health impacts of an exposure on a defined population are quantified and summarized using metrics such as disability-adjusted life years (DALYs).</w:t>
+      </w:r>
+      <w:r>
+        <w:t xml:space="preserve"> </w:t>
+      </w:r>
+      <w:r>
+        <w:t xml:space="preserve">These estimates enable comparisons of the impact of multiple health determinants within a population, as well as comparisons of the same determinant across populations or countries.</w:t>
+      </w:r>
+      <w:r>
+        <w:t xml:space="preserve"> </w:t>
+      </w:r>
+      <w:r>
+        <w:t xml:space="preserve">EBD integrates both population exposure and the associated exposure–response relationship (e.g. relative risk / beta coefficient)</w:t>
+      </w:r>
+      <w:r>
+        <w:t xml:space="preserve"> </w:t>
+      </w:r>
+      <w:r>
+        <w:t xml:space="preserve">(59)</w:t>
       </w:r>
       <w:r>
         <w:t xml:space="preserve">.</w:t>
       </w:r>
       <w:r>
-        <w:br/>
-      </w:r>
-      <w:r>
-        <w:t xml:space="preserve">Conducting a Bayesian meta-analysis can be laborious compared to frequentist approaches, as it requires more statistical knowledge, explicit consideration of modelling assumptions, and in practice often more programming effort</w:t>
-      </w:r>
-      <w:r>
-        <w:t xml:space="preserve"> </w:t>
-      </w:r>
-      <w:r>
-        <w:t xml:space="preserve">(58)</w:t>
-      </w:r>
-      <w:r>
-        <w:t xml:space="preserve">.</w:t>
-      </w:r>
-      <w:r>
-        <w:t xml:space="preserve"> </w:t>
-      </w:r>
-      <w:r>
-        <w:t xml:space="preserve">While these might initially appear as disadvantages, they can equally be understood as methodological safeguards:</w:t>
-      </w:r>
-      <w:r>
-        <w:t xml:space="preserve"> </w:t>
-      </w:r>
-      <w:r>
-        <w:t xml:space="preserve">by requiring researchers to state their assumptions explicitly rather than accepting defaults embedded in software, the Bayesian approach encourages engagement with the data and the modelling assumptions being made.</w:t>
+        <w:t xml:space="preserve"> </w:t>
+      </w:r>
+      <w:r>
+        <w:t xml:space="preserve">The distributional results of this study enable probabilistic EBD assessments using Monte Carlo simulations without additional assumptions on uncertainty distributions on the exposure-response function.</w:t>
       </w:r>
     </w:p>
     <w:p>
@@ -4348,94 +4443,55 @@
         <w:pStyle w:val="BodyText"/>
       </w:pPr>
       <w:r>
-        <w:t xml:space="preserve">The results of Bayesian models are inherently distributional, which is an important difference to point estimates (central estimate, CI) produced by frequentist models.</w:t>
-      </w:r>
-      <w:r>
-        <w:t xml:space="preserve"> </w:t>
-      </w:r>
-      <w:r>
-        <w:t xml:space="preserve">These distributional results offer distinct advantages, particularly for risk assessment and policy-making.</w:t>
-      </w:r>
-      <w:r>
-        <w:t xml:space="preserve"> </w:t>
-      </w:r>
-      <w:r>
-        <w:t xml:space="preserve">First, any credible interval can be derived from the posterior distribution according to the needs of researchers, decision-makers, or other stakeholders.</w:t>
-      </w:r>
-      <w:r>
-        <w:t xml:space="preserve"> </w:t>
-      </w:r>
-      <w:r>
-        <w:t xml:space="preserve">These allow direct probability statements about parameter values, unlike confidence intervals which are frequently but incorrectly interpreted probabilistically.</w:t>
-      </w:r>
-      <w:r>
-        <w:br/>
-      </w:r>
-      <w:r>
-        <w:t xml:space="preserve">Second, posterior distributions enable probabilistic comparisons across multiple health risks, such as calculating the probability that one risk exceeds another.</w:t>
-      </w:r>
-      <w:r>
-        <w:t xml:space="preserve"> </w:t>
-      </w:r>
-      <w:r>
-        <w:t xml:space="preserve">When meaningful thresholds of effect size or health risk are defined, exceedance probabilities can be directly obtained from the posterior distribution, providing an intuitive and policy-relevant summary of uncertainty.</w:t>
-      </w:r>
-      <w:r>
-        <w:br/>
-      </w:r>
-      <w:r>
-        <w:t xml:space="preserve">Posterior distributions of meta-analyses together with the specified statistical model can be used to predict theoretical future epidemiological studies.</w:t>
-      </w:r>
-      <w:r>
-        <w:t xml:space="preserve"> </w:t>
-      </w:r>
-      <w:r>
-        <w:t xml:space="preserve">This offers an additional way of representing between-study heterogeneity.</w:t>
-      </w:r>
-      <w:r>
-        <w:t xml:space="preserve"> </w:t>
-      </w:r>
-      <w:r>
-        <w:t xml:space="preserve">Also, the population-level health impact of an exposure under specified conditions can be estimated using the posterior distribution.</w:t>
-      </w:r>
-      <w:r>
-        <w:t xml:space="preserve"> </w:t>
-      </w:r>
-      <w:r>
-        <w:t xml:space="preserve">The latter application is known as Environmental Burden of Disease (EBD).</w:t>
-      </w:r>
-      <w:r>
-        <w:br/>
-      </w:r>
-      <w:r>
-        <w:t xml:space="preserve">In EBD studies, the health impacts of an exposure on a defined population are quantified and summarized using metrics such as disability-adjusted life years (DALYs).</w:t>
-      </w:r>
-      <w:r>
-        <w:t xml:space="preserve"> </w:t>
-      </w:r>
-      <w:r>
-        <w:t xml:space="preserve">These estimates enable comparisons of the impact of multiple health determinants within a population, as well as comparisons of the same determinant across populations or countries.</w:t>
-      </w:r>
-      <w:r>
-        <w:t xml:space="preserve"> </w:t>
-      </w:r>
-      <w:r>
-        <w:t xml:space="preserve">EBD integrates both population exposure and the associated exposure–response relationship (e.g. relative risk, beta coefficient etc.)</w:t>
-      </w:r>
-      <w:r>
-        <w:t xml:space="preserve"> </w:t>
-      </w:r>
-      <w:r>
-        <w:t xml:space="preserve">(59)</w:t>
-      </w:r>
-      <w:r>
-        <w:t xml:space="preserve">.</w:t>
-      </w:r>
-      <w:r>
-        <w:t xml:space="preserve"> </w:t>
-      </w:r>
-      <w:r>
-        <w:t xml:space="preserve">The distributional results of this study enable probabilistic EBD assessments using Monte Carlo simulations without additional assumptions on uncertainty distributions on the exposure-response function.</w:t>
+        <w:t xml:space="preserve">This study has several limitations and strengths that should be taken into consideration when interpreting the results.</w:t>
+      </w:r>
+      <w:r>
+        <w:t xml:space="preserve"> </w:t>
+      </w:r>
+      <w:r>
+        <w:t xml:space="preserve">The included studies are heterogenous and have for example adjusted for varying sets of covariates.</w:t>
+      </w:r>
+      <w:r>
+        <w:t xml:space="preserve"> </w:t>
+      </w:r>
+      <w:r>
+        <w:t xml:space="preserve">Also, as mentioned above, the locations of cohorts in the included studies vary.</w:t>
+      </w:r>
+      <w:r>
+        <w:t xml:space="preserve"> </w:t>
+      </w:r>
+      <w:r>
+        <w:t xml:space="preserve">Both of these limit the generalizability of the results or their applicability to a specific population.</w:t>
+      </w:r>
+      <w:r>
+        <w:t xml:space="preserve"> </w:t>
+      </w:r>
+      <w:r>
+        <w:t xml:space="preserve">In this study, the publication bias was only assessed via visual inspection.</w:t>
+      </w:r>
+      <w:r>
+        <w:t xml:space="preserve"> </w:t>
+      </w:r>
+      <w:r>
+        <w:t xml:space="preserve">To further investigate this, statistical tests like the Egger’s test would be appropriate.</w:t>
+      </w:r>
+      <w:r>
+        <w:t xml:space="preserve"> </w:t>
+      </w:r>
+      <w:r>
+        <w:t xml:space="preserve">The visual test suggested the presence of publication bias which leads to possible overestimation of the pooled effect and adds another limitation to this study.</w:t>
+      </w:r>
+      <w:r>
+        <w:t xml:space="preserve"> </w:t>
+      </w:r>
+      <w:r>
+        <w:t xml:space="preserve">We excluded any effect estimates of studies that left the BLL variable untransformed and thus on a linear scale, because the transformation to the logarithmic scale could not be justified based on visual inspection.</w:t>
+      </w:r>
+      <w:r>
+        <w:t xml:space="preserve"> </w:t>
+      </w:r>
+      <w:r>
+        <w:t xml:space="preserve">This resulted in a smaller number of studies included in the meta-analysis which is another limitation.</w:t>
       </w:r>
     </w:p>
     <w:p>
@@ -4443,63 +4499,7 @@
         <w:pStyle w:val="BodyText"/>
       </w:pPr>
       <w:r>
-        <w:t xml:space="preserve">This study has several limitations and strengths that should be taken into consideration when interpreting the results.</w:t>
-      </w:r>
-      <w:r>
-        <w:t xml:space="preserve"> </w:t>
-      </w:r>
-      <w:r>
-        <w:t xml:space="preserve">The included studies are heterogenous and have for example adjusted for varying sets of covariates.</w:t>
-      </w:r>
-      <w:r>
-        <w:t xml:space="preserve"> </w:t>
-      </w:r>
-      <w:r>
-        <w:t xml:space="preserve">Also, as mentioned above, the locations of cohorts in the included studies vary.</w:t>
-      </w:r>
-      <w:r>
-        <w:t xml:space="preserve"> </w:t>
-      </w:r>
-      <w:r>
-        <w:t xml:space="preserve">Both of these limit the generalizability of the results or their applicability to a specific population.</w:t>
-      </w:r>
-      <w:r>
-        <w:t xml:space="preserve"> </w:t>
-      </w:r>
-      <w:r>
-        <w:t xml:space="preserve">In this study, the publication bias was only assessed via visual inspection.</w:t>
-      </w:r>
-      <w:r>
-        <w:t xml:space="preserve"> </w:t>
-      </w:r>
-      <w:r>
-        <w:t xml:space="preserve">To further investigate this, statistical tests like the Egger’s test would be appropriate.</w:t>
-      </w:r>
-      <w:r>
-        <w:t xml:space="preserve"> </w:t>
-      </w:r>
-      <w:r>
-        <w:t xml:space="preserve">The visual test suggested the presence of publication bias which leads to possible overestimation of the pooled effect and adds a limitation to this study.</w:t>
-      </w:r>
-      <w:r>
-        <w:br/>
-      </w:r>
-      <w:r>
-        <w:t xml:space="preserve">In this study, we excluded any effect estimates of studies that left the BLL variable untransformed and thus on a linear scale, because the transformation to the logarithmic scale could not be justified based on visual inspection.</w:t>
-      </w:r>
-      <w:r>
-        <w:t xml:space="preserve"> </w:t>
-      </w:r>
-      <w:r>
-        <w:t xml:space="preserve">This resulted in a smaller number of studies included in the meta-analysis and adds another limitation.</w:t>
-      </w:r>
-    </w:p>
-    <w:p>
-      <w:pPr>
-        <w:pStyle w:val="BodyText"/>
-      </w:pPr>
-      <w:r>
-        <w:t xml:space="preserve">While there are publications that compare Bayesian and frequentist approaches to meta-analysis, they either have a focus on evidence-based medicine</w:t>
+        <w:t xml:space="preserve">While there are publications that compare Bayesian and frequentist approaches to meta-analysis, they either focus on evidence-based medicine</w:t>
       </w:r>
       <w:r>
         <w:t xml:space="preserve"> </w:t>

</xml_diff>

<commit_message>
small changes, choosing journal to publish in
</commit_message>
<xml_diff>
--- a/manuscript/manuscript.docx
+++ b/manuscript/manuscript.docx
@@ -111,18 +111,309 @@
         </w:r>
       </w:hyperlink>
     </w:p>
-    <w:bookmarkStart w:id="21" w:name="abstract"/>
+    <w:bookmarkStart w:id="27" w:name="notes"/>
     <w:p>
       <w:pPr>
         <w:pStyle w:val="Heading1"/>
       </w:pPr>
       <w:r>
+        <w:t xml:space="preserve">Notes</w:t>
+      </w:r>
+    </w:p>
+    <w:p>
+      <w:pPr>
+        <w:pStyle w:val="Compact"/>
+        <w:numPr>
+          <w:ilvl w:val="0"/>
+          <w:numId w:val="1001"/>
+        </w:numPr>
+      </w:pPr>
+      <w:r>
+        <w:t xml:space="preserve">Journal:</w:t>
+      </w:r>
+    </w:p>
+    <w:p>
+      <w:pPr>
+        <w:pStyle w:val="Compact"/>
+        <w:numPr>
+          <w:ilvl w:val="0"/>
+          <w:numId w:val="1002"/>
+        </w:numPr>
+      </w:pPr>
+      <w:hyperlink r:id="rId21">
+        <w:r>
+          <w:rPr>
+            <w:rStyle w:val="Hyperlink"/>
+          </w:rPr>
+          <w:t xml:space="preserve">Environment International, Elsevir</w:t>
+        </w:r>
+      </w:hyperlink>
+    </w:p>
+    <w:p>
+      <w:pPr>
+        <w:pStyle w:val="Compact"/>
+        <w:numPr>
+          <w:ilvl w:val="0"/>
+          <w:numId w:val="1003"/>
+        </w:numPr>
+      </w:pPr>
+      <w:r>
+        <w:t xml:space="preserve">“Method papers should be concise presentations of an advancement in methodology applied to the type of evidence syntheses Environment International publishes.</w:t>
+      </w:r>
+    </w:p>
+    <w:p>
+      <w:pPr>
+        <w:pStyle w:val="Compact"/>
+        <w:numPr>
+          <w:ilvl w:val="0"/>
+          <w:numId w:val="1003"/>
+        </w:numPr>
+      </w:pPr>
+      <w:r>
+        <w:t xml:space="preserve">These include tools for assessing the validity of research, surveys and</w:t>
+      </w:r>
+      <w:r>
+        <w:t xml:space="preserve"> </w:t>
+      </w:r>
+      <w:r>
+        <w:rPr>
+          <w:b/>
+          <w:bCs/>
+        </w:rPr>
+        <w:t xml:space="preserve">analyses of current research practices</w:t>
+      </w:r>
+      <w:r>
+        <w:t xml:space="preserve">, methods for locating literature, support for conduct of individual steps of the</w:t>
+      </w:r>
+      <w:r>
+        <w:t xml:space="preserve"> </w:t>
+      </w:r>
+      <w:r>
+        <w:rPr>
+          <w:b/>
+          <w:bCs/>
+        </w:rPr>
+        <w:t xml:space="preserve">evidence synthesis process</w:t>
+      </w:r>
+      <w:r>
+        <w:t xml:space="preserve">,</w:t>
+      </w:r>
+      <w:r>
+        <w:t xml:space="preserve"> </w:t>
+      </w:r>
+      <w:r>
+        <w:rPr>
+          <w:b/>
+          <w:bCs/>
+        </w:rPr>
+        <w:t xml:space="preserve">statistical methods</w:t>
+      </w:r>
+      <w:r>
+        <w:t xml:space="preserve">,</w:t>
+      </w:r>
+      <w:r>
+        <w:t xml:space="preserve"> </w:t>
+      </w:r>
+      <w:r>
+        <w:rPr>
+          <w:b/>
+          <w:bCs/>
+        </w:rPr>
+        <w:t xml:space="preserve">computational approaches to evidence synthesis</w:t>
+      </w:r>
+      <w:r>
+        <w:t xml:space="preserve">, etc. While there is no formal word limit, most manuscripts would be expected to be</w:t>
+      </w:r>
+      <w:r>
+        <w:t xml:space="preserve"> </w:t>
+      </w:r>
+      <w:r>
+        <w:rPr>
+          <w:b/>
+          <w:bCs/>
+        </w:rPr>
+        <w:t xml:space="preserve">2500-4000 words</w:t>
+      </w:r>
+      <w:r>
+        <w:t xml:space="preserve"> </w:t>
+      </w:r>
+      <w:r>
+        <w:t xml:space="preserve">in length depending on the methodology and its validation, with</w:t>
+      </w:r>
+      <w:r>
+        <w:t xml:space="preserve"> </w:t>
+      </w:r>
+      <w:r>
+        <w:rPr>
+          <w:b/>
+          <w:bCs/>
+        </w:rPr>
+        <w:t xml:space="preserve">2-5 figures</w:t>
+      </w:r>
+      <w:r>
+        <w:t xml:space="preserve"> </w:t>
+      </w:r>
+      <w:r>
+        <w:t xml:space="preserve">and an appropriate number of citations. In case of doubts, prospective authors are invited to contact the Editors.”</w:t>
+      </w:r>
+      <w:r>
+        <w:br/>
+      </w:r>
+    </w:p>
+    <w:p>
+      <w:pPr>
+        <w:pStyle w:val="Compact"/>
+        <w:numPr>
+          <w:ilvl w:val="0"/>
+          <w:numId w:val="1003"/>
+        </w:numPr>
+      </w:pPr>
+      <w:r>
+        <w:t xml:space="preserve">“The corresponding author of a review article must list, in the cover letter, at least 5 relevant research papers on which they also served as the corresponding author.”</w:t>
+      </w:r>
+      <w:r>
+        <w:t xml:space="preserve"> </w:t>
+      </w:r>
+      <w:r>
+        <w:t xml:space="preserve">(https://www.sciencedirect.com/journal/environment-international/publish/guide-for-authors)</w:t>
+      </w:r>
+    </w:p>
+    <w:p>
+      <w:pPr>
+        <w:pStyle w:val="Compact"/>
+        <w:numPr>
+          <w:ilvl w:val="0"/>
+          <w:numId w:val="1003"/>
+        </w:numPr>
+      </w:pPr>
+      <w:r>
+        <w:t xml:space="preserve">2,500 - 4,000 words approximately. 4,500 words atm</w:t>
+      </w:r>
+    </w:p>
+    <w:p>
+      <w:pPr>
+        <w:pStyle w:val="Compact"/>
+        <w:numPr>
+          <w:ilvl w:val="0"/>
+          <w:numId w:val="1004"/>
+        </w:numPr>
+      </w:pPr>
+      <w:hyperlink r:id="rId22">
+        <w:r>
+          <w:rPr>
+            <w:rStyle w:val="Hyperlink"/>
+          </w:rPr>
+          <w:t xml:space="preserve">International Journal of Hygiene and Environmental Health, Elsevir</w:t>
+        </w:r>
+      </w:hyperlink>
+    </w:p>
+    <w:p>
+      <w:pPr>
+        <w:pStyle w:val="Compact"/>
+        <w:numPr>
+          <w:ilvl w:val="0"/>
+          <w:numId w:val="1004"/>
+        </w:numPr>
+      </w:pPr>
+      <w:hyperlink r:id="rId23">
+        <w:r>
+          <w:rPr>
+            <w:rStyle w:val="Hyperlink"/>
+          </w:rPr>
+          <w:t xml:space="preserve">Environmental Research, Elsevir</w:t>
+        </w:r>
+      </w:hyperlink>
+    </w:p>
+    <w:p>
+      <w:pPr>
+        <w:pStyle w:val="Compact"/>
+        <w:numPr>
+          <w:ilvl w:val="0"/>
+          <w:numId w:val="1005"/>
+        </w:numPr>
+      </w:pPr>
+      <w:hyperlink r:id="rId24">
+        <w:r>
+          <w:rPr>
+            <w:rStyle w:val="Hyperlink"/>
+          </w:rPr>
+          <w:t xml:space="preserve">PRISMA 2020 checklist</w:t>
+        </w:r>
+      </w:hyperlink>
+      <w:r>
+        <w:t xml:space="preserve"> </w:t>
+      </w:r>
+      <w:r>
+        <w:t xml:space="preserve">for structure</w:t>
+      </w:r>
+    </w:p>
+    <w:p>
+      <w:pPr>
+        <w:pStyle w:val="Compact"/>
+        <w:numPr>
+          <w:ilvl w:val="0"/>
+          <w:numId w:val="1005"/>
+        </w:numPr>
+      </w:pPr>
+      <w:hyperlink r:id="rId25">
+        <w:r>
+          <w:rPr>
+            <w:rStyle w:val="Hyperlink"/>
+          </w:rPr>
+          <w:t xml:space="preserve">Bayesian Analysis Reporting Guidelines, BARG</w:t>
+        </w:r>
+      </w:hyperlink>
+      <w:r>
+        <w:t xml:space="preserve"> </w:t>
+      </w:r>
+      <w:r>
+        <w:t xml:space="preserve">for reporting Bayesian model</w:t>
+      </w:r>
+    </w:p>
+    <w:p>
+      <w:pPr>
+        <w:pStyle w:val="Compact"/>
+        <w:numPr>
+          <w:ilvl w:val="0"/>
+          <w:numId w:val="1005"/>
+        </w:numPr>
+      </w:pPr>
+      <w:hyperlink r:id="rId26">
+        <w:r>
+          <w:rPr>
+            <w:rStyle w:val="Hyperlink"/>
+          </w:rPr>
+          <w:t xml:space="preserve">raRoB tool</w:t>
+        </w:r>
+      </w:hyperlink>
+      <w:r>
+        <w:t xml:space="preserve"> </w:t>
+      </w:r>
+      <w:r>
+        <w:t xml:space="preserve">for Risk of Bias Assessment</w:t>
+      </w:r>
+    </w:p>
+    <w:bookmarkEnd w:id="27"/>
+    <w:bookmarkStart w:id="28" w:name="abstract"/>
+    <w:p>
+      <w:pPr>
+        <w:pStyle w:val="Heading1"/>
+      </w:pPr>
+      <w:r>
         <w:t xml:space="preserve">Abstract</w:t>
       </w:r>
     </w:p>
     <w:p>
       <w:pPr>
         <w:pStyle w:val="FirstParagraph"/>
+      </w:pPr>
+      <w:r>
+        <w:t xml:space="preserve">(250 words limit in Environment International)</w:t>
+      </w:r>
+    </w:p>
+    <w:p>
+      <w:pPr>
+        <w:pStyle w:val="BodyText"/>
       </w:pPr>
       <w:r>
         <w:rPr>
@@ -467,8 +758,8 @@
         <w:br w:type="page"/>
       </w:r>
     </w:p>
-    <w:bookmarkEnd w:id="21"/>
-    <w:bookmarkStart w:id="22" w:name="background"/>
+    <w:bookmarkEnd w:id="28"/>
+    <w:bookmarkStart w:id="29" w:name="background"/>
     <w:p>
       <w:pPr>
         <w:pStyle w:val="Heading1"/>
@@ -849,8 +1140,8 @@
         <w:t xml:space="preserve">The aim of this study is twofold: first, to synthesize and quantitatively pool available epidemiological findings on the association between blood lead levels and IQ scores in children; and second, to conduct both a frequentist and Bayesian meta-analyses, comparing how these analytical frameworks influence exposure-response estimates, uncertainty characterization, and applicability to burden of disease and risk assessment.</w:t>
       </w:r>
     </w:p>
-    <w:bookmarkEnd w:id="22"/>
-    <w:bookmarkStart w:id="36" w:name="methods"/>
+    <w:bookmarkEnd w:id="29"/>
+    <w:bookmarkStart w:id="43" w:name="methods"/>
     <w:p>
       <w:pPr>
         <w:pStyle w:val="Heading1"/>
@@ -859,7 +1150,7 @@
         <w:t xml:space="preserve">2. Methods</w:t>
       </w:r>
     </w:p>
-    <w:bookmarkStart w:id="24" w:name="literature-review"/>
+    <w:bookmarkStart w:id="31" w:name="literature-review"/>
     <w:p>
       <w:pPr>
         <w:pStyle w:val="Heading2"/>
@@ -929,7 +1220,7 @@
         </w:rPr>
         <w:t xml:space="preserve">Partnership for the Assessment of Risks from Chemicals (</w:t>
       </w:r>
-      <w:hyperlink r:id="rId23">
+      <w:hyperlink r:id="rId30">
         <w:r>
           <w:rPr>
             <w:rStyle w:val="Hyperlink"/>
@@ -1081,8 +1372,8 @@
         <w:t xml:space="preserve">For all included studies, effect estimates from the most-adjusted model were extracted and the adjustment set was recorded.</w:t>
       </w:r>
     </w:p>
-    <w:bookmarkEnd w:id="24"/>
-    <w:bookmarkStart w:id="25" w:name="risk-of-bias-assessment"/>
+    <w:bookmarkEnd w:id="31"/>
+    <w:bookmarkStart w:id="32" w:name="risk-of-bias-assessment"/>
     <w:p>
       <w:pPr>
         <w:pStyle w:val="Heading2"/>
@@ -1156,8 +1447,8 @@
         <w:t xml:space="preserve">If there were any deviations in the judgement of the researcher and the LLM, the respective item was revisited by the researcher and they made the final decision.</w:t>
       </w:r>
     </w:p>
-    <w:bookmarkEnd w:id="25"/>
-    <w:bookmarkStart w:id="27" w:name="harmonization-of-effect-estimates"/>
+    <w:bookmarkEnd w:id="32"/>
+    <w:bookmarkStart w:id="34" w:name="harmonization-of-effect-estimates"/>
     <w:p>
       <w:pPr>
         <w:pStyle w:val="Heading2"/>
@@ -1225,7 +1516,7 @@
       <w:pPr>
         <w:pStyle w:val="BodyText"/>
       </w:pPr>
-      <w:bookmarkStart w:id="26" w:name="eq-regression-model"/>
+      <w:bookmarkStart w:id="33" w:name="eq-regression-model"/>
       <m:oMathPara>
         <m:oMathParaPr>
           <m:jc m:val="center"/>
@@ -1316,7 +1607,7 @@
           </m:d>
         </m:oMath>
       </m:oMathPara>
-      <w:bookmarkEnd w:id="26"/>
+      <w:bookmarkEnd w:id="33"/>
     </w:p>
     <w:p>
       <w:pPr>
@@ -1502,8 +1793,8 @@
         <w:t xml:space="preserve">These were excluded from the meta-analysis, as transformation of effect estimates for linear BLL to log-linear could not be justified based on visual inspection (include plots in supplement?).</w:t>
       </w:r>
     </w:p>
-    <w:bookmarkEnd w:id="27"/>
-    <w:bookmarkStart w:id="34" w:name="meta-analysis-methodology"/>
+    <w:bookmarkEnd w:id="34"/>
+    <w:bookmarkStart w:id="41" w:name="meta-analysis-methodology"/>
     <w:p>
       <w:pPr>
         <w:pStyle w:val="Heading2"/>
@@ -1581,7 +1872,7 @@
       <w:r>
         <w:t xml:space="preserve"> </w:t>
       </w:r>
-      <w:hyperlink r:id="rId28">
+      <w:hyperlink r:id="rId35">
         <w:r>
           <w:rPr>
             <w:rStyle w:val="Hyperlink"/>
@@ -1593,7 +1884,7 @@
         <w:t xml:space="preserve">.</w:t>
       </w:r>
     </w:p>
-    <w:bookmarkStart w:id="30" w:name="bayesian-meta-analysis"/>
+    <w:bookmarkStart w:id="37" w:name="bayesian-meta-analysis"/>
     <w:p>
       <w:pPr>
         <w:pStyle w:val="Heading3"/>
@@ -1724,7 +2015,7 @@
       <w:pPr>
         <w:pStyle w:val="BodyText"/>
       </w:pPr>
-      <w:bookmarkStart w:id="29" w:name="eq-model"/>
+      <w:bookmarkStart w:id="36" w:name="eq-model"/>
       <m:oMathPara>
         <m:oMathParaPr>
           <m:jc m:val="center"/>
@@ -1902,7 +2193,7 @@
           </m:d>
         </m:oMath>
       </m:oMathPara>
-      <w:bookmarkEnd w:id="29"/>
+      <w:bookmarkEnd w:id="36"/>
     </w:p>
     <w:p>
       <w:pPr>
@@ -2206,8 +2497,8 @@
         <w:t xml:space="preserve">results are comparable.</w:t>
       </w:r>
     </w:p>
-    <w:bookmarkEnd w:id="30"/>
-    <w:bookmarkStart w:id="32" w:name="priors"/>
+    <w:bookmarkEnd w:id="37"/>
+    <w:bookmarkStart w:id="39" w:name="priors"/>
     <w:p>
       <w:pPr>
         <w:pStyle w:val="Heading3"/>
@@ -2383,7 +2674,7 @@
       <w:pPr>
         <w:pStyle w:val="BodyText"/>
       </w:pPr>
-      <w:bookmarkStart w:id="31" w:name="eq-priors"/>
+      <w:bookmarkStart w:id="38" w:name="eq-priors"/>
       <m:oMathPara>
         <m:oMathParaPr>
           <m:jc m:val="center"/>
@@ -2534,7 +2825,7 @@
           </m:d>
         </m:oMath>
       </m:oMathPara>
-      <w:bookmarkEnd w:id="31"/>
+      <w:bookmarkEnd w:id="38"/>
     </w:p>
     <w:p>
       <w:pPr>
@@ -2577,8 +2868,8 @@
         <w:t xml:space="preserve">Additionally, a sensitivity analysis with alternative priors was conduced, as described below.</w:t>
       </w:r>
     </w:p>
-    <w:bookmarkEnd w:id="32"/>
-    <w:bookmarkStart w:id="33" w:name="frequentist-meta-analysis"/>
+    <w:bookmarkEnd w:id="39"/>
+    <w:bookmarkStart w:id="40" w:name="frequentist-meta-analysis"/>
     <w:p>
       <w:pPr>
         <w:pStyle w:val="Heading3"/>
@@ -2685,9 +2976,9 @@
         <w:t xml:space="preserve">.</w:t>
       </w:r>
     </w:p>
-    <w:bookmarkEnd w:id="33"/>
-    <w:bookmarkEnd w:id="34"/>
-    <w:bookmarkStart w:id="35" w:name="sensitivity-analysis"/>
+    <w:bookmarkEnd w:id="40"/>
+    <w:bookmarkEnd w:id="41"/>
+    <w:bookmarkStart w:id="42" w:name="sensitivity-analysis"/>
     <w:p>
       <w:pPr>
         <w:pStyle w:val="Heading2"/>
@@ -2972,9 +3263,9 @@
         <w:t xml:space="preserve">Notice that for the main effect, we centered the broader prior around 0, giving equal weight to the probability of a protective and detrimental effect of lead.</w:t>
       </w:r>
     </w:p>
-    <w:bookmarkEnd w:id="35"/>
-    <w:bookmarkEnd w:id="36"/>
-    <w:bookmarkStart w:id="50" w:name="results"/>
+    <w:bookmarkEnd w:id="42"/>
+    <w:bookmarkEnd w:id="43"/>
+    <w:bookmarkStart w:id="54" w:name="results"/>
     <w:p>
       <w:pPr>
         <w:pStyle w:val="Heading1"/>
@@ -2983,7 +3274,7 @@
         <w:t xml:space="preserve">3. Results</w:t>
       </w:r>
     </w:p>
-    <w:bookmarkStart w:id="40" w:name="literature-review-1"/>
+    <w:bookmarkStart w:id="47" w:name="literature-review-1"/>
     <w:p>
       <w:pPr>
         <w:pStyle w:val="Heading2"/>
@@ -3095,18 +3386,18 @@
           <wp:inline>
             <wp:extent cx="3566160" cy="4059018"/>
             <wp:effectExtent b="0" l="0" r="0" t="0"/>
-            <wp:docPr descr="Fig. 1: PRISMA flow diagram" title="" id="38" name="Picture"/>
+            <wp:docPr descr="Fig. 1: PRISMA flow diagram" title="" id="45" name="Picture"/>
             <a:graphic>
               <a:graphicData uri="http://schemas.openxmlformats.org/drawingml/2006/picture">
                 <pic:pic>
                   <pic:nvPicPr>
-                    <pic:cNvPr descr="tables_figures/main/figure1.png" id="39" name="Picture"/>
+                    <pic:cNvPr descr="tables_figures/main/figure1.png" id="46" name="Picture"/>
                     <pic:cNvPicPr>
                       <a:picLocks noChangeArrowheads="1" noChangeAspect="1"/>
                     </pic:cNvPicPr>
                   </pic:nvPicPr>
                   <pic:blipFill>
-                    <a:blip r:embed="rId37"/>
+                    <a:blip r:embed="rId44"/>
                     <a:stretch>
                       <a:fillRect/>
                     </a:stretch>
@@ -3141,8 +3432,8 @@
         <w:t xml:space="preserve">Fig. 1: PRISMA flow diagram</w:t>
       </w:r>
     </w:p>
-    <w:bookmarkEnd w:id="40"/>
-    <w:bookmarkStart w:id="41" w:name="risk-of-bias"/>
+    <w:bookmarkEnd w:id="47"/>
+    <w:bookmarkStart w:id="48" w:name="risk-of-bias"/>
     <w:p>
       <w:pPr>
         <w:pStyle w:val="Heading2"/>
@@ -3276,8 +3567,8 @@
         <w:t xml:space="preserve">Results from the RoB assessment is presented in Tab. 3.</w:t>
       </w:r>
     </w:p>
-    <w:bookmarkEnd w:id="41"/>
-    <w:bookmarkStart w:id="48" w:name="meta-analysis-results"/>
+    <w:bookmarkEnd w:id="48"/>
+    <w:bookmarkStart w:id="52" w:name="meta-analysis-results"/>
     <w:p>
       <w:pPr>
         <w:pStyle w:val="Heading2"/>
@@ -3532,129 +3823,58 @@
         <w:t xml:space="preserve">Forest plots of both approaches are shown in Fig. 2:</w:t>
       </w:r>
     </w:p>
-    <w:tbl>
-      <w:tblPr>
-        <w:tblStyle w:val="Table"/>
-        <w:tblW w:type="pct" w:w="5000"/>
-        <w:tblLayout w:type="fixed"/>
-        <w:tblLook w:firstRow="0" w:lastRow="0" w:firstColumn="0" w:lastColumn="0" w:noHBand="0" w:noVBand="0" w:val="0000"/>
-      </w:tblPr>
-      <w:tblGrid>
-        <w:gridCol w:w="3960"/>
-        <w:gridCol w:w="3960"/>
-      </w:tblGrid>
-      <w:tr>
-        <w:tc>
-          <w:tcPr/>
-          <w:p>
-            <w:pPr>
-              <w:jc w:val="center"/>
-            </w:pPr>
-            <w:r>
-              <w:drawing>
-                <wp:inline>
-                  <wp:extent cx="2971800" cy="3657600"/>
-                  <wp:effectExtent b="0" l="0" r="0" t="0"/>
-                  <wp:docPr descr="" title="" id="43" name="Picture"/>
-                  <a:graphic>
-                    <a:graphicData uri="http://schemas.openxmlformats.org/drawingml/2006/picture">
-                      <pic:pic>
-                        <pic:nvPicPr>
-                          <pic:cNvPr descr="manuscript_files/figure-docx/figure2_forest-1.png" id="44" name="Picture"/>
-                          <pic:cNvPicPr>
-                            <a:picLocks noChangeArrowheads="1" noChangeAspect="1"/>
-                          </pic:cNvPicPr>
-                        </pic:nvPicPr>
-                        <pic:blipFill>
-                          <a:blip r:embed="rId42"/>
-                          <a:stretch>
-                            <a:fillRect/>
-                          </a:stretch>
-                        </pic:blipFill>
-                        <pic:spPr bwMode="auto">
-                          <a:xfrm>
-                            <a:off x="0" y="0"/>
-                            <a:ext cx="2971800" cy="3657600"/>
-                          </a:xfrm>
-                          <a:prstGeom prst="rect">
-                            <a:avLst/>
-                          </a:prstGeom>
-                          <a:noFill/>
-                          <a:ln w="9525">
-                            <a:noFill/>
-                            <a:headEnd/>
-                            <a:tailEnd/>
-                          </a:ln>
-                        </pic:spPr>
-                      </pic:pic>
-                    </a:graphicData>
-                  </a:graphic>
-                </wp:inline>
-              </w:drawing>
-            </w:r>
-          </w:p>
-        </w:tc>
-        <w:tc>
-          <w:tcPr/>
-          <w:p>
-            <w:pPr>
-              <w:jc w:val="center"/>
-            </w:pPr>
-            <w:r>
-              <w:drawing>
-                <wp:inline>
-                  <wp:extent cx="2971800" cy="3657600"/>
-                  <wp:effectExtent b="0" l="0" r="0" t="0"/>
-                  <wp:docPr descr="" title="" id="46" name="Picture"/>
-                  <a:graphic>
-                    <a:graphicData uri="http://schemas.openxmlformats.org/drawingml/2006/picture">
-                      <pic:pic>
-                        <pic:nvPicPr>
-                          <pic:cNvPr descr="manuscript_files/figure-docx/figure2_forest-2.png" id="47" name="Picture"/>
-                          <pic:cNvPicPr>
-                            <a:picLocks noChangeArrowheads="1" noChangeAspect="1"/>
-                          </pic:cNvPicPr>
-                        </pic:nvPicPr>
-                        <pic:blipFill>
-                          <a:blip r:embed="rId45"/>
-                          <a:stretch>
-                            <a:fillRect/>
-                          </a:stretch>
-                        </pic:blipFill>
-                        <pic:spPr bwMode="auto">
-                          <a:xfrm>
-                            <a:off x="0" y="0"/>
-                            <a:ext cx="2971800" cy="3657600"/>
-                          </a:xfrm>
-                          <a:prstGeom prst="rect">
-                            <a:avLst/>
-                          </a:prstGeom>
-                          <a:noFill/>
-                          <a:ln w="9525">
-                            <a:noFill/>
-                            <a:headEnd/>
-                            <a:tailEnd/>
-                          </a:ln>
-                        </pic:spPr>
-                      </pic:pic>
-                    </a:graphicData>
-                  </a:graphic>
-                </wp:inline>
-              </w:drawing>
-            </w:r>
-          </w:p>
-        </w:tc>
-      </w:tr>
-    </w:tbl>
+    <w:p>
+      <w:pPr>
+        <w:pStyle w:val="CaptionedFigure"/>
+      </w:pPr>
+      <w:r>
+        <w:drawing>
+          <wp:inline>
+            <wp:extent cx="5943600" cy="2228220"/>
+            <wp:effectExtent b="0" l="0" r="0" t="0"/>
+            <wp:docPr descr="Fig. 2: Forest plots" title="" id="50" name="Picture"/>
+            <a:graphic>
+              <a:graphicData uri="http://schemas.openxmlformats.org/drawingml/2006/picture">
+                <pic:pic>
+                  <pic:nvPicPr>
+                    <pic:cNvPr descr="./tables_figures/main/combined_forest_plots.png" id="51" name="Picture"/>
+                    <pic:cNvPicPr>
+                      <a:picLocks noChangeArrowheads="1" noChangeAspect="1"/>
+                    </pic:cNvPicPr>
+                  </pic:nvPicPr>
+                  <pic:blipFill>
+                    <a:blip r:embed="rId49"/>
+                    <a:stretch>
+                      <a:fillRect/>
+                    </a:stretch>
+                  </pic:blipFill>
+                  <pic:spPr bwMode="auto">
+                    <a:xfrm>
+                      <a:off x="0" y="0"/>
+                      <a:ext cx="5943600" cy="2228220"/>
+                    </a:xfrm>
+                    <a:prstGeom prst="rect">
+                      <a:avLst/>
+                    </a:prstGeom>
+                    <a:noFill/>
+                    <a:ln w="9525">
+                      <a:noFill/>
+                      <a:headEnd/>
+                      <a:tailEnd/>
+                    </a:ln>
+                  </pic:spPr>
+                </pic:pic>
+              </a:graphicData>
+            </a:graphic>
+          </wp:inline>
+        </w:drawing>
+      </w:r>
+    </w:p>
     <w:p>
       <w:pPr>
         <w:pStyle w:val="ImageCaption"/>
       </w:pPr>
       <w:r>
-        <w:rPr>
-          <w:i/>
-          <w:iCs/>
-        </w:rPr>
         <w:t xml:space="preserve">Fig. 2: Forest plots</w:t>
       </w:r>
     </w:p>
@@ -3678,8 +3898,8 @@
         <w:t xml:space="preserve">This leads to a shrinkage of the posterior means towards the pooled effect and is comparable to the inverse-variance weighting in frequentist meta-analyses.</w:t>
       </w:r>
     </w:p>
-    <w:bookmarkEnd w:id="48"/>
-    <w:bookmarkStart w:id="49" w:name="sensitivity-analysis-results"/>
+    <w:bookmarkEnd w:id="52"/>
+    <w:bookmarkStart w:id="53" w:name="sensitivity-analysis-results"/>
     <w:p>
       <w:pPr>
         <w:pStyle w:val="Heading2"/>
@@ -3994,9 +4214,9 @@
         <w:t xml:space="preserve">Suppl. file 6 shows prior, observed data and posterior distributions of all three prior specifications.</w:t>
       </w:r>
     </w:p>
-    <w:bookmarkEnd w:id="49"/>
-    <w:bookmarkEnd w:id="50"/>
-    <w:bookmarkStart w:id="51" w:name="discussion"/>
+    <w:bookmarkEnd w:id="53"/>
+    <w:bookmarkEnd w:id="54"/>
+    <w:bookmarkStart w:id="55" w:name="discussion"/>
     <w:p>
       <w:pPr>
         <w:pStyle w:val="Heading1"/>
@@ -4543,7 +4763,7 @@
       <w:r>
         <w:t xml:space="preserve"> </w:t>
       </w:r>
-      <w:hyperlink r:id="rId28">
+      <w:hyperlink r:id="rId35">
         <w:r>
           <w:rPr>
             <w:rStyle w:val="Hyperlink"/>
@@ -4558,8 +4778,8 @@
         <w:t xml:space="preserve">which makes it fully reproducible.</w:t>
       </w:r>
     </w:p>
-    <w:bookmarkEnd w:id="51"/>
-    <w:bookmarkStart w:id="52" w:name="conclusions"/>
+    <w:bookmarkEnd w:id="55"/>
+    <w:bookmarkStart w:id="56" w:name="conclusions"/>
     <w:p>
       <w:pPr>
         <w:pStyle w:val="Heading1"/>
@@ -4606,8 +4826,8 @@
         <w:t xml:space="preserve">We therefore want to encourage researchers to consider Bayesian methods where capacity allows.</w:t>
       </w:r>
     </w:p>
-    <w:bookmarkEnd w:id="52"/>
-    <w:bookmarkStart w:id="53" w:name="list-of-abbreviations"/>
+    <w:bookmarkEnd w:id="56"/>
+    <w:bookmarkStart w:id="57" w:name="list-of-abbreviations"/>
     <w:p>
       <w:pPr>
         <w:pStyle w:val="Heading1"/>
@@ -5020,8 +5240,8 @@
         </w:tc>
       </w:tr>
     </w:tbl>
-    <w:bookmarkEnd w:id="53"/>
-    <w:bookmarkStart w:id="54" w:name="acknowledgements"/>
+    <w:bookmarkEnd w:id="57"/>
+    <w:bookmarkStart w:id="58" w:name="acknowledgements"/>
     <w:p>
       <w:pPr>
         <w:pStyle w:val="Heading1"/>
@@ -5080,8 +5300,8 @@
         <w:t xml:space="preserve">for their help in the screening process.</w:t>
       </w:r>
     </w:p>
-    <w:bookmarkEnd w:id="54"/>
-    <w:bookmarkStart w:id="55" w:name="funding"/>
+    <w:bookmarkEnd w:id="58"/>
+    <w:bookmarkStart w:id="59" w:name="funding"/>
     <w:p>
       <w:pPr>
         <w:pStyle w:val="Heading1"/>
@@ -5110,8 +5330,8 @@
         <w:t xml:space="preserve">Neither the European Union nor the granting authority can be held responsible for them.</w:t>
       </w:r>
     </w:p>
-    <w:bookmarkEnd w:id="55"/>
-    <w:bookmarkStart w:id="181" w:name="bibliography"/>
+    <w:bookmarkEnd w:id="59"/>
+    <w:bookmarkStart w:id="184" w:name="bibliography"/>
     <w:p>
       <w:pPr>
         <w:pStyle w:val="Heading1"/>
@@ -5120,8 +5340,8 @@
         <w:t xml:space="preserve">References</w:t>
       </w:r>
     </w:p>
-    <w:bookmarkStart w:id="180" w:name="refs"/>
-    <w:bookmarkStart w:id="57" w:name="Xe38019c88c6d2792bb296bad7dc0a4dd55f1319"/>
+    <w:bookmarkStart w:id="183" w:name="refs"/>
+    <w:bookmarkStart w:id="61" w:name="Xe38019c88c6d2792bb296bad7dc0a4dd55f1319"/>
     <w:p>
       <w:pPr>
         <w:pStyle w:val="Bibliography"/>
@@ -5141,7 +5361,7 @@
       <w:r>
         <w:t xml:space="preserve"> </w:t>
       </w:r>
-      <w:hyperlink r:id="rId56">
+      <w:hyperlink r:id="rId60">
         <w:r>
           <w:rPr>
             <w:rStyle w:val="Hyperlink"/>
@@ -5180,8 +5400,8 @@
         <w:t xml:space="preserve"> </w:t>
       </w:r>
     </w:p>
-    <w:bookmarkEnd w:id="57"/>
-    <w:bookmarkStart w:id="59" w:name="ref-lacerda2023GlobalDecreaseBlood"/>
+    <w:bookmarkEnd w:id="61"/>
+    <w:bookmarkStart w:id="63" w:name="ref-lacerda2023GlobalDecreaseBlood"/>
     <w:p>
       <w:pPr>
         <w:pStyle w:val="Bibliography"/>
@@ -5201,7 +5421,7 @@
       <w:r>
         <w:t xml:space="preserve"> </w:t>
       </w:r>
-      <w:hyperlink r:id="rId58">
+      <w:hyperlink r:id="rId62">
         <w:r>
           <w:rPr>
             <w:rStyle w:val="Hyperlink"/>
@@ -5216,8 +5436,8 @@
         <w:t xml:space="preserve"> </w:t>
       </w:r>
     </w:p>
-    <w:bookmarkEnd w:id="59"/>
-    <w:bookmarkStart w:id="61" w:name="X4707f3a4b72a0982487545f9dc3d674642af108"/>
+    <w:bookmarkEnd w:id="63"/>
+    <w:bookmarkStart w:id="65" w:name="X4707f3a4b72a0982487545f9dc3d674642af108"/>
     <w:p>
       <w:pPr>
         <w:pStyle w:val="Bibliography"/>
@@ -5237,7 +5457,7 @@
       <w:r>
         <w:t xml:space="preserve"> </w:t>
       </w:r>
-      <w:hyperlink r:id="rId60">
+      <w:hyperlink r:id="rId64">
         <w:r>
           <w:rPr>
             <w:rStyle w:val="Hyperlink"/>
@@ -5276,8 +5496,8 @@
         <w:t xml:space="preserve"> </w:t>
       </w:r>
     </w:p>
-    <w:bookmarkEnd w:id="61"/>
-    <w:bookmarkStart w:id="63" w:name="ref-sy2024AssessmentLongTermExposure"/>
+    <w:bookmarkEnd w:id="65"/>
+    <w:bookmarkStart w:id="67" w:name="ref-sy2024AssessmentLongTermExposure"/>
     <w:p>
       <w:pPr>
         <w:pStyle w:val="Bibliography"/>
@@ -5297,7 +5517,7 @@
       <w:r>
         <w:t xml:space="preserve"> </w:t>
       </w:r>
-      <w:hyperlink r:id="rId62">
+      <w:hyperlink r:id="rId66">
         <w:r>
           <w:rPr>
             <w:rStyle w:val="Hyperlink"/>
@@ -5372,8 +5592,8 @@
         <w:t xml:space="preserve"> </w:t>
       </w:r>
     </w:p>
-    <w:bookmarkEnd w:id="63"/>
-    <w:bookmarkStart w:id="65" w:name="ref-brauer2024GlobalBurdenStrength"/>
+    <w:bookmarkEnd w:id="67"/>
+    <w:bookmarkStart w:id="69" w:name="ref-brauer2024GlobalBurdenStrength"/>
     <w:p>
       <w:pPr>
         <w:pStyle w:val="Bibliography"/>
@@ -5393,7 +5613,7 @@
       <w:r>
         <w:t xml:space="preserve"> </w:t>
       </w:r>
-      <w:hyperlink r:id="rId64">
+      <w:hyperlink r:id="rId68">
         <w:r>
           <w:rPr>
             <w:rStyle w:val="Hyperlink"/>
@@ -5456,8 +5676,8 @@
         <w:t xml:space="preserve"> </w:t>
       </w:r>
     </w:p>
-    <w:bookmarkEnd w:id="65"/>
-    <w:bookmarkStart w:id="67" w:name="ref-harari2018BloodLeadLevels"/>
+    <w:bookmarkEnd w:id="69"/>
+    <w:bookmarkStart w:id="71" w:name="ref-harari2018BloodLeadLevels"/>
     <w:p>
       <w:pPr>
         <w:pStyle w:val="Bibliography"/>
@@ -5477,7 +5697,7 @@
       <w:r>
         <w:t xml:space="preserve"> </w:t>
       </w:r>
-      <w:hyperlink r:id="rId66">
+      <w:hyperlink r:id="rId70">
         <w:r>
           <w:rPr>
             <w:rStyle w:val="Hyperlink"/>
@@ -5552,8 +5772,8 @@
         <w:t xml:space="preserve"> </w:t>
       </w:r>
     </w:p>
-    <w:bookmarkEnd w:id="67"/>
-    <w:bookmarkStart w:id="69" w:name="ref-wan2022ChronicLeadExposure"/>
+    <w:bookmarkEnd w:id="71"/>
+    <w:bookmarkStart w:id="73" w:name="ref-wan2022ChronicLeadExposure"/>
     <w:p>
       <w:pPr>
         <w:pStyle w:val="Bibliography"/>
@@ -5573,7 +5793,7 @@
       <w:r>
         <w:t xml:space="preserve"> </w:t>
       </w:r>
-      <w:hyperlink r:id="rId68">
+      <w:hyperlink r:id="rId72">
         <w:r>
           <w:rPr>
             <w:rStyle w:val="Hyperlink"/>
@@ -5588,8 +5808,8 @@
         <w:t xml:space="preserve"> </w:t>
       </w:r>
     </w:p>
-    <w:bookmarkEnd w:id="69"/>
-    <w:bookmarkStart w:id="71" w:name="ref-rosengren2025ExposureLeadCoronary"/>
+    <w:bookmarkEnd w:id="73"/>
+    <w:bookmarkStart w:id="75" w:name="ref-rosengren2025ExposureLeadCoronary"/>
     <w:p>
       <w:pPr>
         <w:pStyle w:val="Bibliography"/>
@@ -5609,7 +5829,7 @@
       <w:r>
         <w:t xml:space="preserve"> </w:t>
       </w:r>
-      <w:hyperlink r:id="rId70">
+      <w:hyperlink r:id="rId74">
         <w:r>
           <w:rPr>
             <w:rStyle w:val="Hyperlink"/>
@@ -5702,8 +5922,8 @@
         <w:t xml:space="preserve"> </w:t>
       </w:r>
     </w:p>
-    <w:bookmarkEnd w:id="71"/>
-    <w:bookmarkStart w:id="73" w:name="ref-lanphear2018LowlevelLeadExposure"/>
+    <w:bookmarkEnd w:id="75"/>
+    <w:bookmarkStart w:id="77" w:name="ref-lanphear2018LowlevelLeadExposure"/>
     <w:p>
       <w:pPr>
         <w:pStyle w:val="Bibliography"/>
@@ -5723,7 +5943,7 @@
       <w:r>
         <w:t xml:space="preserve"> </w:t>
       </w:r>
-      <w:hyperlink r:id="rId72">
+      <w:hyperlink r:id="rId76">
         <w:r>
           <w:rPr>
             <w:rStyle w:val="Hyperlink"/>
@@ -5762,8 +5982,8 @@
         <w:t xml:space="preserve"> </w:t>
       </w:r>
     </w:p>
-    <w:bookmarkEnd w:id="73"/>
-    <w:bookmarkStart w:id="75" w:name="ref-chang2006LowBloodLead"/>
+    <w:bookmarkEnd w:id="77"/>
+    <w:bookmarkStart w:id="79" w:name="ref-chang2006LowBloodLead"/>
     <w:p>
       <w:pPr>
         <w:pStyle w:val="Bibliography"/>
@@ -5783,7 +6003,7 @@
       <w:r>
         <w:t xml:space="preserve"> </w:t>
       </w:r>
-      <w:hyperlink r:id="rId74">
+      <w:hyperlink r:id="rId78">
         <w:r>
           <w:rPr>
             <w:rStyle w:val="Hyperlink"/>
@@ -5798,8 +6018,8 @@
         <w:t xml:space="preserve"> </w:t>
       </w:r>
     </w:p>
-    <w:bookmarkEnd w:id="75"/>
-    <w:bookmarkStart w:id="77" w:name="Xadfdab0209e4a364d9fdcffecfddb00700d2db9"/>
+    <w:bookmarkEnd w:id="79"/>
+    <w:bookmarkStart w:id="81" w:name="Xadfdab0209e4a364d9fdcffecfddb00700d2db9"/>
     <w:p>
       <w:pPr>
         <w:pStyle w:val="Bibliography"/>
@@ -5819,7 +6039,7 @@
       <w:r>
         <w:t xml:space="preserve"> </w:t>
       </w:r>
-      <w:hyperlink r:id="rId76">
+      <w:hyperlink r:id="rId80">
         <w:r>
           <w:rPr>
             <w:rStyle w:val="Hyperlink"/>
@@ -5954,8 +6174,8 @@
         <w:t xml:space="preserve"> </w:t>
       </w:r>
     </w:p>
-    <w:bookmarkEnd w:id="77"/>
-    <w:bookmarkStart w:id="79" w:name="ref-shaffer2025LeadExposureAntisocial"/>
+    <w:bookmarkEnd w:id="81"/>
+    <w:bookmarkStart w:id="83" w:name="ref-shaffer2025LeadExposureAntisocial"/>
     <w:p>
       <w:pPr>
         <w:pStyle w:val="Bibliography"/>
@@ -5975,7 +6195,7 @@
       <w:r>
         <w:t xml:space="preserve"> </w:t>
       </w:r>
-      <w:hyperlink r:id="rId78">
+      <w:hyperlink r:id="rId82">
         <w:r>
           <w:rPr>
             <w:rStyle w:val="Hyperlink"/>
@@ -6014,8 +6234,8 @@
         <w:t xml:space="preserve"> </w:t>
       </w:r>
     </w:p>
-    <w:bookmarkEnd w:id="79"/>
-    <w:bookmarkStart w:id="81" w:name="X06097e4c5e52362623b7f1c040457eb7d553acc"/>
+    <w:bookmarkEnd w:id="83"/>
+    <w:bookmarkStart w:id="85" w:name="X06097e4c5e52362623b7f1c040457eb7d553acc"/>
     <w:p>
       <w:pPr>
         <w:pStyle w:val="Bibliography"/>
@@ -6035,7 +6255,7 @@
       <w:r>
         <w:t xml:space="preserve"> </w:t>
       </w:r>
-      <w:hyperlink r:id="rId80">
+      <w:hyperlink r:id="rId84">
         <w:r>
           <w:rPr>
             <w:rStyle w:val="Hyperlink"/>
@@ -6194,8 +6414,8 @@
         <w:t xml:space="preserve"> </w:t>
       </w:r>
     </w:p>
-    <w:bookmarkEnd w:id="81"/>
-    <w:bookmarkStart w:id="83" w:name="ref-needleman1990LowLevelLeadExposure"/>
+    <w:bookmarkEnd w:id="85"/>
+    <w:bookmarkStart w:id="87" w:name="ref-needleman1990LowLevelLeadExposure"/>
     <w:p>
       <w:pPr>
         <w:pStyle w:val="Bibliography"/>
@@ -6215,7 +6435,7 @@
       <w:r>
         <w:t xml:space="preserve"> </w:t>
       </w:r>
-      <w:hyperlink r:id="rId82">
+      <w:hyperlink r:id="rId86">
         <w:r>
           <w:rPr>
             <w:rStyle w:val="Hyperlink"/>
@@ -6326,8 +6546,8 @@
         <w:t xml:space="preserve"> </w:t>
       </w:r>
     </w:p>
-    <w:bookmarkEnd w:id="83"/>
-    <w:bookmarkStart w:id="85" w:name="ref-bellinger1992LowLevelLeadExposure"/>
+    <w:bookmarkEnd w:id="87"/>
+    <w:bookmarkStart w:id="89" w:name="ref-bellinger1992LowLevelLeadExposure"/>
     <w:p>
       <w:pPr>
         <w:pStyle w:val="Bibliography"/>
@@ -6347,7 +6567,7 @@
       <w:r>
         <w:t xml:space="preserve"> </w:t>
       </w:r>
-      <w:hyperlink r:id="rId84">
+      <w:hyperlink r:id="rId88">
         <w:r>
           <w:rPr>
             <w:rStyle w:val="Hyperlink"/>
@@ -6428,8 +6648,8 @@
         <w:t xml:space="preserve"> </w:t>
       </w:r>
     </w:p>
-    <w:bookmarkEnd w:id="85"/>
-    <w:bookmarkStart w:id="87" w:name="X9a8bad0b78f43066cb333fdedcdcad5d7017900"/>
+    <w:bookmarkEnd w:id="89"/>
+    <w:bookmarkStart w:id="91" w:name="X9a8bad0b78f43066cb333fdedcdcad5d7017900"/>
     <w:p>
       <w:pPr>
         <w:pStyle w:val="Bibliography"/>
@@ -6449,7 +6669,7 @@
       <w:r>
         <w:t xml:space="preserve"> </w:t>
       </w:r>
-      <w:hyperlink r:id="rId86">
+      <w:hyperlink r:id="rId90">
         <w:r>
           <w:rPr>
             <w:rStyle w:val="Hyperlink"/>
@@ -6530,8 +6750,8 @@
         <w:t xml:space="preserve"> </w:t>
       </w:r>
     </w:p>
-    <w:bookmarkEnd w:id="87"/>
-    <w:bookmarkStart w:id="89" w:name="ref-larsen2023GlobalHealthBurden"/>
+    <w:bookmarkEnd w:id="91"/>
+    <w:bookmarkStart w:id="93" w:name="ref-larsen2023GlobalHealthBurden"/>
     <w:p>
       <w:pPr>
         <w:pStyle w:val="Bibliography"/>
@@ -6551,7 +6771,7 @@
       <w:r>
         <w:t xml:space="preserve"> </w:t>
       </w:r>
-      <w:hyperlink r:id="rId88">
+      <w:hyperlink r:id="rId92">
         <w:r>
           <w:rPr>
             <w:rStyle w:val="Hyperlink"/>
@@ -6566,8 +6786,8 @@
         <w:t xml:space="preserve"> </w:t>
       </w:r>
     </w:p>
-    <w:bookmarkEnd w:id="89"/>
-    <w:bookmarkStart w:id="90" w:name="Xccae642063400a60b450e4ce6d84827fa125294"/>
+    <w:bookmarkEnd w:id="93"/>
+    <w:bookmarkStart w:id="94" w:name="Xccae642063400a60b450e4ce6d84827fa125294"/>
     <w:p>
       <w:pPr>
         <w:pStyle w:val="Bibliography"/>
@@ -6588,8 +6808,8 @@
         <w:t xml:space="preserve"> </w:t>
       </w:r>
     </w:p>
-    <w:bookmarkEnd w:id="90"/>
-    <w:bookmarkStart w:id="92" w:name="X5615fc1cb9c455a90da75660348bda09fd0f967"/>
+    <w:bookmarkEnd w:id="94"/>
+    <w:bookmarkStart w:id="96" w:name="X5615fc1cb9c455a90da75660348bda09fd0f967"/>
     <w:p>
       <w:pPr>
         <w:pStyle w:val="Bibliography"/>
@@ -6609,7 +6829,7 @@
       <w:r>
         <w:t xml:space="preserve"> </w:t>
       </w:r>
-      <w:hyperlink r:id="rId91">
+      <w:hyperlink r:id="rId95">
         <w:r>
           <w:rPr>
             <w:rStyle w:val="Hyperlink"/>
@@ -6684,8 +6904,8 @@
         <w:t xml:space="preserve"> </w:t>
       </w:r>
     </w:p>
-    <w:bookmarkEnd w:id="92"/>
-    <w:bookmarkStart w:id="94" w:name="ref-schwartz1994LowLevelLeadExposure"/>
+    <w:bookmarkEnd w:id="96"/>
+    <w:bookmarkStart w:id="98" w:name="ref-schwartz1994LowLevelLeadExposure"/>
     <w:p>
       <w:pPr>
         <w:pStyle w:val="Bibliography"/>
@@ -6705,7 +6925,7 @@
       <w:r>
         <w:t xml:space="preserve"> </w:t>
       </w:r>
-      <w:hyperlink r:id="rId93">
+      <w:hyperlink r:id="rId97">
         <w:r>
           <w:rPr>
             <w:rStyle w:val="Hyperlink"/>
@@ -6842,8 +7062,8 @@
         <w:t xml:space="preserve"> </w:t>
       </w:r>
     </w:p>
-    <w:bookmarkEnd w:id="94"/>
-    <w:bookmarkStart w:id="96" w:name="Xa2086c2c3f6a9ac4b676f66b1cdbbd5efdb3b23"/>
+    <w:bookmarkEnd w:id="98"/>
+    <w:bookmarkStart w:id="100" w:name="Xa2086c2c3f6a9ac4b676f66b1cdbbd5efdb3b23"/>
     <w:p>
       <w:pPr>
         <w:pStyle w:val="Bibliography"/>
@@ -6863,7 +7083,7 @@
       <w:r>
         <w:t xml:space="preserve"> </w:t>
       </w:r>
-      <w:hyperlink r:id="rId95">
+      <w:hyperlink r:id="rId99">
         <w:r>
           <w:rPr>
             <w:rStyle w:val="Hyperlink"/>
@@ -6979,8 +7199,8 @@
         <w:t xml:space="preserve"> </w:t>
       </w:r>
     </w:p>
-    <w:bookmarkEnd w:id="96"/>
-    <w:bookmarkStart w:id="98" w:name="X93c1fc7f8e1220d02cbab90c02ac44248f2b23e"/>
+    <w:bookmarkEnd w:id="100"/>
+    <w:bookmarkStart w:id="102" w:name="X93c1fc7f8e1220d02cbab90c02ac44248f2b23e"/>
     <w:p>
       <w:pPr>
         <w:pStyle w:val="Bibliography"/>
@@ -7000,7 +7220,7 @@
       <w:r>
         <w:t xml:space="preserve"> </w:t>
       </w:r>
-      <w:hyperlink r:id="rId97">
+      <w:hyperlink r:id="rId101">
         <w:r>
           <w:rPr>
             <w:rStyle w:val="Hyperlink"/>
@@ -7015,8 +7235,8 @@
         <w:t xml:space="preserve"> </w:t>
       </w:r>
     </w:p>
-    <w:bookmarkEnd w:id="98"/>
-    <w:bookmarkStart w:id="100" w:name="ref-figueroa2024LossCognitiveFunction"/>
+    <w:bookmarkEnd w:id="102"/>
+    <w:bookmarkStart w:id="104" w:name="ref-figueroa2024LossCognitiveFunction"/>
     <w:p>
       <w:pPr>
         <w:pStyle w:val="Bibliography"/>
@@ -7036,7 +7256,7 @@
       <w:r>
         <w:t xml:space="preserve"> </w:t>
       </w:r>
-      <w:hyperlink r:id="rId99">
+      <w:hyperlink r:id="rId103">
         <w:r>
           <w:rPr>
             <w:rStyle w:val="Hyperlink"/>
@@ -7075,8 +7295,8 @@
         <w:t xml:space="preserve"> </w:t>
       </w:r>
     </w:p>
-    <w:bookmarkEnd w:id="100"/>
-    <w:bookmarkStart w:id="102" w:name="ref-mcfarland2022HalfUSPopulation"/>
+    <w:bookmarkEnd w:id="104"/>
+    <w:bookmarkStart w:id="106" w:name="ref-mcfarland2022HalfUSPopulation"/>
     <w:p>
       <w:pPr>
         <w:pStyle w:val="Bibliography"/>
@@ -7096,7 +7316,7 @@
       <w:r>
         <w:t xml:space="preserve"> </w:t>
       </w:r>
-      <w:hyperlink r:id="rId101">
+      <w:hyperlink r:id="rId105">
         <w:r>
           <w:rPr>
             <w:rStyle w:val="Hyperlink"/>
@@ -7135,8 +7355,8 @@
         <w:t xml:space="preserve"> </w:t>
       </w:r>
     </w:p>
-    <w:bookmarkEnd w:id="102"/>
-    <w:bookmarkStart w:id="104" w:name="ref-crump2013StatisticalReevaluationData"/>
+    <w:bookmarkEnd w:id="106"/>
+    <w:bookmarkStart w:id="108" w:name="ref-crump2013StatisticalReevaluationData"/>
     <w:p>
       <w:pPr>
         <w:pStyle w:val="Bibliography"/>
@@ -7156,7 +7376,7 @@
       <w:r>
         <w:t xml:space="preserve"> </w:t>
       </w:r>
-      <w:hyperlink r:id="rId103">
+      <w:hyperlink r:id="rId107">
         <w:r>
           <w:rPr>
             <w:rStyle w:val="Hyperlink"/>
@@ -7195,8 +7415,8 @@
         <w:t xml:space="preserve"> </w:t>
       </w:r>
     </w:p>
-    <w:bookmarkEnd w:id="104"/>
-    <w:bookmarkStart w:id="106" w:name="X33f03e29791f20cdbbbbf0729c723b16e55ed16"/>
+    <w:bookmarkEnd w:id="108"/>
+    <w:bookmarkStart w:id="110" w:name="X33f03e29791f20cdbbbbf0729c723b16e55ed16"/>
     <w:p>
       <w:pPr>
         <w:pStyle w:val="Bibliography"/>
@@ -7216,7 +7436,7 @@
       <w:r>
         <w:t xml:space="preserve"> </w:t>
       </w:r>
-      <w:hyperlink r:id="rId105">
+      <w:hyperlink r:id="rId109">
         <w:r>
           <w:rPr>
             <w:rStyle w:val="Hyperlink"/>
@@ -7315,8 +7535,8 @@
         <w:t xml:space="preserve"> </w:t>
       </w:r>
     </w:p>
-    <w:bookmarkEnd w:id="106"/>
-    <w:bookmarkStart w:id="108" w:name="X035620408d1fb22c7ed381e74f0468c30df4612"/>
+    <w:bookmarkEnd w:id="110"/>
+    <w:bookmarkStart w:id="112" w:name="X035620408d1fb22c7ed381e74f0468c30df4612"/>
     <w:p>
       <w:pPr>
         <w:pStyle w:val="Bibliography"/>
@@ -7336,7 +7556,7 @@
       <w:r>
         <w:t xml:space="preserve"> </w:t>
       </w:r>
-      <w:hyperlink r:id="rId107">
+      <w:hyperlink r:id="rId111">
         <w:r>
           <w:rPr>
             <w:rStyle w:val="Hyperlink"/>
@@ -7390,8 +7610,8 @@
         <w:t xml:space="preserve"> </w:t>
       </w:r>
     </w:p>
-    <w:bookmarkEnd w:id="108"/>
-    <w:bookmarkStart w:id="110" w:name="X837f91f784566061977da85c17a5755a81dedde"/>
+    <w:bookmarkEnd w:id="112"/>
+    <w:bookmarkStart w:id="114" w:name="X837f91f784566061977da85c17a5755a81dedde"/>
     <w:p>
       <w:pPr>
         <w:pStyle w:val="Bibliography"/>
@@ -7411,7 +7631,7 @@
       <w:r>
         <w:t xml:space="preserve"> </w:t>
       </w:r>
-      <w:hyperlink r:id="rId109">
+      <w:hyperlink r:id="rId113">
         <w:r>
           <w:rPr>
             <w:rStyle w:val="Hyperlink"/>
@@ -7426,8 +7646,8 @@
         <w:t xml:space="preserve"> </w:t>
       </w:r>
     </w:p>
-    <w:bookmarkEnd w:id="110"/>
-    <w:bookmarkStart w:id="112" w:name="ref-page2021PRISMA2020Statement"/>
+    <w:bookmarkEnd w:id="114"/>
+    <w:bookmarkStart w:id="116" w:name="ref-page2021PRISMA2020Statement"/>
     <w:p>
       <w:pPr>
         <w:pStyle w:val="Bibliography"/>
@@ -7447,7 +7667,7 @@
       <w:r>
         <w:t xml:space="preserve"> </w:t>
       </w:r>
-      <w:hyperlink r:id="rId111">
+      <w:hyperlink r:id="rId115">
         <w:r>
           <w:rPr>
             <w:rStyle w:val="Hyperlink"/>
@@ -7486,8 +7706,8 @@
         <w:t xml:space="preserve"> </w:t>
       </w:r>
     </w:p>
-    <w:bookmarkEnd w:id="112"/>
-    <w:bookmarkStart w:id="114" w:name="X5cae6442bbe0e1f5d8df6cd5008aab2dbfb65a6"/>
+    <w:bookmarkEnd w:id="116"/>
+    <w:bookmarkStart w:id="117" w:name="X5cae6442bbe0e1f5d8df6cd5008aab2dbfb65a6"/>
     <w:p>
       <w:pPr>
         <w:pStyle w:val="Bibliography"/>
@@ -7507,7 +7727,7 @@
       <w:r>
         <w:t xml:space="preserve"> </w:t>
       </w:r>
-      <w:hyperlink r:id="rId113">
+      <w:hyperlink r:id="rId25">
         <w:r>
           <w:rPr>
             <w:rStyle w:val="Hyperlink"/>
@@ -7534,8 +7754,8 @@
         <w:t xml:space="preserve"> </w:t>
       </w:r>
     </w:p>
-    <w:bookmarkEnd w:id="114"/>
-    <w:bookmarkStart w:id="115" w:name="Xf5486a80753c915bf34b5d8f3ad5e46aac479a7"/>
+    <w:bookmarkEnd w:id="117"/>
+    <w:bookmarkStart w:id="118" w:name="Xf5486a80753c915bf34b5d8f3ad5e46aac479a7"/>
     <w:p>
       <w:pPr>
         <w:pStyle w:val="Bibliography"/>
@@ -7601,8 +7821,8 @@
         <w:t xml:space="preserve"> </w:t>
       </w:r>
     </w:p>
-    <w:bookmarkEnd w:id="115"/>
-    <w:bookmarkStart w:id="117" w:name="ref-plate2024DevelopmentToolRapid"/>
+    <w:bookmarkEnd w:id="118"/>
+    <w:bookmarkStart w:id="120" w:name="ref-plate2024DevelopmentToolRapid"/>
     <w:p>
       <w:pPr>
         <w:pStyle w:val="Bibliography"/>
@@ -7622,7 +7842,7 @@
       <w:r>
         <w:t xml:space="preserve"> </w:t>
       </w:r>
-      <w:hyperlink r:id="rId116">
+      <w:hyperlink r:id="rId119">
         <w:r>
           <w:rPr>
             <w:rStyle w:val="Hyperlink"/>
@@ -7637,8 +7857,8 @@
         <w:t xml:space="preserve"> </w:t>
       </w:r>
     </w:p>
-    <w:bookmarkEnd w:id="117"/>
-    <w:bookmarkStart w:id="119" w:name="ref-halabicky2023LowLevelLead"/>
+    <w:bookmarkEnd w:id="120"/>
+    <w:bookmarkStart w:id="122" w:name="ref-halabicky2023LowLevelLead"/>
     <w:p>
       <w:pPr>
         <w:pStyle w:val="Bibliography"/>
@@ -7658,7 +7878,7 @@
       <w:r>
         <w:t xml:space="preserve"> </w:t>
       </w:r>
-      <w:hyperlink r:id="rId118">
+      <w:hyperlink r:id="rId121">
         <w:r>
           <w:rPr>
             <w:rStyle w:val="Hyperlink"/>
@@ -7697,8 +7917,8 @@
         <w:t xml:space="preserve"> </w:t>
       </w:r>
     </w:p>
-    <w:bookmarkEnd w:id="119"/>
-    <w:bookmarkStart w:id="121" w:name="ref-chen2005IQBloodLead"/>
+    <w:bookmarkEnd w:id="122"/>
+    <w:bookmarkStart w:id="124" w:name="ref-chen2005IQBloodLead"/>
     <w:p>
       <w:pPr>
         <w:pStyle w:val="Bibliography"/>
@@ -7718,7 +7938,7 @@
       <w:r>
         <w:t xml:space="preserve"> </w:t>
       </w:r>
-      <w:hyperlink r:id="rId120">
+      <w:hyperlink r:id="rId123">
         <w:r>
           <w:rPr>
             <w:rStyle w:val="Hyperlink"/>
@@ -7943,8 +8163,8 @@
         <w:t xml:space="preserve"> </w:t>
       </w:r>
     </w:p>
-    <w:bookmarkEnd w:id="121"/>
-    <w:bookmarkStart w:id="123" w:name="Xcf7993c3f58afaabaf73be6238c67f4f63053d9"/>
+    <w:bookmarkEnd w:id="124"/>
+    <w:bookmarkStart w:id="126" w:name="Xcf7993c3f58afaabaf73be6238c67f4f63053d9"/>
     <w:p>
       <w:pPr>
         <w:pStyle w:val="Bibliography"/>
@@ -7964,7 +8184,7 @@
       <w:r>
         <w:t xml:space="preserve"> </w:t>
       </w:r>
-      <w:hyperlink r:id="rId122">
+      <w:hyperlink r:id="rId125">
         <w:r>
           <w:rPr>
             <w:rStyle w:val="Hyperlink"/>
@@ -8039,8 +8259,8 @@
         <w:t xml:space="preserve"> </w:t>
       </w:r>
     </w:p>
-    <w:bookmarkEnd w:id="123"/>
-    <w:bookmarkStart w:id="124" w:name="X4bd034c52731e178b4de125c2c778bdc533803c"/>
+    <w:bookmarkEnd w:id="126"/>
+    <w:bookmarkStart w:id="127" w:name="X4bd034c52731e178b4de125c2c778bdc533803c"/>
     <w:p>
       <w:pPr>
         <w:pStyle w:val="Bibliography"/>
@@ -8094,8 +8314,8 @@
         <w:t xml:space="preserve"> </w:t>
       </w:r>
     </w:p>
-    <w:bookmarkEnd w:id="124"/>
-    <w:bookmarkStart w:id="126" w:name="ref-burkner2017BrmsPackageBayesian"/>
+    <w:bookmarkEnd w:id="127"/>
+    <w:bookmarkStart w:id="129" w:name="ref-burkner2017BrmsPackageBayesian"/>
     <w:p>
       <w:pPr>
         <w:pStyle w:val="Bibliography"/>
@@ -8115,7 +8335,7 @@
       <w:r>
         <w:t xml:space="preserve"> </w:t>
       </w:r>
-      <w:hyperlink r:id="rId125">
+      <w:hyperlink r:id="rId128">
         <w:r>
           <w:rPr>
             <w:rStyle w:val="Hyperlink"/>
@@ -8220,8 +8440,8 @@
         <w:t xml:space="preserve"> </w:t>
       </w:r>
     </w:p>
-    <w:bookmarkEnd w:id="126"/>
-    <w:bookmarkStart w:id="128" w:name="ref-hoffman2011NoUTurnSamplerAdaptively"/>
+    <w:bookmarkEnd w:id="129"/>
+    <w:bookmarkStart w:id="131" w:name="ref-hoffman2011NoUTurnSamplerAdaptively"/>
     <w:p>
       <w:pPr>
         <w:pStyle w:val="Bibliography"/>
@@ -8241,7 +8461,7 @@
       <w:r>
         <w:t xml:space="preserve"> </w:t>
       </w:r>
-      <w:hyperlink r:id="rId127">
+      <w:hyperlink r:id="rId130">
         <w:r>
           <w:rPr>
             <w:rStyle w:val="Hyperlink"/>
@@ -8310,8 +8530,8 @@
         <w:t xml:space="preserve"> </w:t>
       </w:r>
     </w:p>
-    <w:bookmarkEnd w:id="128"/>
-    <w:bookmarkStart w:id="129" w:name="X21bf392f662dc1b38e9a7fa4b314fc7a471696b"/>
+    <w:bookmarkEnd w:id="131"/>
+    <w:bookmarkStart w:id="132" w:name="X21bf392f662dc1b38e9a7fa4b314fc7a471696b"/>
     <w:p>
       <w:pPr>
         <w:pStyle w:val="Bibliography"/>
@@ -8353,8 +8573,8 @@
         <w:t xml:space="preserve"> </w:t>
       </w:r>
     </w:p>
-    <w:bookmarkEnd w:id="129"/>
-    <w:bookmarkStart w:id="131" w:name="X111bb06244f8f2a1a6d0d2f1f41c24b71f248e6"/>
+    <w:bookmarkEnd w:id="132"/>
+    <w:bookmarkStart w:id="134" w:name="X111bb06244f8f2a1a6d0d2f1f41c24b71f248e6"/>
     <w:p>
       <w:pPr>
         <w:pStyle w:val="Bibliography"/>
@@ -8374,7 +8594,7 @@
       <w:r>
         <w:t xml:space="preserve"> </w:t>
       </w:r>
-      <w:hyperlink r:id="rId130">
+      <w:hyperlink r:id="rId133">
         <w:r>
           <w:rPr>
             <w:rStyle w:val="Hyperlink"/>
@@ -8431,8 +8651,8 @@
         <w:t xml:space="preserve"> </w:t>
       </w:r>
     </w:p>
-    <w:bookmarkEnd w:id="131"/>
-    <w:bookmarkStart w:id="133" w:name="ref-bauer2020AssociationsMetalMixture"/>
+    <w:bookmarkEnd w:id="134"/>
+    <w:bookmarkStart w:id="136" w:name="ref-bauer2020AssociationsMetalMixture"/>
     <w:p>
       <w:pPr>
         <w:pStyle w:val="Bibliography"/>
@@ -8452,7 +8672,7 @@
       <w:r>
         <w:t xml:space="preserve"> </w:t>
       </w:r>
-      <w:hyperlink r:id="rId132">
+      <w:hyperlink r:id="rId135">
         <w:r>
           <w:rPr>
             <w:rStyle w:val="Hyperlink"/>
@@ -8593,8 +8813,8 @@
         <w:t xml:space="preserve"> </w:t>
       </w:r>
     </w:p>
-    <w:bookmarkEnd w:id="133"/>
-    <w:bookmarkStart w:id="135" w:name="ref-dantzer2020ComparisonBloodToenails"/>
+    <w:bookmarkEnd w:id="136"/>
+    <w:bookmarkStart w:id="138" w:name="ref-dantzer2020ComparisonBloodToenails"/>
     <w:p>
       <w:pPr>
         <w:pStyle w:val="Bibliography"/>
@@ -8614,7 +8834,7 @@
       <w:r>
         <w:t xml:space="preserve"> </w:t>
       </w:r>
-      <w:hyperlink r:id="rId134">
+      <w:hyperlink r:id="rId137">
         <w:r>
           <w:rPr>
             <w:rStyle w:val="Hyperlink"/>
@@ -8629,8 +8849,8 @@
         <w:t xml:space="preserve"> </w:t>
       </w:r>
     </w:p>
-    <w:bookmarkEnd w:id="135"/>
-    <w:bookmarkStart w:id="137" w:name="X6bc65313eadd1b86059eb4ba10c8cf9d91be17d"/>
+    <w:bookmarkEnd w:id="138"/>
+    <w:bookmarkStart w:id="140" w:name="X6bc65313eadd1b86059eb4ba10c8cf9d91be17d"/>
     <w:p>
       <w:pPr>
         <w:pStyle w:val="Bibliography"/>
@@ -8650,7 +8870,7 @@
       <w:r>
         <w:t xml:space="preserve"> </w:t>
       </w:r>
-      <w:hyperlink r:id="rId136">
+      <w:hyperlink r:id="rId139">
         <w:r>
           <w:rPr>
             <w:rStyle w:val="Hyperlink"/>
@@ -8713,8 +8933,8 @@
         <w:t xml:space="preserve"> </w:t>
       </w:r>
     </w:p>
-    <w:bookmarkEnd w:id="137"/>
-    <w:bookmarkStart w:id="139" w:name="ref-hong2015EnvironmentalLeadExposure"/>
+    <w:bookmarkEnd w:id="140"/>
+    <w:bookmarkStart w:id="142" w:name="ref-hong2015EnvironmentalLeadExposure"/>
     <w:p>
       <w:pPr>
         <w:pStyle w:val="Bibliography"/>
@@ -8734,7 +8954,7 @@
       <w:r>
         <w:t xml:space="preserve"> </w:t>
       </w:r>
-      <w:hyperlink r:id="rId138">
+      <w:hyperlink r:id="rId141">
         <w:r>
           <w:rPr>
             <w:rStyle w:val="Hyperlink"/>
@@ -8845,8 +9065,8 @@
         <w:t xml:space="preserve"> </w:t>
       </w:r>
     </w:p>
-    <w:bookmarkEnd w:id="139"/>
-    <w:bookmarkStart w:id="141" w:name="ref-lee2021PrenatalPostnatalExposures"/>
+    <w:bookmarkEnd w:id="142"/>
+    <w:bookmarkStart w:id="144" w:name="ref-lee2021PrenatalPostnatalExposures"/>
     <w:p>
       <w:pPr>
         <w:pStyle w:val="Bibliography"/>
@@ -8866,7 +9086,7 @@
       <w:r>
         <w:t xml:space="preserve"> </w:t>
       </w:r>
-      <w:hyperlink r:id="rId140">
+      <w:hyperlink r:id="rId143">
         <w:r>
           <w:rPr>
             <w:rStyle w:val="Hyperlink"/>
@@ -8941,8 +9161,8 @@
         <w:t xml:space="preserve"> </w:t>
       </w:r>
     </w:p>
-    <w:bookmarkEnd w:id="141"/>
-    <w:bookmarkStart w:id="142" w:name="X33fe7de6e8b65c86af337dbdb8d7cc8651c48a8"/>
+    <w:bookmarkEnd w:id="144"/>
+    <w:bookmarkStart w:id="145" w:name="X33fe7de6e8b65c86af337dbdb8d7cc8651c48a8"/>
     <w:p>
       <w:pPr>
         <w:pStyle w:val="Bibliography"/>
@@ -9020,8 +9240,8 @@
         <w:t xml:space="preserve"> </w:t>
       </w:r>
     </w:p>
-    <w:bookmarkEnd w:id="142"/>
-    <w:bookmarkStart w:id="144" w:name="ref-roy2013EffectModificationTransferrin"/>
+    <w:bookmarkEnd w:id="145"/>
+    <w:bookmarkStart w:id="147" w:name="ref-roy2013EffectModificationTransferrin"/>
     <w:p>
       <w:pPr>
         <w:pStyle w:val="Bibliography"/>
@@ -9041,7 +9261,7 @@
       <w:r>
         <w:t xml:space="preserve"> </w:t>
       </w:r>
-      <w:hyperlink r:id="rId143">
+      <w:hyperlink r:id="rId146">
         <w:r>
           <w:rPr>
             <w:rStyle w:val="Hyperlink"/>
@@ -9092,8 +9312,8 @@
         <w:t xml:space="preserve"> </w:t>
       </w:r>
     </w:p>
-    <w:bookmarkEnd w:id="144"/>
-    <w:bookmarkStart w:id="146" w:name="Xb0421be95a139ca5af39ce6040517bf1be79427"/>
+    <w:bookmarkEnd w:id="147"/>
+    <w:bookmarkStart w:id="149" w:name="Xb0421be95a139ca5af39ce6040517bf1be79427"/>
     <w:p>
       <w:pPr>
         <w:pStyle w:val="Bibliography"/>
@@ -9113,7 +9333,7 @@
       <w:r>
         <w:t xml:space="preserve"> </w:t>
       </w:r>
-      <w:hyperlink r:id="rId145">
+      <w:hyperlink r:id="rId148">
         <w:r>
           <w:rPr>
             <w:rStyle w:val="Hyperlink"/>
@@ -9152,8 +9372,8 @@
         <w:t xml:space="preserve"> </w:t>
       </w:r>
     </w:p>
-    <w:bookmarkEnd w:id="146"/>
-    <w:bookmarkStart w:id="148" w:name="X716dc31ca13dac7355fea3a0f7dea95779ecabb"/>
+    <w:bookmarkEnd w:id="149"/>
+    <w:bookmarkStart w:id="151" w:name="X716dc31ca13dac7355fea3a0f7dea95779ecabb"/>
     <w:p>
       <w:pPr>
         <w:pStyle w:val="Bibliography"/>
@@ -9173,7 +9393,7 @@
       <w:r>
         <w:t xml:space="preserve"> </w:t>
       </w:r>
-      <w:hyperlink r:id="rId147">
+      <w:hyperlink r:id="rId150">
         <w:r>
           <w:rPr>
             <w:rStyle w:val="Hyperlink"/>
@@ -9218,8 +9438,8 @@
         <w:t xml:space="preserve"> </w:t>
       </w:r>
     </w:p>
-    <w:bookmarkEnd w:id="148"/>
-    <w:bookmarkStart w:id="150" w:name="ref-earl2016LowlevelEnvironmentalLead"/>
+    <w:bookmarkEnd w:id="151"/>
+    <w:bookmarkStart w:id="153" w:name="ref-earl2016LowlevelEnvironmentalLead"/>
     <w:p>
       <w:pPr>
         <w:pStyle w:val="Bibliography"/>
@@ -9239,7 +9459,7 @@
       <w:r>
         <w:t xml:space="preserve"> </w:t>
       </w:r>
-      <w:hyperlink r:id="rId149">
+      <w:hyperlink r:id="rId152">
         <w:r>
           <w:rPr>
             <w:rStyle w:val="Hyperlink"/>
@@ -9254,8 +9474,8 @@
         <w:t xml:space="preserve"> </w:t>
       </w:r>
     </w:p>
-    <w:bookmarkEnd w:id="150"/>
-    <w:bookmarkStart w:id="152" w:name="ref-smith2018StepAwayStepwise"/>
+    <w:bookmarkEnd w:id="153"/>
+    <w:bookmarkStart w:id="155" w:name="ref-smith2018StepAwayStepwise"/>
     <w:p>
       <w:pPr>
         <w:pStyle w:val="Bibliography"/>
@@ -9275,7 +9495,7 @@
       <w:r>
         <w:t xml:space="preserve"> </w:t>
       </w:r>
-      <w:hyperlink r:id="rId151">
+      <w:hyperlink r:id="rId154">
         <w:r>
           <w:rPr>
             <w:rStyle w:val="Hyperlink"/>
@@ -9290,8 +9510,8 @@
         <w:t xml:space="preserve"> </w:t>
       </w:r>
     </w:p>
-    <w:bookmarkEnd w:id="152"/>
-    <w:bookmarkStart w:id="154" w:name="ref-goodman2023SexDifferencePre"/>
+    <w:bookmarkEnd w:id="155"/>
+    <w:bookmarkStart w:id="157" w:name="ref-goodman2023SexDifferencePre"/>
     <w:p>
       <w:pPr>
         <w:pStyle w:val="Bibliography"/>
@@ -9311,7 +9531,7 @@
       <w:r>
         <w:t xml:space="preserve"> </w:t>
       </w:r>
-      <w:hyperlink r:id="rId153">
+      <w:hyperlink r:id="rId156">
         <w:r>
           <w:rPr>
             <w:rStyle w:val="Hyperlink"/>
@@ -9326,8 +9546,8 @@
         <w:t xml:space="preserve"> </w:t>
       </w:r>
     </w:p>
-    <w:bookmarkEnd w:id="154"/>
-    <w:bookmarkStart w:id="156" w:name="ref-pocock1994EnvironmentalLeadChildrens"/>
+    <w:bookmarkEnd w:id="157"/>
+    <w:bookmarkStart w:id="159" w:name="ref-pocock1994EnvironmentalLeadChildrens"/>
     <w:p>
       <w:pPr>
         <w:pStyle w:val="Bibliography"/>
@@ -9347,7 +9567,7 @@
       <w:r>
         <w:t xml:space="preserve"> </w:t>
       </w:r>
-      <w:hyperlink r:id="rId155">
+      <w:hyperlink r:id="rId158">
         <w:r>
           <w:rPr>
             <w:rStyle w:val="Hyperlink"/>
@@ -9362,8 +9582,8 @@
         <w:t xml:space="preserve"> </w:t>
       </w:r>
     </w:p>
-    <w:bookmarkEnd w:id="156"/>
-    <w:bookmarkStart w:id="158" w:name="ref-heidari2022EffectLeadExposurea"/>
+    <w:bookmarkEnd w:id="159"/>
+    <w:bookmarkStart w:id="161" w:name="ref-heidari2022EffectLeadExposurea"/>
     <w:p>
       <w:pPr>
         <w:pStyle w:val="Bibliography"/>
@@ -9383,7 +9603,7 @@
       <w:r>
         <w:t xml:space="preserve"> </w:t>
       </w:r>
-      <w:hyperlink r:id="rId157">
+      <w:hyperlink r:id="rId160">
         <w:r>
           <w:rPr>
             <w:rStyle w:val="Hyperlink"/>
@@ -9422,8 +9642,8 @@
         <w:t xml:space="preserve"> </w:t>
       </w:r>
     </w:p>
-    <w:bookmarkEnd w:id="158"/>
-    <w:bookmarkStart w:id="160" w:name="X99fa6bd9cd2521340285769f289a6c9d4bfe17b"/>
+    <w:bookmarkEnd w:id="161"/>
+    <w:bookmarkStart w:id="163" w:name="X99fa6bd9cd2521340285769f289a6c9d4bfe17b"/>
     <w:p>
       <w:pPr>
         <w:pStyle w:val="Bibliography"/>
@@ -9443,7 +9663,7 @@
       <w:r>
         <w:t xml:space="preserve"> </w:t>
       </w:r>
-      <w:hyperlink r:id="rId159">
+      <w:hyperlink r:id="rId162">
         <w:r>
           <w:rPr>
             <w:rStyle w:val="Hyperlink"/>
@@ -9518,8 +9738,8 @@
         <w:t xml:space="preserve"> </w:t>
       </w:r>
     </w:p>
-    <w:bookmarkEnd w:id="160"/>
-    <w:bookmarkStart w:id="162" w:name="Xec30ec7c912152a14c0f622040312567154bf15"/>
+    <w:bookmarkEnd w:id="163"/>
+    <w:bookmarkStart w:id="165" w:name="Xec30ec7c912152a14c0f622040312567154bf15"/>
     <w:p>
       <w:pPr>
         <w:pStyle w:val="Bibliography"/>
@@ -9539,7 +9759,7 @@
       <w:r>
         <w:t xml:space="preserve"> </w:t>
       </w:r>
-      <w:hyperlink r:id="rId161">
+      <w:hyperlink r:id="rId164">
         <w:r>
           <w:rPr>
             <w:rStyle w:val="Hyperlink"/>
@@ -9689,8 +9909,8 @@
         <w:t xml:space="preserve"> </w:t>
       </w:r>
     </w:p>
-    <w:bookmarkEnd w:id="162"/>
-    <w:bookmarkStart w:id="164" w:name="ref-gelman2013BayesianDataAnalysis"/>
+    <w:bookmarkEnd w:id="165"/>
+    <w:bookmarkStart w:id="167" w:name="ref-gelman2013BayesianDataAnalysis"/>
     <w:p>
       <w:pPr>
         <w:pStyle w:val="Bibliography"/>
@@ -9710,7 +9930,7 @@
       <w:r>
         <w:t xml:space="preserve"> </w:t>
       </w:r>
-      <w:hyperlink r:id="rId163">
+      <w:hyperlink r:id="rId166">
         <w:r>
           <w:rPr>
             <w:rStyle w:val="Hyperlink"/>
@@ -9746,8 +9966,8 @@
         <w:t xml:space="preserve"> </w:t>
       </w:r>
     </w:p>
-    <w:bookmarkEnd w:id="164"/>
-    <w:bookmarkStart w:id="166" w:name="ref-gelman2020BayesianWorkflow"/>
+    <w:bookmarkEnd w:id="167"/>
+    <w:bookmarkStart w:id="169" w:name="ref-gelman2020BayesianWorkflow"/>
     <w:p>
       <w:pPr>
         <w:pStyle w:val="Bibliography"/>
@@ -9767,7 +9987,7 @@
       <w:r>
         <w:t xml:space="preserve"> </w:t>
       </w:r>
-      <w:hyperlink r:id="rId165">
+      <w:hyperlink r:id="rId168">
         <w:r>
           <w:rPr>
             <w:rStyle w:val="Hyperlink"/>
@@ -9794,8 +10014,8 @@
         <w:t xml:space="preserve"> </w:t>
       </w:r>
     </w:p>
-    <w:bookmarkEnd w:id="166"/>
-    <w:bookmarkStart w:id="167" w:name="Xd915bcb040430c17655975a5ceb4d7b4bdd04ac"/>
+    <w:bookmarkEnd w:id="169"/>
+    <w:bookmarkStart w:id="170" w:name="Xd915bcb040430c17655975a5ceb4d7b4bdd04ac"/>
     <w:p>
       <w:pPr>
         <w:pStyle w:val="Bibliography"/>
@@ -9816,8 +10036,8 @@
         <w:t xml:space="preserve"> </w:t>
       </w:r>
     </w:p>
-    <w:bookmarkEnd w:id="167"/>
-    <w:bookmarkStart w:id="169" w:name="ref-kazi2026PvaluesBayesFactor"/>
+    <w:bookmarkEnd w:id="170"/>
+    <w:bookmarkStart w:id="172" w:name="ref-kazi2026PvaluesBayesFactor"/>
     <w:p>
       <w:pPr>
         <w:pStyle w:val="Bibliography"/>
@@ -9837,7 +10057,7 @@
       <w:r>
         <w:t xml:space="preserve"> </w:t>
       </w:r>
-      <w:hyperlink r:id="rId168">
+      <w:hyperlink r:id="rId171">
         <w:r>
           <w:rPr>
             <w:rStyle w:val="Hyperlink"/>
@@ -9906,8 +10126,8 @@
         <w:t xml:space="preserve"> </w:t>
       </w:r>
     </w:p>
-    <w:bookmarkEnd w:id="169"/>
-    <w:bookmarkStart w:id="171" w:name="X946754e67e3c74fad7a8806aa9d2819ed4ec186"/>
+    <w:bookmarkEnd w:id="172"/>
+    <w:bookmarkStart w:id="174" w:name="X946754e67e3c74fad7a8806aa9d2819ed4ec186"/>
     <w:p>
       <w:pPr>
         <w:pStyle w:val="Bibliography"/>
@@ -9927,7 +10147,7 @@
       <w:r>
         <w:t xml:space="preserve"> </w:t>
       </w:r>
-      <w:hyperlink r:id="rId170">
+      <w:hyperlink r:id="rId173">
         <w:r>
           <w:rPr>
             <w:rStyle w:val="Hyperlink"/>
@@ -9942,8 +10162,8 @@
         <w:t xml:space="preserve"> </w:t>
       </w:r>
     </w:p>
-    <w:bookmarkEnd w:id="171"/>
-    <w:bookmarkStart w:id="173" w:name="ref-ciyer2025BayesianMetaanalysis21st"/>
+    <w:bookmarkEnd w:id="174"/>
+    <w:bookmarkStart w:id="176" w:name="ref-ciyer2025BayesianMetaanalysis21st"/>
     <w:p>
       <w:pPr>
         <w:pStyle w:val="Bibliography"/>
@@ -9963,7 +10183,7 @@
       <w:r>
         <w:t xml:space="preserve"> </w:t>
       </w:r>
-      <w:hyperlink r:id="rId172">
+      <w:hyperlink r:id="rId175">
         <w:r>
           <w:rPr>
             <w:rStyle w:val="Hyperlink"/>
@@ -10002,8 +10222,8 @@
         <w:t xml:space="preserve"> </w:t>
       </w:r>
     </w:p>
-    <w:bookmarkEnd w:id="173"/>
-    <w:bookmarkStart w:id="175" w:name="ref-hong2013ComparingBayesianFrequentist"/>
+    <w:bookmarkEnd w:id="176"/>
+    <w:bookmarkStart w:id="178" w:name="ref-hong2013ComparingBayesianFrequentist"/>
     <w:p>
       <w:pPr>
         <w:pStyle w:val="Bibliography"/>
@@ -10023,7 +10243,7 @@
       <w:r>
         <w:t xml:space="preserve"> </w:t>
       </w:r>
-      <w:hyperlink r:id="rId174">
+      <w:hyperlink r:id="rId177">
         <w:r>
           <w:rPr>
             <w:rStyle w:val="Hyperlink"/>
@@ -10098,8 +10318,8 @@
         <w:t xml:space="preserve"> </w:t>
       </w:r>
     </w:p>
-    <w:bookmarkEnd w:id="175"/>
-    <w:bookmarkStart w:id="177" w:name="ref-sadeghirad2023TheoryPracticeBayesian"/>
+    <w:bookmarkEnd w:id="178"/>
+    <w:bookmarkStart w:id="180" w:name="ref-sadeghirad2023TheoryPracticeBayesian"/>
     <w:p>
       <w:pPr>
         <w:pStyle w:val="Bibliography"/>
@@ -10119,7 +10339,7 @@
       <w:r>
         <w:t xml:space="preserve"> </w:t>
       </w:r>
-      <w:hyperlink r:id="rId176">
+      <w:hyperlink r:id="rId179">
         <w:r>
           <w:rPr>
             <w:rStyle w:val="Hyperlink"/>
@@ -10158,8 +10378,8 @@
         <w:t xml:space="preserve"> </w:t>
       </w:r>
     </w:p>
-    <w:bookmarkEnd w:id="177"/>
-    <w:bookmarkStart w:id="179" w:name="X55ae1a8b757df519e0a47e2002b3acc0b2e73ec"/>
+    <w:bookmarkEnd w:id="180"/>
+    <w:bookmarkStart w:id="182" w:name="X55ae1a8b757df519e0a47e2002b3acc0b2e73ec"/>
     <w:p>
       <w:pPr>
         <w:pStyle w:val="Bibliography"/>
@@ -10179,7 +10399,7 @@
       <w:r>
         <w:t xml:space="preserve"> </w:t>
       </w:r>
-      <w:hyperlink r:id="rId178">
+      <w:hyperlink r:id="rId181">
         <w:r>
           <w:rPr>
             <w:rStyle w:val="Hyperlink"/>
@@ -10218,9 +10438,9 @@
         <w:t xml:space="preserve"> </w:t>
       </w:r>
     </w:p>
-    <w:bookmarkEnd w:id="179"/>
-    <w:bookmarkEnd w:id="180"/>
-    <w:bookmarkEnd w:id="181"/>
+    <w:bookmarkEnd w:id="182"/>
+    <w:bookmarkEnd w:id="183"/>
+    <w:bookmarkEnd w:id="184"/>
     <w:sectPr>
       <w:footerReference r:id="rId9" w:type="default"/>
       <w:footnotePr>
@@ -10373,8 +10593,350 @@
       </w:pPr>
     </w:lvl>
   </w:abstractNum>
+  <w:abstractNum w:abstractNumId="991">
+    <w:nsid w:val="0000A991"/>
+    <w:multiLevelType w:val="multilevel"/>
+    <w:lvl w:ilvl="0">
+      <w:numFmt w:val="bullet"/>
+      <w:lvlText w:val=""/>
+      <w:lvlJc w:val="left"/>
+      <w:pPr>
+        <w:ind w:left="720" w:hanging="360"/>
+      </w:pPr>
+      <w:rPr>
+        <w:rFonts w:ascii="Symbol" w:hAnsi="Symbol" w:cs="Symbol" w:hint="default"/>
+      </w:rPr>
+    </w:lvl>
+    <w:lvl w:ilvl="1">
+      <w:numFmt w:val="bullet"/>
+      <w:lvlText w:val="o"/>
+      <w:lvlJc w:val="left"/>
+      <w:pPr>
+        <w:ind w:left="1440" w:hanging="360"/>
+      </w:pPr>
+      <w:rPr>
+        <w:rFonts w:ascii="Courier New" w:hAnsi="Courier New" w:cs="Courier New" w:hint="default"/>
+      </w:rPr>
+    </w:lvl>
+    <w:lvl w:ilvl="2">
+      <w:numFmt w:val="bullet"/>
+      <w:lvlText w:val=""/>
+      <w:lvlJc w:val="left"/>
+      <w:pPr>
+        <w:ind w:left="2160" w:hanging="360"/>
+      </w:pPr>
+      <w:rPr>
+        <w:rFonts w:ascii="Wingdings" w:hAnsi="Wingdings" w:cs="Wingdings" w:hint="default"/>
+      </w:rPr>
+    </w:lvl>
+    <w:lvl w:ilvl="3">
+      <w:numFmt w:val="bullet"/>
+      <w:lvlText w:val=""/>
+      <w:lvlJc w:val="left"/>
+      <w:pPr>
+        <w:ind w:left="2880" w:hanging="360"/>
+      </w:pPr>
+      <w:rPr>
+        <w:rFonts w:ascii="Symbol" w:hAnsi="Symbol" w:cs="Symbol" w:hint="default"/>
+      </w:rPr>
+    </w:lvl>
+    <w:lvl w:ilvl="4">
+      <w:numFmt w:val="bullet"/>
+      <w:lvlText w:val="o"/>
+      <w:lvlJc w:val="left"/>
+      <w:pPr>
+        <w:ind w:left="3600" w:hanging="360"/>
+      </w:pPr>
+      <w:rPr>
+        <w:rFonts w:ascii="Courier New" w:hAnsi="Courier New" w:cs="Courier New" w:hint="default"/>
+      </w:rPr>
+    </w:lvl>
+    <w:lvl w:ilvl="5">
+      <w:numFmt w:val="bullet"/>
+      <w:lvlText w:val=""/>
+      <w:lvlJc w:val="left"/>
+      <w:pPr>
+        <w:ind w:left="4320" w:hanging="360"/>
+      </w:pPr>
+      <w:rPr>
+        <w:rFonts w:ascii="Wingdings" w:hAnsi="Wingdings" w:cs="Wingdings" w:hint="default"/>
+      </w:rPr>
+    </w:lvl>
+    <w:lvl w:ilvl="6">
+      <w:numFmt w:val="bullet"/>
+      <w:lvlText w:val=""/>
+      <w:lvlJc w:val="left"/>
+      <w:pPr>
+        <w:ind w:left="5040" w:hanging="360"/>
+      </w:pPr>
+      <w:rPr>
+        <w:rFonts w:ascii="Symbol" w:hAnsi="Symbol" w:cs="Symbol" w:hint="default"/>
+      </w:rPr>
+    </w:lvl>
+    <w:lvl w:ilvl="7">
+      <w:numFmt w:val="bullet"/>
+      <w:lvlText w:val="o"/>
+      <w:lvlJc w:val="left"/>
+      <w:pPr>
+        <w:ind w:left="5760" w:hanging="360"/>
+      </w:pPr>
+      <w:rPr>
+        <w:rFonts w:ascii="Courier New" w:hAnsi="Courier New" w:cs="Courier New" w:hint="default"/>
+      </w:rPr>
+    </w:lvl>
+    <w:lvl w:ilvl="8">
+      <w:numFmt w:val="bullet"/>
+      <w:lvlText w:val=""/>
+      <w:lvlJc w:val="left"/>
+      <w:pPr>
+        <w:ind w:left="6480" w:hanging="360"/>
+      </w:pPr>
+      <w:rPr>
+        <w:rFonts w:ascii="Wingdings" w:hAnsi="Wingdings" w:cs="Wingdings" w:hint="default"/>
+      </w:rPr>
+    </w:lvl>
+  </w:abstractNum>
+  <w:abstractNum w:abstractNumId="99411">
+    <w:nsid w:val="00A99411"/>
+    <w:multiLevelType w:val="multilevel"/>
+    <w:lvl w:ilvl="0">
+      <w:start w:val="1"/>
+      <w:numFmt w:val="decimal"/>
+      <w:lvlText w:val="%1."/>
+      <w:lvlJc w:val="left"/>
+      <w:pPr>
+        <w:ind w:left="720" w:hanging="360"/>
+      </w:pPr>
+    </w:lvl>
+    <w:lvl w:ilvl="1">
+      <w:start w:val="1"/>
+      <w:numFmt w:val="decimal"/>
+      <w:lvlText w:val="%2."/>
+      <w:lvlJc w:val="left"/>
+      <w:pPr>
+        <w:ind w:left="1440" w:hanging="360"/>
+      </w:pPr>
+    </w:lvl>
+    <w:lvl w:ilvl="2">
+      <w:start w:val="1"/>
+      <w:numFmt w:val="decimal"/>
+      <w:lvlText w:val="%3."/>
+      <w:lvlJc w:val="left"/>
+      <w:pPr>
+        <w:ind w:left="2160" w:hanging="360"/>
+      </w:pPr>
+    </w:lvl>
+    <w:lvl w:ilvl="3">
+      <w:start w:val="1"/>
+      <w:numFmt w:val="decimal"/>
+      <w:lvlText w:val="%4."/>
+      <w:lvlJc w:val="left"/>
+      <w:pPr>
+        <w:ind w:left="2880" w:hanging="360"/>
+      </w:pPr>
+    </w:lvl>
+    <w:lvl w:ilvl="4">
+      <w:start w:val="1"/>
+      <w:numFmt w:val="decimal"/>
+      <w:lvlText w:val="%5."/>
+      <w:lvlJc w:val="left"/>
+      <w:pPr>
+        <w:ind w:left="3600" w:hanging="360"/>
+      </w:pPr>
+    </w:lvl>
+    <w:lvl w:ilvl="5">
+      <w:start w:val="1"/>
+      <w:numFmt w:val="decimal"/>
+      <w:lvlText w:val="%6."/>
+      <w:lvlJc w:val="left"/>
+      <w:pPr>
+        <w:ind w:left="4320" w:hanging="360"/>
+      </w:pPr>
+    </w:lvl>
+    <w:lvl w:ilvl="6">
+      <w:start w:val="1"/>
+      <w:numFmt w:val="decimal"/>
+      <w:lvlText w:val="%7."/>
+      <w:lvlJc w:val="left"/>
+      <w:pPr>
+        <w:ind w:left="5040" w:hanging="360"/>
+      </w:pPr>
+    </w:lvl>
+    <w:lvl w:ilvl="7">
+      <w:start w:val="1"/>
+      <w:numFmt w:val="decimal"/>
+      <w:lvlText w:val="%8."/>
+      <w:lvlJc w:val="left"/>
+      <w:pPr>
+        <w:ind w:left="5760" w:hanging="360"/>
+      </w:pPr>
+    </w:lvl>
+    <w:lvl w:ilvl="8">
+      <w:start w:val="1"/>
+      <w:numFmt w:val="decimal"/>
+      <w:lvlText w:val="%9."/>
+      <w:lvlJc w:val="left"/>
+      <w:pPr>
+        <w:ind w:left="6480" w:hanging="360"/>
+      </w:pPr>
+    </w:lvl>
+  </w:abstractNum>
+  <w:abstractNum w:abstractNumId="99412">
+    <w:nsid w:val="00A99412"/>
+    <w:multiLevelType w:val="multilevel"/>
+    <w:lvl w:ilvl="0">
+      <w:start w:val="2"/>
+      <w:numFmt w:val="decimal"/>
+      <w:lvlText w:val="%1."/>
+      <w:lvlJc w:val="left"/>
+      <w:pPr>
+        <w:ind w:left="720" w:hanging="360"/>
+      </w:pPr>
+    </w:lvl>
+    <w:lvl w:ilvl="1">
+      <w:start w:val="2"/>
+      <w:numFmt w:val="decimal"/>
+      <w:lvlText w:val="%2."/>
+      <w:lvlJc w:val="left"/>
+      <w:pPr>
+        <w:ind w:left="1440" w:hanging="360"/>
+      </w:pPr>
+    </w:lvl>
+    <w:lvl w:ilvl="2">
+      <w:start w:val="2"/>
+      <w:numFmt w:val="decimal"/>
+      <w:lvlText w:val="%3."/>
+      <w:lvlJc w:val="left"/>
+      <w:pPr>
+        <w:ind w:left="2160" w:hanging="360"/>
+      </w:pPr>
+    </w:lvl>
+    <w:lvl w:ilvl="3">
+      <w:start w:val="2"/>
+      <w:numFmt w:val="decimal"/>
+      <w:lvlText w:val="%4."/>
+      <w:lvlJc w:val="left"/>
+      <w:pPr>
+        <w:ind w:left="2880" w:hanging="360"/>
+      </w:pPr>
+    </w:lvl>
+    <w:lvl w:ilvl="4">
+      <w:start w:val="2"/>
+      <w:numFmt w:val="decimal"/>
+      <w:lvlText w:val="%5."/>
+      <w:lvlJc w:val="left"/>
+      <w:pPr>
+        <w:ind w:left="3600" w:hanging="360"/>
+      </w:pPr>
+    </w:lvl>
+    <w:lvl w:ilvl="5">
+      <w:start w:val="2"/>
+      <w:numFmt w:val="decimal"/>
+      <w:lvlText w:val="%6."/>
+      <w:lvlJc w:val="left"/>
+      <w:pPr>
+        <w:ind w:left="4320" w:hanging="360"/>
+      </w:pPr>
+    </w:lvl>
+    <w:lvl w:ilvl="6">
+      <w:start w:val="2"/>
+      <w:numFmt w:val="decimal"/>
+      <w:lvlText w:val="%7."/>
+      <w:lvlJc w:val="left"/>
+      <w:pPr>
+        <w:ind w:left="5040" w:hanging="360"/>
+      </w:pPr>
+    </w:lvl>
+    <w:lvl w:ilvl="7">
+      <w:start w:val="2"/>
+      <w:numFmt w:val="decimal"/>
+      <w:lvlText w:val="%8."/>
+      <w:lvlJc w:val="left"/>
+      <w:pPr>
+        <w:ind w:left="5760" w:hanging="360"/>
+      </w:pPr>
+    </w:lvl>
+    <w:lvl w:ilvl="8">
+      <w:start w:val="2"/>
+      <w:numFmt w:val="decimal"/>
+      <w:lvlText w:val="%9."/>
+      <w:lvlJc w:val="left"/>
+      <w:pPr>
+        <w:ind w:left="6480" w:hanging="360"/>
+      </w:pPr>
+    </w:lvl>
+  </w:abstractNum>
   <w:num w:numId="1000">
     <w:abstractNumId w:val="990"/>
+  </w:num>
+  <w:num w:numId="1001">
+    <w:abstractNumId w:val="991"/>
+  </w:num>
+  <w:num w:numId="1002">
+    <w:abstractNumId w:val="99411"/>
+    <w:lvlOverride w:ilvl="0">
+      <w:startOverride w:val="1"/>
+    </w:lvlOverride>
+    <w:lvlOverride w:ilvl="1">
+      <w:startOverride w:val="1"/>
+    </w:lvlOverride>
+    <w:lvlOverride w:ilvl="2">
+      <w:startOverride w:val="1"/>
+    </w:lvlOverride>
+    <w:lvlOverride w:ilvl="3">
+      <w:startOverride w:val="1"/>
+    </w:lvlOverride>
+    <w:lvlOverride w:ilvl="4">
+      <w:startOverride w:val="1"/>
+    </w:lvlOverride>
+    <w:lvlOverride w:ilvl="5">
+      <w:startOverride w:val="1"/>
+    </w:lvlOverride>
+    <w:lvlOverride w:ilvl="6">
+      <w:startOverride w:val="1"/>
+    </w:lvlOverride>
+    <w:lvlOverride w:ilvl="7">
+      <w:startOverride w:val="1"/>
+    </w:lvlOverride>
+    <w:lvlOverride w:ilvl="8">
+      <w:startOverride w:val="1"/>
+    </w:lvlOverride>
+  </w:num>
+  <w:num w:numId="1003">
+    <w:abstractNumId w:val="991"/>
+  </w:num>
+  <w:num w:numId="1004">
+    <w:abstractNumId w:val="99412"/>
+    <w:lvlOverride w:ilvl="0">
+      <w:startOverride w:val="2"/>
+    </w:lvlOverride>
+    <w:lvlOverride w:ilvl="1">
+      <w:startOverride w:val="2"/>
+    </w:lvlOverride>
+    <w:lvlOverride w:ilvl="2">
+      <w:startOverride w:val="2"/>
+    </w:lvlOverride>
+    <w:lvlOverride w:ilvl="3">
+      <w:startOverride w:val="2"/>
+    </w:lvlOverride>
+    <w:lvlOverride w:ilvl="4">
+      <w:startOverride w:val="2"/>
+    </w:lvlOverride>
+    <w:lvlOverride w:ilvl="5">
+      <w:startOverride w:val="2"/>
+    </w:lvlOverride>
+    <w:lvlOverride w:ilvl="6">
+      <w:startOverride w:val="2"/>
+    </w:lvlOverride>
+    <w:lvlOverride w:ilvl="7">
+      <w:startOverride w:val="2"/>
+    </w:lvlOverride>
+    <w:lvlOverride w:ilvl="8">
+      <w:startOverride w:val="2"/>
+    </w:lvlOverride>
+  </w:num>
+  <w:num w:numId="1005">
+    <w:abstractNumId w:val="991"/>
   </w:num>
 </w:numbering>
 </file>

</xml_diff>

<commit_message>
version for comments from Simon
</commit_message>
<xml_diff>
--- a/manuscript/manuscript.docx
+++ b/manuscript/manuscript.docx
@@ -966,7 +966,7 @@
       </w:r>
     </w:p>
     <w:bookmarkEnd w:id="24"/>
-    <w:bookmarkStart w:id="38" w:name="methods"/>
+    <w:bookmarkStart w:id="37" w:name="methods"/>
     <w:p>
       <w:pPr>
         <w:pStyle w:val="Heading1"/>
@@ -1656,7 +1656,7 @@
       </w:r>
     </w:p>
     <w:bookmarkEnd w:id="29"/>
-    <w:bookmarkStart w:id="36" w:name="meta-analysis-methodology"/>
+    <w:bookmarkStart w:id="35" w:name="meta-analysis-methodology"/>
     <w:p>
       <w:pPr>
         <w:pStyle w:val="Heading2"/>
@@ -1746,7 +1746,7 @@
         <w:t xml:space="preserve">.</w:t>
       </w:r>
     </w:p>
-    <w:bookmarkStart w:id="32" w:name="bayesian-meta-analysis"/>
+    <w:bookmarkStart w:id="33" w:name="bayesian-meta-analysis"/>
     <w:p>
       <w:pPr>
         <w:pStyle w:val="Heading3"/>
@@ -2359,19 +2359,9 @@
         <w:t xml:space="preserve">results are comparable.</w:t>
       </w:r>
     </w:p>
-    <w:bookmarkEnd w:id="32"/>
-    <w:bookmarkStart w:id="34" w:name="priors"/>
-    <w:p>
-      <w:pPr>
-        <w:pStyle w:val="Heading3"/>
-      </w:pPr>
-      <w:r>
-        <w:t xml:space="preserve">2.4.2 Priors</w:t>
-      </w:r>
-    </w:p>
-    <w:p>
-      <w:pPr>
-        <w:pStyle w:val="FirstParagraph"/>
+    <w:p>
+      <w:pPr>
+        <w:pStyle w:val="BodyText"/>
       </w:pPr>
       <w:r>
         <w:t xml:space="preserve">In Bayesian statistics, prior knowledge or assumptions from previously published studies, domain knowledge or beliefs are updated by the newly observed data and together result in a posterior distribution.</w:t>
@@ -2536,7 +2526,7 @@
       <w:pPr>
         <w:pStyle w:val="BodyText"/>
       </w:pPr>
-      <w:bookmarkStart w:id="33" w:name="eq-priors"/>
+      <w:bookmarkStart w:id="32" w:name="eq-priors"/>
       <m:oMathPara>
         <m:oMathParaPr>
           <m:jc m:val="center"/>
@@ -2687,7 +2677,7 @@
           </m:d>
         </m:oMath>
       </m:oMathPara>
-      <w:bookmarkEnd w:id="33"/>
+      <w:bookmarkEnd w:id="32"/>
     </w:p>
     <w:p>
       <w:pPr>
@@ -2730,14 +2720,14 @@
         <w:t xml:space="preserve">Additionally, a sensitivity analysis with alternative priors was conducted, as described below.</w:t>
       </w:r>
     </w:p>
-    <w:bookmarkEnd w:id="34"/>
-    <w:bookmarkStart w:id="35" w:name="frequentist-meta-analysis"/>
+    <w:bookmarkEnd w:id="33"/>
+    <w:bookmarkStart w:id="34" w:name="frequentist-meta-analysis"/>
     <w:p>
       <w:pPr>
         <w:pStyle w:val="Heading3"/>
       </w:pPr>
       <w:r>
-        <w:t xml:space="preserve">2.4.3 Frequentist Meta-Analysis</w:t>
+        <w:t xml:space="preserve">2.4.2 Frequentist Meta-Analysis</w:t>
       </w:r>
     </w:p>
     <w:p>
@@ -2838,9 +2828,9 @@
         <w:t xml:space="preserve">.</w:t>
       </w:r>
     </w:p>
+    <w:bookmarkEnd w:id="34"/>
     <w:bookmarkEnd w:id="35"/>
-    <w:bookmarkEnd w:id="36"/>
-    <w:bookmarkStart w:id="37" w:name="sensitivity-analysis"/>
+    <w:bookmarkStart w:id="36" w:name="sensitivity-analysis"/>
     <w:p>
       <w:pPr>
         <w:pStyle w:val="Heading2"/>
@@ -3125,9 +3115,9 @@
         <w:t xml:space="preserve">Notice that for the main effect, the broader prior is centered around 0, giving equal weight to the probability of a protective and detrimental effect of lead.</w:t>
       </w:r>
     </w:p>
+    <w:bookmarkEnd w:id="36"/>
     <w:bookmarkEnd w:id="37"/>
-    <w:bookmarkEnd w:id="38"/>
-    <w:bookmarkStart w:id="49" w:name="results"/>
+    <w:bookmarkStart w:id="48" w:name="results"/>
     <w:p>
       <w:pPr>
         <w:pStyle w:val="Heading1"/>
@@ -3136,7 +3126,7 @@
         <w:t xml:space="preserve">3. Results</w:t>
       </w:r>
     </w:p>
-    <w:bookmarkStart w:id="42" w:name="literature-review-1"/>
+    <w:bookmarkStart w:id="41" w:name="literature-review-1"/>
     <w:p>
       <w:pPr>
         <w:pStyle w:val="Heading2"/>
@@ -3248,18 +3238,18 @@
           <wp:inline>
             <wp:extent cx="3566160" cy="4059018"/>
             <wp:effectExtent b="0" l="0" r="0" t="0"/>
-            <wp:docPr descr="Fig. 1: PRISMA flow diagram" title="" id="40" name="Picture"/>
+            <wp:docPr descr="Fig. 1: PRISMA flow diagram" title="" id="39" name="Picture"/>
             <a:graphic>
               <a:graphicData uri="http://schemas.openxmlformats.org/drawingml/2006/picture">
                 <pic:pic>
                   <pic:nvPicPr>
-                    <pic:cNvPr descr="tables_figures/main/figure1.png" id="41" name="Picture"/>
+                    <pic:cNvPr descr="tables_figures/main/figure1.png" id="40" name="Picture"/>
                     <pic:cNvPicPr>
                       <a:picLocks noChangeArrowheads="1" noChangeAspect="1"/>
                     </pic:cNvPicPr>
                   </pic:nvPicPr>
                   <pic:blipFill>
-                    <a:blip r:embed="rId39"/>
+                    <a:blip r:embed="rId38"/>
                     <a:stretch>
                       <a:fillRect/>
                     </a:stretch>
@@ -3389,8 +3379,8 @@
         <w:t xml:space="preserve">We contacted the corresponding author, who confirmed that decimal points were missing in the publication.</w:t>
       </w:r>
     </w:p>
-    <w:bookmarkEnd w:id="42"/>
-    <w:bookmarkStart w:id="43" w:name="risk-of-bias"/>
+    <w:bookmarkEnd w:id="41"/>
+    <w:bookmarkStart w:id="42" w:name="risk-of-bias"/>
     <w:p>
       <w:pPr>
         <w:pStyle w:val="Heading2"/>
@@ -3521,8 +3511,8 @@
         <w:t xml:space="preserve">Results from the RoB assessment are presented in Tab. 4.</w:t>
       </w:r>
     </w:p>
-    <w:bookmarkEnd w:id="43"/>
-    <w:bookmarkStart w:id="47" w:name="meta-analysis-results"/>
+    <w:bookmarkEnd w:id="42"/>
+    <w:bookmarkStart w:id="46" w:name="meta-analysis-results"/>
     <w:p>
       <w:pPr>
         <w:pStyle w:val="Heading2"/>
@@ -3786,18 +3776,18 @@
           <wp:inline>
             <wp:extent cx="5943600" cy="2228220"/>
             <wp:effectExtent b="0" l="0" r="0" t="0"/>
-            <wp:docPr descr="Fig. 2: Forest plots for Bayesian (left) and frequentist (right) meta-analyses. BLL, blood lead level; CI, confidence interval; CrI, credible interval" title="" id="45" name="Picture"/>
+            <wp:docPr descr="Fig. 2: Forest plots for Bayesian (left) and frequentist (right) meta-analyses. BLL, blood lead level; CI, confidence interval; CrI, credible interval" title="" id="44" name="Picture"/>
             <a:graphic>
               <a:graphicData uri="http://schemas.openxmlformats.org/drawingml/2006/picture">
                 <pic:pic>
                   <pic:nvPicPr>
-                    <pic:cNvPr descr="./tables_figures/main/combined_forest_plots.png" id="46" name="Picture"/>
+                    <pic:cNvPr descr="./tables_figures/main/combined_forest_plots.png" id="45" name="Picture"/>
                     <pic:cNvPicPr>
                       <a:picLocks noChangeArrowheads="1" noChangeAspect="1"/>
                     </pic:cNvPicPr>
                   </pic:nvPicPr>
                   <pic:blipFill>
-                    <a:blip r:embed="rId44"/>
+                    <a:blip r:embed="rId43"/>
                     <a:stretch>
                       <a:fillRect/>
                     </a:stretch>
@@ -3852,8 +3842,8 @@
         <w:t xml:space="preserve">This leads to a shrinkage of the posterior means towards the pooled effect and is comparable to the inverse-variance weighting in frequentist meta-analyses.</w:t>
       </w:r>
     </w:p>
-    <w:bookmarkEnd w:id="47"/>
-    <w:bookmarkStart w:id="48" w:name="sensitivity-analysis-results"/>
+    <w:bookmarkEnd w:id="46"/>
+    <w:bookmarkStart w:id="47" w:name="sensitivity-analysis-results"/>
     <w:p>
       <w:pPr>
         <w:pStyle w:val="Heading2"/>
@@ -3867,7 +3857,7 @@
         <w:pStyle w:val="FirstParagraph"/>
       </w:pPr>
       <w:r>
-        <w:t xml:space="preserve">We conducted two sets of sensitivity analyses, results are shown in Tab. 4.</w:t>
+        <w:t xml:space="preserve">We conducted two sets of sensitivity analyses, results are shown in Tab. 5.</w:t>
       </w:r>
       <w:r>
         <w:t xml:space="preserve"> </w:t>
@@ -4168,9 +4158,9 @@
         <w:t xml:space="preserve">Supplementary file 6 shows prior, observed data and posterior distributions of all three prior specifications.</w:t>
       </w:r>
     </w:p>
+    <w:bookmarkEnd w:id="47"/>
     <w:bookmarkEnd w:id="48"/>
-    <w:bookmarkEnd w:id="49"/>
-    <w:bookmarkStart w:id="50" w:name="discussion"/>
+    <w:bookmarkStart w:id="49" w:name="discussion"/>
     <w:p>
       <w:pPr>
         <w:pStyle w:val="Heading1"/>
@@ -4413,6 +4403,9 @@
       </w:pPr>
       <w:r>
         <w:t xml:space="preserve">Our results are consistent with previous toxicological and epidemiological evidence</w:t>
+      </w:r>
+      <w:r>
+        <w:t xml:space="preserve"> </w:t>
       </w:r>
       <w:r>
         <w:t xml:space="preserve">[13,15,16,19]</w:t>
@@ -4625,56 +4618,56 @@
         <w:t xml:space="preserve">This reduced the number of studies included in the meta-analysis and is an additional limitation.</w:t>
       </w:r>
     </w:p>
+    <w:bookmarkEnd w:id="49"/>
+    <w:bookmarkStart w:id="50" w:name="conclusions"/>
+    <w:p>
+      <w:pPr>
+        <w:pStyle w:val="Heading1"/>
+      </w:pPr>
+      <w:r>
+        <w:t xml:space="preserve">5. Conclusions</w:t>
+      </w:r>
+    </w:p>
+    <w:p>
+      <w:pPr>
+        <w:pStyle w:val="FirstParagraph"/>
+      </w:pPr>
+      <w:r>
+        <w:t xml:space="preserve">This study provides both an updated evidence synthesis of epidemiological studies examining the association between lead exposure and children’s IQ, and a methodological comparison of the Bayesian and more conventional frequentist frameworks for meta-analysis.</w:t>
+      </w:r>
+      <w:r>
+        <w:t xml:space="preserve"> </w:t>
+      </w:r>
+      <w:r>
+        <w:t xml:space="preserve">The resulting pooled effect estimates are consistent with previous evidence and once again emphasize the importance of reducing environmental lead contamination to reduce the public health burden this substance continues to impose.</w:t>
+      </w:r>
+      <w:r>
+        <w:br/>
+      </w:r>
+      <w:r>
+        <w:t xml:space="preserve">Comparing both frameworks showed that the Bayesian approach offers distinct advantages for risk assessment and policy-making.</w:t>
+      </w:r>
+      <w:r>
+        <w:t xml:space="preserve"> </w:t>
+      </w:r>
+      <w:r>
+        <w:t xml:space="preserve">Especially the ability to incorporate prior knowledge, comprehensively quantify uncertainty, and produce probabilistic outputs that are more directly useable for decision-makers.</w:t>
+      </w:r>
+      <w:r>
+        <w:t xml:space="preserve"> </w:t>
+      </w:r>
+      <w:r>
+        <w:t xml:space="preserve">While the Bayesian framework currently demands greater statistical knowledge and programming effort than the frequentist approach, these barriers are likely to diminish if the framework gains wider adoption and training becomes more accessible.</w:t>
+      </w:r>
+      <w:r>
+        <w:t xml:space="preserve"> </w:t>
+      </w:r>
+      <w:r>
+        <w:t xml:space="preserve">We therefore want to encourage researchers to consider Bayesian methods where capacity allows.</w:t>
+      </w:r>
+    </w:p>
     <w:bookmarkEnd w:id="50"/>
-    <w:bookmarkStart w:id="51" w:name="conclusions"/>
-    <w:p>
-      <w:pPr>
-        <w:pStyle w:val="Heading1"/>
-      </w:pPr>
-      <w:r>
-        <w:t xml:space="preserve">5. Conclusions</w:t>
-      </w:r>
-    </w:p>
-    <w:p>
-      <w:pPr>
-        <w:pStyle w:val="FirstParagraph"/>
-      </w:pPr>
-      <w:r>
-        <w:t xml:space="preserve">This study provides both an updated evidence synthesis of epidemiological studies examining the association between lead exposure and children’s IQ, and a methodological comparison of the Bayesian and more conventional frequentist frameworks for meta-analysis.</w:t>
-      </w:r>
-      <w:r>
-        <w:t xml:space="preserve"> </w:t>
-      </w:r>
-      <w:r>
-        <w:t xml:space="preserve">The resulting pooled effect estimates are consistent with previous evidence and once again emphasize the importance of reducing environmental lead contamination to reduce the public health burden this substance continues to impose.</w:t>
-      </w:r>
-      <w:r>
-        <w:br/>
-      </w:r>
-      <w:r>
-        <w:t xml:space="preserve">Comparing both frameworks showed that the Bayesian approach offers distinct advantages for risk assessment and policy-making.</w:t>
-      </w:r>
-      <w:r>
-        <w:t xml:space="preserve"> </w:t>
-      </w:r>
-      <w:r>
-        <w:t xml:space="preserve">Especially the ability to incorporate prior knowledge, comprehensively quantify uncertainty, and produce probabilistic outputs that are more directly useable for decision-makers.</w:t>
-      </w:r>
-      <w:r>
-        <w:t xml:space="preserve"> </w:t>
-      </w:r>
-      <w:r>
-        <w:t xml:space="preserve">While the Bayesian framework currently demands greater statistical knowledge and programming effort than the frequentist approach, these barriers are likely to diminish if the framework gains wider adoption and training becomes more accessible.</w:t>
-      </w:r>
-      <w:r>
-        <w:t xml:space="preserve"> </w:t>
-      </w:r>
-      <w:r>
-        <w:t xml:space="preserve">We therefore want to encourage researchers to consider Bayesian methods where capacity allows.</w:t>
-      </w:r>
-    </w:p>
-    <w:bookmarkEnd w:id="51"/>
-    <w:bookmarkStart w:id="52" w:name="list-of-abbreviations"/>
+    <w:bookmarkStart w:id="51" w:name="list-of-abbreviations"/>
     <w:p>
       <w:pPr>
         <w:pStyle w:val="Heading1"/>
@@ -5087,14 +5080,74 @@
         </w:tc>
       </w:tr>
     </w:tbl>
+    <w:bookmarkEnd w:id="51"/>
+    <w:bookmarkStart w:id="52" w:name="acknowledgements"/>
+    <w:p>
+      <w:pPr>
+        <w:pStyle w:val="Heading1"/>
+      </w:pPr>
+      <w:r>
+        <w:t xml:space="preserve">Acknowledgements</w:t>
+      </w:r>
+    </w:p>
+    <w:p>
+      <w:pPr>
+        <w:pStyle w:val="FirstParagraph"/>
+      </w:pPr>
+      <w:r>
+        <w:t xml:space="preserve">The authors thank</w:t>
+      </w:r>
+      <w:r>
+        <w:t xml:space="preserve"> </w:t>
+      </w:r>
+      <w:r>
+        <w:t xml:space="preserve">Rafiqa Benchrih (Department of Epidemiology and Public Health, Sciensano, Belgium),</w:t>
+      </w:r>
+      <w:r>
+        <w:t xml:space="preserve"> </w:t>
+      </w:r>
+      <w:r>
+        <w:t xml:space="preserve">Jurgen Buekers (Flemish Institute for Technological Research, VITO, Belgium),</w:t>
+      </w:r>
+      <w:r>
+        <w:t xml:space="preserve"> </w:t>
+      </w:r>
+      <w:r>
+        <w:t xml:space="preserve">Carla Martins (National School of Public Health, NOVA University of Lisbon, Portugal),</w:t>
+      </w:r>
+      <w:r>
+        <w:t xml:space="preserve"> </w:t>
+      </w:r>
+      <w:r>
+        <w:t xml:space="preserve">Emily Mc Vey (Institute for Public Health and the Environment, RIVM, The Netherlands),</w:t>
+      </w:r>
+      <w:r>
+        <w:t xml:space="preserve"> </w:t>
+      </w:r>
+      <w:r>
+        <w:t xml:space="preserve">Anthony Purece (Flemish Institute for Technological Research, VITO, Belgium) and</w:t>
+      </w:r>
+      <w:r>
+        <w:t xml:space="preserve"> </w:t>
+      </w:r>
+      <w:r>
+        <w:t xml:space="preserve">Sofie Thomsen (Technical University of Denmark, DTU, Denmark)</w:t>
+      </w:r>
+      <w:r>
+        <w:t xml:space="preserve"> </w:t>
+      </w:r>
+      <w:r>
+        <w:t xml:space="preserve">for their help in the literature screening process.</w:t>
+      </w:r>
+    </w:p>
     <w:bookmarkEnd w:id="52"/>
-    <w:bookmarkStart w:id="53" w:name="acknowledgements"/>
+    <w:bookmarkStart w:id="53" w:name="funding"/>
     <w:p>
       <w:pPr>
         <w:pStyle w:val="Heading1"/>
       </w:pPr>
       <w:r>
-        <w:t xml:space="preserve">Acknowledgements</w:t>
+        <w:t xml:space="preserve">Funding</w:t>
       </w:r>
     </w:p>
     <w:p>
@@ -5102,93 +5155,33 @@
         <w:pStyle w:val="FirstParagraph"/>
       </w:pPr>
       <w:r>
-        <w:t xml:space="preserve">The authors thank</w:t>
-      </w:r>
-      <w:r>
-        <w:t xml:space="preserve"> </w:t>
-      </w:r>
-      <w:r>
-        <w:t xml:space="preserve">Rafiqa Benchrih (Department of Epidemiology and Public Health, Sciensano, Belgium),</w:t>
-      </w:r>
-      <w:r>
-        <w:t xml:space="preserve"> </w:t>
-      </w:r>
-      <w:r>
-        <w:t xml:space="preserve">Jurgen Buekers (Flemish Institute for Technological Research, VITO, Belgium),</w:t>
-      </w:r>
-      <w:r>
-        <w:t xml:space="preserve"> </w:t>
-      </w:r>
-      <w:r>
-        <w:t xml:space="preserve">Carla Martins (National School of Public Health, NOVA University of Lisbon, Portugal),</w:t>
-      </w:r>
-      <w:r>
-        <w:t xml:space="preserve"> </w:t>
-      </w:r>
-      <w:r>
-        <w:t xml:space="preserve">Emily Mc Vey (Institute for Public Health and the Environment, RIVM, The Netherlands),</w:t>
-      </w:r>
-      <w:r>
-        <w:t xml:space="preserve"> </w:t>
-      </w:r>
-      <w:r>
-        <w:t xml:space="preserve">Anthony Purece (Flemish Institute for Technological Research, VITO, Belgium) and</w:t>
-      </w:r>
-      <w:r>
-        <w:t xml:space="preserve"> </w:t>
-      </w:r>
-      <w:r>
-        <w:t xml:space="preserve">Sofie Thomsen (Technical University of Denmark, DTU, Denmark)</w:t>
-      </w:r>
-      <w:r>
-        <w:t xml:space="preserve"> </w:t>
-      </w:r>
-      <w:r>
-        <w:t xml:space="preserve">for their help in the literature screening process.</w:t>
+        <w:t xml:space="preserve">This work was carried out in the framework of the European Partnership for the Assessment of Risks from Chemicals (PARC) and has received funding from the European Union’s Horizon Europe research and innovation programme under Grant Agreement No 101057014.</w:t>
+      </w:r>
+      <w:r>
+        <w:t xml:space="preserve"> </w:t>
+      </w:r>
+      <w:r>
+        <w:t xml:space="preserve">Views and opinions expressed are however those of the author(s) only and do not necessarily reflect those of the European Union or the Health and Digital Executive Agency.</w:t>
+      </w:r>
+      <w:r>
+        <w:t xml:space="preserve"> </w:t>
+      </w:r>
+      <w:r>
+        <w:t xml:space="preserve">Neither the European Union nor the granting authority can be held responsible for them.</w:t>
       </w:r>
     </w:p>
     <w:bookmarkEnd w:id="53"/>
-    <w:bookmarkStart w:id="54" w:name="funding"/>
+    <w:bookmarkStart w:id="179" w:name="bibliography"/>
     <w:p>
       <w:pPr>
         <w:pStyle w:val="Heading1"/>
       </w:pPr>
       <w:r>
-        <w:t xml:space="preserve">Funding</w:t>
-      </w:r>
-    </w:p>
-    <w:p>
-      <w:pPr>
-        <w:pStyle w:val="FirstParagraph"/>
-      </w:pPr>
-      <w:r>
-        <w:t xml:space="preserve">This work was carried out in the framework of the European Partnership for the Assessment of Risks from Chemicals (PARC) and has received funding from the European Union’s Horizon Europe research and innovation programme under Grant Agreement No 101057014.</w:t>
-      </w:r>
-      <w:r>
-        <w:t xml:space="preserve"> </w:t>
-      </w:r>
-      <w:r>
-        <w:t xml:space="preserve">Views and opinions expressed are however those of the author(s) only and do not necessarily reflect those of the European Union or the Health and Digital Executive Agency.</w:t>
-      </w:r>
-      <w:r>
-        <w:t xml:space="preserve"> </w:t>
-      </w:r>
-      <w:r>
-        <w:t xml:space="preserve">Neither the European Union nor the granting authority can be held responsible for them.</w:t>
-      </w:r>
-    </w:p>
-    <w:bookmarkEnd w:id="54"/>
-    <w:bookmarkStart w:id="180" w:name="bibliography"/>
-    <w:p>
-      <w:pPr>
-        <w:pStyle w:val="Heading1"/>
-      </w:pPr>
-      <w:r>
         <w:t xml:space="preserve">References</w:t>
       </w:r>
     </w:p>
-    <w:bookmarkStart w:id="179" w:name="refs"/>
-    <w:bookmarkStart w:id="56" w:name="Xe38019c88c6d2792bb296bad7dc0a4dd55f1319"/>
+    <w:bookmarkStart w:id="178" w:name="refs"/>
+    <w:bookmarkStart w:id="55" w:name="Xe38019c88c6d2792bb296bad7dc0a4dd55f1319"/>
     <w:p>
       <w:pPr>
         <w:pStyle w:val="Bibliography"/>
@@ -5220,7 +5213,7 @@
       <w:r>
         <w:t xml:space="preserve"> </w:t>
       </w:r>
-      <w:hyperlink r:id="rId55">
+      <w:hyperlink r:id="rId54">
         <w:r>
           <w:rPr>
             <w:rStyle w:val="Hyperlink"/>
@@ -5232,8 +5225,8 @@
         <w:t xml:space="preserve">.</w:t>
       </w:r>
     </w:p>
-    <w:bookmarkEnd w:id="56"/>
-    <w:bookmarkStart w:id="58" w:name="ref-lacerda2023GlobalDecreaseBlood"/>
+    <w:bookmarkEnd w:id="55"/>
+    <w:bookmarkStart w:id="57" w:name="ref-lacerda2023GlobalDecreaseBlood"/>
     <w:p>
       <w:pPr>
         <w:pStyle w:val="Bibliography"/>
@@ -5253,7 +5246,7 @@
       <w:r>
         <w:t xml:space="preserve"> </w:t>
       </w:r>
-      <w:hyperlink r:id="rId57">
+      <w:hyperlink r:id="rId56">
         <w:r>
           <w:rPr>
             <w:rStyle w:val="Hyperlink"/>
@@ -5265,8 +5258,8 @@
         <w:t xml:space="preserve">.</w:t>
       </w:r>
     </w:p>
-    <w:bookmarkEnd w:id="58"/>
-    <w:bookmarkStart w:id="60" w:name="X4707f3a4b72a0982487545f9dc3d674642af108"/>
+    <w:bookmarkEnd w:id="57"/>
+    <w:bookmarkStart w:id="59" w:name="X4707f3a4b72a0982487545f9dc3d674642af108"/>
     <w:p>
       <w:pPr>
         <w:pStyle w:val="Bibliography"/>
@@ -5298,7 +5291,7 @@
       <w:r>
         <w:t xml:space="preserve"> </w:t>
       </w:r>
-      <w:hyperlink r:id="rId59">
+      <w:hyperlink r:id="rId58">
         <w:r>
           <w:rPr>
             <w:rStyle w:val="Hyperlink"/>
@@ -5310,8 +5303,8 @@
         <w:t xml:space="preserve">.</w:t>
       </w:r>
     </w:p>
-    <w:bookmarkEnd w:id="60"/>
-    <w:bookmarkStart w:id="62" w:name="ref-sy2024AssessmentLongTermExposure"/>
+    <w:bookmarkEnd w:id="59"/>
+    <w:bookmarkStart w:id="61" w:name="ref-sy2024AssessmentLongTermExposure"/>
     <w:p>
       <w:pPr>
         <w:pStyle w:val="Bibliography"/>
@@ -5364,7 +5357,7 @@
       <w:r>
         <w:t xml:space="preserve"> </w:t>
       </w:r>
-      <w:hyperlink r:id="rId61">
+      <w:hyperlink r:id="rId60">
         <w:r>
           <w:rPr>
             <w:rStyle w:val="Hyperlink"/>
@@ -5376,8 +5369,8 @@
         <w:t xml:space="preserve">.</w:t>
       </w:r>
     </w:p>
-    <w:bookmarkEnd w:id="62"/>
-    <w:bookmarkStart w:id="64" w:name="ref-brauer2024GlobalBurdenStrength"/>
+    <w:bookmarkEnd w:id="61"/>
+    <w:bookmarkStart w:id="63" w:name="ref-brauer2024GlobalBurdenStrength"/>
     <w:p>
       <w:pPr>
         <w:pStyle w:val="Bibliography"/>
@@ -5421,7 +5414,7 @@
       <w:r>
         <w:t xml:space="preserve"> </w:t>
       </w:r>
-      <w:hyperlink r:id="rId63">
+      <w:hyperlink r:id="rId62">
         <w:r>
           <w:rPr>
             <w:rStyle w:val="Hyperlink"/>
@@ -5433,8 +5426,8 @@
         <w:t xml:space="preserve">.</w:t>
       </w:r>
     </w:p>
-    <w:bookmarkEnd w:id="64"/>
-    <w:bookmarkStart w:id="66" w:name="ref-harari2018BloodLeadLevels"/>
+    <w:bookmarkEnd w:id="63"/>
+    <w:bookmarkStart w:id="65" w:name="ref-harari2018BloodLeadLevels"/>
     <w:p>
       <w:pPr>
         <w:pStyle w:val="Bibliography"/>
@@ -5487,7 +5480,7 @@
       <w:r>
         <w:t xml:space="preserve"> </w:t>
       </w:r>
-      <w:hyperlink r:id="rId65">
+      <w:hyperlink r:id="rId64">
         <w:r>
           <w:rPr>
             <w:rStyle w:val="Hyperlink"/>
@@ -5499,8 +5492,8 @@
         <w:t xml:space="preserve">.</w:t>
       </w:r>
     </w:p>
-    <w:bookmarkEnd w:id="66"/>
-    <w:bookmarkStart w:id="68" w:name="ref-wan2022ChronicLeadExposure"/>
+    <w:bookmarkEnd w:id="65"/>
+    <w:bookmarkStart w:id="67" w:name="ref-wan2022ChronicLeadExposure"/>
     <w:p>
       <w:pPr>
         <w:pStyle w:val="Bibliography"/>
@@ -5520,7 +5513,7 @@
       <w:r>
         <w:t xml:space="preserve"> </w:t>
       </w:r>
-      <w:hyperlink r:id="rId67">
+      <w:hyperlink r:id="rId66">
         <w:r>
           <w:rPr>
             <w:rStyle w:val="Hyperlink"/>
@@ -5532,8 +5525,8 @@
         <w:t xml:space="preserve">.</w:t>
       </w:r>
     </w:p>
-    <w:bookmarkEnd w:id="68"/>
-    <w:bookmarkStart w:id="70" w:name="ref-rosengren2025ExposureLeadCoronary"/>
+    <w:bookmarkEnd w:id="67"/>
+    <w:bookmarkStart w:id="69" w:name="ref-rosengren2025ExposureLeadCoronary"/>
     <w:p>
       <w:pPr>
         <w:pStyle w:val="Bibliography"/>
@@ -5595,7 +5588,7 @@
       <w:r>
         <w:t xml:space="preserve"> </w:t>
       </w:r>
-      <w:hyperlink r:id="rId69">
+      <w:hyperlink r:id="rId68">
         <w:r>
           <w:rPr>
             <w:rStyle w:val="Hyperlink"/>
@@ -5607,8 +5600,8 @@
         <w:t xml:space="preserve">.</w:t>
       </w:r>
     </w:p>
-    <w:bookmarkEnd w:id="70"/>
-    <w:bookmarkStart w:id="72" w:name="ref-lanphear2018LowlevelLeadExposure"/>
+    <w:bookmarkEnd w:id="69"/>
+    <w:bookmarkStart w:id="71" w:name="ref-lanphear2018LowlevelLeadExposure"/>
     <w:p>
       <w:pPr>
         <w:pStyle w:val="Bibliography"/>
@@ -5640,7 +5633,7 @@
       <w:r>
         <w:t xml:space="preserve"> </w:t>
       </w:r>
-      <w:hyperlink r:id="rId71">
+      <w:hyperlink r:id="rId70">
         <w:r>
           <w:rPr>
             <w:rStyle w:val="Hyperlink"/>
@@ -5652,8 +5645,8 @@
         <w:t xml:space="preserve">.</w:t>
       </w:r>
     </w:p>
-    <w:bookmarkEnd w:id="72"/>
-    <w:bookmarkStart w:id="74" w:name="ref-chang2006LowBloodLead"/>
+    <w:bookmarkEnd w:id="71"/>
+    <w:bookmarkStart w:id="73" w:name="ref-chang2006LowBloodLead"/>
     <w:p>
       <w:pPr>
         <w:pStyle w:val="Bibliography"/>
@@ -5673,7 +5666,7 @@
       <w:r>
         <w:t xml:space="preserve"> </w:t>
       </w:r>
-      <w:hyperlink r:id="rId73">
+      <w:hyperlink r:id="rId72">
         <w:r>
           <w:rPr>
             <w:rStyle w:val="Hyperlink"/>
@@ -5685,8 +5678,8 @@
         <w:t xml:space="preserve">.</w:t>
       </w:r>
     </w:p>
-    <w:bookmarkEnd w:id="74"/>
-    <w:bookmarkStart w:id="76" w:name="Xadfdab0209e4a364d9fdcffecfddb00700d2db9"/>
+    <w:bookmarkEnd w:id="73"/>
+    <w:bookmarkStart w:id="75" w:name="Xadfdab0209e4a364d9fdcffecfddb00700d2db9"/>
     <w:p>
       <w:pPr>
         <w:pStyle w:val="Bibliography"/>
@@ -5769,7 +5762,7 @@
       <w:r>
         <w:t xml:space="preserve"> </w:t>
       </w:r>
-      <w:hyperlink r:id="rId75">
+      <w:hyperlink r:id="rId74">
         <w:r>
           <w:rPr>
             <w:rStyle w:val="Hyperlink"/>
@@ -5781,8 +5774,8 @@
         <w:t xml:space="preserve">.</w:t>
       </w:r>
     </w:p>
-    <w:bookmarkEnd w:id="76"/>
-    <w:bookmarkStart w:id="78" w:name="ref-shaffer2025LeadExposureAntisocial"/>
+    <w:bookmarkEnd w:id="75"/>
+    <w:bookmarkStart w:id="77" w:name="ref-shaffer2025LeadExposureAntisocial"/>
     <w:p>
       <w:pPr>
         <w:pStyle w:val="Bibliography"/>
@@ -5814,7 +5807,7 @@
       <w:r>
         <w:t xml:space="preserve"> </w:t>
       </w:r>
-      <w:hyperlink r:id="rId77">
+      <w:hyperlink r:id="rId76">
         <w:r>
           <w:rPr>
             <w:rStyle w:val="Hyperlink"/>
@@ -5826,8 +5819,8 @@
         <w:t xml:space="preserve">.</w:t>
       </w:r>
     </w:p>
-    <w:bookmarkEnd w:id="78"/>
-    <w:bookmarkStart w:id="80" w:name="X06097e4c5e52362623b7f1c040457eb7d553acc"/>
+    <w:bookmarkEnd w:id="77"/>
+    <w:bookmarkStart w:id="79" w:name="X06097e4c5e52362623b7f1c040457eb7d553acc"/>
     <w:p>
       <w:pPr>
         <w:pStyle w:val="Bibliography"/>
@@ -5922,7 +5915,7 @@
       <w:r>
         <w:t xml:space="preserve"> </w:t>
       </w:r>
-      <w:hyperlink r:id="rId79">
+      <w:hyperlink r:id="rId78">
         <w:r>
           <w:rPr>
             <w:rStyle w:val="Hyperlink"/>
@@ -5934,8 +5927,8 @@
         <w:t xml:space="preserve">.</w:t>
       </w:r>
     </w:p>
-    <w:bookmarkEnd w:id="80"/>
-    <w:bookmarkStart w:id="82" w:name="ref-needleman1990LowLevelLeadExposure"/>
+    <w:bookmarkEnd w:id="79"/>
+    <w:bookmarkStart w:id="81" w:name="ref-needleman1990LowLevelLeadExposure"/>
     <w:p>
       <w:pPr>
         <w:pStyle w:val="Bibliography"/>
@@ -6006,7 +5999,7 @@
       <w:r>
         <w:t xml:space="preserve"> </w:t>
       </w:r>
-      <w:hyperlink r:id="rId81">
+      <w:hyperlink r:id="rId80">
         <w:r>
           <w:rPr>
             <w:rStyle w:val="Hyperlink"/>
@@ -6018,8 +6011,8 @@
         <w:t xml:space="preserve">.</w:t>
       </w:r>
     </w:p>
-    <w:bookmarkEnd w:id="82"/>
-    <w:bookmarkStart w:id="84" w:name="ref-bellinger1992LowLevelLeadExposure"/>
+    <w:bookmarkEnd w:id="81"/>
+    <w:bookmarkStart w:id="83" w:name="ref-bellinger1992LowLevelLeadExposure"/>
     <w:p>
       <w:pPr>
         <w:pStyle w:val="Bibliography"/>
@@ -6075,7 +6068,7 @@
       <w:r>
         <w:t xml:space="preserve"> </w:t>
       </w:r>
-      <w:hyperlink r:id="rId83">
+      <w:hyperlink r:id="rId82">
         <w:r>
           <w:rPr>
             <w:rStyle w:val="Hyperlink"/>
@@ -6087,8 +6080,8 @@
         <w:t xml:space="preserve">.</w:t>
       </w:r>
     </w:p>
-    <w:bookmarkEnd w:id="84"/>
-    <w:bookmarkStart w:id="86" w:name="X9a8bad0b78f43066cb333fdedcdcad5d7017900"/>
+    <w:bookmarkEnd w:id="83"/>
+    <w:bookmarkStart w:id="85" w:name="X9a8bad0b78f43066cb333fdedcdcad5d7017900"/>
     <w:p>
       <w:pPr>
         <w:pStyle w:val="Bibliography"/>
@@ -6144,7 +6137,7 @@
       <w:r>
         <w:t xml:space="preserve"> </w:t>
       </w:r>
-      <w:hyperlink r:id="rId85">
+      <w:hyperlink r:id="rId84">
         <w:r>
           <w:rPr>
             <w:rStyle w:val="Hyperlink"/>
@@ -6156,8 +6149,8 @@
         <w:t xml:space="preserve">.</w:t>
       </w:r>
     </w:p>
-    <w:bookmarkEnd w:id="86"/>
-    <w:bookmarkStart w:id="88" w:name="ref-larsen2023GlobalHealthBurden"/>
+    <w:bookmarkEnd w:id="85"/>
+    <w:bookmarkStart w:id="87" w:name="ref-larsen2023GlobalHealthBurden"/>
     <w:p>
       <w:pPr>
         <w:pStyle w:val="Bibliography"/>
@@ -6177,7 +6170,7 @@
       <w:r>
         <w:t xml:space="preserve"> </w:t>
       </w:r>
-      <w:hyperlink r:id="rId87">
+      <w:hyperlink r:id="rId86">
         <w:r>
           <w:rPr>
             <w:rStyle w:val="Hyperlink"/>
@@ -6189,14 +6182,33 @@
         <w:t xml:space="preserve">.</w:t>
       </w:r>
     </w:p>
+    <w:bookmarkEnd w:id="87"/>
+    <w:bookmarkStart w:id="88" w:name="Xccae642063400a60b450e4ce6d84827fa125294"/>
+    <w:p>
+      <w:pPr>
+        <w:pStyle w:val="Bibliography"/>
+      </w:pPr>
+      <w:r>
+        <w:t xml:space="preserve">[18]</w:t>
+      </w:r>
+      <w:r>
+        <w:t xml:space="preserve"> </w:t>
+      </w:r>
+      <w:r>
+        <w:t xml:space="preserve">	</w:t>
+      </w:r>
+      <w:r>
+        <w:t xml:space="preserve">European Human Biomonitoring Initiative. Lead. 2026 n.d.</w:t>
+      </w:r>
+    </w:p>
     <w:bookmarkEnd w:id="88"/>
-    <w:bookmarkStart w:id="89" w:name="Xccae642063400a60b450e4ce6d84827fa125294"/>
+    <w:bookmarkStart w:id="90" w:name="X5615fc1cb9c455a90da75660348bda09fd0f967"/>
     <w:p>
       <w:pPr>
         <w:pStyle w:val="Bibliography"/>
       </w:pPr>
       <w:r>
-        <w:t xml:space="preserve">[18]</w:t>
+        <w:t xml:space="preserve">[19]</w:t>
       </w:r>
       <w:r>
         <w:t xml:space="preserve"> </w:t>
@@ -6205,25 +6217,6 @@
         <w:t xml:space="preserve">	</w:t>
       </w:r>
       <w:r>
-        <w:t xml:space="preserve">European Human Biomonitoring Initiative. Lead. 2026 n.d.</w:t>
-      </w:r>
-    </w:p>
-    <w:bookmarkEnd w:id="89"/>
-    <w:bookmarkStart w:id="91" w:name="X5615fc1cb9c455a90da75660348bda09fd0f967"/>
-    <w:p>
-      <w:pPr>
-        <w:pStyle w:val="Bibliography"/>
-      </w:pPr>
-      <w:r>
-        <w:t xml:space="preserve">[19]</w:t>
-      </w:r>
-      <w:r>
-        <w:t xml:space="preserve"> </w:t>
-      </w:r>
-      <w:r>
-        <w:t xml:space="preserve">	</w:t>
-      </w:r>
-      <w:r>
         <w:t xml:space="preserve">EFSA Panel on Contaminants in the Food Chain (CONTAM). Scientific</w:t>
       </w:r>
       <w:r>
@@ -6262,7 +6255,7 @@
       <w:r>
         <w:t xml:space="preserve"> </w:t>
       </w:r>
-      <w:hyperlink r:id="rId90">
+      <w:hyperlink r:id="rId89">
         <w:r>
           <w:rPr>
             <w:rStyle w:val="Hyperlink"/>
@@ -6274,8 +6267,8 @@
         <w:t xml:space="preserve">.</w:t>
       </w:r>
     </w:p>
-    <w:bookmarkEnd w:id="91"/>
-    <w:bookmarkStart w:id="93" w:name="ref-schwartz1994LowLevelLeadExposure"/>
+    <w:bookmarkEnd w:id="90"/>
+    <w:bookmarkStart w:id="92" w:name="ref-schwartz1994LowLevelLeadExposure"/>
     <w:p>
       <w:pPr>
         <w:pStyle w:val="Bibliography"/>
@@ -6363,7 +6356,7 @@
       <w:r>
         <w:t xml:space="preserve"> </w:t>
       </w:r>
-      <w:hyperlink r:id="rId92">
+      <w:hyperlink r:id="rId91">
         <w:r>
           <w:rPr>
             <w:rStyle w:val="Hyperlink"/>
@@ -6375,8 +6368,8 @@
         <w:t xml:space="preserve">.</w:t>
       </w:r>
     </w:p>
-    <w:bookmarkEnd w:id="93"/>
-    <w:bookmarkStart w:id="95" w:name="Xa2086c2c3f6a9ac4b676f66b1cdbbd5efdb3b23"/>
+    <w:bookmarkEnd w:id="92"/>
+    <w:bookmarkStart w:id="94" w:name="Xa2086c2c3f6a9ac4b676f66b1cdbbd5efdb3b23"/>
     <w:p>
       <w:pPr>
         <w:pStyle w:val="Bibliography"/>
@@ -6452,7 +6445,7 @@
       <w:r>
         <w:t xml:space="preserve"> </w:t>
       </w:r>
-      <w:hyperlink r:id="rId94">
+      <w:hyperlink r:id="rId93">
         <w:r>
           <w:rPr>
             <w:rStyle w:val="Hyperlink"/>
@@ -6464,8 +6457,8 @@
         <w:t xml:space="preserve">.</w:t>
       </w:r>
     </w:p>
-    <w:bookmarkEnd w:id="95"/>
-    <w:bookmarkStart w:id="97" w:name="X93c1fc7f8e1220d02cbab90c02ac44248f2b23e"/>
+    <w:bookmarkEnd w:id="94"/>
+    <w:bookmarkStart w:id="96" w:name="X93c1fc7f8e1220d02cbab90c02ac44248f2b23e"/>
     <w:p>
       <w:pPr>
         <w:pStyle w:val="Bibliography"/>
@@ -6485,7 +6478,7 @@
       <w:r>
         <w:t xml:space="preserve"> </w:t>
       </w:r>
-      <w:hyperlink r:id="rId96">
+      <w:hyperlink r:id="rId95">
         <w:r>
           <w:rPr>
             <w:rStyle w:val="Hyperlink"/>
@@ -6497,8 +6490,8 @@
         <w:t xml:space="preserve">.</w:t>
       </w:r>
     </w:p>
-    <w:bookmarkEnd w:id="97"/>
-    <w:bookmarkStart w:id="99" w:name="ref-figueroa2024LossCognitiveFunction"/>
+    <w:bookmarkEnd w:id="96"/>
+    <w:bookmarkStart w:id="98" w:name="ref-figueroa2024LossCognitiveFunction"/>
     <w:p>
       <w:pPr>
         <w:pStyle w:val="Bibliography"/>
@@ -6530,7 +6523,7 @@
       <w:r>
         <w:t xml:space="preserve"> </w:t>
       </w:r>
-      <w:hyperlink r:id="rId98">
+      <w:hyperlink r:id="rId97">
         <w:r>
           <w:rPr>
             <w:rStyle w:val="Hyperlink"/>
@@ -6542,8 +6535,8 @@
         <w:t xml:space="preserve">.</w:t>
       </w:r>
     </w:p>
-    <w:bookmarkEnd w:id="99"/>
-    <w:bookmarkStart w:id="101" w:name="ref-mcfarland2022HalfUSPopulation"/>
+    <w:bookmarkEnd w:id="98"/>
+    <w:bookmarkStart w:id="100" w:name="ref-mcfarland2022HalfUSPopulation"/>
     <w:p>
       <w:pPr>
         <w:pStyle w:val="Bibliography"/>
@@ -6575,7 +6568,7 @@
       <w:r>
         <w:t xml:space="preserve"> </w:t>
       </w:r>
-      <w:hyperlink r:id="rId100">
+      <w:hyperlink r:id="rId99">
         <w:r>
           <w:rPr>
             <w:rStyle w:val="Hyperlink"/>
@@ -6587,8 +6580,8 @@
         <w:t xml:space="preserve">.</w:t>
       </w:r>
     </w:p>
-    <w:bookmarkEnd w:id="101"/>
-    <w:bookmarkStart w:id="103" w:name="ref-crump2013StatisticalReevaluationData"/>
+    <w:bookmarkEnd w:id="100"/>
+    <w:bookmarkStart w:id="102" w:name="ref-crump2013StatisticalReevaluationData"/>
     <w:p>
       <w:pPr>
         <w:pStyle w:val="Bibliography"/>
@@ -6620,7 +6613,7 @@
       <w:r>
         <w:t xml:space="preserve"> </w:t>
       </w:r>
-      <w:hyperlink r:id="rId102">
+      <w:hyperlink r:id="rId101">
         <w:r>
           <w:rPr>
             <w:rStyle w:val="Hyperlink"/>
@@ -6632,8 +6625,8 @@
         <w:t xml:space="preserve">.</w:t>
       </w:r>
     </w:p>
-    <w:bookmarkEnd w:id="103"/>
-    <w:bookmarkStart w:id="105" w:name="X33f03e29791f20cdbbbbf0729c723b16e55ed16"/>
+    <w:bookmarkEnd w:id="102"/>
+    <w:bookmarkStart w:id="104" w:name="X33f03e29791f20cdbbbbf0729c723b16e55ed16"/>
     <w:p>
       <w:pPr>
         <w:pStyle w:val="Bibliography"/>
@@ -6701,7 +6694,7 @@
       <w:r>
         <w:t xml:space="preserve"> </w:t>
       </w:r>
-      <w:hyperlink r:id="rId104">
+      <w:hyperlink r:id="rId103">
         <w:r>
           <w:rPr>
             <w:rStyle w:val="Hyperlink"/>
@@ -6713,8 +6706,8 @@
         <w:t xml:space="preserve">.</w:t>
       </w:r>
     </w:p>
-    <w:bookmarkEnd w:id="105"/>
-    <w:bookmarkStart w:id="107" w:name="X035620408d1fb22c7ed381e74f0468c30df4612"/>
+    <w:bookmarkEnd w:id="104"/>
+    <w:bookmarkStart w:id="106" w:name="X035620408d1fb22c7ed381e74f0468c30df4612"/>
     <w:p>
       <w:pPr>
         <w:pStyle w:val="Bibliography"/>
@@ -6761,7 +6754,7 @@
       <w:r>
         <w:t xml:space="preserve"> </w:t>
       </w:r>
-      <w:hyperlink r:id="rId106">
+      <w:hyperlink r:id="rId105">
         <w:r>
           <w:rPr>
             <w:rStyle w:val="Hyperlink"/>
@@ -6773,8 +6766,8 @@
         <w:t xml:space="preserve">.</w:t>
       </w:r>
     </w:p>
-    <w:bookmarkEnd w:id="107"/>
-    <w:bookmarkStart w:id="109" w:name="X837f91f784566061977da85c17a5755a81dedde"/>
+    <w:bookmarkEnd w:id="106"/>
+    <w:bookmarkStart w:id="108" w:name="X837f91f784566061977da85c17a5755a81dedde"/>
     <w:p>
       <w:pPr>
         <w:pStyle w:val="Bibliography"/>
@@ -6794,7 +6787,7 @@
       <w:r>
         <w:t xml:space="preserve"> </w:t>
       </w:r>
-      <w:hyperlink r:id="rId108">
+      <w:hyperlink r:id="rId107">
         <w:r>
           <w:rPr>
             <w:rStyle w:val="Hyperlink"/>
@@ -6806,8 +6799,8 @@
         <w:t xml:space="preserve">.</w:t>
       </w:r>
     </w:p>
-    <w:bookmarkEnd w:id="109"/>
-    <w:bookmarkStart w:id="111" w:name="ref-page2021PRISMA2020Statement"/>
+    <w:bookmarkEnd w:id="108"/>
+    <w:bookmarkStart w:id="110" w:name="ref-page2021PRISMA2020Statement"/>
     <w:p>
       <w:pPr>
         <w:pStyle w:val="Bibliography"/>
@@ -6839,7 +6832,7 @@
       <w:r>
         <w:t xml:space="preserve"> </w:t>
       </w:r>
-      <w:hyperlink r:id="rId110">
+      <w:hyperlink r:id="rId109">
         <w:r>
           <w:rPr>
             <w:rStyle w:val="Hyperlink"/>
@@ -6851,8 +6844,8 @@
         <w:t xml:space="preserve">.</w:t>
       </w:r>
     </w:p>
-    <w:bookmarkEnd w:id="111"/>
-    <w:bookmarkStart w:id="113" w:name="X5cae6442bbe0e1f5d8df6cd5008aab2dbfb65a6"/>
+    <w:bookmarkEnd w:id="110"/>
+    <w:bookmarkStart w:id="112" w:name="X5cae6442bbe0e1f5d8df6cd5008aab2dbfb65a6"/>
     <w:p>
       <w:pPr>
         <w:pStyle w:val="Bibliography"/>
@@ -6881,7 +6874,7 @@
       <w:r>
         <w:t xml:space="preserve"> </w:t>
       </w:r>
-      <w:hyperlink r:id="rId112">
+      <w:hyperlink r:id="rId111">
         <w:r>
           <w:rPr>
             <w:rStyle w:val="Hyperlink"/>
@@ -6893,14 +6886,81 @@
         <w:t xml:space="preserve">.</w:t>
       </w:r>
     </w:p>
+    <w:bookmarkEnd w:id="112"/>
+    <w:bookmarkStart w:id="113" w:name="Xf5486a80753c915bf34b5d8f3ad5e46aac479a7"/>
+    <w:p>
+      <w:pPr>
+        <w:pStyle w:val="Bibliography"/>
+      </w:pPr>
+      <w:r>
+        <w:t xml:space="preserve">[31]</w:t>
+      </w:r>
+      <w:r>
+        <w:t xml:space="preserve"> </w:t>
+      </w:r>
+      <w:r>
+        <w:t xml:space="preserve">	</w:t>
+      </w:r>
+      <w:r>
+        <w:t xml:space="preserve">NTP OHAT. Handbook for</w:t>
+      </w:r>
+      <w:r>
+        <w:t xml:space="preserve"> </w:t>
+      </w:r>
+      <w:r>
+        <w:t xml:space="preserve">Conducting</w:t>
+      </w:r>
+      <w:r>
+        <w:t xml:space="preserve"> </w:t>
+      </w:r>
+      <w:r>
+        <w:t xml:space="preserve">a</w:t>
+      </w:r>
+      <w:r>
+        <w:t xml:space="preserve"> </w:t>
+      </w:r>
+      <w:r>
+        <w:t xml:space="preserve">Literature-Based Health Assessment Using OHAT Approach</w:t>
+      </w:r>
+      <w:r>
+        <w:t xml:space="preserve"> </w:t>
+      </w:r>
+      <w:r>
+        <w:t xml:space="preserve">for</w:t>
+      </w:r>
+      <w:r>
+        <w:t xml:space="preserve"> </w:t>
+      </w:r>
+      <w:r>
+        <w:t xml:space="preserve">Systematic Review</w:t>
+      </w:r>
+      <w:r>
+        <w:t xml:space="preserve"> </w:t>
+      </w:r>
+      <w:r>
+        <w:t xml:space="preserve">and</w:t>
+      </w:r>
+      <w:r>
+        <w:t xml:space="preserve"> </w:t>
+      </w:r>
+      <w:r>
+        <w:t xml:space="preserve">Evidence Integration</w:t>
+      </w:r>
+      <w:r>
+        <w:t xml:space="preserve"> </w:t>
+      </w:r>
+      <w:r>
+        <w:t xml:space="preserve">2019.</w:t>
+      </w:r>
+    </w:p>
     <w:bookmarkEnd w:id="113"/>
-    <w:bookmarkStart w:id="114" w:name="Xf5486a80753c915bf34b5d8f3ad5e46aac479a7"/>
+    <w:bookmarkStart w:id="115" w:name="ref-plate2024DevelopmentToolRapid"/>
     <w:p>
       <w:pPr>
         <w:pStyle w:val="Bibliography"/>
       </w:pPr>
       <w:r>
-        <w:t xml:space="preserve">[31]</w:t>
+        <w:t xml:space="preserve">[32]</w:t>
       </w:r>
       <w:r>
         <w:t xml:space="preserve"> </w:t>
@@ -6909,79 +6969,12 @@
         <w:t xml:space="preserve">	</w:t>
       </w:r>
       <w:r>
-        <w:t xml:space="preserve">NTP OHAT. Handbook for</w:t>
-      </w:r>
-      <w:r>
-        <w:t xml:space="preserve"> </w:t>
-      </w:r>
-      <w:r>
-        <w:t xml:space="preserve">Conducting</w:t>
-      </w:r>
-      <w:r>
-        <w:t xml:space="preserve"> </w:t>
-      </w:r>
-      <w:r>
-        <w:t xml:space="preserve">a</w:t>
-      </w:r>
-      <w:r>
-        <w:t xml:space="preserve"> </w:t>
-      </w:r>
-      <w:r>
-        <w:t xml:space="preserve">Literature-Based Health Assessment Using OHAT Approach</w:t>
-      </w:r>
-      <w:r>
-        <w:t xml:space="preserve"> </w:t>
-      </w:r>
-      <w:r>
-        <w:t xml:space="preserve">for</w:t>
-      </w:r>
-      <w:r>
-        <w:t xml:space="preserve"> </w:t>
-      </w:r>
-      <w:r>
-        <w:t xml:space="preserve">Systematic Review</w:t>
-      </w:r>
-      <w:r>
-        <w:t xml:space="preserve"> </w:t>
-      </w:r>
-      <w:r>
-        <w:t xml:space="preserve">and</w:t>
-      </w:r>
-      <w:r>
-        <w:t xml:space="preserve"> </w:t>
-      </w:r>
-      <w:r>
-        <w:t xml:space="preserve">Evidence Integration</w:t>
-      </w:r>
-      <w:r>
-        <w:t xml:space="preserve"> </w:t>
-      </w:r>
-      <w:r>
-        <w:t xml:space="preserve">2019.</w:t>
-      </w:r>
-    </w:p>
-    <w:bookmarkEnd w:id="114"/>
-    <w:bookmarkStart w:id="116" w:name="ref-plate2024DevelopmentToolRapid"/>
-    <w:p>
-      <w:pPr>
-        <w:pStyle w:val="Bibliography"/>
-      </w:pPr>
-      <w:r>
-        <w:t xml:space="preserve">[32]</w:t>
-      </w:r>
-      <w:r>
-        <w:t xml:space="preserve"> </w:t>
-      </w:r>
-      <w:r>
-        <w:t xml:space="preserve">	</w:t>
-      </w:r>
-      <w:r>
         <w:t xml:space="preserve">Plate K, Knüppel S, Hornbacher A, Greiner M, Müller-Graf C. Development of a tool for rapid assessment of the evidence of human observational epidemiological studies with focus on risk of bias in the context of public health and risk assessment. EFS3 2024;21.</w:t>
       </w:r>
       <w:r>
         <w:t xml:space="preserve"> </w:t>
       </w:r>
-      <w:hyperlink r:id="rId115">
+      <w:hyperlink r:id="rId114">
         <w:r>
           <w:rPr>
             <w:rStyle w:val="Hyperlink"/>
@@ -6993,8 +6986,8 @@
         <w:t xml:space="preserve">.</w:t>
       </w:r>
     </w:p>
-    <w:bookmarkEnd w:id="116"/>
-    <w:bookmarkStart w:id="118" w:name="ref-halabicky2023LowLevelLead"/>
+    <w:bookmarkEnd w:id="115"/>
+    <w:bookmarkStart w:id="117" w:name="ref-halabicky2023LowLevelLead"/>
     <w:p>
       <w:pPr>
         <w:pStyle w:val="Bibliography"/>
@@ -7026,7 +7019,7 @@
       <w:r>
         <w:t xml:space="preserve"> </w:t>
       </w:r>
-      <w:hyperlink r:id="rId117">
+      <w:hyperlink r:id="rId116">
         <w:r>
           <w:rPr>
             <w:rStyle w:val="Hyperlink"/>
@@ -7038,8 +7031,8 @@
         <w:t xml:space="preserve">.</w:t>
       </w:r>
     </w:p>
-    <w:bookmarkEnd w:id="118"/>
-    <w:bookmarkStart w:id="120" w:name="ref-chen2005IQBloodLead"/>
+    <w:bookmarkEnd w:id="117"/>
+    <w:bookmarkStart w:id="119" w:name="ref-chen2005IQBloodLead"/>
     <w:p>
       <w:pPr>
         <w:pStyle w:val="Bibliography"/>
@@ -7170,7 +7163,7 @@
       <w:r>
         <w:t xml:space="preserve"> </w:t>
       </w:r>
-      <w:hyperlink r:id="rId119">
+      <w:hyperlink r:id="rId118">
         <w:r>
           <w:rPr>
             <w:rStyle w:val="Hyperlink"/>
@@ -7182,8 +7175,8 @@
         <w:t xml:space="preserve">.</w:t>
       </w:r>
     </w:p>
-    <w:bookmarkEnd w:id="120"/>
-    <w:bookmarkStart w:id="122" w:name="Xcf7993c3f58afaabaf73be6238c67f4f63053d9"/>
+    <w:bookmarkEnd w:id="119"/>
+    <w:bookmarkStart w:id="121" w:name="Xcf7993c3f58afaabaf73be6238c67f4f63053d9"/>
     <w:p>
       <w:pPr>
         <w:pStyle w:val="Bibliography"/>
@@ -7236,7 +7229,7 @@
       <w:r>
         <w:t xml:space="preserve"> </w:t>
       </w:r>
-      <w:hyperlink r:id="rId121">
+      <w:hyperlink r:id="rId120">
         <w:r>
           <w:rPr>
             <w:rStyle w:val="Hyperlink"/>
@@ -7248,63 +7241,63 @@
         <w:t xml:space="preserve">.</w:t>
       </w:r>
     </w:p>
+    <w:bookmarkEnd w:id="121"/>
+    <w:bookmarkStart w:id="122" w:name="X4bd034c52731e178b4de125c2c778bdc533803c"/>
+    <w:p>
+      <w:pPr>
+        <w:pStyle w:val="Bibliography"/>
+      </w:pPr>
+      <w:r>
+        <w:t xml:space="preserve">[36]</w:t>
+      </w:r>
+      <w:r>
+        <w:t xml:space="preserve"> </w:t>
+      </w:r>
+      <w:r>
+        <w:t xml:space="preserve">	</w:t>
+      </w:r>
+      <w:r>
+        <w:t xml:space="preserve">R Core Team. R:</w:t>
+      </w:r>
+      <w:r>
+        <w:t xml:space="preserve"> </w:t>
+      </w:r>
+      <w:r>
+        <w:t xml:space="preserve">A Language</w:t>
+      </w:r>
+      <w:r>
+        <w:t xml:space="preserve"> </w:t>
+      </w:r>
+      <w:r>
+        <w:t xml:space="preserve">and</w:t>
+      </w:r>
+      <w:r>
+        <w:t xml:space="preserve"> </w:t>
+      </w:r>
+      <w:r>
+        <w:t xml:space="preserve">Environment</w:t>
+      </w:r>
+      <w:r>
+        <w:t xml:space="preserve"> </w:t>
+      </w:r>
+      <w:r>
+        <w:t xml:space="preserve">for</w:t>
+      </w:r>
+      <w:r>
+        <w:t xml:space="preserve"> </w:t>
+      </w:r>
+      <w:r>
+        <w:t xml:space="preserve">Statistical Computing</w:t>
+      </w:r>
+      <w:r>
+        <w:t xml:space="preserve"> </w:t>
+      </w:r>
+      <w:r>
+        <w:t xml:space="preserve">2024.</w:t>
+      </w:r>
+    </w:p>
     <w:bookmarkEnd w:id="122"/>
-    <w:bookmarkStart w:id="123" w:name="X4bd034c52731e178b4de125c2c778bdc533803c"/>
-    <w:p>
-      <w:pPr>
-        <w:pStyle w:val="Bibliography"/>
-      </w:pPr>
-      <w:r>
-        <w:t xml:space="preserve">[36]</w:t>
-      </w:r>
-      <w:r>
-        <w:t xml:space="preserve"> </w:t>
-      </w:r>
-      <w:r>
-        <w:t xml:space="preserve">	</w:t>
-      </w:r>
-      <w:r>
-        <w:t xml:space="preserve">R Core Team. R:</w:t>
-      </w:r>
-      <w:r>
-        <w:t xml:space="preserve"> </w:t>
-      </w:r>
-      <w:r>
-        <w:t xml:space="preserve">A Language</w:t>
-      </w:r>
-      <w:r>
-        <w:t xml:space="preserve"> </w:t>
-      </w:r>
-      <w:r>
-        <w:t xml:space="preserve">and</w:t>
-      </w:r>
-      <w:r>
-        <w:t xml:space="preserve"> </w:t>
-      </w:r>
-      <w:r>
-        <w:t xml:space="preserve">Environment</w:t>
-      </w:r>
-      <w:r>
-        <w:t xml:space="preserve"> </w:t>
-      </w:r>
-      <w:r>
-        <w:t xml:space="preserve">for</w:t>
-      </w:r>
-      <w:r>
-        <w:t xml:space="preserve"> </w:t>
-      </w:r>
-      <w:r>
-        <w:t xml:space="preserve">Statistical Computing</w:t>
-      </w:r>
-      <w:r>
-        <w:t xml:space="preserve"> </w:t>
-      </w:r>
-      <w:r>
-        <w:t xml:space="preserve">2024.</w:t>
-      </w:r>
-    </w:p>
-    <w:bookmarkEnd w:id="123"/>
-    <w:bookmarkStart w:id="125" w:name="ref-burkner2017BrmsPackageBayesian"/>
+    <w:bookmarkStart w:id="124" w:name="ref-burkner2017BrmsPackageBayesian"/>
     <w:p>
       <w:pPr>
         <w:pStyle w:val="Bibliography"/>
@@ -7387,7 +7380,7 @@
       <w:r>
         <w:t xml:space="preserve"> </w:t>
       </w:r>
-      <w:hyperlink r:id="rId124">
+      <w:hyperlink r:id="rId123">
         <w:r>
           <w:rPr>
             <w:rStyle w:val="Hyperlink"/>
@@ -7399,8 +7392,8 @@
         <w:t xml:space="preserve">.</w:t>
       </w:r>
     </w:p>
-    <w:bookmarkEnd w:id="125"/>
-    <w:bookmarkStart w:id="127" w:name="ref-hoffman2011NoUTurnSamplerAdaptively"/>
+    <w:bookmarkEnd w:id="124"/>
+    <w:bookmarkStart w:id="126" w:name="ref-hoffman2011NoUTurnSamplerAdaptively"/>
     <w:p>
       <w:pPr>
         <w:pStyle w:val="Bibliography"/>
@@ -7453,7 +7446,7 @@
       <w:r>
         <w:t xml:space="preserve"> </w:t>
       </w:r>
-      <w:hyperlink r:id="rId126">
+      <w:hyperlink r:id="rId125">
         <w:r>
           <w:rPr>
             <w:rStyle w:val="Hyperlink"/>
@@ -7465,14 +7458,57 @@
         <w:t xml:space="preserve">.</w:t>
       </w:r>
     </w:p>
+    <w:bookmarkEnd w:id="126"/>
+    <w:bookmarkStart w:id="127" w:name="X21bf392f662dc1b38e9a7fa4b314fc7a471696b"/>
+    <w:p>
+      <w:pPr>
+        <w:pStyle w:val="Bibliography"/>
+      </w:pPr>
+      <w:r>
+        <w:t xml:space="preserve">[39]</w:t>
+      </w:r>
+      <w:r>
+        <w:t xml:space="preserve"> </w:t>
+      </w:r>
+      <w:r>
+        <w:t xml:space="preserve">	</w:t>
+      </w:r>
+      <w:r>
+        <w:t xml:space="preserve">Gabry J, Mahr T. Bayesplot:</w:t>
+      </w:r>
+      <w:r>
+        <w:t xml:space="preserve"> </w:t>
+      </w:r>
+      <w:r>
+        <w:t xml:space="preserve">Plotting</w:t>
+      </w:r>
+      <w:r>
+        <w:t xml:space="preserve"> </w:t>
+      </w:r>
+      <w:r>
+        <w:t xml:space="preserve">for</w:t>
+      </w:r>
+      <w:r>
+        <w:t xml:space="preserve"> </w:t>
+      </w:r>
+      <w:r>
+        <w:t xml:space="preserve">Bayesian Models</w:t>
+      </w:r>
+      <w:r>
+        <w:t xml:space="preserve"> </w:t>
+      </w:r>
+      <w:r>
+        <w:t xml:space="preserve">2025.</w:t>
+      </w:r>
+    </w:p>
     <w:bookmarkEnd w:id="127"/>
-    <w:bookmarkStart w:id="128" w:name="X21bf392f662dc1b38e9a7fa4b314fc7a471696b"/>
+    <w:bookmarkStart w:id="129" w:name="X111bb06244f8f2a1a6d0d2f1f41c24b71f248e6"/>
     <w:p>
       <w:pPr>
         <w:pStyle w:val="Bibliography"/>
       </w:pPr>
       <w:r>
-        <w:t xml:space="preserve">[39]</w:t>
+        <w:t xml:space="preserve">[40]</w:t>
       </w:r>
       <w:r>
         <w:t xml:space="preserve"> </w:t>
@@ -7481,49 +7517,6 @@
         <w:t xml:space="preserve">	</w:t>
       </w:r>
       <w:r>
-        <w:t xml:space="preserve">Gabry J, Mahr T. Bayesplot:</w:t>
-      </w:r>
-      <w:r>
-        <w:t xml:space="preserve"> </w:t>
-      </w:r>
-      <w:r>
-        <w:t xml:space="preserve">Plotting</w:t>
-      </w:r>
-      <w:r>
-        <w:t xml:space="preserve"> </w:t>
-      </w:r>
-      <w:r>
-        <w:t xml:space="preserve">for</w:t>
-      </w:r>
-      <w:r>
-        <w:t xml:space="preserve"> </w:t>
-      </w:r>
-      <w:r>
-        <w:t xml:space="preserve">Bayesian Models</w:t>
-      </w:r>
-      <w:r>
-        <w:t xml:space="preserve"> </w:t>
-      </w:r>
-      <w:r>
-        <w:t xml:space="preserve">2025.</w:t>
-      </w:r>
-    </w:p>
-    <w:bookmarkEnd w:id="128"/>
-    <w:bookmarkStart w:id="130" w:name="X111bb06244f8f2a1a6d0d2f1f41c24b71f248e6"/>
-    <w:p>
-      <w:pPr>
-        <w:pStyle w:val="Bibliography"/>
-      </w:pPr>
-      <w:r>
-        <w:t xml:space="preserve">[40]</w:t>
-      </w:r>
-      <w:r>
-        <w:t xml:space="preserve"> </w:t>
-      </w:r>
-      <w:r>
-        <w:t xml:space="preserve">	</w:t>
-      </w:r>
-      <w:r>
         <w:t xml:space="preserve">Wolfgang Viechtbauer. Conducting meta-analyses in</w:t>
       </w:r>
       <w:r>
@@ -7550,7 +7543,7 @@
       <w:r>
         <w:t xml:space="preserve"> </w:t>
       </w:r>
-      <w:hyperlink r:id="rId129">
+      <w:hyperlink r:id="rId128">
         <w:r>
           <w:rPr>
             <w:rStyle w:val="Hyperlink"/>
@@ -7562,8 +7555,8 @@
         <w:t xml:space="preserve">.</w:t>
       </w:r>
     </w:p>
-    <w:bookmarkEnd w:id="130"/>
-    <w:bookmarkStart w:id="132" w:name="ref-earl2016LowlevelEnvironmentalLead"/>
+    <w:bookmarkEnd w:id="129"/>
+    <w:bookmarkStart w:id="131" w:name="ref-earl2016LowlevelEnvironmentalLead"/>
     <w:p>
       <w:pPr>
         <w:pStyle w:val="Bibliography"/>
@@ -7583,7 +7576,7 @@
       <w:r>
         <w:t xml:space="preserve"> </w:t>
       </w:r>
-      <w:hyperlink r:id="rId131">
+      <w:hyperlink r:id="rId130">
         <w:r>
           <w:rPr>
             <w:rStyle w:val="Hyperlink"/>
@@ -7595,8 +7588,8 @@
         <w:t xml:space="preserve">.</w:t>
       </w:r>
     </w:p>
-    <w:bookmarkEnd w:id="132"/>
-    <w:bookmarkStart w:id="134" w:name="ref-bauer2020AssociationsMetalMixture"/>
+    <w:bookmarkEnd w:id="131"/>
+    <w:bookmarkStart w:id="133" w:name="ref-bauer2020AssociationsMetalMixture"/>
     <w:p>
       <w:pPr>
         <w:pStyle w:val="Bibliography"/>
@@ -7682,7 +7675,7 @@
       <w:r>
         <w:t xml:space="preserve"> </w:t>
       </w:r>
-      <w:hyperlink r:id="rId133">
+      <w:hyperlink r:id="rId132">
         <w:r>
           <w:rPr>
             <w:rStyle w:val="Hyperlink"/>
@@ -7694,8 +7687,8 @@
         <w:t xml:space="preserve">.</w:t>
       </w:r>
     </w:p>
-    <w:bookmarkEnd w:id="134"/>
-    <w:bookmarkStart w:id="136" w:name="ref-hong2015EnvironmentalLeadExposure"/>
+    <w:bookmarkEnd w:id="133"/>
+    <w:bookmarkStart w:id="135" w:name="ref-hong2015EnvironmentalLeadExposure"/>
     <w:p>
       <w:pPr>
         <w:pStyle w:val="Bibliography"/>
@@ -7766,7 +7759,7 @@
       <w:r>
         <w:t xml:space="preserve"> </w:t>
       </w:r>
-      <w:hyperlink r:id="rId135">
+      <w:hyperlink r:id="rId134">
         <w:r>
           <w:rPr>
             <w:rStyle w:val="Hyperlink"/>
@@ -7778,8 +7771,8 @@
         <w:t xml:space="preserve">.</w:t>
       </w:r>
     </w:p>
-    <w:bookmarkEnd w:id="136"/>
-    <w:bookmarkStart w:id="138" w:name="Xb0421be95a139ca5af39ce6040517bf1be79427"/>
+    <w:bookmarkEnd w:id="135"/>
+    <w:bookmarkStart w:id="137" w:name="Xb0421be95a139ca5af39ce6040517bf1be79427"/>
     <w:p>
       <w:pPr>
         <w:pStyle w:val="Bibliography"/>
@@ -7811,7 +7804,7 @@
       <w:r>
         <w:t xml:space="preserve"> </w:t>
       </w:r>
-      <w:hyperlink r:id="rId137">
+      <w:hyperlink r:id="rId136">
         <w:r>
           <w:rPr>
             <w:rStyle w:val="Hyperlink"/>
@@ -7823,8 +7816,8 @@
         <w:t xml:space="preserve">.</w:t>
       </w:r>
     </w:p>
-    <w:bookmarkEnd w:id="138"/>
-    <w:bookmarkStart w:id="140" w:name="X716dc31ca13dac7355fea3a0f7dea95779ecabb"/>
+    <w:bookmarkEnd w:id="137"/>
+    <w:bookmarkStart w:id="139" w:name="X716dc31ca13dac7355fea3a0f7dea95779ecabb"/>
     <w:p>
       <w:pPr>
         <w:pStyle w:val="Bibliography"/>
@@ -7862,7 +7855,7 @@
       <w:r>
         <w:t xml:space="preserve"> </w:t>
       </w:r>
-      <w:hyperlink r:id="rId139">
+      <w:hyperlink r:id="rId138">
         <w:r>
           <w:rPr>
             <w:rStyle w:val="Hyperlink"/>
@@ -7874,8 +7867,8 @@
         <w:t xml:space="preserve">.</w:t>
       </w:r>
     </w:p>
-    <w:bookmarkEnd w:id="140"/>
-    <w:bookmarkStart w:id="142" w:name="ref-roy2013EffectModificationTransferrin"/>
+    <w:bookmarkEnd w:id="139"/>
+    <w:bookmarkStart w:id="141" w:name="ref-roy2013EffectModificationTransferrin"/>
     <w:p>
       <w:pPr>
         <w:pStyle w:val="Bibliography"/>
@@ -7916,7 +7909,7 @@
       <w:r>
         <w:t xml:space="preserve"> </w:t>
       </w:r>
-      <w:hyperlink r:id="rId141">
+      <w:hyperlink r:id="rId140">
         <w:r>
           <w:rPr>
             <w:rStyle w:val="Hyperlink"/>
@@ -7928,8 +7921,8 @@
         <w:t xml:space="preserve">.</w:t>
       </w:r>
     </w:p>
-    <w:bookmarkEnd w:id="142"/>
-    <w:bookmarkStart w:id="144" w:name="ref-dantzer2020ComparisonBloodToenails"/>
+    <w:bookmarkEnd w:id="141"/>
+    <w:bookmarkStart w:id="143" w:name="ref-dantzer2020ComparisonBloodToenails"/>
     <w:p>
       <w:pPr>
         <w:pStyle w:val="Bibliography"/>
@@ -7949,7 +7942,7 @@
       <w:r>
         <w:t xml:space="preserve"> </w:t>
       </w:r>
-      <w:hyperlink r:id="rId143">
+      <w:hyperlink r:id="rId142">
         <w:r>
           <w:rPr>
             <w:rStyle w:val="Hyperlink"/>
@@ -7961,8 +7954,8 @@
         <w:t xml:space="preserve">.</w:t>
       </w:r>
     </w:p>
-    <w:bookmarkEnd w:id="144"/>
-    <w:bookmarkStart w:id="146" w:name="X6bc65313eadd1b86059eb4ba10c8cf9d91be17d"/>
+    <w:bookmarkEnd w:id="143"/>
+    <w:bookmarkStart w:id="145" w:name="X6bc65313eadd1b86059eb4ba10c8cf9d91be17d"/>
     <w:p>
       <w:pPr>
         <w:pStyle w:val="Bibliography"/>
@@ -8006,7 +7999,7 @@
       <w:r>
         <w:t xml:space="preserve"> </w:t>
       </w:r>
-      <w:hyperlink r:id="rId145">
+      <w:hyperlink r:id="rId144">
         <w:r>
           <w:rPr>
             <w:rStyle w:val="Hyperlink"/>
@@ -8018,8 +8011,8 @@
         <w:t xml:space="preserve">.</w:t>
       </w:r>
     </w:p>
-    <w:bookmarkEnd w:id="146"/>
-    <w:bookmarkStart w:id="148" w:name="ref-lee2021PrenatalPostnatalExposures"/>
+    <w:bookmarkEnd w:id="145"/>
+    <w:bookmarkStart w:id="147" w:name="ref-lee2021PrenatalPostnatalExposures"/>
     <w:p>
       <w:pPr>
         <w:pStyle w:val="Bibliography"/>
@@ -8072,7 +8065,7 @@
       <w:r>
         <w:t xml:space="preserve"> </w:t>
       </w:r>
-      <w:hyperlink r:id="rId147">
+      <w:hyperlink r:id="rId146">
         <w:r>
           <w:rPr>
             <w:rStyle w:val="Hyperlink"/>
@@ -8084,14 +8077,90 @@
         <w:t xml:space="preserve">.</w:t>
       </w:r>
     </w:p>
+    <w:bookmarkEnd w:id="147"/>
+    <w:bookmarkStart w:id="148" w:name="X33fe7de6e8b65c86af337dbdb8d7cc8651c48a8"/>
+    <w:p>
+      <w:pPr>
+        <w:pStyle w:val="Bibliography"/>
+      </w:pPr>
+      <w:r>
+        <w:t xml:space="preserve">[50]</w:t>
+      </w:r>
+      <w:r>
+        <w:t xml:space="preserve"> </w:t>
+      </w:r>
+      <w:r>
+        <w:t xml:space="preserve">	</w:t>
+      </w:r>
+      <w:r>
+        <w:t xml:space="preserve">Menezes-Filho JA, Carvalho CF, Rodrigues JLG, Araújo CFS, Dos Santos NR, Lima CS, Bandeira MJ, Marques BL de S, Anjos ALS, Bah HAF, Abreu N, Philibert A, Mergler D. Environmental</w:t>
+      </w:r>
+      <w:r>
+        <w:t xml:space="preserve"> </w:t>
+      </w:r>
+      <w:r>
+        <w:t xml:space="preserve">Co-Exposure</w:t>
+      </w:r>
+      <w:r>
+        <w:t xml:space="preserve"> </w:t>
+      </w:r>
+      <w:r>
+        <w:t xml:space="preserve">to</w:t>
+      </w:r>
+      <w:r>
+        <w:t xml:space="preserve"> </w:t>
+      </w:r>
+      <w:r>
+        <w:t xml:space="preserve">Lead</w:t>
+      </w:r>
+      <w:r>
+        <w:t xml:space="preserve"> </w:t>
+      </w:r>
+      <w:r>
+        <w:t xml:space="preserve">and</w:t>
+      </w:r>
+      <w:r>
+        <w:t xml:space="preserve"> </w:t>
+      </w:r>
+      <w:r>
+        <w:t xml:space="preserve">Manganese</w:t>
+      </w:r>
+      <w:r>
+        <w:t xml:space="preserve"> </w:t>
+      </w:r>
+      <w:r>
+        <w:t xml:space="preserve">and</w:t>
+      </w:r>
+      <w:r>
+        <w:t xml:space="preserve"> </w:t>
+      </w:r>
+      <w:r>
+        <w:t xml:space="preserve">Intellectual Deficit</w:t>
+      </w:r>
+      <w:r>
+        <w:t xml:space="preserve"> </w:t>
+      </w:r>
+      <w:r>
+        <w:t xml:space="preserve">in</w:t>
+      </w:r>
+      <w:r>
+        <w:t xml:space="preserve"> </w:t>
+      </w:r>
+      <w:r>
+        <w:t xml:space="preserve">School-Aged Children</w:t>
+      </w:r>
+      <w:r>
+        <w:t xml:space="preserve">. International Journal of Environmental Research and Public Health 2018;15:2418.</w:t>
+      </w:r>
+    </w:p>
     <w:bookmarkEnd w:id="148"/>
-    <w:bookmarkStart w:id="149" w:name="X33fe7de6e8b65c86af337dbdb8d7cc8651c48a8"/>
+    <w:bookmarkStart w:id="150" w:name="ref-smith2018StepAwayStepwise"/>
     <w:p>
       <w:pPr>
         <w:pStyle w:val="Bibliography"/>
       </w:pPr>
       <w:r>
-        <w:t xml:space="preserve">[50]</w:t>
+        <w:t xml:space="preserve">[51]</w:t>
       </w:r>
       <w:r>
         <w:t xml:space="preserve"> </w:t>
@@ -8100,88 +8169,12 @@
         <w:t xml:space="preserve">	</w:t>
       </w:r>
       <w:r>
-        <w:t xml:space="preserve">Menezes-Filho JA, Carvalho CF, Rodrigues JLG, Araújo CFS, Dos Santos NR, Lima CS, Bandeira MJ, Marques BL de S, Anjos ALS, Bah HAF, Abreu N, Philibert A, Mergler D. Environmental</w:t>
-      </w:r>
-      <w:r>
-        <w:t xml:space="preserve"> </w:t>
-      </w:r>
-      <w:r>
-        <w:t xml:space="preserve">Co-Exposure</w:t>
-      </w:r>
-      <w:r>
-        <w:t xml:space="preserve"> </w:t>
-      </w:r>
-      <w:r>
-        <w:t xml:space="preserve">to</w:t>
-      </w:r>
-      <w:r>
-        <w:t xml:space="preserve"> </w:t>
-      </w:r>
-      <w:r>
-        <w:t xml:space="preserve">Lead</w:t>
-      </w:r>
-      <w:r>
-        <w:t xml:space="preserve"> </w:t>
-      </w:r>
-      <w:r>
-        <w:t xml:space="preserve">and</w:t>
-      </w:r>
-      <w:r>
-        <w:t xml:space="preserve"> </w:t>
-      </w:r>
-      <w:r>
-        <w:t xml:space="preserve">Manganese</w:t>
-      </w:r>
-      <w:r>
-        <w:t xml:space="preserve"> </w:t>
-      </w:r>
-      <w:r>
-        <w:t xml:space="preserve">and</w:t>
-      </w:r>
-      <w:r>
-        <w:t xml:space="preserve"> </w:t>
-      </w:r>
-      <w:r>
-        <w:t xml:space="preserve">Intellectual Deficit</w:t>
-      </w:r>
-      <w:r>
-        <w:t xml:space="preserve"> </w:t>
-      </w:r>
-      <w:r>
-        <w:t xml:space="preserve">in</w:t>
-      </w:r>
-      <w:r>
-        <w:t xml:space="preserve"> </w:t>
-      </w:r>
-      <w:r>
-        <w:t xml:space="preserve">School-Aged Children</w:t>
-      </w:r>
-      <w:r>
-        <w:t xml:space="preserve">. International Journal of Environmental Research and Public Health 2018;15:2418.</w:t>
-      </w:r>
-    </w:p>
-    <w:bookmarkEnd w:id="149"/>
-    <w:bookmarkStart w:id="151" w:name="ref-smith2018StepAwayStepwise"/>
-    <w:p>
-      <w:pPr>
-        <w:pStyle w:val="Bibliography"/>
-      </w:pPr>
-      <w:r>
-        <w:t xml:space="preserve">[51]</w:t>
-      </w:r>
-      <w:r>
-        <w:t xml:space="preserve"> </w:t>
-      </w:r>
-      <w:r>
-        <w:t xml:space="preserve">	</w:t>
-      </w:r>
-      <w:r>
         <w:t xml:space="preserve">Smith G. Step away from stepwise. J Big Data 2018;5:32.</w:t>
       </w:r>
       <w:r>
         <w:t xml:space="preserve"> </w:t>
       </w:r>
-      <w:hyperlink r:id="rId150">
+      <w:hyperlink r:id="rId149">
         <w:r>
           <w:rPr>
             <w:rStyle w:val="Hyperlink"/>
@@ -8193,8 +8186,8 @@
         <w:t xml:space="preserve">.</w:t>
       </w:r>
     </w:p>
-    <w:bookmarkEnd w:id="151"/>
-    <w:bookmarkStart w:id="153" w:name="ref-kazi2026PvaluesBayesFactor"/>
+    <w:bookmarkEnd w:id="150"/>
+    <w:bookmarkStart w:id="152" w:name="ref-kazi2026PvaluesBayesFactor"/>
     <w:p>
       <w:pPr>
         <w:pStyle w:val="Bibliography"/>
@@ -8244,7 +8237,7 @@
       <w:r>
         <w:t xml:space="preserve"> </w:t>
       </w:r>
-      <w:hyperlink r:id="rId152">
+      <w:hyperlink r:id="rId151">
         <w:r>
           <w:rPr>
             <w:rStyle w:val="Hyperlink"/>
@@ -8256,8 +8249,8 @@
         <w:t xml:space="preserve">.</w:t>
       </w:r>
     </w:p>
-    <w:bookmarkEnd w:id="153"/>
-    <w:bookmarkStart w:id="155" w:name="X946754e67e3c74fad7a8806aa9d2819ed4ec186"/>
+    <w:bookmarkEnd w:id="152"/>
+    <w:bookmarkStart w:id="154" w:name="X946754e67e3c74fad7a8806aa9d2819ed4ec186"/>
     <w:p>
       <w:pPr>
         <w:pStyle w:val="Bibliography"/>
@@ -8277,7 +8270,7 @@
       <w:r>
         <w:t xml:space="preserve"> </w:t>
       </w:r>
-      <w:hyperlink r:id="rId154">
+      <w:hyperlink r:id="rId153">
         <w:r>
           <w:rPr>
             <w:rStyle w:val="Hyperlink"/>
@@ -8289,8 +8282,8 @@
         <w:t xml:space="preserve">.</w:t>
       </w:r>
     </w:p>
-    <w:bookmarkEnd w:id="155"/>
-    <w:bookmarkStart w:id="157" w:name="ref-ciyer2025BayesianMetaanalysis21st"/>
+    <w:bookmarkEnd w:id="154"/>
+    <w:bookmarkStart w:id="156" w:name="ref-ciyer2025BayesianMetaanalysis21st"/>
     <w:p>
       <w:pPr>
         <w:pStyle w:val="Bibliography"/>
@@ -8322,7 +8315,7 @@
       <w:r>
         <w:t xml:space="preserve"> </w:t>
       </w:r>
-      <w:hyperlink r:id="rId156">
+      <w:hyperlink r:id="rId155">
         <w:r>
           <w:rPr>
             <w:rStyle w:val="Hyperlink"/>
@@ -8334,8 +8327,8 @@
         <w:t xml:space="preserve">.</w:t>
       </w:r>
     </w:p>
-    <w:bookmarkEnd w:id="157"/>
-    <w:bookmarkStart w:id="159" w:name="ref-hong2013ComparingBayesianFrequentist"/>
+    <w:bookmarkEnd w:id="156"/>
+    <w:bookmarkStart w:id="158" w:name="ref-hong2013ComparingBayesianFrequentist"/>
     <w:p>
       <w:pPr>
         <w:pStyle w:val="Bibliography"/>
@@ -8388,7 +8381,7 @@
       <w:r>
         <w:t xml:space="preserve"> </w:t>
       </w:r>
-      <w:hyperlink r:id="rId158">
+      <w:hyperlink r:id="rId157">
         <w:r>
           <w:rPr>
             <w:rStyle w:val="Hyperlink"/>
@@ -8400,8 +8393,8 @@
         <w:t xml:space="preserve">.</w:t>
       </w:r>
     </w:p>
-    <w:bookmarkEnd w:id="159"/>
-    <w:bookmarkStart w:id="161" w:name="ref-sadeghirad2023TheoryPracticeBayesian"/>
+    <w:bookmarkEnd w:id="158"/>
+    <w:bookmarkStart w:id="160" w:name="ref-sadeghirad2023TheoryPracticeBayesian"/>
     <w:p>
       <w:pPr>
         <w:pStyle w:val="Bibliography"/>
@@ -8433,7 +8426,7 @@
       <w:r>
         <w:t xml:space="preserve"> </w:t>
       </w:r>
-      <w:hyperlink r:id="rId160">
+      <w:hyperlink r:id="rId159">
         <w:r>
           <w:rPr>
             <w:rStyle w:val="Hyperlink"/>
@@ -8445,8 +8438,8 @@
         <w:t xml:space="preserve">.</w:t>
       </w:r>
     </w:p>
-    <w:bookmarkEnd w:id="161"/>
-    <w:bookmarkStart w:id="163" w:name="X55ae1a8b757df519e0a47e2002b3acc0b2e73ec"/>
+    <w:bookmarkEnd w:id="160"/>
+    <w:bookmarkStart w:id="162" w:name="X55ae1a8b757df519e0a47e2002b3acc0b2e73ec"/>
     <w:p>
       <w:pPr>
         <w:pStyle w:val="Bibliography"/>
@@ -8478,7 +8471,7 @@
       <w:r>
         <w:t xml:space="preserve"> </w:t>
       </w:r>
-      <w:hyperlink r:id="rId162">
+      <w:hyperlink r:id="rId161">
         <w:r>
           <w:rPr>
             <w:rStyle w:val="Hyperlink"/>
@@ -8490,8 +8483,8 @@
         <w:t xml:space="preserve">.</w:t>
       </w:r>
     </w:p>
-    <w:bookmarkEnd w:id="163"/>
-    <w:bookmarkStart w:id="165" w:name="ref-gelman2013Chapter4Asymptotics"/>
+    <w:bookmarkEnd w:id="162"/>
+    <w:bookmarkStart w:id="164" w:name="ref-gelman2013Chapter4Asymptotics"/>
     <w:p>
       <w:pPr>
         <w:pStyle w:val="Bibliography"/>
@@ -8550,7 +8543,7 @@
       <w:r>
         <w:t xml:space="preserve"> </w:t>
       </w:r>
-      <w:hyperlink r:id="rId164">
+      <w:hyperlink r:id="rId163">
         <w:r>
           <w:rPr>
             <w:rStyle w:val="Hyperlink"/>
@@ -8562,8 +8555,8 @@
         <w:t xml:space="preserve">.</w:t>
       </w:r>
     </w:p>
-    <w:bookmarkEnd w:id="165"/>
-    <w:bookmarkStart w:id="167" w:name="ref-gelman2020BayesianWorkflow"/>
+    <w:bookmarkEnd w:id="164"/>
+    <w:bookmarkStart w:id="166" w:name="ref-gelman2020BayesianWorkflow"/>
     <w:p>
       <w:pPr>
         <w:pStyle w:val="Bibliography"/>
@@ -8595,7 +8588,7 @@
       <w:r>
         <w:t xml:space="preserve"> </w:t>
       </w:r>
-      <w:hyperlink r:id="rId166">
+      <w:hyperlink r:id="rId165">
         <w:r>
           <w:rPr>
             <w:rStyle w:val="Hyperlink"/>
@@ -8607,14 +8600,33 @@
         <w:t xml:space="preserve">.</w:t>
       </w:r>
     </w:p>
+    <w:bookmarkEnd w:id="166"/>
+    <w:bookmarkStart w:id="167" w:name="Xd915bcb040430c17655975a5ceb4d7b4bdd04ac"/>
+    <w:p>
+      <w:pPr>
+        <w:pStyle w:val="Bibliography"/>
+      </w:pPr>
+      <w:r>
+        <w:t xml:space="preserve">[60]</w:t>
+      </w:r>
+      <w:r>
+        <w:t xml:space="preserve"> </w:t>
+      </w:r>
+      <w:r>
+        <w:t xml:space="preserve">	</w:t>
+      </w:r>
+      <w:r>
+        <w:t xml:space="preserve">Prüss-Üstün A, Mathers C, Corvalán C, Woodward A. Assessing the environmental burden of disease at national and local levels: Introduction and methods. Environmental Burden of Disease Series 2003.</w:t>
+      </w:r>
+    </w:p>
     <w:bookmarkEnd w:id="167"/>
-    <w:bookmarkStart w:id="168" w:name="Xd915bcb040430c17655975a5ceb4d7b4bdd04ac"/>
+    <w:bookmarkStart w:id="169" w:name="ref-goodman2023SexDifferencePre"/>
     <w:p>
       <w:pPr>
         <w:pStyle w:val="Bibliography"/>
       </w:pPr>
       <w:r>
-        <w:t xml:space="preserve">[60]</w:t>
+        <w:t xml:space="preserve">[61]</w:t>
       </w:r>
       <w:r>
         <w:t xml:space="preserve"> </w:t>
@@ -8623,31 +8635,12 @@
         <w:t xml:space="preserve">	</w:t>
       </w:r>
       <w:r>
-        <w:t xml:space="preserve">Prüss-Üstün A, Mathers C, Corvalán C, Woodward A. Assessing the environmental burden of disease at national and local levels: Introduction and methods. Environmental Burden of Disease Series 2003.</w:t>
-      </w:r>
-    </w:p>
-    <w:bookmarkEnd w:id="168"/>
-    <w:bookmarkStart w:id="170" w:name="ref-goodman2023SexDifferencePre"/>
-    <w:p>
-      <w:pPr>
-        <w:pStyle w:val="Bibliography"/>
-      </w:pPr>
-      <w:r>
-        <w:t xml:space="preserve">[61]</w:t>
-      </w:r>
-      <w:r>
-        <w:t xml:space="preserve"> </w:t>
-      </w:r>
-      <w:r>
-        <w:t xml:space="preserve">	</w:t>
-      </w:r>
-      <w:r>
         <w:t xml:space="preserve">Goodman CV, Green R, DaCosta A, Flora D, Lanphear B, Till C. Sex difference of pre- and post-natal exposure to six developmental neurotoxicants on intellectual abilities: A systematic review and meta-analysis of human studies. Environ Health 2023;22:80.</w:t>
       </w:r>
       <w:r>
         <w:t xml:space="preserve"> </w:t>
       </w:r>
-      <w:hyperlink r:id="rId169">
+      <w:hyperlink r:id="rId168">
         <w:r>
           <w:rPr>
             <w:rStyle w:val="Hyperlink"/>
@@ -8659,8 +8652,8 @@
         <w:t xml:space="preserve">.</w:t>
       </w:r>
     </w:p>
-    <w:bookmarkEnd w:id="170"/>
-    <w:bookmarkStart w:id="172" w:name="ref-pocock1994EnvironmentalLeadChildrens"/>
+    <w:bookmarkEnd w:id="169"/>
+    <w:bookmarkStart w:id="171" w:name="ref-pocock1994EnvironmentalLeadChildrens"/>
     <w:p>
       <w:pPr>
         <w:pStyle w:val="Bibliography"/>
@@ -8680,7 +8673,7 @@
       <w:r>
         <w:t xml:space="preserve"> </w:t>
       </w:r>
-      <w:hyperlink r:id="rId171">
+      <w:hyperlink r:id="rId170">
         <w:r>
           <w:rPr>
             <w:rStyle w:val="Hyperlink"/>
@@ -8692,8 +8685,8 @@
         <w:t xml:space="preserve">.</w:t>
       </w:r>
     </w:p>
-    <w:bookmarkEnd w:id="172"/>
-    <w:bookmarkStart w:id="174" w:name="ref-heidari2022EffectLeadExposurea"/>
+    <w:bookmarkEnd w:id="171"/>
+    <w:bookmarkStart w:id="173" w:name="ref-heidari2022EffectLeadExposurea"/>
     <w:p>
       <w:pPr>
         <w:pStyle w:val="Bibliography"/>
@@ -8725,7 +8718,7 @@
       <w:r>
         <w:t xml:space="preserve"> </w:t>
       </w:r>
-      <w:hyperlink r:id="rId173">
+      <w:hyperlink r:id="rId172">
         <w:r>
           <w:rPr>
             <w:rStyle w:val="Hyperlink"/>
@@ -8737,8 +8730,8 @@
         <w:t xml:space="preserve">.</w:t>
       </w:r>
     </w:p>
-    <w:bookmarkEnd w:id="174"/>
-    <w:bookmarkStart w:id="176" w:name="X99fa6bd9cd2521340285769f289a6c9d4bfe17b"/>
+    <w:bookmarkEnd w:id="173"/>
+    <w:bookmarkStart w:id="175" w:name="X99fa6bd9cd2521340285769f289a6c9d4bfe17b"/>
     <w:p>
       <w:pPr>
         <w:pStyle w:val="Bibliography"/>
@@ -8791,7 +8784,7 @@
       <w:r>
         <w:t xml:space="preserve"> </w:t>
       </w:r>
-      <w:hyperlink r:id="rId175">
+      <w:hyperlink r:id="rId174">
         <w:r>
           <w:rPr>
             <w:rStyle w:val="Hyperlink"/>
@@ -8803,8 +8796,8 @@
         <w:t xml:space="preserve">.</w:t>
       </w:r>
     </w:p>
-    <w:bookmarkEnd w:id="176"/>
-    <w:bookmarkStart w:id="178" w:name="Xec30ec7c912152a14c0f622040312567154bf15"/>
+    <w:bookmarkEnd w:id="175"/>
+    <w:bookmarkStart w:id="177" w:name="Xec30ec7c912152a14c0f622040312567154bf15"/>
     <w:p>
       <w:pPr>
         <w:pStyle w:val="Bibliography"/>
@@ -8884,7 +8877,7 @@
       <w:r>
         <w:t xml:space="preserve"> </w:t>
       </w:r>
-      <w:hyperlink r:id="rId177">
+      <w:hyperlink r:id="rId176">
         <w:r>
           <w:rPr>
             <w:rStyle w:val="Hyperlink"/>
@@ -8896,9 +8889,9 @@
         <w:t xml:space="preserve">.</w:t>
       </w:r>
     </w:p>
+    <w:bookmarkEnd w:id="177"/>
     <w:bookmarkEnd w:id="178"/>
     <w:bookmarkEnd w:id="179"/>
-    <w:bookmarkEnd w:id="180"/>
     <w:sectPr>
       <w:footerReference r:id="rId9" w:type="default"/>
       <w:footnotePr>

</xml_diff>

<commit_message>
changed wordings: methods & discussion
</commit_message>
<xml_diff>
--- a/manuscript/manuscript.docx
+++ b/manuscript/manuscript.docx
@@ -161,7 +161,7 @@
         <w:br/>
       </w:r>
       <w:r>
-        <w:t xml:space="preserve">Methods</w:t>
+        <w:t xml:space="preserve">Evidence synthesis</w:t>
       </w:r>
       <w:r>
         <w:br/>
@@ -278,14 +278,6 @@
     <w:p>
       <w:pPr>
         <w:pStyle w:val="FirstParagraph"/>
-      </w:pPr>
-      <w:r>
-        <w:t xml:space="preserve">(250 words limit in Environment International)</w:t>
-      </w:r>
-    </w:p>
-    <w:p>
-      <w:pPr>
-        <w:pStyle w:val="BodyText"/>
       </w:pPr>
       <w:r>
         <w:rPr>
@@ -614,7 +606,7 @@
         <w:t xml:space="preserve"> </w:t>
       </w:r>
       <w:r>
-        <w:t xml:space="preserve">These features are particularly valueable regarding risk assessment and policy-making.</w:t>
+        <w:t xml:space="preserve">These features are particularly valuable regarding risk assessment and policy-making.</w:t>
       </w:r>
     </w:p>
     <w:p>

</xml_diff>

<commit_message>
added reference to suppl. file 6
</commit_message>
<xml_diff>
--- a/manuscript/manuscript.docx
+++ b/manuscript/manuscript.docx
@@ -3845,6 +3845,18 @@
       </w:r>
       <w:r>
         <w:t xml:space="preserve">= 85% (95% CI: 62.7 to 95.2%).</w:t>
+      </w:r>
+      <w:r>
+        <w:t xml:space="preserve"> </w:t>
+      </w:r>
+      <w:r>
+        <w:t xml:space="preserve">Supplementary file 6 contains the full model code and output for both frameworks.</w:t>
+      </w:r>
+      <w:r>
+        <w:t xml:space="preserve"> </w:t>
+      </w:r>
+      <w:r>
+        <w:t xml:space="preserve">The results of both frameworks are shown as forest plots in Figure 2.</w:t>
       </w:r>
     </w:p>
     <w:p>

</xml_diff>

<commit_message>
fixed error in a reference
</commit_message>
<xml_diff>
--- a/manuscript/manuscript.docx
+++ b/manuscript/manuscript.docx
@@ -706,7 +706,7 @@
         <w:t xml:space="preserve"> </w:t>
       </w:r>
       <w:r>
-        <w:t xml:space="preserve">(Brauer et al., 2024)</w:t>
+        <w:t xml:space="preserve">(Hay et al., 2025)</w:t>
       </w:r>
       <w:r>
         <w:t xml:space="preserve">.</w:t>
@@ -931,7 +931,7 @@
         <w:t xml:space="preserve"> </w:t>
       </w:r>
       <w:r>
-        <w:t xml:space="preserve">(Brauer et al., 2024; Carrington et al., 2019; Figueroa et al., 2024; Larsen and Sánchez-Triana, 2023; McFarland et al., 2022)</w:t>
+        <w:t xml:space="preserve">(Carrington et al., 2019; Figueroa et al., 2024; Hay et al., 2025; Larsen and Sánchez-Triana, 2023; McFarland et al., 2022)</w:t>
       </w:r>
       <w:r>
         <w:t xml:space="preserve"> </w:t>
@@ -5658,52 +5658,7 @@
       </w:hyperlink>
     </w:p>
     <w:bookmarkEnd w:id="64"/>
-    <w:bookmarkStart w:id="66" w:name="ref-brauer2024GlobalBurdenStrength"/>
-    <w:p>
-      <w:pPr>
-        <w:pStyle w:val="Bibliography"/>
-      </w:pPr>
-      <w:r>
-        <w:t xml:space="preserve">Brauer, M., Roth, G.A., Aravkin, A.Y., Zheng, P., Abate, K.H., Abate, Y.H., Abbafati, C., Abbasgholizadeh, R., Abbasi, M.A., Abbasian, M., Abbasifard, M., Abbasi-Kangevari, M., Abd ElHafeez, S., Abd-Elsalam, S., Abdi, P., Abdollahi, M., Abdoun, M., Abdulah, D.M., Abdullahi, A., Abebe, M., Abedi, A., Abedi, A., Abegaz, T.M., Abeldaño Zuñiga, R.A., Abiodun, O., Abiso, T.L., Aboagye, R.G., Abolhassani, H., Abouzid, M., Aboye, G.B., Abreu, L.G., Abualruz, H., Abubakar, B., Abu-Gharbieh, E., Abukhadijah, H.J.J., Aburuz, S., Abu-Zaid, A., Adane, M.M., Addo, I.Y., Addolorato, G., Adedoyin, R.A., Adekanmbi, V., Aden, B., Adetunji, J.B., Adeyeoluwa, T.E., Adha, R., Adibi, A., Adnani, Q.E.S., Adzigbli, L.A., Afolabi, A.A., Afolabi, R.F., Afshin, A., Afyouni, S., Afzal, M.S., Afzal, S., Agampodi, S.B., Agbozo, F., Aghamiri, S., Agodi, A., Agrawal, A., Agyemang-Duah, W., Ahinkorah, B.O., Ahmad, A., Ahmad, D., Ahmad, F., Ahmad, N., Ahmad, S., Ahmad, T., Ahmed, A., Ahmed, A., Ahmed, A., Ahmed, L.A., Ahmed, M.B., Ahmed, S., Ahmed, S.A., Ajami, M., Akalu, G.T., Akara, E.M., Akbarialiabad, H., Akhlaghi, S., Akinosoglou, K., Akinyemiju, T., Akkaif, M.A., Akkala, S., Akombi-Inyang, B., Al Awaidy, S., Al Hasan, S.M., Alahdab, F., Al-Ahdal, T.M.A., Alalalmeh, S.O., Alalwan, T.A., Al-Aly, Z., Alam, K., Alam, N., Alanezi, F.M., Alanzi, T.M., Albakri, A., AlBataineh, M.T., Aldhaleei, W.A., Aldridge, R.W., others, 2024. Global burden and strength of evidence for 88 risk factors in 204 countries and 811 subnational locations, 1990&amp;#x2013;2021: A systematic analysis for the</w:t>
-      </w:r>
-      <w:r>
-        <w:t xml:space="preserve"> </w:t>
-      </w:r>
-      <w:r>
-        <w:t xml:space="preserve">Global Burden</w:t>
-      </w:r>
-      <w:r>
-        <w:t xml:space="preserve"> </w:t>
-      </w:r>
-      <w:r>
-        <w:t xml:space="preserve">of</w:t>
-      </w:r>
-      <w:r>
-        <w:t xml:space="preserve"> </w:t>
-      </w:r>
-      <w:r>
-        <w:t xml:space="preserve">Disease Study</w:t>
-      </w:r>
-      <w:r>
-        <w:t xml:space="preserve"> </w:t>
-      </w:r>
-      <w:r>
-        <w:t xml:space="preserve">2021. The Lancet 403, 2162–2203.</w:t>
-      </w:r>
-      <w:r>
-        <w:t xml:space="preserve"> </w:t>
-      </w:r>
-      <w:hyperlink r:id="rId65">
-        <w:r>
-          <w:rPr>
-            <w:rStyle w:val="Hyperlink"/>
-          </w:rPr>
-          <w:t xml:space="preserve">https://doi.org/10.1016/S0140-6736(24)00933-4</w:t>
-        </w:r>
-      </w:hyperlink>
-    </w:p>
-    <w:bookmarkEnd w:id="66"/>
-    <w:bookmarkStart w:id="68" w:name="ref-burkner2017BrmsPackageBayesian"/>
+    <w:bookmarkStart w:id="66" w:name="ref-burkner2017BrmsPackageBayesian"/>
     <w:p>
       <w:pPr>
         <w:pStyle w:val="Bibliography"/>
@@ -5777,7 +5732,7 @@
       <w:r>
         <w:t xml:space="preserve"> </w:t>
       </w:r>
-      <w:hyperlink r:id="rId67">
+      <w:hyperlink r:id="rId65">
         <w:r>
           <w:rPr>
             <w:rStyle w:val="Hyperlink"/>
@@ -5786,8 +5741,8 @@
         </w:r>
       </w:hyperlink>
     </w:p>
-    <w:bookmarkEnd w:id="68"/>
-    <w:bookmarkStart w:id="70" w:name="ref-ciyer2025BayesianMetaanalysis21st"/>
+    <w:bookmarkEnd w:id="66"/>
+    <w:bookmarkStart w:id="68" w:name="ref-ciyer2025BayesianMetaanalysis21st"/>
     <w:p>
       <w:pPr>
         <w:pStyle w:val="Bibliography"/>
@@ -5810,7 +5765,7 @@
       <w:r>
         <w:t xml:space="preserve"> </w:t>
       </w:r>
-      <w:hyperlink r:id="rId69">
+      <w:hyperlink r:id="rId67">
         <w:r>
           <w:rPr>
             <w:rStyle w:val="Hyperlink"/>
@@ -5819,8 +5774,8 @@
         </w:r>
       </w:hyperlink>
     </w:p>
-    <w:bookmarkEnd w:id="70"/>
-    <w:bookmarkStart w:id="72" w:name="Xa2086c2c3f6a9ac4b676f66b1cdbbd5efdb3b23"/>
+    <w:bookmarkEnd w:id="68"/>
+    <w:bookmarkStart w:id="70" w:name="Xa2086c2c3f6a9ac4b676f66b1cdbbd5efdb3b23"/>
     <w:p>
       <w:pPr>
         <w:pStyle w:val="Bibliography"/>
@@ -5887,7 +5842,7 @@
       <w:r>
         <w:t xml:space="preserve"> </w:t>
       </w:r>
-      <w:hyperlink r:id="rId71">
+      <w:hyperlink r:id="rId69">
         <w:r>
           <w:rPr>
             <w:rStyle w:val="Hyperlink"/>
@@ -5896,8 +5851,8 @@
         </w:r>
       </w:hyperlink>
     </w:p>
-    <w:bookmarkEnd w:id="72"/>
-    <w:bookmarkStart w:id="74" w:name="X93c1fc7f8e1220d02cbab90c02ac44248f2b23e"/>
+    <w:bookmarkEnd w:id="70"/>
+    <w:bookmarkStart w:id="72" w:name="X93c1fc7f8e1220d02cbab90c02ac44248f2b23e"/>
     <w:p>
       <w:pPr>
         <w:pStyle w:val="Bibliography"/>
@@ -5908,7 +5863,7 @@
       <w:r>
         <w:t xml:space="preserve"> </w:t>
       </w:r>
-      <w:hyperlink r:id="rId73">
+      <w:hyperlink r:id="rId71">
         <w:r>
           <w:rPr>
             <w:rStyle w:val="Hyperlink"/>
@@ -5917,8 +5872,8 @@
         </w:r>
       </w:hyperlink>
     </w:p>
-    <w:bookmarkEnd w:id="74"/>
-    <w:bookmarkStart w:id="76" w:name="ref-chang2006LowBloodLead"/>
+    <w:bookmarkEnd w:id="72"/>
+    <w:bookmarkStart w:id="74" w:name="ref-chang2006LowBloodLead"/>
     <w:p>
       <w:pPr>
         <w:pStyle w:val="Bibliography"/>
@@ -5929,7 +5884,7 @@
       <w:r>
         <w:t xml:space="preserve"> </w:t>
       </w:r>
-      <w:hyperlink r:id="rId75">
+      <w:hyperlink r:id="rId73">
         <w:r>
           <w:rPr>
             <w:rStyle w:val="Hyperlink"/>
@@ -5938,8 +5893,8 @@
         </w:r>
       </w:hyperlink>
     </w:p>
-    <w:bookmarkEnd w:id="76"/>
-    <w:bookmarkStart w:id="78" w:name="ref-chen2005IQBloodLead"/>
+    <w:bookmarkEnd w:id="74"/>
+    <w:bookmarkStart w:id="76" w:name="ref-chen2005IQBloodLead"/>
     <w:p>
       <w:pPr>
         <w:pStyle w:val="Bibliography"/>
@@ -6061,7 +6016,7 @@
       <w:r>
         <w:t xml:space="preserve"> </w:t>
       </w:r>
-      <w:hyperlink r:id="rId77">
+      <w:hyperlink r:id="rId75">
         <w:r>
           <w:rPr>
             <w:rStyle w:val="Hyperlink"/>
@@ -6070,8 +6025,8 @@
         </w:r>
       </w:hyperlink>
     </w:p>
-    <w:bookmarkEnd w:id="78"/>
-    <w:bookmarkStart w:id="80" w:name="ref-crump2013StatisticalReevaluationData"/>
+    <w:bookmarkEnd w:id="76"/>
+    <w:bookmarkStart w:id="78" w:name="ref-crump2013StatisticalReevaluationData"/>
     <w:p>
       <w:pPr>
         <w:pStyle w:val="Bibliography"/>
@@ -6094,7 +6049,7 @@
       <w:r>
         <w:t xml:space="preserve"> </w:t>
       </w:r>
-      <w:hyperlink r:id="rId79">
+      <w:hyperlink r:id="rId77">
         <w:r>
           <w:rPr>
             <w:rStyle w:val="Hyperlink"/>
@@ -6103,8 +6058,8 @@
         </w:r>
       </w:hyperlink>
     </w:p>
-    <w:bookmarkEnd w:id="80"/>
-    <w:bookmarkStart w:id="82" w:name="ref-dantzer2020ComparisonBloodToenails"/>
+    <w:bookmarkEnd w:id="78"/>
+    <w:bookmarkStart w:id="80" w:name="ref-dantzer2020ComparisonBloodToenails"/>
     <w:p>
       <w:pPr>
         <w:pStyle w:val="Bibliography"/>
@@ -6115,7 +6070,7 @@
       <w:r>
         <w:t xml:space="preserve"> </w:t>
       </w:r>
-      <w:hyperlink r:id="rId81">
+      <w:hyperlink r:id="rId79">
         <w:r>
           <w:rPr>
             <w:rStyle w:val="Hyperlink"/>
@@ -6124,8 +6079,8 @@
         </w:r>
       </w:hyperlink>
     </w:p>
-    <w:bookmarkEnd w:id="82"/>
-    <w:bookmarkStart w:id="84" w:name="X6bc65313eadd1b86059eb4ba10c8cf9d91be17d"/>
+    <w:bookmarkEnd w:id="80"/>
+    <w:bookmarkStart w:id="82" w:name="X6bc65313eadd1b86059eb4ba10c8cf9d91be17d"/>
     <w:p>
       <w:pPr>
         <w:pStyle w:val="Bibliography"/>
@@ -6160,7 +6115,7 @@
       <w:r>
         <w:t xml:space="preserve"> </w:t>
       </w:r>
-      <w:hyperlink r:id="rId83">
+      <w:hyperlink r:id="rId81">
         <w:r>
           <w:rPr>
             <w:rStyle w:val="Hyperlink"/>
@@ -6169,8 +6124,8 @@
         </w:r>
       </w:hyperlink>
     </w:p>
-    <w:bookmarkEnd w:id="84"/>
-    <w:bookmarkStart w:id="86" w:name="Xadfdab0209e4a364d9fdcffecfddb00700d2db9"/>
+    <w:bookmarkEnd w:id="82"/>
+    <w:bookmarkStart w:id="84" w:name="Xadfdab0209e4a364d9fdcffecfddb00700d2db9"/>
     <w:p>
       <w:pPr>
         <w:pStyle w:val="Bibliography"/>
@@ -6244,7 +6199,7 @@
       <w:r>
         <w:t xml:space="preserve"> </w:t>
       </w:r>
-      <w:hyperlink r:id="rId85">
+      <w:hyperlink r:id="rId83">
         <w:r>
           <w:rPr>
             <w:rStyle w:val="Hyperlink"/>
@@ -6253,8 +6208,8 @@
         </w:r>
       </w:hyperlink>
     </w:p>
-    <w:bookmarkEnd w:id="86"/>
-    <w:bookmarkStart w:id="88" w:name="ref-earl2016LowlevelEnvironmentalLead"/>
+    <w:bookmarkEnd w:id="84"/>
+    <w:bookmarkStart w:id="86" w:name="ref-earl2016LowlevelEnvironmentalLead"/>
     <w:p>
       <w:pPr>
         <w:pStyle w:val="Bibliography"/>
@@ -6265,7 +6220,7 @@
       <w:r>
         <w:t xml:space="preserve"> </w:t>
       </w:r>
-      <w:hyperlink r:id="rId87">
+      <w:hyperlink r:id="rId85">
         <w:r>
           <w:rPr>
             <w:rStyle w:val="Hyperlink"/>
@@ -6274,8 +6229,8 @@
         </w:r>
       </w:hyperlink>
     </w:p>
-    <w:bookmarkEnd w:id="88"/>
-    <w:bookmarkStart w:id="90" w:name="X4707f3a4b72a0982487545f9dc3d674642af108"/>
+    <w:bookmarkEnd w:id="86"/>
+    <w:bookmarkStart w:id="88" w:name="X4707f3a4b72a0982487545f9dc3d674642af108"/>
     <w:p>
       <w:pPr>
         <w:pStyle w:val="Bibliography"/>
@@ -6298,7 +6253,7 @@
       <w:r>
         <w:t xml:space="preserve"> </w:t>
       </w:r>
-      <w:hyperlink r:id="rId89">
+      <w:hyperlink r:id="rId87">
         <w:r>
           <w:rPr>
             <w:rStyle w:val="Hyperlink"/>
@@ -6307,8 +6262,8 @@
         </w:r>
       </w:hyperlink>
     </w:p>
-    <w:bookmarkEnd w:id="90"/>
-    <w:bookmarkStart w:id="92" w:name="X5615fc1cb9c455a90da75660348bda09fd0f967"/>
+    <w:bookmarkEnd w:id="88"/>
+    <w:bookmarkStart w:id="90" w:name="X5615fc1cb9c455a90da75660348bda09fd0f967"/>
     <w:p>
       <w:pPr>
         <w:pStyle w:val="Bibliography"/>
@@ -6352,7 +6307,7 @@
       <w:r>
         <w:t xml:space="preserve"> </w:t>
       </w:r>
-      <w:hyperlink r:id="rId91">
+      <w:hyperlink r:id="rId89">
         <w:r>
           <w:rPr>
             <w:rStyle w:val="Hyperlink"/>
@@ -6361,8 +6316,8 @@
         </w:r>
       </w:hyperlink>
     </w:p>
-    <w:bookmarkEnd w:id="92"/>
-    <w:bookmarkStart w:id="94" w:name="ref-figueroa2024LossCognitiveFunction"/>
+    <w:bookmarkEnd w:id="90"/>
+    <w:bookmarkStart w:id="92" w:name="ref-figueroa2024LossCognitiveFunction"/>
     <w:p>
       <w:pPr>
         <w:pStyle w:val="Bibliography"/>
@@ -6385,7 +6340,7 @@
       <w:r>
         <w:t xml:space="preserve"> </w:t>
       </w:r>
-      <w:hyperlink r:id="rId93">
+      <w:hyperlink r:id="rId91">
         <w:r>
           <w:rPr>
             <w:rStyle w:val="Hyperlink"/>
@@ -6394,8 +6349,8 @@
         </w:r>
       </w:hyperlink>
     </w:p>
-    <w:bookmarkEnd w:id="94"/>
-    <w:bookmarkStart w:id="95" w:name="X21bf392f662dc1b38e9a7fa4b314fc7a471696b"/>
+    <w:bookmarkEnd w:id="92"/>
+    <w:bookmarkStart w:id="93" w:name="X21bf392f662dc1b38e9a7fa4b314fc7a471696b"/>
     <w:p>
       <w:pPr>
         <w:pStyle w:val="Bibliography"/>
@@ -6425,8 +6380,8 @@
         <w:t xml:space="preserve">.</w:t>
       </w:r>
     </w:p>
-    <w:bookmarkEnd w:id="95"/>
-    <w:bookmarkStart w:id="97" w:name="ref-gelman2013Chapter4Asymptotics"/>
+    <w:bookmarkEnd w:id="93"/>
+    <w:bookmarkStart w:id="95" w:name="ref-gelman2013Chapter4Asymptotics"/>
     <w:p>
       <w:pPr>
         <w:pStyle w:val="Bibliography"/>
@@ -6476,7 +6431,7 @@
       <w:r>
         <w:t xml:space="preserve"> </w:t>
       </w:r>
-      <w:hyperlink r:id="rId96">
+      <w:hyperlink r:id="rId94">
         <w:r>
           <w:rPr>
             <w:rStyle w:val="Hyperlink"/>
@@ -6485,8 +6440,8 @@
         </w:r>
       </w:hyperlink>
     </w:p>
-    <w:bookmarkEnd w:id="97"/>
-    <w:bookmarkStart w:id="99" w:name="ref-gelman2020BayesianWorkflow"/>
+    <w:bookmarkEnd w:id="95"/>
+    <w:bookmarkStart w:id="97" w:name="ref-gelman2020BayesianWorkflow"/>
     <w:p>
       <w:pPr>
         <w:pStyle w:val="Bibliography"/>
@@ -6506,7 +6461,7 @@
       <w:r>
         <w:t xml:space="preserve"> </w:t>
       </w:r>
-      <w:hyperlink r:id="rId98">
+      <w:hyperlink r:id="rId96">
         <w:r>
           <w:rPr>
             <w:rStyle w:val="Hyperlink"/>
@@ -6515,8 +6470,8 @@
         </w:r>
       </w:hyperlink>
     </w:p>
-    <w:bookmarkEnd w:id="99"/>
-    <w:bookmarkStart w:id="101" w:name="ref-goodman2023SexDifferencePre"/>
+    <w:bookmarkEnd w:id="97"/>
+    <w:bookmarkStart w:id="99" w:name="ref-goodman2023SexDifferencePre"/>
     <w:p>
       <w:pPr>
         <w:pStyle w:val="Bibliography"/>
@@ -6527,7 +6482,7 @@
       <w:r>
         <w:t xml:space="preserve"> </w:t>
       </w:r>
-      <w:hyperlink r:id="rId100">
+      <w:hyperlink r:id="rId98">
         <w:r>
           <w:rPr>
             <w:rStyle w:val="Hyperlink"/>
@@ -6536,8 +6491,8 @@
         </w:r>
       </w:hyperlink>
     </w:p>
-    <w:bookmarkEnd w:id="101"/>
-    <w:bookmarkStart w:id="103" w:name="X035620408d1fb22c7ed381e74f0468c30df4612"/>
+    <w:bookmarkEnd w:id="99"/>
+    <w:bookmarkStart w:id="101" w:name="X035620408d1fb22c7ed381e74f0468c30df4612"/>
     <w:p>
       <w:pPr>
         <w:pStyle w:val="Bibliography"/>
@@ -6575,7 +6530,7 @@
       <w:r>
         <w:t xml:space="preserve"> </w:t>
       </w:r>
-      <w:hyperlink r:id="rId102">
+      <w:hyperlink r:id="rId100">
         <w:r>
           <w:rPr>
             <w:rStyle w:val="Hyperlink"/>
@@ -6584,8 +6539,8 @@
         </w:r>
       </w:hyperlink>
     </w:p>
-    <w:bookmarkEnd w:id="103"/>
-    <w:bookmarkStart w:id="105" w:name="ref-halabicky2023LowLevelLead"/>
+    <w:bookmarkEnd w:id="101"/>
+    <w:bookmarkStart w:id="103" w:name="ref-halabicky2023LowLevelLead"/>
     <w:p>
       <w:pPr>
         <w:pStyle w:val="Bibliography"/>
@@ -6608,7 +6563,7 @@
       <w:r>
         <w:t xml:space="preserve"> </w:t>
       </w:r>
-      <w:hyperlink r:id="rId104">
+      <w:hyperlink r:id="rId102">
         <w:r>
           <w:rPr>
             <w:rStyle w:val="Hyperlink"/>
@@ -6617,8 +6572,8 @@
         </w:r>
       </w:hyperlink>
     </w:p>
-    <w:bookmarkEnd w:id="105"/>
-    <w:bookmarkStart w:id="107" w:name="ref-harari2018BloodLeadLevels"/>
+    <w:bookmarkEnd w:id="103"/>
+    <w:bookmarkStart w:id="105" w:name="ref-harari2018BloodLeadLevels"/>
     <w:p>
       <w:pPr>
         <w:pStyle w:val="Bibliography"/>
@@ -6662,7 +6617,7 @@
       <w:r>
         <w:t xml:space="preserve"> </w:t>
       </w:r>
-      <w:hyperlink r:id="rId106">
+      <w:hyperlink r:id="rId104">
         <w:r>
           <w:rPr>
             <w:rStyle w:val="Hyperlink"/>
@@ -6671,95 +6626,140 @@
         </w:r>
       </w:hyperlink>
     </w:p>
+    <w:bookmarkEnd w:id="105"/>
+    <w:bookmarkStart w:id="107" w:name="Xec30ec7c912152a14c0f622040312567154bf15"/>
+    <w:p>
+      <w:pPr>
+        <w:pStyle w:val="Bibliography"/>
+      </w:pPr>
+      <w:r>
+        <w:t xml:space="preserve">Harrell, F.E., 2015. Regression</w:t>
+      </w:r>
+      <w:r>
+        <w:t xml:space="preserve"> </w:t>
+      </w:r>
+      <w:r>
+        <w:t xml:space="preserve">Modeling Strategies</w:t>
+      </w:r>
+      <w:r>
+        <w:t xml:space="preserve">:</w:t>
+      </w:r>
+      <w:r>
+        <w:t xml:space="preserve"> </w:t>
+      </w:r>
+      <w:r>
+        <w:t xml:space="preserve">With Applications</w:t>
+      </w:r>
+      <w:r>
+        <w:t xml:space="preserve"> </w:t>
+      </w:r>
+      <w:r>
+        <w:t xml:space="preserve">to</w:t>
+      </w:r>
+      <w:r>
+        <w:t xml:space="preserve"> </w:t>
+      </w:r>
+      <w:r>
+        <w:t xml:space="preserve">Linear Models</w:t>
+      </w:r>
+      <w:r>
+        <w:t xml:space="preserve">,</w:t>
+      </w:r>
+      <w:r>
+        <w:t xml:space="preserve"> </w:t>
+      </w:r>
+      <w:r>
+        <w:t xml:space="preserve">Logistic</w:t>
+      </w:r>
+      <w:r>
+        <w:t xml:space="preserve"> </w:t>
+      </w:r>
+      <w:r>
+        <w:t xml:space="preserve">and</w:t>
+      </w:r>
+      <w:r>
+        <w:t xml:space="preserve"> </w:t>
+      </w:r>
+      <w:r>
+        <w:t xml:space="preserve">Ordinal Regression</w:t>
+      </w:r>
+      <w:r>
+        <w:t xml:space="preserve">, and</w:t>
+      </w:r>
+      <w:r>
+        <w:t xml:space="preserve"> </w:t>
+      </w:r>
+      <w:r>
+        <w:t xml:space="preserve">Survival Analysis</w:t>
+      </w:r>
+      <w:r>
+        <w:t xml:space="preserve">, Springer</w:t>
+      </w:r>
+      <w:r>
+        <w:t xml:space="preserve"> </w:t>
+      </w:r>
+      <w:r>
+        <w:t xml:space="preserve">Series</w:t>
+      </w:r>
+      <w:r>
+        <w:t xml:space="preserve"> </w:t>
+      </w:r>
+      <w:r>
+        <w:t xml:space="preserve">in</w:t>
+      </w:r>
+      <w:r>
+        <w:t xml:space="preserve"> </w:t>
+      </w:r>
+      <w:r>
+        <w:t xml:space="preserve">Statistics</w:t>
+      </w:r>
+      <w:r>
+        <w:t xml:space="preserve">. Springer International Publishing, Cham.</w:t>
+      </w:r>
+      <w:r>
+        <w:t xml:space="preserve"> </w:t>
+      </w:r>
+      <w:hyperlink r:id="rId106">
+        <w:r>
+          <w:rPr>
+            <w:rStyle w:val="Hyperlink"/>
+          </w:rPr>
+          <w:t xml:space="preserve">https://doi.org/10.1007/978-3-319-19425-7</w:t>
+        </w:r>
+      </w:hyperlink>
+    </w:p>
     <w:bookmarkEnd w:id="107"/>
-    <w:bookmarkStart w:id="109" w:name="Xec30ec7c912152a14c0f622040312567154bf15"/>
+    <w:bookmarkStart w:id="109" w:name="ref-hay2025Burden375Diseases"/>
     <w:p>
       <w:pPr>
         <w:pStyle w:val="Bibliography"/>
       </w:pPr>
       <w:r>
-        <w:t xml:space="preserve">Harrell, F.E., 2015. Regression</w:t>
-      </w:r>
-      <w:r>
-        <w:t xml:space="preserve"> </w:t>
-      </w:r>
-      <w:r>
-        <w:t xml:space="preserve">Modeling Strategies</w:t>
-      </w:r>
-      <w:r>
-        <w:t xml:space="preserve">:</w:t>
-      </w:r>
-      <w:r>
-        <w:t xml:space="preserve"> </w:t>
-      </w:r>
-      <w:r>
-        <w:t xml:space="preserve">With Applications</w:t>
-      </w:r>
-      <w:r>
-        <w:t xml:space="preserve"> </w:t>
-      </w:r>
-      <w:r>
-        <w:t xml:space="preserve">to</w:t>
-      </w:r>
-      <w:r>
-        <w:t xml:space="preserve"> </w:t>
-      </w:r>
-      <w:r>
-        <w:t xml:space="preserve">Linear Models</w:t>
-      </w:r>
-      <w:r>
-        <w:t xml:space="preserve">,</w:t>
-      </w:r>
-      <w:r>
-        <w:t xml:space="preserve"> </w:t>
-      </w:r>
-      <w:r>
-        <w:t xml:space="preserve">Logistic</w:t>
-      </w:r>
-      <w:r>
-        <w:t xml:space="preserve"> </w:t>
-      </w:r>
-      <w:r>
-        <w:t xml:space="preserve">and</w:t>
-      </w:r>
-      <w:r>
-        <w:t xml:space="preserve"> </w:t>
-      </w:r>
-      <w:r>
-        <w:t xml:space="preserve">Ordinal Regression</w:t>
-      </w:r>
-      <w:r>
-        <w:t xml:space="preserve">, and</w:t>
-      </w:r>
-      <w:r>
-        <w:t xml:space="preserve"> </w:t>
-      </w:r>
-      <w:r>
-        <w:t xml:space="preserve">Survival Analysis</w:t>
-      </w:r>
-      <w:r>
-        <w:t xml:space="preserve">, Springer</w:t>
-      </w:r>
-      <w:r>
-        <w:t xml:space="preserve"> </w:t>
-      </w:r>
-      <w:r>
-        <w:t xml:space="preserve">Series</w:t>
-      </w:r>
-      <w:r>
-        <w:t xml:space="preserve"> </w:t>
-      </w:r>
-      <w:r>
-        <w:t xml:space="preserve">in</w:t>
-      </w:r>
-      <w:r>
-        <w:t xml:space="preserve"> </w:t>
-      </w:r>
-      <w:r>
-        <w:t xml:space="preserve">Statistics</w:t>
-      </w:r>
-      <w:r>
-        <w:t xml:space="preserve">. Springer International Publishing, Cham.</w:t>
+        <w:t xml:space="preserve">Hay, S.I., Ong, K.L., Santomauro, D.F., A, B., Aalipour, M.A., Aalruz, H., Ababneh, H.S., Abaraogu, U.O., Abate, B.B., Abbafati, C., Abbas, N., Abbasifard, M., Abbasi-Kangevari, M., Abd ElHafeez, S., Abdalla, A.N., Abdalla, M.A., Abdallah, E.M., Abdeeq, B.A., Abdel Razeq, N.M.I., Abdelgalil, A.A., Abdel-Hameed, R., Abdelmasseh, M., Abdelnabi, M., Abdel-Rahman, W.M., Abd-Elsalam, S., Abdi, S., Abdollahi, M., Abdoun, M., Abdous, A., Abdul Aziz, J.M., Abdulah, D.M., Abdulkader, R.S., Abdullahi, A., Abdullahi, A., Abdul-Rahman, T., Abdykerimova, K., Abebe Getahun, H., Abedi, A., Abedi, A., Abejew, A.A., Abeldaño Zuñiga, R.A., Abhilash, E.S., Abid, S.U.A., Abidi, S.H., Abie, A., Abiodun, O.O., Abiodun, O., Aboagye, R.G., Abohashem, S., Abolhassani, H., Abonie, U.S., Abourashed, N.M., Abouzid, M., Abramov, D., Abreu, L.G., Abtahi, D., Abu Farha, R.K., Abuadas, F.H.A., Abubakar, A.K., Abubakar, B., Abu-Gharbieh, E., Abuhammad, S., Abuhelwa, A.Y., Abukhadijah, H.J., Abu-Rmeileh, N.M., Aburuz, S., Abushanab, D., Achar, R.R., Acharya, A.B., Acharya, A., Ackerman, I.N., Acuna, J.M., Adal, O., Adams, L.C., Adamu, L.H., Adane, M.M., Addisu, Z.D., Addo, I.Y., Adeagbo, O.A., Adebisi, T.A., Adedeji, I.A., Adedia, D., Adedokun, K.A., Adedoyin, R.A., Adegbile, O.E., Adegboye, O.A., Adegoke, N.A., Adeleke, O.T., Adesina, I.A., Adesina, M.A., Adewuyi, H.O., Adeyeoluwa, T.E., Adeyomoye, O.I., Adhikari, K., Adhikary, R.K., Adiga, U., Adnan, M., Adnani, Q.E.S., Adoma, P.O., Adzigbli, L.A., Adzrago, D., Affinito, G., Afifi, A.M., Afolabi, A.A., Afolabi, R.F., Afzal, S., Agafari, G.B., Agampodi, S.B., Ageru, T.A., Aggarwal, N., Aghaalikhani, M., Aghajanian, S., Aghamir, S.M.K., Agostinis Sobrinho, C., Agrawal, A., Agyemang-Duah, W., Ahadi, M., Ahinkorah, B.O., Ahmad, A., Ahmad, D., Ahmad, F., Ahmad, K., Ahmad, K., Ahmad, M.M., Ahmad, N., Ahmad, R., Ahmad, S., Ahmad, T., Ahmad, W., Ahmadi, N.S., Ahmadzade, A.M., Ahmadzade, M., Ahmed, A.O., Ahmed, A., Ahmed, A., Ahmed, G.S., Ahmed, H., Ahmed, J., Ahmed, L.A., Ahmed, M.S., Ahmed, M.S., Ahmed, M.B., Ahmed, M., Ahmed, O., Ahmed, S., Ahmed, S.M., Aimagambetova, G., Aj Jabbar, A., Ajala, D.E., Ajami, M., Ajose, A.O., Akbarialiabad, H., Akbarifard, S., Akeju, O., Akhigbe, R.E., Akinkuotu, O.A., Akinosoglou, K., Akkaif, M.A., Akkala, S., Akosile, W., Akram, H., Akrami, A.E., Akyea, R.K., Al Amiry, A., Al Awaidy, S., Al Hasan, S.M., Al Omari, O., Al Qadire, M., Al Ta’ani, O., Al Taie, W.A.M., Al Thaher, Y., Al Zaabi, O.A.M., Al Zoubi, M.A.M., Al-Abbadi, M.A., Al-Ajlouni, Y., Alalwan, T.A., Al-Aly, Z., Alam, K., Alam, M., Alam, M.K., Alam, M., Al-Amer, R.M., Alamrew, A., Alansari, A., Alanzi, T.M., Al-Ashwal, F.Y., Al-Asmar, R., Alavi, S.M.A., Albashtawy, M., Al-Dalakta, A., Aldawsari, K.A., Aldhaleei, W.A., Aldossary, M.S., Aldridge, R.W., Alebshehy, R., Aleidi, S.M., Alemayehu, B.A., Alemayehu, T.T., Alemnew, F., Alemu, M.B., Al-Eyadhy, A., Alfalki, A.M., Algahtani, F.D., Algammal, A.M., Algethami, M.R., Al-Gheethi, A.A.S., Al-Habbal, K., Alhabib, K.F., Alhaji, N.B., Al-Hajj, S., Alhalaiqa, F.N., Al-Hanawi, M.K., Alhassan Ibrahim, A., Alhumaidi, A., Alhumaydhi, F.A., Alhuwail, D., Ali, A., Ali, H.M., Ali, I., Ali, M., Ali, M.D., Ali, M.U., Ali, R., Ali, S., Ali, S.S., Ali, S.Y., Ali, W., Al-Ibraheem, A., Alicandro, G., Al-Iede, M., Alif, S.M., Alipour, M., Al-Jabi, S.W., Aljasir, M.A., Aljofan, M., Al-Jumaily, A., Aljunid, S.M., Alkhatib, A., Alkhatib, M.H., Alkhawam, M., Allahbakhshian, A., Allemailem, K.S., Allouh, M.Z., Almagharbeh, W.T., Almahmeed, W., Al-Marwani, S., Almasri, N.A., Almazan, J.U., Al-Mekhlafi, H.M., Almidani, O., Almobayed, A., Alnawafleh, K.A., Alniss, H.Y., Alocious Sukumar, M.B., Alomari, M.A., Alosta, M.R., Alqahtani, J.S., Alqahtani, S.A., Alqudimat, M.R., Al-Qudimat, A.R., Alrawashdeh, A., Alrimawi, I., Alrousan, S.M., Al-Sabah, S.K., Alsabri, M.A., Alshahrani, N.Z., Alshehri, M.A., Altaany, Z., Altaf, A., Al-Tammemi, A.B., Al-Tawfiq, J.A., Althobiani, M.A., Altirkawi, K.A., Alvarez-Galvez, J., Alves Carneiro, V.L., Alvis-Guzman, N., Alvis-Zakzuk, N.J., Alwafi, H., Al-Wardat, M., Al-Worafi, Y.M., Aly, H., Alyahya, M.S.I., AlZahmi, A., Alzahrani, H., Alzoubi, K.H., Al-Zubayer, M.A., Amaechi, U.A., Amafah, E.J., Amafah, J., Aman Mohammadi, M., Amani-Beni, R., Amegah, A.K., Amer, F., Amidi, B., Amin, A., Amin, T.T., Amindarolzarbi, A., Amini, S., Amini-Salehi, E., Aminu, N., Aminzare, M., Amiri, S., Amlag, J.O., Amugsi, D.A., Amzat, J., Anagnostakis, F., Ananda, R.A., Ancuceanu, R., Anderlini, D., Anderson, D.B., Anderson, J.A., Androudi, S., Anenberg, S.C., Ang, S.P., Angus, C., Anh, N.H., Ankomah, S.E., Annadurai, K., Anoushiravani, A., Ansari, I., Ansari, S., Ansari, U., Anteneh, R.M., Antó, J.M., Antony, C.M., Antriyandarti, E., Anuoluwa, B.S., Anwar, S., Anwar, S.L., Anwer, R., Anwer, S., Anyasodor, A.E., Apostol, G.L.C., Arab, J.P., Arabi, H., Arabloo, J., Arafat, M., Aravkin, A.Y., Areda, D., Arias De La Torre, J., Ariffin, H., Armocida, B., Ärnlöv, J., Arockiaraj, J., Arooj, M., Artamonov, A.A., Artanti, K.D., Aruleba, R.T., Arumuganainar, D., Aryntayeva, N., Asadi Anar, M., Asaduzzaman, M., Asdaq, S.M.B., Asefa, S.M., Asemu, M.T., Asgary, S., Asghari-Jafarabadi, M., Ashbaugh, C., Ashraf, S.A., Ashraf, T., Ashrafi, M., Ashrafizadeh, M., Asiamah-Asare, B.K.Y., Aslam, M.S., Aslani, S., Asri, Y., Assembekov, B., Astell-Burt, T., Ataei, M., Athari, M., Athari, S.S., Atout, M.M.W., Atre, S.R., Atreya, A., Atta, J.A., Atwan, Z.A., Aumoldaeva, Z.M., Ausloos, M., Avan, A., Avelar, N.C.P., Awan, S.J., Awosile, B.B., Awotidebe, A.W., Ayana, L.A.A., Ayatizadeh, S.H., Ayinde, O.O., Ayipo, Y.O., Ayyoubzadeh, S.M., Azadi, D., Azadnajafabad, S., Azarboo, A., Azargoonjahromi, A., Azhar, M., Azimi, F., Aziz, M.Y., Aziz, S.A., Azizan, A., Azzam, A.Y., Azzolino, D., Babandi, Z.S., Babiker, R., Babu, G.R., Bacha, I.T., Badar, M., Badiye, A.D., Badran, A.A., Bae, Y., Bagga, A., Baghdadi, S., Bagheri, N., Bagheri, S., Baghizadeh, E., Baghizadeh, F., Baghizadeh, S., Baghlaf, K.K., Bahmanziari, N., Bahrami, M.A., Bahreini, R., Bai, R., Baig, A.A., Baigi, V., Bakkannavar, S.M., Bako, A.T., Balakrishnan, S., Balcha, W.F., Balkis, M., Balmori-de-la-Miyar, J., Balooch Hasankhani, M., Baltatu, O.C., Bamashmous, S., Banach, M., Banakar, M., Banik, P.C., Banik, R., Barati, S., Barengo, N.C., Barker-Collo, S.L., Barqawi, H.J., Barreras Beltran, I.A., Barrow, A., Barteit, S., Barua, L., Bashar, M.A., Basharat, Z., Bashir, S., Basile, G., Baskaran, P., Basri, R., Bassat, Q., Bastan, M.-M., Basu, S., Basu, S., Batra, K., Baune, B.T., Bayat, M., Bayat Tork, M.A., Bayih, M.T., Bayisa, F.S., Bayleyegn, N.S., Beaney, T., Bedi, N., Beeraka, N.M., Behera, P., Behjati, J., Behnam, B., Behnoush, A.H., Bekele, B.K., Belayneh, A.G., Belayneh, M., Belete, A.C., Belge Bilgin, G., Belingheri, M., Bello, M.B., Bello, O.O., Belo, L., Beloukas, A., Bendak, S., Bendardaf, R., Benjet, C., Bennett, D.A., Bensenor, I.M., Bente Kamal Tune, S.N., Benzian, H., Berezvai, Z., Bergami, M., Berhie, A.Y., Berihun, A.A., Bermudez, A.N.C., Bernabe, E., Bernstein, R.S., Bettencourt, P.J.G., Bhadoria, A.S., Bhagavathula, A.S., Bhala, N., Bhandari, J., Bhangdia, K., Bharadwaj, R., Bhaskar, S., Bhat, A.N., Bhat, A., Bhat, V., Bhattacharjee, P., Bhattacharjee, S., Bhatti, G.K., Bhatti, J.S., Bhatti, M.S., Bhatti, R., Bhuyan, S.S., Biadgilign, S.K., Bievel-Radulescu, R., Bilgin, C., Bilgin, C., Biroudian, S., Bisignano, C., Biswas, A., Biswas, B., Biswas, R.K., Bitar, A.N., Bitew, M., Bizzozero-Peroni, B., Bjertness, E., Blyth, F.M., Bodhare, T., Bodolica, V., Bodur, M., Bohn, L., Bokota, R., Bolarinwa, O.A., Bolla, S.R., Bolourinejad, P., Bonny, A., Boppana, S.H., Bora Basara, B., Bordbar, S., Borhany, H., Botero Carvajal, A., Bouaoud, S., Boufous, S., Bourne, R.R.A., Boxe, C., Bozic, M.M., Brahmaiah, J., Braithwaite, D., Breitborde, N.J.K., Brenner, H., Brewer, E.D., Britton, G., Brown, J., Browne, A.J., Brugha, T., Buchweitz, C., Bugiardini, R., Bui, L.P., Bulamu, N.B., Bunare, T.S., Buonsenso, D., Burhan, A., Burkart, K., Burns, R.A., Busch, F., Busse, R., Bustanji, Y., Butt, Z.A., Buxbaum, C., C J, S., Cagney, J., Cai, T., Cairns, R., Barsbay, M. Çakmak, Calina, D., Cámera, L.A., Campos, L.A., Campos-Nonato, I., Cao, F., Cao, Y., Capodici, A., Cárdenas, R., Carr, S., Carreras, G., Carrero, J.J., Carter, A., Carugno, A., Carvalho, A.F., Carvalho-e-Silva, A.P., Castaldelli-Maia, J.M., Castañeda-Orjuela, C.A., Castelpietra, G., Catapano, A.L., Cattaruzza, M.S., Caye, A., Cederroth, C.R., Cegolon, L., Cembranel, F., Cenderadewi, M., Cercy, K.M., Cerin, E., Cerrai, S., Cevik, M., Chakkere Shivamadhu, M., Chakraborty, C., Chakraborty, P.A., Chakraborty, S., Chandan, J.S., Chandika, R.M., Chandradasa, M., Chandrasekar, E.K., Chang, J.-C., Chattu, V.K., Chatzimavridou-Grigoriadou, V., Chau, L.D., Chaudhuri, S., Chaurasia, A., Chemeda, G.B., Chen, A.-T., Chen, C.S., Chen, G., Chen, H., Chen, H., Chen, H., Chen, J., Chen, M.X., Chen, S., Chen, S., Chen, X., Chen, Y., Cheng, H., Cheung, K.C., Chew, N.W., Chi, G., Chien, J.-H., Chimed-Ochir, O., Ching, P.R., Chirinos-Caceres, J.L., Chisari, C.G., Cho, W.C.S., Chong, B., Chong, Y.Y., Chou, H.I., Chowdhury, E.K., Chowdhury, M.A.K., Christensen, H., Christensen, S.W.M., Chu, D.-T., Chukwu, I.S., Chung, E., Chung, E., Chung, S.-C., Chung, S., Chutiyami, M., Cicero, A.F.G., Ciobanu, L.G., Cogen, R.M., Cohen, A.J., Columbus, A., Conde, J., Congly, S.E., Conrad, N., Conti, S., Corda, M.O., Corlateanu, A., Cortese, S., Cortesi, P.A., Cosma, C., Cousin, E., Cowart, E.J., Criqui, M.H., Crist, A., Cruz, J.A., Cruz-Martins, N., Cui, X., Culbreth, G.T., Dababo, N., Dabbagh, A., Dadras, O., Dahiru, T., Dai, X., Dai, Z., Dalakoti, M., Dalal, K., Dalla Costa, G., Damiani, G., D’Amico, E., Damtew, Y.T., Daniel, R.A.A., D’Anna, L., Danpanichkul, P., Darcho, S.D., Dardas, L.A., Darouei, B., Darvishi Cheshmeh Soltani, R., Dastiridou, A., Davey, G., Dávila-Cervantes, C.A., Davis Weaver, N., Davletov, D., Davletov, K., Davoudi, E., De La Hoz, F.P., De Luca, K., DeCleene, N.K., Dee, E.C., Deegan, O., Deekonda, S., Deen, A., Degenhardt, L., Dehesh, P., Deitesfeld, L., Dejenie, T.A., Delbari, P., Delsoz, M., Demeke, D., Demetriades, A.K., Demsie, D.G., Denova-Gutiérrez, E., Derese, T.N., Dergaa, I., Derseh, H.A., Dervišević, E., Desta, A.A., Devanbu, V.G.C., Devarakonda, P.K., Dewan, S.M.R., Dhali, A., Dhama, K., Dhamija, R.K., Dhane, A.S., Dhania, N.K., Dhimal, M.L., Dhimal, M., Dhingra, S., Dhungel, B., Di Pumpo, M., Dias Da Silva, D., Diaz, D., Diaz, L.A., Didehvar, K., Dillard, L.K., Dima, A., Ding, X., Dinkayehu, T.E., Do, H.P., Do, T.H.P., Dokova, K.G., Dolecek, C., Dominguez, R.-M.V., Dondi, F., D’Oria, M., Dorostkar, F., Doshi, O.P., Dourado, P.M.M., Dowou, R.K., Dresse, M.T., Driscoll, T.R., Dsouza, A.C., Dsouza, V.S., Du, J., Dube, J., Dumbili, E.W., Dumith, S.C., Dunne, J., Duraes, A.R., Duraisamy, S., Durojaiye, O.C., Dutta, A.K., Dziedzic, A.M., E’mar, A.R., Ebohon, O., Eboreime, E., Ebraheim, L.L.M., Ebrahimi, A., Ebrahimi, M.H., Ebrahimi, S., Ed-Dra, A., Edelduok, E.G., Edvardsson, K., Efendi, F., Eftekhari, B., Eghbali, F., Ehsani, F., Eighaei Sedeh, A., Eikemo, T.A., Eini, E., Ekholuenetale, M., Ekundayo, T.C., El Arab, R.A., El Omri, A., El Sayed Zaki, M., Eladl, M.A., Elahi, R., El-Ashker, S., Elbeshbeishy, R., Elemam, N.M., ElGohary, G.M.T., Elhadi, M., Elhoumed, M., El-Huneidi, W., Elkannishy, S., Elmeligy, O.A.A., Elmorsi, R., Elmoselhi, A.B., Elnaem, M.H., ELNahas, G., Elshaer, M., Elsohaby, I., Eltahawy, A.S.A., Emagneneh, T., Emeto, T.I., Emojevwe, V.O., Endeshaw, D., Endriyas, M., Erskine, H.E., Esezobor, C.I., Eshetu, D., Eshetu, H.B., Eshun, G., Eskandarieh, S., Eslami, M., Espírito Santo, R.C.D., Esposito, F., Estep, K., Estrada, C.A.M., Eva, F.N., Ezenwankwo, E., Fadaka, A.O., Fadavian, H., Fagbamigbe, A.F., Fahim, A., Fakhradiyev, I.R., Fakhri-Demeshghieh, A., Fan, Q., Farahmand, M., Faraon, E.J.A., Fareed, M., Farhana, Z., Farinha, C.S.E.S., Faris, M.E.M., Faro, A., Farooq, S.M.Y., Farooque, U., Farrokhpour, H., Farshad, F., Farsi, F., Faruk, M.O., Fasina, F.O., Fasina, M.M., Fasusi, E.T., Fatehizadeh, A., Fathi, D., Fatima, Z., Fazlzadeh, M., Fei, L., Feigin, V.L., Feizkhah, A., Fekadu, G., Feleke, B.E., Feng, D., Feng, K., Feng, X., Ferdous, T.R., Fereshtehnejad, S.-M., Fernandez-Jimenez, R., Ferrara, P., Ferrari, A.J., Ferreira, A., Ferreira, N., Feter, N., Finnemore, A., Fiorilla, C., Fischer, F., Fitriana, I., Flor, L.S., Fogacci, F., Folayan, M.O., Fonzo, M., Force, L.M., Fornari, A., Fornari, C., Forthun, I., Fortuna, D., Foschi, M., Fotouhi, M., Fowobaje, K.R., Foyet F, J.V., Franklin, R.C., Freitas, A., Fu, J., Fullman, N., Fux, B., G, S., Gaal, P.A., Gadeka, D.D., Gajdács, M., Galali, Y., Gallus, S., Ganapathy, D., Gangachannaiah, S., Ganie, M.A., Gao, D., Gao, X., Garba, B., Garcia, F.B., Garcia, V., Garcia-Argibay, M., Garcia-Azorin, D., Gardner, W.M., Garlasco, J., Gatzioufas, Z., Gautam, P., Gautam, R.K., Gazzelloni, F., Gebre, F.S., Gebregergis, M.W., Gebreslassie, H.G., Gelibter, S., George, N.S., Gerami Matin, A., Getahun, G.K., Gete, K.Y., Ghadimi, D.J., Ghadiri, K., Ghadirian, F., Ghaffari Jolfayi, A., Ghamari, S.-H., Ghamkhar, A., Ghandili, A., Ghasemi, M., Ghasemi, M.-R., Ghasemi Assl, S., Ghasrsaz, H., Ghazy, R.M., Ghimire, S., Ghith, N., Gholizadeh, N., Ghotbi, E., Gialluisi, A., Giannakis, K., Gibson, R.M., Gil, A.U., Gil, G.F., Gilani, S.A., Gilbertson, N.M., Gill, T.K., Ginindza, T.G., Giri, B.R., Girmay, A.A., Girombelli, A., Gnedovskaya, E.V., Göbölös, L., Gohari, K., Golechha, M., Goleij, P., Golestani, A., Golinelli, D., Golmohammadi, M., Gong, W., Gopalani, S.V., Goshu, Y.A., Goulart, A.C., Goyal, A., Grada, A., Graham, S.M., Grieco, V., Grivna, M., Grover, A., Guadie, H.A., Guan, S.-Y., Guan, Z., Guarducci, G., Gubari, M.I.M., Guha, A., Gunawardane, D.A., Guo, X., Guo, Z., Guo, Z., Guo, Z., Gupta, A.K., Gupta, H., Gupta, I., Gupta, L., Gupta, R.D., Gupta, R., Gupta, S., Gupta, V.B., Gupta, V.K., Gupta, V., Gupta, V.K., Guracho, Y.D., Gurmessa, L., Gutiérrez, R.A., Gutiérrez-Murillo, R.S., Guttoo, P., Guzman-Esquivel, J., Habibzadeh, A., Habteyes, A.T., Habteyohannes, A.D., Hadaro, T.S., Hadi, N.R., Hadian, Z., Hafiz, A., Haghdoost, F., Haghtalab, A., Hagins, H., Haile, D., Hailu, H.E., Halder, P., Halimi, A., Haller, S., Hama Aziz, K.H., Hamad, I.M., Hamadeh, R.R., Hamdy, N.M., Hameed, S., Hamilton, E.B., Hammoud, A., Hamza, M., Hamza, U.S., Han, H., Han Yekdeş, D., Hanif, A., Hanifi, N., Hankey, G.J., Hanna, F., Haque, A., Haque, M.A., Haque, M.N., Harapan, H., Harb, H.L., Harding, K.L., Hargono, A., Hariandja, A.M.A., Haro, J.M., Harris, A.A., Has, E.M.M., Hasaballah, A.I., Hasan, F., Hasan, M.K., Hasani, H., Hasanpour- Dehkordi, A., Hashem Zadeh, A., Hashempur, M.H., Hashim, N.T., Hasnain, A., Hassan, A., Hassan, I.N., Hassan, I., Hassan, N., Hassan Zadeh Tabatabaei, M.S., Hassani, S., Hassen, M.B., Hathagoda, L.W., Havmoeller, R.J., Hawat, A., Hayat, K., Hbid, Y., He, J., He, J., Hebert, J.J., Heidari, M., Hemmati, M., Henson, C.A., Herbert, M.E., Herteliu, C., Heuer, A., Hewage, S.A., Heydari, M., Heydarifard, Z., Hezam, K., Hiraike, Y., Holla, R., Hon, J., Hossain, A., Hossain, L., Hossain, M.B., Hossain, M.M., Hossain, M.S., Hossain, M.B., Hosseinzadeh, H., Hosseinzadeh, M., Hostiuc, M., Hostiuc, S., Houser, J.A., Htay, M.N.N., Hu, C., Hu, Y., Huang, J., Huang, W., Huang, Y., Huda, M.H., Human, A.I., Humphrey, K.M., Hushmandi, K., Husøy, A.K., Hussain, J., Hussain, M.A., Hussain, S., Hussein, D., Hussein, N.R., Husseiny, M.I., Huynh, H.-H., Hwang, B.-F., Iannone, L.F., Ibrahim, A., Ibrahim, K.S., Ibrahim, R., Ibrahim, R., Ibrayeva, A., Idalsoaga, F.J., Iftikhar, P.M., Ihler, A.L., Ikeda, N., Ikiroma, A., Ikram, J., Ilesanmi, O.S., Ilic, I.M., Ilic, M.D., Ilyas, M.H., Imam, M.T., Imani, M., Immurana, M., Imoh, L.C., Inbaraj, L.R., Inok, A., Iqbal, M., Irham, L.M., Isa, M.A., Islam, D.M.S., Islam, M.R., Islam, M.S., Islami, F., Ismail, F., Ismail, N.E., Ismoldayev, Y., Iso, H., Isola, G., Ituka, M.C., Iwagami, M., Iwu-Jaja, C.J., Iyamu, I.O., Iyer, M., Iyer, V.J., J, V., Jaafari, J., Jacob, L., Jacobsen, K.H., Jadidi, A., Jadidi-Niaragh, F., Jafarinia, M., Jaffar, S., Jahrami, H., Jairoun, A.A., Jaiswal, V., Jakovljevic, M., Jaliliyan, A., Jalilzadeh Yengejeh, R., Jalloh, M., Jamal, A., Jamal, Q.M.S., Jamaluddin, J., James, J., James, T.G., Jamil, H., Jamil, S., Jamora, R.D.G., Jamshidi, M., JamshidiRastabi, S., Janardhanan, R., Jarrahi, E., Javaid, S.S., Javanmardi, A., Javidnia, J., Jawaid, T., Jawell Odah Abed, Q., Jayasinghe, R.D., Jayasinghe, Y.A., Jayatilleke, A.U., Jazi, K., Jebasingh, F.K., Jee, S.H., Jeganathan, J., Jember, T.H., Jena, B.H., Jena, D., Jeong, S., Jessri, M., Jeswani, B.M., Jha, V., Ji, Z., Jiang, M., Jin, W., Jin, W., Johnson, C.O., Johnson, E.K., Jokar, M., Jonas, J.B., Joo, T., Jor, A., Joseph, A., Joseph, A., Joseph, N., Joshua, C.E., Joukar, F., Joy, G., Jozwiak, J.J., Jürisson, M., Juweid, M.E., K, M., Kaambwa, B., Kabir, Z., Kadir, D.H.H., Kahn, E.M., Kakkar, A.K., Kalankesh, L.R., Kalavani, K., Kaliyadan, F., Kaliyakparova, A., Kalra, S., Kamal, M.M., Kamal, M., Kamarajah, S.K., Kamath, R., Kamenova, S., Kamireddy, A., Kamorudeen, R.T., Kamyshnyi, O., Kan, H., Kanaan, M., Kanaan, S.F., Kang, J., Kankam, S.B., Kanmodi, K.K., Kannan, S., Kannan S, S., Kantar, R.S., Kapoor, N., Kar, S.K., Karakasis, P., Karasneh, R.A., Karimi, H., Karimi Behnagh, A., Karkhah, S., Karobari, M.I., Karpiński, T.M., Kashyap, M.K., Kaso, A.W., Kasraei, H., Kassaw, N.A., Katamreddy, A., Katoto, P.D., Kauppila, J.H., Kayode, G.A., Kazemi Rad, N., Keivanlou, M.-H., Keiyoro, P.N., Keke, C., Kempen, J.H., Kerai, S., Keshri, V.R., Keshtkar, K., Kesse-Guyot, E., Khademi, R., Khader, Y.S., Khaing, I.K., Khajuria, H., Khalid, S., Khalid-Ariturk, S., Khalifa, H.O., Khalifeh, A.H., Khalil, A.A., Khalil, M., Khalili, A., Khalili, P., Khalili-Tanha, G., Khalis, M., Khamesipour, F., Khan, A.A., Khan, A., Khan, A., Khan, F.U., Khan, M., Khan, M.A.S., Khan, M.I., Khan, M.J., Khan, M.H., Khan, M.M., Khan, M.U., Khan, M.U., Khan, N., Khan, R., Khan, S.A., Khan, S., Khan, S., Khan, Y.S., Khan, Z., Khanal, S., Khanal, V., Khanmohammadi, S., Khasbage, S.U., Khashim, Z., Khatab, K., Khatatbeh, H., Khatatbeh, M.M., Khatri, K., Khayat Kashani, H.R., Khazaei, A., Kheirandish Zarandi, P., Khokhar, S.K., Khonji, M.S., Khoshnaw, N.S.H., Khosla, A.A., Khosravi, F., Khosrowjerdi, M., Khuman, P.R., Khusun, H., Kifle, Z.D., Kim, H.J., Kim, J., Kim, M.S., Kim, S., Kimokoti, R.W., Kinfu, Y., Kirk, M., Kisa, A., Kisa, S., Kissimova-Skarbek, K., Kivimäki, M., Klusty, J., Km, A.B., Km, S., Knudsen, A.K.S., Kobyliak, N., Kocarnik, J.M., Kochhar, S., Kokkorakis, M., Kolahi, A.-A., Kolieghu Tcheumeni, D.G., Kompani, F., Kondybayeva, A., Konstas, A.G.P., Koomson, I., Koren, G., Kormoker, T., Korzh, O., Kostev, K., Kotsis, K., Koul, A., Koul, P.A., Koulmane Laxminarayana, S.L., Kretchy, I.A., Kretchy, J.-P., Krishan, K., Kua, C.-H., Kuanar, A., Kuate Defo, B., Kuchay, R.A.H., Kucuk Bicer, B., Kuddus, M., Kuitunen, I., Kujan, O., Kujur, A., Kulimbet, M., Kulkarni, V., Kulshreshtha, S., Kumar, D., Kumar, D., Kumar, J., Kumar, M., Kumar, N., Kumar, N., Kumar, R., Kumar, S.K., Kumar, T., Kumar, V., Kumaran, S., Kunjavara, J., Kunutsor, S.K., Kurmanova, A., Kurmi, O.P., Kurniasari, M.D., Kurpad, K.P., Kushawaha, P.K., Kusnali, A., Kustanti, C.Y., Kusuma, D., Kutluk, T., Kuttybayev, A., Kwarteng, M.A., Kwong, W.H.P., Kyei, E.F., Kyei, G.K., Kytö, V., Kyu, H.H., L C, P., La Vecchia, A., La Vecchia, C., Ladan, M.A., Laflamme, L., Lahariya, C., Lai, D.T.C., Lakhani, A., Lal, D.K., Lalloo, R., Lallukka, T., Lám, J., Landires, I., Langguth, B., Laplante-Lévesque, A., Lasrado, S., Latief, K., Lau, K.K.L., Lawal, B.K., Lawal, B.K., Lawal, S.A., Lawan, A., Lawford, H.L.S., Lawlor, H.R., Le, D.Q., Le, D.H., Le, H.-H., Le, L.K.D., Le, M.H.N., Le, N.H.H., Le, T.T.T., Le, T.D.T., Ledda, C., Lee, H.A., Lee, S.W., Lee, W.-C., Lee, Y.H., Leigh, J., Leivaditis, V., Lennon, M.J., Leonardi, M., Leong, E., Leung, J., Li, C., Li, H., Li, H., Li, J., Li, J., Li, J., Li, J., Li, M.-C., Li, P., Li, S., Li, W.-Z., Li, W., Li, W., Li, W., Li, W., Li, X., Li, Y., Li, Y., Li, Z., Li, Z., Lian, Y., Liang, X.-Z., Lim, S.S., Lin, J., Lin, Q., Lin, R.-T., Lin, Y., Lindholm, D., Linehan, C., Ling, Y., Liu, G., Liu, H., Liu, J., Liu, X., Liu, X., Liu, X., Liu, Y., Liu, Y., Llanaj, E., Loftus, M.J., Lohner, V., López-Gil, J.F., Lopukhov, P.D., Lorkowski, S., Lotfizadeh, M., Luan, S., Lubinda, J., Lucas, T., Lucchetti, G., Lugo, A., Lunevicius, R., Luo, P., Lusk, J.B., Lutambi, A.M., Lutzky Saute, R., Lytras, M.D., Lytvyak, E., M Amin, H.I., Ma, K.S.-K., Ma, Z.F., Mabrok, M., Machado, I.E., Madadi, F., Madinezad, S.A., Madsen, C., Madureira-Carvalho, A.M., Magdy Abd El Razek, M., Maghazachi, A.A., Mahadeshwara Prasad, D.R., Mahalingam, S., Mahalleh, M., Mahmood, N.H., Mahmoudi, A., Mahmoudi, F., Mai, M.T., Maiti, R., Majeed, A., Makris, K.C.C., Malekpour, M.-R., Malekzadeh, R., Malhotra, H.S., Malik, A.A., Malik, F., Malik, T., Malta, D.C., Mamun, A.A., Mangdow, M., Manjani, L., Manla, Y., Mannethodi, K., Mansoor, F., Mansourian, M., Mansournia, M.A., Mantilla Herrera, A.M., Mantovani, L.G., Mao, C., Maqbool, T., Maqsood, S., Marateb, H.R., Maravilla, J.C., Margetis, K., Marino, M., Marques, A., Martin, R.V., Martinez, G., Martinez-Guerra, B.A., Martinez-Piedra, R., Martini, D., Martins-Melo, F.R., Martorell, M., März, W., Marzo, R.R., Marzouk, S., Masi, S., Matei, C.N., Mathangasinghe, Y., Mathieson, S., Mathioudakis, A.G., Mathur, M.R., Mathur, M., Matozinhos, F.P., Mattiello, R., Mattoo, K.A., Maude, R.J., Maulik, P.K., May, M.L., Mayeli, M., Mazaheri, M., Mazzotti, A., Mbachu, C.N.P., Mbachu, I.I., McKee, M., McLaughlin, S.A., McPhail, S.M., Mechili, E.A., Mediratta, R.P., Meena, J., Meftah, E., Mehari, M., Mehmood, A., Mehndiratta, M.M., Mehrabi Nasab, E., Mehta, K.M., Mehta, V., Mehto, S., Meier, T., Mekene Meto, T., Meles, H.N., Melese, E.B., Melwani, S., Memetova, A., Mendoza, W., Menezes, G.A., Menezes, R.G., Mengistie, B.A., Mengistie, E.A., Meo, S.A., Mercogliano, M., Meretoja, A., Meretoja, T.J., Mestrovic, T., Mettananda, C.D.K., Mettananda, S., Metwally, M.M.M., Mewton, L., Mhlanga, A., Michelerio, A., Micheletti Gomide Nogueira De Sá, A.C., Mideksa, H.S., Miller, P.A., Miller, T.R., Minervini, G., Ming, W., Mini, G., Mirghafourvand, M., Mirrakhimov, E.M., Mirshahvalad, S.A., Mirutse, M.K., Mirzaei, Y., Mishra, A., Mishra, K.G., Mishra, V., Misra, A.K., Mitchell, P.B., Mithra, P., Mitra, S., Mittinty, M.M.M., Moazeni, M., Mobayen, M., Moberg, M.E., Modi, S., Mohamadkhani, A., Mohamed, J., Mohamed, M.G., Mohamed, N.S., Mohamed Ahmed, K.A.H., Mohammad, T., Mohammad-Alizadeh-Charandabi, S., Mohammadi, A., Mohammadi, M.R., Mohammadi, S.O., Mohammadian-Hafshejani, A., Mohammadzadeh, I., Mohammadzadeh, R., Mohammed, A.S., Mohammed, H., Mohammed, O., Mohammed, S., Mohammed, S., Mohammed, Y., Mohan, S., Mohanta, Y.K., Mohseni, M., Mokari-Yamchi, A., Mokdad, A.H., Mokhirev, A., Mokhtarzadehazar, P., Molinaro, S., Mollaei, A., Momani, S., Monasta, L., Monazzami, A., Mondal, H., Mondello, S., Montasir, A.A., Moore, C.E., Moradi, Y., Moradi-Lakeh, M., Moraga, P., Morawska, L., Moreira, R.S., Morgan, B.W., Morovatdar, N., Morovvati, M., Morsy, M.M., Morze, J., Mosaddeghi Heris, R., Mosser, J.F., Motamedgorji, N., Mougin, V., Mouodi, S., Mousavi, A., Mousavi, S.Z., Mousavi Khaneghah, A., Mousavi Kiasary, S.M.S., Mousnad, M.A.A., Movo, A., Mowafy, H.L., Mozahheb Yousefi, K., Mrejen, M., Msherghi, A., Mubarak, R., Mubarik, S., Mudgal, S.K., Muhammad, S.A., Muhtar, M.S., Mukherjee, S., Mukherjee, S., Mukhopadhyay, A., Mukhopadhyay, S., Muktadir, M.A., Mulatu, S., Mulita, F., Mulu, G.B., Mulugeta, C., Mulyadi, M., Muneer, M.A., Muniyandi, M., Munjal, K., Munkhsaikhan, Y., Muñoz Laguna, J., Munshi, A., Muragundi, P.M., Murakami, M., Muse, Y.H., Mushtaq, A., Mustafa, G., Mustafa, S.I., Mustapha, M.T., Muthu, S., Muthupandian, S., Muvunyi, C.M., Muzaffar, M., Myung, W., Nabavi, A., Naddafi, F., Nagarajan, A.J., Nagaraju, S.P., Naghavi, M., Naghavi, P., Naik, G.R., Naik, G., Naik, H., Nainu, F., Nair, S., Najdaghi, S., Nakhostin Ansari, N., Nam, P., Nangia, V., Nansseu, J.R., Naqid, I.A., Nargus, S., Narimani Davani, D., Nartey, Y., Nascimento, B.R., Nascimento, G.G., Naser, A.Y., Naser, M., Nashwan, A.J., Nasiri, H., Nassar, M., Natto, Z.S., Nauman, J., Naureen, Z., Navaratna, S.N.K., Nawaz, A., Nawaz, M.O., Nayak, B.P., Nayak, S.G., Nazari, J., Nchanji, G.T., Ndejjo, R., Ndungu, A.W., Nega, A.T., Negash, A.A., Negoi, I., Negoi, R.I., Negru, A.G., Nejati, J., Nejjari, C., Nepal, S., Nesbit, O.D., Netsere, H.B., Newton, C.R.J., Ng, M., Nguefack-Tsague, G., Ngunjiri, J.W., Nguyen, A.T.H., Nguyen, C.T., Nguyen, H.L.T., Nguyen, H.-D.T., Nguyen, N.P., Nguyen, P.T., Nguyen, T.P., Nguyen, T., Nguyen, T.A., Nguyen, V.T., Ngwa, A.M., Niazi, R.K., Nie, J., Nieddu, L., Nigatu, Y.T., Nikoobar, A., Ningrum, D.N.A., Niranjan, V., Nisro, A.M., Nkeck, J.R., Nkrumah-Boateng, P.A., Nnaji, C.A., Noman, E.A., Nomura, S., Noor, S.T.A., Noorafrooz, M., Noormohammadpour, P., Noreen, M., Noroozi, M., Noubiap, J.J., Noyes, T., Nriagu, V.C., Nri-Ezedi, C.A., Nshimiyimana, J.C., Nugen, F., Nugusa, A.N., Nunemo, M.H., Nur, A., Nurrika, D., Nyadanu, S.D., Nyande, F.K., Nzoputam, C.I., Nzoputam, O.J., Oancea, B., Obaido, G., O’Connell, E.M., Odama, A.M., Odat, R.M., Oddi, F.M., Odetokun, I.A., Odukoya, O.O., Oduro, J.K., Oduro, M.S., Oghenetega, O.B., Ogundijo, O.A., Ogunkoya, A., Oguta, J.O., Oh, D., Oh, S., O’Hagan, E.T., Okati-Aliabad, H., Okeke, S.R., Okeke-Obayemi, D.O., Okekunle, A.P., Okesanya, O.J., Okoli, O.A., Okonji, O.C., Okunlola, J.O., Okunlola, O.A., Olabisi, O.I., Olagunju, A.T., Olalusi, O.V., Olatubi, M.I., Oliveira, A.B., Oliveira, G.M.M., Olorukooba, A.A., Olson, E.J., Oludoye, O.O., Olum, R., Olusanya, B.O., Olusanya, J.O., Oluwole, O.G., Omage, F.B., Omar, H.A., Omer, G.L., Ong, Q.C., Onie, S., Onwujekwe, O.E., Opara, F., Opitz, M., Ordak, M., Orish, V.N., Ornello, R., Orscelik, A., Ortiz, A., Ortiz-Prado, E., Osborne, A., Osei, E., Ostroff, S.M., Ostrominski, J.W., Osuagwu, U.L., Osuolale, O., Otchere, G., Othman, E.H., Othman, M.M., Otoiu, A., Otorkpa, O.J., Oumer, A., Ouner, J.J., Ouyahia, A., Ouyang, G., Owolabi, M.O., Owusu, I.A., Oyebola, K., Oyelade, T., Oyeyemi, O.T., Ozsahin, I., P A, M., Pacheco-Barrios, K., Padda, I., Padron-Monedero, A., Padubidri, J.R., Pak, A., Pal, P.K., Palicz, T., Palladino, R., Palma-Alvarez, R.F., Paluvai, T., Pan, F., Pan, H.-F., Panahi, P., Panda, S.K., Panda-Jonas, S., Pande Katare, D., Pang, K., Pangaribuan, H.U., Panos, G.D., Panos, L.D., Pantazopoulos, I., Paolino, G., Papa, M.V., Papadimopoulos, I., Papadopoulou, P., Parekh, U., Parhizkar Roudsari, P., Parida, A., Park, C., Park, E.-K., Park, S., Parmar, A., Parve, S., Pashaei, A., Passera, R., Patel, B.H., Patel, H.M., Patel, M., Patel, N.N., Patel, S., Patil, A., Patil, S., Patoulias, D., Patra, A., Patwary, M.H., Paul, H., Pawar, S., Pawar, S., Pazoki Toroudi, H., Peden, A.E., Pedersini, P., Pekarcikova, J., Pepito, V.C.F., Peprah, P., Perdigão, J., Pereira, G., Pereira, M.O., Perez-Lopez, P., Perico, N., Perna, S., Pesudovs, K., Petakh, P., Peter, O.J., Petermann-Rocha, F.E., Pham, H.N., Pham, N.T., Pham, T.T., Philip, A.K., Phillips, M.R., Phyo, Z., Pickering, B.V., Pigott, D.M., Pillay, J.D., Pinheiro Rocha, L.P., Piracha, Z.Z., Piradov, M.A., Pirera, E., Pisoni, E., Plass, D., Plotnikov, E., Podder, I., Poddighe, D., Polibin, R.V., Pollner, P., Poluru, R., Pon Avudaiappan, A., Pond, C.D., Ponkilainen, V.T., Popa, I., Popova, S., Popovic, D.S., Postma, M.J., Pourasghary, S., Pourbabaki, R., Pourghazi, F., Poursadeqiyan, M., Pourtaheri, N., Prabhu, A.R., Prada, S.I., Pradhan, J., Pradhan, P.M.S., Pradipta, R.O., Prakash, P.Y., Prasad, C.P., Prashant, A., Prates, E.J.S., Priscilla, T., Pritchett, N., Priya, H., Purnobasuki, H., Purohit, B.M., Puvvula, J., Qasim, N.H., Qi, X., Qi, Z., Qiu, J.-Y., Quazi, Z.S., Qurashi, S.N., R, D., Rabiee, N., Rachmat, B., Radhakrishnan, R.A., Radhakrishnan, V., Radojčić, M.R., Raeisi Shahraki, H., Rafique, I., Raghav, P., Raghuveer, P., Rahbarnia, L., Rahim, F., Rahim, H.M.-A., Rahimi, S., Rahimi-Movaghar, A., Rahimi-Movaghar, V., Rahman, F.M., Rahman, M., Rahman, M., Rahman, M.M., Rahman, M.H.U., Rahman, M.M., Rahman, M., Rahmani, S., Rahmati, M., Rahmatpour Rokni, G., Rahmoune, H., Rai, P., Raimondo, D., Raimondo, I., Raina, S.K., Raj, J.P., Raja, A., Raja, S., Rajaa, S., Rajabi, E., Rajai Firouzabadi, S., Rajendran, G., Rajendran, J., Rajendran, V., Rajindrajith, S., Rajizadeh, M.A., Rajput, P., Ramadan, M.M., Ramadan, M., Ramadhan, K., Ramasamy, C., Ramasamy, S.K., Ramazanu, S., Ramezani, Z., Ramezani Farani, M., Ramteke, P.W., Rana, J., Rana, S.S., Ranabhat, C.L., Rancic, N., Rani, S., Ranjbar Noei, F., Rao, C.R., Rao, K., Rao, M., Rao, S.J., Rasella, D., Rashedi, V., Rashidi, M.-M., Rasouli, M.A., Rasouli-Saravani, A., Rastogi, P., Rasul, A., Rathish, D., Rauf, A., Rauniyar, S.K., Rautalin, I., Ravangard, R., Ravi, D., Rawaf, D.L., Rawaf, S., Rawassizadeh, R., Rawat, R., Ray, A., Rayati, M., Razeghian, I., Razi, B., Razo, C., Recenti, F., Reddy, M.M.R.K., Redwan, E., Rege, S., Rehman, W., Reifels, L., Remuzzi, G., Ren, L., Renzaho, A.M.N., Resnikoff, S., Reyes, L.F., Rezaei, M., Rezaei, N., Rezaei, N., Rezaei, N., Rezaeian, M., Rhee, T.G., Riaz, M.A., Ribeiro, A.L.P., Rickard, J., Rizvi, M.R., Robinson-Oden, H.E., Rocha, H.A.L., Rocha-Gomes, J.R., Rodrigues, M., Roever, L., Rohloff, P., Rohmah, I., Röhr, S., Rojas-Rueda, D., Rolfzen, M.L., Romadlon, D.S., Romoli, M., Romozzi, M., Ronfani, L., Rosauer, J.J., Roshanshad, A., Rostamian, M., Roth, G.A., Rotimi, K., Rout, H.S., Rouzbahani, H., Rouzbahani, R., Rouzbahani, S., Roy, B., Roy, N., Roy, P., Roy, P., Roy, P., Roy, S., Roy, S., Roy Chowdhury, S., Royapuram Parthasarathy, P., Rubagotti, E., Ruela, G.D.A., Rumisha, S.F., Russo, M., Rwegerera, G.M., S, M., S N, C., Saad, A.M.A., Saad Eddin, A., Saadatian, Z., Saber-Ayad, M.M., Sabet, C.J., Sabour, S., Sadarangani, K.P., Sadat Rafiei, S.K., Saddik, B.A., Sadee, B.A., Sadegh, T., Sadeghi, E., Sadeghi, E., Sadeghi-Ghyassi, F., Saeed, M., Saeed, U., Saeedi, M., Safari, M., Safi, S., Safi, S.Z., Sagar, R., Sagharichi, M., Sagoe, D., Saha, N., Saheb Sharif-Askari, F., Saheb Sharif-Askari, N., Sahebkar, A., Sahoo, P.M., Sahu, K.S., Said, M.S., Saif, Z., Sajadi, S.M., Sajib, M.R.U.Z., Sajid, M.R., Saki, M., Salam, N., Salamati, P., Salaroli, L.B., Saleh, M.A., Salehi, L., Salehi, M., Salem, M.R., Salem, M.Z.Y., Salihu, D., Salimi, S., Sallam, M., Salum, G.A., Salvi, S.S., Samadi Kafil, H., Samaranayake, J.E., Sami, W., Samodra, Y.L., Samuel, V.P., Samy, A.M., Sangle, S.G., Sanjari, E., Sankar, S., Sanmarchi, F., Sanna, F., Santos, L.H.C.C., Santric-Milicevic, M.M., Sao Jose, B.P., Sapkota, K.P., Saraswathy, S.Y.I., Sarfo, J.O., Sarikhani, Y., Sarma, H., Sarmadi, M., Sarode, G.S., Sarode, S.C., Saroshe, S., Sassano, M., Sathian, B., Sathya Narayanan, M.K., Saunders, P.A., Savabi Far, M., Sawhney, M., Saxena, S.G., Saya, G.K., Sayeed, A., Saylan, M., Schinckus, C., Schneider, I.J.C., Schneider, R.D., Schuermans, A., Schumacher, A.E., Schwarz, G., Schwebel, D.C., Schwendicke, F., Schwinger, C., Sedigh, A., Sekaran, S., Šekerija, M., Selvamani, M., Selvaraj, V., Semenova, Y., Semreen, M.H., Sendeku, F.W., Senol, Y.C., Senthilkumaran, S., Sepanlou, S.G., Serban, A.C., Serván-Mori, E., Sethi, Y., Sewor, C., Seyed Alshohadaei, S.M., Seylani, A., Seymour, M., Shadid, J., Shah, N.S., Shah, S., Shaharudin, S., Shahbaz, M., Shahid, S., Shahid, S.A., Shahid, W., Shahini, E., Shahrahmani, F., Shahsavari, H.R., Shahwan, M.J., Shaikh, M.A., Shakeri, A., Shakerimoghaddam, A., Shalash, A.S., Sham, S., Shamim, M.A., Shams, F., Shams-Beyranvand, M., Shamshirgaran, M.A., Shamsi, A., Shamsutdinova, A., Shan, D., Shankar, A., Shannawaz, M., Shao, X., Sharifan, A., Sharifi Rad, J., Sharma, A., Sharma, B.K., Sharma, B., Sharma, K., Sharma, M., Sharma, S., Sharma, U., Sharma, V., Shastry, R.P., Shastry, S., Shavandi, A., Shawahna, R., Shayan, M., Shehu Bappah, B., Sheidaei, A., Shenoy, S.M., Sherchan, S.P., Shetty, S.S., Shi, F., Shi, L.-H., Shibani, M., Shibesh, B.F., Shibuya, K., Shiferaw, D., Shimul, M.M.H., Shin, J.I., Shin, M.-J., Shiri, R., Shirkoohi, R., Shittu, A., Shitu, A.O., Shiue, I., Shivarov, V., Shlobin, N.A., Shojaei, S., Shokati Eshkiki, Z., Shokri, A., Shongwe, S.N., Shool, S., Shorofi, S.A., Shrestha, G., Shrestha, S., Shuval, K., Sibuyi, N.R.S., Siddig, E.E., Sidiq, M., Siegel, M., Silva, D.A.S., Silva, G.C.B.D., Silva, J.P., Silva, J.C., Silva, L.M.L.R., Silva De Leonardi, N.J.B., Simkhada, P.P., Singh, A., Singh, A., Singh, A., Singh, B., Singh, B.P., Singh, H., Singh, H., Singh, J., Singh, J.A., Singh, K., Singh, L., Singh, N.P., Singh, P., Singh, P.S., Singh, P.K., Singh, P., Singh, R.K., Singh, S., Singh, S., Singh, S., Sinha, M.K., Sinha, R., Sinto, R., Sirota, S.B., Skou, S.T., Sleet, D.A., Slepak, E.L.N., Sobia, F., Sohel, M., Sohrabi, S., Sokhal, B.S., Solanki, R., Solikhah, S., Soliman, S.S.M., Song, W., Song, Y., Sood, A., Sood, P., Soraneh, S., Sorensen, R.J.D., Soriano, J.B., Sorrentino, M., Sousa, F., Sousa, M.A., Soylu, C., Spartalis, M., Spearman, S., Sra, M.S., Sreeramareddy, C.T., Srichawla, B.S., Srinivasamurthy, S.K., Sriram, S., Stafford, L.K., Stanaway, J.D., Starodubova, A.V., Ştefan, S.C., Stein, C., Stein, D.J., Steiner, C., Steiner, T.J., Steinmetz, J.D., Steiropoulos, P., Stevanović, A., Stockfelt, L., Stovner, L.J., Straif, K., Stubbs, P., Su, Y., Subasi, O., Subedi, N., Suemoto, C.K., Suhag, A., Sui, L., Sukaew, T., Sulaiman, S.K., Suleiman, A.G., Suleiman Odidi, M., Suleman, M., Sulistiyorini, D., Sullman, M.J.M., Sultan Meo, A., Sun, H.Z., Sun, J., Sun, M., Sun, X., Sun, Z., Sun, Z., Sundaragiri, S., Sundaram, T., Sundström, J., Sunkersing, D., Sunny, S., Suresh, V., Swain, C.K., Swart, V.M., Syaiful, D.A., Szarpak, L., Szeto, M.D., T Y, S.S., Tabaee Damavandi, P., Tabarés-Seisdedos, R., Tabatabaeizadeh, S.-A., Tabatabai, S., Tabche, C., Tabibi, R., Tabish, M., Tadakamadla, J., Tadakamadla, S.K., Tafida, B.A., Taghizadeh-Hesary, F., Taheri Abkenar, Y., Taheri Soodejani, M., Taherkhani, A., Taiba, J., Tajabadi, S., Talaat, I.M., Talic, S., Talukder, B., Tampa, M., Tamuzi, J.L., Tan, J., Tan, K.-K., Tanabayeva, S., Tang, H., Tantisattamo, E., Tarigan, I.U., Tariku, M.K., Tariq, S., Tariqujjaman, M., Tat, N.Y., Tavakoli Oliaee, R., Tavakoly, R., Tavangar, S.M., Tedla, M.G., Tefera, A.T., Teimoori, M., Temsah, M.-H., Teply, C., Teramoto, M., Tesfaye, A.H., Tesfu, A.A., Tewari, J., Teymouri, A., Thaher, O., Thangaraju, P., Thankappan, K.R., Thapar, R., Tharwat, I., Tharwat, S., Theyra-Enias, H., Thind, M.K., Thirunavukarasu, A.J., Thiruvengadam, M., Thiruvengadam, R., Thiyagarajan, A., Thomas, N., Thota, G.P., Tian, W., Ticoalu, J.H.V., Tiruye, T.Y., Tleshev, M., Tolani, M.A., Tomo, S., Tonelli, M., Topor-Madry, R., Torkashvand, A., Touvier, M., Tovani-Palone, M.R., Trabelsi, K., Traini, E., Tran, M.T.N., Tran, N.M., Tran, N.H., Tran, Q.T.H., Tran, T.Q.M., Tran, T.H., Tran Minh Duc, N., Trico, D., Trihandini, I., Tromans, S.J., Truong, Q.X.N., Truyen, T.T.T.T., Tsatsakis, A., Tse, G., Tsermpini, E.E., Tudor Car, L., Tuffour Amirikah, M., Tumurkhuu, M., Tuo, Z., Tye, S.C., Udoakang, A.J., Ullah, A., Ullah, H., Ullah, I., Ullah, S., Umair, M., Umapathi, K.K., Umar, L., Umar, M., Umar, M., Umar, S.S., Underwood-Nakamura, A., Upadhya, D., Upadhyay, E., Uppal, D., Urso, D., Usman, J.S., Uzor, K.J., Uzun Ozsahin, D., Uzunçıbuk, H., Vadagam, P., Vahdati, S., Vaithinathan, A.G., Vakili, O., Vakilian, A., Valdez, P.R., Valenti, M., Valizadeh, G., Van Den Eynde, J., Van Der Walt, G., Van Donkelaar, A., Varasteh, J., Varma, R.P., Vart, P., Vasankari, T.J., Vasishta, S., Vasudevan, S.S., Veginadu, P., Vella, A.S., Vellingiri, B., Venketasubramanian, N., Venkidasamy, B., Verma, M., Verma, P., Veroux, M., Verras, G.-I., Vervoort, D., Vidale, S., Villa, S., Villafañe, J.H., Villarreal-Zegarra, D., Violante, F.S., Vipparthy, S.C., Visontay, R., Vitorino, L.M., Vlassov, V., Vojtek, M., Vollset, S.E., Vongpradith, A., Vosoughi, M., Vounzoulaki, E., Vu, H.N., Vu, L., Waheed, Y., Wahidin, M., Walia, M., Wamai, A.W., Wan, J.-Y., Wang, C., Wang, F., Wang, L., Wang, L., Wang, R., Wang, S., Wang, S., Wang, W., Wang, X., Wang, X., Wang, Y., Wang, Y., Wang, Y.-P., Wang, Z., Wani, T.A., Wanjau, M.N., Waqar, A.B., Waqas, M., Ward, P., Wassie, T.H., Weerakoon, K.G., Weerasekara, I., Wei, F.-L., Wei, X., Weintraub, R.G., Weiss, D.J., Weiss, E.J., Wen, Y.F., Werdecker, A., Westerman, R., Whisnant, J.L., Whiteford, H.A., Wiangkham, T., Wibowo, Y.C., Wicaksana, A.L., Wickramasinghe, D.P., Wickramasinghe, N.D., Wiebe, S., Wilandika, A., Willeit, P., Wilson, S., Wireko, A.A., Wirtu, G.K., Wiysonge, C.S., Woday, A.T., Wojewodzic, M.W., Wolf, A.W., Wonde, T.E., Wondmeneh, Y.C., Worede, D.T., Worku, M.C., Worku, N.K., Wu, A.-M., Wu, C., Wu, F., Wu, J.F., Wu, J., Wu, J., Wu, S.-N., Wu, Z., Wubie, Y.M., Xia, Y., Xia, Z., Xiao, G., Xiao, H., Xiao, N., Xie, W., Xing, H., Xu, S., Xu, S., Xu, W., Xu, X., Xu, X., Yadav, M.K., Yadav, V., Yadollahi, M., Yaghoubi, S., Yahoo (Syed), S., Yahya, G., Yamagishi, K., Yan, G., Yang, H., Yang, W., Yang, X., Yano, Y., Yao, H., Yao, L., Yarahmadi, A., Yasin, H., Yassin, M.A., Yasufuku, Y., Yaya, S., Ye, P., Yeganeh, M., Yekdeş, A.C., YektaKooshali, M.H., Yergaliyev, K.A., Yesodharan, R., Yesuf, S.A., Yezli, S., Yi, S., Yigezu, M., Yigzaw, Z.A., Yin, D., Yin, Y., Yip, P., Yismaw, M.B., Yismaw, Y.E., Yon, D.K., Yonemoto, N., Younis, M.Z., Yousuf, A., Yu, C., Yu, J., Yu, Y., Yuh, F.H., Yunus, G., Yunusa, U., Yusuf, A.A., Yuwanati, M., Zadey, S., Zadnik, V., Zafar, M., Zaghampour, M., Zainal Abidin, E., Zakham, F., Zaki, N., Zamagni, G., Zaman, B.A., Zaman, S.B., Zamani, A.S., Zamora, N., Zanghì, A., Zar, H.J., Zarea, K., Zawiah, M., Zeariya, M.G.M., Zenebe, A.M., Zensen, S., Zeru, E.M., Zhan, T., Zhan, Y., Zhang, B., Zhang, C.J.P., Zhang, H., Zhang, J., Zhang, L., Zhang, M., Zhang, X., Zhang, Y., Zhang, Z., Zhao, J., Zhao, S., Zhao, Z., Zheng, J., Zheng, M.-H., Zheng, P., Zhong, C.C., Zhou, J., Zhou, J., Zhou, M., Zhu, B., Zhu, Z., Zhumagaliuly, A., Zielińska, M., Zihao, L., Zoghi, G., Zoromba, M.A., Zou, Z., Zrieq, R.M., Zuhlke, L.J., Zuhriyah, L., Zumla, A., Zyoud, A.H., Zyoud, S.H., Zyoud, S.H., Brauer, M., Vos, T., Murray, C.J.L., Gakidou, E., 2025. Burden of 375 diseases and injuries, risk-attributable burden of 88 risk factors, and healthy life expectancy in 204 countries and territories, including 660 subnational locations, 1990–2023: A systematic analysis for the</w:t>
+      </w:r>
+      <w:r>
+        <w:t xml:space="preserve"> </w:t>
+      </w:r>
+      <w:r>
+        <w:t xml:space="preserve">Global Burden</w:t>
+      </w:r>
+      <w:r>
+        <w:t xml:space="preserve"> </w:t>
+      </w:r>
+      <w:r>
+        <w:t xml:space="preserve">of</w:t>
+      </w:r>
+      <w:r>
+        <w:t xml:space="preserve"> </w:t>
+      </w:r>
+      <w:r>
+        <w:t xml:space="preserve">Disease Study</w:t>
+      </w:r>
+      <w:r>
+        <w:t xml:space="preserve"> </w:t>
+      </w:r>
+      <w:r>
+        <w:t xml:space="preserve">2023. The Lancet 406, 1873–1922.</w:t>
       </w:r>
       <w:r>
         <w:t xml:space="preserve"> </w:t>
@@ -6769,7 +6769,7 @@
           <w:rPr>
             <w:rStyle w:val="Hyperlink"/>
           </w:rPr>
-          <w:t xml:space="preserve">https://doi.org/10.1007/978-3-319-19425-7</w:t>
+          <w:t xml:space="preserve">https://doi.org/10.1016/S0140-6736(25)01637-X</w:t>
         </w:r>
       </w:hyperlink>
     </w:p>

</xml_diff>

<commit_message>
version for co-author feedback
</commit_message>
<xml_diff>
--- a/manuscript/manuscript.docx
+++ b/manuscript/manuscript.docx
@@ -126,7 +126,7 @@
       <w:r>
         <w:t xml:space="preserve"> </w:t>
       </w:r>
-      <w:hyperlink r:id="rId20">
+      <w:hyperlink r:id="rId12">
         <w:r>
           <w:rPr>
             <w:rStyle w:val="Hyperlink"/>
@@ -135,7 +135,12 @@
         </w:r>
       </w:hyperlink>
     </w:p>
-    <w:bookmarkStart w:id="21" w:name="keywords"/>
+    <w:p>
+      <w:r>
+        <w:br w:type="page"/>
+      </w:r>
+    </w:p>
+    <w:bookmarkStart w:id="13" w:name="keywords"/>
     <w:p>
       <w:pPr>
         <w:pStyle w:val="Heading1"/>
@@ -191,8 +196,8 @@
         <w:br/>
       </w:r>
     </w:p>
-    <w:bookmarkEnd w:id="21"/>
-    <w:bookmarkStart w:id="22" w:name="highlights"/>
+    <w:bookmarkEnd w:id="13"/>
+    <w:bookmarkStart w:id="14" w:name="highlights"/>
     <w:p>
       <w:pPr>
         <w:pStyle w:val="Heading1"/>
@@ -243,8 +248,8 @@
         <w:t xml:space="preserve">Results underscore health risk of lead exposure, even in low concentration</w:t>
       </w:r>
     </w:p>
-    <w:bookmarkEnd w:id="22"/>
-    <w:bookmarkStart w:id="26" w:name="graphical-abstract"/>
+    <w:bookmarkEnd w:id="14"/>
+    <w:bookmarkStart w:id="18" w:name="graphical-abstract"/>
     <w:p>
       <w:pPr>
         <w:pStyle w:val="Heading1"/>
@@ -262,18 +267,18 @@
           <wp:inline>
             <wp:extent cx="5943600" cy="3530498"/>
             <wp:effectExtent b="0" l="0" r="0" t="0"/>
-            <wp:docPr descr="" title="" id="24" name="Picture"/>
+            <wp:docPr descr="" title="" id="16" name="Picture"/>
             <a:graphic>
               <a:graphicData uri="http://schemas.openxmlformats.org/drawingml/2006/picture">
                 <pic:pic>
                   <pic:nvPicPr>
-                    <pic:cNvPr descr="tables_figures/main/graphical_abstract.png" id="25" name="Picture"/>
+                    <pic:cNvPr descr="tables_figures/main/graphical_abstract.png" id="17" name="Picture"/>
                     <pic:cNvPicPr>
                       <a:picLocks noChangeArrowheads="1" noChangeAspect="1"/>
                     </pic:cNvPicPr>
                   </pic:nvPicPr>
                   <pic:blipFill>
-                    <a:blip r:embed="rId23"/>
+                    <a:blip r:embed="rId15"/>
                     <a:stretch>
                       <a:fillRect/>
                     </a:stretch>
@@ -300,8 +305,8 @@
         </w:drawing>
       </w:r>
     </w:p>
-    <w:bookmarkEnd w:id="26"/>
-    <w:bookmarkStart w:id="27" w:name="abstract"/>
+    <w:bookmarkEnd w:id="18"/>
+    <w:bookmarkStart w:id="19" w:name="abstract"/>
     <w:p>
       <w:pPr>
         <w:pStyle w:val="Heading1"/>
@@ -649,8 +654,8 @@
         <w:br w:type="page"/>
       </w:r>
     </w:p>
-    <w:bookmarkEnd w:id="27"/>
-    <w:bookmarkStart w:id="28" w:name="background"/>
+    <w:bookmarkEnd w:id="19"/>
+    <w:bookmarkStart w:id="20" w:name="background"/>
     <w:p>
       <w:pPr>
         <w:pStyle w:val="Heading1"/>
@@ -676,7 +681,13 @@
         <w:t xml:space="preserve"> </w:t>
       </w:r>
       <w:r>
-        <w:t xml:space="preserve">(Lacerda et al., 2023; Salamanca-Fernández et al., 2025)</w:t>
+        <w:t xml:space="preserve">(</w:t>
+      </w:r>
+      <w:r>
+        <w:t xml:space="preserve">Lacerda et al.</w:t>
+      </w:r>
+      <w:r>
+        <w:t xml:space="preserve">, 2023; Salamanca-Fernández et al., 2025)</w:t>
       </w:r>
       <w:r>
         <w:t xml:space="preserve">.</w:t>
@@ -1034,8 +1045,8 @@
         <w:t xml:space="preserve">The aim of this study is twofold: first, to synthesize and quantitatively pool available epidemiological findings on the association between BLL and IQ scores in children; and second, to conduct both frequentist and Bayesian meta-analyses, comparing how these analytical frameworks impact exposure-response estimates and uncertainty quantification.</w:t>
       </w:r>
     </w:p>
-    <w:bookmarkEnd w:id="28"/>
-    <w:bookmarkStart w:id="41" w:name="methods"/>
+    <w:bookmarkEnd w:id="20"/>
+    <w:bookmarkStart w:id="33" w:name="methods"/>
     <w:p>
       <w:pPr>
         <w:pStyle w:val="Heading1"/>
@@ -1044,7 +1055,7 @@
         <w:t xml:space="preserve">2. Methods</w:t>
       </w:r>
     </w:p>
-    <w:bookmarkStart w:id="30" w:name="literature-review"/>
+    <w:bookmarkStart w:id="22" w:name="literature-review"/>
     <w:p>
       <w:pPr>
         <w:pStyle w:val="Heading2"/>
@@ -1128,7 +1139,7 @@
         </w:rPr>
         <w:t xml:space="preserve">(</w:t>
       </w:r>
-      <w:hyperlink r:id="rId29">
+      <w:hyperlink r:id="rId21">
         <w:r>
           <w:rPr>
             <w:rStyle w:val="Hyperlink"/>
@@ -1242,7 +1253,7 @@
         <w:br/>
       </w:r>
       <w:r>
-        <w:t xml:space="preserve">For this present study, only studies that used a continuous, log-transformed BLL scale were included, so that effect estimates could be harmonized</w:t>
+        <w:t xml:space="preserve">For this present study, only studies that used a continuous, log-transformed BLL scale were included, so that effect estimates could be harmonized.</w:t>
       </w:r>
       <w:r>
         <w:t xml:space="preserve"> </w:t>
@@ -1254,13 +1265,16 @@
         <w:t xml:space="preserve"> </w:t>
       </w:r>
       <w:r>
-        <w:t xml:space="preserve">Descriptive study data was extracted using a grid based on the one proposed by the Office of Health Assessment and Translation within the US National Toxicology Program (NTP OHAT)</w:t>
-      </w:r>
-      <w:r>
-        <w:t xml:space="preserve"> </w:t>
-      </w:r>
-      <w:r>
-        <w:t xml:space="preserve">(NTP OHAT, 2019.)</w:t>
+        <w:t xml:space="preserve">Descriptive study data was extracted using a grid based on the one proposed by the Office of Health Assessment and Translation within the US National Toxicology Program</w:t>
+      </w:r>
+      <w:r>
+        <w:t xml:space="preserve"> </w:t>
+      </w:r>
+      <w:r>
+        <w:t xml:space="preserve">(NTP OHAT, 2019)</w:t>
+      </w:r>
+      <w:r>
+        <w:t xml:space="preserve">.</w:t>
       </w:r>
       <w:r>
         <w:t xml:space="preserve"> </w:t>
@@ -1269,8 +1283,8 @@
         <w:t xml:space="preserve">For all included studies, effect estimates from the most-adjusted model were extracted and the adjustment set was recorded.</w:t>
       </w:r>
     </w:p>
-    <w:bookmarkEnd w:id="30"/>
-    <w:bookmarkStart w:id="31" w:name="risk-of-bias-assessment"/>
+    <w:bookmarkEnd w:id="22"/>
+    <w:bookmarkStart w:id="23" w:name="risk-of-bias-assessment"/>
     <w:p>
       <w:pPr>
         <w:pStyle w:val="Heading2"/>
@@ -1368,8 +1382,8 @@
         <w:t xml:space="preserve">If there were any deviations in the judgement of the researcher and the LLM, the respective item was revisited by the researcher who made the final decision.</w:t>
       </w:r>
     </w:p>
-    <w:bookmarkEnd w:id="31"/>
-    <w:bookmarkStart w:id="33" w:name="harmonization-of-effect-estimates"/>
+    <w:bookmarkEnd w:id="23"/>
+    <w:bookmarkStart w:id="25" w:name="harmonization-of-effect-estimates"/>
     <w:p>
       <w:pPr>
         <w:pStyle w:val="Heading2"/>
@@ -1437,7 +1451,7 @@
       <w:pPr>
         <w:pStyle w:val="BodyText"/>
       </w:pPr>
-      <w:bookmarkStart w:id="32" w:name="eq-regression-model"/>
+      <w:bookmarkStart w:id="24" w:name="eq-regression-model"/>
       <m:oMathPara>
         <m:oMathParaPr>
           <m:jc m:val="center"/>
@@ -1510,19 +1524,21 @@
               </m:r>
             </m:sub>
           </m:sSub>
-          <m:d>
-            <m:dPr>
-              <m:begChr m:val="("/>
-              <m:sepChr m:val=""/>
-              <m:endChr m:val=")"/>
-              <m:grow/>
-            </m:dPr>
-            <m:e>
-              <m:r>
-                <m:t>X</m:t>
-              </m:r>
-            </m:e>
-          </m:d>
+          <m:r>
+            <m:rPr>
+              <m:sty m:val="p"/>
+            </m:rPr>
+            <m:t>(</m:t>
+          </m:r>
+          <m:r>
+            <m:t>X</m:t>
+          </m:r>
+          <m:r>
+            <m:rPr>
+              <m:sty m:val="p"/>
+            </m:rPr>
+            <m:t>)</m:t>
+          </m:r>
           <m:r>
             <m:rPr>
               <m:sty m:val="p"/>
@@ -1535,22 +1551,24 @@
           <m:r>
             <m:t>  </m:t>
           </m:r>
-          <m:d>
-            <m:dPr>
-              <m:begChr m:val="("/>
-              <m:sepChr m:val=""/>
-              <m:endChr m:val=")"/>
-              <m:grow/>
-            </m:dPr>
-            <m:e>
-              <m:r>
-                <m:t>1</m:t>
-              </m:r>
-            </m:e>
-          </m:d>
+          <m:r>
+            <m:rPr>
+              <m:sty m:val="p"/>
+            </m:rPr>
+            <m:t>(</m:t>
+          </m:r>
+          <m:r>
+            <m:t>1</m:t>
+          </m:r>
+          <m:r>
+            <m:rPr>
+              <m:sty m:val="p"/>
+            </m:rPr>
+            <m:t>)</m:t>
+          </m:r>
         </m:oMath>
       </m:oMathPara>
-      <w:bookmarkEnd w:id="32"/>
+      <w:bookmarkEnd w:id="24"/>
     </w:p>
     <w:p>
       <w:pPr>
@@ -1758,8 +1776,8 @@
         <w:t xml:space="preserve">These were excluded from the meta-analysis, as transformation of effect estimates for linear BLL to log-linear could not be justified.</w:t>
       </w:r>
     </w:p>
-    <w:bookmarkEnd w:id="33"/>
-    <w:bookmarkStart w:id="39" w:name="meta-analysis"/>
+    <w:bookmarkEnd w:id="25"/>
+    <w:bookmarkStart w:id="31" w:name="meta-analysis"/>
     <w:p>
       <w:pPr>
         <w:pStyle w:val="Heading2"/>
@@ -1834,7 +1852,7 @@
       <w:r>
         <w:t xml:space="preserve"> </w:t>
       </w:r>
-      <w:hyperlink r:id="rId34">
+      <w:hyperlink r:id="rId26">
         <w:r>
           <w:rPr>
             <w:rStyle w:val="Hyperlink"/>
@@ -1846,7 +1864,7 @@
         <w:t xml:space="preserve">.</w:t>
       </w:r>
     </w:p>
-    <w:bookmarkStart w:id="37" w:name="bayesian-meta-analysis"/>
+    <w:bookmarkStart w:id="29" w:name="bayesian-meta-analysis"/>
     <w:p>
       <w:pPr>
         <w:pStyle w:val="Heading3"/>
@@ -1983,185 +2001,169 @@
       <w:pPr>
         <w:pStyle w:val="BodyText"/>
       </w:pPr>
-      <w:bookmarkStart w:id="35" w:name="eq-model"/>
+      <w:bookmarkStart w:id="27" w:name="eq-model"/>
       <m:oMathPara>
         <m:oMathParaPr>
           <m:jc m:val="center"/>
         </m:oMathParaPr>
         <m:oMath>
-          <m:m>
-            <m:mPr>
-              <m:baseJc m:val="center"/>
-              <m:plcHide m:val="on"/>
-              <m:mcs>
-                <m:mc>
-                  <m:mcPr>
-                    <m:mcJc m:val="right"/>
-                    <m:count m:val="1"/>
-                  </m:mcPr>
-                </m:mc>
-                <m:mc>
-                  <m:mcPr>
-                    <m:mcJc m:val="left"/>
-                    <m:count m:val="1"/>
-                  </m:mcPr>
-                </m:mc>
-              </m:mcs>
-            </m:mPr>
-            <m:mr>
-              <m:e>
-                <m:sSub>
-                  <m:e>
-                    <m:acc>
-                      <m:accPr>
-                        <m:chr m:val="̂"/>
-                      </m:accPr>
-                      <m:e>
-                        <m:r>
-                          <m:t>θ</m:t>
-                        </m:r>
-                      </m:e>
-                    </m:acc>
-                  </m:e>
-                  <m:sub>
-                    <m:r>
-                      <m:t>k</m:t>
-                    </m:r>
-                  </m:sub>
-                </m:sSub>
-              </m:e>
-              <m:e>
-                <m:r>
-                  <m:rPr>
-                    <m:sty m:val="p"/>
-                  </m:rPr>
-                  <m:t>∼</m:t>
-                </m:r>
-                <m:r>
-                  <m:rPr>
-                    <m:sty m:val="p"/>
-                    <m:scr m:val="script"/>
-                  </m:rPr>
-                  <m:t>N</m:t>
-                </m:r>
-                <m:d>
-                  <m:dPr>
-                    <m:begChr m:val="("/>
-                    <m:sepChr m:val=""/>
-                    <m:endChr m:val=")"/>
-                    <m:grow/>
-                  </m:dPr>
-                  <m:e>
-                    <m:sSub>
-                      <m:e>
-                        <m:r>
-                          <m:t>θ</m:t>
-                        </m:r>
-                      </m:e>
-                      <m:sub>
-                        <m:r>
-                          <m:t>k</m:t>
-                        </m:r>
-                      </m:sub>
-                    </m:sSub>
-                    <m:r>
-                      <m:rPr>
-                        <m:sty m:val="p"/>
-                      </m:rPr>
-                      <m:t>,</m:t>
-                    </m:r>
-                    <m:sSub>
-                      <m:e>
-                        <m:r>
-                          <m:t>σ</m:t>
-                        </m:r>
-                      </m:e>
-                      <m:sub>
-                        <m:r>
-                          <m:t>k</m:t>
-                        </m:r>
-                      </m:sub>
-                    </m:sSub>
-                  </m:e>
-                </m:d>
-              </m:e>
-            </m:mr>
-            <m:mr>
-              <m:e>
-                <m:sSub>
-                  <m:e>
-                    <m:r>
-                      <m:t>θ</m:t>
-                    </m:r>
-                  </m:e>
-                  <m:sub>
-                    <m:r>
-                      <m:t>k</m:t>
-                    </m:r>
-                  </m:sub>
-                </m:sSub>
-              </m:e>
-              <m:e>
-                <m:r>
-                  <m:rPr>
-                    <m:sty m:val="p"/>
-                  </m:rPr>
-                  <m:t>∼</m:t>
-                </m:r>
-                <m:r>
-                  <m:rPr>
-                    <m:sty m:val="p"/>
-                    <m:scr m:val="script"/>
-                  </m:rPr>
-                  <m:t>N</m:t>
-                </m:r>
-                <m:d>
-                  <m:dPr>
-                    <m:begChr m:val="("/>
-                    <m:sepChr m:val=""/>
-                    <m:endChr m:val=")"/>
-                    <m:grow/>
-                  </m:dPr>
-                  <m:e>
-                    <m:r>
-                      <m:t>μ</m:t>
-                    </m:r>
-                    <m:r>
-                      <m:rPr>
-                        <m:sty m:val="p"/>
-                      </m:rPr>
-                      <m:t>,</m:t>
-                    </m:r>
-                    <m:r>
-                      <m:t>τ</m:t>
-                    </m:r>
-                  </m:e>
-                </m:d>
-              </m:e>
-            </m:mr>
-            <m:mr>
-              <m:e/>
-            </m:mr>
-          </m:m>
+          <m:eqArr>
+            <m:e>
+              <m:sSub>
+                <m:e>
+                  <m:acc>
+                    <m:accPr>
+                      <m:chr m:val="̂"/>
+                    </m:accPr>
+                    <m:e>
+                      <m:r>
+                        <m:t>θ</m:t>
+                      </m:r>
+                    </m:e>
+                  </m:acc>
+                </m:e>
+                <m:sub>
+                  <m:r>
+                    <m:t>k</m:t>
+                  </m:r>
+                </m:sub>
+              </m:sSub>
+              <m:r>
+                <m:t>&amp;</m:t>
+              </m:r>
+              <m:r>
+                <m:rPr>
+                  <m:sty m:val="p"/>
+                </m:rPr>
+                <m:t>∼</m:t>
+              </m:r>
+              <m:r>
+                <m:rPr>
+                  <m:scr m:val="script"/>
+                  <m:sty m:val="p"/>
+                </m:rPr>
+                <m:t>N</m:t>
+              </m:r>
+              <m:r>
+                <m:rPr>
+                  <m:sty m:val="p"/>
+                </m:rPr>
+                <m:t>(</m:t>
+              </m:r>
+              <m:sSub>
+                <m:e>
+                  <m:r>
+                    <m:t>θ</m:t>
+                  </m:r>
+                </m:e>
+                <m:sub>
+                  <m:r>
+                    <m:t>k</m:t>
+                  </m:r>
+                </m:sub>
+              </m:sSub>
+              <m:r>
+                <m:rPr>
+                  <m:sty m:val="p"/>
+                </m:rPr>
+                <m:t>,</m:t>
+              </m:r>
+              <m:sSub>
+                <m:e>
+                  <m:r>
+                    <m:t>σ</m:t>
+                  </m:r>
+                </m:e>
+                <m:sub>
+                  <m:r>
+                    <m:t>k</m:t>
+                  </m:r>
+                </m:sub>
+              </m:sSub>
+              <m:r>
+                <m:rPr>
+                  <m:sty m:val="p"/>
+                </m:rPr>
+                <m:t>)</m:t>
+              </m:r>
+            </m:e>
+            <m:e>
+              <m:sSub>
+                <m:e>
+                  <m:r>
+                    <m:t>θ</m:t>
+                  </m:r>
+                </m:e>
+                <m:sub>
+                  <m:r>
+                    <m:t>k</m:t>
+                  </m:r>
+                </m:sub>
+              </m:sSub>
+              <m:r>
+                <m:t>&amp;</m:t>
+              </m:r>
+              <m:r>
+                <m:rPr>
+                  <m:sty m:val="p"/>
+                </m:rPr>
+                <m:t>∼</m:t>
+              </m:r>
+              <m:r>
+                <m:rPr>
+                  <m:scr m:val="script"/>
+                  <m:sty m:val="p"/>
+                </m:rPr>
+                <m:t>N</m:t>
+              </m:r>
+              <m:r>
+                <m:rPr>
+                  <m:sty m:val="p"/>
+                </m:rPr>
+                <m:t>(</m:t>
+              </m:r>
+              <m:r>
+                <m:t>μ</m:t>
+              </m:r>
+              <m:r>
+                <m:rPr>
+                  <m:sty m:val="p"/>
+                </m:rPr>
+                <m:t>,</m:t>
+              </m:r>
+              <m:r>
+                <m:t>τ</m:t>
+              </m:r>
+              <m:r>
+                <m:rPr>
+                  <m:sty m:val="p"/>
+                </m:rPr>
+                <m:t>)</m:t>
+              </m:r>
+            </m:e>
+            <m:e/>
+          </m:eqArr>
           <m:r>
             <m:t>  </m:t>
           </m:r>
-          <m:d>
-            <m:dPr>
-              <m:begChr m:val="("/>
-              <m:sepChr m:val=""/>
-              <m:endChr m:val=")"/>
-              <m:grow/>
-            </m:dPr>
-            <m:e>
-              <m:r>
-                <m:t>2</m:t>
-              </m:r>
-            </m:e>
-          </m:d>
+          <m:r>
+            <m:rPr>
+              <m:sty m:val="p"/>
+            </m:rPr>
+            <m:t>(</m:t>
+          </m:r>
+          <m:r>
+            <m:t>2</m:t>
+          </m:r>
+          <m:r>
+            <m:rPr>
+              <m:sty m:val="p"/>
+            </m:rPr>
+            <m:t>)</m:t>
+          </m:r>
         </m:oMath>
       </m:oMathPara>
-      <w:bookmarkEnd w:id="35"/>
+      <w:bookmarkEnd w:id="27"/>
     </w:p>
     <w:p>
       <w:pPr>
@@ -2647,158 +2649,144 @@
       <w:pPr>
         <w:pStyle w:val="BodyText"/>
       </w:pPr>
-      <w:bookmarkStart w:id="36" w:name="eq-priors"/>
+      <w:bookmarkStart w:id="28" w:name="eq-priors"/>
       <m:oMathPara>
         <m:oMathParaPr>
           <m:jc m:val="center"/>
         </m:oMathParaPr>
         <m:oMath>
-          <m:m>
-            <m:mPr>
-              <m:baseJc m:val="center"/>
-              <m:plcHide m:val="on"/>
-              <m:mcs>
-                <m:mc>
-                  <m:mcPr>
-                    <m:mcJc m:val="right"/>
-                    <m:count m:val="1"/>
-                  </m:mcPr>
-                </m:mc>
-                <m:mc>
-                  <m:mcPr>
-                    <m:mcJc m:val="left"/>
-                    <m:count m:val="1"/>
-                  </m:mcPr>
-                </m:mc>
-              </m:mcs>
-            </m:mPr>
-            <m:mr>
-              <m:e>
-                <m:r>
-                  <m:t>μ</m:t>
-                </m:r>
-              </m:e>
-              <m:e>
-                <m:r>
-                  <m:rPr>
-                    <m:sty m:val="p"/>
-                  </m:rPr>
-                  <m:t>∼</m:t>
-                </m:r>
-                <m:r>
-                  <m:rPr>
-                    <m:sty m:val="p"/>
-                    <m:scr m:val="script"/>
-                  </m:rPr>
-                  <m:t>N</m:t>
-                </m:r>
-                <m:d>
-                  <m:dPr>
-                    <m:begChr m:val="("/>
-                    <m:sepChr m:val=""/>
-                    <m:endChr m:val=")"/>
-                    <m:grow/>
-                  </m:dPr>
-                  <m:e>
-                    <m:r>
-                      <m:rPr>
-                        <m:sty m:val="p"/>
-                      </m:rPr>
-                      <m:t>−</m:t>
-                    </m:r>
-                    <m:r>
-                      <m:t>1</m:t>
-                    </m:r>
-                    <m:r>
-                      <m:rPr>
-                        <m:sty m:val="p"/>
-                      </m:rPr>
-                      <m:t>,</m:t>
-                    </m:r>
-                    <m:r>
-                      <m:t>2</m:t>
-                    </m:r>
-                  </m:e>
-                </m:d>
-              </m:e>
-            </m:mr>
-            <m:mr>
-              <m:e>
-                <m:r>
-                  <m:t>τ</m:t>
-                </m:r>
-              </m:e>
-              <m:e>
-                <m:r>
-                  <m:rPr>
-                    <m:sty m:val="p"/>
-                  </m:rPr>
-                  <m:t>∼</m:t>
-                </m:r>
-                <m:sSup>
-                  <m:e>
-                    <m:r>
-                      <m:rPr>
-                        <m:sty m:val="p"/>
-                        <m:scr m:val="script"/>
-                      </m:rPr>
-                      <m:t>N</m:t>
-                    </m:r>
-                  </m:e>
-                  <m:sup>
-                    <m:r>
-                      <m:rPr>
-                        <m:sty m:val="p"/>
-                        <m:scr m:val="script"/>
-                      </m:rPr>
-                      <m:t>+</m:t>
-                    </m:r>
-                  </m:sup>
-                </m:sSup>
-                <m:d>
-                  <m:dPr>
-                    <m:begChr m:val="("/>
-                    <m:sepChr m:val=""/>
-                    <m:endChr m:val=")"/>
-                    <m:grow/>
-                  </m:dPr>
-                  <m:e>
-                    <m:r>
-                      <m:t>0</m:t>
-                    </m:r>
-                    <m:r>
-                      <m:rPr>
-                        <m:sty m:val="p"/>
-                      </m:rPr>
-                      <m:t>,</m:t>
-                    </m:r>
-                    <m:r>
-                      <m:t>2</m:t>
-                    </m:r>
-                  </m:e>
-                </m:d>
-              </m:e>
-            </m:mr>
-          </m:m>
+          <m:eqArr>
+            <m:e>
+              <m:r>
+                <m:t>μ</m:t>
+              </m:r>
+              <m:r>
+                <m:t>&amp;</m:t>
+              </m:r>
+              <m:r>
+                <m:rPr>
+                  <m:sty m:val="p"/>
+                </m:rPr>
+                <m:t>∼</m:t>
+              </m:r>
+              <m:r>
+                <m:rPr>
+                  <m:scr m:val="script"/>
+                  <m:sty m:val="p"/>
+                </m:rPr>
+                <m:t>N</m:t>
+              </m:r>
+              <m:r>
+                <m:rPr>
+                  <m:sty m:val="p"/>
+                </m:rPr>
+                <m:t>(</m:t>
+              </m:r>
+              <m:r>
+                <m:rPr>
+                  <m:sty m:val="p"/>
+                </m:rPr>
+                <m:t>−</m:t>
+              </m:r>
+              <m:r>
+                <m:t>1</m:t>
+              </m:r>
+              <m:r>
+                <m:rPr>
+                  <m:sty m:val="p"/>
+                </m:rPr>
+                <m:t>,</m:t>
+              </m:r>
+              <m:r>
+                <m:t>2</m:t>
+              </m:r>
+              <m:r>
+                <m:rPr>
+                  <m:sty m:val="p"/>
+                </m:rPr>
+                <m:t>)</m:t>
+              </m:r>
+            </m:e>
+            <m:e>
+              <m:r>
+                <m:t>τ</m:t>
+              </m:r>
+              <m:r>
+                <m:t>&amp;</m:t>
+              </m:r>
+              <m:r>
+                <m:rPr>
+                  <m:sty m:val="p"/>
+                </m:rPr>
+                <m:t>∼</m:t>
+              </m:r>
+              <m:sSup>
+                <m:e>
+                  <m:r>
+                    <m:rPr>
+                      <m:scr m:val="script"/>
+                      <m:sty m:val="p"/>
+                    </m:rPr>
+                    <m:t>N</m:t>
+                  </m:r>
+                </m:e>
+                <m:sup>
+                  <m:r>
+                    <m:rPr>
+                      <m:scr m:val="script"/>
+                      <m:sty m:val="p"/>
+                    </m:rPr>
+                    <m:t>+</m:t>
+                  </m:r>
+                </m:sup>
+              </m:sSup>
+              <m:r>
+                <m:rPr>
+                  <m:sty m:val="p"/>
+                </m:rPr>
+                <m:t>(</m:t>
+              </m:r>
+              <m:r>
+                <m:t>0</m:t>
+              </m:r>
+              <m:r>
+                <m:rPr>
+                  <m:sty m:val="p"/>
+                </m:rPr>
+                <m:t>,</m:t>
+              </m:r>
+              <m:r>
+                <m:t>2</m:t>
+              </m:r>
+              <m:r>
+                <m:rPr>
+                  <m:sty m:val="p"/>
+                </m:rPr>
+                <m:t>)</m:t>
+              </m:r>
+            </m:e>
+          </m:eqArr>
           <m:r>
             <m:t>  </m:t>
           </m:r>
-          <m:d>
-            <m:dPr>
-              <m:begChr m:val="("/>
-              <m:sepChr m:val=""/>
-              <m:endChr m:val=")"/>
-              <m:grow/>
-            </m:dPr>
-            <m:e>
-              <m:r>
-                <m:t>3</m:t>
-              </m:r>
-            </m:e>
-          </m:d>
+          <m:r>
+            <m:rPr>
+              <m:sty m:val="p"/>
+            </m:rPr>
+            <m:t>(</m:t>
+          </m:r>
+          <m:r>
+            <m:t>3</m:t>
+          </m:r>
+          <m:r>
+            <m:rPr>
+              <m:sty m:val="p"/>
+            </m:rPr>
+            <m:t>)</m:t>
+          </m:r>
         </m:oMath>
       </m:oMathPara>
-      <w:bookmarkEnd w:id="36"/>
+      <w:bookmarkEnd w:id="28"/>
     </w:p>
     <w:p>
       <w:pPr>
@@ -2850,8 +2838,8 @@
         <w:t xml:space="preserve">Additionally, a sensitivity analysis with alternative priors was conducted, as described below.</w:t>
       </w:r>
     </w:p>
-    <w:bookmarkEnd w:id="37"/>
-    <w:bookmarkStart w:id="38" w:name="frequentist-meta-analysis"/>
+    <w:bookmarkEnd w:id="29"/>
+    <w:bookmarkStart w:id="30" w:name="frequentist-meta-analysis"/>
     <w:p>
       <w:pPr>
         <w:pStyle w:val="Heading3"/>
@@ -2958,9 +2946,9 @@
         <w:t xml:space="preserve">.</w:t>
       </w:r>
     </w:p>
-    <w:bookmarkEnd w:id="38"/>
-    <w:bookmarkEnd w:id="39"/>
-    <w:bookmarkStart w:id="40" w:name="sensitivity-analysis"/>
+    <w:bookmarkEnd w:id="30"/>
+    <w:bookmarkEnd w:id="31"/>
+    <w:bookmarkStart w:id="32" w:name="sensitivity-analysis"/>
     <w:p>
       <w:pPr>
         <w:pStyle w:val="Heading2"/>
@@ -3011,39 +2999,41 @@
         </m:r>
         <m:r>
           <m:rPr>
+            <m:scr m:val="script"/>
             <m:sty m:val="p"/>
-            <m:scr m:val="script"/>
           </m:rPr>
           <m:t>N</m:t>
         </m:r>
-        <m:d>
-          <m:dPr>
-            <m:begChr m:val="("/>
-            <m:sepChr m:val=""/>
-            <m:endChr m:val=")"/>
-            <m:grow/>
-          </m:dPr>
-          <m:e>
-            <m:r>
-              <m:rPr>
-                <m:sty m:val="p"/>
-              </m:rPr>
-              <m:t>−</m:t>
-            </m:r>
-            <m:r>
-              <m:t>1</m:t>
-            </m:r>
-            <m:r>
-              <m:rPr>
-                <m:sty m:val="p"/>
-              </m:rPr>
-              <m:t>,</m:t>
-            </m:r>
-            <m:r>
-              <m:t>1</m:t>
-            </m:r>
-          </m:e>
-        </m:d>
+        <m:r>
+          <m:rPr>
+            <m:sty m:val="p"/>
+          </m:rPr>
+          <m:t>(</m:t>
+        </m:r>
+        <m:r>
+          <m:rPr>
+            <m:sty m:val="p"/>
+          </m:rPr>
+          <m:t>−</m:t>
+        </m:r>
+        <m:r>
+          <m:t>1</m:t>
+        </m:r>
+        <m:r>
+          <m:rPr>
+            <m:sty m:val="p"/>
+          </m:rPr>
+          <m:t>,</m:t>
+        </m:r>
+        <m:r>
+          <m:t>1</m:t>
+        </m:r>
+        <m:r>
+          <m:rPr>
+            <m:sty m:val="p"/>
+          </m:rPr>
+          <m:t>)</m:t>
+        </m:r>
       </m:oMath>
       <w:r>
         <w:t xml:space="preserve"> </w:t>
@@ -3068,8 +3058,8 @@
           <m:e>
             <m:r>
               <m:rPr>
+                <m:scr m:val="script"/>
                 <m:sty m:val="p"/>
-                <m:scr m:val="script"/>
               </m:rPr>
               <m:t>N</m:t>
             </m:r>
@@ -3083,28 +3073,30 @@
             </m:r>
           </m:sup>
         </m:sSup>
-        <m:d>
-          <m:dPr>
-            <m:begChr m:val="("/>
-            <m:sepChr m:val=""/>
-            <m:endChr m:val=")"/>
-            <m:grow/>
-          </m:dPr>
-          <m:e>
-            <m:r>
-              <m:t>0</m:t>
-            </m:r>
-            <m:r>
-              <m:rPr>
-                <m:sty m:val="p"/>
-              </m:rPr>
-              <m:t>,</m:t>
-            </m:r>
-            <m:r>
-              <m:t>1</m:t>
-            </m:r>
-          </m:e>
-        </m:d>
+        <m:r>
+          <m:rPr>
+            <m:sty m:val="p"/>
+          </m:rPr>
+          <m:t>(</m:t>
+        </m:r>
+        <m:r>
+          <m:t>0</m:t>
+        </m:r>
+        <m:r>
+          <m:rPr>
+            <m:sty m:val="p"/>
+          </m:rPr>
+          <m:t>,</m:t>
+        </m:r>
+        <m:r>
+          <m:t>1</m:t>
+        </m:r>
+        <m:r>
+          <m:rPr>
+            <m:sty m:val="p"/>
+          </m:rPr>
+          <m:t>)</m:t>
+        </m:r>
       </m:oMath>
       <w:r>
         <w:t xml:space="preserve">.</w:t>
@@ -3130,33 +3122,35 @@
         </m:r>
         <m:r>
           <m:rPr>
+            <m:scr m:val="script"/>
             <m:sty m:val="p"/>
-            <m:scr m:val="script"/>
           </m:rPr>
           <m:t>N</m:t>
         </m:r>
-        <m:d>
-          <m:dPr>
-            <m:begChr m:val="("/>
-            <m:sepChr m:val=""/>
-            <m:endChr m:val=")"/>
-            <m:grow/>
-          </m:dPr>
-          <m:e>
-            <m:r>
-              <m:t>0</m:t>
-            </m:r>
-            <m:r>
-              <m:rPr>
-                <m:sty m:val="p"/>
-              </m:rPr>
-              <m:t>,</m:t>
-            </m:r>
-            <m:r>
-              <m:t>6</m:t>
-            </m:r>
-          </m:e>
-        </m:d>
+        <m:r>
+          <m:rPr>
+            <m:sty m:val="p"/>
+          </m:rPr>
+          <m:t>(</m:t>
+        </m:r>
+        <m:r>
+          <m:t>0</m:t>
+        </m:r>
+        <m:r>
+          <m:rPr>
+            <m:sty m:val="p"/>
+          </m:rPr>
+          <m:t>,</m:t>
+        </m:r>
+        <m:r>
+          <m:t>6</m:t>
+        </m:r>
+        <m:r>
+          <m:rPr>
+            <m:sty m:val="p"/>
+          </m:rPr>
+          <m:t>)</m:t>
+        </m:r>
       </m:oMath>
       <w:r>
         <w:t xml:space="preserve"> </w:t>
@@ -3181,8 +3175,8 @@
           <m:e>
             <m:r>
               <m:rPr>
+                <m:scr m:val="script"/>
                 <m:sty m:val="p"/>
-                <m:scr m:val="script"/>
               </m:rPr>
               <m:t>N</m:t>
             </m:r>
@@ -3196,28 +3190,30 @@
             </m:r>
           </m:sup>
         </m:sSup>
-        <m:d>
-          <m:dPr>
-            <m:begChr m:val="("/>
-            <m:sepChr m:val=""/>
-            <m:endChr m:val=")"/>
-            <m:grow/>
-          </m:dPr>
-          <m:e>
-            <m:r>
-              <m:t>0</m:t>
-            </m:r>
-            <m:r>
-              <m:rPr>
-                <m:sty m:val="p"/>
-              </m:rPr>
-              <m:t>,</m:t>
-            </m:r>
-            <m:r>
-              <m:t>6</m:t>
-            </m:r>
-          </m:e>
-        </m:d>
+        <m:r>
+          <m:rPr>
+            <m:sty m:val="p"/>
+          </m:rPr>
+          <m:t>(</m:t>
+        </m:r>
+        <m:r>
+          <m:t>0</m:t>
+        </m:r>
+        <m:r>
+          <m:rPr>
+            <m:sty m:val="p"/>
+          </m:rPr>
+          <m:t>,</m:t>
+        </m:r>
+        <m:r>
+          <m:t>6</m:t>
+        </m:r>
+        <m:r>
+          <m:rPr>
+            <m:sty m:val="p"/>
+          </m:rPr>
+          <m:t>)</m:t>
+        </m:r>
       </m:oMath>
       <w:r>
         <w:t xml:space="preserve">.</w:t>
@@ -3229,9 +3225,9 @@
         <w:t xml:space="preserve">Note that for the main effect, the broader prior is centered around 0, giving equal weight to the probability of a protective and detrimental effect of lead.</w:t>
       </w:r>
     </w:p>
-    <w:bookmarkEnd w:id="40"/>
-    <w:bookmarkEnd w:id="41"/>
-    <w:bookmarkStart w:id="52" w:name="results"/>
+    <w:bookmarkEnd w:id="32"/>
+    <w:bookmarkEnd w:id="33"/>
+    <w:bookmarkStart w:id="44" w:name="results"/>
     <w:p>
       <w:pPr>
         <w:pStyle w:val="Heading1"/>
@@ -3240,7 +3236,7 @@
         <w:t xml:space="preserve">3. Results</w:t>
       </w:r>
     </w:p>
-    <w:bookmarkStart w:id="45" w:name="literature-review-1"/>
+    <w:bookmarkStart w:id="37" w:name="literature-review-1"/>
     <w:p>
       <w:pPr>
         <w:pStyle w:val="Heading2"/>
@@ -3347,20 +3343,20 @@
       <w:r>
         <w:drawing>
           <wp:inline>
-            <wp:extent cx="3566160" cy="4059018"/>
+            <wp:extent cx="3566160" cy="4257586"/>
             <wp:effectExtent b="0" l="0" r="0" t="0"/>
-            <wp:docPr descr="Fig. 1: PRISMA flow diagram. BLL, blood lead level; Pb, lead; Hg, mercury" title="" id="43" name="Picture"/>
+            <wp:docPr descr="Fig. 1: PRISMA flow diagram. BLL, blood lead level; Pb, lead; Hg, mercury" title="" id="35" name="Picture"/>
             <a:graphic>
               <a:graphicData uri="http://schemas.openxmlformats.org/drawingml/2006/picture">
                 <pic:pic>
                   <pic:nvPicPr>
-                    <pic:cNvPr descr="tables_figures/main/figure1.png" id="44" name="Picture"/>
+                    <pic:cNvPr descr="tables_figures/main/figure1.png" id="36" name="Picture"/>
                     <pic:cNvPicPr>
                       <a:picLocks noChangeArrowheads="1" noChangeAspect="1"/>
                     </pic:cNvPicPr>
                   </pic:nvPicPr>
                   <pic:blipFill>
-                    <a:blip r:embed="rId42"/>
+                    <a:blip r:embed="rId34"/>
                     <a:stretch>
                       <a:fillRect/>
                     </a:stretch>
@@ -3368,7 +3364,7 @@
                   <pic:spPr bwMode="auto">
                     <a:xfrm>
                       <a:off x="0" y="0"/>
-                      <a:ext cx="3566160" cy="4059018"/>
+                      <a:ext cx="3566160" cy="4257586"/>
                     </a:xfrm>
                     <a:prstGeom prst="rect">
                       <a:avLst/>
@@ -3490,8 +3486,8 @@
         <w:t xml:space="preserve">We contacted the corresponding author, who confirmed that decimal points were missing in the publication.</w:t>
       </w:r>
     </w:p>
-    <w:bookmarkEnd w:id="45"/>
-    <w:bookmarkStart w:id="46" w:name="risk-of-bias"/>
+    <w:bookmarkEnd w:id="37"/>
+    <w:bookmarkStart w:id="38" w:name="risk-of-bias"/>
     <w:p>
       <w:pPr>
         <w:pStyle w:val="Heading2"/>
@@ -3622,8 +3618,8 @@
         <w:t xml:space="preserve">Results from the RoB assessment are presented in Tab. 3.</w:t>
       </w:r>
     </w:p>
-    <w:bookmarkEnd w:id="46"/>
-    <w:bookmarkStart w:id="50" w:name="meta-analysis-1"/>
+    <w:bookmarkEnd w:id="38"/>
+    <w:bookmarkStart w:id="42" w:name="meta-analysis-1"/>
     <w:p>
       <w:pPr>
         <w:pStyle w:val="Heading2"/>
@@ -3868,18 +3864,18 @@
           <wp:inline>
             <wp:extent cx="5943600" cy="2228220"/>
             <wp:effectExtent b="0" l="0" r="0" t="0"/>
-            <wp:docPr descr="Fig. 2: Forest plots for Bayesian (left) and frequentist (right) meta-analyses. BLL, blood lead level; CI, confidence interval; CrI, credible interval" title="" id="48" name="Picture"/>
+            <wp:docPr descr="Fig. 2: Forest plots for Bayesian (left) and frequentist (right) meta-analyses. BLL, blood lead level; CI, confidence interval; CrI, credible interval" title="" id="40" name="Picture"/>
             <a:graphic>
               <a:graphicData uri="http://schemas.openxmlformats.org/drawingml/2006/picture">
                 <pic:pic>
                   <pic:nvPicPr>
-                    <pic:cNvPr descr="./tables_figures/main/figure2.png" id="49" name="Picture"/>
+                    <pic:cNvPr descr="./tables_figures/main/figure2.png" id="41" name="Picture"/>
                     <pic:cNvPicPr>
                       <a:picLocks noChangeArrowheads="1" noChangeAspect="1"/>
                     </pic:cNvPicPr>
                   </pic:nvPicPr>
                   <pic:blipFill>
-                    <a:blip r:embed="rId47"/>
+                    <a:blip r:embed="rId39"/>
                     <a:stretch>
                       <a:fillRect/>
                     </a:stretch>
@@ -3928,8 +3924,8 @@
         <w:t xml:space="preserve">In the context of meta-analysis, shrinkage is comparable to the inverse-variance weighting in the frequentist framework.</w:t>
       </w:r>
     </w:p>
-    <w:bookmarkEnd w:id="50"/>
-    <w:bookmarkStart w:id="51" w:name="sensitivity-analysis-1"/>
+    <w:bookmarkEnd w:id="42"/>
+    <w:bookmarkStart w:id="43" w:name="sensitivity-analysis-1"/>
     <w:p>
       <w:pPr>
         <w:pStyle w:val="Heading2"/>
@@ -3943,7 +3939,7 @@
         <w:pStyle w:val="FirstParagraph"/>
       </w:pPr>
       <w:r>
-        <w:t xml:space="preserve">We conducted two sets of sensitivity analyses, results are shown in Tab. 4.</w:t>
+        <w:t xml:space="preserve">We conducted two sets of sensitivity analyses; results are shown in Tab. 4.</w:t>
       </w:r>
       <w:r>
         <w:t xml:space="preserve"> </w:t>
@@ -3989,39 +3985,41 @@
         </m:r>
         <m:r>
           <m:rPr>
+            <m:scr m:val="script"/>
             <m:sty m:val="p"/>
-            <m:scr m:val="script"/>
           </m:rPr>
           <m:t>N</m:t>
         </m:r>
-        <m:d>
-          <m:dPr>
-            <m:begChr m:val="("/>
-            <m:sepChr m:val=""/>
-            <m:endChr m:val=")"/>
-            <m:grow/>
-          </m:dPr>
-          <m:e>
-            <m:r>
-              <m:rPr>
-                <m:sty m:val="p"/>
-              </m:rPr>
-              <m:t>−</m:t>
-            </m:r>
-            <m:r>
-              <m:t>1</m:t>
-            </m:r>
-            <m:r>
-              <m:rPr>
-                <m:sty m:val="p"/>
-              </m:rPr>
-              <m:t>,</m:t>
-            </m:r>
-            <m:r>
-              <m:t>1</m:t>
-            </m:r>
-          </m:e>
-        </m:d>
+        <m:r>
+          <m:rPr>
+            <m:sty m:val="p"/>
+          </m:rPr>
+          <m:t>(</m:t>
+        </m:r>
+        <m:r>
+          <m:rPr>
+            <m:sty m:val="p"/>
+          </m:rPr>
+          <m:t>−</m:t>
+        </m:r>
+        <m:r>
+          <m:t>1</m:t>
+        </m:r>
+        <m:r>
+          <m:rPr>
+            <m:sty m:val="p"/>
+          </m:rPr>
+          <m:t>,</m:t>
+        </m:r>
+        <m:r>
+          <m:t>1</m:t>
+        </m:r>
+        <m:r>
+          <m:rPr>
+            <m:sty m:val="p"/>
+          </m:rPr>
+          <m:t>)</m:t>
+        </m:r>
       </m:oMath>
       <w:r>
         <w:t xml:space="preserve">,</w:t>
@@ -4043,8 +4041,8 @@
           <m:e>
             <m:r>
               <m:rPr>
+                <m:scr m:val="script"/>
                 <m:sty m:val="p"/>
-                <m:scr m:val="script"/>
               </m:rPr>
               <m:t>N</m:t>
             </m:r>
@@ -4058,28 +4056,30 @@
             </m:r>
           </m:sup>
         </m:sSup>
-        <m:d>
-          <m:dPr>
-            <m:begChr m:val="("/>
-            <m:sepChr m:val=""/>
-            <m:endChr m:val=")"/>
-            <m:grow/>
-          </m:dPr>
-          <m:e>
-            <m:r>
-              <m:t>0</m:t>
-            </m:r>
-            <m:r>
-              <m:rPr>
-                <m:sty m:val="p"/>
-              </m:rPr>
-              <m:t>,</m:t>
-            </m:r>
-            <m:r>
-              <m:t>1</m:t>
-            </m:r>
-          </m:e>
-        </m:d>
+        <m:r>
+          <m:rPr>
+            <m:sty m:val="p"/>
+          </m:rPr>
+          <m:t>(</m:t>
+        </m:r>
+        <m:r>
+          <m:t>0</m:t>
+        </m:r>
+        <m:r>
+          <m:rPr>
+            <m:sty m:val="p"/>
+          </m:rPr>
+          <m:t>,</m:t>
+        </m:r>
+        <m:r>
+          <m:t>1</m:t>
+        </m:r>
+        <m:r>
+          <m:rPr>
+            <m:sty m:val="p"/>
+          </m:rPr>
+          <m:t>)</m:t>
+        </m:r>
       </m:oMath>
       <w:r>
         <w:t xml:space="preserve">), the posterior mean of</w:t>
@@ -4122,33 +4122,35 @@
         </m:r>
         <m:r>
           <m:rPr>
+            <m:scr m:val="script"/>
             <m:sty m:val="p"/>
-            <m:scr m:val="script"/>
           </m:rPr>
           <m:t>N</m:t>
         </m:r>
-        <m:d>
-          <m:dPr>
-            <m:begChr m:val="("/>
-            <m:sepChr m:val=""/>
-            <m:endChr m:val=")"/>
-            <m:grow/>
-          </m:dPr>
-          <m:e>
-            <m:r>
-              <m:t>0</m:t>
-            </m:r>
-            <m:r>
-              <m:rPr>
-                <m:sty m:val="p"/>
-              </m:rPr>
-              <m:t>,</m:t>
-            </m:r>
-            <m:r>
-              <m:t>6</m:t>
-            </m:r>
-          </m:e>
-        </m:d>
+        <m:r>
+          <m:rPr>
+            <m:sty m:val="p"/>
+          </m:rPr>
+          <m:t>(</m:t>
+        </m:r>
+        <m:r>
+          <m:t>0</m:t>
+        </m:r>
+        <m:r>
+          <m:rPr>
+            <m:sty m:val="p"/>
+          </m:rPr>
+          <m:t>,</m:t>
+        </m:r>
+        <m:r>
+          <m:t>6</m:t>
+        </m:r>
+        <m:r>
+          <m:rPr>
+            <m:sty m:val="p"/>
+          </m:rPr>
+          <m:t>)</m:t>
+        </m:r>
       </m:oMath>
       <w:r>
         <w:t xml:space="preserve">,</w:t>
@@ -4170,8 +4172,8 @@
           <m:e>
             <m:r>
               <m:rPr>
+                <m:scr m:val="script"/>
                 <m:sty m:val="p"/>
-                <m:scr m:val="script"/>
               </m:rPr>
               <m:t>N</m:t>
             </m:r>
@@ -4185,28 +4187,30 @@
             </m:r>
           </m:sup>
         </m:sSup>
-        <m:d>
-          <m:dPr>
-            <m:begChr m:val="("/>
-            <m:sepChr m:val=""/>
-            <m:endChr m:val=")"/>
-            <m:grow/>
-          </m:dPr>
-          <m:e>
-            <m:r>
-              <m:t>0</m:t>
-            </m:r>
-            <m:r>
-              <m:rPr>
-                <m:sty m:val="p"/>
-              </m:rPr>
-              <m:t>,</m:t>
-            </m:r>
-            <m:r>
-              <m:t>6</m:t>
-            </m:r>
-          </m:e>
-        </m:d>
+        <m:r>
+          <m:rPr>
+            <m:sty m:val="p"/>
+          </m:rPr>
+          <m:t>(</m:t>
+        </m:r>
+        <m:r>
+          <m:t>0</m:t>
+        </m:r>
+        <m:r>
+          <m:rPr>
+            <m:sty m:val="p"/>
+          </m:rPr>
+          <m:t>,</m:t>
+        </m:r>
+        <m:r>
+          <m:t>6</m:t>
+        </m:r>
+        <m:r>
+          <m:rPr>
+            <m:sty m:val="p"/>
+          </m:rPr>
+          <m:t>)</m:t>
+        </m:r>
       </m:oMath>
       <w:r>
         <w:t xml:space="preserve">), the posterior mean of</w:t>
@@ -4244,9 +4248,9 @@
         <w:t xml:space="preserve">This shows that the results are robust to prior specification, because the shifts in the pooled estimate are not substantial and do not change the conclusion.</w:t>
       </w:r>
     </w:p>
-    <w:bookmarkEnd w:id="51"/>
-    <w:bookmarkEnd w:id="52"/>
-    <w:bookmarkStart w:id="53" w:name="discussion"/>
+    <w:bookmarkEnd w:id="43"/>
+    <w:bookmarkEnd w:id="44"/>
+    <w:bookmarkStart w:id="45" w:name="discussion"/>
     <w:p>
       <w:pPr>
         <w:pStyle w:val="Heading1"/>
@@ -4327,13 +4331,13 @@
         <w:t xml:space="preserve"> </w:t>
       </w:r>
       <w:r>
-        <w:t xml:space="preserve">The two frameworks differ in how they treat outier studies reporting substantial uncertainty.</w:t>
-      </w:r>
-      <w:r>
-        <w:t xml:space="preserve"> </w:t>
-      </w:r>
-      <w:r>
-        <w:t xml:space="preserve">Bayesian meta analysis can be less sensitive to these outliers, due to the shrinkage exerted by the prior specified for heterogeneity, provided that priors reflecting plausible domain knowledge are specified carefully.</w:t>
+        <w:t xml:space="preserve">The two frameworks differ in how they treat outlier studies reporting substantial uncertainty.</w:t>
+      </w:r>
+      <w:r>
+        <w:t xml:space="preserve"> </w:t>
+      </w:r>
+      <w:r>
+        <w:t xml:space="preserve">Bayesian meta-analysis can be less sensitive to these outliers, due to the shrinkage exerted by the prior specified for heterogeneity, provided that priors reflecting plausible domain knowledge are specified carefully.</w:t>
       </w:r>
       <w:r>
         <w:t xml:space="preserve"> </w:t>
@@ -4751,8 +4755,8 @@
         <w:t xml:space="preserve">Finally, we adhered to PRISMA and BARG reporting guidelines, along with the use of the raRoB tool for risk of bias assessment, ensuring consistency and rigor in study selection, data extraction, study quality appraisal, and statistical analysis.</w:t>
       </w:r>
     </w:p>
-    <w:bookmarkEnd w:id="53"/>
-    <w:bookmarkStart w:id="54" w:name="conclusions"/>
+    <w:bookmarkEnd w:id="45"/>
+    <w:bookmarkStart w:id="46" w:name="conclusions"/>
     <w:p>
       <w:pPr>
         <w:pStyle w:val="Heading1"/>
@@ -4799,8 +4803,8 @@
         <w:t xml:space="preserve">We believe that the benefits gained outweigh the investments made and therefore want to encourage researchers to consider Bayesian methods.</w:t>
       </w:r>
     </w:p>
-    <w:bookmarkEnd w:id="54"/>
-    <w:bookmarkStart w:id="55" w:name="list-of-abbreviations"/>
+    <w:bookmarkEnd w:id="46"/>
+    <w:bookmarkStart w:id="47" w:name="list-of-abbreviations"/>
     <w:p>
       <w:pPr>
         <w:pStyle w:val="Heading1"/>
@@ -5240,8 +5244,8 @@
         </w:tc>
       </w:tr>
     </w:tbl>
-    <w:bookmarkEnd w:id="55"/>
-    <w:bookmarkStart w:id="56" w:name="credit-authorship-contribution-statement"/>
+    <w:bookmarkEnd w:id="47"/>
+    <w:bookmarkStart w:id="48" w:name="credit-authorship-contribution-statement"/>
     <w:p>
       <w:pPr>
         <w:pStyle w:val="Heading1"/>
@@ -5317,8 +5321,8 @@
         <w:t xml:space="preserve">: Supervision, Writing – review and editing.</w:t>
       </w:r>
     </w:p>
-    <w:bookmarkEnd w:id="56"/>
-    <w:bookmarkStart w:id="57" w:name="acknowledgements"/>
+    <w:bookmarkEnd w:id="48"/>
+    <w:bookmarkStart w:id="49" w:name="acknowledgements"/>
     <w:p>
       <w:pPr>
         <w:pStyle w:val="Heading1"/>
@@ -5377,8 +5381,8 @@
         <w:t xml:space="preserve">for their help in the literature screening process.</w:t>
       </w:r>
     </w:p>
-    <w:bookmarkEnd w:id="57"/>
-    <w:bookmarkStart w:id="58" w:name="funding"/>
+    <w:bookmarkEnd w:id="49"/>
+    <w:bookmarkStart w:id="50" w:name="funding"/>
     <w:p>
       <w:pPr>
         <w:pStyle w:val="Heading1"/>
@@ -5407,8 +5411,8 @@
         <w:t xml:space="preserve">Neither the European Union nor the granting authority can be held responsible for them.</w:t>
       </w:r>
     </w:p>
-    <w:bookmarkEnd w:id="58"/>
-    <w:bookmarkStart w:id="59" w:name="X1f74eb43af444059c7518034463b6c89b1cacf4"/>
+    <w:bookmarkEnd w:id="50"/>
+    <w:bookmarkStart w:id="51" w:name="X1f74eb43af444059c7518034463b6c89b1cacf4"/>
     <w:p>
       <w:pPr>
         <w:pStyle w:val="Heading1"/>
@@ -5422,7 +5426,7 @@
         <w:pStyle w:val="FirstParagraph"/>
       </w:pPr>
       <w:r>
-        <w:t xml:space="preserve">During the preparation of this work the authors used the large language model Claude Sonnet 4.6 (Anthropic) in order to to assist in the risk of bias assessment of the studies included in the literature review and assess language and grammar throughout the manuscript.</w:t>
+        <w:t xml:space="preserve">During the preparation of this work the authors used the large language model Claude Sonnet 4.6 (Anthropic) in order to assist in the risk of bias assessment of the studies included in the literature review and assess language and grammar throughout the manuscript.</w:t>
       </w:r>
       <w:r>
         <w:t xml:space="preserve"> </w:t>
@@ -5431,8 +5435,8 @@
         <w:t xml:space="preserve">After using this tool, the authors reviewed and edited the content as needed and take full responsibility for the content of the published article.</w:t>
       </w:r>
     </w:p>
-    <w:bookmarkEnd w:id="59"/>
-    <w:bookmarkStart w:id="183" w:name="bibliography"/>
+    <w:bookmarkEnd w:id="51"/>
+    <w:bookmarkStart w:id="175" w:name="bibliography"/>
     <w:p>
       <w:pPr>
         <w:pStyle w:val="Heading1"/>
@@ -5441,8 +5445,8 @@
         <w:t xml:space="preserve">References</w:t>
       </w:r>
     </w:p>
-    <w:bookmarkStart w:id="182" w:name="refs"/>
-    <w:bookmarkStart w:id="61" w:name="X06097e4c5e52362623b7f1c040457eb7d553acc"/>
+    <w:bookmarkStart w:id="174" w:name="refs"/>
+    <w:bookmarkStart w:id="53" w:name="X06097e4c5e52362623b7f1c040457eb7d553acc"/>
     <w:p>
       <w:pPr>
         <w:pStyle w:val="Bibliography"/>
@@ -5528,7 +5532,7 @@
       <w:r>
         <w:t xml:space="preserve"> </w:t>
       </w:r>
-      <w:hyperlink r:id="rId60">
+      <w:hyperlink r:id="rId52">
         <w:r>
           <w:rPr>
             <w:rStyle w:val="Hyperlink"/>
@@ -5537,14 +5541,14 @@
         </w:r>
       </w:hyperlink>
     </w:p>
-    <w:bookmarkEnd w:id="61"/>
-    <w:bookmarkStart w:id="63" w:name="ref-bauer2020AssociationsMetalMixture"/>
+    <w:bookmarkEnd w:id="53"/>
+    <w:bookmarkStart w:id="55" w:name="ref-bauer2020AssociationsMetalMixture"/>
     <w:p>
       <w:pPr>
         <w:pStyle w:val="Bibliography"/>
       </w:pPr>
       <w:r>
-        <w:t xml:space="preserve">Bauer, J.A., Devick, K.L., Bobb, J.F., Coull, B.A., Bellinger, D., Benedetti, C., Cagna, G., Fedrighi, C., Guazzetti, S., Oppini, M., Placidi, D., Webster, T.F., White, R.F., Yang, Q., Zoni, S., Wright, R.O., Smith, D.R., Lucchini, R.G., Henn, B.C., 2020. Associations of a</w:t>
+        <w:t xml:space="preserve">Bauer, J.A., Devick, K.L., Bobb, J.F., Coull, B.A., Bellinger, D., Benedetti, C., Cagna, G., Fedrighi, C., Guazzetti, S., Oppini, M., et al., 2020. Associations of a</w:t>
       </w:r>
       <w:r>
         <w:t xml:space="preserve"> </w:t>
@@ -5615,7 +5619,7 @@
       <w:r>
         <w:t xml:space="preserve"> </w:t>
       </w:r>
-      <w:hyperlink r:id="rId62">
+      <w:hyperlink r:id="rId54">
         <w:r>
           <w:rPr>
             <w:rStyle w:val="Hyperlink"/>
@@ -5624,8 +5628,8 @@
         </w:r>
       </w:hyperlink>
     </w:p>
-    <w:bookmarkEnd w:id="63"/>
-    <w:bookmarkStart w:id="65" w:name="ref-bellinger1992LowLevelLeadExposure"/>
+    <w:bookmarkEnd w:id="55"/>
+    <w:bookmarkStart w:id="57" w:name="ref-bellinger1992LowLevelLeadExposure"/>
     <w:p>
       <w:pPr>
         <w:pStyle w:val="Bibliography"/>
@@ -5672,7 +5676,7 @@
       <w:r>
         <w:t xml:space="preserve"> </w:t>
       </w:r>
-      <w:hyperlink r:id="rId64">
+      <w:hyperlink r:id="rId56">
         <w:r>
           <w:rPr>
             <w:rStyle w:val="Hyperlink"/>
@@ -5681,8 +5685,8 @@
         </w:r>
       </w:hyperlink>
     </w:p>
-    <w:bookmarkEnd w:id="65"/>
-    <w:bookmarkStart w:id="67" w:name="ref-burkner2017BrmsPackageBayesian"/>
+    <w:bookmarkEnd w:id="57"/>
+    <w:bookmarkStart w:id="59" w:name="ref-burkner2017BrmsPackageBayesian"/>
     <w:p>
       <w:pPr>
         <w:pStyle w:val="Bibliography"/>
@@ -5756,7 +5760,7 @@
       <w:r>
         <w:t xml:space="preserve"> </w:t>
       </w:r>
-      <w:hyperlink r:id="rId66">
+      <w:hyperlink r:id="rId58">
         <w:r>
           <w:rPr>
             <w:rStyle w:val="Hyperlink"/>
@@ -5765,8 +5769,8 @@
         </w:r>
       </w:hyperlink>
     </w:p>
-    <w:bookmarkEnd w:id="67"/>
-    <w:bookmarkStart w:id="69" w:name="ref-ciyer2025BayesianMetaanalysis21st"/>
+    <w:bookmarkEnd w:id="59"/>
+    <w:bookmarkStart w:id="61" w:name="ref-ciyer2025BayesianMetaanalysis21st"/>
     <w:p>
       <w:pPr>
         <w:pStyle w:val="Bibliography"/>
@@ -5789,7 +5793,7 @@
       <w:r>
         <w:t xml:space="preserve"> </w:t>
       </w:r>
-      <w:hyperlink r:id="rId68">
+      <w:hyperlink r:id="rId60">
         <w:r>
           <w:rPr>
             <w:rStyle w:val="Hyperlink"/>
@@ -5798,8 +5802,8 @@
         </w:r>
       </w:hyperlink>
     </w:p>
-    <w:bookmarkEnd w:id="69"/>
-    <w:bookmarkStart w:id="71" w:name="Xa2086c2c3f6a9ac4b676f66b1cdbbd5efdb3b23"/>
+    <w:bookmarkEnd w:id="61"/>
+    <w:bookmarkStart w:id="63" w:name="Xa2086c2c3f6a9ac4b676f66b1cdbbd5efdb3b23"/>
     <w:p>
       <w:pPr>
         <w:pStyle w:val="Bibliography"/>
@@ -5866,7 +5870,7 @@
       <w:r>
         <w:t xml:space="preserve"> </w:t>
       </w:r>
-      <w:hyperlink r:id="rId70">
+      <w:hyperlink r:id="rId62">
         <w:r>
           <w:rPr>
             <w:rStyle w:val="Hyperlink"/>
@@ -5875,8 +5879,8 @@
         </w:r>
       </w:hyperlink>
     </w:p>
-    <w:bookmarkEnd w:id="71"/>
-    <w:bookmarkStart w:id="73" w:name="X93c1fc7f8e1220d02cbab90c02ac44248f2b23e"/>
+    <w:bookmarkEnd w:id="63"/>
+    <w:bookmarkStart w:id="65" w:name="X93c1fc7f8e1220d02cbab90c02ac44248f2b23e"/>
     <w:p>
       <w:pPr>
         <w:pStyle w:val="Bibliography"/>
@@ -5887,7 +5891,7 @@
       <w:r>
         <w:t xml:space="preserve"> </w:t>
       </w:r>
-      <w:hyperlink r:id="rId72">
+      <w:hyperlink r:id="rId64">
         <w:r>
           <w:rPr>
             <w:rStyle w:val="Hyperlink"/>
@@ -5896,8 +5900,8 @@
         </w:r>
       </w:hyperlink>
     </w:p>
-    <w:bookmarkEnd w:id="73"/>
-    <w:bookmarkStart w:id="75" w:name="ref-chang2006LowBloodLead"/>
+    <w:bookmarkEnd w:id="65"/>
+    <w:bookmarkStart w:id="67" w:name="ref-chang2006LowBloodLead"/>
     <w:p>
       <w:pPr>
         <w:pStyle w:val="Bibliography"/>
@@ -5908,7 +5912,7 @@
       <w:r>
         <w:t xml:space="preserve"> </w:t>
       </w:r>
-      <w:hyperlink r:id="rId74">
+      <w:hyperlink r:id="rId66">
         <w:r>
           <w:rPr>
             <w:rStyle w:val="Hyperlink"/>
@@ -5917,8 +5921,8 @@
         </w:r>
       </w:hyperlink>
     </w:p>
-    <w:bookmarkEnd w:id="75"/>
-    <w:bookmarkStart w:id="77" w:name="ref-chen2005IQBloodLead"/>
+    <w:bookmarkEnd w:id="67"/>
+    <w:bookmarkStart w:id="69" w:name="ref-chen2005IQBloodLead"/>
     <w:p>
       <w:pPr>
         <w:pStyle w:val="Bibliography"/>
@@ -6040,7 +6044,7 @@
       <w:r>
         <w:t xml:space="preserve"> </w:t>
       </w:r>
-      <w:hyperlink r:id="rId76">
+      <w:hyperlink r:id="rId68">
         <w:r>
           <w:rPr>
             <w:rStyle w:val="Hyperlink"/>
@@ -6049,8 +6053,8 @@
         </w:r>
       </w:hyperlink>
     </w:p>
-    <w:bookmarkEnd w:id="77"/>
-    <w:bookmarkStart w:id="79" w:name="ref-crump2013StatisticalReevaluationData"/>
+    <w:bookmarkEnd w:id="69"/>
+    <w:bookmarkStart w:id="71" w:name="ref-crump2013StatisticalReevaluationData"/>
     <w:p>
       <w:pPr>
         <w:pStyle w:val="Bibliography"/>
@@ -6073,7 +6077,7 @@
       <w:r>
         <w:t xml:space="preserve"> </w:t>
       </w:r>
-      <w:hyperlink r:id="rId78">
+      <w:hyperlink r:id="rId70">
         <w:r>
           <w:rPr>
             <w:rStyle w:val="Hyperlink"/>
@@ -6082,8 +6086,8 @@
         </w:r>
       </w:hyperlink>
     </w:p>
-    <w:bookmarkEnd w:id="79"/>
-    <w:bookmarkStart w:id="81" w:name="ref-dantzer2020ComparisonBloodToenails"/>
+    <w:bookmarkEnd w:id="71"/>
+    <w:bookmarkStart w:id="73" w:name="ref-dantzer2020ComparisonBloodToenails"/>
     <w:p>
       <w:pPr>
         <w:pStyle w:val="Bibliography"/>
@@ -6094,7 +6098,7 @@
       <w:r>
         <w:t xml:space="preserve"> </w:t>
       </w:r>
-      <w:hyperlink r:id="rId80">
+      <w:hyperlink r:id="rId72">
         <w:r>
           <w:rPr>
             <w:rStyle w:val="Hyperlink"/>
@@ -6103,14 +6107,14 @@
         </w:r>
       </w:hyperlink>
     </w:p>
-    <w:bookmarkEnd w:id="81"/>
-    <w:bookmarkStart w:id="83" w:name="X6bc65313eadd1b86059eb4ba10c8cf9d91be17d"/>
+    <w:bookmarkEnd w:id="73"/>
+    <w:bookmarkStart w:id="75" w:name="X6bc65313eadd1b86059eb4ba10c8cf9d91be17d"/>
     <w:p>
       <w:pPr>
         <w:pStyle w:val="Bibliography"/>
       </w:pPr>
       <w:r>
-        <w:t xml:space="preserve">Desrochers-Couture, M., Oulhote, Y., Arbuckle, T.E., Fraser, W.D., Séguin, J.R., Ouellet, E., Forget-Dubois, N., Ayotte, P., Boivin, M., Lanphear, B.P., Muckle, G., 2018. Prenatal, concurrent, and sex-specific associations between blood lead concentrations and</w:t>
+        <w:t xml:space="preserve">Desrochers-Couture, M., Oulhote, Y., Arbuckle, T.E., Fraser, W.D., Séguin, J.R., Ouellet, E., Forget-Dubois, N., Ayotte, P., Boivin, M., Lanphear, B.P., et al., 2018. Prenatal, concurrent, and sex-specific associations between blood lead concentrations and</w:t>
       </w:r>
       <w:r>
         <w:t xml:space="preserve"> </w:t>
@@ -6139,7 +6143,7 @@
       <w:r>
         <w:t xml:space="preserve"> </w:t>
       </w:r>
-      <w:hyperlink r:id="rId82">
+      <w:hyperlink r:id="rId74">
         <w:r>
           <w:rPr>
             <w:rStyle w:val="Hyperlink"/>
@@ -6148,14 +6152,14 @@
         </w:r>
       </w:hyperlink>
     </w:p>
-    <w:bookmarkEnd w:id="83"/>
-    <w:bookmarkStart w:id="85" w:name="Xadfdab0209e4a364d9fdcffecfddb00700d2db9"/>
+    <w:bookmarkEnd w:id="75"/>
+    <w:bookmarkStart w:id="77" w:name="Xadfdab0209e4a364d9fdcffecfddb00700d2db9"/>
     <w:p>
       <w:pPr>
         <w:pStyle w:val="Bibliography"/>
       </w:pPr>
       <w:r>
-        <w:t xml:space="preserve">Dimitrov, L.V., Kaminski, J.W., Holbrook, J.R., Bitsko, R.H., Yeh, M., Courtney, J.G., O’Masta, B., Maher, B., Cerles, A., McGowan, K., Rush, M., 2024. A</w:t>
+        <w:t xml:space="preserve">Dimitrov, L.V., Kaminski, J.W., Holbrook, J.R., Bitsko, R.H., Yeh, M., Courtney, J.G., O’Masta, B., Maher, B., Cerles, A., McGowan, K., et al., 2024. A</w:t>
       </w:r>
       <w:r>
         <w:t xml:space="preserve"> </w:t>
@@ -6223,7 +6227,7 @@
       <w:r>
         <w:t xml:space="preserve"> </w:t>
       </w:r>
-      <w:hyperlink r:id="rId84">
+      <w:hyperlink r:id="rId76">
         <w:r>
           <w:rPr>
             <w:rStyle w:val="Hyperlink"/>
@@ -6232,8 +6236,8 @@
         </w:r>
       </w:hyperlink>
     </w:p>
-    <w:bookmarkEnd w:id="85"/>
-    <w:bookmarkStart w:id="87" w:name="ref-earl2016LowlevelEnvironmentalLead"/>
+    <w:bookmarkEnd w:id="77"/>
+    <w:bookmarkStart w:id="79" w:name="ref-earl2016LowlevelEnvironmentalLead"/>
     <w:p>
       <w:pPr>
         <w:pStyle w:val="Bibliography"/>
@@ -6244,7 +6248,7 @@
       <w:r>
         <w:t xml:space="preserve"> </w:t>
       </w:r>
-      <w:hyperlink r:id="rId86">
+      <w:hyperlink r:id="rId78">
         <w:r>
           <w:rPr>
             <w:rStyle w:val="Hyperlink"/>
@@ -6253,8 +6257,8 @@
         </w:r>
       </w:hyperlink>
     </w:p>
-    <w:bookmarkEnd w:id="87"/>
-    <w:bookmarkStart w:id="89" w:name="X4707f3a4b72a0982487545f9dc3d674642af108"/>
+    <w:bookmarkEnd w:id="79"/>
+    <w:bookmarkStart w:id="81" w:name="X4707f3a4b72a0982487545f9dc3d674642af108"/>
     <w:p>
       <w:pPr>
         <w:pStyle w:val="Bibliography"/>
@@ -6277,7 +6281,7 @@
       <w:r>
         <w:t xml:space="preserve"> </w:t>
       </w:r>
-      <w:hyperlink r:id="rId88">
+      <w:hyperlink r:id="rId80">
         <w:r>
           <w:rPr>
             <w:rStyle w:val="Hyperlink"/>
@@ -6286,8 +6290,8 @@
         </w:r>
       </w:hyperlink>
     </w:p>
-    <w:bookmarkEnd w:id="89"/>
-    <w:bookmarkStart w:id="91" w:name="X5615fc1cb9c455a90da75660348bda09fd0f967"/>
+    <w:bookmarkEnd w:id="81"/>
+    <w:bookmarkStart w:id="83" w:name="X5615fc1cb9c455a90da75660348bda09fd0f967"/>
     <w:p>
       <w:pPr>
         <w:pStyle w:val="Bibliography"/>
@@ -6331,7 +6335,7 @@
       <w:r>
         <w:t xml:space="preserve"> </w:t>
       </w:r>
-      <w:hyperlink r:id="rId90">
+      <w:hyperlink r:id="rId82">
         <w:r>
           <w:rPr>
             <w:rStyle w:val="Hyperlink"/>
@@ -6340,14 +6344,14 @@
         </w:r>
       </w:hyperlink>
     </w:p>
-    <w:bookmarkEnd w:id="91"/>
-    <w:bookmarkStart w:id="93" w:name="ref-figueroa2024LossCognitiveFunction"/>
+    <w:bookmarkEnd w:id="83"/>
+    <w:bookmarkStart w:id="85" w:name="ref-figueroa2024LossCognitiveFunction"/>
     <w:p>
       <w:pPr>
         <w:pStyle w:val="Bibliography"/>
       </w:pPr>
       <w:r>
-        <w:t xml:space="preserve">Figueroa, J.L., Rodríguez-Atristain, A., Bautista-Arredondo, L.F., Treviño, C.L., Martínez, M.R., Valdivia, B.T., Avalos-Alvarez, S.V., Sánchez-Morales, J.E., Fuller, R., Bautista-Arredondo, S., Téllez-Rojo, M.M., 2024. Loss of cognitive function in</w:t>
+        <w:t xml:space="preserve">Figueroa, J.L., Rodríguez-Atristain, A., Bautista-Arredondo, L.F., Treviño, C.L., Martínez, M.R., Valdivia, B.T., Avalos-Alvarez, S.V., Sánchez-Morales, J.E., Fuller, R., Bautista-Arredondo, S., et al., 2024. Loss of cognitive function in</w:t>
       </w:r>
       <w:r>
         <w:t xml:space="preserve"> </w:t>
@@ -6364,7 +6368,7 @@
       <w:r>
         <w:t xml:space="preserve"> </w:t>
       </w:r>
-      <w:hyperlink r:id="rId92">
+      <w:hyperlink r:id="rId84">
         <w:r>
           <w:rPr>
             <w:rStyle w:val="Hyperlink"/>
@@ -6373,8 +6377,8 @@
         </w:r>
       </w:hyperlink>
     </w:p>
-    <w:bookmarkEnd w:id="93"/>
-    <w:bookmarkStart w:id="94" w:name="X21bf392f662dc1b38e9a7fa4b314fc7a471696b"/>
+    <w:bookmarkEnd w:id="85"/>
+    <w:bookmarkStart w:id="86" w:name="X21bf392f662dc1b38e9a7fa4b314fc7a471696b"/>
     <w:p>
       <w:pPr>
         <w:pStyle w:val="Bibliography"/>
@@ -6404,8 +6408,8 @@
         <w:t xml:space="preserve">.</w:t>
       </w:r>
     </w:p>
-    <w:bookmarkEnd w:id="94"/>
-    <w:bookmarkStart w:id="96" w:name="ref-gelman2013Chapter4Asymptotics"/>
+    <w:bookmarkEnd w:id="86"/>
+    <w:bookmarkStart w:id="88" w:name="ref-gelman2013Chapter4Asymptotics"/>
     <w:p>
       <w:pPr>
         <w:pStyle w:val="Bibliography"/>
@@ -6455,7 +6459,7 @@
       <w:r>
         <w:t xml:space="preserve"> </w:t>
       </w:r>
-      <w:hyperlink r:id="rId95">
+      <w:hyperlink r:id="rId87">
         <w:r>
           <w:rPr>
             <w:rStyle w:val="Hyperlink"/>
@@ -6464,8 +6468,8 @@
         </w:r>
       </w:hyperlink>
     </w:p>
-    <w:bookmarkEnd w:id="96"/>
-    <w:bookmarkStart w:id="98" w:name="ref-gelman2020BayesianWorkflow"/>
+    <w:bookmarkEnd w:id="88"/>
+    <w:bookmarkStart w:id="90" w:name="ref-gelman2020BayesianWorkflow"/>
     <w:p>
       <w:pPr>
         <w:pStyle w:val="Bibliography"/>
@@ -6485,7 +6489,7 @@
       <w:r>
         <w:t xml:space="preserve"> </w:t>
       </w:r>
-      <w:hyperlink r:id="rId97">
+      <w:hyperlink r:id="rId89">
         <w:r>
           <w:rPr>
             <w:rStyle w:val="Hyperlink"/>
@@ -6494,8 +6498,8 @@
         </w:r>
       </w:hyperlink>
     </w:p>
-    <w:bookmarkEnd w:id="98"/>
-    <w:bookmarkStart w:id="100" w:name="ref-goodman2023SexDifferencePre"/>
+    <w:bookmarkEnd w:id="90"/>
+    <w:bookmarkStart w:id="92" w:name="ref-goodman2023SexDifferencePre"/>
     <w:p>
       <w:pPr>
         <w:pStyle w:val="Bibliography"/>
@@ -6506,7 +6510,7 @@
       <w:r>
         <w:t xml:space="preserve"> </w:t>
       </w:r>
-      <w:hyperlink r:id="rId99">
+      <w:hyperlink r:id="rId91">
         <w:r>
           <w:rPr>
             <w:rStyle w:val="Hyperlink"/>
@@ -6515,8 +6519,8 @@
         </w:r>
       </w:hyperlink>
     </w:p>
-    <w:bookmarkEnd w:id="100"/>
-    <w:bookmarkStart w:id="102" w:name="X035620408d1fb22c7ed381e74f0468c30df4612"/>
+    <w:bookmarkEnd w:id="92"/>
+    <w:bookmarkStart w:id="94" w:name="X035620408d1fb22c7ed381e74f0468c30df4612"/>
     <w:p>
       <w:pPr>
         <w:pStyle w:val="Bibliography"/>
@@ -6554,7 +6558,7 @@
       <w:r>
         <w:t xml:space="preserve"> </w:t>
       </w:r>
-      <w:hyperlink r:id="rId101">
+      <w:hyperlink r:id="rId93">
         <w:r>
           <w:rPr>
             <w:rStyle w:val="Hyperlink"/>
@@ -6563,8 +6567,8 @@
         </w:r>
       </w:hyperlink>
     </w:p>
-    <w:bookmarkEnd w:id="102"/>
-    <w:bookmarkStart w:id="104" w:name="ref-halabicky2023LowLevelLead"/>
+    <w:bookmarkEnd w:id="94"/>
+    <w:bookmarkStart w:id="96" w:name="ref-halabicky2023LowLevelLead"/>
     <w:p>
       <w:pPr>
         <w:pStyle w:val="Bibliography"/>
@@ -6587,7 +6591,7 @@
       <w:r>
         <w:t xml:space="preserve"> </w:t>
       </w:r>
-      <w:hyperlink r:id="rId103">
+      <w:hyperlink r:id="rId95">
         <w:r>
           <w:rPr>
             <w:rStyle w:val="Hyperlink"/>
@@ -6596,14 +6600,14 @@
         </w:r>
       </w:hyperlink>
     </w:p>
-    <w:bookmarkEnd w:id="104"/>
-    <w:bookmarkStart w:id="106" w:name="ref-harari2018BloodLeadLevels"/>
+    <w:bookmarkEnd w:id="96"/>
+    <w:bookmarkStart w:id="98" w:name="ref-harari2018BloodLeadLevels"/>
     <w:p>
       <w:pPr>
         <w:pStyle w:val="Bibliography"/>
       </w:pPr>
       <w:r>
-        <w:t xml:space="preserve">Harari, F., Sallsten, G., Christensson, A., Petkovic, M., Hedblad, B., Forsgard, N., Melander, O., Nilsson, P.M., Borné, Y., Engström, G., Barregard, L., 2018. Blood</w:t>
+        <w:t xml:space="preserve">Harari, F., Sallsten, G., Christensson, A., Petkovic, M., Hedblad, B., Forsgard, N., Melander, O., Nilsson, P.M., Borné, Y., Engström, G., et al., 2018. Blood</w:t>
       </w:r>
       <w:r>
         <w:t xml:space="preserve"> </w:t>
@@ -6641,7 +6645,7 @@
       <w:r>
         <w:t xml:space="preserve"> </w:t>
       </w:r>
-      <w:hyperlink r:id="rId105">
+      <w:hyperlink r:id="rId97">
         <w:r>
           <w:rPr>
             <w:rStyle w:val="Hyperlink"/>
@@ -6650,8 +6654,8 @@
         </w:r>
       </w:hyperlink>
     </w:p>
-    <w:bookmarkEnd w:id="106"/>
-    <w:bookmarkStart w:id="108" w:name="Xec30ec7c912152a14c0f622040312567154bf15"/>
+    <w:bookmarkEnd w:id="98"/>
+    <w:bookmarkStart w:id="100" w:name="Xec30ec7c912152a14c0f622040312567154bf15"/>
     <w:p>
       <w:pPr>
         <w:pStyle w:val="Bibliography"/>
@@ -6743,7 +6747,7 @@
       <w:r>
         <w:t xml:space="preserve"> </w:t>
       </w:r>
-      <w:hyperlink r:id="rId107">
+      <w:hyperlink r:id="rId99">
         <w:r>
           <w:rPr>
             <w:rStyle w:val="Hyperlink"/>
@@ -6752,14 +6756,14 @@
         </w:r>
       </w:hyperlink>
     </w:p>
-    <w:bookmarkEnd w:id="108"/>
-    <w:bookmarkStart w:id="110" w:name="ref-hay2025Burden375Diseases"/>
+    <w:bookmarkEnd w:id="100"/>
+    <w:bookmarkStart w:id="102" w:name="ref-hay2025Burden375Diseases"/>
     <w:p>
       <w:pPr>
         <w:pStyle w:val="Bibliography"/>
       </w:pPr>
       <w:r>
-        <w:t xml:space="preserve">Hay, S.I., Ong, K.L., Santomauro, D.F., A, B., Aalipour, M.A., Aalruz, H., Ababneh, H.S., Abaraogu, U.O., Abate, B.B., Abbafati, C., Abbas, N., Abbasifard, M., Abbasi-Kangevari, M., Abd ElHafeez, S., Abdalla, A.N., Abdalla, M.A., Abdallah, E.M., Abdeeq, B.A., Abdel Razeq, N.M.I., Abdelgalil, A.A., Abdel-Hameed, R., Abdelmasseh, M., Abdelnabi, M., Abdel-Rahman, W.M., Abd-Elsalam, S., Abdi, S., Abdollahi, M., Abdoun, M., Abdous, A., Abdul Aziz, J.M., Abdulah, D.M., Abdulkader, R.S., Abdullahi, A., Abdullahi, A., Abdul-Rahman, T., Abdykerimova, K., Abebe Getahun, H., Abedi, A., Abedi, A., Abejew, A.A., Abeldaño Zuñiga, R.A., Abhilash, E.S., Abid, S.U.A., Abidi, S.H., Abie, A., Abiodun, O.O., Abiodun, O., Aboagye, R.G., Abohashem, S., Abolhassani, H., Abonie, U.S., Abourashed, N.M., Abouzid, M., Abramov, D., Abreu, L.G., Abtahi, D., Abu Farha, R.K., Abuadas, F.H.A., Abubakar, A.K., Abubakar, B., Abu-Gharbieh, E., Abuhammad, S., Abuhelwa, A.Y., Abukhadijah, H.J., Abu-Rmeileh, N.M., Aburuz, S., Abushanab, D., Achar, R.R., Acharya, A.B., Acharya, A., Ackerman, I.N., Acuna, J.M., Adal, O., Adams, L.C., Adamu, L.H., Adane, M.M., Addisu, Z.D., Addo, I.Y., Adeagbo, O.A., Adebisi, T.A., Adedeji, I.A., Adedia, D., Adedokun, K.A., Adedoyin, R.A., Adegbile, O.E., Adegboye, O.A., Adegoke, N.A., Adeleke, O.T., Adesina, I.A., Adesina, M.A., Adewuyi, H.O., Adeyeoluwa, T.E., Adeyomoye, O.I., Adhikari, K., Adhikary, R.K., Adiga, U., Adnan, M., Adnani, Q.E.S., Adoma, P.O., Adzigbli, L.A., Adzrago, D., Affinito, G., Afifi, A.M., Afolabi, A.A., Afolabi, R.F., Afzal, S., Agafari, G.B., Agampodi, S.B., Ageru, T.A., Aggarwal, N., Aghaalikhani, M., Aghajanian, S., Aghamir, S.M.K., Agostinis Sobrinho, C., Agrawal, A., Agyemang-Duah, W., Ahadi, M., Ahinkorah, B.O., Ahmad, A., Ahmad, D., Ahmad, F., Ahmad, K., Ahmad, K., Ahmad, M.M., Ahmad, N., Ahmad, R., Ahmad, S., Ahmad, T., Ahmad, W., Ahmadi, N.S., Ahmadzade, A.M., Ahmadzade, M., Ahmed, A.O., Ahmed, A., Ahmed, A., Ahmed, G.S., Ahmed, H., Ahmed, J., Ahmed, L.A., Ahmed, M.S., Ahmed, M.S., Ahmed, M.B., Ahmed, M., Ahmed, O., Ahmed, S., Ahmed, S.M., Aimagambetova, G., Aj Jabbar, A., Ajala, D.E., Ajami, M., Ajose, A.O., Akbarialiabad, H., Akbarifard, S., Akeju, O., Akhigbe, R.E., Akinkuotu, O.A., Akinosoglou, K., Akkaif, M.A., Akkala, S., Akosile, W., Akram, H., Akrami, A.E., Akyea, R.K., Al Amiry, A., Al Awaidy, S., Al Hasan, S.M., Al Omari, O., Al Qadire, M., Al Ta’ani, O., Al Taie, W.A.M., Al Thaher, Y., Al Zaabi, O.A.M., Al Zoubi, M.A.M., Al-Abbadi, M.A., Al-Ajlouni, Y., Alalwan, T.A., Al-Aly, Z., Alam, K., Alam, M., Alam, M.K., Alam, M., Al-Amer, R.M., Alamrew, A., Alansari, A., Alanzi, T.M., Al-Ashwal, F.Y., Al-Asmar, R., Alavi, S.M.A., Albashtawy, M., Al-Dalakta, A., Aldawsari, K.A., Aldhaleei, W.A., Aldossary, M.S., Aldridge, R.W., Alebshehy, R., Aleidi, S.M., Alemayehu, B.A., Alemayehu, T.T., Alemnew, F., Alemu, M.B., Al-Eyadhy, A., Alfalki, A.M., Algahtani, F.D., Algammal, A.M., Algethami, M.R., Al-Gheethi, A.A.S., Al-Habbal, K., Alhabib, K.F., Alhaji, N.B., Al-Hajj, S., Alhalaiqa, F.N., Al-Hanawi, M.K., Alhassan Ibrahim, A., Alhumaidi, A., Alhumaydhi, F.A., Alhuwail, D., Ali, A., Ali, H.M., Ali, I., Ali, M., Ali, M.D., Ali, M.U., Ali, R., Ali, S., Ali, S.S., Ali, S.Y., Ali, W., Al-Ibraheem, A., Alicandro, G., Al-Iede, M., Alif, S.M., Alipour, M., Al-Jabi, S.W., Aljasir, M.A., Aljofan, M., Al-Jumaily, A., Aljunid, S.M., Alkhatib, A., Alkhatib, M.H., Alkhawam, M., Allahbakhshian, A., Allemailem, K.S., Allouh, M.Z., Almagharbeh, W.T., Almahmeed, W., Al-Marwani, S., Almasri, N.A., Almazan, J.U., Al-Mekhlafi, H.M., Almidani, O., Almobayed, A., Alnawafleh, K.A., Alniss, H.Y., Alocious Sukumar, M.B., Alomari, M.A., Alosta, M.R., Alqahtani, J.S., Alqahtani, S.A., Alqudimat, M.R., Al-Qudimat, A.R., Alrawashdeh, A., Alrimawi, I., Alrousan, S.M., Al-Sabah, S.K., Alsabri, M.A., Alshahrani, N.Z., Alshehri, M.A., Altaany, Z., Altaf, A., Al-Tammemi, A.B., Al-Tawfiq, J.A., Althobiani, M.A., Altirkawi, K.A., Alvarez-Galvez, J., Alves Carneiro, V.L., Alvis-Guzman, N., Alvis-Zakzuk, N.J., Alwafi, H., Al-Wardat, M., Al-Worafi, Y.M., Aly, H., Alyahya, M.S.I., AlZahmi, A., Alzahrani, H., Alzoubi, K.H., Al-Zubayer, M.A., Amaechi, U.A., Amafah, E.J., Amafah, J., Aman Mohammadi, M., Amani-Beni, R., Amegah, A.K., Amer, F., Amidi, B., Amin, A., Amin, T.T., Amindarolzarbi, A., Amini, S., Amini-Salehi, E., Aminu, N., Aminzare, M., Amiri, S., Amlag, J.O., Amugsi, D.A., Amzat, J., Anagnostakis, F., Ananda, R.A., Ancuceanu, R., Anderlini, D., Anderson, D.B., Anderson, J.A., Androudi, S., Anenberg, S.C., Ang, S.P., Angus, C., Anh, N.H., Ankomah, S.E., Annadurai, K., Anoushiravani, A., Ansari, I., Ansari, S., Ansari, U., Anteneh, R.M., Antó, J.M., Antony, C.M., Antriyandarti, E., Anuoluwa, B.S., Anwar, S., Anwar, S.L., Anwer, R., Anwer, S., Anyasodor, A.E., Apostol, G.L.C., Arab, J.P., Arabi, H., Arabloo, J., Arafat, M., Aravkin, A.Y., Areda, D., Arias De La Torre, J., Ariffin, H., Armocida, B., Ärnlöv, J., Arockiaraj, J., Arooj, M., Artamonov, A.A., Artanti, K.D., Aruleba, R.T., Arumuganainar, D., Aryntayeva, N., Asadi Anar, M., Asaduzzaman, M., Asdaq, S.M.B., Asefa, S.M., Asemu, M.T., Asgary, S., Asghari-Jafarabadi, M., Ashbaugh, C., Ashraf, S.A., Ashraf, T., Ashrafi, M., Ashrafizadeh, M., Asiamah-Asare, B.K.Y., Aslam, M.S., Aslani, S., Asri, Y., Assembekov, B., Astell-Burt, T., Ataei, M., Athari, M., Athari, S.S., Atout, M.M.W., Atre, S.R., Atreya, A., Atta, J.A., Atwan, Z.A., Aumoldaeva, Z.M., Ausloos, M., Avan, A., Avelar, N.C.P., Awan, S.J., Awosile, B.B., Awotidebe, A.W., Ayana, L.A.A., Ayatizadeh, S.H., Ayinde, O.O., Ayipo, Y.O., Ayyoubzadeh, S.M., Azadi, D., Azadnajafabad, S., Azarboo, A., Azargoonjahromi, A., Azhar, M., Azimi, F., Aziz, M.Y., Aziz, S.A., Azizan, A., Azzam, A.Y., Azzolino, D., Babandi, Z.S., Babiker, R., Babu, G.R., Bacha, I.T., Badar, M., Badiye, A.D., Badran, A.A., Bae, Y., Bagga, A., Baghdadi, S., Bagheri, N., Bagheri, S., Baghizadeh, E., Baghizadeh, F., Baghizadeh, S., Baghlaf, K.K., Bahmanziari, N., Bahrami, M.A., Bahreini, R., Bai, R., Baig, A.A., Baigi, V., Bakkannavar, S.M., Bako, A.T., Balakrishnan, S., Balcha, W.F., Balkis, M., Balmori-de-la-Miyar, J., Balooch Hasankhani, M., Baltatu, O.C., Bamashmous, S., Banach, M., Banakar, M., Banik, P.C., Banik, R., Barati, S., Barengo, N.C., Barker-Collo, S.L., Barqawi, H.J., Barreras Beltran, I.A., Barrow, A., Barteit, S., Barua, L., Bashar, M.A., Basharat, Z., Bashir, S., Basile, G., Baskaran, P., Basri, R., Bassat, Q., Bastan, M.-M., Basu, S., Basu, S., Batra, K., Baune, B.T., Bayat, M., Bayat Tork, M.A., Bayih, M.T., Bayisa, F.S., Bayleyegn, N.S., Beaney, T., Bedi, N., Beeraka, N.M., Behera, P., Behjati, J., Behnam, B., Behnoush, A.H., Bekele, B.K., Belayneh, A.G., Belayneh, M., Belete, A.C., Belge Bilgin, G., Belingheri, M., Bello, M.B., Bello, O.O., Belo, L., Beloukas, A., Bendak, S., Bendardaf, R., Benjet, C., Bennett, D.A., Bensenor, I.M., Bente Kamal Tune, S.N., Benzian, H., Berezvai, Z., Bergami, M., Berhie, A.Y., Berihun, A.A., Bermudez, A.N.C., Bernabe, E., Bernstein, R.S., Bettencourt, P.J.G., Bhadoria, A.S., Bhagavathula, A.S., Bhala, N., Bhandari, J., Bhangdia, K., Bharadwaj, R., Bhaskar, S., Bhat, A.N., Bhat, A., Bhat, V., Bhattacharjee, P., Bhattacharjee, S., Bhatti, G.K., Bhatti, J.S., Bhatti, M.S., Bhatti, R., Bhuyan, S.S., Biadgilign, S.K., Bievel-Radulescu, R., Bilgin, C., Bilgin, C., Biroudian, S., Bisignano, C., Biswas, A., Biswas, B., Biswas, R.K., Bitar, A.N., Bitew, M., Bizzozero-Peroni, B., Bjertness, E., Blyth, F.M., Bodhare, T., Bodolica, V., Bodur, M., Bohn, L., Bokota, R., Bolarinwa, O.A., Bolla, S.R., Bolourinejad, P., Bonny, A., Boppana, S.H., Bora Basara, B., Bordbar, S., Borhany, H., Botero Carvajal, A., Bouaoud, S., Boufous, S., Bourne, R.R.A., Boxe, C., Bozic, M.M., Brahmaiah, J., Braithwaite, D., Breitborde, N.J.K., Brenner, H., Brewer, E.D., Britton, G., Brown, J., Browne, A.J., Brugha, T., Buchweitz, C., Bugiardini, R., Bui, L.P., Bulamu, N.B., Bunare, T.S., Buonsenso, D., Burhan, A., Burkart, K., Burns, R.A., Busch, F., Busse, R., Bustanji, Y., Butt, Z.A., Buxbaum, C., C J, S., Cagney, J., Cai, T., Cairns, R., Barsbay, M. Çakmak, Calina, D., Cámera, L.A., Campos, L.A., Campos-Nonato, I., Cao, F., Cao, Y., Capodici, A., Cárdenas, R., Carr, S., Carreras, G., Carrero, J.J., Carter, A., Carugno, A., Carvalho, A.F., Carvalho-e-Silva, A.P., Castaldelli-Maia, J.M., Castañeda-Orjuela, C.A., Castelpietra, G., Catapano, A.L., Cattaruzza, M.S., Caye, A., Cederroth, C.R., Cegolon, L., Cembranel, F., Cenderadewi, M., Cercy, K.M., Cerin, E., Cerrai, S., Cevik, M., Chakkere Shivamadhu, M., Chakraborty, C., Chakraborty, P.A., Chakraborty, S., Chandan, J.S., Chandika, R.M., Chandradasa, M., Chandrasekar, E.K., Chang, J.-C., Chattu, V.K., Chatzimavridou-Grigoriadou, V., Chau, L.D., Chaudhuri, S., Chaurasia, A., Chemeda, G.B., Chen, A.-T., Chen, C.S., Chen, G., Chen, H., Chen, H., Chen, H., Chen, J., Chen, M.X., Chen, S., Chen, S., Chen, X., Chen, Y., Cheng, H., Cheung, K.C., Chew, N.W., Chi, G., Chien, J.-H., Chimed-Ochir, O., Ching, P.R., Chirinos-Caceres, J.L., Chisari, C.G., Cho, W.C.S., Chong, B., Chong, Y.Y., Chou, H.I., Chowdhury, E.K., Chowdhury, M.A.K., Christensen, H., Christensen, S.W.M., Chu, D.-T., Chukwu, I.S., Chung, E., Chung, E., Chung, S.-C., Chung, S., Chutiyami, M., Cicero, A.F.G., Ciobanu, L.G., Cogen, R.M., Cohen, A.J., Columbus, A., Conde, J., Congly, S.E., Conrad, N., Conti, S., Corda, M.O., Corlateanu, A., Cortese, S., Cortesi, P.A., Cosma, C., Cousin, E., Cowart, E.J., Criqui, M.H., Crist, A., Cruz, J.A., Cruz-Martins, N., Cui, X., Culbreth, G.T., Dababo, N., Dabbagh, A., Dadras, O., Dahiru, T., Dai, X., Dai, Z., Dalakoti, M., Dalal, K., Dalla Costa, G., Damiani, G., D’Amico, E., Damtew, Y.T., Daniel, R.A.A., D’Anna, L., Danpanichkul, P., Darcho, S.D., Dardas, L.A., Darouei, B., Darvishi Cheshmeh Soltani, R., Dastiridou, A., Davey, G., Dávila-Cervantes, C.A., Davis Weaver, N., Davletov, D., Davletov, K., Davoudi, E., De La Hoz, F.P., De Luca, K., DeCleene, N.K., Dee, E.C., Deegan, O., Deekonda, S., Deen, A., Degenhardt, L., Dehesh, P., Deitesfeld, L., Dejenie, T.A., Delbari, P., Delsoz, M., Demeke, D., Demetriades, A.K., Demsie, D.G., Denova-Gutiérrez, E., Derese, T.N., Dergaa, I., Derseh, H.A., Dervišević, E., Desta, A.A., Devanbu, V.G.C., Devarakonda, P.K., Dewan, S.M.R., Dhali, A., Dhama, K., Dhamija, R.K., Dhane, A.S., Dhania, N.K., Dhimal, M.L., Dhimal, M., Dhingra, S., Dhungel, B., Di Pumpo, M., Dias Da Silva, D., Diaz, D., Diaz, L.A., Didehvar, K., Dillard, L.K., Dima, A., Ding, X., Dinkayehu, T.E., Do, H.P., Do, T.H.P., Dokova, K.G., Dolecek, C., Dominguez, R.-M.V., Dondi, F., D’Oria, M., Dorostkar, F., Doshi, O.P., Dourado, P.M.M., Dowou, R.K., Dresse, M.T., Driscoll, T.R., Dsouza, A.C., Dsouza, V.S., Du, J., Dube, J., Dumbili, E.W., Dumith, S.C., Dunne, J., Duraes, A.R., Duraisamy, S., Durojaiye, O.C., Dutta, A.K., Dziedzic, A.M., E’mar, A.R., Ebohon, O., Eboreime, E., Ebraheim, L.L.M., Ebrahimi, A., Ebrahimi, M.H., Ebrahimi, S., Ed-Dra, A., Edelduok, E.G., Edvardsson, K., Efendi, F., Eftekhari, B., Eghbali, F., Ehsani, F., Eighaei Sedeh, A., Eikemo, T.A., Eini, E., Ekholuenetale, M., Ekundayo, T.C., El Arab, R.A., El Omri, A., El Sayed Zaki, M., Eladl, M.A., Elahi, R., El-Ashker, S., Elbeshbeishy, R., Elemam, N.M., ElGohary, G.M.T., Elhadi, M., Elhoumed, M., El-Huneidi, W., Elkannishy, S., Elmeligy, O.A.A., Elmorsi, R., Elmoselhi, A.B., Elnaem, M.H., ELNahas, G., Elshaer, M., Elsohaby, I., Eltahawy, A.S.A., Emagneneh, T., Emeto, T.I., Emojevwe, V.O., Endeshaw, D., Endriyas, M., Erskine, H.E., Esezobor, C.I., Eshetu, D., Eshetu, H.B., Eshun, G., Eskandarieh, S., Eslami, M., Espírito Santo, R.C.D., Esposito, F., Estep, K., Estrada, C.A.M., Eva, F.N., Ezenwankwo, E., Fadaka, A.O., Fadavian, H., Fagbamigbe, A.F., Fahim, A., Fakhradiyev, I.R., Fakhri-Demeshghieh, A., Fan, Q., Farahmand, M., Faraon, E.J.A., Fareed, M., Farhana, Z., Farinha, C.S.E.S., Faris, M.E.M., Faro, A., Farooq, S.M.Y., Farooque, U., Farrokhpour, H., Farshad, F., Farsi, F., Faruk, M.O., Fasina, F.O., Fasina, M.M., Fasusi, E.T., Fatehizadeh, A., Fathi, D., Fatima, Z., Fazlzadeh, M., Fei, L., Feigin, V.L., Feizkhah, A., Fekadu, G., Feleke, B.E., Feng, D., Feng, K., Feng, X., Ferdous, T.R., Fereshtehnejad, S.-M., Fernandez-Jimenez, R., Ferrara, P., Ferrari, A.J., Ferreira, A., Ferreira, N., Feter, N., Finnemore, A., Fiorilla, C., Fischer, F., Fitriana, I., Flor, L.S., Fogacci, F., Folayan, M.O., Fonzo, M., Force, L.M., Fornari, A., Fornari, C., Forthun, I., Fortuna, D., Foschi, M., Fotouhi, M., Fowobaje, K.R., Foyet F, J.V., Franklin, R.C., Freitas, A., Fu, J., Fullman, N., Fux, B., G, S., Gaal, P.A., Gadeka, D.D., Gajdács, M., Galali, Y., Gallus, S., Ganapathy, D., Gangachannaiah, S., Ganie, M.A., Gao, D., Gao, X., Garba, B., Garcia, F.B., Garcia, V., Garcia-Argibay, M., Garcia-Azorin, D., Gardner, W.M., Garlasco, J., Gatzioufas, Z., Gautam, P., Gautam, R.K., Gazzelloni, F., Gebre, F.S., Gebregergis, M.W., Gebreslassie, H.G., Gelibter, S., George, N.S., Gerami Matin, A., Getahun, G.K., Gete, K.Y., Ghadimi, D.J., Ghadiri, K., Ghadirian, F., Ghaffari Jolfayi, A., Ghamari, S.-H., Ghamkhar, A., Ghandili, A., Ghasemi, M., Ghasemi, M.-R., Ghasemi Assl, S., Ghasrsaz, H., Ghazy, R.M., Ghimire, S., Ghith, N., Gholizadeh, N., Ghotbi, E., Gialluisi, A., Giannakis, K., Gibson, R.M., Gil, A.U., Gil, G.F., Gilani, S.A., Gilbertson, N.M., Gill, T.K., Ginindza, T.G., Giri, B.R., Girmay, A.A., Girombelli, A., Gnedovskaya, E.V., Göbölös, L., Gohari, K., Golechha, M., Goleij, P., Golestani, A., Golinelli, D., Golmohammadi, M., Gong, W., Gopalani, S.V., Goshu, Y.A., Goulart, A.C., Goyal, A., Grada, A., Graham, S.M., Grieco, V., Grivna, M., Grover, A., Guadie, H.A., Guan, S.-Y., Guan, Z., Guarducci, G., Gubari, M.I.M., Guha, A., Gunawardane, D.A., Guo, X., Guo, Z., Guo, Z., Guo, Z., Gupta, A.K., Gupta, H., Gupta, I., Gupta, L., Gupta, R.D., Gupta, R., Gupta, S., Gupta, V.B., Gupta, V.K., Gupta, V., Gupta, V.K., Guracho, Y.D., Gurmessa, L., Gutiérrez, R.A., Gutiérrez-Murillo, R.S., Guttoo, P., Guzman-Esquivel, J., Habibzadeh, A., Habteyes, A.T., Habteyohannes, A.D., Hadaro, T.S., Hadi, N.R., Hadian, Z., Hafiz, A., Haghdoost, F., Haghtalab, A., Hagins, H., Haile, D., Hailu, H.E., Halder, P., Halimi, A., Haller, S., Hama Aziz, K.H., Hamad, I.M., Hamadeh, R.R., Hamdy, N.M., Hameed, S., Hamilton, E.B., Hammoud, A., Hamza, M., Hamza, U.S., Han, H., Han Yekdeş, D., Hanif, A., Hanifi, N., Hankey, G.J., Hanna, F., Haque, A., Haque, M.A., Haque, M.N., Harapan, H., Harb, H.L., Harding, K.L., Hargono, A., Hariandja, A.M.A., Haro, J.M., Harris, A.A., Has, E.M.M., Hasaballah, A.I., Hasan, F., Hasan, M.K., Hasani, H., Hasanpour- Dehkordi, A., Hashem Zadeh, A., Hashempur, M.H., Hashim, N.T., Hasnain, A., Hassan, A., Hassan, I.N., Hassan, I., Hassan, N., Hassan Zadeh Tabatabaei, M.S., Hassani, S., Hassen, M.B., Hathagoda, L.W., Havmoeller, R.J., Hawat, A., Hayat, K., Hbid, Y., He, J., He, J., Hebert, J.J., Heidari, M., Hemmati, M., Henson, C.A., Herbert, M.E., Herteliu, C., Heuer, A., Hewage, S.A., Heydari, M., Heydarifard, Z., Hezam, K., Hiraike, Y., Holla, R., Hon, J., Hossain, A., Hossain, L., Hossain, M.B., Hossain, M.M., Hossain, M.S., Hossain, M.B., Hosseinzadeh, H., Hosseinzadeh, M., Hostiuc, M., Hostiuc, S., Houser, J.A., Htay, M.N.N., Hu, C., Hu, Y., Huang, J., Huang, W., Huang, Y., Huda, M.H., Human, A.I., Humphrey, K.M., Hushmandi, K., Husøy, A.K., Hussain, J., Hussain, M.A., Hussain, S., Hussein, D., Hussein, N.R., Husseiny, M.I., Huynh, H.-H., Hwang, B.-F., Iannone, L.F., Ibrahim, A., Ibrahim, K.S., Ibrahim, R., Ibrahim, R., Ibrayeva, A., Idalsoaga, F.J., Iftikhar, P.M., Ihler, A.L., Ikeda, N., Ikiroma, A., Ikram, J., Ilesanmi, O.S., Ilic, I.M., Ilic, M.D., Ilyas, M.H., Imam, M.T., Imani, M., Immurana, M., Imoh, L.C., Inbaraj, L.R., Inok, A., Iqbal, M., Irham, L.M., Isa, M.A., Islam, D.M.S., Islam, M.R., Islam, M.S., Islami, F., Ismail, F., Ismail, N.E., Ismoldayev, Y., Iso, H., Isola, G., Ituka, M.C., Iwagami, M., Iwu-Jaja, C.J., Iyamu, I.O., Iyer, M., Iyer, V.J., J, V., Jaafari, J., Jacob, L., Jacobsen, K.H., Jadidi, A., Jadidi-Niaragh, F., Jafarinia, M., Jaffar, S., Jahrami, H., Jairoun, A.A., Jaiswal, V., Jakovljevic, M., Jaliliyan, A., Jalilzadeh Yengejeh, R., Jalloh, M., Jamal, A., Jamal, Q.M.S., Jamaluddin, J., James, J., James, T.G., Jamil, H., Jamil, S., Jamora, R.D.G., Jamshidi, M., JamshidiRastabi, S., Janardhanan, R., Jarrahi, E., Javaid, S.S., Javanmardi, A., Javidnia, J., Jawaid, T., Jawell Odah Abed, Q., Jayasinghe, R.D., Jayasinghe, Y.A., Jayatilleke, A.U., Jazi, K., Jebasingh, F.K., Jee, S.H., Jeganathan, J., Jember, T.H., Jena, B.H., Jena, D., Jeong, S., Jessri, M., Jeswani, B.M., Jha, V., Ji, Z., Jiang, M., Jin, W., Jin, W., Johnson, C.O., Johnson, E.K., Jokar, M., Jonas, J.B., Joo, T., Jor, A., Joseph, A., Joseph, A., Joseph, N., Joshua, C.E., Joukar, F., Joy, G., Jozwiak, J.J., Jürisson, M., Juweid, M.E., K, M., Kaambwa, B., Kabir, Z., Kadir, D.H.H., Kahn, E.M., Kakkar, A.K., Kalankesh, L.R., Kalavani, K., Kaliyadan, F., Kaliyakparova, A., Kalra, S., Kamal, M.M., Kamal, M., Kamarajah, S.K., Kamath, R., Kamenova, S., Kamireddy, A., Kamorudeen, R.T., Kamyshnyi, O., Kan, H., Kanaan, M., Kanaan, S.F., Kang, J., Kankam, S.B., Kanmodi, K.K., Kannan, S., Kannan S, S., Kantar, R.S., Kapoor, N., Kar, S.K., Karakasis, P., Karasneh, R.A., Karimi, H., Karimi Behnagh, A., Karkhah, S., Karobari, M.I., Karpiński, T.M., Kashyap, M.K., Kaso, A.W., Kasraei, H., Kassaw, N.A., Katamreddy, A., Katoto, P.D., Kauppila, J.H., Kayode, G.A., Kazemi Rad, N., Keivanlou, M.-H., Keiyoro, P.N., Keke, C., Kempen, J.H., Kerai, S., Keshri, V.R., Keshtkar, K., Kesse-Guyot, E., Khademi, R., Khader, Y.S., Khaing, I.K., Khajuria, H., Khalid, S., Khalid-Ariturk, S., Khalifa, H.O., Khalifeh, A.H., Khalil, A.A., Khalil, M., Khalili, A., Khalili, P., Khalili-Tanha, G., Khalis, M., Khamesipour, F., Khan, A.A., Khan, A., Khan, A., Khan, F.U., Khan, M., Khan, M.A.S., Khan, M.I., Khan, M.J., Khan, M.H., Khan, M.M., Khan, M.U., Khan, M.U., Khan, N., Khan, R., Khan, S.A., Khan, S., Khan, S., Khan, Y.S., Khan, Z., Khanal, S., Khanal, V., Khanmohammadi, S., Khasbage, S.U., Khashim, Z., Khatab, K., Khatatbeh, H., Khatatbeh, M.M., Khatri, K., Khayat Kashani, H.R., Khazaei, A., Kheirandish Zarandi, P., Khokhar, S.K., Khonji, M.S., Khoshnaw, N.S.H., Khosla, A.A., Khosravi, F., Khosrowjerdi, M., Khuman, P.R., Khusun, H., Kifle, Z.D., Kim, H.J., Kim, J., Kim, M.S., Kim, S., Kimokoti, R.W., Kinfu, Y., Kirk, M., Kisa, A., Kisa, S., Kissimova-Skarbek, K., Kivimäki, M., Klusty, J., Km, A.B., Km, S., Knudsen, A.K.S., Kobyliak, N., Kocarnik, J.M., Kochhar, S., Kokkorakis, M., Kolahi, A.-A., Kolieghu Tcheumeni, D.G., Kompani, F., Kondybayeva, A., Konstas, A.G.P., Koomson, I., Koren, G., Kormoker, T., Korzh, O., Kostev, K., Kotsis, K., Koul, A., Koul, P.A., Koulmane Laxminarayana, S.L., Kretchy, I.A., Kretchy, J.-P., Krishan, K., Kua, C.-H., Kuanar, A., Kuate Defo, B., Kuchay, R.A.H., Kucuk Bicer, B., Kuddus, M., Kuitunen, I., Kujan, O., Kujur, A., Kulimbet, M., Kulkarni, V., Kulshreshtha, S., Kumar, D., Kumar, D., Kumar, J., Kumar, M., Kumar, N., Kumar, N., Kumar, R., Kumar, S.K., Kumar, T., Kumar, V., Kumaran, S., Kunjavara, J., Kunutsor, S.K., Kurmanova, A., Kurmi, O.P., Kurniasari, M.D., Kurpad, K.P., Kushawaha, P.K., Kusnali, A., Kustanti, C.Y., Kusuma, D., Kutluk, T., Kuttybayev, A., Kwarteng, M.A., Kwong, W.H.P., Kyei, E.F., Kyei, G.K., Kytö, V., Kyu, H.H., L C, P., La Vecchia, A., La Vecchia, C., Ladan, M.A., Laflamme, L., Lahariya, C., Lai, D.T.C., Lakhani, A., Lal, D.K., Lalloo, R., Lallukka, T., Lám, J., Landires, I., Langguth, B., Laplante-Lévesque, A., Lasrado, S., Latief, K., Lau, K.K.L., Lawal, B.K., Lawal, B.K., Lawal, S.A., Lawan, A., Lawford, H.L.S., Lawlor, H.R., Le, D.Q., Le, D.H., Le, H.-H., Le, L.K.D., Le, M.H.N., Le, N.H.H., Le, T.T.T., Le, T.D.T., Ledda, C., Lee, H.A., Lee, S.W., Lee, W.-C., Lee, Y.H., Leigh, J., Leivaditis, V., Lennon, M.J., Leonardi, M., Leong, E., Leung, J., Li, C., Li, H., Li, H., Li, J., Li, J., Li, J., Li, J., Li, M.-C., Li, P., Li, S., Li, W.-Z., Li, W., Li, W., Li, W., Li, W., Li, X., Li, Y., Li, Y., Li, Z., Li, Z., Lian, Y., Liang, X.-Z., Lim, S.S., Lin, J., Lin, Q., Lin, R.-T., Lin, Y., Lindholm, D., Linehan, C., Ling, Y., Liu, G., Liu, H., Liu, J., Liu, X., Liu, X., Liu, X., Liu, Y., Liu, Y., Llanaj, E., Loftus, M.J., Lohner, V., López-Gil, J.F., Lopukhov, P.D., Lorkowski, S., Lotfizadeh, M., Luan, S., Lubinda, J., Lucas, T., Lucchetti, G., Lugo, A., Lunevicius, R., Luo, P., Lusk, J.B., Lutambi, A.M., Lutzky Saute, R., Lytras, M.D., Lytvyak, E., M Amin, H.I., Ma, K.S.-K., Ma, Z.F., Mabrok, M., Machado, I.E., Madadi, F., Madinezad, S.A., Madsen, C., Madureira-Carvalho, A.M., Magdy Abd El Razek, M., Maghazachi, A.A., Mahadeshwara Prasad, D.R., Mahalingam, S., Mahalleh, M., Mahmood, N.H., Mahmoudi, A., Mahmoudi, F., Mai, M.T., Maiti, R., Majeed, A., Makris, K.C.C., Malekpour, M.-R., Malekzadeh, R., Malhotra, H.S., Malik, A.A., Malik, F., Malik, T., Malta, D.C., Mamun, A.A., Mangdow, M., Manjani, L., Manla, Y., Mannethodi, K., Mansoor, F., Mansourian, M., Mansournia, M.A., Mantilla Herrera, A.M., Mantovani, L.G., Mao, C., Maqbool, T., Maqsood, S., Marateb, H.R., Maravilla, J.C., Margetis, K., Marino, M., Marques, A., Martin, R.V., Martinez, G., Martinez-Guerra, B.A., Martinez-Piedra, R., Martini, D., Martins-Melo, F.R., Martorell, M., März, W., Marzo, R.R., Marzouk, S., Masi, S., Matei, C.N., Mathangasinghe, Y., Mathieson, S., Mathioudakis, A.G., Mathur, M.R., Mathur, M., Matozinhos, F.P., Mattiello, R., Mattoo, K.A., Maude, R.J., Maulik, P.K., May, M.L., Mayeli, M., Mazaheri, M., Mazzotti, A., Mbachu, C.N.P., Mbachu, I.I., McKee, M., McLaughlin, S.A., McPhail, S.M., Mechili, E.A., Mediratta, R.P., Meena, J., Meftah, E., Mehari, M., Mehmood, A., Mehndiratta, M.M., Mehrabi Nasab, E., Mehta, K.M., Mehta, V., Mehto, S., Meier, T., Mekene Meto, T., Meles, H.N., Melese, E.B., Melwani, S., Memetova, A., Mendoza, W., Menezes, G.A., Menezes, R.G., Mengistie, B.A., Mengistie, E.A., Meo, S.A., Mercogliano, M., Meretoja, A., Meretoja, T.J., Mestrovic, T., Mettananda, C.D.K., Mettananda, S., Metwally, M.M.M., Mewton, L., Mhlanga, A., Michelerio, A., Micheletti Gomide Nogueira De Sá, A.C., Mideksa, H.S., Miller, P.A., Miller, T.R., Minervini, G., Ming, W., Mini, G., Mirghafourvand, M., Mirrakhimov, E.M., Mirshahvalad, S.A., Mirutse, M.K., Mirzaei, Y., Mishra, A., Mishra, K.G., Mishra, V., Misra, A.K., Mitchell, P.B., Mithra, P., Mitra, S., Mittinty, M.M.M., Moazeni, M., Mobayen, M., Moberg, M.E., Modi, S., Mohamadkhani, A., Mohamed, J., Mohamed, M.G., Mohamed, N.S., Mohamed Ahmed, K.A.H., Mohammad, T., Mohammad-Alizadeh-Charandabi, S., Mohammadi, A., Mohammadi, M.R., Mohammadi, S.O., Mohammadian-Hafshejani, A., Mohammadzadeh, I., Mohammadzadeh, R., Mohammed, A.S., Mohammed, H., Mohammed, O., Mohammed, S., Mohammed, S., Mohammed, Y., Mohan, S., Mohanta, Y.K., Mohseni, M., Mokari-Yamchi, A., Mokdad, A.H., Mokhirev, A., Mokhtarzadehazar, P., Molinaro, S., Mollaei, A., Momani, S., Monasta, L., Monazzami, A., Mondal, H., Mondello, S., Montasir, A.A., Moore, C.E., Moradi, Y., Moradi-Lakeh, M., Moraga, P., Morawska, L., Moreira, R.S., Morgan, B.W., Morovatdar, N., Morovvati, M., Morsy, M.M., Morze, J., Mosaddeghi Heris, R., Mosser, J.F., Motamedgorji, N., Mougin, V., Mouodi, S., Mousavi, A., Mousavi, S.Z., Mousavi Khaneghah, A., Mousavi Kiasary, S.M.S., Mousnad, M.A.A., Movo, A., Mowafy, H.L., Mozahheb Yousefi, K., Mrejen, M., Msherghi, A., Mubarak, R., Mubarik, S., Mudgal, S.K., Muhammad, S.A., Muhtar, M.S., Mukherjee, S., Mukherjee, S., Mukhopadhyay, A., Mukhopadhyay, S., Muktadir, M.A., Mulatu, S., Mulita, F., Mulu, G.B., Mulugeta, C., Mulyadi, M., Muneer, M.A., Muniyandi, M., Munjal, K., Munkhsaikhan, Y., Muñoz Laguna, J., Munshi, A., Muragundi, P.M., Murakami, M., Muse, Y.H., Mushtaq, A., Mustafa, G., Mustafa, S.I., Mustapha, M.T., Muthu, S., Muthupandian, S., Muvunyi, C.M., Muzaffar, M., Myung, W., Nabavi, A., Naddafi, F., Nagarajan, A.J., Nagaraju, S.P., Naghavi, M., Naghavi, P., Naik, G.R., Naik, G., Naik, H., Nainu, F., Nair, S., Najdaghi, S., Nakhostin Ansari, N., Nam, P., Nangia, V., Nansseu, J.R., Naqid, I.A., Nargus, S., Narimani Davani, D., Nartey, Y., Nascimento, B.R., Nascimento, G.G., Naser, A.Y., Naser, M., Nashwan, A.J., Nasiri, H., Nassar, M., Natto, Z.S., Nauman, J., Naureen, Z., Navaratna, S.N.K., Nawaz, A., Nawaz, M.O., Nayak, B.P., Nayak, S.G., Nazari, J., Nchanji, G.T., Ndejjo, R., Ndungu, A.W., Nega, A.T., Negash, A.A., Negoi, I., Negoi, R.I., Negru, A.G., Nejati, J., Nejjari, C., Nepal, S., Nesbit, O.D., Netsere, H.B., Newton, C.R.J., Ng, M., Nguefack-Tsague, G., Ngunjiri, J.W., Nguyen, A.T.H., Nguyen, C.T., Nguyen, H.L.T., Nguyen, H.-D.T., Nguyen, N.P., Nguyen, P.T., Nguyen, T.P., Nguyen, T., Nguyen, T.A., Nguyen, V.T., Ngwa, A.M., Niazi, R.K., Nie, J., Nieddu, L., Nigatu, Y.T., Nikoobar, A., Ningrum, D.N.A., Niranjan, V., Nisro, A.M., Nkeck, J.R., Nkrumah-Boateng, P.A., Nnaji, C.A., Noman, E.A., Nomura, S., Noor, S.T.A., Noorafrooz, M., Noormohammadpour, P., Noreen, M., Noroozi, M., Noubiap, J.J., Noyes, T., Nriagu, V.C., Nri-Ezedi, C.A., Nshimiyimana, J.C., Nugen, F., Nugusa, A.N., Nunemo, M.H., Nur, A., Nurrika, D., Nyadanu, S.D., Nyande, F.K., Nzoputam, C.I., Nzoputam, O.J., Oancea, B., Obaido, G., O’Connell, E.M., Odama, A.M., Odat, R.M., Oddi, F.M., Odetokun, I.A., Odukoya, O.O., Oduro, J.K., Oduro, M.S., Oghenetega, O.B., Ogundijo, O.A., Ogunkoya, A., Oguta, J.O., Oh, D., Oh, S., O’Hagan, E.T., Okati-Aliabad, H., Okeke, S.R., Okeke-Obayemi, D.O., Okekunle, A.P., Okesanya, O.J., Okoli, O.A., Okonji, O.C., Okunlola, J.O., Okunlola, O.A., Olabisi, O.I., Olagunju, A.T., Olalusi, O.V., Olatubi, M.I., Oliveira, A.B., Oliveira, G.M.M., Olorukooba, A.A., Olson, E.J., Oludoye, O.O., Olum, R., Olusanya, B.O., Olusanya, J.O., Oluwole, O.G., Omage, F.B., Omar, H.A., Omer, G.L., Ong, Q.C., Onie, S., Onwujekwe, O.E., Opara, F., Opitz, M., Ordak, M., Orish, V.N., Ornello, R., Orscelik, A., Ortiz, A., Ortiz-Prado, E., Osborne, A., Osei, E., Ostroff, S.M., Ostrominski, J.W., Osuagwu, U.L., Osuolale, O., Otchere, G., Othman, E.H., Othman, M.M., Otoiu, A., Otorkpa, O.J., Oumer, A., Ouner, J.J., Ouyahia, A., Ouyang, G., Owolabi, M.O., Owusu, I.A., Oyebola, K., Oyelade, T., Oyeyemi, O.T., Ozsahin, I., P A, M., Pacheco-Barrios, K., Padda, I., Padron-Monedero, A., Padubidri, J.R., Pak, A., Pal, P.K., Palicz, T., Palladino, R., Palma-Alvarez, R.F., Paluvai, T., Pan, F., Pan, H.-F., Panahi, P., Panda, S.K., Panda-Jonas, S., Pande Katare, D., Pang, K., Pangaribuan, H.U., Panos, G.D., Panos, L.D., Pantazopoulos, I., Paolino, G., Papa, M.V., Papadimopoulos, I., Papadopoulou, P., Parekh, U., Parhizkar Roudsari, P., Parida, A., Park, C., Park, E.-K., Park, S., Parmar, A., Parve, S., Pashaei, A., Passera, R., Patel, B.H., Patel, H.M., Patel, M., Patel, N.N., Patel, S., Patil, A., Patil, S., Patoulias, D., Patra, A., Patwary, M.H., Paul, H., Pawar, S., Pawar, S., Pazoki Toroudi, H., Peden, A.E., Pedersini, P., Pekarcikova, J., Pepito, V.C.F., Peprah, P., Perdigão, J., Pereira, G., Pereira, M.O., Perez-Lopez, P., Perico, N., Perna, S., Pesudovs, K., Petakh, P., Peter, O.J., Petermann-Rocha, F.E., Pham, H.N., Pham, N.T., Pham, T.T., Philip, A.K., Phillips, M.R., Phyo, Z., Pickering, B.V., Pigott, D.M., Pillay, J.D., Pinheiro Rocha, L.P., Piracha, Z.Z., Piradov, M.A., Pirera, E., Pisoni, E., Plass, D., Plotnikov, E., Podder, I., Poddighe, D., Polibin, R.V., Pollner, P., Poluru, R., Pon Avudaiappan, A., Pond, C.D., Ponkilainen, V.T., Popa, I., Popova, S., Popovic, D.S., Postma, M.J., Pourasghary, S., Pourbabaki, R., Pourghazi, F., Poursadeqiyan, M., Pourtaheri, N., Prabhu, A.R., Prada, S.I., Pradhan, J., Pradhan, P.M.S., Pradipta, R.O., Prakash, P.Y., Prasad, C.P., Prashant, A., Prates, E.J.S., Priscilla, T., Pritchett, N., Priya, H., Purnobasuki, H., Purohit, B.M., Puvvula, J., Qasim, N.H., Qi, X., Qi, Z., Qiu, J.-Y., Quazi, Z.S., Qurashi, S.N., R, D., Rabiee, N., Rachmat, B., Radhakrishnan, R.A., Radhakrishnan, V., Radojčić, M.R., Raeisi Shahraki, H., Rafique, I., Raghav, P., Raghuveer, P., Rahbarnia, L., Rahim, F., Rahim, H.M.-A., Rahimi, S., Rahimi-Movaghar, A., Rahimi-Movaghar, V., Rahman, F.M., Rahman, M., Rahman, M., Rahman, M.M., Rahman, M.H.U., Rahman, M.M., Rahman, M., Rahmani, S., Rahmati, M., Rahmatpour Rokni, G., Rahmoune, H., Rai, P., Raimondo, D., Raimondo, I., Raina, S.K., Raj, J.P., Raja, A., Raja, S., Rajaa, S., Rajabi, E., Rajai Firouzabadi, S., Rajendran, G., Rajendran, J., Rajendran, V., Rajindrajith, S., Rajizadeh, M.A., Rajput, P., Ramadan, M.M., Ramadan, M., Ramadhan, K., Ramasamy, C., Ramasamy, S.K., Ramazanu, S., Ramezani, Z., Ramezani Farani, M., Ramteke, P.W., Rana, J., Rana, S.S., Ranabhat, C.L., Rancic, N., Rani, S., Ranjbar Noei, F., Rao, C.R., Rao, K., Rao, M., Rao, S.J., Rasella, D., Rashedi, V., Rashidi, M.-M., Rasouli, M.A., Rasouli-Saravani, A., Rastogi, P., Rasul, A., Rathish, D., Rauf, A., Rauniyar, S.K., Rautalin, I., Ravangard, R., Ravi, D., Rawaf, D.L., Rawaf, S., Rawassizadeh, R., Rawat, R., Ray, A., Rayati, M., Razeghian, I., Razi, B., Razo, C., Recenti, F., Reddy, M.M.R.K., Redwan, E., Rege, S., Rehman, W., Reifels, L., Remuzzi, G., Ren, L., Renzaho, A.M.N., Resnikoff, S., Reyes, L.F., Rezaei, M., Rezaei, N., Rezaei, N., Rezaei, N., Rezaeian, M., Rhee, T.G., Riaz, M.A., Ribeiro, A.L.P., Rickard, J., Rizvi, M.R., Robinson-Oden, H.E., Rocha, H.A.L., Rocha-Gomes, J.R., Rodrigues, M., Roever, L., Rohloff, P., Rohmah, I., Röhr, S., Rojas-Rueda, D., Rolfzen, M.L., Romadlon, D.S., Romoli, M., Romozzi, M., Ronfani, L., Rosauer, J.J., Roshanshad, A., Rostamian, M., Roth, G.A., Rotimi, K., Rout, H.S., Rouzbahani, H., Rouzbahani, R., Rouzbahani, S., Roy, B., Roy, N., Roy, P., Roy, P., Roy, P., Roy, S., Roy, S., Roy Chowdhury, S., Royapuram Parthasarathy, P., Rubagotti, E., Ruela, G.D.A., Rumisha, S.F., Russo, M., Rwegerera, G.M., S, M., S N, C., Saad, A.M.A., Saad Eddin, A., Saadatian, Z., Saber-Ayad, M.M., Sabet, C.J., Sabour, S., Sadarangani, K.P., Sadat Rafiei, S.K., Saddik, B.A., Sadee, B.A., Sadegh, T., Sadeghi, E., Sadeghi, E., Sadeghi-Ghyassi, F., Saeed, M., Saeed, U., Saeedi, M., Safari, M., Safi, S., Safi, S.Z., Sagar, R., Sagharichi, M., Sagoe, D., Saha, N., Saheb Sharif-Askari, F., Saheb Sharif-Askari, N., Sahebkar, A., Sahoo, P.M., Sahu, K.S., Said, M.S., Saif, Z., Sajadi, S.M., Sajib, M.R.U.Z., Sajid, M.R., Saki, M., Salam, N., Salamati, P., Salaroli, L.B., Saleh, M.A., Salehi, L., Salehi, M., Salem, M.R., Salem, M.Z.Y., Salihu, D., Salimi, S., Sallam, M., Salum, G.A., Salvi, S.S., Samadi Kafil, H., Samaranayake, J.E., Sami, W., Samodra, Y.L., Samuel, V.P., Samy, A.M., Sangle, S.G., Sanjari, E., Sankar, S., Sanmarchi, F., Sanna, F., Santos, L.H.C.C., Santric-Milicevic, M.M., Sao Jose, B.P., Sapkota, K.P., Saraswathy, S.Y.I., Sarfo, J.O., Sarikhani, Y., Sarma, H., Sarmadi, M., Sarode, G.S., Sarode, S.C., Saroshe, S., Sassano, M., Sathian, B., Sathya Narayanan, M.K., Saunders, P.A., Savabi Far, M., Sawhney, M., Saxena, S.G., Saya, G.K., Sayeed, A., Saylan, M., Schinckus, C., Schneider, I.J.C., Schneider, R.D., Schuermans, A., Schumacher, A.E., Schwarz, G., Schwebel, D.C., Schwendicke, F., Schwinger, C., Sedigh, A., Sekaran, S., Šekerija, M., Selvamani, M., Selvaraj, V., Semenova, Y., Semreen, M.H., Sendeku, F.W., Senol, Y.C., Senthilkumaran, S., Sepanlou, S.G., Serban, A.C., Serván-Mori, E., Sethi, Y., Sewor, C., Seyed Alshohadaei, S.M., Seylani, A., Seymour, M., Shadid, J., Shah, N.S., Shah, S., Shaharudin, S., Shahbaz, M., Shahid, S., Shahid, S.A., Shahid, W., Shahini, E., Shahrahmani, F., Shahsavari, H.R., Shahwan, M.J., Shaikh, M.A., Shakeri, A., Shakerimoghaddam, A., Shalash, A.S., Sham, S., Shamim, M.A., Shams, F., Shams-Beyranvand, M., Shamshirgaran, M.A., Shamsi, A., Shamsutdinova, A., Shan, D., Shankar, A., Shannawaz, M., Shao, X., Sharifan, A., Sharifi Rad, J., Sharma, A., Sharma, B.K., Sharma, B., Sharma, K., Sharma, M., Sharma, S., Sharma, U., Sharma, V., Shastry, R.P., Shastry, S., Shavandi, A., Shawahna, R., Shayan, M., Shehu Bappah, B., Sheidaei, A., Shenoy, S.M., Sherchan, S.P., Shetty, S.S., Shi, F., Shi, L.-H., Shibani, M., Shibesh, B.F., Shibuya, K., Shiferaw, D., Shimul, M.M.H., Shin, J.I., Shin, M.-J., Shiri, R., Shirkoohi, R., Shittu, A., Shitu, A.O., Shiue, I., Shivarov, V., Shlobin, N.A., Shojaei, S., Shokati Eshkiki, Z., Shokri, A., Shongwe, S.N., Shool, S., Shorofi, S.A., Shrestha, G., Shrestha, S., Shuval, K., Sibuyi, N.R.S., Siddig, E.E., Sidiq, M., Siegel, M., Silva, D.A.S., Silva, G.C.B.D., Silva, J.P., Silva, J.C., Silva, L.M.L.R., Silva De Leonardi, N.J.B., Simkhada, P.P., Singh, A., Singh, A., Singh, A., Singh, B., Singh, B.P., Singh, H., Singh, H., Singh, J., Singh, J.A., Singh, K., Singh, L., Singh, N.P., Singh, P., Singh, P.S., Singh, P.K., Singh, P., Singh, R.K., Singh, S., Singh, S., Singh, S., Sinha, M.K., Sinha, R., Sinto, R., Sirota, S.B., Skou, S.T., Sleet, D.A., Slepak, E.L.N., Sobia, F., Sohel, M., Sohrabi, S., Sokhal, B.S., Solanki, R., Solikhah, S., Soliman, S.S.M., Song, W., Song, Y., Sood, A., Sood, P., Soraneh, S., Sorensen, R.J.D., Soriano, J.B., Sorrentino, M., Sousa, F., Sousa, M.A., Soylu, C., Spartalis, M., Spearman, S., Sra, M.S., Sreeramareddy, C.T., Srichawla, B.S., Srinivasamurthy, S.K., Sriram, S., Stafford, L.K., Stanaway, J.D., Starodubova, A.V., Ştefan, S.C., Stein, C., Stein, D.J., Steiner, C., Steiner, T.J., Steinmetz, J.D., Steiropoulos, P., Stevanović, A., Stockfelt, L., Stovner, L.J., Straif, K., Stubbs, P., Su, Y., Subasi, O., Subedi, N., Suemoto, C.K., Suhag, A., Sui, L., Sukaew, T., Sulaiman, S.K., Suleiman, A.G., Suleiman Odidi, M., Suleman, M., Sulistiyorini, D., Sullman, M.J.M., Sultan Meo, A., Sun, H.Z., Sun, J., Sun, M., Sun, X., Sun, Z., Sun, Z., Sundaragiri, S., Sundaram, T., Sundström, J., Sunkersing, D., Sunny, S., Suresh, V., Swain, C.K., Swart, V.M., Syaiful, D.A., Szarpak, L., Szeto, M.D., T Y, S.S., Tabaee Damavandi, P., Tabarés-Seisdedos, R., Tabatabaeizadeh, S.-A., Tabatabai, S., Tabche, C., Tabibi, R., Tabish, M., Tadakamadla, J., Tadakamadla, S.K., Tafida, B.A., Taghizadeh-Hesary, F., Taheri Abkenar, Y., Taheri Soodejani, M., Taherkhani, A., Taiba, J., Tajabadi, S., Talaat, I.M., Talic, S., Talukder, B., Tampa, M., Tamuzi, J.L., Tan, J., Tan, K.-K., Tanabayeva, S., Tang, H., Tantisattamo, E., Tarigan, I.U., Tariku, M.K., Tariq, S., Tariqujjaman, M., Tat, N.Y., Tavakoli Oliaee, R., Tavakoly, R., Tavangar, S.M., Tedla, M.G., Tefera, A.T., Teimoori, M., Temsah, M.-H., Teply, C., Teramoto, M., Tesfaye, A.H., Tesfu, A.A., Tewari, J., Teymouri, A., Thaher, O., Thangaraju, P., Thankappan, K.R., Thapar, R., Tharwat, I., Tharwat, S., Theyra-Enias, H., Thind, M.K., Thirunavukarasu, A.J., Thiruvengadam, M., Thiruvengadam, R., Thiyagarajan, A., Thomas, N., Thota, G.P., Tian, W., Ticoalu, J.H.V., Tiruye, T.Y., Tleshev, M., Tolani, M.A., Tomo, S., Tonelli, M., Topor-Madry, R., Torkashvand, A., Touvier, M., Tovani-Palone, M.R., Trabelsi, K., Traini, E., Tran, M.T.N., Tran, N.M., Tran, N.H., Tran, Q.T.H., Tran, T.Q.M., Tran, T.H., Tran Minh Duc, N., Trico, D., Trihandini, I., Tromans, S.J., Truong, Q.X.N., Truyen, T.T.T.T., Tsatsakis, A., Tse, G., Tsermpini, E.E., Tudor Car, L., Tuffour Amirikah, M., Tumurkhuu, M., Tuo, Z., Tye, S.C., Udoakang, A.J., Ullah, A., Ullah, H., Ullah, I., Ullah, S., Umair, M., Umapathi, K.K., Umar, L., Umar, M., Umar, M., Umar, S.S., Underwood-Nakamura, A., Upadhya, D., Upadhyay, E., Uppal, D., Urso, D., Usman, J.S., Uzor, K.J., Uzun Ozsahin, D., Uzunçıbuk, H., Vadagam, P., Vahdati, S., Vaithinathan, A.G., Vakili, O., Vakilian, A., Valdez, P.R., Valenti, M., Valizadeh, G., Van Den Eynde, J., Van Der Walt, G., Van Donkelaar, A., Varasteh, J., Varma, R.P., Vart, P., Vasankari, T.J., Vasishta, S., Vasudevan, S.S., Veginadu, P., Vella, A.S., Vellingiri, B., Venketasubramanian, N., Venkidasamy, B., Verma, M., Verma, P., Veroux, M., Verras, G.-I., Vervoort, D., Vidale, S., Villa, S., Villafañe, J.H., Villarreal-Zegarra, D., Violante, F.S., Vipparthy, S.C., Visontay, R., Vitorino, L.M., Vlassov, V., Vojtek, M., Vollset, S.E., Vongpradith, A., Vosoughi, M., Vounzoulaki, E., Vu, H.N., Vu, L., Waheed, Y., Wahidin, M., Walia, M., Wamai, A.W., Wan, J.-Y., Wang, C., Wang, F., Wang, L., Wang, L., Wang, R., Wang, S., Wang, S., Wang, W., Wang, X., Wang, X., Wang, Y., Wang, Y., Wang, Y.-P., Wang, Z., Wani, T.A., Wanjau, M.N., Waqar, A.B., Waqas, M., Ward, P., Wassie, T.H., Weerakoon, K.G., Weerasekara, I., Wei, F.-L., Wei, X., Weintraub, R.G., Weiss, D.J., Weiss, E.J., Wen, Y.F., Werdecker, A., Westerman, R., Whisnant, J.L., Whiteford, H.A., Wiangkham, T., Wibowo, Y.C., Wicaksana, A.L., Wickramasinghe, D.P., Wickramasinghe, N.D., Wiebe, S., Wilandika, A., Willeit, P., Wilson, S., Wireko, A.A., Wirtu, G.K., Wiysonge, C.S., Woday, A.T., Wojewodzic, M.W., Wolf, A.W., Wonde, T.E., Wondmeneh, Y.C., Worede, D.T., Worku, M.C., Worku, N.K., Wu, A.-M., Wu, C., Wu, F., Wu, J.F., Wu, J., Wu, J., Wu, S.-N., Wu, Z., Wubie, Y.M., Xia, Y., Xia, Z., Xiao, G., Xiao, H., Xiao, N., Xie, W., Xing, H., Xu, S., Xu, S., Xu, W., Xu, X., Xu, X., Yadav, M.K., Yadav, V., Yadollahi, M., Yaghoubi, S., Yahoo (Syed), S., Yahya, G., Yamagishi, K., Yan, G., Yang, H., Yang, W., Yang, X., Yano, Y., Yao, H., Yao, L., Yarahmadi, A., Yasin, H., Yassin, M.A., Yasufuku, Y., Yaya, S., Ye, P., Yeganeh, M., Yekdeş, A.C., YektaKooshali, M.H., Yergaliyev, K.A., Yesodharan, R., Yesuf, S.A., Yezli, S., Yi, S., Yigezu, M., Yigzaw, Z.A., Yin, D., Yin, Y., Yip, P., Yismaw, M.B., Yismaw, Y.E., Yon, D.K., Yonemoto, N., Younis, M.Z., Yousuf, A., Yu, C., Yu, J., Yu, Y., Yuh, F.H., Yunus, G., Yunusa, U., Yusuf, A.A., Yuwanati, M., Zadey, S., Zadnik, V., Zafar, M., Zaghampour, M., Zainal Abidin, E., Zakham, F., Zaki, N., Zamagni, G., Zaman, B.A., Zaman, S.B., Zamani, A.S., Zamora, N., Zanghì, A., Zar, H.J., Zarea, K., Zawiah, M., Zeariya, M.G.M., Zenebe, A.M., Zensen, S., Zeru, E.M., Zhan, T., Zhan, Y., Zhang, B., Zhang, C.J.P., Zhang, H., Zhang, J., Zhang, L., Zhang, M., Zhang, X., Zhang, Y., Zhang, Z., Zhao, J., Zhao, S., Zhao, Z., Zheng, J., Zheng, M.-H., Zheng, P., Zhong, C.C., Zhou, J., Zhou, J., Zhou, M., Zhu, B., Zhu, Z., Zhumagaliuly, A., Zielińska, M., Zihao, L., Zoghi, G., Zoromba, M.A., Zou, Z., Zrieq, R.M., Zuhlke, L.J., Zuhriyah, L., Zumla, A., Zyoud, A.H., Zyoud, S.H., Zyoud, S.H., Brauer, M., Vos, T., Murray, C.J.L., Gakidou, E., 2025. Burden of 375 diseases and injuries, risk-attributable burden of 88 risk factors, and healthy life expectancy in 204 countries and territories, including 660 subnational locations, 1990–2023: A systematic analysis for the</w:t>
+        <w:t xml:space="preserve">Hay, S.I., Ong, K.L., Santomauro, D.F., A, B., Aalipour, M.A., Aalruz, H., Ababneh, H.S., Abaraogu, U.O., Abate, B.B., Abbafati, C., et al., 2025. Burden of 375 diseases and injuries, risk-attributable burden of 88 risk factors, and healthy life expectancy in 204 countries and territories, including 660 subnational locations, 1990–2023: A systematic analysis for the</w:t>
       </w:r>
       <w:r>
         <w:t xml:space="preserve"> </w:t>
@@ -6788,7 +6792,7 @@
       <w:r>
         <w:t xml:space="preserve"> </w:t>
       </w:r>
-      <w:hyperlink r:id="rId109">
+      <w:hyperlink r:id="rId101">
         <w:r>
           <w:rPr>
             <w:rStyle w:val="Hyperlink"/>
@@ -6797,8 +6801,8 @@
         </w:r>
       </w:hyperlink>
     </w:p>
-    <w:bookmarkEnd w:id="110"/>
-    <w:bookmarkStart w:id="112" w:name="ref-heidari2022EffectLeadExposurea"/>
+    <w:bookmarkEnd w:id="102"/>
+    <w:bookmarkStart w:id="104" w:name="ref-heidari2022EffectLeadExposurea"/>
     <w:p>
       <w:pPr>
         <w:pStyle w:val="Bibliography"/>
@@ -6821,7 +6825,7 @@
       <w:r>
         <w:t xml:space="preserve"> </w:t>
       </w:r>
-      <w:hyperlink r:id="rId111">
+      <w:hyperlink r:id="rId103">
         <w:r>
           <w:rPr>
             <w:rStyle w:val="Hyperlink"/>
@@ -6830,8 +6834,8 @@
         </w:r>
       </w:hyperlink>
     </w:p>
-    <w:bookmarkEnd w:id="112"/>
-    <w:bookmarkStart w:id="114" w:name="X837f91f784566061977da85c17a5755a81dedde"/>
+    <w:bookmarkEnd w:id="104"/>
+    <w:bookmarkStart w:id="106" w:name="X837f91f784566061977da85c17a5755a81dedde"/>
     <w:p>
       <w:pPr>
         <w:pStyle w:val="Bibliography"/>
@@ -6842,7 +6846,7 @@
       <w:r>
         <w:t xml:space="preserve"> </w:t>
       </w:r>
-      <w:hyperlink r:id="rId113">
+      <w:hyperlink r:id="rId105">
         <w:r>
           <w:rPr>
             <w:rStyle w:val="Hyperlink"/>
@@ -6851,8 +6855,8 @@
         </w:r>
       </w:hyperlink>
     </w:p>
-    <w:bookmarkEnd w:id="114"/>
-    <w:bookmarkStart w:id="116" w:name="ref-hong2013ComparingBayesianFrequentist"/>
+    <w:bookmarkEnd w:id="106"/>
+    <w:bookmarkStart w:id="108" w:name="ref-hong2013ComparingBayesianFrequentist"/>
     <w:p>
       <w:pPr>
         <w:pStyle w:val="Bibliography"/>
@@ -6896,7 +6900,7 @@
       <w:r>
         <w:t xml:space="preserve"> </w:t>
       </w:r>
-      <w:hyperlink r:id="rId115">
+      <w:hyperlink r:id="rId107">
         <w:r>
           <w:rPr>
             <w:rStyle w:val="Hyperlink"/>
@@ -6905,14 +6909,14 @@
         </w:r>
       </w:hyperlink>
     </w:p>
-    <w:bookmarkEnd w:id="116"/>
-    <w:bookmarkStart w:id="118" w:name="ref-hong2015EnvironmentalLeadExposure"/>
+    <w:bookmarkEnd w:id="108"/>
+    <w:bookmarkStart w:id="110" w:name="ref-hong2015EnvironmentalLeadExposure"/>
     <w:p>
       <w:pPr>
         <w:pStyle w:val="Bibliography"/>
       </w:pPr>
       <w:r>
-        <w:t xml:space="preserve">Hong, S.-B., Im, M.-H., Kim, J.-W., Park, E.-J., Shin, M.-S., Kim, B.-N., Yoo, H.-J., Cho, I.-H., Bhang, S.-Y., Hong, Y.-C., Cho, S.-C., 2015. Environmental</w:t>
+        <w:t xml:space="preserve">Hong, S.-B., Im, M.-H., Kim, J.-W., Park, E.-J., Shin, M.-S., Kim, B.-N., Yoo, H.-J., Cho, I.-H., Bhang, S.-Y., Hong, Y.-C., et al., 2015. Environmental</w:t>
       </w:r>
       <w:r>
         <w:t xml:space="preserve"> </w:t>
@@ -6968,7 +6972,7 @@
       <w:r>
         <w:t xml:space="preserve"> </w:t>
       </w:r>
-      <w:hyperlink r:id="rId117">
+      <w:hyperlink r:id="rId109">
         <w:r>
           <w:rPr>
             <w:rStyle w:val="Hyperlink"/>
@@ -6977,8 +6981,8 @@
         </w:r>
       </w:hyperlink>
     </w:p>
-    <w:bookmarkEnd w:id="118"/>
-    <w:bookmarkStart w:id="120" w:name="ref-kazi2026PvaluesBayesFactor"/>
+    <w:bookmarkEnd w:id="110"/>
+    <w:bookmarkStart w:id="112" w:name="ref-kazi2026PvaluesBayesFactor"/>
     <w:p>
       <w:pPr>
         <w:pStyle w:val="Bibliography"/>
@@ -7019,7 +7023,7 @@
       <w:r>
         <w:t xml:space="preserve"> </w:t>
       </w:r>
-      <w:hyperlink r:id="rId119">
+      <w:hyperlink r:id="rId111">
         <w:r>
           <w:rPr>
             <w:rStyle w:val="Hyperlink"/>
@@ -7028,8 +7032,8 @@
         </w:r>
       </w:hyperlink>
     </w:p>
-    <w:bookmarkEnd w:id="120"/>
-    <w:bookmarkStart w:id="122" w:name="X5cae6442bbe0e1f5d8df6cd5008aab2dbfb65a6"/>
+    <w:bookmarkEnd w:id="112"/>
+    <w:bookmarkStart w:id="114" w:name="X5cae6442bbe0e1f5d8df6cd5008aab2dbfb65a6"/>
     <w:p>
       <w:pPr>
         <w:pStyle w:val="Bibliography"/>
@@ -7049,7 +7053,7 @@
       <w:r>
         <w:t xml:space="preserve"> </w:t>
       </w:r>
-      <w:hyperlink r:id="rId121">
+      <w:hyperlink r:id="rId113">
         <w:r>
           <w:rPr>
             <w:rStyle w:val="Hyperlink"/>
@@ -7058,19 +7062,22 @@
         </w:r>
       </w:hyperlink>
     </w:p>
-    <w:bookmarkEnd w:id="122"/>
-    <w:bookmarkStart w:id="124" w:name="ref-lacerda2023GlobalDecreaseBlood"/>
+    <w:bookmarkEnd w:id="114"/>
+    <w:bookmarkStart w:id="116" w:name="ref-lacerda2023GlobalDecreaseBlood"/>
     <w:p>
       <w:pPr>
         <w:pStyle w:val="Bibliography"/>
       </w:pPr>
       <w:r>
-        <w:t xml:space="preserve">Lacerda, D., Pestana, I.A., Santos Vergilio, C.D., de Rezende, C.E., 2023. Global decrease in blood lead concentrations due to the removal of leaded gasoline. Chemosphere 324, 138207.</w:t>
-      </w:r>
-      <w:r>
-        <w:t xml:space="preserve"> </w:t>
-      </w:r>
-      <w:hyperlink r:id="rId123">
+        <w:t xml:space="preserve">Lacerda, D., Pestana, I.A., Santos Vergilio, C.D., de Rezende, C.E.</w:t>
+      </w:r>
+      <w:r>
+        <w:t xml:space="preserve">, 2023. Global decrease in blood lead concentrations due to the removal of leaded gasoline. Chemosphere 324, 138207.</w:t>
+      </w:r>
+      <w:r>
+        <w:t xml:space="preserve"> </w:t>
+      </w:r>
+      <w:hyperlink r:id="rId115">
         <w:r>
           <w:rPr>
             <w:rStyle w:val="Hyperlink"/>
@@ -7079,14 +7086,14 @@
         </w:r>
       </w:hyperlink>
     </w:p>
-    <w:bookmarkEnd w:id="124"/>
-    <w:bookmarkStart w:id="126" w:name="X33f03e29791f20cdbbbbf0729c723b16e55ed16"/>
+    <w:bookmarkEnd w:id="116"/>
+    <w:bookmarkStart w:id="118" w:name="X33f03e29791f20cdbbbbf0729c723b16e55ed16"/>
     <w:p>
       <w:pPr>
         <w:pStyle w:val="Bibliography"/>
       </w:pPr>
       <w:r>
-        <w:t xml:space="preserve">Lanphear, B.P., Hornung, R., Khoury, J., Yolton, K., Baghurst, P., Bellinger, D.C., Canfield, R.L., Dietrich, K.N., Bornschein, R., Greene, T., Rothenberg, S.J., Needleman, H.L., Schnaas, L., Wasserman, G., Graziano, J., Roberts, R., 2019. Erratum:</w:t>
+        <w:t xml:space="preserve">Lanphear, B.P., Hornung, R., Khoury, J., Yolton, K., Baghurst, P., Bellinger, D.C., Canfield, R.L., Dietrich, K.N., Bornschein, R., Greene, T., et al., 2019. Erratum:</w:t>
       </w:r>
       <w:r>
         <w:t xml:space="preserve"> </w:t>
@@ -7139,7 +7146,7 @@
       <w:r>
         <w:t xml:space="preserve"> </w:t>
       </w:r>
-      <w:hyperlink r:id="rId125">
+      <w:hyperlink r:id="rId117">
         <w:r>
           <w:rPr>
             <w:rStyle w:val="Hyperlink"/>
@@ -7148,14 +7155,14 @@
         </w:r>
       </w:hyperlink>
     </w:p>
-    <w:bookmarkEnd w:id="126"/>
-    <w:bookmarkStart w:id="128" w:name="X9a8bad0b78f43066cb333fdedcdcad5d7017900"/>
+    <w:bookmarkEnd w:id="118"/>
+    <w:bookmarkStart w:id="120" w:name="X9a8bad0b78f43066cb333fdedcdcad5d7017900"/>
     <w:p>
       <w:pPr>
         <w:pStyle w:val="Bibliography"/>
       </w:pPr>
       <w:r>
-        <w:t xml:space="preserve">Lanphear, B.P., Hornung, R., Khoury, J., Yolton, K., Baghurst, P., Bellinger, D.C., Canfield, R.L., Dietrich, K.N., Bornschein, R., Greene, T., Rothenberg, S.J., Needleman, H.L., Schnaas, L., Wasserman, G., Graziano, J., Roberts, R., 2005. Low-</w:t>
+        <w:t xml:space="preserve">Lanphear, B.P., Hornung, R., Khoury, J., Yolton, K., Baghurst, P., Bellinger, D.C., Canfield, R.L., Dietrich, K.N., Bornschein, R., Greene, T., et al., 2005. Low-</w:t>
       </w:r>
       <w:r>
         <w:t xml:space="preserve">Level Environmental Lead Exposure</w:t>
@@ -7196,7 +7203,7 @@
       <w:r>
         <w:t xml:space="preserve"> </w:t>
       </w:r>
-      <w:hyperlink r:id="rId127">
+      <w:hyperlink r:id="rId119">
         <w:r>
           <w:rPr>
             <w:rStyle w:val="Hyperlink"/>
@@ -7205,8 +7212,8 @@
         </w:r>
       </w:hyperlink>
     </w:p>
-    <w:bookmarkEnd w:id="128"/>
-    <w:bookmarkStart w:id="130" w:name="ref-lanphear2018LowlevelLeadExposure"/>
+    <w:bookmarkEnd w:id="120"/>
+    <w:bookmarkStart w:id="122" w:name="ref-lanphear2018LowlevelLeadExposure"/>
     <w:p>
       <w:pPr>
         <w:pStyle w:val="Bibliography"/>
@@ -7229,7 +7236,7 @@
       <w:r>
         <w:t xml:space="preserve"> </w:t>
       </w:r>
-      <w:hyperlink r:id="rId129">
+      <w:hyperlink r:id="rId121">
         <w:r>
           <w:rPr>
             <w:rStyle w:val="Hyperlink"/>
@@ -7238,8 +7245,8 @@
         </w:r>
       </w:hyperlink>
     </w:p>
-    <w:bookmarkEnd w:id="130"/>
-    <w:bookmarkStart w:id="132" w:name="ref-larsen2023GlobalHealthBurden"/>
+    <w:bookmarkEnd w:id="122"/>
+    <w:bookmarkStart w:id="124" w:name="ref-larsen2023GlobalHealthBurden"/>
     <w:p>
       <w:pPr>
         <w:pStyle w:val="Bibliography"/>
@@ -7250,7 +7257,7 @@
       <w:r>
         <w:t xml:space="preserve"> </w:t>
       </w:r>
-      <w:hyperlink r:id="rId131">
+      <w:hyperlink r:id="rId123">
         <w:r>
           <w:rPr>
             <w:rStyle w:val="Hyperlink"/>
@@ -7259,14 +7266,14 @@
         </w:r>
       </w:hyperlink>
     </w:p>
-    <w:bookmarkEnd w:id="132"/>
-    <w:bookmarkStart w:id="134" w:name="ref-lee2021PrenatalPostnatalExposures"/>
+    <w:bookmarkEnd w:id="124"/>
+    <w:bookmarkStart w:id="126" w:name="ref-lee2021PrenatalPostnatalExposures"/>
     <w:p>
       <w:pPr>
         <w:pStyle w:val="Bibliography"/>
       </w:pPr>
       <w:r>
-        <w:t xml:space="preserve">Lee, K.-S., Kim, K.-N., Ahn, Y.D., Choi, Y.-J., Cho, J., Jang, Y., Lim, Y.-H., Kim, J.I., Shin, C.H., Lee, Y.A., Kim, B.-N., Hong, Y.-C., 2021. Prenatal and postnatal exposures to four metals mixture and</w:t>
+        <w:t xml:space="preserve">Lee, K.-S., Kim, K.-N., Ahn, Y.D., Choi, Y.-J., Cho, J., Jang, Y., Lim, Y.-H., Kim, J.I., Shin, C.H., Lee, Y.A., et al., 2021. Prenatal and postnatal exposures to four metals mixture and</w:t>
       </w:r>
       <w:r>
         <w:t xml:space="preserve"> </w:t>
@@ -7304,7 +7311,7 @@
       <w:r>
         <w:t xml:space="preserve"> </w:t>
       </w:r>
-      <w:hyperlink r:id="rId133">
+      <w:hyperlink r:id="rId125">
         <w:r>
           <w:rPr>
             <w:rStyle w:val="Hyperlink"/>
@@ -7313,14 +7320,14 @@
         </w:r>
       </w:hyperlink>
     </w:p>
-    <w:bookmarkEnd w:id="134"/>
-    <w:bookmarkStart w:id="136" w:name="X716dc31ca13dac7355fea3a0f7dea95779ecabb"/>
+    <w:bookmarkEnd w:id="126"/>
+    <w:bookmarkStart w:id="128" w:name="X716dc31ca13dac7355fea3a0f7dea95779ecabb"/>
     <w:p>
       <w:pPr>
         <w:pStyle w:val="Bibliography"/>
       </w:pPr>
       <w:r>
-        <w:t xml:space="preserve">Lucchini, R.G., Guazzetti, S., Renzetti, S., Conversano, M., Cagna, G., Fedrighi, C., Giorgino, A., Peli, M., Placidi, D., Zoni, S., Forte, G., Majorani, C., Pino, A., Senofonte, O., Petrucci, F., Alimonti, A., 2019. Neurocognitive impact of metal exposure and social stressors among schoolchildren in</w:t>
+        <w:t xml:space="preserve">Lucchini, R.G., Guazzetti, S., Renzetti, S., Conversano, M., Cagna, G., Fedrighi, C., Giorgino, A., Peli, M., Placidi, D., Zoni, S., et al., 2019. Neurocognitive impact of metal exposure and social stressors among schoolchildren in</w:t>
       </w:r>
       <w:r>
         <w:t xml:space="preserve"> </w:t>
@@ -7343,7 +7350,7 @@
       <w:r>
         <w:t xml:space="preserve"> </w:t>
       </w:r>
-      <w:hyperlink r:id="rId135">
+      <w:hyperlink r:id="rId127">
         <w:r>
           <w:rPr>
             <w:rStyle w:val="Hyperlink"/>
@@ -7352,8 +7359,8 @@
         </w:r>
       </w:hyperlink>
     </w:p>
-    <w:bookmarkEnd w:id="136"/>
-    <w:bookmarkStart w:id="138" w:name="Xb0421be95a139ca5af39ce6040517bf1be79427"/>
+    <w:bookmarkEnd w:id="128"/>
+    <w:bookmarkStart w:id="130" w:name="Xb0421be95a139ca5af39ce6040517bf1be79427"/>
     <w:p>
       <w:pPr>
         <w:pStyle w:val="Bibliography"/>
@@ -7376,7 +7383,7 @@
       <w:r>
         <w:t xml:space="preserve"> </w:t>
       </w:r>
-      <w:hyperlink r:id="rId137">
+      <w:hyperlink r:id="rId129">
         <w:r>
           <w:rPr>
             <w:rStyle w:val="Hyperlink"/>
@@ -7385,8 +7392,8 @@
         </w:r>
       </w:hyperlink>
     </w:p>
-    <w:bookmarkEnd w:id="138"/>
-    <w:bookmarkStart w:id="140" w:name="ref-mcfarland2022HalfUSPopulation"/>
+    <w:bookmarkEnd w:id="130"/>
+    <w:bookmarkStart w:id="132" w:name="ref-mcfarland2022HalfUSPopulation"/>
     <w:p>
       <w:pPr>
         <w:pStyle w:val="Bibliography"/>
@@ -7409,7 +7416,7 @@
       <w:r>
         <w:t xml:space="preserve"> </w:t>
       </w:r>
-      <w:hyperlink r:id="rId139">
+      <w:hyperlink r:id="rId131">
         <w:r>
           <w:rPr>
             <w:rStyle w:val="Hyperlink"/>
@@ -7418,14 +7425,14 @@
         </w:r>
       </w:hyperlink>
     </w:p>
-    <w:bookmarkEnd w:id="140"/>
-    <w:bookmarkStart w:id="141" w:name="X33fe7de6e8b65c86af337dbdb8d7cc8651c48a8"/>
+    <w:bookmarkEnd w:id="132"/>
+    <w:bookmarkStart w:id="133" w:name="X33fe7de6e8b65c86af337dbdb8d7cc8651c48a8"/>
     <w:p>
       <w:pPr>
         <w:pStyle w:val="Bibliography"/>
       </w:pPr>
       <w:r>
-        <w:t xml:space="preserve">Menezes-Filho, J.A., Carvalho, C.F., Rodrigues, J.L.G., Araújo, C.F.S., Dos Santos, N.R., Lima, C.S., Bandeira, M.J., Marques, B.L. de S., Anjos, A.L.S., Bah, H.A.F., Abreu, N., Philibert, A., Mergler, D., 2018. Environmental</w:t>
+        <w:t xml:space="preserve">Menezes-Filho, J.A., Carvalho, C.F., Rodrigues, J.L.G., Araújo, C.F.S., Dos Santos, N.R., Lima, C.S., Bandeira, M.J., Marques, B.L. de S., Anjos, A.L.S., Bah, H.A.F., et al., 2018. Environmental</w:t>
       </w:r>
       <w:r>
         <w:t xml:space="preserve"> </w:t>
@@ -7485,8 +7492,8 @@
         <w:t xml:space="preserve">. International Journal of Environmental Research and Public Health 15, 2418.</w:t>
       </w:r>
     </w:p>
-    <w:bookmarkEnd w:id="141"/>
-    <w:bookmarkStart w:id="143" w:name="ref-needleman1990LowLevelLeadExposure"/>
+    <w:bookmarkEnd w:id="133"/>
+    <w:bookmarkStart w:id="135" w:name="ref-needleman1990LowLevelLeadExposure"/>
     <w:p>
       <w:pPr>
         <w:pStyle w:val="Bibliography"/>
@@ -7548,7 +7555,7 @@
       <w:r>
         <w:t xml:space="preserve"> </w:t>
       </w:r>
-      <w:hyperlink r:id="rId142">
+      <w:hyperlink r:id="rId134">
         <w:r>
           <w:rPr>
             <w:rStyle w:val="Hyperlink"/>
@@ -7557,8 +7564,8 @@
         </w:r>
       </w:hyperlink>
     </w:p>
-    <w:bookmarkEnd w:id="143"/>
-    <w:bookmarkStart w:id="144" w:name="Xf5486a80753c915bf34b5d8f3ad5e46aac479a7"/>
+    <w:bookmarkEnd w:id="135"/>
+    <w:bookmarkStart w:id="136" w:name="Xf5486a80753c915bf34b5d8f3ad5e46aac479a7"/>
     <w:p>
       <w:pPr>
         <w:pStyle w:val="Bibliography"/>
@@ -7612,14 +7619,14 @@
         <w:t xml:space="preserve">.</w:t>
       </w:r>
     </w:p>
-    <w:bookmarkEnd w:id="144"/>
-    <w:bookmarkStart w:id="146" w:name="ref-page2021PRISMA2020Statement"/>
+    <w:bookmarkEnd w:id="136"/>
+    <w:bookmarkStart w:id="138" w:name="ref-page2021PRISMA2020Statement"/>
     <w:p>
       <w:pPr>
         <w:pStyle w:val="Bibliography"/>
       </w:pPr>
       <w:r>
-        <w:t xml:space="preserve">Page, M.J., McKenzie, J.E., Bossuyt, P.M., Boutron, I., Hoffmann, T.C., Mulrow, C.D., Shamseer, L., Tetzlaff, J.M., Akl, E.A., Brennan, S.E., Chou, R., Glanville, J., Grimshaw, J.M., Hróbjartsson, A., Lalu, M.M., Li, T., Loder, E.W., Mayo-Wilson, E., McDonald, S., McGuinness, L.A., Stewart, L.A., Thomas, J., Tricco, A.C., Welch, V.A., Whiting, P., Moher, D., 2021. The</w:t>
+        <w:t xml:space="preserve">Page, M.J., McKenzie, J.E., Bossuyt, P.M., Boutron, I., Hoffmann, T.C., Mulrow, C.D., Shamseer, L., Tetzlaff, J.M., Akl, E.A., Brennan, S.E., et al., 2021. The</w:t>
       </w:r>
       <w:r>
         <w:t xml:space="preserve"> </w:t>
@@ -7636,7 +7643,7 @@
       <w:r>
         <w:t xml:space="preserve"> </w:t>
       </w:r>
-      <w:hyperlink r:id="rId145">
+      <w:hyperlink r:id="rId137">
         <w:r>
           <w:rPr>
             <w:rStyle w:val="Hyperlink"/>
@@ -7645,8 +7652,8 @@
         </w:r>
       </w:hyperlink>
     </w:p>
-    <w:bookmarkEnd w:id="146"/>
-    <w:bookmarkStart w:id="148" w:name="ref-plate2024DevelopmentToolRapid"/>
+    <w:bookmarkEnd w:id="138"/>
+    <w:bookmarkStart w:id="140" w:name="ref-plate2024DevelopmentToolRapid"/>
     <w:p>
       <w:pPr>
         <w:pStyle w:val="Bibliography"/>
@@ -7657,7 +7664,7 @@
       <w:r>
         <w:t xml:space="preserve"> </w:t>
       </w:r>
-      <w:hyperlink r:id="rId147">
+      <w:hyperlink r:id="rId139">
         <w:r>
           <w:rPr>
             <w:rStyle w:val="Hyperlink"/>
@@ -7666,8 +7673,8 @@
         </w:r>
       </w:hyperlink>
     </w:p>
-    <w:bookmarkEnd w:id="148"/>
-    <w:bookmarkStart w:id="150" w:name="ref-pocock1994EnvironmentalLeadChildrens"/>
+    <w:bookmarkEnd w:id="140"/>
+    <w:bookmarkStart w:id="142" w:name="ref-pocock1994EnvironmentalLeadChildrens"/>
     <w:p>
       <w:pPr>
         <w:pStyle w:val="Bibliography"/>
@@ -7678,7 +7685,7 @@
       <w:r>
         <w:t xml:space="preserve"> </w:t>
       </w:r>
-      <w:hyperlink r:id="rId149">
+      <w:hyperlink r:id="rId141">
         <w:r>
           <w:rPr>
             <w:rStyle w:val="Hyperlink"/>
@@ -7687,8 +7694,8 @@
         </w:r>
       </w:hyperlink>
     </w:p>
-    <w:bookmarkEnd w:id="150"/>
-    <w:bookmarkStart w:id="151" w:name="Xd915bcb040430c17655975a5ceb4d7b4bdd04ac"/>
+    <w:bookmarkEnd w:id="142"/>
+    <w:bookmarkStart w:id="143" w:name="Xd915bcb040430c17655975a5ceb4d7b4bdd04ac"/>
     <w:p>
       <w:pPr>
         <w:pStyle w:val="Bibliography"/>
@@ -7697,8 +7704,8 @@
         <w:t xml:space="preserve">Prüss-Üstün, A., Mathers, C., Corvalán, C., Woodward, A., 2003. Assessing the environmental burden of disease at national and local levels: Introduction and methods. Environmental burden of disease series.</w:t>
       </w:r>
     </w:p>
-    <w:bookmarkEnd w:id="151"/>
-    <w:bookmarkStart w:id="152" w:name="X4bd034c52731e178b4de125c2c778bdc533803c"/>
+    <w:bookmarkEnd w:id="143"/>
+    <w:bookmarkStart w:id="144" w:name="X4bd034c52731e178b4de125c2c778bdc533803c"/>
     <w:p>
       <w:pPr>
         <w:pStyle w:val="Bibliography"/>
@@ -7740,8 +7747,8 @@
         <w:t xml:space="preserve">.</w:t>
       </w:r>
     </w:p>
-    <w:bookmarkEnd w:id="152"/>
-    <w:bookmarkStart w:id="154" w:name="ref-rosengren2025ExposureLeadCoronary"/>
+    <w:bookmarkEnd w:id="144"/>
+    <w:bookmarkStart w:id="146" w:name="ref-rosengren2025ExposureLeadCoronary"/>
     <w:p>
       <w:pPr>
         <w:pStyle w:val="Bibliography"/>
@@ -7794,7 +7801,7 @@
       <w:r>
         <w:t xml:space="preserve"> </w:t>
       </w:r>
-      <w:hyperlink r:id="rId153">
+      <w:hyperlink r:id="rId145">
         <w:r>
           <w:rPr>
             <w:rStyle w:val="Hyperlink"/>
@@ -7803,8 +7810,8 @@
         </w:r>
       </w:hyperlink>
     </w:p>
-    <w:bookmarkEnd w:id="154"/>
-    <w:bookmarkStart w:id="156" w:name="ref-roy2013EffectModificationTransferrin"/>
+    <w:bookmarkEnd w:id="146"/>
+    <w:bookmarkStart w:id="148" w:name="ref-roy2013EffectModificationTransferrin"/>
     <w:p>
       <w:pPr>
         <w:pStyle w:val="Bibliography"/>
@@ -7836,7 +7843,7 @@
       <w:r>
         <w:t xml:space="preserve"> </w:t>
       </w:r>
-      <w:hyperlink r:id="rId155">
+      <w:hyperlink r:id="rId147">
         <w:r>
           <w:rPr>
             <w:rStyle w:val="Hyperlink"/>
@@ -7845,8 +7852,8 @@
         </w:r>
       </w:hyperlink>
     </w:p>
-    <w:bookmarkEnd w:id="156"/>
-    <w:bookmarkStart w:id="158" w:name="ref-sadeghirad2023TheoryPracticeBayesian"/>
+    <w:bookmarkEnd w:id="148"/>
+    <w:bookmarkStart w:id="150" w:name="ref-sadeghirad2023TheoryPracticeBayesian"/>
     <w:p>
       <w:pPr>
         <w:pStyle w:val="Bibliography"/>
@@ -7869,7 +7876,7 @@
       <w:r>
         <w:t xml:space="preserve"> </w:t>
       </w:r>
-      <w:hyperlink r:id="rId157">
+      <w:hyperlink r:id="rId149">
         <w:r>
           <w:rPr>
             <w:rStyle w:val="Hyperlink"/>
@@ -7878,14 +7885,14 @@
         </w:r>
       </w:hyperlink>
     </w:p>
-    <w:bookmarkEnd w:id="158"/>
-    <w:bookmarkStart w:id="160" w:name="Xe38019c88c6d2792bb296bad7dc0a4dd55f1319"/>
+    <w:bookmarkEnd w:id="150"/>
+    <w:bookmarkStart w:id="152" w:name="Xe38019c88c6d2792bb296bad7dc0a4dd55f1319"/>
     <w:p>
       <w:pPr>
         <w:pStyle w:val="Bibliography"/>
       </w:pPr>
       <w:r>
-        <w:t xml:space="preserve">Salamanca-Fernández, E., Peinado, F.M., Esteban-López, M., Puklova, V., Poyatos, R.M., Govarts, E., Laeremans, M., Leermakers, M., Den Hond, E., Schoeters, G., Murawski, A., Pedraza-Díaz, S., Szigeti, T., Verheyen, V., Vogel, N., Weber, T., Hahn, D., Zimmermann, P., Kolossa-Gehring, M., Fernandez, M.F., Arrebola, J.P., 2025. Sociodemographic determinants and temporal variability of blood lead levels (2003–2019) in a pooled analysis of nine studies in four</w:t>
+        <w:t xml:space="preserve">Salamanca-Fernández, E., Peinado, F.M., Esteban-López, M., Puklova, V., Poyatos, R.M., Govarts, E., Laeremans, M., Leermakers, M., Den Hond, E., Schoeters, G., et al., 2025. Sociodemographic determinants and temporal variability of blood lead levels (2003–2019) in a pooled analysis of nine studies in four</w:t>
       </w:r>
       <w:r>
         <w:t xml:space="preserve"> </w:t>
@@ -7902,7 +7909,7 @@
       <w:r>
         <w:t xml:space="preserve"> </w:t>
       </w:r>
-      <w:hyperlink r:id="rId159">
+      <w:hyperlink r:id="rId151">
         <w:r>
           <w:rPr>
             <w:rStyle w:val="Hyperlink"/>
@@ -7911,8 +7918,8 @@
         </w:r>
       </w:hyperlink>
     </w:p>
-    <w:bookmarkEnd w:id="160"/>
-    <w:bookmarkStart w:id="162" w:name="Xcf7993c3f58afaabaf73be6238c67f4f63053d9"/>
+    <w:bookmarkEnd w:id="152"/>
+    <w:bookmarkStart w:id="154" w:name="Xcf7993c3f58afaabaf73be6238c67f4f63053d9"/>
     <w:p>
       <w:pPr>
         <w:pStyle w:val="Bibliography"/>
@@ -7956,7 +7963,7 @@
       <w:r>
         <w:t xml:space="preserve"> </w:t>
       </w:r>
-      <w:hyperlink r:id="rId161">
+      <w:hyperlink r:id="rId153">
         <w:r>
           <w:rPr>
             <w:rStyle w:val="Hyperlink"/>
@@ -7965,8 +7972,8 @@
         </w:r>
       </w:hyperlink>
     </w:p>
-    <w:bookmarkEnd w:id="162"/>
-    <w:bookmarkStart w:id="164" w:name="ref-schwartz1994LowLevelLeadExposure"/>
+    <w:bookmarkEnd w:id="154"/>
+    <w:bookmarkStart w:id="156" w:name="ref-schwartz1994LowLevelLeadExposure"/>
     <w:p>
       <w:pPr>
         <w:pStyle w:val="Bibliography"/>
@@ -8045,7 +8052,7 @@
       <w:r>
         <w:t xml:space="preserve"> </w:t>
       </w:r>
-      <w:hyperlink r:id="rId163">
+      <w:hyperlink r:id="rId155">
         <w:r>
           <w:rPr>
             <w:rStyle w:val="Hyperlink"/>
@@ -8054,8 +8061,8 @@
         </w:r>
       </w:hyperlink>
     </w:p>
-    <w:bookmarkEnd w:id="164"/>
-    <w:bookmarkStart w:id="166" w:name="X55ae1a8b757df519e0a47e2002b3acc0b2e73ec"/>
+    <w:bookmarkEnd w:id="156"/>
+    <w:bookmarkStart w:id="158" w:name="X55ae1a8b757df519e0a47e2002b3acc0b2e73ec"/>
     <w:p>
       <w:pPr>
         <w:pStyle w:val="Bibliography"/>
@@ -8078,7 +8085,7 @@
       <w:r>
         <w:t xml:space="preserve"> </w:t>
       </w:r>
-      <w:hyperlink r:id="rId165">
+      <w:hyperlink r:id="rId157">
         <w:r>
           <w:rPr>
             <w:rStyle w:val="Hyperlink"/>
@@ -8087,14 +8094,14 @@
         </w:r>
       </w:hyperlink>
     </w:p>
-    <w:bookmarkEnd w:id="166"/>
-    <w:bookmarkStart w:id="168" w:name="ref-shaffer2025LeadExposureAntisocial"/>
+    <w:bookmarkEnd w:id="158"/>
+    <w:bookmarkStart w:id="160" w:name="ref-shaffer2025LeadExposureAntisocial"/>
     <w:p>
       <w:pPr>
         <w:pStyle w:val="Bibliography"/>
       </w:pPr>
       <w:r>
-        <w:t xml:space="preserve">Shaffer, R.M., Carlson, L.M., Hester, K., Kim, H., Duffney, P., Forsyth, J.E., Ferraro, G., Till, C., Haddock, A., Strawbridge, J., Lanfear, C.C., Gohari, Z., Lee, A.L., Hu, H., Kirrane, E., 2025. Lead exposure and antisocial behavior:</w:t>
+        <w:t xml:space="preserve">Shaffer, R.M., Carlson, L.M., Hester, K., Kim, H., Duffney, P., Forsyth, J.E., Ferraro, G., Till, C., Haddock, A., Strawbridge, J., et al., 2025. Lead exposure and antisocial behavior:</w:t>
       </w:r>
       <w:r>
         <w:t xml:space="preserve"> </w:t>
@@ -8111,7 +8118,7 @@
       <w:r>
         <w:t xml:space="preserve"> </w:t>
       </w:r>
-      <w:hyperlink r:id="rId167">
+      <w:hyperlink r:id="rId159">
         <w:r>
           <w:rPr>
             <w:rStyle w:val="Hyperlink"/>
@@ -8120,8 +8127,8 @@
         </w:r>
       </w:hyperlink>
     </w:p>
-    <w:bookmarkEnd w:id="168"/>
-    <w:bookmarkStart w:id="170" w:name="ref-smith2018StepAwayStepwise"/>
+    <w:bookmarkEnd w:id="160"/>
+    <w:bookmarkStart w:id="162" w:name="ref-smith2018StepAwayStepwise"/>
     <w:p>
       <w:pPr>
         <w:pStyle w:val="Bibliography"/>
@@ -8132,7 +8139,7 @@
       <w:r>
         <w:t xml:space="preserve"> </w:t>
       </w:r>
-      <w:hyperlink r:id="rId169">
+      <w:hyperlink r:id="rId161">
         <w:r>
           <w:rPr>
             <w:rStyle w:val="Hyperlink"/>
@@ -8141,8 +8148,8 @@
         </w:r>
       </w:hyperlink>
     </w:p>
-    <w:bookmarkEnd w:id="170"/>
-    <w:bookmarkStart w:id="172" w:name="ref-sy2024AssessmentLongTermExposure"/>
+    <w:bookmarkEnd w:id="162"/>
+    <w:bookmarkStart w:id="164" w:name="ref-sy2024AssessmentLongTermExposure"/>
     <w:p>
       <w:pPr>
         <w:pStyle w:val="Bibliography"/>
@@ -8186,7 +8193,7 @@
       <w:r>
         <w:t xml:space="preserve"> </w:t>
       </w:r>
-      <w:hyperlink r:id="rId171">
+      <w:hyperlink r:id="rId163">
         <w:r>
           <w:rPr>
             <w:rStyle w:val="Hyperlink"/>
@@ -8195,8 +8202,8 @@
         </w:r>
       </w:hyperlink>
     </w:p>
-    <w:bookmarkEnd w:id="172"/>
-    <w:bookmarkStart w:id="173" w:name="ref-tamasszigeti2022SubstanceReportLead"/>
+    <w:bookmarkEnd w:id="164"/>
+    <w:bookmarkStart w:id="165" w:name="ref-tamasszigeti2022SubstanceReportLead"/>
     <w:p>
       <w:pPr>
         <w:pStyle w:val="Bibliography"/>
@@ -8214,8 +8221,8 @@
         <w:t xml:space="preserve">. HBM4EU.</w:t>
       </w:r>
     </w:p>
-    <w:bookmarkEnd w:id="173"/>
-    <w:bookmarkStart w:id="175" w:name="X99fa6bd9cd2521340285769f289a6c9d4bfe17b"/>
+    <w:bookmarkEnd w:id="165"/>
+    <w:bookmarkStart w:id="167" w:name="X99fa6bd9cd2521340285769f289a6c9d4bfe17b"/>
     <w:p>
       <w:pPr>
         <w:pStyle w:val="Bibliography"/>
@@ -8259,7 +8266,7 @@
       <w:r>
         <w:t xml:space="preserve"> </w:t>
       </w:r>
-      <w:hyperlink r:id="rId174">
+      <w:hyperlink r:id="rId166">
         <w:r>
           <w:rPr>
             <w:rStyle w:val="Hyperlink"/>
@@ -8268,8 +8275,8 @@
         </w:r>
       </w:hyperlink>
     </w:p>
-    <w:bookmarkEnd w:id="175"/>
-    <w:bookmarkStart w:id="177" w:name="ref-wan2022ChronicLeadExposure"/>
+    <w:bookmarkEnd w:id="167"/>
+    <w:bookmarkStart w:id="169" w:name="ref-wan2022ChronicLeadExposure"/>
     <w:p>
       <w:pPr>
         <w:pStyle w:val="Bibliography"/>
@@ -8280,7 +8287,7 @@
       <w:r>
         <w:t xml:space="preserve"> </w:t>
       </w:r>
-      <w:hyperlink r:id="rId176">
+      <w:hyperlink r:id="rId168">
         <w:r>
           <w:rPr>
             <w:rStyle w:val="Hyperlink"/>
@@ -8289,8 +8296,8 @@
         </w:r>
       </w:hyperlink>
     </w:p>
-    <w:bookmarkEnd w:id="177"/>
-    <w:bookmarkStart w:id="179" w:name="X111bb06244f8f2a1a6d0d2f1f41c24b71f248e6"/>
+    <w:bookmarkEnd w:id="169"/>
+    <w:bookmarkStart w:id="171" w:name="X111bb06244f8f2a1a6d0d2f1f41c24b71f248e6"/>
     <w:p>
       <w:pPr>
         <w:pStyle w:val="Bibliography"/>
@@ -8322,7 +8329,7 @@
       <w:r>
         <w:t xml:space="preserve"> </w:t>
       </w:r>
-      <w:hyperlink r:id="rId178">
+      <w:hyperlink r:id="rId170">
         <w:r>
           <w:rPr>
             <w:rStyle w:val="Hyperlink"/>
@@ -8331,8 +8338,8 @@
         </w:r>
       </w:hyperlink>
     </w:p>
-    <w:bookmarkEnd w:id="179"/>
-    <w:bookmarkStart w:id="181" w:name="X946754e67e3c74fad7a8806aa9d2819ed4ec186"/>
+    <w:bookmarkEnd w:id="171"/>
+    <w:bookmarkStart w:id="173" w:name="X946754e67e3c74fad7a8806aa9d2819ed4ec186"/>
     <w:p>
       <w:pPr>
         <w:pStyle w:val="Bibliography"/>
@@ -8343,7 +8350,7 @@
       <w:r>
         <w:t xml:space="preserve"> </w:t>
       </w:r>
-      <w:hyperlink r:id="rId180">
+      <w:hyperlink r:id="rId172">
         <w:r>
           <w:rPr>
             <w:rStyle w:val="Hyperlink"/>
@@ -8352,11 +8359,11 @@
         </w:r>
       </w:hyperlink>
     </w:p>
-    <w:bookmarkEnd w:id="181"/>
-    <w:bookmarkEnd w:id="182"/>
-    <w:bookmarkEnd w:id="183"/>
+    <w:bookmarkEnd w:id="173"/>
+    <w:bookmarkEnd w:id="174"/>
+    <w:bookmarkEnd w:id="175"/>
     <w:sectPr>
-      <w:footerReference r:id="rId9" w:type="default"/>
+      <w:footerReference r:id="rId3" w:type="default"/>
       <w:footnotePr>
         <w:numFmt w:val="decimal"/>
       </w:footnotePr>

</xml_diff>

<commit_message>
version after comments from Dietrich
</commit_message>
<xml_diff>
--- a/manuscript/manuscript.docx
+++ b/manuscript/manuscript.docx
@@ -126,7 +126,7 @@
       <w:r>
         <w:t xml:space="preserve"> </w:t>
       </w:r>
-      <w:hyperlink r:id="rId9">
+      <w:hyperlink r:id="rId12">
         <w:r>
           <w:rPr>
             <w:rStyle w:val="Hyperlink"/>
@@ -140,7 +140,7 @@
         <w:br w:type="page"/>
       </w:r>
     </w:p>
-    <w:bookmarkStart w:id="10" w:name="keywords"/>
+    <w:bookmarkStart w:id="13" w:name="keywords"/>
     <w:p>
       <w:pPr>
         <w:pStyle w:val="Heading1"/>
@@ -196,8 +196,8 @@
         <w:br/>
       </w:r>
     </w:p>
-    <w:bookmarkEnd w:id="10"/>
-    <w:bookmarkStart w:id="11" w:name="highlights"/>
+    <w:bookmarkEnd w:id="13"/>
+    <w:bookmarkStart w:id="14" w:name="highlights"/>
     <w:p>
       <w:pPr>
         <w:pStyle w:val="Heading1"/>
@@ -215,10 +215,7 @@
         </w:numPr>
       </w:pPr>
       <w:r>
-        <w:t xml:space="preserve">Bayesian and frequentist meta-analyses yield similar estimates for lead’s effect on IQ</w:t>
-      </w:r>
-      <w:r>
-        <w:t xml:space="preserve"> </w:t>
+        <w:t xml:space="preserve">Bayesian model yields full probability distributions, not just point estimates</w:t>
       </w:r>
     </w:p>
     <w:p>
@@ -230,7 +227,10 @@
         </w:numPr>
       </w:pPr>
       <w:r>
-        <w:t xml:space="preserve">Bayesian model yields full probability distributions, not just point estimates</w:t>
+        <w:t xml:space="preserve">Bayesian and frequentist meta-analyses yield similar estimates for lead’s effect on IQ</w:t>
+      </w:r>
+      <w:r>
+        <w:t xml:space="preserve"> </w:t>
       </w:r>
       <w:r>
         <w:t xml:space="preserve"> </w:t>
@@ -245,11 +245,11 @@
         </w:numPr>
       </w:pPr>
       <w:r>
-        <w:t xml:space="preserve">Results underscore health risk of lead exposure, even in low concentration</w:t>
-      </w:r>
-    </w:p>
-    <w:bookmarkEnd w:id="11"/>
-    <w:bookmarkStart w:id="15" w:name="graphical-abstract"/>
+        <w:t xml:space="preserve">Results underscore the health risk of lead exposure, even at low concentrations</w:t>
+      </w:r>
+    </w:p>
+    <w:bookmarkEnd w:id="14"/>
+    <w:bookmarkStart w:id="18" w:name="graphical-abstract"/>
     <w:p>
       <w:pPr>
         <w:pStyle w:val="Heading1"/>
@@ -265,20 +265,20 @@
       <w:r>
         <w:drawing>
           <wp:inline>
-            <wp:extent cx="5334000" cy="3168396"/>
+            <wp:extent cx="5943600" cy="3530498"/>
             <wp:effectExtent b="0" l="0" r="0" t="0"/>
-            <wp:docPr descr="" title="" id="13" name="Picture"/>
+            <wp:docPr descr="" title="" id="16" name="Picture"/>
             <a:graphic>
               <a:graphicData uri="http://schemas.openxmlformats.org/drawingml/2006/picture">
                 <pic:pic>
                   <pic:nvPicPr>
-                    <pic:cNvPr descr="tables_figures/main/graphical_abstract.png" id="14" name="Picture"/>
+                    <pic:cNvPr descr="tables_figures/main/graphical_abstract.png" id="17" name="Picture"/>
                     <pic:cNvPicPr>
                       <a:picLocks noChangeArrowheads="1" noChangeAspect="1"/>
                     </pic:cNvPicPr>
                   </pic:nvPicPr>
                   <pic:blipFill>
-                    <a:blip r:embed="rId12"/>
+                    <a:blip r:embed="rId15"/>
                     <a:stretch>
                       <a:fillRect/>
                     </a:stretch>
@@ -286,7 +286,7 @@
                   <pic:spPr bwMode="auto">
                     <a:xfrm>
                       <a:off x="0" y="0"/>
-                      <a:ext cx="5334000" cy="3168396"/>
+                      <a:ext cx="5943600" cy="3530498"/>
                     </a:xfrm>
                     <a:prstGeom prst="rect">
                       <a:avLst/>
@@ -305,8 +305,8 @@
         </w:drawing>
       </w:r>
     </w:p>
-    <w:bookmarkEnd w:id="15"/>
-    <w:bookmarkStart w:id="16" w:name="abstract"/>
+    <w:bookmarkEnd w:id="18"/>
+    <w:bookmarkStart w:id="19" w:name="abstract"/>
     <w:p>
       <w:pPr>
         <w:pStyle w:val="Heading1"/>
@@ -342,7 +342,7 @@
         <w:t xml:space="preserve"> </w:t>
       </w:r>
       <w:r>
-        <w:t xml:space="preserve">We compared frequentist and Bayesian frameworks, using lead exposure and IQ as a case study.</w:t>
+        <w:t xml:space="preserve">We compared frequentist and Bayesian frameworks, using lead exposure and IQ loss as a case study.</w:t>
       </w:r>
     </w:p>
     <w:p>
@@ -369,22 +369,7 @@
         <w:t xml:space="preserve"> </w:t>
       </w:r>
       <w:r>
-        <w:t xml:space="preserve"> </w:t>
-      </w:r>
-      <w:r>
-        <w:t xml:space="preserve">In both meta-analyses, we</w:t>
-      </w:r>
-      <w:r>
-        <w:t xml:space="preserve"> </w:t>
-      </w:r>
-      <w:r>
-        <w:t xml:space="preserve"> </w:t>
-      </w:r>
-      <w:r>
-        <w:t xml:space="preserve">used random-effects models and included the same effect estimates.</w:t>
-      </w:r>
-      <w:r>
-        <w:t xml:space="preserve"> </w:t>
+        <w:t xml:space="preserve">In both meta-analyses, we used random-effects models and included the same effect estimates.</w:t>
       </w:r>
       <w:r>
         <w:t xml:space="preserve"> </w:t>
@@ -637,13 +622,13 @@
         <w:t xml:space="preserve"> </w:t>
       </w:r>
       <w:r>
-        <w:t xml:space="preserve">The Bayesian framework provides posterior distributions, enabling direct probability statements, e.g. about exceeding risk thresholds, and comparative assessments across pollutants.</w:t>
-      </w:r>
-      <w:r>
-        <w:t xml:space="preserve"> </w:t>
-      </w:r>
-      <w:r>
-        <w:t xml:space="preserve">These features are particularly valuable regarding risk assessment and policy-making.</w:t>
+        <w:t xml:space="preserve">The Bayesian framework provides posterior distributions, enabling direct probability statements, e.g. about exceeding risk thresholds, and comparative assessments between pollutants.</w:t>
+      </w:r>
+      <w:r>
+        <w:t xml:space="preserve"> </w:t>
+      </w:r>
+      <w:r>
+        <w:t xml:space="preserve">These features are particularly valuable for risk assessment and policy-making.</w:t>
       </w:r>
     </w:p>
     <w:p>
@@ -651,14 +636,14 @@
         <w:br w:type="page"/>
       </w:r>
     </w:p>
-    <w:bookmarkEnd w:id="16"/>
-    <w:bookmarkStart w:id="17" w:name="background"/>
+    <w:bookmarkEnd w:id="19"/>
+    <w:bookmarkStart w:id="20" w:name="background"/>
     <w:p>
       <w:pPr>
         <w:pStyle w:val="Heading1"/>
       </w:pPr>
       <w:r>
-        <w:t xml:space="preserve">Background</w:t>
+        <w:t xml:space="preserve">1. Background</w:t>
       </w:r>
     </w:p>
     <w:p>
@@ -960,7 +945,7 @@
         <w:t xml:space="preserve"> </w:t>
       </w:r>
       <w:r>
-        <w:t xml:space="preserve">While these landmark studies have substantially shaped research and policy on childhood lead exposure, methodological issues and errors have been raised.</w:t>
+        <w:t xml:space="preserve">While these landmark studies have substantially shaped research and policy on childhood lead exposure, methodological issues and shortcomings have been raised.</w:t>
       </w:r>
       <w:r>
         <w:t xml:space="preserve"> </w:t>
@@ -981,7 +966,7 @@
         <w:t xml:space="preserve"> </w:t>
       </w:r>
       <w:r>
-        <w:t xml:space="preserve">These limitations, combined with the availability of more recent epidemiological data, underscore the need not only for an updated evidence synthesis, but also for methodologically robust approaches that can provide reliable exposure-response estimates for burden of disease and risk assessments.</w:t>
+        <w:t xml:space="preserve">These limitations, combined with the availability of more recent epidemiological data, underscore the need not only for an updated evidence synthesis, but also for methodologically robust approaches that can provide reliable exposure-response estimates to be used in burden of disease and risk assessments.</w:t>
       </w:r>
     </w:p>
     <w:p>
@@ -1042,23 +1027,23 @@
         <w:t xml:space="preserve">The aim of this study is twofold: first, to synthesize and quantitatively pool available epidemiological findings on the association between BLL and IQ scores in children; and second, to conduct both frequentist and Bayesian meta-analyses, comparing how these analytical frameworks impact exposure-response estimates and uncertainty quantification.</w:t>
       </w:r>
     </w:p>
-    <w:bookmarkEnd w:id="17"/>
-    <w:bookmarkStart w:id="30" w:name="methods"/>
+    <w:bookmarkEnd w:id="20"/>
+    <w:bookmarkStart w:id="33" w:name="methods"/>
     <w:p>
       <w:pPr>
         <w:pStyle w:val="Heading1"/>
       </w:pPr>
       <w:r>
-        <w:t xml:space="preserve">Methods</w:t>
-      </w:r>
-    </w:p>
-    <w:bookmarkStart w:id="19" w:name="literature-review"/>
+        <w:t xml:space="preserve">2. Methods</w:t>
+      </w:r>
+    </w:p>
+    <w:bookmarkStart w:id="22" w:name="literature-review"/>
     <w:p>
       <w:pPr>
         <w:pStyle w:val="Heading2"/>
       </w:pPr>
       <w:r>
-        <w:t xml:space="preserve">Literature Review</w:t>
+        <w:t xml:space="preserve">2.1 Literature Review</w:t>
       </w:r>
     </w:p>
     <w:p>
@@ -1136,7 +1121,7 @@
         </w:rPr>
         <w:t xml:space="preserve">(</w:t>
       </w:r>
-      <w:hyperlink r:id="rId18">
+      <w:hyperlink r:id="rId21">
         <w:r>
           <w:rPr>
             <w:rStyle w:val="Hyperlink"/>
@@ -1280,14 +1265,14 @@
         <w:t xml:space="preserve">For all included studies, effect estimates from the most-adjusted model were extracted and the adjustment set was recorded.</w:t>
       </w:r>
     </w:p>
-    <w:bookmarkEnd w:id="19"/>
-    <w:bookmarkStart w:id="20" w:name="risk-of-bias-assessment"/>
+    <w:bookmarkEnd w:id="22"/>
+    <w:bookmarkStart w:id="23" w:name="risk-of-bias-assessment"/>
     <w:p>
       <w:pPr>
         <w:pStyle w:val="Heading2"/>
       </w:pPr>
       <w:r>
-        <w:t xml:space="preserve">Risk of Bias Assessment</w:t>
+        <w:t xml:space="preserve">2.2 Risk of Bias Assessment</w:t>
       </w:r>
     </w:p>
     <w:p>
@@ -1379,14 +1364,14 @@
         <w:t xml:space="preserve">If there were any deviations in the judgement of the researcher and the LLM, the respective item was revisited by the researcher who made the final decision.</w:t>
       </w:r>
     </w:p>
-    <w:bookmarkEnd w:id="20"/>
-    <w:bookmarkStart w:id="22" w:name="harmonization-of-effect-estimates"/>
+    <w:bookmarkEnd w:id="23"/>
+    <w:bookmarkStart w:id="25" w:name="harmonization-of-effect-estimates"/>
     <w:p>
       <w:pPr>
         <w:pStyle w:val="Heading2"/>
       </w:pPr>
       <w:r>
-        <w:t xml:space="preserve">Harmonization of Effect Estimates</w:t>
+        <w:t xml:space="preserve">2.3 Harmonization of Effect Estimates</w:t>
       </w:r>
     </w:p>
     <w:p>
@@ -1448,7 +1433,7 @@
       <w:pPr>
         <w:pStyle w:val="BodyText"/>
       </w:pPr>
-      <w:bookmarkStart w:id="21" w:name="eq-regression-model"/>
+      <w:bookmarkStart w:id="24" w:name="eq-regression-model"/>
       <m:oMathPara>
         <m:oMathParaPr>
           <m:jc m:val="center"/>
@@ -1565,7 +1550,7 @@
           </m:r>
         </m:oMath>
       </m:oMathPara>
-      <w:bookmarkEnd w:id="21"/>
+      <w:bookmarkEnd w:id="24"/>
     </w:p>
     <w:p>
       <w:pPr>
@@ -1773,14 +1758,14 @@
         <w:t xml:space="preserve">These were excluded from the meta-analysis, as transformation of effect estimates for linear BLL to log-linear could not be justified.</w:t>
       </w:r>
     </w:p>
-    <w:bookmarkEnd w:id="22"/>
-    <w:bookmarkStart w:id="28" w:name="meta-analysis"/>
+    <w:bookmarkEnd w:id="25"/>
+    <w:bookmarkStart w:id="31" w:name="meta-analysis"/>
     <w:p>
       <w:pPr>
         <w:pStyle w:val="Heading2"/>
       </w:pPr>
       <w:r>
-        <w:t xml:space="preserve">Meta-Analysis</w:t>
+        <w:t xml:space="preserve">2.4 Meta-Analysis</w:t>
       </w:r>
     </w:p>
     <w:p>
@@ -1849,7 +1834,7 @@
       <w:r>
         <w:t xml:space="preserve"> </w:t>
       </w:r>
-      <w:hyperlink r:id="rId23">
+      <w:hyperlink r:id="rId26">
         <w:r>
           <w:rPr>
             <w:rStyle w:val="Hyperlink"/>
@@ -1861,13 +1846,13 @@
         <w:t xml:space="preserve">.</w:t>
       </w:r>
     </w:p>
-    <w:bookmarkStart w:id="26" w:name="bayesian-meta-analysis"/>
+    <w:bookmarkStart w:id="29" w:name="bayesian-meta-analysis"/>
     <w:p>
       <w:pPr>
         <w:pStyle w:val="Heading3"/>
       </w:pPr>
       <w:r>
-        <w:t xml:space="preserve">Bayesian Meta-Analysis</w:t>
+        <w:t xml:space="preserve">2.4.1 Bayesian Meta-Analysis</w:t>
       </w:r>
     </w:p>
     <w:p>
@@ -1992,7 +1977,7 @@
       <w:pPr>
         <w:pStyle w:val="BodyText"/>
       </w:pPr>
-      <w:bookmarkStart w:id="24" w:name="eq-model"/>
+      <w:bookmarkStart w:id="27" w:name="eq-model"/>
       <m:oMathPara>
         <m:oMathParaPr>
           <m:jc m:val="center"/>
@@ -2153,7 +2138,7 @@
           </m:r>
         </m:oMath>
       </m:oMathPara>
-      <w:bookmarkEnd w:id="24"/>
+      <w:bookmarkEnd w:id="27"/>
     </w:p>
     <w:p>
       <w:pPr>
@@ -2503,7 +2488,7 @@
         <w:t xml:space="preserve"> </w:t>
       </w:r>
       <w:r>
-        <w:t xml:space="preserve">For both parameters, weakly-informative priors were chosen so that the posterior distributions are softly being bounded to realistic ranges of results.</w:t>
+        <w:t xml:space="preserve">For both parameters, weakly-informative priors were chosen to softly constrain the posterior distributions to realistic ranges of results.</w:t>
       </w:r>
       <w:r>
         <w:t xml:space="preserve"> </w:t>
@@ -2639,7 +2624,7 @@
       <w:pPr>
         <w:pStyle w:val="BodyText"/>
       </w:pPr>
-      <w:bookmarkStart w:id="25" w:name="eq-priors"/>
+      <w:bookmarkStart w:id="28" w:name="eq-priors"/>
       <m:oMathPara>
         <m:oMathParaPr>
           <m:jc m:val="center"/>
@@ -2776,7 +2761,7 @@
           </m:r>
         </m:oMath>
       </m:oMathPara>
-      <w:bookmarkEnd w:id="25"/>
+      <w:bookmarkEnd w:id="28"/>
     </w:p>
     <w:p>
       <w:pPr>
@@ -2810,7 +2795,7 @@
         <w:t xml:space="preserve"> </w:t>
       </w:r>
       <w:r>
-        <w:t xml:space="preserve">to assess the appropriateness of the specified priors.</w:t>
+        <w:t xml:space="preserve">to verify that the specified priors were appropriate.</w:t>
       </w:r>
       <w:r>
         <w:t xml:space="preserve"> </w:t>
@@ -2825,14 +2810,14 @@
         <w:t xml:space="preserve">Additionally, a sensitivity analysis with alternative priors was conducted, as described below.</w:t>
       </w:r>
     </w:p>
-    <w:bookmarkEnd w:id="26"/>
-    <w:bookmarkStart w:id="27" w:name="frequentist-meta-analysis"/>
+    <w:bookmarkEnd w:id="29"/>
+    <w:bookmarkStart w:id="30" w:name="frequentist-meta-analysis"/>
     <w:p>
       <w:pPr>
         <w:pStyle w:val="Heading3"/>
       </w:pPr>
       <w:r>
-        <w:t xml:space="preserve">Frequentist Meta-Analysis</w:t>
+        <w:t xml:space="preserve">2.4.2 Frequentist Meta-Analysis</w:t>
       </w:r>
     </w:p>
     <w:p>
@@ -2933,15 +2918,15 @@
         <w:t xml:space="preserve">.</w:t>
       </w:r>
     </w:p>
-    <w:bookmarkEnd w:id="27"/>
-    <w:bookmarkEnd w:id="28"/>
-    <w:bookmarkStart w:id="29" w:name="sensitivity-analysis"/>
+    <w:bookmarkEnd w:id="30"/>
+    <w:bookmarkEnd w:id="31"/>
+    <w:bookmarkStart w:id="32" w:name="sensitivity-analysis"/>
     <w:p>
       <w:pPr>
         <w:pStyle w:val="Heading2"/>
       </w:pPr>
       <w:r>
-        <w:t xml:space="preserve">Sensitivity Analysis</w:t>
+        <w:t xml:space="preserve">2.5 Sensitivity Analysis</w:t>
       </w:r>
     </w:p>
     <w:p>
@@ -3212,24 +3197,24 @@
         <w:t xml:space="preserve">Note that for the main effect, the broader prior is centered around 0, giving equal weight to the probability of a protective and detrimental effect of lead.</w:t>
       </w:r>
     </w:p>
-    <w:bookmarkEnd w:id="29"/>
-    <w:bookmarkEnd w:id="30"/>
-    <w:bookmarkStart w:id="41" w:name="results"/>
+    <w:bookmarkEnd w:id="32"/>
+    <w:bookmarkEnd w:id="33"/>
+    <w:bookmarkStart w:id="44" w:name="results"/>
     <w:p>
       <w:pPr>
         <w:pStyle w:val="Heading1"/>
       </w:pPr>
       <w:r>
-        <w:t xml:space="preserve">Results</w:t>
-      </w:r>
-    </w:p>
-    <w:bookmarkStart w:id="34" w:name="literature-review-1"/>
+        <w:t xml:space="preserve">3. Results</w:t>
+      </w:r>
+    </w:p>
+    <w:bookmarkStart w:id="37" w:name="literature-review-1"/>
     <w:p>
       <w:pPr>
         <w:pStyle w:val="Heading2"/>
       </w:pPr>
       <w:r>
-        <w:t xml:space="preserve">Literature Review</w:t>
+        <w:t xml:space="preserve">3.1 Literature Review</w:t>
       </w:r>
     </w:p>
     <w:p>
@@ -3330,20 +3315,20 @@
       <w:r>
         <w:drawing>
           <wp:inline>
-            <wp:extent cx="3200400" cy="3820911"/>
+            <wp:extent cx="3566160" cy="4257586"/>
             <wp:effectExtent b="0" l="0" r="0" t="0"/>
-            <wp:docPr descr="Fig. 1: PRISMA flow diagram. BLL, blood lead level; Pb, lead; Hg, mercury" title="" id="32" name="Picture"/>
+            <wp:docPr descr="Fig. 1: PRISMA flow diagram. BLL, blood lead level; Pb, lead; Hg, mercury" title="" id="35" name="Picture"/>
             <a:graphic>
               <a:graphicData uri="http://schemas.openxmlformats.org/drawingml/2006/picture">
                 <pic:pic>
                   <pic:nvPicPr>
-                    <pic:cNvPr descr="tables_figures/main/figure1.png" id="33" name="Picture"/>
+                    <pic:cNvPr descr="tables_figures/main/figure1.png" id="36" name="Picture"/>
                     <pic:cNvPicPr>
                       <a:picLocks noChangeArrowheads="1" noChangeAspect="1"/>
                     </pic:cNvPicPr>
                   </pic:nvPicPr>
                   <pic:blipFill>
-                    <a:blip r:embed="rId31"/>
+                    <a:blip r:embed="rId34"/>
                     <a:stretch>
                       <a:fillRect/>
                     </a:stretch>
@@ -3351,7 +3336,7 @@
                   <pic:spPr bwMode="auto">
                     <a:xfrm>
                       <a:off x="0" y="0"/>
-                      <a:ext cx="3200400" cy="3820911"/>
+                      <a:ext cx="3566160" cy="4257586"/>
                     </a:xfrm>
                     <a:prstGeom prst="rect">
                       <a:avLst/>
@@ -3473,14 +3458,14 @@
         <w:t xml:space="preserve">We contacted the corresponding author, who confirmed that decimal points were missing in the publication.</w:t>
       </w:r>
     </w:p>
-    <w:bookmarkEnd w:id="34"/>
-    <w:bookmarkStart w:id="35" w:name="risk-of-bias"/>
+    <w:bookmarkEnd w:id="37"/>
+    <w:bookmarkStart w:id="38" w:name="risk-of-bias"/>
     <w:p>
       <w:pPr>
         <w:pStyle w:val="Heading2"/>
       </w:pPr>
       <w:r>
-        <w:t xml:space="preserve">Risk of Bias</w:t>
+        <w:t xml:space="preserve">3.2 Risk of Bias</w:t>
       </w:r>
     </w:p>
     <w:p>
@@ -3568,7 +3553,7 @@
         <w:t xml:space="preserve"> </w:t>
       </w:r>
       <w:r>
-        <w:t xml:space="preserve">(2x high RoB, 5x some concerns), where important confounders like maternal IQ were not included or the authors used a data-driven selection approach for covariate selection, when a theory-driven approach is preferable</w:t>
+        <w:t xml:space="preserve">(2x high RoB, 5x some concerns), where important confounders like maternal IQ were not included or the authors used a data-driven selection approach for covariate selection, when a theory-driven approach was preferable</w:t>
       </w:r>
       <w:r>
         <w:t xml:space="preserve"> </w:t>
@@ -3605,14 +3590,14 @@
         <w:t xml:space="preserve">Results from the RoB assessment are presented in Tab. 3.</w:t>
       </w:r>
     </w:p>
-    <w:bookmarkEnd w:id="35"/>
-    <w:bookmarkStart w:id="39" w:name="meta-analysis-1"/>
+    <w:bookmarkEnd w:id="38"/>
+    <w:bookmarkStart w:id="42" w:name="meta-analysis-1"/>
     <w:p>
       <w:pPr>
         <w:pStyle w:val="Heading2"/>
       </w:pPr>
       <w:r>
-        <w:t xml:space="preserve">Meta Analysis</w:t>
+        <w:t xml:space="preserve">3.3 Meta Analysis</w:t>
       </w:r>
     </w:p>
     <w:p>
@@ -3849,20 +3834,20 @@
       <w:r>
         <w:drawing>
           <wp:inline>
-            <wp:extent cx="5334000" cy="1999685"/>
+            <wp:extent cx="5943600" cy="2228220"/>
             <wp:effectExtent b="0" l="0" r="0" t="0"/>
-            <wp:docPr descr="Fig. 2: Forest plots for Bayesian (left) and frequentist (right) meta-analyses. BLL, blood lead level; CI, confidence interval; CrI, credible interval" title="" id="37" name="Picture"/>
+            <wp:docPr descr="Fig. 2: Forest plots for Bayesian (left) and frequentist (right) meta-analyses. BLL, blood lead level; CI, confidence interval; CrI, credible interval" title="" id="40" name="Picture"/>
             <a:graphic>
               <a:graphicData uri="http://schemas.openxmlformats.org/drawingml/2006/picture">
                 <pic:pic>
                   <pic:nvPicPr>
-                    <pic:cNvPr descr="tables_figures/main/figure2.png" id="38" name="Picture"/>
+                    <pic:cNvPr descr="tables_figures/main/figure2.png" id="41" name="Picture"/>
                     <pic:cNvPicPr>
                       <a:picLocks noChangeArrowheads="1" noChangeAspect="1"/>
                     </pic:cNvPicPr>
                   </pic:nvPicPr>
                   <pic:blipFill>
-                    <a:blip r:embed="rId36"/>
+                    <a:blip r:embed="rId39"/>
                     <a:stretch>
                       <a:fillRect/>
                     </a:stretch>
@@ -3870,7 +3855,7 @@
                   <pic:spPr bwMode="auto">
                     <a:xfrm>
                       <a:off x="0" y="0"/>
-                      <a:ext cx="5334000" cy="1999685"/>
+                      <a:ext cx="5943600" cy="2228220"/>
                     </a:xfrm>
                     <a:prstGeom prst="rect">
                       <a:avLst/>
@@ -3902,7 +3887,7 @@
         <w:pStyle w:val="BodyText"/>
       </w:pPr>
       <w:r>
-        <w:t xml:space="preserve">The single study estimates depicted in Fig. 2 differ in both approaches because individual study estimates are shrunk towards the pooled estimate.</w:t>
+        <w:t xml:space="preserve">The single study estimates shown in Fig. 2 differ in both approaches because individual study estimates are shrunk towards the pooled estimate.</w:t>
       </w:r>
       <w:r>
         <w:t xml:space="preserve"> </w:t>
@@ -3911,14 +3896,14 @@
         <w:t xml:space="preserve">In the context of meta-analysis, shrinkage is comparable to the inverse-variance weighting in the frequentist framework.</w:t>
       </w:r>
     </w:p>
-    <w:bookmarkEnd w:id="39"/>
-    <w:bookmarkStart w:id="40" w:name="sensitivity-analysis-1"/>
+    <w:bookmarkEnd w:id="42"/>
+    <w:bookmarkStart w:id="43" w:name="sensitivity-analysis-1"/>
     <w:p>
       <w:pPr>
         <w:pStyle w:val="Heading2"/>
       </w:pPr>
       <w:r>
-        <w:t xml:space="preserve">Sensitivity Analysis</w:t>
+        <w:t xml:space="preserve">3.4 Sensitivity Analysis</w:t>
       </w:r>
     </w:p>
     <w:p>
@@ -4232,18 +4217,18 @@
         <w:t xml:space="preserve"> </w:t>
       </w:r>
       <w:r>
-        <w:t xml:space="preserve">This shows that the results are robust to prior specification, because the shifts in the pooled estimate are not substantial and do not change the conclusion.</w:t>
-      </w:r>
-    </w:p>
-    <w:bookmarkEnd w:id="40"/>
-    <w:bookmarkEnd w:id="41"/>
-    <w:bookmarkStart w:id="42" w:name="discussion"/>
+        <w:t xml:space="preserve">This shows that the results are robust to prior specification, because the shifts in the pooled estimate are not substantial and do not change the conclusion of our analysis.</w:t>
+      </w:r>
+    </w:p>
+    <w:bookmarkEnd w:id="43"/>
+    <w:bookmarkEnd w:id="44"/>
+    <w:bookmarkStart w:id="45" w:name="discussion"/>
     <w:p>
       <w:pPr>
         <w:pStyle w:val="Heading1"/>
       </w:pPr>
       <w:r>
-        <w:t xml:space="preserve">Discussion</w:t>
+        <w:t xml:space="preserve">4. Discussion</w:t>
       </w:r>
     </w:p>
     <w:p>
@@ -4409,7 +4394,7 @@
         <w:t xml:space="preserve"> </w:t>
       </w:r>
       <w:r>
-        <w:t xml:space="preserve">When meaningful effect size or risk thresholds are defined, exceedance probabilities can be directly obtained from the posterior, providing an intuitive and policy-relevant summary of uncertainty.</w:t>
+        <w:t xml:space="preserve">When meaningful effect sizes or risk thresholds are defined, exceedance probabilities can be directly obtained from the posterior, providing an intuitive and policy-relevant summary of uncertainty.</w:t>
       </w:r>
       <w:r>
         <w:t xml:space="preserve"> </w:t>
@@ -4637,7 +4622,7 @@
         <w:t xml:space="preserve"> </w:t>
       </w:r>
       <w:r>
-        <w:t xml:space="preserve">The Bayesian approach was less sensitive to estimates from such studies, as the results of individual studies with large uncertainty are shrunk towards the pooled estimate, which is a particular advantage when pooling a small number of studies.</w:t>
+        <w:t xml:space="preserve">The Bayesian approach was less sensitive to estimates from such studies, because the results of individual studies with large uncertainty were shrunk towards the pooled estimate, which is a particular advantage when pooling a small number of studies.</w:t>
       </w:r>
     </w:p>
     <w:p>
@@ -4676,6 +4661,9 @@
       </w:r>
       <w:r>
         <w:t xml:space="preserve">While this reduced the number of studies available for pooling, exclusion was necessary to ensure interpretability, as combining effect estimates expressed on different scales would render the pooled estimate uninterpretable.</w:t>
+      </w:r>
+      <w:r>
+        <w:t xml:space="preserve"> </w:t>
       </w:r>
     </w:p>
     <w:p>
@@ -4739,14 +4727,14 @@
         <w:t xml:space="preserve">Finally, we adhered to PRISMA and BARG reporting guidelines, along with the use of the raRoB tool for risk of bias assessment, ensuring consistency and rigor in study selection, data extraction, study quality appraisal, and statistical analysis.</w:t>
       </w:r>
     </w:p>
-    <w:bookmarkEnd w:id="42"/>
-    <w:bookmarkStart w:id="43" w:name="conclusions"/>
+    <w:bookmarkEnd w:id="45"/>
+    <w:bookmarkStart w:id="46" w:name="conclusions"/>
     <w:p>
       <w:pPr>
         <w:pStyle w:val="Heading1"/>
       </w:pPr>
       <w:r>
-        <w:t xml:space="preserve">Conclusions</w:t>
+        <w:t xml:space="preserve">5. Conclusions</w:t>
       </w:r>
     </w:p>
     <w:p>
@@ -4789,8 +4777,8 @@
         <w:t xml:space="preserve">We believe that the benefits gained outweigh the investments made and therefore want to encourage researchers to consider Bayesian methods.</w:t>
       </w:r>
     </w:p>
-    <w:bookmarkEnd w:id="43"/>
-    <w:bookmarkStart w:id="44" w:name="list-of-abbreviations"/>
+    <w:bookmarkEnd w:id="46"/>
+    <w:bookmarkStart w:id="47" w:name="list-of-abbreviations"/>
     <w:p>
       <w:pPr>
         <w:pStyle w:val="Heading1"/>
@@ -5230,8 +5218,8 @@
         </w:tc>
       </w:tr>
     </w:tbl>
-    <w:bookmarkEnd w:id="44"/>
-    <w:bookmarkStart w:id="45" w:name="credit-authorship-contribution-statement"/>
+    <w:bookmarkEnd w:id="47"/>
+    <w:bookmarkStart w:id="48" w:name="credit-authorship-contribution-statement"/>
     <w:p>
       <w:pPr>
         <w:pStyle w:val="Heading1"/>
@@ -5307,8 +5295,8 @@
         <w:t xml:space="preserve">: Supervision, Writing – review and editing.</w:t>
       </w:r>
     </w:p>
-    <w:bookmarkEnd w:id="45"/>
-    <w:bookmarkStart w:id="46" w:name="acknowledgements"/>
+    <w:bookmarkEnd w:id="48"/>
+    <w:bookmarkStart w:id="49" w:name="acknowledgements"/>
     <w:p>
       <w:pPr>
         <w:pStyle w:val="Heading1"/>
@@ -5367,8 +5355,8 @@
         <w:t xml:space="preserve">for their help in the literature screening process.</w:t>
       </w:r>
     </w:p>
-    <w:bookmarkEnd w:id="46"/>
-    <w:bookmarkStart w:id="47" w:name="funding"/>
+    <w:bookmarkEnd w:id="49"/>
+    <w:bookmarkStart w:id="50" w:name="funding"/>
     <w:p>
       <w:pPr>
         <w:pStyle w:val="Heading1"/>
@@ -5397,8 +5385,8 @@
         <w:t xml:space="preserve">Neither the European Union nor the granting authority can be held responsible for them.</w:t>
       </w:r>
     </w:p>
-    <w:bookmarkEnd w:id="47"/>
-    <w:bookmarkStart w:id="48" w:name="X1f74eb43af444059c7518034463b6c89b1cacf4"/>
+    <w:bookmarkEnd w:id="50"/>
+    <w:bookmarkStart w:id="51" w:name="X1f74eb43af444059c7518034463b6c89b1cacf4"/>
     <w:p>
       <w:pPr>
         <w:pStyle w:val="Heading1"/>
@@ -5421,8 +5409,8 @@
         <w:t xml:space="preserve">After using this tool, the authors reviewed and edited the content as needed and take full responsibility for the content of the published article.</w:t>
       </w:r>
     </w:p>
-    <w:bookmarkEnd w:id="48"/>
-    <w:bookmarkStart w:id="172" w:name="bibliography"/>
+    <w:bookmarkEnd w:id="51"/>
+    <w:bookmarkStart w:id="175" w:name="bibliography"/>
     <w:p>
       <w:pPr>
         <w:pStyle w:val="Heading1"/>
@@ -5431,8 +5419,8 @@
         <w:t xml:space="preserve">References</w:t>
       </w:r>
     </w:p>
-    <w:bookmarkStart w:id="171" w:name="refs"/>
-    <w:bookmarkStart w:id="50" w:name="X06097e4c5e52362623b7f1c040457eb7d553acc"/>
+    <w:bookmarkStart w:id="174" w:name="refs"/>
+    <w:bookmarkStart w:id="53" w:name="X06097e4c5e52362623b7f1c040457eb7d553acc"/>
     <w:p>
       <w:pPr>
         <w:pStyle w:val="Bibliography"/>
@@ -5518,7 +5506,7 @@
       <w:r>
         <w:t xml:space="preserve"> </w:t>
       </w:r>
-      <w:hyperlink r:id="rId49">
+      <w:hyperlink r:id="rId52">
         <w:r>
           <w:rPr>
             <w:rStyle w:val="Hyperlink"/>
@@ -5527,8 +5515,8 @@
         </w:r>
       </w:hyperlink>
     </w:p>
-    <w:bookmarkEnd w:id="50"/>
-    <w:bookmarkStart w:id="52" w:name="ref-bauer2020AssociationsMetalMixture"/>
+    <w:bookmarkEnd w:id="53"/>
+    <w:bookmarkStart w:id="55" w:name="ref-bauer2020AssociationsMetalMixture"/>
     <w:p>
       <w:pPr>
         <w:pStyle w:val="Bibliography"/>
@@ -5605,7 +5593,7 @@
       <w:r>
         <w:t xml:space="preserve"> </w:t>
       </w:r>
-      <w:hyperlink r:id="rId51">
+      <w:hyperlink r:id="rId54">
         <w:r>
           <w:rPr>
             <w:rStyle w:val="Hyperlink"/>
@@ -5614,8 +5602,8 @@
         </w:r>
       </w:hyperlink>
     </w:p>
-    <w:bookmarkEnd w:id="52"/>
-    <w:bookmarkStart w:id="54" w:name="ref-bellinger1992LowLevelLeadExposure"/>
+    <w:bookmarkEnd w:id="55"/>
+    <w:bookmarkStart w:id="57" w:name="ref-bellinger1992LowLevelLeadExposure"/>
     <w:p>
       <w:pPr>
         <w:pStyle w:val="Bibliography"/>
@@ -5662,7 +5650,7 @@
       <w:r>
         <w:t xml:space="preserve"> </w:t>
       </w:r>
-      <w:hyperlink r:id="rId53">
+      <w:hyperlink r:id="rId56">
         <w:r>
           <w:rPr>
             <w:rStyle w:val="Hyperlink"/>
@@ -5671,8 +5659,8 @@
         </w:r>
       </w:hyperlink>
     </w:p>
-    <w:bookmarkEnd w:id="54"/>
-    <w:bookmarkStart w:id="56" w:name="ref-burkner2017BrmsPackageBayesian"/>
+    <w:bookmarkEnd w:id="57"/>
+    <w:bookmarkStart w:id="59" w:name="ref-burkner2017BrmsPackageBayesian"/>
     <w:p>
       <w:pPr>
         <w:pStyle w:val="Bibliography"/>
@@ -5746,7 +5734,7 @@
       <w:r>
         <w:t xml:space="preserve"> </w:t>
       </w:r>
-      <w:hyperlink r:id="rId55">
+      <w:hyperlink r:id="rId58">
         <w:r>
           <w:rPr>
             <w:rStyle w:val="Hyperlink"/>
@@ -5755,8 +5743,8 @@
         </w:r>
       </w:hyperlink>
     </w:p>
-    <w:bookmarkEnd w:id="56"/>
-    <w:bookmarkStart w:id="58" w:name="ref-ciyer2025BayesianMetaanalysis21st"/>
+    <w:bookmarkEnd w:id="59"/>
+    <w:bookmarkStart w:id="61" w:name="ref-ciyer2025BayesianMetaanalysis21st"/>
     <w:p>
       <w:pPr>
         <w:pStyle w:val="Bibliography"/>
@@ -5779,7 +5767,7 @@
       <w:r>
         <w:t xml:space="preserve"> </w:t>
       </w:r>
-      <w:hyperlink r:id="rId57">
+      <w:hyperlink r:id="rId60">
         <w:r>
           <w:rPr>
             <w:rStyle w:val="Hyperlink"/>
@@ -5788,8 +5776,8 @@
         </w:r>
       </w:hyperlink>
     </w:p>
-    <w:bookmarkEnd w:id="58"/>
-    <w:bookmarkStart w:id="60" w:name="Xa2086c2c3f6a9ac4b676f66b1cdbbd5efdb3b23"/>
+    <w:bookmarkEnd w:id="61"/>
+    <w:bookmarkStart w:id="63" w:name="Xa2086c2c3f6a9ac4b676f66b1cdbbd5efdb3b23"/>
     <w:p>
       <w:pPr>
         <w:pStyle w:val="Bibliography"/>
@@ -5856,7 +5844,7 @@
       <w:r>
         <w:t xml:space="preserve"> </w:t>
       </w:r>
-      <w:hyperlink r:id="rId59">
+      <w:hyperlink r:id="rId62">
         <w:r>
           <w:rPr>
             <w:rStyle w:val="Hyperlink"/>
@@ -5865,8 +5853,8 @@
         </w:r>
       </w:hyperlink>
     </w:p>
-    <w:bookmarkEnd w:id="60"/>
-    <w:bookmarkStart w:id="62" w:name="X93c1fc7f8e1220d02cbab90c02ac44248f2b23e"/>
+    <w:bookmarkEnd w:id="63"/>
+    <w:bookmarkStart w:id="65" w:name="X93c1fc7f8e1220d02cbab90c02ac44248f2b23e"/>
     <w:p>
       <w:pPr>
         <w:pStyle w:val="Bibliography"/>
@@ -5877,7 +5865,7 @@
       <w:r>
         <w:t xml:space="preserve"> </w:t>
       </w:r>
-      <w:hyperlink r:id="rId61">
+      <w:hyperlink r:id="rId64">
         <w:r>
           <w:rPr>
             <w:rStyle w:val="Hyperlink"/>
@@ -5886,8 +5874,8 @@
         </w:r>
       </w:hyperlink>
     </w:p>
-    <w:bookmarkEnd w:id="62"/>
-    <w:bookmarkStart w:id="64" w:name="ref-chang2006LowBloodLead"/>
+    <w:bookmarkEnd w:id="65"/>
+    <w:bookmarkStart w:id="67" w:name="ref-chang2006LowBloodLead"/>
     <w:p>
       <w:pPr>
         <w:pStyle w:val="Bibliography"/>
@@ -5898,7 +5886,7 @@
       <w:r>
         <w:t xml:space="preserve"> </w:t>
       </w:r>
-      <w:hyperlink r:id="rId63">
+      <w:hyperlink r:id="rId66">
         <w:r>
           <w:rPr>
             <w:rStyle w:val="Hyperlink"/>
@@ -5907,8 +5895,8 @@
         </w:r>
       </w:hyperlink>
     </w:p>
-    <w:bookmarkEnd w:id="64"/>
-    <w:bookmarkStart w:id="66" w:name="ref-chen2005IQBloodLead"/>
+    <w:bookmarkEnd w:id="67"/>
+    <w:bookmarkStart w:id="69" w:name="ref-chen2005IQBloodLead"/>
     <w:p>
       <w:pPr>
         <w:pStyle w:val="Bibliography"/>
@@ -6030,7 +6018,7 @@
       <w:r>
         <w:t xml:space="preserve"> </w:t>
       </w:r>
-      <w:hyperlink r:id="rId65">
+      <w:hyperlink r:id="rId68">
         <w:r>
           <w:rPr>
             <w:rStyle w:val="Hyperlink"/>
@@ -6039,8 +6027,8 @@
         </w:r>
       </w:hyperlink>
     </w:p>
-    <w:bookmarkEnd w:id="66"/>
-    <w:bookmarkStart w:id="68" w:name="ref-crump2013StatisticalReevaluationData"/>
+    <w:bookmarkEnd w:id="69"/>
+    <w:bookmarkStart w:id="71" w:name="ref-crump2013StatisticalReevaluationData"/>
     <w:p>
       <w:pPr>
         <w:pStyle w:val="Bibliography"/>
@@ -6063,7 +6051,7 @@
       <w:r>
         <w:t xml:space="preserve"> </w:t>
       </w:r>
-      <w:hyperlink r:id="rId67">
+      <w:hyperlink r:id="rId70">
         <w:r>
           <w:rPr>
             <w:rStyle w:val="Hyperlink"/>
@@ -6072,8 +6060,8 @@
         </w:r>
       </w:hyperlink>
     </w:p>
-    <w:bookmarkEnd w:id="68"/>
-    <w:bookmarkStart w:id="70" w:name="ref-dantzer2020ComparisonBloodToenails"/>
+    <w:bookmarkEnd w:id="71"/>
+    <w:bookmarkStart w:id="73" w:name="ref-dantzer2020ComparisonBloodToenails"/>
     <w:p>
       <w:pPr>
         <w:pStyle w:val="Bibliography"/>
@@ -6084,7 +6072,7 @@
       <w:r>
         <w:t xml:space="preserve"> </w:t>
       </w:r>
-      <w:hyperlink r:id="rId69">
+      <w:hyperlink r:id="rId72">
         <w:r>
           <w:rPr>
             <w:rStyle w:val="Hyperlink"/>
@@ -6093,8 +6081,8 @@
         </w:r>
       </w:hyperlink>
     </w:p>
-    <w:bookmarkEnd w:id="70"/>
-    <w:bookmarkStart w:id="72" w:name="X6bc65313eadd1b86059eb4ba10c8cf9d91be17d"/>
+    <w:bookmarkEnd w:id="73"/>
+    <w:bookmarkStart w:id="75" w:name="X6bc65313eadd1b86059eb4ba10c8cf9d91be17d"/>
     <w:p>
       <w:pPr>
         <w:pStyle w:val="Bibliography"/>
@@ -6129,7 +6117,7 @@
       <w:r>
         <w:t xml:space="preserve"> </w:t>
       </w:r>
-      <w:hyperlink r:id="rId71">
+      <w:hyperlink r:id="rId74">
         <w:r>
           <w:rPr>
             <w:rStyle w:val="Hyperlink"/>
@@ -6138,8 +6126,8 @@
         </w:r>
       </w:hyperlink>
     </w:p>
-    <w:bookmarkEnd w:id="72"/>
-    <w:bookmarkStart w:id="74" w:name="Xadfdab0209e4a364d9fdcffecfddb00700d2db9"/>
+    <w:bookmarkEnd w:id="75"/>
+    <w:bookmarkStart w:id="77" w:name="Xadfdab0209e4a364d9fdcffecfddb00700d2db9"/>
     <w:p>
       <w:pPr>
         <w:pStyle w:val="Bibliography"/>
@@ -6213,7 +6201,7 @@
       <w:r>
         <w:t xml:space="preserve"> </w:t>
       </w:r>
-      <w:hyperlink r:id="rId73">
+      <w:hyperlink r:id="rId76">
         <w:r>
           <w:rPr>
             <w:rStyle w:val="Hyperlink"/>
@@ -6222,8 +6210,8 @@
         </w:r>
       </w:hyperlink>
     </w:p>
-    <w:bookmarkEnd w:id="74"/>
-    <w:bookmarkStart w:id="76" w:name="ref-earl2016LowlevelEnvironmentalLead"/>
+    <w:bookmarkEnd w:id="77"/>
+    <w:bookmarkStart w:id="79" w:name="ref-earl2016LowlevelEnvironmentalLead"/>
     <w:p>
       <w:pPr>
         <w:pStyle w:val="Bibliography"/>
@@ -6234,7 +6222,7 @@
       <w:r>
         <w:t xml:space="preserve"> </w:t>
       </w:r>
-      <w:hyperlink r:id="rId75">
+      <w:hyperlink r:id="rId78">
         <w:r>
           <w:rPr>
             <w:rStyle w:val="Hyperlink"/>
@@ -6243,8 +6231,8 @@
         </w:r>
       </w:hyperlink>
     </w:p>
-    <w:bookmarkEnd w:id="76"/>
-    <w:bookmarkStart w:id="78" w:name="X4707f3a4b72a0982487545f9dc3d674642af108"/>
+    <w:bookmarkEnd w:id="79"/>
+    <w:bookmarkStart w:id="81" w:name="X4707f3a4b72a0982487545f9dc3d674642af108"/>
     <w:p>
       <w:pPr>
         <w:pStyle w:val="Bibliography"/>
@@ -6267,7 +6255,7 @@
       <w:r>
         <w:t xml:space="preserve"> </w:t>
       </w:r>
-      <w:hyperlink r:id="rId77">
+      <w:hyperlink r:id="rId80">
         <w:r>
           <w:rPr>
             <w:rStyle w:val="Hyperlink"/>
@@ -6276,8 +6264,8 @@
         </w:r>
       </w:hyperlink>
     </w:p>
-    <w:bookmarkEnd w:id="78"/>
-    <w:bookmarkStart w:id="80" w:name="X5615fc1cb9c455a90da75660348bda09fd0f967"/>
+    <w:bookmarkEnd w:id="81"/>
+    <w:bookmarkStart w:id="83" w:name="X5615fc1cb9c455a90da75660348bda09fd0f967"/>
     <w:p>
       <w:pPr>
         <w:pStyle w:val="Bibliography"/>
@@ -6321,7 +6309,7 @@
       <w:r>
         <w:t xml:space="preserve"> </w:t>
       </w:r>
-      <w:hyperlink r:id="rId79">
+      <w:hyperlink r:id="rId82">
         <w:r>
           <w:rPr>
             <w:rStyle w:val="Hyperlink"/>
@@ -6330,8 +6318,8 @@
         </w:r>
       </w:hyperlink>
     </w:p>
-    <w:bookmarkEnd w:id="80"/>
-    <w:bookmarkStart w:id="82" w:name="ref-figueroa2024LossCognitiveFunction"/>
+    <w:bookmarkEnd w:id="83"/>
+    <w:bookmarkStart w:id="85" w:name="ref-figueroa2024LossCognitiveFunction"/>
     <w:p>
       <w:pPr>
         <w:pStyle w:val="Bibliography"/>
@@ -6354,7 +6342,7 @@
       <w:r>
         <w:t xml:space="preserve"> </w:t>
       </w:r>
-      <w:hyperlink r:id="rId81">
+      <w:hyperlink r:id="rId84">
         <w:r>
           <w:rPr>
             <w:rStyle w:val="Hyperlink"/>
@@ -6363,8 +6351,8 @@
         </w:r>
       </w:hyperlink>
     </w:p>
-    <w:bookmarkEnd w:id="82"/>
-    <w:bookmarkStart w:id="83" w:name="X21bf392f662dc1b38e9a7fa4b314fc7a471696b"/>
+    <w:bookmarkEnd w:id="85"/>
+    <w:bookmarkStart w:id="86" w:name="X21bf392f662dc1b38e9a7fa4b314fc7a471696b"/>
     <w:p>
       <w:pPr>
         <w:pStyle w:val="Bibliography"/>
@@ -6394,8 +6382,8 @@
         <w:t xml:space="preserve">.</w:t>
       </w:r>
     </w:p>
-    <w:bookmarkEnd w:id="83"/>
-    <w:bookmarkStart w:id="85" w:name="ref-gelman2013Chapter4Asymptotics"/>
+    <w:bookmarkEnd w:id="86"/>
+    <w:bookmarkStart w:id="88" w:name="ref-gelman2013Chapter4Asymptotics"/>
     <w:p>
       <w:pPr>
         <w:pStyle w:val="Bibliography"/>
@@ -6445,7 +6433,7 @@
       <w:r>
         <w:t xml:space="preserve"> </w:t>
       </w:r>
-      <w:hyperlink r:id="rId84">
+      <w:hyperlink r:id="rId87">
         <w:r>
           <w:rPr>
             <w:rStyle w:val="Hyperlink"/>
@@ -6454,8 +6442,8 @@
         </w:r>
       </w:hyperlink>
     </w:p>
-    <w:bookmarkEnd w:id="85"/>
-    <w:bookmarkStart w:id="87" w:name="ref-gelman2020BayesianWorkflow"/>
+    <w:bookmarkEnd w:id="88"/>
+    <w:bookmarkStart w:id="90" w:name="ref-gelman2020BayesianWorkflow"/>
     <w:p>
       <w:pPr>
         <w:pStyle w:val="Bibliography"/>
@@ -6475,7 +6463,7 @@
       <w:r>
         <w:t xml:space="preserve"> </w:t>
       </w:r>
-      <w:hyperlink r:id="rId86">
+      <w:hyperlink r:id="rId89">
         <w:r>
           <w:rPr>
             <w:rStyle w:val="Hyperlink"/>
@@ -6484,8 +6472,8 @@
         </w:r>
       </w:hyperlink>
     </w:p>
-    <w:bookmarkEnd w:id="87"/>
-    <w:bookmarkStart w:id="89" w:name="ref-goodman2023SexDifferencePre"/>
+    <w:bookmarkEnd w:id="90"/>
+    <w:bookmarkStart w:id="92" w:name="ref-goodman2023SexDifferencePre"/>
     <w:p>
       <w:pPr>
         <w:pStyle w:val="Bibliography"/>
@@ -6496,7 +6484,7 @@
       <w:r>
         <w:t xml:space="preserve"> </w:t>
       </w:r>
-      <w:hyperlink r:id="rId88">
+      <w:hyperlink r:id="rId91">
         <w:r>
           <w:rPr>
             <w:rStyle w:val="Hyperlink"/>
@@ -6505,8 +6493,8 @@
         </w:r>
       </w:hyperlink>
     </w:p>
-    <w:bookmarkEnd w:id="89"/>
-    <w:bookmarkStart w:id="91" w:name="X035620408d1fb22c7ed381e74f0468c30df4612"/>
+    <w:bookmarkEnd w:id="92"/>
+    <w:bookmarkStart w:id="94" w:name="X035620408d1fb22c7ed381e74f0468c30df4612"/>
     <w:p>
       <w:pPr>
         <w:pStyle w:val="Bibliography"/>
@@ -6544,7 +6532,7 @@
       <w:r>
         <w:t xml:space="preserve"> </w:t>
       </w:r>
-      <w:hyperlink r:id="rId90">
+      <w:hyperlink r:id="rId93">
         <w:r>
           <w:rPr>
             <w:rStyle w:val="Hyperlink"/>
@@ -6553,8 +6541,8 @@
         </w:r>
       </w:hyperlink>
     </w:p>
-    <w:bookmarkEnd w:id="91"/>
-    <w:bookmarkStart w:id="93" w:name="ref-halabicky2023LowLevelLead"/>
+    <w:bookmarkEnd w:id="94"/>
+    <w:bookmarkStart w:id="96" w:name="ref-halabicky2023LowLevelLead"/>
     <w:p>
       <w:pPr>
         <w:pStyle w:val="Bibliography"/>
@@ -6577,7 +6565,7 @@
       <w:r>
         <w:t xml:space="preserve"> </w:t>
       </w:r>
-      <w:hyperlink r:id="rId92">
+      <w:hyperlink r:id="rId95">
         <w:r>
           <w:rPr>
             <w:rStyle w:val="Hyperlink"/>
@@ -6586,8 +6574,8 @@
         </w:r>
       </w:hyperlink>
     </w:p>
-    <w:bookmarkEnd w:id="93"/>
-    <w:bookmarkStart w:id="95" w:name="ref-harari2018BloodLeadLevels"/>
+    <w:bookmarkEnd w:id="96"/>
+    <w:bookmarkStart w:id="98" w:name="ref-harari2018BloodLeadLevels"/>
     <w:p>
       <w:pPr>
         <w:pStyle w:val="Bibliography"/>
@@ -6631,7 +6619,7 @@
       <w:r>
         <w:t xml:space="preserve"> </w:t>
       </w:r>
-      <w:hyperlink r:id="rId94">
+      <w:hyperlink r:id="rId97">
         <w:r>
           <w:rPr>
             <w:rStyle w:val="Hyperlink"/>
@@ -6640,8 +6628,8 @@
         </w:r>
       </w:hyperlink>
     </w:p>
-    <w:bookmarkEnd w:id="95"/>
-    <w:bookmarkStart w:id="97" w:name="Xec30ec7c912152a14c0f622040312567154bf15"/>
+    <w:bookmarkEnd w:id="98"/>
+    <w:bookmarkStart w:id="100" w:name="Xec30ec7c912152a14c0f622040312567154bf15"/>
     <w:p>
       <w:pPr>
         <w:pStyle w:val="Bibliography"/>
@@ -6733,7 +6721,7 @@
       <w:r>
         <w:t xml:space="preserve"> </w:t>
       </w:r>
-      <w:hyperlink r:id="rId96">
+      <w:hyperlink r:id="rId99">
         <w:r>
           <w:rPr>
             <w:rStyle w:val="Hyperlink"/>
@@ -6742,8 +6730,8 @@
         </w:r>
       </w:hyperlink>
     </w:p>
-    <w:bookmarkEnd w:id="97"/>
-    <w:bookmarkStart w:id="99" w:name="ref-hay2025Burden375Diseases"/>
+    <w:bookmarkEnd w:id="100"/>
+    <w:bookmarkStart w:id="102" w:name="ref-hay2025Burden375Diseases"/>
     <w:p>
       <w:pPr>
         <w:pStyle w:val="Bibliography"/>
@@ -6778,7 +6766,7 @@
       <w:r>
         <w:t xml:space="preserve"> </w:t>
       </w:r>
-      <w:hyperlink r:id="rId98">
+      <w:hyperlink r:id="rId101">
         <w:r>
           <w:rPr>
             <w:rStyle w:val="Hyperlink"/>
@@ -6787,8 +6775,8 @@
         </w:r>
       </w:hyperlink>
     </w:p>
-    <w:bookmarkEnd w:id="99"/>
-    <w:bookmarkStart w:id="101" w:name="ref-heidari2022EffectLeadExposurea"/>
+    <w:bookmarkEnd w:id="102"/>
+    <w:bookmarkStart w:id="104" w:name="ref-heidari2022EffectLeadExposurea"/>
     <w:p>
       <w:pPr>
         <w:pStyle w:val="Bibliography"/>
@@ -6811,7 +6799,7 @@
       <w:r>
         <w:t xml:space="preserve"> </w:t>
       </w:r>
-      <w:hyperlink r:id="rId100">
+      <w:hyperlink r:id="rId103">
         <w:r>
           <w:rPr>
             <w:rStyle w:val="Hyperlink"/>
@@ -6820,8 +6808,8 @@
         </w:r>
       </w:hyperlink>
     </w:p>
-    <w:bookmarkEnd w:id="101"/>
-    <w:bookmarkStart w:id="103" w:name="X837f91f784566061977da85c17a5755a81dedde"/>
+    <w:bookmarkEnd w:id="104"/>
+    <w:bookmarkStart w:id="106" w:name="X837f91f784566061977da85c17a5755a81dedde"/>
     <w:p>
       <w:pPr>
         <w:pStyle w:val="Bibliography"/>
@@ -6832,7 +6820,7 @@
       <w:r>
         <w:t xml:space="preserve"> </w:t>
       </w:r>
-      <w:hyperlink r:id="rId102">
+      <w:hyperlink r:id="rId105">
         <w:r>
           <w:rPr>
             <w:rStyle w:val="Hyperlink"/>
@@ -6841,8 +6829,8 @@
         </w:r>
       </w:hyperlink>
     </w:p>
-    <w:bookmarkEnd w:id="103"/>
-    <w:bookmarkStart w:id="105" w:name="ref-hong2013ComparingBayesianFrequentist"/>
+    <w:bookmarkEnd w:id="106"/>
+    <w:bookmarkStart w:id="108" w:name="ref-hong2013ComparingBayesianFrequentist"/>
     <w:p>
       <w:pPr>
         <w:pStyle w:val="Bibliography"/>
@@ -6886,7 +6874,7 @@
       <w:r>
         <w:t xml:space="preserve"> </w:t>
       </w:r>
-      <w:hyperlink r:id="rId104">
+      <w:hyperlink r:id="rId107">
         <w:r>
           <w:rPr>
             <w:rStyle w:val="Hyperlink"/>
@@ -6895,8 +6883,8 @@
         </w:r>
       </w:hyperlink>
     </w:p>
-    <w:bookmarkEnd w:id="105"/>
-    <w:bookmarkStart w:id="107" w:name="ref-hong2015EnvironmentalLeadExposure"/>
+    <w:bookmarkEnd w:id="108"/>
+    <w:bookmarkStart w:id="110" w:name="ref-hong2015EnvironmentalLeadExposure"/>
     <w:p>
       <w:pPr>
         <w:pStyle w:val="Bibliography"/>
@@ -6958,7 +6946,7 @@
       <w:r>
         <w:t xml:space="preserve"> </w:t>
       </w:r>
-      <w:hyperlink r:id="rId106">
+      <w:hyperlink r:id="rId109">
         <w:r>
           <w:rPr>
             <w:rStyle w:val="Hyperlink"/>
@@ -6967,8 +6955,8 @@
         </w:r>
       </w:hyperlink>
     </w:p>
-    <w:bookmarkEnd w:id="107"/>
-    <w:bookmarkStart w:id="109" w:name="ref-kazi2026PvaluesBayesFactor"/>
+    <w:bookmarkEnd w:id="110"/>
+    <w:bookmarkStart w:id="112" w:name="ref-kazi2026PvaluesBayesFactor"/>
     <w:p>
       <w:pPr>
         <w:pStyle w:val="Bibliography"/>
@@ -7009,7 +6997,7 @@
       <w:r>
         <w:t xml:space="preserve"> </w:t>
       </w:r>
-      <w:hyperlink r:id="rId108">
+      <w:hyperlink r:id="rId111">
         <w:r>
           <w:rPr>
             <w:rStyle w:val="Hyperlink"/>
@@ -7018,8 +7006,8 @@
         </w:r>
       </w:hyperlink>
     </w:p>
-    <w:bookmarkEnd w:id="109"/>
-    <w:bookmarkStart w:id="111" w:name="X5cae6442bbe0e1f5d8df6cd5008aab2dbfb65a6"/>
+    <w:bookmarkEnd w:id="112"/>
+    <w:bookmarkStart w:id="114" w:name="X5cae6442bbe0e1f5d8df6cd5008aab2dbfb65a6"/>
     <w:p>
       <w:pPr>
         <w:pStyle w:val="Bibliography"/>
@@ -7039,7 +7027,7 @@
       <w:r>
         <w:t xml:space="preserve"> </w:t>
       </w:r>
-      <w:hyperlink r:id="rId110">
+      <w:hyperlink r:id="rId113">
         <w:r>
           <w:rPr>
             <w:rStyle w:val="Hyperlink"/>
@@ -7048,8 +7036,8 @@
         </w:r>
       </w:hyperlink>
     </w:p>
-    <w:bookmarkEnd w:id="111"/>
-    <w:bookmarkStart w:id="113" w:name="ref-lacerda2023GlobalDecreaseBlood"/>
+    <w:bookmarkEnd w:id="114"/>
+    <w:bookmarkStart w:id="116" w:name="ref-lacerda2023GlobalDecreaseBlood"/>
     <w:p>
       <w:pPr>
         <w:pStyle w:val="Bibliography"/>
@@ -7063,7 +7051,7 @@
       <w:r>
         <w:t xml:space="preserve"> </w:t>
       </w:r>
-      <w:hyperlink r:id="rId112">
+      <w:hyperlink r:id="rId115">
         <w:r>
           <w:rPr>
             <w:rStyle w:val="Hyperlink"/>
@@ -7072,8 +7060,8 @@
         </w:r>
       </w:hyperlink>
     </w:p>
-    <w:bookmarkEnd w:id="113"/>
-    <w:bookmarkStart w:id="115" w:name="X33f03e29791f20cdbbbbf0729c723b16e55ed16"/>
+    <w:bookmarkEnd w:id="116"/>
+    <w:bookmarkStart w:id="118" w:name="X33f03e29791f20cdbbbbf0729c723b16e55ed16"/>
     <w:p>
       <w:pPr>
         <w:pStyle w:val="Bibliography"/>
@@ -7132,7 +7120,7 @@
       <w:r>
         <w:t xml:space="preserve"> </w:t>
       </w:r>
-      <w:hyperlink r:id="rId114">
+      <w:hyperlink r:id="rId117">
         <w:r>
           <w:rPr>
             <w:rStyle w:val="Hyperlink"/>
@@ -7141,8 +7129,8 @@
         </w:r>
       </w:hyperlink>
     </w:p>
-    <w:bookmarkEnd w:id="115"/>
-    <w:bookmarkStart w:id="117" w:name="X9a8bad0b78f43066cb333fdedcdcad5d7017900"/>
+    <w:bookmarkEnd w:id="118"/>
+    <w:bookmarkStart w:id="120" w:name="X9a8bad0b78f43066cb333fdedcdcad5d7017900"/>
     <w:p>
       <w:pPr>
         <w:pStyle w:val="Bibliography"/>
@@ -7189,7 +7177,7 @@
       <w:r>
         <w:t xml:space="preserve"> </w:t>
       </w:r>
-      <w:hyperlink r:id="rId116">
+      <w:hyperlink r:id="rId119">
         <w:r>
           <w:rPr>
             <w:rStyle w:val="Hyperlink"/>
@@ -7198,8 +7186,8 @@
         </w:r>
       </w:hyperlink>
     </w:p>
-    <w:bookmarkEnd w:id="117"/>
-    <w:bookmarkStart w:id="119" w:name="ref-lanphear2018LowlevelLeadExposure"/>
+    <w:bookmarkEnd w:id="120"/>
+    <w:bookmarkStart w:id="122" w:name="ref-lanphear2018LowlevelLeadExposure"/>
     <w:p>
       <w:pPr>
         <w:pStyle w:val="Bibliography"/>
@@ -7222,7 +7210,7 @@
       <w:r>
         <w:t xml:space="preserve"> </w:t>
       </w:r>
-      <w:hyperlink r:id="rId118">
+      <w:hyperlink r:id="rId121">
         <w:r>
           <w:rPr>
             <w:rStyle w:val="Hyperlink"/>
@@ -7231,8 +7219,8 @@
         </w:r>
       </w:hyperlink>
     </w:p>
-    <w:bookmarkEnd w:id="119"/>
-    <w:bookmarkStart w:id="121" w:name="ref-larsen2023GlobalHealthBurden"/>
+    <w:bookmarkEnd w:id="122"/>
+    <w:bookmarkStart w:id="124" w:name="ref-larsen2023GlobalHealthBurden"/>
     <w:p>
       <w:pPr>
         <w:pStyle w:val="Bibliography"/>
@@ -7243,7 +7231,7 @@
       <w:r>
         <w:t xml:space="preserve"> </w:t>
       </w:r>
-      <w:hyperlink r:id="rId120">
+      <w:hyperlink r:id="rId123">
         <w:r>
           <w:rPr>
             <w:rStyle w:val="Hyperlink"/>
@@ -7252,8 +7240,8 @@
         </w:r>
       </w:hyperlink>
     </w:p>
-    <w:bookmarkEnd w:id="121"/>
-    <w:bookmarkStart w:id="123" w:name="ref-lee2021PrenatalPostnatalExposures"/>
+    <w:bookmarkEnd w:id="124"/>
+    <w:bookmarkStart w:id="126" w:name="ref-lee2021PrenatalPostnatalExposures"/>
     <w:p>
       <w:pPr>
         <w:pStyle w:val="Bibliography"/>
@@ -7297,7 +7285,7 @@
       <w:r>
         <w:t xml:space="preserve"> </w:t>
       </w:r>
-      <w:hyperlink r:id="rId122">
+      <w:hyperlink r:id="rId125">
         <w:r>
           <w:rPr>
             <w:rStyle w:val="Hyperlink"/>
@@ -7306,8 +7294,8 @@
         </w:r>
       </w:hyperlink>
     </w:p>
-    <w:bookmarkEnd w:id="123"/>
-    <w:bookmarkStart w:id="125" w:name="X716dc31ca13dac7355fea3a0f7dea95779ecabb"/>
+    <w:bookmarkEnd w:id="126"/>
+    <w:bookmarkStart w:id="128" w:name="X716dc31ca13dac7355fea3a0f7dea95779ecabb"/>
     <w:p>
       <w:pPr>
         <w:pStyle w:val="Bibliography"/>
@@ -7336,7 +7324,7 @@
       <w:r>
         <w:t xml:space="preserve"> </w:t>
       </w:r>
-      <w:hyperlink r:id="rId124">
+      <w:hyperlink r:id="rId127">
         <w:r>
           <w:rPr>
             <w:rStyle w:val="Hyperlink"/>
@@ -7345,8 +7333,8 @@
         </w:r>
       </w:hyperlink>
     </w:p>
-    <w:bookmarkEnd w:id="125"/>
-    <w:bookmarkStart w:id="127" w:name="Xb0421be95a139ca5af39ce6040517bf1be79427"/>
+    <w:bookmarkEnd w:id="128"/>
+    <w:bookmarkStart w:id="130" w:name="Xb0421be95a139ca5af39ce6040517bf1be79427"/>
     <w:p>
       <w:pPr>
         <w:pStyle w:val="Bibliography"/>
@@ -7369,7 +7357,7 @@
       <w:r>
         <w:t xml:space="preserve"> </w:t>
       </w:r>
-      <w:hyperlink r:id="rId126">
+      <w:hyperlink r:id="rId129">
         <w:r>
           <w:rPr>
             <w:rStyle w:val="Hyperlink"/>
@@ -7378,8 +7366,8 @@
         </w:r>
       </w:hyperlink>
     </w:p>
-    <w:bookmarkEnd w:id="127"/>
-    <w:bookmarkStart w:id="129" w:name="ref-mcfarland2022HalfUSPopulation"/>
+    <w:bookmarkEnd w:id="130"/>
+    <w:bookmarkStart w:id="132" w:name="ref-mcfarland2022HalfUSPopulation"/>
     <w:p>
       <w:pPr>
         <w:pStyle w:val="Bibliography"/>
@@ -7402,7 +7390,7 @@
       <w:r>
         <w:t xml:space="preserve"> </w:t>
       </w:r>
-      <w:hyperlink r:id="rId128">
+      <w:hyperlink r:id="rId131">
         <w:r>
           <w:rPr>
             <w:rStyle w:val="Hyperlink"/>
@@ -7411,8 +7399,8 @@
         </w:r>
       </w:hyperlink>
     </w:p>
-    <w:bookmarkEnd w:id="129"/>
-    <w:bookmarkStart w:id="130" w:name="X33fe7de6e8b65c86af337dbdb8d7cc8651c48a8"/>
+    <w:bookmarkEnd w:id="132"/>
+    <w:bookmarkStart w:id="133" w:name="X33fe7de6e8b65c86af337dbdb8d7cc8651c48a8"/>
     <w:p>
       <w:pPr>
         <w:pStyle w:val="Bibliography"/>
@@ -7478,8 +7466,8 @@
         <w:t xml:space="preserve">. International Journal of Environmental Research and Public Health 15, 2418.</w:t>
       </w:r>
     </w:p>
-    <w:bookmarkEnd w:id="130"/>
-    <w:bookmarkStart w:id="132" w:name="ref-needleman1990LowLevelLeadExposure"/>
+    <w:bookmarkEnd w:id="133"/>
+    <w:bookmarkStart w:id="135" w:name="ref-needleman1990LowLevelLeadExposure"/>
     <w:p>
       <w:pPr>
         <w:pStyle w:val="Bibliography"/>
@@ -7541,7 +7529,7 @@
       <w:r>
         <w:t xml:space="preserve"> </w:t>
       </w:r>
-      <w:hyperlink r:id="rId131">
+      <w:hyperlink r:id="rId134">
         <w:r>
           <w:rPr>
             <w:rStyle w:val="Hyperlink"/>
@@ -7550,8 +7538,8 @@
         </w:r>
       </w:hyperlink>
     </w:p>
-    <w:bookmarkEnd w:id="132"/>
-    <w:bookmarkStart w:id="133" w:name="Xf5486a80753c915bf34b5d8f3ad5e46aac479a7"/>
+    <w:bookmarkEnd w:id="135"/>
+    <w:bookmarkStart w:id="136" w:name="Xf5486a80753c915bf34b5d8f3ad5e46aac479a7"/>
     <w:p>
       <w:pPr>
         <w:pStyle w:val="Bibliography"/>
@@ -7605,8 +7593,8 @@
         <w:t xml:space="preserve">.</w:t>
       </w:r>
     </w:p>
-    <w:bookmarkEnd w:id="133"/>
-    <w:bookmarkStart w:id="135" w:name="ref-page2021PRISMA2020Statement"/>
+    <w:bookmarkEnd w:id="136"/>
+    <w:bookmarkStart w:id="138" w:name="ref-page2021PRISMA2020Statement"/>
     <w:p>
       <w:pPr>
         <w:pStyle w:val="Bibliography"/>
@@ -7629,7 +7617,7 @@
       <w:r>
         <w:t xml:space="preserve"> </w:t>
       </w:r>
-      <w:hyperlink r:id="rId134">
+      <w:hyperlink r:id="rId137">
         <w:r>
           <w:rPr>
             <w:rStyle w:val="Hyperlink"/>
@@ -7638,8 +7626,8 @@
         </w:r>
       </w:hyperlink>
     </w:p>
-    <w:bookmarkEnd w:id="135"/>
-    <w:bookmarkStart w:id="137" w:name="ref-plate2024DevelopmentToolRapid"/>
+    <w:bookmarkEnd w:id="138"/>
+    <w:bookmarkStart w:id="140" w:name="ref-plate2024DevelopmentToolRapid"/>
     <w:p>
       <w:pPr>
         <w:pStyle w:val="Bibliography"/>
@@ -7650,7 +7638,7 @@
       <w:r>
         <w:t xml:space="preserve"> </w:t>
       </w:r>
-      <w:hyperlink r:id="rId136">
+      <w:hyperlink r:id="rId139">
         <w:r>
           <w:rPr>
             <w:rStyle w:val="Hyperlink"/>
@@ -7659,8 +7647,8 @@
         </w:r>
       </w:hyperlink>
     </w:p>
-    <w:bookmarkEnd w:id="137"/>
-    <w:bookmarkStart w:id="139" w:name="ref-pocock1994EnvironmentalLeadChildrens"/>
+    <w:bookmarkEnd w:id="140"/>
+    <w:bookmarkStart w:id="142" w:name="ref-pocock1994EnvironmentalLeadChildrens"/>
     <w:p>
       <w:pPr>
         <w:pStyle w:val="Bibliography"/>
@@ -7671,7 +7659,7 @@
       <w:r>
         <w:t xml:space="preserve"> </w:t>
       </w:r>
-      <w:hyperlink r:id="rId138">
+      <w:hyperlink r:id="rId141">
         <w:r>
           <w:rPr>
             <w:rStyle w:val="Hyperlink"/>
@@ -7680,8 +7668,8 @@
         </w:r>
       </w:hyperlink>
     </w:p>
-    <w:bookmarkEnd w:id="139"/>
-    <w:bookmarkStart w:id="140" w:name="Xd915bcb040430c17655975a5ceb4d7b4bdd04ac"/>
+    <w:bookmarkEnd w:id="142"/>
+    <w:bookmarkStart w:id="143" w:name="Xd915bcb040430c17655975a5ceb4d7b4bdd04ac"/>
     <w:p>
       <w:pPr>
         <w:pStyle w:val="Bibliography"/>
@@ -7690,8 +7678,8 @@
         <w:t xml:space="preserve">Prüss-Üstün, A., Mathers, C., Corvalán, C., Woodward, A., 2003. Assessing the environmental burden of disease at national and local levels: Introduction and methods. Environmental burden of disease series.</w:t>
       </w:r>
     </w:p>
-    <w:bookmarkEnd w:id="140"/>
-    <w:bookmarkStart w:id="141" w:name="X4bd034c52731e178b4de125c2c778bdc533803c"/>
+    <w:bookmarkEnd w:id="143"/>
+    <w:bookmarkStart w:id="144" w:name="X4bd034c52731e178b4de125c2c778bdc533803c"/>
     <w:p>
       <w:pPr>
         <w:pStyle w:val="Bibliography"/>
@@ -7733,8 +7721,8 @@
         <w:t xml:space="preserve">.</w:t>
       </w:r>
     </w:p>
-    <w:bookmarkEnd w:id="141"/>
-    <w:bookmarkStart w:id="143" w:name="ref-rosengren2025ExposureLeadCoronary"/>
+    <w:bookmarkEnd w:id="144"/>
+    <w:bookmarkStart w:id="146" w:name="ref-rosengren2025ExposureLeadCoronary"/>
     <w:p>
       <w:pPr>
         <w:pStyle w:val="Bibliography"/>
@@ -7787,7 +7775,7 @@
       <w:r>
         <w:t xml:space="preserve"> </w:t>
       </w:r>
-      <w:hyperlink r:id="rId142">
+      <w:hyperlink r:id="rId145">
         <w:r>
           <w:rPr>
             <w:rStyle w:val="Hyperlink"/>
@@ -7796,8 +7784,8 @@
         </w:r>
       </w:hyperlink>
     </w:p>
-    <w:bookmarkEnd w:id="143"/>
-    <w:bookmarkStart w:id="145" w:name="ref-roy2013EffectModificationTransferrin"/>
+    <w:bookmarkEnd w:id="146"/>
+    <w:bookmarkStart w:id="148" w:name="ref-roy2013EffectModificationTransferrin"/>
     <w:p>
       <w:pPr>
         <w:pStyle w:val="Bibliography"/>
@@ -7829,7 +7817,7 @@
       <w:r>
         <w:t xml:space="preserve"> </w:t>
       </w:r>
-      <w:hyperlink r:id="rId144">
+      <w:hyperlink r:id="rId147">
         <w:r>
           <w:rPr>
             <w:rStyle w:val="Hyperlink"/>
@@ -7838,8 +7826,8 @@
         </w:r>
       </w:hyperlink>
     </w:p>
-    <w:bookmarkEnd w:id="145"/>
-    <w:bookmarkStart w:id="147" w:name="ref-sadeghirad2023TheoryPracticeBayesian"/>
+    <w:bookmarkEnd w:id="148"/>
+    <w:bookmarkStart w:id="150" w:name="ref-sadeghirad2023TheoryPracticeBayesian"/>
     <w:p>
       <w:pPr>
         <w:pStyle w:val="Bibliography"/>
@@ -7862,7 +7850,7 @@
       <w:r>
         <w:t xml:space="preserve"> </w:t>
       </w:r>
-      <w:hyperlink r:id="rId146">
+      <w:hyperlink r:id="rId149">
         <w:r>
           <w:rPr>
             <w:rStyle w:val="Hyperlink"/>
@@ -7871,8 +7859,8 @@
         </w:r>
       </w:hyperlink>
     </w:p>
-    <w:bookmarkEnd w:id="147"/>
-    <w:bookmarkStart w:id="149" w:name="Xe38019c88c6d2792bb296bad7dc0a4dd55f1319"/>
+    <w:bookmarkEnd w:id="150"/>
+    <w:bookmarkStart w:id="152" w:name="Xe38019c88c6d2792bb296bad7dc0a4dd55f1319"/>
     <w:p>
       <w:pPr>
         <w:pStyle w:val="Bibliography"/>
@@ -7895,7 +7883,7 @@
       <w:r>
         <w:t xml:space="preserve"> </w:t>
       </w:r>
-      <w:hyperlink r:id="rId148">
+      <w:hyperlink r:id="rId151">
         <w:r>
           <w:rPr>
             <w:rStyle w:val="Hyperlink"/>
@@ -7904,8 +7892,8 @@
         </w:r>
       </w:hyperlink>
     </w:p>
-    <w:bookmarkEnd w:id="149"/>
-    <w:bookmarkStart w:id="151" w:name="Xcf7993c3f58afaabaf73be6238c67f4f63053d9"/>
+    <w:bookmarkEnd w:id="152"/>
+    <w:bookmarkStart w:id="154" w:name="Xcf7993c3f58afaabaf73be6238c67f4f63053d9"/>
     <w:p>
       <w:pPr>
         <w:pStyle w:val="Bibliography"/>
@@ -7949,7 +7937,7 @@
       <w:r>
         <w:t xml:space="preserve"> </w:t>
       </w:r>
-      <w:hyperlink r:id="rId150">
+      <w:hyperlink r:id="rId153">
         <w:r>
           <w:rPr>
             <w:rStyle w:val="Hyperlink"/>
@@ -7958,8 +7946,8 @@
         </w:r>
       </w:hyperlink>
     </w:p>
-    <w:bookmarkEnd w:id="151"/>
-    <w:bookmarkStart w:id="153" w:name="ref-schwartz1994LowLevelLeadExposure"/>
+    <w:bookmarkEnd w:id="154"/>
+    <w:bookmarkStart w:id="156" w:name="ref-schwartz1994LowLevelLeadExposure"/>
     <w:p>
       <w:pPr>
         <w:pStyle w:val="Bibliography"/>
@@ -8038,7 +8026,7 @@
       <w:r>
         <w:t xml:space="preserve"> </w:t>
       </w:r>
-      <w:hyperlink r:id="rId152">
+      <w:hyperlink r:id="rId155">
         <w:r>
           <w:rPr>
             <w:rStyle w:val="Hyperlink"/>
@@ -8047,8 +8035,8 @@
         </w:r>
       </w:hyperlink>
     </w:p>
-    <w:bookmarkEnd w:id="153"/>
-    <w:bookmarkStart w:id="155" w:name="X55ae1a8b757df519e0a47e2002b3acc0b2e73ec"/>
+    <w:bookmarkEnd w:id="156"/>
+    <w:bookmarkStart w:id="158" w:name="X55ae1a8b757df519e0a47e2002b3acc0b2e73ec"/>
     <w:p>
       <w:pPr>
         <w:pStyle w:val="Bibliography"/>
@@ -8071,7 +8059,7 @@
       <w:r>
         <w:t xml:space="preserve"> </w:t>
       </w:r>
-      <w:hyperlink r:id="rId154">
+      <w:hyperlink r:id="rId157">
         <w:r>
           <w:rPr>
             <w:rStyle w:val="Hyperlink"/>
@@ -8080,8 +8068,8 @@
         </w:r>
       </w:hyperlink>
     </w:p>
-    <w:bookmarkEnd w:id="155"/>
-    <w:bookmarkStart w:id="157" w:name="ref-shaffer2025LeadExposureAntisocial"/>
+    <w:bookmarkEnd w:id="158"/>
+    <w:bookmarkStart w:id="160" w:name="ref-shaffer2025LeadExposureAntisocial"/>
     <w:p>
       <w:pPr>
         <w:pStyle w:val="Bibliography"/>
@@ -8104,7 +8092,7 @@
       <w:r>
         <w:t xml:space="preserve"> </w:t>
       </w:r>
-      <w:hyperlink r:id="rId156">
+      <w:hyperlink r:id="rId159">
         <w:r>
           <w:rPr>
             <w:rStyle w:val="Hyperlink"/>
@@ -8113,8 +8101,8 @@
         </w:r>
       </w:hyperlink>
     </w:p>
-    <w:bookmarkEnd w:id="157"/>
-    <w:bookmarkStart w:id="159" w:name="ref-smith2018StepAwayStepwise"/>
+    <w:bookmarkEnd w:id="160"/>
+    <w:bookmarkStart w:id="162" w:name="ref-smith2018StepAwayStepwise"/>
     <w:p>
       <w:pPr>
         <w:pStyle w:val="Bibliography"/>
@@ -8125,7 +8113,7 @@
       <w:r>
         <w:t xml:space="preserve"> </w:t>
       </w:r>
-      <w:hyperlink r:id="rId158">
+      <w:hyperlink r:id="rId161">
         <w:r>
           <w:rPr>
             <w:rStyle w:val="Hyperlink"/>
@@ -8134,8 +8122,8 @@
         </w:r>
       </w:hyperlink>
     </w:p>
-    <w:bookmarkEnd w:id="159"/>
-    <w:bookmarkStart w:id="161" w:name="ref-sy2024AssessmentLongTermExposure"/>
+    <w:bookmarkEnd w:id="162"/>
+    <w:bookmarkStart w:id="164" w:name="ref-sy2024AssessmentLongTermExposure"/>
     <w:p>
       <w:pPr>
         <w:pStyle w:val="Bibliography"/>
@@ -8179,7 +8167,7 @@
       <w:r>
         <w:t xml:space="preserve"> </w:t>
       </w:r>
-      <w:hyperlink r:id="rId160">
+      <w:hyperlink r:id="rId163">
         <w:r>
           <w:rPr>
             <w:rStyle w:val="Hyperlink"/>
@@ -8188,8 +8176,8 @@
         </w:r>
       </w:hyperlink>
     </w:p>
-    <w:bookmarkEnd w:id="161"/>
-    <w:bookmarkStart w:id="162" w:name="ref-tamasszigeti2022SubstanceReportLead"/>
+    <w:bookmarkEnd w:id="164"/>
+    <w:bookmarkStart w:id="165" w:name="ref-tamasszigeti2022SubstanceReportLead"/>
     <w:p>
       <w:pPr>
         <w:pStyle w:val="Bibliography"/>
@@ -8207,8 +8195,8 @@
         <w:t xml:space="preserve">. HBM4EU.</w:t>
       </w:r>
     </w:p>
-    <w:bookmarkEnd w:id="162"/>
-    <w:bookmarkStart w:id="164" w:name="X99fa6bd9cd2521340285769f289a6c9d4bfe17b"/>
+    <w:bookmarkEnd w:id="165"/>
+    <w:bookmarkStart w:id="167" w:name="X99fa6bd9cd2521340285769f289a6c9d4bfe17b"/>
     <w:p>
       <w:pPr>
         <w:pStyle w:val="Bibliography"/>
@@ -8252,7 +8240,7 @@
       <w:r>
         <w:t xml:space="preserve"> </w:t>
       </w:r>
-      <w:hyperlink r:id="rId163">
+      <w:hyperlink r:id="rId166">
         <w:r>
           <w:rPr>
             <w:rStyle w:val="Hyperlink"/>
@@ -8261,8 +8249,8 @@
         </w:r>
       </w:hyperlink>
     </w:p>
-    <w:bookmarkEnd w:id="164"/>
-    <w:bookmarkStart w:id="166" w:name="X111bb06244f8f2a1a6d0d2f1f41c24b71f248e6"/>
+    <w:bookmarkEnd w:id="167"/>
+    <w:bookmarkStart w:id="169" w:name="X111bb06244f8f2a1a6d0d2f1f41c24b71f248e6"/>
     <w:p>
       <w:pPr>
         <w:pStyle w:val="Bibliography"/>
@@ -8294,7 +8282,7 @@
       <w:r>
         <w:t xml:space="preserve"> </w:t>
       </w:r>
-      <w:hyperlink r:id="rId165">
+      <w:hyperlink r:id="rId168">
         <w:r>
           <w:rPr>
             <w:rStyle w:val="Hyperlink"/>
@@ -8303,8 +8291,8 @@
         </w:r>
       </w:hyperlink>
     </w:p>
-    <w:bookmarkEnd w:id="166"/>
-    <w:bookmarkStart w:id="168" w:name="ref-wan2022ChronicLeadExposure"/>
+    <w:bookmarkEnd w:id="169"/>
+    <w:bookmarkStart w:id="171" w:name="ref-wan2022ChronicLeadExposure"/>
     <w:p>
       <w:pPr>
         <w:pStyle w:val="Bibliography"/>
@@ -8315,7 +8303,7 @@
       <w:r>
         <w:t xml:space="preserve"> </w:t>
       </w:r>
-      <w:hyperlink r:id="rId167">
+      <w:hyperlink r:id="rId170">
         <w:r>
           <w:rPr>
             <w:rStyle w:val="Hyperlink"/>
@@ -8324,8 +8312,8 @@
         </w:r>
       </w:hyperlink>
     </w:p>
-    <w:bookmarkEnd w:id="168"/>
-    <w:bookmarkStart w:id="170" w:name="X946754e67e3c74fad7a8806aa9d2819ed4ec186"/>
+    <w:bookmarkEnd w:id="171"/>
+    <w:bookmarkStart w:id="173" w:name="X946754e67e3c74fad7a8806aa9d2819ed4ec186"/>
     <w:p>
       <w:pPr>
         <w:pStyle w:val="Bibliography"/>
@@ -8336,7 +8324,7 @@
       <w:r>
         <w:t xml:space="preserve"> </w:t>
       </w:r>
-      <w:hyperlink r:id="rId169">
+      <w:hyperlink r:id="rId172">
         <w:r>
           <w:rPr>
             <w:rStyle w:val="Hyperlink"/>
@@ -8345,13 +8333,21 @@
         </w:r>
       </w:hyperlink>
     </w:p>
-    <w:bookmarkEnd w:id="170"/>
-    <w:bookmarkEnd w:id="171"/>
-    <w:bookmarkEnd w:id="172"/>
+    <w:bookmarkEnd w:id="173"/>
+    <w:bookmarkEnd w:id="174"/>
+    <w:bookmarkEnd w:id="175"/>
     <w:sectPr>
+      <w:footerReference r:id="rId3" w:type="default"/>
       <w:footnotePr>
-        <w:numRestart w:val="eachSect"/>
+        <w:numFmt w:val="decimal"/>
       </w:footnotePr>
+      <w:type w:val="nextPage"/>
+      <w:pgSz w:h="15840" w:w="12240"/>
+      <w:pgMar w:bottom="2199" w:footer="1440" w:gutter="0" w:header="0" w:left="1440" w:right="1440" w:top="1440"/>
+      <w:pgNumType w:fmt="decimal"/>
+      <w:formProt w:val="false"/>
+      <w:textDirection w:val="lrTb"/>
+      <w:docGrid w:charSpace="0" w:linePitch="100" w:type="default"/>
     </w:sectPr>
   </w:body>
 </w:document>
@@ -8359,6 +8355,40 @@
 
 <file path=word/comments.xml><?xml version="1.0" encoding="utf-8"?>
 <w:comments xmlns:w="http://schemas.openxmlformats.org/wordprocessingml/2006/main" xmlns:m="http://schemas.openxmlformats.org/officeDocument/2006/math" xmlns:r="http://schemas.openxmlformats.org/officeDocument/2006/relationships" xmlns:o="urn:schemas-microsoft-com:office:office" xmlns:v="urn:schemas-microsoft-com:vml" xmlns:w10="urn:schemas-microsoft-com:office:word" xmlns:a="http://schemas.openxmlformats.org/drawingml/2006/main" xmlns:pic="http://schemas.openxmlformats.org/drawingml/2006/picture" xmlns:wp="http://schemas.openxmlformats.org/drawingml/2006/wordprocessingDrawing"/>
+</file>
+
+<file path=word/footer1.xml><?xml version="1.0" encoding="utf-8"?>
+<w:ftr xmlns:o="urn:schemas-microsoft-com:office:office" xmlns:r="http://schemas.openxmlformats.org/officeDocument/2006/relationships" xmlns:v="urn:schemas-microsoft-com:vml" xmlns:w="http://schemas.openxmlformats.org/wordprocessingml/2006/main" xmlns:w10="urn:schemas-microsoft-com:office:word" xmlns:wp="http://schemas.openxmlformats.org/drawingml/2006/wordprocessingDrawing" xmlns:wps="http://schemas.microsoft.com/office/word/2010/wordprocessingShape" xmlns:wpg="http://schemas.microsoft.com/office/word/2010/wordprocessingGroup" xmlns:mc="http://schemas.openxmlformats.org/markup-compatibility/2006" xmlns:wp14="http://schemas.microsoft.com/office/word/2010/wordprocessingDrawing" xmlns:w14="http://schemas.microsoft.com/office/word/2010/wordml" xmlns:w15="http://schemas.microsoft.com/office/word/2012/wordml" mc:Ignorable="w14 wp14 w15">
+  <w:p>
+    <w:pPr>
+      <w:pStyle w:val="Footer"/>
+      <w:suppressLineNumbers/>
+      <w:spacing w:before="0" w:after="200"/>
+      <w:jc w:val="right"/>
+      <w:rPr/>
+    </w:pPr>
+    <w:r>
+      <w:rPr/>
+      <w:fldChar w:fldCharType="begin"/>
+    </w:r>
+    <w:r>
+      <w:rPr/>
+      <w:instrText xml:space="preserve"> PAGE </w:instrText>
+    </w:r>
+    <w:r>
+      <w:rPr/>
+      <w:fldChar w:fldCharType="separate"/>
+    </w:r>
+    <w:r>
+      <w:rPr/>
+      <w:t>1</w:t>
+    </w:r>
+    <w:r>
+      <w:rPr/>
+      <w:fldChar w:fldCharType="end"/>
+    </w:r>
+  </w:p>
+</w:ftr>
 </file>
 
 <file path=word/footnotes.xml><?xml version="1.0" encoding="utf-8"?>
@@ -8571,19 +8601,19 @@
 </file>
 
 <file path=word/styles.xml><?xml version="1.0" encoding="utf-8"?>
-<w:styles xmlns:r="http://schemas.openxmlformats.org/officeDocument/2006/relationships" xmlns:w="http://schemas.openxmlformats.org/wordprocessingml/2006/main">
+<w:styles xmlns:mc="http://schemas.openxmlformats.org/markup-compatibility/2006" xmlns:w="http://schemas.openxmlformats.org/wordprocessingml/2006/main" xmlns:w14="http://schemas.microsoft.com/office/word/2010/wordml" mc:Ignorable="w14">
   <w:docDefaults>
     <w:rPrDefault>
       <w:rPr>
-        <w:rFonts w:asciiTheme="minorHAnsi" w:cstheme="minorBidi" w:eastAsiaTheme="minorEastAsia" w:hAnsiTheme="minorHAnsi"/>
+        <w:rFonts w:ascii="Aptos" w:asciiTheme="minorHAnsi" w:cs="" w:cstheme="minorBidi" w:eastAsia="Aptos" w:eastAsiaTheme="minorHAnsi" w:hAnsi="Aptos" w:hAnsiTheme="minorHAnsi"/>
         <w:sz w:val="24"/>
         <w:szCs w:val="24"/>
-        <w:lang w:bidi="ar-SA" w:eastAsia="zh-CN" w:val="en-US"/>
+        <w:lang w:bidi="ar-SA" w:eastAsia="en-US" w:val="en-US"/>
       </w:rPr>
     </w:rPrDefault>
     <w:pPrDefault>
       <w:pPr>
-        <w:spacing w:after="200"/>
+        <w:suppressAutoHyphens w:val="true"/>
       </w:pPr>
     </w:pPrDefault>
   </w:docDefaults>
@@ -8591,6 +8621,454 @@
   <w:style w:default="1" w:styleId="Normal" w:type="paragraph">
     <w:name w:val="Normal"/>
     <w:qFormat/>
+    <w:pPr>
+      <w:widowControl/>
+      <w:suppressAutoHyphens w:val="true"/>
+      <w:bidi w:val="0"/>
+      <w:spacing w:after="200" w:before="0"/>
+      <w:jc w:val="left"/>
+    </w:pPr>
+    <w:rPr>
+      <w:rFonts w:ascii="Aptos" w:asciiTheme="minorHAnsi" w:cs="" w:cstheme="minorBidi" w:eastAsia="Aptos" w:eastAsiaTheme="minorHAnsi" w:hAnsi="Aptos" w:hAnsiTheme="minorHAnsi"/>
+      <w:color w:val="auto"/>
+      <w:kern w:val="0"/>
+      <w:sz w:val="24"/>
+      <w:szCs w:val="24"/>
+      <w:lang w:bidi="ar-SA" w:eastAsia="en-US" w:val="en-US"/>
+    </w:rPr>
+  </w:style>
+  <w:style w:styleId="Heading1" w:type="paragraph">
+    <w:name w:val="Heading 1"/>
+    <w:basedOn w:val="Normal"/>
+    <w:next w:val="BodyText"/>
+    <w:link w:val="Heading1Char"/>
+    <w:uiPriority w:val="9"/>
+    <w:qFormat/>
+    <w:rsid w:val="00a10fd9"/>
+    <w:pPr>
+      <w:keepNext w:val="true"/>
+      <w:keepLines/>
+      <w:spacing w:after="80" w:before="360"/>
+      <w:outlineLvl w:val="0"/>
+    </w:pPr>
+    <w:rPr>
+      <w:rFonts w:ascii="Aptos Display" w:asciiTheme="majorHAnsi" w:cs="" w:cstheme="majorBidi" w:eastAsia="" w:eastAsiaTheme="majorEastAsia" w:hAnsi="Aptos Display" w:hAnsiTheme="majorHAnsi"/>
+      <w:color w:val="000000"/>
+      <w:sz w:val="40"/>
+      <w:szCs w:val="40"/>
+    </w:rPr>
+  </w:style>
+  <w:style w:styleId="Heading2" w:type="paragraph">
+    <w:name w:val="Heading 2"/>
+    <w:basedOn w:val="Normal"/>
+    <w:next w:val="BodyText"/>
+    <w:link w:val="Heading2Char"/>
+    <w:uiPriority w:val="9"/>
+    <w:semiHidden/>
+    <w:unhideWhenUsed/>
+    <w:qFormat/>
+    <w:rsid w:val="00a10fd9"/>
+    <w:pPr>
+      <w:keepNext w:val="true"/>
+      <w:keepLines/>
+      <w:spacing w:after="80" w:before="160"/>
+      <w:outlineLvl w:val="1"/>
+    </w:pPr>
+    <w:rPr>
+      <w:rFonts w:ascii="Aptos Display" w:asciiTheme="majorHAnsi" w:cs="" w:cstheme="majorBidi" w:eastAsia="" w:eastAsiaTheme="majorEastAsia" w:hAnsi="Aptos Display" w:hAnsiTheme="majorHAnsi"/>
+      <w:color w:val="000000"/>
+      <w:sz w:val="32"/>
+      <w:szCs w:val="32"/>
+    </w:rPr>
+  </w:style>
+  <w:style w:styleId="Heading3" w:type="paragraph">
+    <w:name w:val="Heading 3"/>
+    <w:basedOn w:val="Normal"/>
+    <w:next w:val="BodyText"/>
+    <w:link w:val="Heading3Char"/>
+    <w:uiPriority w:val="9"/>
+    <w:semiHidden/>
+    <w:unhideWhenUsed/>
+    <w:qFormat/>
+    <w:rsid w:val="00a10fd9"/>
+    <w:pPr>
+      <w:keepNext w:val="true"/>
+      <w:keepLines/>
+      <w:spacing w:after="80" w:before="160"/>
+      <w:outlineLvl w:val="2"/>
+    </w:pPr>
+    <w:rPr>
+      <w:rFonts w:cs="" w:cstheme="majorBidi" w:eastAsia="" w:eastAsiaTheme="majorEastAsia"/>
+      <w:color w:val="000000"/>
+      <w:sz w:val="28"/>
+      <w:szCs w:val="28"/>
+    </w:rPr>
+  </w:style>
+  <w:style w:styleId="Heading4" w:type="paragraph">
+    <w:name w:val="Heading 4"/>
+    <w:basedOn w:val="Normal"/>
+    <w:next w:val="BodyText"/>
+    <w:link w:val="Heading4Char"/>
+    <w:uiPriority w:val="9"/>
+    <w:semiHidden/>
+    <w:unhideWhenUsed/>
+    <w:qFormat/>
+    <w:rsid w:val="00a10fd9"/>
+    <w:pPr>
+      <w:keepNext w:val="true"/>
+      <w:keepLines/>
+      <w:spacing w:after="40" w:before="80"/>
+      <w:outlineLvl w:val="3"/>
+    </w:pPr>
+    <w:rPr>
+      <w:rFonts w:cs="" w:cstheme="majorBidi" w:eastAsia="" w:eastAsiaTheme="majorEastAsia"/>
+      <w:i/>
+      <w:iCs/>
+      <w:color w:themeColor="accent1" w:themeShade="bf" w:val="0F4761"/>
+    </w:rPr>
+  </w:style>
+  <w:style w:styleId="Heading5" w:type="paragraph">
+    <w:name w:val="Heading 5"/>
+    <w:basedOn w:val="Normal"/>
+    <w:next w:val="BodyText"/>
+    <w:link w:val="Heading5Char"/>
+    <w:uiPriority w:val="9"/>
+    <w:semiHidden/>
+    <w:unhideWhenUsed/>
+    <w:qFormat/>
+    <w:rsid w:val="00a10fd9"/>
+    <w:pPr>
+      <w:keepNext w:val="true"/>
+      <w:keepLines/>
+      <w:spacing w:after="40" w:before="80"/>
+      <w:outlineLvl w:val="4"/>
+    </w:pPr>
+    <w:rPr>
+      <w:rFonts w:cs="" w:cstheme="majorBidi" w:eastAsia="" w:eastAsiaTheme="majorEastAsia"/>
+      <w:color w:themeColor="accent1" w:themeShade="bf" w:val="0F4761"/>
+    </w:rPr>
+  </w:style>
+  <w:style w:styleId="Heading6" w:type="paragraph">
+    <w:name w:val="Heading 6"/>
+    <w:basedOn w:val="Normal"/>
+    <w:next w:val="BodyText"/>
+    <w:link w:val="Heading6Char"/>
+    <w:uiPriority w:val="9"/>
+    <w:semiHidden/>
+    <w:unhideWhenUsed/>
+    <w:qFormat/>
+    <w:rsid w:val="00a10fd9"/>
+    <w:pPr>
+      <w:keepNext w:val="true"/>
+      <w:keepLines/>
+      <w:spacing w:after="0" w:before="40"/>
+      <w:outlineLvl w:val="5"/>
+    </w:pPr>
+    <w:rPr>
+      <w:rFonts w:cs="" w:cstheme="majorBidi" w:eastAsia="" w:eastAsiaTheme="majorEastAsia"/>
+      <w:i/>
+      <w:iCs/>
+      <w:color w:themeColor="text1" w:themeTint="a6" w:val="595959"/>
+    </w:rPr>
+  </w:style>
+  <w:style w:styleId="Heading7" w:type="paragraph">
+    <w:name w:val="Heading 7"/>
+    <w:basedOn w:val="Normal"/>
+    <w:next w:val="BodyText"/>
+    <w:link w:val="Heading7Char"/>
+    <w:uiPriority w:val="9"/>
+    <w:semiHidden/>
+    <w:unhideWhenUsed/>
+    <w:qFormat/>
+    <w:rsid w:val="00a10fd9"/>
+    <w:pPr>
+      <w:keepNext w:val="true"/>
+      <w:keepLines/>
+      <w:spacing w:after="0" w:before="40"/>
+      <w:outlineLvl w:val="6"/>
+    </w:pPr>
+    <w:rPr>
+      <w:rFonts w:cs="" w:cstheme="majorBidi" w:eastAsia="" w:eastAsiaTheme="majorEastAsia"/>
+      <w:color w:themeColor="text1" w:themeTint="a6" w:val="595959"/>
+    </w:rPr>
+  </w:style>
+  <w:style w:styleId="Heading8" w:type="paragraph">
+    <w:name w:val="Heading 8"/>
+    <w:basedOn w:val="Normal"/>
+    <w:next w:val="BodyText"/>
+    <w:link w:val="Heading8Char"/>
+    <w:uiPriority w:val="9"/>
+    <w:semiHidden/>
+    <w:unhideWhenUsed/>
+    <w:qFormat/>
+    <w:rsid w:val="00a10fd9"/>
+    <w:pPr>
+      <w:keepNext w:val="true"/>
+      <w:keepLines/>
+      <w:spacing w:after="0" w:before="0"/>
+      <w:outlineLvl w:val="7"/>
+    </w:pPr>
+    <w:rPr>
+      <w:rFonts w:cs="" w:cstheme="majorBidi" w:eastAsia="" w:eastAsiaTheme="majorEastAsia"/>
+      <w:i/>
+      <w:iCs/>
+      <w:color w:themeColor="text1" w:themeTint="d8" w:val="272727"/>
+    </w:rPr>
+  </w:style>
+  <w:style w:styleId="Heading9" w:type="paragraph">
+    <w:name w:val="Heading 9"/>
+    <w:basedOn w:val="Normal"/>
+    <w:next w:val="BodyText"/>
+    <w:link w:val="Heading9Char"/>
+    <w:uiPriority w:val="9"/>
+    <w:semiHidden/>
+    <w:unhideWhenUsed/>
+    <w:qFormat/>
+    <w:rsid w:val="00a10fd9"/>
+    <w:pPr>
+      <w:keepNext w:val="true"/>
+      <w:keepLines/>
+      <w:spacing w:after="0" w:before="0"/>
+      <w:outlineLvl w:val="8"/>
+    </w:pPr>
+    <w:rPr>
+      <w:rFonts w:cs="" w:cstheme="majorBidi" w:eastAsia="" w:eastAsiaTheme="majorEastAsia"/>
+      <w:color w:themeColor="text1" w:themeTint="d8" w:val="272727"/>
+    </w:rPr>
+  </w:style>
+  <w:style w:customStyle="1" w:styleId="TitleChar" w:type="character">
+    <w:name w:val="Title Char"/>
+    <w:basedOn w:val="DefaultParagraphFont"/>
+    <w:link w:val="Title"/>
+    <w:uiPriority w:val="10"/>
+    <w:qFormat/>
+    <w:rsid w:val="00a10fd9"/>
+    <w:rPr>
+      <w:rFonts w:ascii="Aptos Display" w:asciiTheme="majorHAnsi" w:cs="" w:cstheme="majorBidi" w:eastAsia="" w:eastAsiaTheme="majorEastAsia" w:hAnsi="Aptos Display" w:hAnsiTheme="majorHAnsi"/>
+      <w:spacing w:val="-10"/>
+      <w:kern w:val="2"/>
+      <w:sz w:val="56"/>
+      <w:szCs w:val="56"/>
+    </w:rPr>
+  </w:style>
+  <w:style w:customStyle="1" w:styleId="SubtitleChar" w:type="character">
+    <w:name w:val="Subtitle Char"/>
+    <w:basedOn w:val="DefaultParagraphFont"/>
+    <w:link w:val="Subtitle"/>
+    <w:uiPriority w:val="11"/>
+    <w:qFormat/>
+    <w:rsid w:val="00a10fd9"/>
+    <w:rPr>
+      <w:rFonts w:cs="" w:cstheme="majorBidi" w:eastAsia="" w:eastAsiaTheme="majorEastAsia"/>
+      <w:color w:themeColor="text1" w:themeTint="a6" w:val="595959"/>
+      <w:spacing w:val="15"/>
+      <w:sz w:val="28"/>
+      <w:szCs w:val="28"/>
+    </w:rPr>
+  </w:style>
+  <w:style w:customStyle="1" w:styleId="Heading1Char" w:type="character">
+    <w:name w:val="Heading 1 Char"/>
+    <w:basedOn w:val="DefaultParagraphFont"/>
+    <w:link w:val="Heading1"/>
+    <w:uiPriority w:val="9"/>
+    <w:qFormat/>
+    <w:rsid w:val="00a10fd9"/>
+    <w:rPr>
+      <w:rFonts w:ascii="Aptos Display" w:asciiTheme="majorHAnsi" w:cs="" w:cstheme="majorBidi" w:eastAsia="" w:eastAsiaTheme="majorEastAsia" w:hAnsi="Aptos Display" w:hAnsiTheme="majorHAnsi"/>
+      <w:color w:themeColor="accent1" w:themeShade="bf" w:val="0F4761"/>
+      <w:sz w:val="40"/>
+      <w:szCs w:val="40"/>
+    </w:rPr>
+  </w:style>
+  <w:style w:customStyle="1" w:styleId="Heading2Char" w:type="character">
+    <w:name w:val="Heading 2 Char"/>
+    <w:basedOn w:val="DefaultParagraphFont"/>
+    <w:link w:val="Heading2"/>
+    <w:uiPriority w:val="9"/>
+    <w:semiHidden/>
+    <w:qFormat/>
+    <w:rsid w:val="00a10fd9"/>
+    <w:rPr>
+      <w:rFonts w:ascii="Aptos Display" w:asciiTheme="majorHAnsi" w:cs="" w:cstheme="majorBidi" w:eastAsia="" w:eastAsiaTheme="majorEastAsia" w:hAnsi="Aptos Display" w:hAnsiTheme="majorHAnsi"/>
+      <w:color w:themeColor="accent1" w:themeShade="bf" w:val="0F4761"/>
+      <w:sz w:val="32"/>
+      <w:szCs w:val="32"/>
+    </w:rPr>
+  </w:style>
+  <w:style w:customStyle="1" w:styleId="Heading3Char" w:type="character">
+    <w:name w:val="Heading 3 Char"/>
+    <w:basedOn w:val="DefaultParagraphFont"/>
+    <w:link w:val="Heading3"/>
+    <w:uiPriority w:val="9"/>
+    <w:semiHidden/>
+    <w:qFormat/>
+    <w:rsid w:val="00a10fd9"/>
+    <w:rPr>
+      <w:rFonts w:cs="" w:cstheme="majorBidi" w:eastAsia="" w:eastAsiaTheme="majorEastAsia"/>
+      <w:color w:themeColor="accent1" w:themeShade="bf" w:val="0F4761"/>
+      <w:sz w:val="28"/>
+      <w:szCs w:val="28"/>
+    </w:rPr>
+  </w:style>
+  <w:style w:customStyle="1" w:styleId="Heading4Char" w:type="character">
+    <w:name w:val="Heading 4 Char"/>
+    <w:basedOn w:val="DefaultParagraphFont"/>
+    <w:link w:val="Heading4"/>
+    <w:uiPriority w:val="9"/>
+    <w:semiHidden/>
+    <w:qFormat/>
+    <w:rsid w:val="00a10fd9"/>
+    <w:rPr>
+      <w:rFonts w:cs="" w:cstheme="majorBidi" w:eastAsia="" w:eastAsiaTheme="majorEastAsia"/>
+      <w:i/>
+      <w:iCs/>
+      <w:color w:themeColor="accent1" w:themeShade="bf" w:val="0F4761"/>
+    </w:rPr>
+  </w:style>
+  <w:style w:customStyle="1" w:styleId="Heading5Char" w:type="character">
+    <w:name w:val="Heading 5 Char"/>
+    <w:basedOn w:val="DefaultParagraphFont"/>
+    <w:link w:val="Heading5"/>
+    <w:uiPriority w:val="9"/>
+    <w:semiHidden/>
+    <w:qFormat/>
+    <w:rsid w:val="00a10fd9"/>
+    <w:rPr>
+      <w:rFonts w:cs="" w:cstheme="majorBidi" w:eastAsia="" w:eastAsiaTheme="majorEastAsia"/>
+      <w:color w:themeColor="accent1" w:themeShade="bf" w:val="0F4761"/>
+    </w:rPr>
+  </w:style>
+  <w:style w:customStyle="1" w:styleId="Heading6Char" w:type="character">
+    <w:name w:val="Heading 6 Char"/>
+    <w:basedOn w:val="DefaultParagraphFont"/>
+    <w:link w:val="Heading6"/>
+    <w:uiPriority w:val="9"/>
+    <w:semiHidden/>
+    <w:qFormat/>
+    <w:rsid w:val="00a10fd9"/>
+    <w:rPr>
+      <w:rFonts w:cs="" w:cstheme="majorBidi" w:eastAsia="" w:eastAsiaTheme="majorEastAsia"/>
+      <w:i/>
+      <w:iCs/>
+      <w:color w:themeColor="text1" w:themeTint="a6" w:val="595959"/>
+    </w:rPr>
+  </w:style>
+  <w:style w:customStyle="1" w:styleId="Heading7Char" w:type="character">
+    <w:name w:val="Heading 7 Char"/>
+    <w:basedOn w:val="DefaultParagraphFont"/>
+    <w:link w:val="Heading7"/>
+    <w:uiPriority w:val="9"/>
+    <w:semiHidden/>
+    <w:qFormat/>
+    <w:rsid w:val="00a10fd9"/>
+    <w:rPr>
+      <w:rFonts w:cs="" w:cstheme="majorBidi" w:eastAsia="" w:eastAsiaTheme="majorEastAsia"/>
+      <w:color w:themeColor="text1" w:themeTint="a6" w:val="595959"/>
+    </w:rPr>
+  </w:style>
+  <w:style w:customStyle="1" w:styleId="Heading8Char" w:type="character">
+    <w:name w:val="Heading 8 Char"/>
+    <w:basedOn w:val="DefaultParagraphFont"/>
+    <w:link w:val="Heading8"/>
+    <w:uiPriority w:val="9"/>
+    <w:semiHidden/>
+    <w:qFormat/>
+    <w:rsid w:val="00a10fd9"/>
+    <w:rPr>
+      <w:rFonts w:cs="" w:cstheme="majorBidi" w:eastAsia="" w:eastAsiaTheme="majorEastAsia"/>
+      <w:i/>
+      <w:iCs/>
+      <w:color w:themeColor="text1" w:themeTint="d8" w:val="272727"/>
+    </w:rPr>
+  </w:style>
+  <w:style w:customStyle="1" w:styleId="Heading9Char" w:type="character">
+    <w:name w:val="Heading 9 Char"/>
+    <w:basedOn w:val="DefaultParagraphFont"/>
+    <w:link w:val="Heading9"/>
+    <w:uiPriority w:val="9"/>
+    <w:semiHidden/>
+    <w:qFormat/>
+    <w:rsid w:val="00a10fd9"/>
+    <w:rPr>
+      <w:rFonts w:cs="" w:cstheme="majorBidi" w:eastAsia="" w:eastAsiaTheme="majorEastAsia"/>
+      <w:color w:themeColor="text1" w:themeTint="d8" w:val="272727"/>
+    </w:rPr>
+  </w:style>
+  <w:style w:default="1" w:styleId="DefaultParagraphFont" w:type="character">
+    <w:name w:val="Default Paragraph Font"/>
+    <w:semiHidden/>
+    <w:unhideWhenUsed/>
+    <w:qFormat/>
+    <w:rPr/>
+  </w:style>
+  <w:style w:customStyle="1" w:styleId="BodyTextChar" w:type="character">
+    <w:name w:val="Body Text Char"/>
+    <w:basedOn w:val="DefaultParagraphFont"/>
+    <w:qFormat/>
+    <w:rPr/>
+  </w:style>
+  <w:style w:customStyle="1" w:styleId="VerbatimChar" w:type="character">
+    <w:name w:val="Verbatim Char"/>
+    <w:basedOn w:val="BodyTextChar"/>
+    <w:qFormat/>
+    <w:rPr>
+      <w:rFonts w:ascii="Consolas" w:hAnsi="Consolas"/>
+      <w:sz w:val="22"/>
+    </w:rPr>
+  </w:style>
+  <w:style w:customStyle="1" w:styleId="SectionNumber" w:type="character">
+    <w:name w:val="Section Number"/>
+    <w:basedOn w:val="BodyTextChar"/>
+    <w:qFormat/>
+    <w:rPr/>
+  </w:style>
+  <w:style w:styleId="FootnoteCharacters" w:type="character">
+    <w:name w:val="Footnote Characters"/>
+    <w:qFormat/>
+    <w:rPr>
+      <w:vertAlign w:val="superscript"/>
+    </w:rPr>
+  </w:style>
+  <w:style w:styleId="FootnoteReference" w:type="character">
+    <w:name w:val="Footnote Reference"/>
+    <w:rPr>
+      <w:vertAlign w:val="superscript"/>
+    </w:rPr>
+  </w:style>
+  <w:style w:styleId="Hyperlink" w:type="character">
+    <w:name w:val="Hyperlink"/>
+    <w:basedOn w:val="BodyTextChar"/>
+    <w:rPr>
+      <w:color w:themeColor="accent1" w:val="4F81BD"/>
+    </w:rPr>
+  </w:style>
+  <w:style w:styleId="EndnoteCharacters" w:type="character">
+    <w:name w:val="Endnote Characters"/>
+    <w:qFormat/>
+    <w:rPr>
+      <w:vertAlign w:val="superscript"/>
+    </w:rPr>
+  </w:style>
+  <w:style w:styleId="EndnoteReference" w:type="character">
+    <w:name w:val="Endnote Reference"/>
+    <w:rPr>
+      <w:vertAlign w:val="superscript"/>
+    </w:rPr>
+  </w:style>
+  <w:style w:styleId="Heading" w:type="paragraph">
+    <w:name w:val="Heading"/>
+    <w:basedOn w:val="Normal"/>
+    <w:next w:val="BodyText"/>
+    <w:qFormat/>
+    <w:pPr>
+      <w:keepNext w:val="true"/>
+      <w:spacing w:after="120" w:before="240"/>
+    </w:pPr>
+    <w:rPr>
+      <w:rFonts w:ascii="Liberation Sans" w:cs="Arial Unicode MS" w:eastAsia="PingFang SC" w:hAnsi="Liberation Sans"/>
+      <w:sz w:val="28"/>
+      <w:szCs w:val="28"/>
+    </w:rPr>
   </w:style>
   <w:style w:styleId="BodyText" w:type="paragraph">
     <w:name w:val="Body Text"/>
@@ -8598,14 +9076,52 @@
     <w:link w:val="BodyTextChar"/>
     <w:qFormat/>
     <w:pPr>
-      <w:spacing w:after="180" w:before="180"/>
+      <w:spacing w:after="180" w:before="180" w:line="276" w:lineRule="auto"/>
+      <w:jc w:val="both"/>
     </w:pPr>
+    <w:rPr/>
+  </w:style>
+  <w:style w:styleId="List" w:type="paragraph">
+    <w:name w:val="List"/>
+    <w:basedOn w:val="BodyText"/>
+    <w:pPr/>
+    <w:rPr>
+      <w:rFonts w:ascii="Times New Roman" w:cs="Arial Unicode MS" w:hAnsi="Times New Roman"/>
+    </w:rPr>
+  </w:style>
+  <w:style w:styleId="Caption" w:type="paragraph">
+    <w:name w:val="Caption"/>
+    <w:basedOn w:val="Normal"/>
+    <w:link w:val="BodyTextChar"/>
+    <w:qFormat/>
+    <w:pPr>
+      <w:spacing w:after="120" w:before="0"/>
+    </w:pPr>
+    <w:rPr>
+      <w:i/>
+    </w:rPr>
+  </w:style>
+  <w:style w:styleId="Index" w:type="paragraph">
+    <w:name w:val="Index"/>
+    <w:basedOn w:val="Normal"/>
+    <w:qFormat/>
+    <w:pPr>
+      <w:suppressLineNumbers/>
+    </w:pPr>
+    <w:rPr>
+      <w:rFonts w:ascii="Times New Roman" w:cs="Arial Unicode MS" w:hAnsi="Times New Roman"/>
+    </w:rPr>
   </w:style>
   <w:style w:customStyle="1" w:styleId="FirstParagraph" w:type="paragraph">
     <w:name w:val="First Paragraph"/>
     <w:basedOn w:val="BodyText"/>
     <w:next w:val="BodyText"/>
     <w:qFormat/>
+    <w:pPr>
+      <w:spacing w:line="276" w:lineRule="auto"/>
+      <w:jc w:val="both"/>
+    </w:pPr>
+    <w:rPr/>
   </w:style>
   <w:style w:customStyle="1" w:styleId="Compact" w:type="paragraph">
     <w:name w:val="Compact"/>
@@ -8614,6 +9130,7 @@
     <w:pPr>
       <w:spacing w:after="36" w:before="36"/>
     </w:pPr>
+    <w:rPr/>
   </w:style>
   <w:style w:styleId="Title" w:type="paragraph">
     <w:name w:val="Title"/>
@@ -8622,59 +9139,32 @@
     <w:link w:val="TitleChar"/>
     <w:uiPriority w:val="10"/>
     <w:qFormat/>
-    <w:rsid w:val="00A10FD9"/>
+    <w:rsid w:val="00a10fd9"/>
     <w:pPr>
-      <w:spacing w:after="80" w:line="240" w:lineRule="auto"/>
+      <w:spacing w:after="230" w:before="0" w:line="240" w:lineRule="auto"/>
       <w:contextualSpacing/>
       <w:jc w:val="center"/>
     </w:pPr>
     <w:rPr>
-      <w:rFonts w:asciiTheme="majorHAnsi" w:cstheme="majorBidi" w:eastAsiaTheme="majorEastAsia" w:hAnsiTheme="majorHAnsi"/>
-      <w:sz w:val="56"/>
-      <w:szCs w:val="56"/>
-    </w:rPr>
-  </w:style>
-  <w:style w:customStyle="1" w:styleId="TitleChar" w:type="character">
-    <w:name w:val="Title Char"/>
-    <w:basedOn w:val="DefaultParagraphFont"/>
-    <w:link w:val="Title"/>
-    <w:uiPriority w:val="10"/>
-    <w:rsid w:val="00A10FD9"/>
-    <w:rPr>
-      <w:rFonts w:asciiTheme="majorHAnsi" w:cstheme="majorBidi" w:eastAsiaTheme="majorEastAsia" w:hAnsiTheme="majorHAnsi"/>
-      <w:sz w:val="56"/>
+      <w:rFonts w:ascii="Aptos Display" w:asciiTheme="majorHAnsi" w:cs="" w:cstheme="majorBidi" w:eastAsia="" w:eastAsiaTheme="majorEastAsia" w:hAnsi="Aptos Display" w:hAnsiTheme="majorHAnsi"/>
+      <w:spacing w:val="-10"/>
+      <w:kern w:val="2"/>
+      <w:sz w:val="52"/>
       <w:szCs w:val="56"/>
     </w:rPr>
   </w:style>
   <w:style w:styleId="Subtitle" w:type="paragraph">
     <w:name w:val="Subtitle"/>
-    <w:basedOn w:val="Title"/>
+    <w:basedOn w:val="Normal"/>
     <w:next w:val="BodyText"/>
     <w:link w:val="SubtitleChar"/>
     <w:uiPriority w:val="11"/>
     <w:qFormat/>
-    <w:rsid w:val="00A10FD9"/>
-    <w:pPr>
-      <w:numPr>
-        <w:ilvl w:val="1"/>
-      </w:numPr>
-    </w:pPr>
+    <w:rsid w:val="00a10fd9"/>
+    <w:pPr/>
     <w:rPr>
-      <w:rFonts w:cstheme="majorBidi" w:eastAsiaTheme="majorEastAsia"/>
-      <w:spacing w:val="15"/>
-      <w:sz w:val="28"/>
-      <w:szCs w:val="28"/>
-    </w:rPr>
-  </w:style>
-  <w:style w:customStyle="1" w:styleId="SubtitleChar" w:type="character">
-    <w:name w:val="Subtitle Char"/>
-    <w:basedOn w:val="DefaultParagraphFont"/>
-    <w:link w:val="Subtitle"/>
-    <w:uiPriority w:val="11"/>
-    <w:rsid w:val="00A10FD9"/>
-    <w:rPr>
-      <w:rFonts w:cstheme="majorBidi" w:eastAsiaTheme="majorEastAsia"/>
-      <w:color w:themeColor="text1" w:themeTint="A6" w:val="595959"/>
+      <w:rFonts w:cs="" w:cstheme="majorBidi" w:eastAsia="" w:eastAsiaTheme="majorEastAsia"/>
+      <w:color w:themeColor="text1" w:themeTint="a6" w:val="595959"/>
       <w:spacing w:val="15"/>
       <w:sz w:val="28"/>
       <w:szCs w:val="28"/>
@@ -8682,30 +9172,47 @@
   </w:style>
   <w:style w:customStyle="1" w:styleId="Author" w:type="paragraph">
     <w:name w:val="Author"/>
-    <w:basedOn w:val="Title"/>
     <w:next w:val="BodyText"/>
     <w:qFormat/>
     <w:pPr>
-      <w:keepNext/>
+      <w:keepNext w:val="true"/>
       <w:keepLines/>
+      <w:widowControl/>
+      <w:suppressAutoHyphens w:val="true"/>
+      <w:bidi w:val="0"/>
+      <w:spacing w:after="115" w:before="115"/>
+      <w:contextualSpacing/>
+      <w:jc w:val="center"/>
     </w:pPr>
     <w:rPr>
+      <w:rFonts w:ascii="Aptos" w:asciiTheme="minorHAnsi" w:cs="" w:cstheme="minorBidi" w:eastAsia="Aptos" w:eastAsiaTheme="minorHAnsi" w:hAnsi="Aptos" w:hAnsiTheme="minorHAnsi"/>
+      <w:color w:val="auto"/>
+      <w:kern w:val="0"/>
       <w:sz w:val="24"/>
       <w:szCs w:val="24"/>
+      <w:lang w:bidi="ar-SA" w:eastAsia="en-US" w:val="en-US"/>
     </w:rPr>
   </w:style>
   <w:style w:styleId="Date" w:type="paragraph">
     <w:name w:val="Date"/>
-    <w:basedOn w:val="Title"/>
     <w:next w:val="BodyText"/>
     <w:qFormat/>
     <w:pPr>
-      <w:keepNext/>
+      <w:keepNext w:val="true"/>
       <w:keepLines/>
+      <w:widowControl/>
+      <w:suppressAutoHyphens w:val="true"/>
+      <w:bidi w:val="0"/>
+      <w:spacing w:after="115" w:before="0"/>
+      <w:jc w:val="center"/>
     </w:pPr>
     <w:rPr>
+      <w:rFonts w:ascii="Aptos" w:asciiTheme="minorHAnsi" w:cs="" w:cstheme="minorBidi" w:eastAsia="Aptos" w:eastAsiaTheme="minorHAnsi" w:hAnsi="Aptos" w:hAnsiTheme="minorHAnsi"/>
+      <w:color w:val="auto"/>
+      <w:kern w:val="0"/>
       <w:sz w:val="24"/>
       <w:szCs w:val="24"/>
+      <w:lang w:bidi="ar-SA" w:eastAsia="en-US" w:val="en-US"/>
     </w:rPr>
   </w:style>
   <w:style w:customStyle="1" w:styleId="AbstractTitle" w:type="paragraph">
@@ -8714,13 +9221,14 @@
     <w:next w:val="Abstract"/>
     <w:qFormat/>
     <w:pPr>
-      <w:keepNext/>
+      <w:keepNext w:val="true"/>
       <w:keepLines/>
       <w:spacing w:after="0" w:before="300"/>
       <w:jc w:val="center"/>
     </w:pPr>
     <w:rPr>
       <w:b/>
+      <w:color w:val="345A8A"/>
       <w:sz w:val="20"/>
       <w:szCs w:val="20"/>
     </w:rPr>
@@ -8731,7 +9239,7 @@
     <w:next w:val="BodyText"/>
     <w:qFormat/>
     <w:pPr>
-      <w:keepNext/>
+      <w:keepNext w:val="true"/>
       <w:keepLines/>
       <w:spacing w:after="300" w:before="100"/>
     </w:pPr>
@@ -8743,328 +9251,9 @@
   <w:style w:styleId="Bibliography" w:type="paragraph">
     <w:name w:val="Bibliography"/>
     <w:basedOn w:val="Normal"/>
-    <w:next w:val="Bibliography"/>
     <w:qFormat/>
     <w:pPr/>
     <w:rPr/>
-  </w:style>
-  <w:style w:styleId="Heading1" w:type="paragraph">
-    <w:name w:val="heading 1"/>
-    <w:basedOn w:val="Normal"/>
-    <w:next w:val="BodyText"/>
-    <w:link w:val="Heading1Char"/>
-    <w:uiPriority w:val="9"/>
-    <w:qFormat/>
-    <w:rsid w:val="00A10FD9"/>
-    <w:pPr>
-      <w:keepNext/>
-      <w:keepLines/>
-      <w:spacing w:after="80" w:before="360"/>
-      <w:outlineLvl w:val="0"/>
-    </w:pPr>
-    <w:rPr>
-      <w:rFonts w:asciiTheme="majorHAnsi" w:cstheme="majorBidi" w:eastAsiaTheme="majorEastAsia" w:hAnsiTheme="majorHAnsi"/>
-      <w:color w:themeColor="accent1" w:themeShade="BF" w:val="0F4761"/>
-      <w:sz w:val="40"/>
-      <w:szCs w:val="40"/>
-    </w:rPr>
-  </w:style>
-  <w:style w:styleId="Heading2" w:type="paragraph">
-    <w:name w:val="heading 2"/>
-    <w:basedOn w:val="Normal"/>
-    <w:next w:val="BodyText"/>
-    <w:link w:val="Heading2Char"/>
-    <w:uiPriority w:val="9"/>
-    <w:semiHidden/>
-    <w:unhideWhenUsed/>
-    <w:qFormat/>
-    <w:rsid w:val="00A10FD9"/>
-    <w:pPr>
-      <w:keepNext/>
-      <w:keepLines/>
-      <w:spacing w:after="80" w:before="160"/>
-      <w:outlineLvl w:val="1"/>
-    </w:pPr>
-    <w:rPr>
-      <w:rFonts w:asciiTheme="majorHAnsi" w:cstheme="majorBidi" w:eastAsiaTheme="majorEastAsia" w:hAnsiTheme="majorHAnsi"/>
-      <w:color w:themeColor="accent1" w:themeShade="BF" w:val="0F4761"/>
-      <w:sz w:val="32"/>
-      <w:szCs w:val="32"/>
-    </w:rPr>
-  </w:style>
-  <w:style w:styleId="Heading3" w:type="paragraph">
-    <w:name w:val="heading 3"/>
-    <w:basedOn w:val="Normal"/>
-    <w:next w:val="BodyText"/>
-    <w:link w:val="Heading3Char"/>
-    <w:uiPriority w:val="9"/>
-    <w:semiHidden/>
-    <w:unhideWhenUsed/>
-    <w:qFormat/>
-    <w:rsid w:val="00A10FD9"/>
-    <w:pPr>
-      <w:keepNext/>
-      <w:keepLines/>
-      <w:spacing w:after="80" w:before="160"/>
-      <w:outlineLvl w:val="2"/>
-    </w:pPr>
-    <w:rPr>
-      <w:rFonts w:cstheme="majorBidi" w:eastAsiaTheme="majorEastAsia"/>
-      <w:color w:themeColor="accent1" w:themeShade="BF" w:val="0F4761"/>
-      <w:sz w:val="28"/>
-      <w:szCs w:val="28"/>
-    </w:rPr>
-  </w:style>
-  <w:style w:styleId="Heading4" w:type="paragraph">
-    <w:name w:val="heading 4"/>
-    <w:basedOn w:val="Normal"/>
-    <w:next w:val="BodyText"/>
-    <w:link w:val="Heading4Char"/>
-    <w:uiPriority w:val="9"/>
-    <w:semiHidden/>
-    <w:unhideWhenUsed/>
-    <w:qFormat/>
-    <w:rsid w:val="00A10FD9"/>
-    <w:pPr>
-      <w:keepNext/>
-      <w:keepLines/>
-      <w:spacing w:after="40" w:before="80"/>
-      <w:outlineLvl w:val="3"/>
-    </w:pPr>
-    <w:rPr>
-      <w:rFonts w:cstheme="majorBidi" w:eastAsiaTheme="majorEastAsia"/>
-      <w:i/>
-      <w:iCs/>
-      <w:color w:themeColor="accent1" w:themeShade="BF" w:val="0F4761"/>
-    </w:rPr>
-  </w:style>
-  <w:style w:styleId="Heading5" w:type="paragraph">
-    <w:name w:val="heading 5"/>
-    <w:basedOn w:val="Normal"/>
-    <w:next w:val="BodyText"/>
-    <w:link w:val="Heading5Char"/>
-    <w:uiPriority w:val="9"/>
-    <w:semiHidden/>
-    <w:unhideWhenUsed/>
-    <w:qFormat/>
-    <w:rsid w:val="00A10FD9"/>
-    <w:pPr>
-      <w:keepNext/>
-      <w:keepLines/>
-      <w:spacing w:after="40" w:before="80"/>
-      <w:outlineLvl w:val="4"/>
-    </w:pPr>
-    <w:rPr>
-      <w:rFonts w:cstheme="majorBidi" w:eastAsiaTheme="majorEastAsia"/>
-      <w:color w:themeColor="accent1" w:themeShade="BF" w:val="0F4761"/>
-    </w:rPr>
-  </w:style>
-  <w:style w:styleId="Heading6" w:type="paragraph">
-    <w:name w:val="heading 6"/>
-    <w:basedOn w:val="Normal"/>
-    <w:next w:val="BodyText"/>
-    <w:link w:val="Heading6Char"/>
-    <w:uiPriority w:val="9"/>
-    <w:semiHidden/>
-    <w:unhideWhenUsed/>
-    <w:qFormat/>
-    <w:rsid w:val="00A10FD9"/>
-    <w:pPr>
-      <w:keepNext/>
-      <w:keepLines/>
-      <w:spacing w:after="0" w:before="40"/>
-      <w:outlineLvl w:val="5"/>
-    </w:pPr>
-    <w:rPr>
-      <w:rFonts w:cstheme="majorBidi" w:eastAsiaTheme="majorEastAsia"/>
-      <w:i/>
-      <w:iCs/>
-      <w:color w:themeColor="text1" w:themeTint="A6" w:val="595959"/>
-    </w:rPr>
-  </w:style>
-  <w:style w:styleId="Heading7" w:type="paragraph">
-    <w:name w:val="heading 7"/>
-    <w:basedOn w:val="Normal"/>
-    <w:next w:val="BodyText"/>
-    <w:link w:val="Heading7Char"/>
-    <w:uiPriority w:val="9"/>
-    <w:semiHidden/>
-    <w:unhideWhenUsed/>
-    <w:qFormat/>
-    <w:rsid w:val="00A10FD9"/>
-    <w:pPr>
-      <w:keepNext/>
-      <w:keepLines/>
-      <w:spacing w:after="0" w:before="40"/>
-      <w:outlineLvl w:val="6"/>
-    </w:pPr>
-    <w:rPr>
-      <w:rFonts w:cstheme="majorBidi" w:eastAsiaTheme="majorEastAsia"/>
-      <w:color w:themeColor="text1" w:themeTint="A6" w:val="595959"/>
-    </w:rPr>
-  </w:style>
-  <w:style w:styleId="Heading8" w:type="paragraph">
-    <w:name w:val="heading 8"/>
-    <w:basedOn w:val="Normal"/>
-    <w:next w:val="BodyText"/>
-    <w:link w:val="Heading8Char"/>
-    <w:uiPriority w:val="9"/>
-    <w:semiHidden/>
-    <w:unhideWhenUsed/>
-    <w:qFormat/>
-    <w:rsid w:val="00A10FD9"/>
-    <w:pPr>
-      <w:keepNext/>
-      <w:keepLines/>
-      <w:spacing w:after="0"/>
-      <w:outlineLvl w:val="7"/>
-    </w:pPr>
-    <w:rPr>
-      <w:rFonts w:cstheme="majorBidi" w:eastAsiaTheme="majorEastAsia"/>
-      <w:i/>
-      <w:iCs/>
-      <w:color w:themeColor="text1" w:themeTint="D8" w:val="272727"/>
-    </w:rPr>
-  </w:style>
-  <w:style w:styleId="Heading9" w:type="paragraph">
-    <w:name w:val="heading 9"/>
-    <w:basedOn w:val="Normal"/>
-    <w:next w:val="BodyText"/>
-    <w:link w:val="Heading9Char"/>
-    <w:uiPriority w:val="9"/>
-    <w:semiHidden/>
-    <w:unhideWhenUsed/>
-    <w:qFormat/>
-    <w:rsid w:val="00A10FD9"/>
-    <w:pPr>
-      <w:keepNext/>
-      <w:keepLines/>
-      <w:spacing w:after="0"/>
-      <w:outlineLvl w:val="8"/>
-    </w:pPr>
-    <w:rPr>
-      <w:rFonts w:cstheme="majorBidi" w:eastAsiaTheme="majorEastAsia"/>
-      <w:color w:themeColor="text1" w:themeTint="D8" w:val="272727"/>
-    </w:rPr>
-  </w:style>
-  <w:style w:customStyle="1" w:styleId="Heading1Char" w:type="character">
-    <w:name w:val="Heading 1 Char"/>
-    <w:basedOn w:val="DefaultParagraphFont"/>
-    <w:link w:val="Heading1"/>
-    <w:uiPriority w:val="9"/>
-    <w:rsid w:val="00A10FD9"/>
-    <w:rPr>
-      <w:rFonts w:asciiTheme="majorHAnsi" w:cstheme="majorBidi" w:eastAsiaTheme="majorEastAsia" w:hAnsiTheme="majorHAnsi"/>
-      <w:color w:themeColor="accent1" w:themeShade="BF" w:val="0F4761"/>
-      <w:sz w:val="40"/>
-      <w:szCs w:val="40"/>
-    </w:rPr>
-  </w:style>
-  <w:style w:customStyle="1" w:styleId="Heading2Char" w:type="character">
-    <w:name w:val="Heading 2 Char"/>
-    <w:basedOn w:val="DefaultParagraphFont"/>
-    <w:link w:val="Heading2"/>
-    <w:uiPriority w:val="9"/>
-    <w:semiHidden/>
-    <w:rsid w:val="00A10FD9"/>
-    <w:rPr>
-      <w:rFonts w:asciiTheme="majorHAnsi" w:cstheme="majorBidi" w:eastAsiaTheme="majorEastAsia" w:hAnsiTheme="majorHAnsi"/>
-      <w:color w:themeColor="accent1" w:themeShade="BF" w:val="0F4761"/>
-      <w:sz w:val="32"/>
-      <w:szCs w:val="32"/>
-    </w:rPr>
-  </w:style>
-  <w:style w:customStyle="1" w:styleId="Heading3Char" w:type="character">
-    <w:name w:val="Heading 3 Char"/>
-    <w:basedOn w:val="DefaultParagraphFont"/>
-    <w:link w:val="Heading3"/>
-    <w:uiPriority w:val="9"/>
-    <w:semiHidden/>
-    <w:rsid w:val="00A10FD9"/>
-    <w:rPr>
-      <w:rFonts w:cstheme="majorBidi" w:eastAsiaTheme="majorEastAsia"/>
-      <w:color w:themeColor="accent1" w:themeShade="BF" w:val="0F4761"/>
-      <w:sz w:val="28"/>
-      <w:szCs w:val="28"/>
-    </w:rPr>
-  </w:style>
-  <w:style w:customStyle="1" w:styleId="Heading4Char" w:type="character">
-    <w:name w:val="Heading 4 Char"/>
-    <w:basedOn w:val="DefaultParagraphFont"/>
-    <w:link w:val="Heading4"/>
-    <w:uiPriority w:val="9"/>
-    <w:semiHidden/>
-    <w:rsid w:val="00A10FD9"/>
-    <w:rPr>
-      <w:rFonts w:cstheme="majorBidi" w:eastAsiaTheme="majorEastAsia"/>
-      <w:i/>
-      <w:iCs/>
-      <w:color w:themeColor="accent1" w:themeShade="BF" w:val="0F4761"/>
-    </w:rPr>
-  </w:style>
-  <w:style w:customStyle="1" w:styleId="Heading5Char" w:type="character">
-    <w:name w:val="Heading 5 Char"/>
-    <w:basedOn w:val="DefaultParagraphFont"/>
-    <w:link w:val="Heading5"/>
-    <w:uiPriority w:val="9"/>
-    <w:semiHidden/>
-    <w:rsid w:val="00A10FD9"/>
-    <w:rPr>
-      <w:rFonts w:cstheme="majorBidi" w:eastAsiaTheme="majorEastAsia"/>
-      <w:color w:themeColor="accent1" w:themeShade="BF" w:val="0F4761"/>
-    </w:rPr>
-  </w:style>
-  <w:style w:customStyle="1" w:styleId="Heading6Char" w:type="character">
-    <w:name w:val="Heading 6 Char"/>
-    <w:basedOn w:val="DefaultParagraphFont"/>
-    <w:link w:val="Heading6"/>
-    <w:uiPriority w:val="9"/>
-    <w:semiHidden/>
-    <w:rsid w:val="00A10FD9"/>
-    <w:rPr>
-      <w:rFonts w:cstheme="majorBidi" w:eastAsiaTheme="majorEastAsia"/>
-      <w:i/>
-      <w:iCs/>
-      <w:color w:themeColor="text1" w:themeTint="A6" w:val="595959"/>
-    </w:rPr>
-  </w:style>
-  <w:style w:customStyle="1" w:styleId="Heading7Char" w:type="character">
-    <w:name w:val="Heading 7 Char"/>
-    <w:basedOn w:val="DefaultParagraphFont"/>
-    <w:link w:val="Heading7"/>
-    <w:uiPriority w:val="9"/>
-    <w:semiHidden/>
-    <w:rsid w:val="00A10FD9"/>
-    <w:rPr>
-      <w:rFonts w:cstheme="majorBidi" w:eastAsiaTheme="majorEastAsia"/>
-      <w:color w:themeColor="text1" w:themeTint="A6" w:val="595959"/>
-    </w:rPr>
-  </w:style>
-  <w:style w:customStyle="1" w:styleId="Heading8Char" w:type="character">
-    <w:name w:val="Heading 8 Char"/>
-    <w:basedOn w:val="DefaultParagraphFont"/>
-    <w:link w:val="Heading8"/>
-    <w:uiPriority w:val="9"/>
-    <w:semiHidden/>
-    <w:rsid w:val="00A10FD9"/>
-    <w:rPr>
-      <w:rFonts w:cstheme="majorBidi" w:eastAsiaTheme="majorEastAsia"/>
-      <w:i/>
-      <w:iCs/>
-      <w:color w:themeColor="text1" w:themeTint="D8" w:val="272727"/>
-    </w:rPr>
-  </w:style>
-  <w:style w:customStyle="1" w:styleId="Heading9Char" w:type="character">
-    <w:name w:val="Heading 9 Char"/>
-    <w:basedOn w:val="DefaultParagraphFont"/>
-    <w:link w:val="Heading9"/>
-    <w:uiPriority w:val="9"/>
-    <w:semiHidden/>
-    <w:rsid w:val="00A10FD9"/>
-    <w:rPr>
-      <w:rFonts w:cstheme="majorBidi" w:eastAsiaTheme="majorEastAsia"/>
-      <w:color w:themeColor="text1" w:themeTint="D8" w:val="272727"/>
-    </w:rPr>
   </w:style>
   <w:style w:styleId="BlockText" w:type="paragraph">
     <w:name w:val="Block Text"/>
@@ -9075,16 +9264,18 @@
     <w:qFormat/>
     <w:pPr>
       <w:spacing w:after="100" w:before="100"/>
-      <w:ind w:firstLine="0" w:left="480" w:right="480"/>
+      <w:ind w:hanging="0" w:left="480" w:right="480"/>
     </w:pPr>
+    <w:rPr/>
   </w:style>
   <w:style w:styleId="FootnoteText" w:type="paragraph">
     <w:name w:val="Footnote Text"/>
     <w:basedOn w:val="Normal"/>
-    <w:next w:val="FootnoteText"/>
     <w:uiPriority w:val="9"/>
     <w:unhideWhenUsed/>
     <w:qFormat/>
+    <w:pPr/>
+    <w:rPr/>
   </w:style>
   <w:style w:styleId="FootnoteBlockText" w:type="paragraph">
     <w:name w:val="Footnote Block Text"/>
@@ -9095,46 +9286,19 @@
     <w:qFormat/>
     <w:pPr>
       <w:spacing w:after="100" w:before="100"/>
-      <w:ind w:firstLine="0" w:left="480" w:right="480"/>
+      <w:ind w:hanging="0" w:left="480" w:right="480"/>
     </w:pPr>
-  </w:style>
-  <w:style w:default="1" w:styleId="DefaultParagraphFont" w:type="character">
-    <w:name w:val="Default Paragraph Font"/>
-    <w:semiHidden/>
-    <w:unhideWhenUsed/>
-  </w:style>
-  <w:style w:default="1" w:styleId="Table" w:type="table">
-    <w:name w:val="Table"/>
-    <w:basedOn w:val="TableNormal"/>
-    <w:semiHidden/>
-    <w:unhideWhenUsed/>
-    <w:qFormat/>
-    <w:tblPr>
-      <w:tblInd w:type="dxa" w:w="0"/>
-      <w:tblCellMar>
-        <w:top w:type="dxa" w:w="0"/>
-        <w:left w:type="dxa" w:w="108"/>
-        <w:bottom w:type="dxa" w:w="0"/>
-        <w:right w:type="dxa" w:w="108"/>
-      </w:tblCellMar>
-    </w:tblPr>
-    <w:tblStylePr w:type="firstRow">
-      <w:tcPr>
-        <w:tcBorders>
-          <w:bottom w:val="single"/>
-        </w:tcBorders>
-        <w:vAlign w:val="bottom"/>
-      </w:tcPr>
-    </w:tblStylePr>
+    <w:rPr/>
   </w:style>
   <w:style w:customStyle="1" w:styleId="DefinitionTerm" w:type="paragraph">
     <w:name w:val="Definition Term"/>
     <w:basedOn w:val="Normal"/>
     <w:next w:val="Definition"/>
+    <w:qFormat/>
     <w:pPr>
-      <w:keepNext/>
+      <w:keepNext w:val="true"/>
       <w:keepLines/>
-      <w:spacing w:after="0"/>
+      <w:spacing w:after="0" w:before="0"/>
     </w:pPr>
     <w:rPr>
       <w:b/>
@@ -9143,70 +9307,47 @@
   <w:style w:customStyle="1" w:styleId="Definition" w:type="paragraph">
     <w:name w:val="Definition"/>
     <w:basedOn w:val="Normal"/>
-  </w:style>
-  <w:style w:styleId="Caption" w:type="paragraph">
-    <w:name w:val="Caption"/>
-    <w:basedOn w:val="Normal"/>
-    <w:link w:val="BodyTextChar"/>
-    <w:pPr>
-      <w:spacing w:after="120" w:before="0"/>
-    </w:pPr>
-    <w:rPr>
-      <w:i/>
-    </w:rPr>
+    <w:qFormat/>
+    <w:pPr/>
+    <w:rPr/>
   </w:style>
   <w:style w:customStyle="1" w:styleId="TableCaption" w:type="paragraph">
     <w:name w:val="Table Caption"/>
     <w:basedOn w:val="Caption"/>
+    <w:qFormat/>
     <w:pPr>
-      <w:keepNext/>
+      <w:keepNext w:val="true"/>
     </w:pPr>
+    <w:rPr/>
   </w:style>
   <w:style w:customStyle="1" w:styleId="ImageCaption" w:type="paragraph">
     <w:name w:val="Image Caption"/>
     <w:basedOn w:val="Caption"/>
+    <w:qFormat/>
+    <w:pPr/>
+    <w:rPr/>
   </w:style>
   <w:style w:customStyle="1" w:styleId="Figure" w:type="paragraph">
     <w:name w:val="Figure"/>
     <w:basedOn w:val="Normal"/>
+    <w:qFormat/>
+    <w:pPr/>
+    <w:rPr/>
   </w:style>
   <w:style w:customStyle="1" w:styleId="CaptionedFigure" w:type="paragraph">
     <w:name w:val="Captioned Figure"/>
     <w:basedOn w:val="Figure"/>
+    <w:qFormat/>
     <w:pPr>
-      <w:keepNext/>
+      <w:keepNext w:val="true"/>
     </w:pPr>
+    <w:rPr/>
   </w:style>
-  <w:style w:customStyle="1" w:styleId="BodyTextChar" w:type="character">
-    <w:name w:val="Body Text Char"/>
-    <w:basedOn w:val="DefaultParagraphFont"/>
-    <w:link w:val="BodyText"/>
-  </w:style>
-  <w:style w:customStyle="1" w:styleId="VerbatimChar" w:type="character">
-    <w:name w:val="Verbatim Char"/>
-    <w:basedOn w:val="BodyTextChar"/>
-    <w:rPr>
-      <w:rFonts w:ascii="Consolas" w:hAnsi="Consolas"/>
-      <w:sz w:val="22"/>
-    </w:rPr>
-  </w:style>
-  <w:style w:customStyle="1" w:styleId="SectionNumber" w:type="character">
-    <w:name w:val="Section Number"/>
-    <w:basedOn w:val="BodyTextChar"/>
-  </w:style>
-  <w:style w:styleId="FootnoteReference" w:type="character">
-    <w:name w:val="Footnote Reference"/>
-    <w:basedOn w:val="BodyTextChar"/>
-    <w:rPr>
-      <w:vertAlign w:val="superscript"/>
-    </w:rPr>
-  </w:style>
-  <w:style w:styleId="Hyperlink" w:type="character">
-    <w:name w:val="Hyperlink"/>
-    <w:basedOn w:val="BodyTextChar"/>
-    <w:rPr>
-      <w:color w:themeColor="accent1" w:val="4F81BD"/>
-    </w:rPr>
+  <w:style w:styleId="IndexHeading" w:type="paragraph">
+    <w:name w:val="Index Heading"/>
+    <w:basedOn w:val="Heading"/>
+    <w:pPr/>
+    <w:rPr/>
   </w:style>
   <w:style w:styleId="TOCHeading" w:type="paragraph">
     <w:name w:val="TOC Heading"/>
@@ -9216,15 +9357,70 @@
     <w:unhideWhenUsed/>
     <w:qFormat/>
     <w:pPr>
-      <w:spacing w:before="240" w:line="259" w:lineRule="auto"/>
+      <w:spacing w:after="80" w:before="240" w:line="259" w:lineRule="auto"/>
       <w:outlineLvl w:val="9"/>
     </w:pPr>
     <w:rPr>
-      <w:rFonts w:asciiTheme="majorHAnsi" w:cstheme="majorBidi" w:eastAsiaTheme="majorEastAsia" w:hAnsiTheme="majorHAnsi"/>
-      <w:b w:val="0"/>
-      <w:bCs w:val="0"/>
-      <w:color w:themeColor="accent1" w:themeShade="BF" w:val="365F91"/>
+      <w:rFonts w:ascii="Aptos Display" w:asciiTheme="majorHAnsi" w:cs="" w:cstheme="majorBidi" w:eastAsia="" w:eastAsiaTheme="majorEastAsia" w:hAnsi="Aptos Display" w:hAnsiTheme="majorHAnsi"/>
+      <w:b w:val="false"/>
+      <w:bCs w:val="false"/>
+      <w:color w:themeColor="accent1" w:themeShade="bf" w:val="365F91"/>
     </w:rPr>
+  </w:style>
+  <w:style w:styleId="BodyTextIndent" w:type="paragraph">
+    <w:name w:val="Body Text Indent"/>
+    <w:basedOn w:val="BodyText"/>
+    <w:pPr>
+      <w:ind w:hanging="0" w:left="283"/>
+    </w:pPr>
+    <w:rPr/>
+  </w:style>
+  <w:style w:styleId="HeaderandFooter" w:type="paragraph">
+    <w:name w:val="Header and Footer"/>
+    <w:basedOn w:val="Normal"/>
+    <w:qFormat/>
+    <w:pPr>
+      <w:suppressLineNumbers/>
+      <w:tabs>
+        <w:tab w:pos="720" w:val="clear"/>
+        <w:tab w:leader="none" w:pos="4680" w:val="center"/>
+        <w:tab w:leader="none" w:pos="9360" w:val="right"/>
+      </w:tabs>
+    </w:pPr>
+    <w:rPr/>
+  </w:style>
+  <w:style w:styleId="Footer" w:type="paragraph">
+    <w:name w:val="Footer"/>
+    <w:basedOn w:val="HeaderandFooter"/>
+    <w:pPr>
+      <w:suppressLineNumbers/>
+      <w:jc w:val="right"/>
+    </w:pPr>
+    <w:rPr/>
+  </w:style>
+  <w:style w:default="1" w:styleId="Table" w:type="table">
+    <w:name w:val="Table"/>
+    <w:basedOn w:val="TableNormal"/>
+    <w:semiHidden/>
+    <w:unhideWhenUsed/>
+    <w:qFormat/>
+    <w:tblPr>
+      <w:tblCellMar>
+        <w:top w:type="dxa" w:w="0"/>
+        <w:left w:type="dxa" w:w="108"/>
+        <w:bottom w:type="dxa" w:w="0"/>
+        <w:right w:type="dxa" w:w="108"/>
+      </w:tblCellMar>
+    </w:tblPr>
+    <w:tblStylePr w:type="firstRow">
+      <w:tblPr/>
+      <w:tcPr>
+        <w:tcBorders>
+          <w:bottom w:val="single"/>
+        </w:tcBorders>
+        <w:vAlign w:val="bottom"/>
+      </w:tcPr>
+    </w:tblStylePr>
   </w:style>
   <w:style w:type="paragraph" w:customStyle="1" w:styleId="SourceCode">
     <w:name w:val="Source Code"/>
@@ -9492,195 +9688,97 @@
 </file>
 
 <file path=word/theme/theme1.xml><?xml version="1.0" encoding="utf-8"?>
-<a:theme xmlns:a="http://schemas.openxmlformats.org/drawingml/2006/main" name="Office Theme">
+<a:theme xmlns:a="http://schemas.openxmlformats.org/drawingml/2006/main" xmlns:r="http://schemas.openxmlformats.org/officeDocument/2006/relationships" name="Office Theme">
   <a:themeElements>
     <a:clrScheme name="Office">
       <a:dk1>
-        <a:sysClr val="windowText" lastClr="000000"/>
+        <a:srgbClr val="000000"/>
       </a:dk1>
       <a:lt1>
-        <a:sysClr val="window" lastClr="FFFFFF"/>
+        <a:srgbClr val="ffffff"/>
       </a:lt1>
       <a:dk2>
-        <a:srgbClr val="0E2841"/>
+        <a:srgbClr val="0e2841"/>
       </a:dk2>
       <a:lt2>
-        <a:srgbClr val="E8E8E8"/>
+        <a:srgbClr val="e8e8e8"/>
       </a:lt2>
       <a:accent1>
         <a:srgbClr val="156082"/>
       </a:accent1>
       <a:accent2>
-        <a:srgbClr val="E97132"/>
+        <a:srgbClr val="e97132"/>
       </a:accent2>
       <a:accent3>
-        <a:srgbClr val="196B24"/>
+        <a:srgbClr val="196b24"/>
       </a:accent3>
       <a:accent4>
-        <a:srgbClr val="0F9ED5"/>
+        <a:srgbClr val="0f9ed5"/>
       </a:accent4>
       <a:accent5>
-        <a:srgbClr val="A02B93"/>
+        <a:srgbClr val="a02b93"/>
       </a:accent5>
       <a:accent6>
-        <a:srgbClr val="4EA72E"/>
+        <a:srgbClr val="4ea72e"/>
       </a:accent6>
       <a:hlink>
         <a:srgbClr val="467886"/>
       </a:hlink>
       <a:folHlink>
-        <a:srgbClr val="96607D"/>
+        <a:srgbClr val="96607d"/>
       </a:folHlink>
     </a:clrScheme>
     <a:fontScheme name="Office">
       <a:majorFont>
-        <a:latin typeface="Aptos Display" panose="02110004020202020204"/>
+        <a:latin typeface="Aptos Display" panose="02110004020202020204" pitchFamily="0" charset="1"/>
         <a:ea typeface=""/>
         <a:cs typeface=""/>
-        <a:font script="Jpan" typeface="游ゴシック Light"/>
-        <a:font script="Hang" typeface="맑은 고딕"/>
-        <a:font script="Hans" typeface="等线 Light"/>
-        <a:font script="Hant" typeface="新細明體"/>
-        <a:font script="Arab" typeface="Times New Roman"/>
-        <a:font script="Hebr" typeface="Times New Roman"/>
-        <a:font script="Thai" typeface="Angsana New"/>
-        <a:font script="Ethi" typeface="Nyala"/>
-        <a:font script="Beng" typeface="Vrinda"/>
-        <a:font script="Gujr" typeface="Shruti"/>
-        <a:font script="Khmr" typeface="MoolBoran"/>
-        <a:font script="Knda" typeface="Tunga"/>
-        <a:font script="Guru" typeface="Raavi"/>
-        <a:font script="Cans" typeface="Euphemia"/>
-        <a:font script="Cher" typeface="Plantagenet Cherokee"/>
-        <a:font script="Yiii" typeface="Microsoft Yi Baiti"/>
-        <a:font script="Tibt" typeface="Microsoft Himalaya"/>
-        <a:font script="Thaa" typeface="MV Boli"/>
-        <a:font script="Deva" typeface="Mangal"/>
-        <a:font script="Telu" typeface="Gautami"/>
-        <a:font script="Taml" typeface="Latha"/>
-        <a:font script="Syrc" typeface="Estrangelo Edessa"/>
-        <a:font script="Orya" typeface="Kalinga"/>
-        <a:font script="Mlym" typeface="Kartika"/>
-        <a:font script="Laoo" typeface="DokChampa"/>
-        <a:font script="Sinh" typeface="Iskoola Pota"/>
-        <a:font script="Mong" typeface="Mongolian Baiti"/>
-        <a:font script="Viet" typeface="Times New Roman"/>
-        <a:font script="Uigh" typeface="Microsoft Uighur"/>
-        <a:font script="Geor" typeface="Sylfaen"/>
-        <a:font script="Armn" typeface="Arial"/>
-        <a:font script="Bugi" typeface="Leelawadee UI"/>
-        <a:font script="Bopo" typeface="Microsoft JhengHei"/>
-        <a:font script="Java" typeface="Javanese Text"/>
-        <a:font script="Lisu" typeface="Segoe UI"/>
-        <a:font script="Mymr" typeface="Myanmar Text"/>
-        <a:font script="Nkoo" typeface="Ebrima"/>
-        <a:font script="Olck" typeface="Nirmala UI"/>
-        <a:font script="Osma" typeface="Ebrima"/>
-        <a:font script="Phag" typeface="Phagspa"/>
-        <a:font script="Syrn" typeface="Estrangelo Edessa"/>
-        <a:font script="Syrj" typeface="Estrangelo Edessa"/>
-        <a:font script="Syre" typeface="Estrangelo Edessa"/>
-        <a:font script="Sora" typeface="Nirmala UI"/>
-        <a:font script="Tale" typeface="Microsoft Tai Le"/>
-        <a:font script="Talu" typeface="Microsoft New Tai Lue"/>
-        <a:font script="Tfng" typeface="Ebrima"/>
       </a:majorFont>
       <a:minorFont>
-        <a:latin typeface="Aptos" panose="02110004020202020204"/>
+        <a:latin typeface="Aptos" panose="02110004020202020204" pitchFamily="0" charset="1"/>
         <a:ea typeface=""/>
         <a:cs typeface=""/>
-        <a:font script="Jpan" typeface="游明朝"/>
-        <a:font script="Hang" typeface="맑은 고딕"/>
-        <a:font script="Hans" typeface="等线"/>
-        <a:font script="Hant" typeface="新細明體"/>
-        <a:font script="Arab" typeface="Arial"/>
-        <a:font script="Hebr" typeface="Arial"/>
-        <a:font script="Thai" typeface="Cordia New"/>
-        <a:font script="Ethi" typeface="Nyala"/>
-        <a:font script="Beng" typeface="Vrinda"/>
-        <a:font script="Gujr" typeface="Shruti"/>
-        <a:font script="Khmr" typeface="DaunPenh"/>
-        <a:font script="Knda" typeface="Tunga"/>
-        <a:font script="Guru" typeface="Raavi"/>
-        <a:font script="Cans" typeface="Euphemia"/>
-        <a:font script="Cher" typeface="Plantagenet Cherokee"/>
-        <a:font script="Yiii" typeface="Microsoft Yi Baiti"/>
-        <a:font script="Tibt" typeface="Microsoft Himalaya"/>
-        <a:font script="Thaa" typeface="MV Boli"/>
-        <a:font script="Deva" typeface="Mangal"/>
-        <a:font script="Telu" typeface="Gautami"/>
-        <a:font script="Taml" typeface="Latha"/>
-        <a:font script="Syrc" typeface="Estrangelo Edessa"/>
-        <a:font script="Orya" typeface="Kalinga"/>
-        <a:font script="Mlym" typeface="Kartika"/>
-        <a:font script="Laoo" typeface="DokChampa"/>
-        <a:font script="Sinh" typeface="Iskoola Pota"/>
-        <a:font script="Mong" typeface="Mongolian Baiti"/>
-        <a:font script="Viet" typeface="Arial"/>
-        <a:font script="Uigh" typeface="Microsoft Uighur"/>
-        <a:font script="Geor" typeface="Sylfaen"/>
-        <a:font script="Armn" typeface="Arial"/>
-        <a:font script="Bugi" typeface="Leelawadee UI"/>
-        <a:font script="Bopo" typeface="Microsoft JhengHei"/>
-        <a:font script="Java" typeface="Javanese Text"/>
-        <a:font script="Lisu" typeface="Segoe UI"/>
-        <a:font script="Mymr" typeface="Myanmar Text"/>
-        <a:font script="Nkoo" typeface="Ebrima"/>
-        <a:font script="Olck" typeface="Nirmala UI"/>
-        <a:font script="Osma" typeface="Ebrima"/>
-        <a:font script="Phag" typeface="Phagspa"/>
-        <a:font script="Syrn" typeface="Estrangelo Edessa"/>
-        <a:font script="Syrj" typeface="Estrangelo Edessa"/>
-        <a:font script="Syre" typeface="Estrangelo Edessa"/>
-        <a:font script="Sora" typeface="Nirmala UI"/>
-        <a:font script="Tale" typeface="Microsoft Tai Le"/>
-        <a:font script="Talu" typeface="Microsoft New Tai Lue"/>
-        <a:font script="Tfng" typeface="Ebrima"/>
       </a:minorFont>
     </a:fontScheme>
-    <a:fmtScheme name="Office">
+    <a:fmtScheme>
       <a:fillStyleLst>
         <a:solidFill>
           <a:schemeClr val="phClr"/>
         </a:solidFill>
-        <a:gradFill rotWithShape="1">
+        <a:gradFill>
           <a:gsLst>
             <a:gs pos="0">
               <a:schemeClr val="phClr">
                 <a:lumMod val="110000"/>
-                <a:satMod val="105000"/>
                 <a:tint val="67000"/>
               </a:schemeClr>
             </a:gs>
             <a:gs pos="50000">
               <a:schemeClr val="phClr">
                 <a:lumMod val="105000"/>
-                <a:satMod val="103000"/>
                 <a:tint val="73000"/>
               </a:schemeClr>
             </a:gs>
             <a:gs pos="100000">
               <a:schemeClr val="phClr">
                 <a:lumMod val="105000"/>
-                <a:satMod val="109000"/>
                 <a:tint val="81000"/>
               </a:schemeClr>
             </a:gs>
           </a:gsLst>
           <a:lin ang="5400000" scaled="0"/>
+          <a:tileRect l="0" t="0" r="0" b="0"/>
         </a:gradFill>
-        <a:gradFill rotWithShape="1">
+        <a:gradFill>
           <a:gsLst>
             <a:gs pos="0">
               <a:schemeClr val="phClr">
-                <a:satMod val="103000"/>
                 <a:lumMod val="102000"/>
                 <a:tint val="94000"/>
               </a:schemeClr>
             </a:gs>
             <a:gs pos="50000">
               <a:schemeClr val="phClr">
-                <a:satMod val="110000"/>
                 <a:lumMod val="100000"/>
                 <a:shade val="100000"/>
               </a:schemeClr>
@@ -9688,33 +9786,24 @@
             <a:gs pos="100000">
               <a:schemeClr val="phClr">
                 <a:lumMod val="99000"/>
-                <a:satMod val="120000"/>
                 <a:shade val="78000"/>
               </a:schemeClr>
             </a:gs>
           </a:gsLst>
           <a:lin ang="5400000" scaled="0"/>
+          <a:tileRect l="0" t="0" r="0" b="0"/>
         </a:gradFill>
       </a:fillStyleLst>
       <a:lnStyleLst>
         <a:ln w="6350" cap="flat" cmpd="sng" algn="ctr">
-          <a:solidFill>
-            <a:schemeClr val="phClr"/>
-          </a:solidFill>
           <a:prstDash val="solid"/>
           <a:miter lim="800000"/>
         </a:ln>
         <a:ln w="12700" cap="flat" cmpd="sng" algn="ctr">
-          <a:solidFill>
-            <a:schemeClr val="phClr"/>
-          </a:solidFill>
           <a:prstDash val="solid"/>
           <a:miter lim="800000"/>
         </a:ln>
         <a:ln w="19050" cap="flat" cmpd="sng" algn="ctr">
-          <a:solidFill>
-            <a:schemeClr val="phClr"/>
-          </a:solidFill>
           <a:prstDash val="solid"/>
           <a:miter lim="800000"/>
         </a:ln>
@@ -9727,13 +9816,7 @@
           <a:effectLst/>
         </a:effectStyle>
         <a:effectStyle>
-          <a:effectLst>
-            <a:outerShdw blurRad="57150" dist="19050" dir="5400000" algn="ctr" rotWithShape="0">
-              <a:srgbClr val="000000">
-                <a:alpha val="63000"/>
-              </a:srgbClr>
-            </a:outerShdw>
-          </a:effectLst>
+          <a:effectLst/>
         </a:effectStyle>
       </a:effectStyleLst>
       <a:bgFillStyleLst>
@@ -9743,15 +9826,13 @@
         <a:solidFill>
           <a:schemeClr val="phClr">
             <a:tint val="95000"/>
-            <a:satMod val="170000"/>
           </a:schemeClr>
         </a:solidFill>
-        <a:gradFill rotWithShape="1">
+        <a:gradFill>
           <a:gsLst>
             <a:gs pos="0">
               <a:schemeClr val="phClr">
                 <a:tint val="93000"/>
-                <a:satMod val="150000"/>
                 <a:shade val="98000"/>
                 <a:lumMod val="102000"/>
               </a:schemeClr>
@@ -9759,7 +9840,6 @@
             <a:gs pos="50000">
               <a:schemeClr val="phClr">
                 <a:tint val="98000"/>
-                <a:satMod val="130000"/>
                 <a:shade val="90000"/>
                 <a:lumMod val="103000"/>
               </a:schemeClr>
@@ -9767,21 +9847,14 @@
             <a:gs pos="100000">
               <a:schemeClr val="phClr">
                 <a:shade val="63000"/>
-                <a:satMod val="120000"/>
               </a:schemeClr>
             </a:gs>
           </a:gsLst>
           <a:lin ang="5400000" scaled="0"/>
+          <a:tileRect l="0" t="0" r="0" b="0"/>
         </a:gradFill>
       </a:bgFillStyleLst>
     </a:fmtScheme>
   </a:themeElements>
-  <a:objectDefaults/>
-  <a:extraClrSchemeLst/>
-  <a:extLst>
-    <a:ext uri="{05A4C25C-085E-4340-85A3-A5531E510DB2}">
-      <thm15:themeFamily xmlns:thm15="http://schemas.microsoft.com/office/thememl/2012/main" name="Office Theme" id="{2E142A2C-CD16-42D6-873A-C26D2A0506FA}" vid="{1BDDFF52-6CD6-40A5-AB3C-68EB2F1E4D0A}"/>
-    </a:ext>
-  </a:extLst>
 </a:theme>
 </file>
</xml_diff>

<commit_message>
version to submit to BMC
</commit_message>
<xml_diff>
--- a/manuscript/manuscript.docx
+++ b/manuscript/manuscript.docx
@@ -3578,7 +3578,7 @@
         <w:t xml:space="preserve"> </w:t>
       </w:r>
       <w:r>
-        <w:t xml:space="preserve">values indicate that all MCMC chains coverged (1.00 for both</w:t>
+        <w:t xml:space="preserve">values indicate that all MCMC chains converged (1.00 for both</w:t>
       </w:r>
       <w:r>
         <w:t xml:space="preserve"> </w:t>
@@ -5302,13 +5302,13 @@
         <w:t xml:space="preserve">Declarations</w:t>
       </w:r>
     </w:p>
-    <w:bookmarkStart w:id="46" w:name="acknowledgements"/>
+    <w:bookmarkStart w:id="46" w:name="Xd182db0490b2de20bd2b4e4cc8698599182035f"/>
     <w:p>
       <w:pPr>
         <w:pStyle w:val="Heading2"/>
       </w:pPr>
       <w:r>
-        <w:t xml:space="preserve">Acknowledgements</w:t>
+        <w:t xml:space="preserve">Ethics approval and consent to participate</w:t>
       </w:r>
     </w:p>
     <w:p>
@@ -5316,59 +5316,17 @@
         <w:pStyle w:val="FirstParagraph"/>
       </w:pPr>
       <w:r>
-        <w:t xml:space="preserve">The authors thank</w:t>
-      </w:r>
-      <w:r>
-        <w:t xml:space="preserve"> </w:t>
-      </w:r>
-      <w:r>
-        <w:t xml:space="preserve">Rafiqa Benchrih (Department of Epidemiology and Public Health, Sciensano, Belgium),</w:t>
-      </w:r>
-      <w:r>
-        <w:t xml:space="preserve"> </w:t>
-      </w:r>
-      <w:r>
-        <w:t xml:space="preserve">Jurgen Buekers (Flemish Institute for Technological Research, VITO, Belgium),</w:t>
-      </w:r>
-      <w:r>
-        <w:t xml:space="preserve"> </w:t>
-      </w:r>
-      <w:r>
-        <w:t xml:space="preserve">Carla Martins (National School of Public Health, NOVA University of Lisbon, Portugal),</w:t>
-      </w:r>
-      <w:r>
-        <w:t xml:space="preserve"> </w:t>
-      </w:r>
-      <w:r>
-        <w:t xml:space="preserve">Emily Mc Vey (Institute for Public Health and the Environment, RIVM, The Netherlands),</w:t>
-      </w:r>
-      <w:r>
-        <w:t xml:space="preserve"> </w:t>
-      </w:r>
-      <w:r>
-        <w:t xml:space="preserve">Anthony Purece (Flemish Institute for Technological Research, VITO, Belgium) and</w:t>
-      </w:r>
-      <w:r>
-        <w:t xml:space="preserve"> </w:t>
-      </w:r>
-      <w:r>
-        <w:t xml:space="preserve">Sofie Thomsen (Technical University of Denmark, DTU, Denmark)</w:t>
-      </w:r>
-      <w:r>
-        <w:t xml:space="preserve"> </w:t>
-      </w:r>
-      <w:r>
-        <w:t xml:space="preserve">for their help in the literature screening process.</w:t>
+        <w:t xml:space="preserve">Not applicable.</w:t>
       </w:r>
     </w:p>
     <w:bookmarkEnd w:id="46"/>
-    <w:bookmarkStart w:id="47" w:name="credit-authorship-contribution-statement"/>
+    <w:bookmarkStart w:id="47" w:name="consent-for-publication"/>
     <w:p>
       <w:pPr>
         <w:pStyle w:val="Heading2"/>
       </w:pPr>
       <w:r>
-        <w:t xml:space="preserve">CRediT authorship contribution statement</w:t>
+        <w:t xml:space="preserve">Consent for publication</w:t>
       </w:r>
     </w:p>
     <w:p>
@@ -5376,76 +5334,17 @@
         <w:pStyle w:val="FirstParagraph"/>
       </w:pPr>
       <w:r>
-        <w:rPr>
-          <w:b/>
-          <w:bCs/>
-        </w:rPr>
-        <w:t xml:space="preserve">Paulina Sell</w:t>
-      </w:r>
-      <w:r>
-        <w:t xml:space="preserve">: Conceptualization, Data curation, Formal analysis, Methodology, Writing - original draft, Writing – review and editing.</w:t>
-      </w:r>
-      <w:r>
-        <w:t xml:space="preserve"> </w:t>
-      </w:r>
-      <w:r>
-        <w:rPr>
-          <w:b/>
-          <w:bCs/>
-        </w:rPr>
-        <w:t xml:space="preserve">Margaux Sanchez</w:t>
-      </w:r>
-      <w:r>
-        <w:t xml:space="preserve">: Data curation, Writing – review and editing.</w:t>
-      </w:r>
-      <w:r>
-        <w:t xml:space="preserve"> </w:t>
-      </w:r>
-      <w:r>
-        <w:rPr>
-          <w:b/>
-          <w:bCs/>
-        </w:rPr>
-        <w:t xml:space="preserve">Philippe Palmont</w:t>
-      </w:r>
-      <w:r>
-        <w:t xml:space="preserve">: Data curation, Writing – review and editing.</w:t>
-      </w:r>
-      <w:r>
-        <w:t xml:space="preserve"> </w:t>
-      </w:r>
-      <w:r>
-        <w:rPr>
-          <w:b/>
-          <w:bCs/>
-        </w:rPr>
-        <w:t xml:space="preserve">Simon Steiger</w:t>
-      </w:r>
-      <w:r>
-        <w:t xml:space="preserve">: Methodology, Writing – review and editing.</w:t>
-      </w:r>
-      <w:r>
-        <w:t xml:space="preserve"> </w:t>
-      </w:r>
-      <w:r>
-        <w:rPr>
-          <w:b/>
-          <w:bCs/>
-        </w:rPr>
-        <w:t xml:space="preserve">Dietrich Plass</w:t>
-      </w:r>
-      <w:r>
-        <w:t xml:space="preserve">: Supervision, Writing – review and editing.</w:t>
+        <w:t xml:space="preserve">Not applicable.</w:t>
       </w:r>
     </w:p>
     <w:bookmarkEnd w:id="47"/>
-    <w:bookmarkStart w:id="48" w:name="funding"/>
+    <w:bookmarkStart w:id="49" w:name="availability-of-data-and-materials"/>
     <w:p>
       <w:pPr>
         <w:pStyle w:val="Heading2"/>
       </w:pPr>
       <w:r>
-        <w:t xml:space="preserve">Funding</w:t>
+        <w:t xml:space="preserve">Availability of data and materials</w:t>
       </w:r>
     </w:p>
     <w:p>
@@ -5453,42 +5352,12 @@
         <w:pStyle w:val="FirstParagraph"/>
       </w:pPr>
       <w:r>
-        <w:t xml:space="preserve">This work was carried out in the framework of the European Partnership for the Assessment of Risks from Chemicals (PARC) and has received funding from the European Union’s Horizon Europe research and innovation programme under Grant Agreement No 101057014.</w:t>
-      </w:r>
-      <w:r>
-        <w:t xml:space="preserve"> </w:t>
-      </w:r>
-      <w:r>
-        <w:t xml:space="preserve">Views and opinions expressed are however those of the author(s) only and do not necessarily reflect those of the European Union or the Health and Digital Executive Agency.</w:t>
-      </w:r>
-      <w:r>
-        <w:t xml:space="preserve"> </w:t>
-      </w:r>
-      <w:r>
-        <w:t xml:space="preserve">Neither the European Union nor the granting authority can be held responsible for them.</w:t>
-      </w:r>
-    </w:p>
-    <w:bookmarkEnd w:id="48"/>
-    <w:bookmarkStart w:id="50" w:name="data-availability"/>
-    <w:p>
-      <w:pPr>
-        <w:pStyle w:val="Heading2"/>
-      </w:pPr>
-      <w:r>
-        <w:t xml:space="preserve">Data availability</w:t>
-      </w:r>
-    </w:p>
-    <w:p>
-      <w:pPr>
-        <w:pStyle w:val="FirstParagraph"/>
-      </w:pPr>
-      <w:r>
         <w:t xml:space="preserve">All data and code needed to reproduce the current study are publicly available on GitHub,</w:t>
       </w:r>
       <w:r>
         <w:t xml:space="preserve"> </w:t>
       </w:r>
-      <w:hyperlink r:id="rId49">
+      <w:hyperlink r:id="rId48">
         <w:r>
           <w:rPr>
             <w:rStyle w:val="Hyperlink"/>
@@ -5506,14 +5375,32 @@
         <w:t xml:space="preserve">.</w:t>
       </w:r>
     </w:p>
+    <w:bookmarkEnd w:id="49"/>
+    <w:bookmarkStart w:id="50" w:name="competing-interests"/>
+    <w:p>
+      <w:pPr>
+        <w:pStyle w:val="Heading2"/>
+      </w:pPr>
+      <w:r>
+        <w:t xml:space="preserve">Competing interests</w:t>
+      </w:r>
+    </w:p>
+    <w:p>
+      <w:pPr>
+        <w:pStyle w:val="FirstParagraph"/>
+      </w:pPr>
+      <w:r>
+        <w:t xml:space="preserve">The authors declare no competing interests.</w:t>
+      </w:r>
+    </w:p>
     <w:bookmarkEnd w:id="50"/>
-    <w:bookmarkStart w:id="51" w:name="Xd182db0490b2de20bd2b4e4cc8698599182035f"/>
+    <w:bookmarkStart w:id="51" w:name="funding"/>
     <w:p>
       <w:pPr>
         <w:pStyle w:val="Heading2"/>
       </w:pPr>
       <w:r>
-        <w:t xml:space="preserve">Ethics approval and consent to participate</w:t>
+        <w:t xml:space="preserve">Funding</w:t>
       </w:r>
     </w:p>
     <w:p>
@@ -5521,17 +5408,29 @@
         <w:pStyle w:val="FirstParagraph"/>
       </w:pPr>
       <w:r>
-        <w:t xml:space="preserve">Not applicable.</w:t>
+        <w:t xml:space="preserve">This work was carried out in the framework of the European Partnership for the Assessment of Risks from Chemicals (PARC) and has received funding from the European Union’s Horizon Europe research and innovation programme under Grant Agreement No 101057014.</w:t>
+      </w:r>
+      <w:r>
+        <w:t xml:space="preserve"> </w:t>
+      </w:r>
+      <w:r>
+        <w:t xml:space="preserve">Views and opinions expressed are however those of the author(s) only and do not necessarily reflect those of the European Union or the Health and Digital Executive Agency.</w:t>
+      </w:r>
+      <w:r>
+        <w:t xml:space="preserve"> </w:t>
+      </w:r>
+      <w:r>
+        <w:t xml:space="preserve">Neither the European Union nor the granting authority can be held responsible for them.</w:t>
       </w:r>
     </w:p>
     <w:bookmarkEnd w:id="51"/>
-    <w:bookmarkStart w:id="52" w:name="consent-for-publication"/>
+    <w:bookmarkStart w:id="52" w:name="acknowledgements"/>
     <w:p>
       <w:pPr>
         <w:pStyle w:val="Heading2"/>
       </w:pPr>
       <w:r>
-        <w:t xml:space="preserve">Consent for publication</w:t>
+        <w:t xml:space="preserve">Acknowledgements</w:t>
       </w:r>
     </w:p>
     <w:p>
@@ -5539,17 +5438,59 @@
         <w:pStyle w:val="FirstParagraph"/>
       </w:pPr>
       <w:r>
-        <w:t xml:space="preserve">Not applicable.</w:t>
+        <w:t xml:space="preserve">The authors thank</w:t>
+      </w:r>
+      <w:r>
+        <w:t xml:space="preserve"> </w:t>
+      </w:r>
+      <w:r>
+        <w:t xml:space="preserve">Rafiqa Benchrih (Department of Epidemiology and Public Health, Sciensano, Belgium),</w:t>
+      </w:r>
+      <w:r>
+        <w:t xml:space="preserve"> </w:t>
+      </w:r>
+      <w:r>
+        <w:t xml:space="preserve">Jurgen Buekers (Flemish Institute for Technological Research, VITO, Belgium),</w:t>
+      </w:r>
+      <w:r>
+        <w:t xml:space="preserve"> </w:t>
+      </w:r>
+      <w:r>
+        <w:t xml:space="preserve">Carla Martins (National School of Public Health, NOVA University of Lisbon, Portugal),</w:t>
+      </w:r>
+      <w:r>
+        <w:t xml:space="preserve"> </w:t>
+      </w:r>
+      <w:r>
+        <w:t xml:space="preserve">Emily Mc Vey (Institute for Public Health and the Environment, RIVM, The Netherlands),</w:t>
+      </w:r>
+      <w:r>
+        <w:t xml:space="preserve"> </w:t>
+      </w:r>
+      <w:r>
+        <w:t xml:space="preserve">Anthony Purece (Flemish Institute for Technological Research, VITO, Belgium) and</w:t>
+      </w:r>
+      <w:r>
+        <w:t xml:space="preserve"> </w:t>
+      </w:r>
+      <w:r>
+        <w:t xml:space="preserve">Sofie Thomsen (Technical University of Denmark, DTU, Denmark)</w:t>
+      </w:r>
+      <w:r>
+        <w:t xml:space="preserve"> </w:t>
+      </w:r>
+      <w:r>
+        <w:t xml:space="preserve">for their help in the literature screening process.</w:t>
       </w:r>
     </w:p>
     <w:bookmarkEnd w:id="52"/>
-    <w:bookmarkStart w:id="53" w:name="competing-interests"/>
+    <w:bookmarkStart w:id="53" w:name="authors-contributions"/>
     <w:p>
       <w:pPr>
         <w:pStyle w:val="Heading2"/>
       </w:pPr>
       <w:r>
-        <w:t xml:space="preserve">Competing interests</w:t>
+        <w:t xml:space="preserve">Authors’ contributions</w:t>
       </w:r>
     </w:p>
     <w:p>
@@ -5557,7 +5498,31 @@
         <w:pStyle w:val="FirstParagraph"/>
       </w:pPr>
       <w:r>
-        <w:t xml:space="preserve">The authors declare no competing interests.</w:t>
+        <w:t xml:space="preserve">PS: Conceptualization, data curation, formal analysis, methodology, writing – original draft, writing – review and editing.</w:t>
+      </w:r>
+      <w:r>
+        <w:t xml:space="preserve"> </w:t>
+      </w:r>
+      <w:r>
+        <w:t xml:space="preserve">MS and PP: Data curation, writing – review and editing.</w:t>
+      </w:r>
+      <w:r>
+        <w:t xml:space="preserve"> </w:t>
+      </w:r>
+      <w:r>
+        <w:t xml:space="preserve">SS: Methodology, writing – review and editing.</w:t>
+      </w:r>
+      <w:r>
+        <w:t xml:space="preserve"> </w:t>
+      </w:r>
+      <w:r>
+        <w:t xml:space="preserve">DP: Supervision, writing – review and editing.</w:t>
+      </w:r>
+      <w:r>
+        <w:t xml:space="preserve"> </w:t>
+      </w:r>
+      <w:r>
+        <w:t xml:space="preserve">All authors read and approved the final manuscript.</w:t>
       </w:r>
     </w:p>
     <w:bookmarkEnd w:id="53"/>
@@ -7345,7 +7310,7 @@
       <w:r>
         <w:t xml:space="preserve"> </w:t>
       </w:r>
-      <w:hyperlink r:id="rId49">
+      <w:hyperlink r:id="rId48">
         <w:r>
           <w:rPr>
             <w:rStyle w:val="Hyperlink"/>

</xml_diff>

<commit_message>
began with revision 1
</commit_message>
<xml_diff>
--- a/manuscript/manuscript.docx
+++ b/manuscript/manuscript.docx
@@ -126,7 +126,7 @@
       <w:r>
         <w:t xml:space="preserve"> </w:t>
       </w:r>
-      <w:hyperlink r:id="rId12">
+      <w:hyperlink r:id="rId9">
         <w:r>
           <w:rPr>
             <w:rStyle w:val="Hyperlink"/>
@@ -140,7 +140,7 @@
         <w:br w:type="page"/>
       </w:r>
     </w:p>
-    <w:bookmarkStart w:id="13" w:name="keywords"/>
+    <w:bookmarkStart w:id="10" w:name="keywords"/>
     <w:p>
       <w:pPr>
         <w:pStyle w:val="Heading1"/>
@@ -190,8 +190,8 @@
         <w:br/>
       </w:r>
     </w:p>
-    <w:bookmarkEnd w:id="13"/>
-    <w:bookmarkStart w:id="17" w:name="graphical-abstract"/>
+    <w:bookmarkEnd w:id="10"/>
+    <w:bookmarkStart w:id="14" w:name="graphical-abstract"/>
     <w:p>
       <w:pPr>
         <w:pStyle w:val="Heading1"/>
@@ -207,20 +207,20 @@
       <w:r>
         <w:drawing>
           <wp:inline>
-            <wp:extent cx="5943600" cy="3530498"/>
+            <wp:extent cx="5334000" cy="3168396"/>
             <wp:effectExtent b="0" l="0" r="0" t="0"/>
-            <wp:docPr descr="" title="" id="15" name="Picture"/>
+            <wp:docPr descr="" title="" id="12" name="Picture"/>
             <a:graphic>
               <a:graphicData uri="http://schemas.openxmlformats.org/drawingml/2006/picture">
                 <pic:pic>
                   <pic:nvPicPr>
-                    <pic:cNvPr descr="tables_figures/main/graphical_abstract.png" id="16" name="Picture"/>
+                    <pic:cNvPr descr="tables_figures/main/graphical_abstract.png" id="13" name="Picture"/>
                     <pic:cNvPicPr>
                       <a:picLocks noChangeArrowheads="1" noChangeAspect="1"/>
                     </pic:cNvPicPr>
                   </pic:nvPicPr>
                   <pic:blipFill>
-                    <a:blip r:embed="rId14"/>
+                    <a:blip r:embed="rId11"/>
                     <a:stretch>
                       <a:fillRect/>
                     </a:stretch>
@@ -228,7 +228,7 @@
                   <pic:spPr bwMode="auto">
                     <a:xfrm>
                       <a:off x="0" y="0"/>
-                      <a:ext cx="5943600" cy="3530498"/>
+                      <a:ext cx="5334000" cy="3168396"/>
                     </a:xfrm>
                     <a:prstGeom prst="rect">
                       <a:avLst/>
@@ -247,8 +247,8 @@
         </w:drawing>
       </w:r>
     </w:p>
-    <w:bookmarkEnd w:id="17"/>
-    <w:bookmarkStart w:id="18" w:name="abstract"/>
+    <w:bookmarkEnd w:id="14"/>
+    <w:bookmarkStart w:id="15" w:name="abstract"/>
     <w:p>
       <w:pPr>
         <w:pStyle w:val="Heading1"/>
@@ -266,7 +266,7 @@
           <w:b/>
           <w:bCs/>
         </w:rPr>
-        <w:t xml:space="preserve">Objective</w:t>
+        <w:t xml:space="preserve">Background</w:t>
       </w:r>
       <w:r>
         <w:t xml:space="preserve">: Uncertainty quantification is central to evidence synthesis for risk assessment and policy-making, but frequentist meta-analytic approaches - currently predominant in epidemiology - often fall short in this regard.</w:t>
@@ -581,7 +581,7 @@
           <w:b/>
           <w:bCs/>
         </w:rPr>
-        <w:t xml:space="preserve">Conclusion</w:t>
+        <w:t xml:space="preserve">Conclusions</w:t>
       </w:r>
       <w:r>
         <w:t xml:space="preserve">: We provide updated pooled estimates for the effect of lead exposure on children’s IQ.</w:t>
@@ -604,14 +604,14 @@
         <w:br w:type="page"/>
       </w:r>
     </w:p>
-    <w:bookmarkEnd w:id="18"/>
-    <w:bookmarkStart w:id="19" w:name="background"/>
+    <w:bookmarkEnd w:id="15"/>
+    <w:bookmarkStart w:id="16" w:name="background"/>
     <w:p>
       <w:pPr>
         <w:pStyle w:val="Heading1"/>
       </w:pPr>
       <w:r>
-        <w:t xml:space="preserve">1. Background</w:t>
+        <w:t xml:space="preserve">Background</w:t>
       </w:r>
     </w:p>
     <w:p>
@@ -989,23 +989,23 @@
         <w:t xml:space="preserve">The aim of this study is twofold: first, to synthesize and quantitatively pool available epidemiological findings on the association between BLL and IQ scores in children; and second, to conduct both frequentist and Bayesian meta-analyses, comparing how these analytical frameworks impact exposure-response estimates and uncertainty quantification.</w:t>
       </w:r>
     </w:p>
-    <w:bookmarkEnd w:id="19"/>
-    <w:bookmarkStart w:id="30" w:name="methods"/>
+    <w:bookmarkEnd w:id="16"/>
+    <w:bookmarkStart w:id="27" w:name="methods"/>
     <w:p>
       <w:pPr>
         <w:pStyle w:val="Heading1"/>
       </w:pPr>
       <w:r>
-        <w:t xml:space="preserve">2. Methods</w:t>
-      </w:r>
-    </w:p>
-    <w:bookmarkStart w:id="20" w:name="literature-review"/>
+        <w:t xml:space="preserve">Methods</w:t>
+      </w:r>
+    </w:p>
+    <w:bookmarkStart w:id="17" w:name="literature-review"/>
     <w:p>
       <w:pPr>
         <w:pStyle w:val="Heading2"/>
       </w:pPr>
       <w:r>
-        <w:t xml:space="preserve">2.1 Literature Review</w:t>
+        <w:t xml:space="preserve">Literature Review</w:t>
       </w:r>
     </w:p>
     <w:p>
@@ -1216,14 +1216,14 @@
         <w:t xml:space="preserve">For all included studies, effect estimates from the most-adjusted model were extracted and the adjustment set was recorded.</w:t>
       </w:r>
     </w:p>
-    <w:bookmarkEnd w:id="20"/>
-    <w:bookmarkStart w:id="21" w:name="risk-of-bias-assessment"/>
+    <w:bookmarkEnd w:id="17"/>
+    <w:bookmarkStart w:id="18" w:name="risk-of-bias-assessment"/>
     <w:p>
       <w:pPr>
         <w:pStyle w:val="Heading2"/>
       </w:pPr>
       <w:r>
-        <w:t xml:space="preserve">2.2 Risk of Bias Assessment</w:t>
+        <w:t xml:space="preserve">Risk of Bias Assessment</w:t>
       </w:r>
     </w:p>
     <w:p>
@@ -1315,14 +1315,14 @@
         <w:t xml:space="preserve">If there were any deviations in the judgement of the researcher and the LLM, the respective item was revisited by the researcher who made the final decision.</w:t>
       </w:r>
     </w:p>
-    <w:bookmarkEnd w:id="21"/>
-    <w:bookmarkStart w:id="23" w:name="harmonization-of-effect-estimates"/>
+    <w:bookmarkEnd w:id="18"/>
+    <w:bookmarkStart w:id="20" w:name="harmonization-of-effect-estimates"/>
     <w:p>
       <w:pPr>
         <w:pStyle w:val="Heading2"/>
       </w:pPr>
       <w:r>
-        <w:t xml:space="preserve">2.3 Harmonization of Effect Estimates</w:t>
+        <w:t xml:space="preserve">Harmonization of Effect Estimates</w:t>
       </w:r>
     </w:p>
     <w:p>
@@ -1384,7 +1384,7 @@
       <w:pPr>
         <w:pStyle w:val="BodyText"/>
       </w:pPr>
-      <w:bookmarkStart w:id="22" w:name="eq-regression-model"/>
+      <w:bookmarkStart w:id="19" w:name="eq-regression-model"/>
       <m:oMathPara>
         <m:oMathParaPr>
           <m:jc m:val="center"/>
@@ -1501,7 +1501,7 @@
           </m:r>
         </m:oMath>
       </m:oMathPara>
-      <w:bookmarkEnd w:id="22"/>
+      <w:bookmarkEnd w:id="19"/>
     </w:p>
     <w:p>
       <w:pPr>
@@ -1709,14 +1709,14 @@
         <w:t xml:space="preserve">These were excluded from the meta-analysis, as transformation of effect estimates for linear BLL to log-linear could not be justified.</w:t>
       </w:r>
     </w:p>
-    <w:bookmarkEnd w:id="23"/>
-    <w:bookmarkStart w:id="28" w:name="meta-analysis"/>
+    <w:bookmarkEnd w:id="20"/>
+    <w:bookmarkStart w:id="25" w:name="meta-analysis"/>
     <w:p>
       <w:pPr>
         <w:pStyle w:val="Heading2"/>
       </w:pPr>
       <w:r>
-        <w:t xml:space="preserve">2.4 Meta-Analysis</w:t>
+        <w:t xml:space="preserve">Meta-Analysis</w:t>
       </w:r>
     </w:p>
     <w:p>
@@ -1792,13 +1792,13 @@
         <w:t xml:space="preserve">.</w:t>
       </w:r>
     </w:p>
-    <w:bookmarkStart w:id="26" w:name="bayesian-meta-analysis"/>
+    <w:bookmarkStart w:id="23" w:name="bayesian-meta-analysis"/>
     <w:p>
       <w:pPr>
         <w:pStyle w:val="Heading3"/>
       </w:pPr>
       <w:r>
-        <w:t xml:space="preserve">2.4.1 Bayesian Meta-Analysis</w:t>
+        <w:t xml:space="preserve">Bayesian Meta-Analysis</w:t>
       </w:r>
     </w:p>
     <w:p>
@@ -1923,7 +1923,7 @@
       <w:pPr>
         <w:pStyle w:val="BodyText"/>
       </w:pPr>
-      <w:bookmarkStart w:id="24" w:name="eq-model"/>
+      <w:bookmarkStart w:id="21" w:name="eq-model"/>
       <m:oMathPara>
         <m:oMathParaPr>
           <m:jc m:val="center"/>
@@ -2084,7 +2084,7 @@
           </m:r>
         </m:oMath>
       </m:oMathPara>
-      <w:bookmarkEnd w:id="24"/>
+      <w:bookmarkEnd w:id="21"/>
     </w:p>
     <w:p>
       <w:pPr>
@@ -2570,7 +2570,7 @@
       <w:pPr>
         <w:pStyle w:val="BodyText"/>
       </w:pPr>
-      <w:bookmarkStart w:id="25" w:name="eq-priors"/>
+      <w:bookmarkStart w:id="22" w:name="eq-priors"/>
       <m:oMathPara>
         <m:oMathParaPr>
           <m:jc m:val="center"/>
@@ -2707,7 +2707,7 @@
           </m:r>
         </m:oMath>
       </m:oMathPara>
-      <w:bookmarkEnd w:id="25"/>
+      <w:bookmarkEnd w:id="22"/>
     </w:p>
     <w:p>
       <w:pPr>
@@ -2756,14 +2756,14 @@
         <w:t xml:space="preserve">Additionally, a sensitivity analysis with alternative priors was conducted, as described below.</w:t>
       </w:r>
     </w:p>
-    <w:bookmarkEnd w:id="26"/>
-    <w:bookmarkStart w:id="27" w:name="frequentist-meta-analysis"/>
+    <w:bookmarkEnd w:id="23"/>
+    <w:bookmarkStart w:id="24" w:name="frequentist-meta-analysis"/>
     <w:p>
       <w:pPr>
         <w:pStyle w:val="Heading3"/>
       </w:pPr>
       <w:r>
-        <w:t xml:space="preserve">2.4.2 Frequentist Meta-Analysis</w:t>
+        <w:t xml:space="preserve">Frequentist Meta-Analysis</w:t>
       </w:r>
     </w:p>
     <w:p>
@@ -2864,15 +2864,15 @@
         <w:t xml:space="preserve">.</w:t>
       </w:r>
     </w:p>
-    <w:bookmarkEnd w:id="27"/>
-    <w:bookmarkEnd w:id="28"/>
-    <w:bookmarkStart w:id="29" w:name="sensitivity-analysis"/>
+    <w:bookmarkEnd w:id="24"/>
+    <w:bookmarkEnd w:id="25"/>
+    <w:bookmarkStart w:id="26" w:name="sensitivity-analysis"/>
     <w:p>
       <w:pPr>
         <w:pStyle w:val="Heading2"/>
       </w:pPr>
       <w:r>
-        <w:t xml:space="preserve">2.5 Sensitivity Analysis</w:t>
+        <w:t xml:space="preserve">Sensitivity Analysis</w:t>
       </w:r>
     </w:p>
     <w:p>
@@ -3143,24 +3143,24 @@
         <w:t xml:space="preserve">Note that for the main effect, the broader prior is centered around 0, giving equal weight to the probability of a protective and detrimental effect of lead.</w:t>
       </w:r>
     </w:p>
-    <w:bookmarkEnd w:id="29"/>
-    <w:bookmarkEnd w:id="30"/>
-    <w:bookmarkStart w:id="41" w:name="results"/>
+    <w:bookmarkEnd w:id="26"/>
+    <w:bookmarkEnd w:id="27"/>
+    <w:bookmarkStart w:id="38" w:name="results"/>
     <w:p>
       <w:pPr>
         <w:pStyle w:val="Heading1"/>
       </w:pPr>
       <w:r>
-        <w:t xml:space="preserve">3. Results</w:t>
-      </w:r>
-    </w:p>
-    <w:bookmarkStart w:id="34" w:name="literature-review-1"/>
+        <w:t xml:space="preserve">Results</w:t>
+      </w:r>
+    </w:p>
+    <w:bookmarkStart w:id="31" w:name="literature-review-1"/>
     <w:p>
       <w:pPr>
         <w:pStyle w:val="Heading2"/>
       </w:pPr>
       <w:r>
-        <w:t xml:space="preserve">3.1 Literature Review</w:t>
+        <w:t xml:space="preserve">Literature Review</w:t>
       </w:r>
     </w:p>
     <w:p>
@@ -3261,20 +3261,20 @@
       <w:r>
         <w:drawing>
           <wp:inline>
-            <wp:extent cx="3566160" cy="4257586"/>
+            <wp:extent cx="3200400" cy="3820911"/>
             <wp:effectExtent b="0" l="0" r="0" t="0"/>
-            <wp:docPr descr="Fig. 1: PRISMA flow diagram. BLL, blood lead level; Pb, lead; Hg, mercury" title="" id="32" name="Picture"/>
+            <wp:docPr descr="Fig. 1: PRISMA flow diagram. BLL, blood lead level; Pb, lead; Hg, mercury" title="" id="29" name="Picture"/>
             <a:graphic>
               <a:graphicData uri="http://schemas.openxmlformats.org/drawingml/2006/picture">
                 <pic:pic>
                   <pic:nvPicPr>
-                    <pic:cNvPr descr="tables_figures/main/figure1.png" id="33" name="Picture"/>
+                    <pic:cNvPr descr="tables_figures/main/figure1.png" id="30" name="Picture"/>
                     <pic:cNvPicPr>
                       <a:picLocks noChangeArrowheads="1" noChangeAspect="1"/>
                     </pic:cNvPicPr>
                   </pic:nvPicPr>
                   <pic:blipFill>
-                    <a:blip r:embed="rId31"/>
+                    <a:blip r:embed="rId28"/>
                     <a:stretch>
                       <a:fillRect/>
                     </a:stretch>
@@ -3282,7 +3282,7 @@
                   <pic:spPr bwMode="auto">
                     <a:xfrm>
                       <a:off x="0" y="0"/>
-                      <a:ext cx="3566160" cy="4257586"/>
+                      <a:ext cx="3200400" cy="3820911"/>
                     </a:xfrm>
                     <a:prstGeom prst="rect">
                       <a:avLst/>
@@ -3404,14 +3404,14 @@
         <w:t xml:space="preserve">We contacted the corresponding author, who confirmed that decimal points were missing in the publication.</w:t>
       </w:r>
     </w:p>
-    <w:bookmarkEnd w:id="34"/>
-    <w:bookmarkStart w:id="35" w:name="risk-of-bias"/>
+    <w:bookmarkEnd w:id="31"/>
+    <w:bookmarkStart w:id="32" w:name="risk-of-bias"/>
     <w:p>
       <w:pPr>
         <w:pStyle w:val="Heading2"/>
       </w:pPr>
       <w:r>
-        <w:t xml:space="preserve">3.2 Risk of Bias</w:t>
+        <w:t xml:space="preserve">Risk of Bias</w:t>
       </w:r>
     </w:p>
     <w:p>
@@ -3536,14 +3536,14 @@
         <w:t xml:space="preserve">Results from the RoB assessment are presented in Table 3.</w:t>
       </w:r>
     </w:p>
-    <w:bookmarkEnd w:id="35"/>
-    <w:bookmarkStart w:id="39" w:name="meta-analysis-1"/>
+    <w:bookmarkEnd w:id="32"/>
+    <w:bookmarkStart w:id="36" w:name="meta-analysis-1"/>
     <w:p>
       <w:pPr>
         <w:pStyle w:val="Heading2"/>
       </w:pPr>
       <w:r>
-        <w:t xml:space="preserve">3.3 Meta Analysis</w:t>
+        <w:t xml:space="preserve">Meta Analysis</w:t>
       </w:r>
     </w:p>
     <w:p>
@@ -3780,20 +3780,20 @@
       <w:r>
         <w:drawing>
           <wp:inline>
-            <wp:extent cx="5943600" cy="2228220"/>
+            <wp:extent cx="5334000" cy="1999685"/>
             <wp:effectExtent b="0" l="0" r="0" t="0"/>
-            <wp:docPr descr="Fig. 2: Forest plots for Bayesian (left) and frequentist (right) meta-analyses. BLL, blood lead level; CI, confidence interval; CrI, credible interval" title="" id="37" name="Picture"/>
+            <wp:docPr descr="Fig. 2: Forest plots for Bayesian (left) and frequentist (right) meta-analyses. BLL, blood lead level; CI, confidence interval; CrI, credible interval" title="" id="34" name="Picture"/>
             <a:graphic>
               <a:graphicData uri="http://schemas.openxmlformats.org/drawingml/2006/picture">
                 <pic:pic>
                   <pic:nvPicPr>
-                    <pic:cNvPr descr="tables_figures/main/figure2.png" id="38" name="Picture"/>
+                    <pic:cNvPr descr="tables_figures/main/figure2.png" id="35" name="Picture"/>
                     <pic:cNvPicPr>
                       <a:picLocks noChangeArrowheads="1" noChangeAspect="1"/>
                     </pic:cNvPicPr>
                   </pic:nvPicPr>
                   <pic:blipFill>
-                    <a:blip r:embed="rId36"/>
+                    <a:blip r:embed="rId33"/>
                     <a:stretch>
                       <a:fillRect/>
                     </a:stretch>
@@ -3801,7 +3801,7 @@
                   <pic:spPr bwMode="auto">
                     <a:xfrm>
                       <a:off x="0" y="0"/>
-                      <a:ext cx="5943600" cy="2228220"/>
+                      <a:ext cx="5334000" cy="1999685"/>
                     </a:xfrm>
                     <a:prstGeom prst="rect">
                       <a:avLst/>
@@ -3842,14 +3842,14 @@
         <w:t xml:space="preserve">In the context of meta-analysis, shrinkage is comparable to the inverse-variance weighting in the frequentist framework.</w:t>
       </w:r>
     </w:p>
-    <w:bookmarkEnd w:id="39"/>
-    <w:bookmarkStart w:id="40" w:name="sensitivity-analysis-1"/>
+    <w:bookmarkEnd w:id="36"/>
+    <w:bookmarkStart w:id="37" w:name="sensitivity-analysis-1"/>
     <w:p>
       <w:pPr>
         <w:pStyle w:val="Heading2"/>
       </w:pPr>
       <w:r>
-        <w:t xml:space="preserve">3.4 Sensitivity Analysis</w:t>
+        <w:t xml:space="preserve">Sensitivity Analysis</w:t>
       </w:r>
     </w:p>
     <w:p>
@@ -4166,15 +4166,15 @@
         <w:t xml:space="preserve">This shows that the results are robust to prior specification, because the shifts in the pooled estimate are not substantial and do not change the conclusion of our analysis.</w:t>
       </w:r>
     </w:p>
-    <w:bookmarkEnd w:id="40"/>
-    <w:bookmarkEnd w:id="41"/>
-    <w:bookmarkStart w:id="42" w:name="discussion"/>
+    <w:bookmarkEnd w:id="37"/>
+    <w:bookmarkEnd w:id="38"/>
+    <w:bookmarkStart w:id="39" w:name="discussion"/>
     <w:p>
       <w:pPr>
         <w:pStyle w:val="Heading1"/>
       </w:pPr>
       <w:r>
-        <w:t xml:space="preserve">4. Discussion</w:t>
+        <w:t xml:space="preserve">Discussion</w:t>
       </w:r>
     </w:p>
     <w:p>
@@ -4673,14 +4673,14 @@
         <w:t xml:space="preserve">Finally, we adhered to PRISMA and BARG reporting guidelines, along with the use of the raRoB tool for risk of bias assessment, ensuring consistency and rigor in study selection, data extraction, study quality appraisal, and statistical analysis.</w:t>
       </w:r>
     </w:p>
-    <w:bookmarkEnd w:id="42"/>
-    <w:bookmarkStart w:id="43" w:name="conclusions"/>
+    <w:bookmarkEnd w:id="39"/>
+    <w:bookmarkStart w:id="40" w:name="conclusions"/>
     <w:p>
       <w:pPr>
         <w:pStyle w:val="Heading1"/>
       </w:pPr>
       <w:r>
-        <w:t xml:space="preserve">5. Conclusions</w:t>
+        <w:t xml:space="preserve">Conclusions</w:t>
       </w:r>
     </w:p>
     <w:p>
@@ -4723,8 +4723,8 @@
         <w:t xml:space="preserve">We believe that the benefits gained outweigh the investments made and therefore want to encourage researchers to consider Bayesian methods.</w:t>
       </w:r>
     </w:p>
-    <w:bookmarkEnd w:id="43"/>
-    <w:bookmarkStart w:id="44" w:name="list-of-abbreviations"/>
+    <w:bookmarkEnd w:id="40"/>
+    <w:bookmarkStart w:id="41" w:name="list-of-abbreviations"/>
     <w:p>
       <w:pPr>
         <w:pStyle w:val="Heading1"/>
@@ -5164,8 +5164,8 @@
         </w:tc>
       </w:tr>
     </w:tbl>
-    <w:bookmarkEnd w:id="44"/>
-    <w:bookmarkStart w:id="45" w:name="supplementary-information"/>
+    <w:bookmarkEnd w:id="41"/>
+    <w:bookmarkStart w:id="42" w:name="supplementary-information"/>
     <w:p>
       <w:pPr>
         <w:pStyle w:val="Heading1"/>
@@ -5292,8 +5292,8 @@
         <w:t xml:space="preserve">Additional file 6; .pdf; Model outputs; Full model output for frequentist and Bayesian meta-analysis</w:t>
       </w:r>
     </w:p>
-    <w:bookmarkEnd w:id="45"/>
-    <w:bookmarkStart w:id="54" w:name="declarations"/>
+    <w:bookmarkEnd w:id="42"/>
+    <w:bookmarkStart w:id="51" w:name="declarations"/>
     <w:p>
       <w:pPr>
         <w:pStyle w:val="Heading1"/>
@@ -5302,7 +5302,7 @@
         <w:t xml:space="preserve">Declarations</w:t>
       </w:r>
     </w:p>
-    <w:bookmarkStart w:id="46" w:name="Xd182db0490b2de20bd2b4e4cc8698599182035f"/>
+    <w:bookmarkStart w:id="43" w:name="Xd182db0490b2de20bd2b4e4cc8698599182035f"/>
     <w:p>
       <w:pPr>
         <w:pStyle w:val="Heading2"/>
@@ -5319,8 +5319,8 @@
         <w:t xml:space="preserve">Not applicable.</w:t>
       </w:r>
     </w:p>
-    <w:bookmarkEnd w:id="46"/>
-    <w:bookmarkStart w:id="47" w:name="consent-for-publication"/>
+    <w:bookmarkEnd w:id="43"/>
+    <w:bookmarkStart w:id="44" w:name="consent-for-publication"/>
     <w:p>
       <w:pPr>
         <w:pStyle w:val="Heading2"/>
@@ -5337,8 +5337,8 @@
         <w:t xml:space="preserve">Not applicable.</w:t>
       </w:r>
     </w:p>
-    <w:bookmarkEnd w:id="47"/>
-    <w:bookmarkStart w:id="49" w:name="availability-of-data-and-materials"/>
+    <w:bookmarkEnd w:id="44"/>
+    <w:bookmarkStart w:id="46" w:name="availability-of-data-and-materials"/>
     <w:p>
       <w:pPr>
         <w:pStyle w:val="Heading2"/>
@@ -5357,7 +5357,7 @@
       <w:r>
         <w:t xml:space="preserve"> </w:t>
       </w:r>
-      <w:hyperlink r:id="rId48">
+      <w:hyperlink r:id="rId45">
         <w:r>
           <w:rPr>
             <w:rStyle w:val="Hyperlink"/>
@@ -5375,14 +5375,122 @@
         <w:t xml:space="preserve">.</w:t>
       </w:r>
     </w:p>
+    <w:bookmarkEnd w:id="46"/>
+    <w:bookmarkStart w:id="47" w:name="competing-interests"/>
+    <w:p>
+      <w:pPr>
+        <w:pStyle w:val="Heading2"/>
+      </w:pPr>
+      <w:r>
+        <w:t xml:space="preserve">Competing interests</w:t>
+      </w:r>
+    </w:p>
+    <w:p>
+      <w:pPr>
+        <w:pStyle w:val="FirstParagraph"/>
+      </w:pPr>
+      <w:r>
+        <w:t xml:space="preserve">The authors declare no competing interests.</w:t>
+      </w:r>
+    </w:p>
+    <w:bookmarkEnd w:id="47"/>
+    <w:bookmarkStart w:id="48" w:name="funding"/>
+    <w:p>
+      <w:pPr>
+        <w:pStyle w:val="Heading2"/>
+      </w:pPr>
+      <w:r>
+        <w:t xml:space="preserve">Funding</w:t>
+      </w:r>
+    </w:p>
+    <w:p>
+      <w:pPr>
+        <w:pStyle w:val="FirstParagraph"/>
+      </w:pPr>
+      <w:r>
+        <w:t xml:space="preserve">This work was carried out in the framework of the European Partnership for the Assessment of Risks from Chemicals (PARC) and has received funding from the European Union’s Horizon Europe research and innovation programme under Grant Agreement No 101057014.</w:t>
+      </w:r>
+      <w:r>
+        <w:t xml:space="preserve"> </w:t>
+      </w:r>
+      <w:r>
+        <w:t xml:space="preserve">Views and opinions expressed are however those of the author(s) only and do not necessarily reflect those of the European Union or the Health and Digital Executive Agency.</w:t>
+      </w:r>
+      <w:r>
+        <w:t xml:space="preserve"> </w:t>
+      </w:r>
+      <w:r>
+        <w:t xml:space="preserve">Neither the European Union nor the granting authority can be held responsible for them.</w:t>
+      </w:r>
+    </w:p>
+    <w:bookmarkEnd w:id="48"/>
+    <w:bookmarkStart w:id="49" w:name="acknowledgements"/>
+    <w:p>
+      <w:pPr>
+        <w:pStyle w:val="Heading2"/>
+      </w:pPr>
+      <w:r>
+        <w:t xml:space="preserve">Acknowledgements</w:t>
+      </w:r>
+    </w:p>
+    <w:p>
+      <w:pPr>
+        <w:pStyle w:val="FirstParagraph"/>
+      </w:pPr>
+      <w:r>
+        <w:t xml:space="preserve">The authors thank</w:t>
+      </w:r>
+      <w:r>
+        <w:t xml:space="preserve"> </w:t>
+      </w:r>
+      <w:r>
+        <w:t xml:space="preserve">Rafiqa Benchrih (Department of Epidemiology and Public Health, Sciensano, Belgium),</w:t>
+      </w:r>
+      <w:r>
+        <w:t xml:space="preserve"> </w:t>
+      </w:r>
+      <w:r>
+        <w:t xml:space="preserve">Jurgen Buekers (Flemish Institute for Technological Research, VITO, Belgium),</w:t>
+      </w:r>
+      <w:r>
+        <w:t xml:space="preserve"> </w:t>
+      </w:r>
+      <w:r>
+        <w:t xml:space="preserve">Carla Martins (National School of Public Health, NOVA University of Lisbon, Portugal),</w:t>
+      </w:r>
+      <w:r>
+        <w:t xml:space="preserve"> </w:t>
+      </w:r>
+      <w:r>
+        <w:t xml:space="preserve">Emily Mc Vey (Institute for Public Health and the Environment, RIVM, The Netherlands),</w:t>
+      </w:r>
+      <w:r>
+        <w:t xml:space="preserve"> </w:t>
+      </w:r>
+      <w:r>
+        <w:t xml:space="preserve">Anthony Purece (Flemish Institute for Technological Research, VITO, Belgium) and</w:t>
+      </w:r>
+      <w:r>
+        <w:t xml:space="preserve"> </w:t>
+      </w:r>
+      <w:r>
+        <w:t xml:space="preserve">Sofie Thomsen (Technical University of Denmark, DTU, Denmark)</w:t>
+      </w:r>
+      <w:r>
+        <w:t xml:space="preserve"> </w:t>
+      </w:r>
+      <w:r>
+        <w:t xml:space="preserve">for their help in the literature screening process.</w:t>
+      </w:r>
+    </w:p>
     <w:bookmarkEnd w:id="49"/>
-    <w:bookmarkStart w:id="50" w:name="competing-interests"/>
+    <w:bookmarkStart w:id="50" w:name="authors-contributions"/>
     <w:p>
       <w:pPr>
         <w:pStyle w:val="Heading2"/>
       </w:pPr>
       <w:r>
-        <w:t xml:space="preserve">Competing interests</w:t>
+        <w:t xml:space="preserve">Authors’ contributions</w:t>
       </w:r>
     </w:p>
     <w:p>
@@ -5390,144 +5498,36 @@
         <w:pStyle w:val="FirstParagraph"/>
       </w:pPr>
       <w:r>
-        <w:t xml:space="preserve">The authors declare no competing interests.</w:t>
+        <w:t xml:space="preserve">PS: Conceptualization, data curation, formal analysis, methodology, writing – original draft, writing – review and editing.</w:t>
+      </w:r>
+      <w:r>
+        <w:t xml:space="preserve"> </w:t>
+      </w:r>
+      <w:r>
+        <w:t xml:space="preserve">MS and PP: Data curation, writing – review and editing.</w:t>
+      </w:r>
+      <w:r>
+        <w:t xml:space="preserve"> </w:t>
+      </w:r>
+      <w:r>
+        <w:t xml:space="preserve">SS: Methodology, writing – review and editing.</w:t>
+      </w:r>
+      <w:r>
+        <w:t xml:space="preserve"> </w:t>
+      </w:r>
+      <w:r>
+        <w:t xml:space="preserve">DP: Supervision, writing – review and editing.</w:t>
+      </w:r>
+      <w:r>
+        <w:t xml:space="preserve"> </w:t>
+      </w:r>
+      <w:r>
+        <w:t xml:space="preserve">All authors read and approved the final manuscript.</w:t>
       </w:r>
     </w:p>
     <w:bookmarkEnd w:id="50"/>
-    <w:bookmarkStart w:id="51" w:name="funding"/>
-    <w:p>
-      <w:pPr>
-        <w:pStyle w:val="Heading2"/>
-      </w:pPr>
-      <w:r>
-        <w:t xml:space="preserve">Funding</w:t>
-      </w:r>
-    </w:p>
-    <w:p>
-      <w:pPr>
-        <w:pStyle w:val="FirstParagraph"/>
-      </w:pPr>
-      <w:r>
-        <w:t xml:space="preserve">This work was carried out in the framework of the European Partnership for the Assessment of Risks from Chemicals (PARC) and has received funding from the European Union’s Horizon Europe research and innovation programme under Grant Agreement No 101057014.</w:t>
-      </w:r>
-      <w:r>
-        <w:t xml:space="preserve"> </w:t>
-      </w:r>
-      <w:r>
-        <w:t xml:space="preserve">Views and opinions expressed are however those of the author(s) only and do not necessarily reflect those of the European Union or the Health and Digital Executive Agency.</w:t>
-      </w:r>
-      <w:r>
-        <w:t xml:space="preserve"> </w:t>
-      </w:r>
-      <w:r>
-        <w:t xml:space="preserve">Neither the European Union nor the granting authority can be held responsible for them.</w:t>
-      </w:r>
-    </w:p>
     <w:bookmarkEnd w:id="51"/>
-    <w:bookmarkStart w:id="52" w:name="acknowledgements"/>
-    <w:p>
-      <w:pPr>
-        <w:pStyle w:val="Heading2"/>
-      </w:pPr>
-      <w:r>
-        <w:t xml:space="preserve">Acknowledgements</w:t>
-      </w:r>
-    </w:p>
-    <w:p>
-      <w:pPr>
-        <w:pStyle w:val="FirstParagraph"/>
-      </w:pPr>
-      <w:r>
-        <w:t xml:space="preserve">The authors thank</w:t>
-      </w:r>
-      <w:r>
-        <w:t xml:space="preserve"> </w:t>
-      </w:r>
-      <w:r>
-        <w:t xml:space="preserve">Rafiqa Benchrih (Department of Epidemiology and Public Health, Sciensano, Belgium),</w:t>
-      </w:r>
-      <w:r>
-        <w:t xml:space="preserve"> </w:t>
-      </w:r>
-      <w:r>
-        <w:t xml:space="preserve">Jurgen Buekers (Flemish Institute for Technological Research, VITO, Belgium),</w:t>
-      </w:r>
-      <w:r>
-        <w:t xml:space="preserve"> </w:t>
-      </w:r>
-      <w:r>
-        <w:t xml:space="preserve">Carla Martins (National School of Public Health, NOVA University of Lisbon, Portugal),</w:t>
-      </w:r>
-      <w:r>
-        <w:t xml:space="preserve"> </w:t>
-      </w:r>
-      <w:r>
-        <w:t xml:space="preserve">Emily Mc Vey (Institute for Public Health and the Environment, RIVM, The Netherlands),</w:t>
-      </w:r>
-      <w:r>
-        <w:t xml:space="preserve"> </w:t>
-      </w:r>
-      <w:r>
-        <w:t xml:space="preserve">Anthony Purece (Flemish Institute for Technological Research, VITO, Belgium) and</w:t>
-      </w:r>
-      <w:r>
-        <w:t xml:space="preserve"> </w:t>
-      </w:r>
-      <w:r>
-        <w:t xml:space="preserve">Sofie Thomsen (Technical University of Denmark, DTU, Denmark)</w:t>
-      </w:r>
-      <w:r>
-        <w:t xml:space="preserve"> </w:t>
-      </w:r>
-      <w:r>
-        <w:t xml:space="preserve">for their help in the literature screening process.</w:t>
-      </w:r>
-    </w:p>
-    <w:bookmarkEnd w:id="52"/>
-    <w:bookmarkStart w:id="53" w:name="authors-contributions"/>
-    <w:p>
-      <w:pPr>
-        <w:pStyle w:val="Heading2"/>
-      </w:pPr>
-      <w:r>
-        <w:t xml:space="preserve">Authors’ contributions</w:t>
-      </w:r>
-    </w:p>
-    <w:p>
-      <w:pPr>
-        <w:pStyle w:val="FirstParagraph"/>
-      </w:pPr>
-      <w:r>
-        <w:t xml:space="preserve">PS: Conceptualization, data curation, formal analysis, methodology, writing – original draft, writing – review and editing.</w:t>
-      </w:r>
-      <w:r>
-        <w:t xml:space="preserve"> </w:t>
-      </w:r>
-      <w:r>
-        <w:t xml:space="preserve">MS and PP: Data curation, writing – review and editing.</w:t>
-      </w:r>
-      <w:r>
-        <w:t xml:space="preserve"> </w:t>
-      </w:r>
-      <w:r>
-        <w:t xml:space="preserve">SS: Methodology, writing – review and editing.</w:t>
-      </w:r>
-      <w:r>
-        <w:t xml:space="preserve"> </w:t>
-      </w:r>
-      <w:r>
-        <w:t xml:space="preserve">DP: Supervision, writing – review and editing.</w:t>
-      </w:r>
-      <w:r>
-        <w:t xml:space="preserve"> </w:t>
-      </w:r>
-      <w:r>
-        <w:t xml:space="preserve">All authors read and approved the final manuscript.</w:t>
-      </w:r>
-    </w:p>
-    <w:bookmarkEnd w:id="53"/>
-    <w:bookmarkEnd w:id="54"/>
-    <w:bookmarkStart w:id="181" w:name="bibliography"/>
+    <w:bookmarkStart w:id="178" w:name="bibliography"/>
     <w:p>
       <w:pPr>
         <w:pStyle w:val="Heading1"/>
@@ -5536,8 +5536,8 @@
         <w:t xml:space="preserve">References</w:t>
       </w:r>
     </w:p>
-    <w:bookmarkStart w:id="180" w:name="refs"/>
-    <w:bookmarkStart w:id="56" w:name="Xe38019c88c6d2792bb296bad7dc0a4dd55f1319"/>
+    <w:bookmarkStart w:id="177" w:name="refs"/>
+    <w:bookmarkStart w:id="53" w:name="Xe38019c88c6d2792bb296bad7dc0a4dd55f1319"/>
     <w:p>
       <w:pPr>
         <w:pStyle w:val="Bibliography"/>
@@ -5560,7 +5560,7 @@
       <w:r>
         <w:t xml:space="preserve"> </w:t>
       </w:r>
-      <w:hyperlink r:id="rId55">
+      <w:hyperlink r:id="rId52">
         <w:r>
           <w:rPr>
             <w:rStyle w:val="Hyperlink"/>
@@ -5569,8 +5569,8 @@
         </w:r>
       </w:hyperlink>
     </w:p>
-    <w:bookmarkEnd w:id="56"/>
-    <w:bookmarkStart w:id="58" w:name="ref-lacerda2023GlobalDecreaseBlood"/>
+    <w:bookmarkEnd w:id="53"/>
+    <w:bookmarkStart w:id="55" w:name="ref-lacerda2023GlobalDecreaseBlood"/>
     <w:p>
       <w:pPr>
         <w:pStyle w:val="Bibliography"/>
@@ -5590,7 +5590,7 @@
       <w:r>
         <w:t xml:space="preserve"> </w:t>
       </w:r>
-      <w:hyperlink r:id="rId57">
+      <w:hyperlink r:id="rId54">
         <w:r>
           <w:rPr>
             <w:rStyle w:val="Hyperlink"/>
@@ -5599,8 +5599,8 @@
         </w:r>
       </w:hyperlink>
     </w:p>
-    <w:bookmarkEnd w:id="58"/>
-    <w:bookmarkStart w:id="60" w:name="X4707f3a4b72a0982487545f9dc3d674642af108"/>
+    <w:bookmarkEnd w:id="55"/>
+    <w:bookmarkStart w:id="57" w:name="X4707f3a4b72a0982487545f9dc3d674642af108"/>
     <w:p>
       <w:pPr>
         <w:pStyle w:val="Bibliography"/>
@@ -5623,7 +5623,7 @@
       <w:r>
         <w:t xml:space="preserve"> </w:t>
       </w:r>
-      <w:hyperlink r:id="rId59">
+      <w:hyperlink r:id="rId56">
         <w:r>
           <w:rPr>
             <w:rStyle w:val="Hyperlink"/>
@@ -5632,8 +5632,8 @@
         </w:r>
       </w:hyperlink>
     </w:p>
-    <w:bookmarkEnd w:id="60"/>
-    <w:bookmarkStart w:id="62" w:name="ref-sy2024AssessmentLongTermExposure"/>
+    <w:bookmarkEnd w:id="57"/>
+    <w:bookmarkStart w:id="59" w:name="ref-sy2024AssessmentLongTermExposure"/>
     <w:p>
       <w:pPr>
         <w:pStyle w:val="Bibliography"/>
@@ -5677,7 +5677,7 @@
       <w:r>
         <w:t xml:space="preserve"> </w:t>
       </w:r>
-      <w:hyperlink r:id="rId61">
+      <w:hyperlink r:id="rId58">
         <w:r>
           <w:rPr>
             <w:rStyle w:val="Hyperlink"/>
@@ -5686,8 +5686,8 @@
         </w:r>
       </w:hyperlink>
     </w:p>
-    <w:bookmarkEnd w:id="62"/>
-    <w:bookmarkStart w:id="64" w:name="ref-hay2025Burden375Diseases"/>
+    <w:bookmarkEnd w:id="59"/>
+    <w:bookmarkStart w:id="61" w:name="ref-hay2025Burden375Diseases"/>
     <w:p>
       <w:pPr>
         <w:pStyle w:val="Bibliography"/>
@@ -5722,7 +5722,7 @@
       <w:r>
         <w:t xml:space="preserve"> </w:t>
       </w:r>
-      <w:hyperlink r:id="rId63">
+      <w:hyperlink r:id="rId60">
         <w:r>
           <w:rPr>
             <w:rStyle w:val="Hyperlink"/>
@@ -5731,8 +5731,8 @@
         </w:r>
       </w:hyperlink>
     </w:p>
-    <w:bookmarkEnd w:id="64"/>
-    <w:bookmarkStart w:id="66" w:name="ref-harari2018BloodLeadLevels"/>
+    <w:bookmarkEnd w:id="61"/>
+    <w:bookmarkStart w:id="63" w:name="ref-harari2018BloodLeadLevels"/>
     <w:p>
       <w:pPr>
         <w:pStyle w:val="Bibliography"/>
@@ -5776,7 +5776,7 @@
       <w:r>
         <w:t xml:space="preserve"> </w:t>
       </w:r>
-      <w:hyperlink r:id="rId65">
+      <w:hyperlink r:id="rId62">
         <w:r>
           <w:rPr>
             <w:rStyle w:val="Hyperlink"/>
@@ -5785,8 +5785,8 @@
         </w:r>
       </w:hyperlink>
     </w:p>
-    <w:bookmarkEnd w:id="66"/>
-    <w:bookmarkStart w:id="68" w:name="ref-wan2022ChronicLeadExposure"/>
+    <w:bookmarkEnd w:id="63"/>
+    <w:bookmarkStart w:id="65" w:name="ref-wan2022ChronicLeadExposure"/>
     <w:p>
       <w:pPr>
         <w:pStyle w:val="Bibliography"/>
@@ -5797,7 +5797,7 @@
       <w:r>
         <w:t xml:space="preserve"> </w:t>
       </w:r>
-      <w:hyperlink r:id="rId67">
+      <w:hyperlink r:id="rId64">
         <w:r>
           <w:rPr>
             <w:rStyle w:val="Hyperlink"/>
@@ -5806,8 +5806,8 @@
         </w:r>
       </w:hyperlink>
     </w:p>
-    <w:bookmarkEnd w:id="68"/>
-    <w:bookmarkStart w:id="70" w:name="ref-rosengren2025ExposureLeadCoronary"/>
+    <w:bookmarkEnd w:id="65"/>
+    <w:bookmarkStart w:id="67" w:name="ref-rosengren2025ExposureLeadCoronary"/>
     <w:p>
       <w:pPr>
         <w:pStyle w:val="Bibliography"/>
@@ -5860,7 +5860,7 @@
       <w:r>
         <w:t xml:space="preserve"> </w:t>
       </w:r>
-      <w:hyperlink r:id="rId69">
+      <w:hyperlink r:id="rId66">
         <w:r>
           <w:rPr>
             <w:rStyle w:val="Hyperlink"/>
@@ -5869,8 +5869,8 @@
         </w:r>
       </w:hyperlink>
     </w:p>
-    <w:bookmarkEnd w:id="70"/>
-    <w:bookmarkStart w:id="72" w:name="ref-lanphear2018LowlevelLeadExposure"/>
+    <w:bookmarkEnd w:id="67"/>
+    <w:bookmarkStart w:id="69" w:name="ref-lanphear2018LowlevelLeadExposure"/>
     <w:p>
       <w:pPr>
         <w:pStyle w:val="Bibliography"/>
@@ -5893,7 +5893,7 @@
       <w:r>
         <w:t xml:space="preserve"> </w:t>
       </w:r>
-      <w:hyperlink r:id="rId71">
+      <w:hyperlink r:id="rId68">
         <w:r>
           <w:rPr>
             <w:rStyle w:val="Hyperlink"/>
@@ -5902,8 +5902,8 @@
         </w:r>
       </w:hyperlink>
     </w:p>
-    <w:bookmarkEnd w:id="72"/>
-    <w:bookmarkStart w:id="74" w:name="ref-chang2006LowBloodLead"/>
+    <w:bookmarkEnd w:id="69"/>
+    <w:bookmarkStart w:id="71" w:name="ref-chang2006LowBloodLead"/>
     <w:p>
       <w:pPr>
         <w:pStyle w:val="Bibliography"/>
@@ -5914,7 +5914,7 @@
       <w:r>
         <w:t xml:space="preserve"> </w:t>
       </w:r>
-      <w:hyperlink r:id="rId73">
+      <w:hyperlink r:id="rId70">
         <w:r>
           <w:rPr>
             <w:rStyle w:val="Hyperlink"/>
@@ -5923,8 +5923,8 @@
         </w:r>
       </w:hyperlink>
     </w:p>
-    <w:bookmarkEnd w:id="74"/>
-    <w:bookmarkStart w:id="76" w:name="Xadfdab0209e4a364d9fdcffecfddb00700d2db9"/>
+    <w:bookmarkEnd w:id="71"/>
+    <w:bookmarkStart w:id="73" w:name="Xadfdab0209e4a364d9fdcffecfddb00700d2db9"/>
     <w:p>
       <w:pPr>
         <w:pStyle w:val="Bibliography"/>
@@ -5998,7 +5998,7 @@
       <w:r>
         <w:t xml:space="preserve"> </w:t>
       </w:r>
-      <w:hyperlink r:id="rId75">
+      <w:hyperlink r:id="rId72">
         <w:r>
           <w:rPr>
             <w:rStyle w:val="Hyperlink"/>
@@ -6007,8 +6007,8 @@
         </w:r>
       </w:hyperlink>
     </w:p>
-    <w:bookmarkEnd w:id="76"/>
-    <w:bookmarkStart w:id="78" w:name="ref-shaffer2025LeadExposureAntisocial"/>
+    <w:bookmarkEnd w:id="73"/>
+    <w:bookmarkStart w:id="75" w:name="ref-shaffer2025LeadExposureAntisocial"/>
     <w:p>
       <w:pPr>
         <w:pStyle w:val="Bibliography"/>
@@ -6031,7 +6031,7 @@
       <w:r>
         <w:t xml:space="preserve"> </w:t>
       </w:r>
-      <w:hyperlink r:id="rId77">
+      <w:hyperlink r:id="rId74">
         <w:r>
           <w:rPr>
             <w:rStyle w:val="Hyperlink"/>
@@ -6040,8 +6040,8 @@
         </w:r>
       </w:hyperlink>
     </w:p>
-    <w:bookmarkEnd w:id="78"/>
-    <w:bookmarkStart w:id="80" w:name="X06097e4c5e52362623b7f1c040457eb7d553acc"/>
+    <w:bookmarkEnd w:id="75"/>
+    <w:bookmarkStart w:id="77" w:name="X06097e4c5e52362623b7f1c040457eb7d553acc"/>
     <w:p>
       <w:pPr>
         <w:pStyle w:val="Bibliography"/>
@@ -6127,7 +6127,7 @@
       <w:r>
         <w:t xml:space="preserve"> </w:t>
       </w:r>
-      <w:hyperlink r:id="rId79">
+      <w:hyperlink r:id="rId76">
         <w:r>
           <w:rPr>
             <w:rStyle w:val="Hyperlink"/>
@@ -6136,8 +6136,8 @@
         </w:r>
       </w:hyperlink>
     </w:p>
-    <w:bookmarkEnd w:id="80"/>
-    <w:bookmarkStart w:id="82" w:name="ref-needleman1990LowLevelLeadExposure"/>
+    <w:bookmarkEnd w:id="77"/>
+    <w:bookmarkStart w:id="79" w:name="ref-needleman1990LowLevelLeadExposure"/>
     <w:p>
       <w:pPr>
         <w:pStyle w:val="Bibliography"/>
@@ -6199,7 +6199,7 @@
       <w:r>
         <w:t xml:space="preserve"> </w:t>
       </w:r>
-      <w:hyperlink r:id="rId81">
+      <w:hyperlink r:id="rId78">
         <w:r>
           <w:rPr>
             <w:rStyle w:val="Hyperlink"/>
@@ -6208,8 +6208,8 @@
         </w:r>
       </w:hyperlink>
     </w:p>
-    <w:bookmarkEnd w:id="82"/>
-    <w:bookmarkStart w:id="84" w:name="ref-bellinger1992LowLevelLeadExposure"/>
+    <w:bookmarkEnd w:id="79"/>
+    <w:bookmarkStart w:id="81" w:name="ref-bellinger1992LowLevelLeadExposure"/>
     <w:p>
       <w:pPr>
         <w:pStyle w:val="Bibliography"/>
@@ -6256,7 +6256,7 @@
       <w:r>
         <w:t xml:space="preserve"> </w:t>
       </w:r>
-      <w:hyperlink r:id="rId83">
+      <w:hyperlink r:id="rId80">
         <w:r>
           <w:rPr>
             <w:rStyle w:val="Hyperlink"/>
@@ -6265,8 +6265,8 @@
         </w:r>
       </w:hyperlink>
     </w:p>
-    <w:bookmarkEnd w:id="84"/>
-    <w:bookmarkStart w:id="86" w:name="X9a8bad0b78f43066cb333fdedcdcad5d7017900"/>
+    <w:bookmarkEnd w:id="81"/>
+    <w:bookmarkStart w:id="83" w:name="X9a8bad0b78f43066cb333fdedcdcad5d7017900"/>
     <w:p>
       <w:pPr>
         <w:pStyle w:val="Bibliography"/>
@@ -6313,7 +6313,7 @@
       <w:r>
         <w:t xml:space="preserve"> </w:t>
       </w:r>
-      <w:hyperlink r:id="rId85">
+      <w:hyperlink r:id="rId82">
         <w:r>
           <w:rPr>
             <w:rStyle w:val="Hyperlink"/>
@@ -6322,8 +6322,8 @@
         </w:r>
       </w:hyperlink>
     </w:p>
-    <w:bookmarkEnd w:id="86"/>
-    <w:bookmarkStart w:id="88" w:name="ref-larsen2023GlobalHealthBurden"/>
+    <w:bookmarkEnd w:id="83"/>
+    <w:bookmarkStart w:id="85" w:name="ref-larsen2023GlobalHealthBurden"/>
     <w:p>
       <w:pPr>
         <w:pStyle w:val="Bibliography"/>
@@ -6334,7 +6334,7 @@
       <w:r>
         <w:t xml:space="preserve"> </w:t>
       </w:r>
-      <w:hyperlink r:id="rId87">
+      <w:hyperlink r:id="rId84">
         <w:r>
           <w:rPr>
             <w:rStyle w:val="Hyperlink"/>
@@ -6343,8 +6343,8 @@
         </w:r>
       </w:hyperlink>
     </w:p>
-    <w:bookmarkEnd w:id="88"/>
-    <w:bookmarkStart w:id="89" w:name="ref-tamasszigeti2022SubstanceReportLead"/>
+    <w:bookmarkEnd w:id="85"/>
+    <w:bookmarkStart w:id="86" w:name="ref-tamasszigeti2022SubstanceReportLead"/>
     <w:p>
       <w:pPr>
         <w:pStyle w:val="Bibliography"/>
@@ -6362,8 +6362,8 @@
         <w:t xml:space="preserve">. HBM4EU; 2022.</w:t>
       </w:r>
     </w:p>
-    <w:bookmarkEnd w:id="89"/>
-    <w:bookmarkStart w:id="91" w:name="X5615fc1cb9c455a90da75660348bda09fd0f967"/>
+    <w:bookmarkEnd w:id="86"/>
+    <w:bookmarkStart w:id="88" w:name="X5615fc1cb9c455a90da75660348bda09fd0f967"/>
     <w:p>
       <w:pPr>
         <w:pStyle w:val="Bibliography"/>
@@ -6407,7 +6407,7 @@
       <w:r>
         <w:t xml:space="preserve"> </w:t>
       </w:r>
-      <w:hyperlink r:id="rId90">
+      <w:hyperlink r:id="rId87">
         <w:r>
           <w:rPr>
             <w:rStyle w:val="Hyperlink"/>
@@ -6416,8 +6416,8 @@
         </w:r>
       </w:hyperlink>
     </w:p>
-    <w:bookmarkEnd w:id="91"/>
-    <w:bookmarkStart w:id="93" w:name="ref-schwartz1994LowLevelLeadExposure"/>
+    <w:bookmarkEnd w:id="88"/>
+    <w:bookmarkStart w:id="90" w:name="ref-schwartz1994LowLevelLeadExposure"/>
     <w:p>
       <w:pPr>
         <w:pStyle w:val="Bibliography"/>
@@ -6496,7 +6496,7 @@
       <w:r>
         <w:t xml:space="preserve"> </w:t>
       </w:r>
-      <w:hyperlink r:id="rId92">
+      <w:hyperlink r:id="rId89">
         <w:r>
           <w:rPr>
             <w:rStyle w:val="Hyperlink"/>
@@ -6505,8 +6505,8 @@
         </w:r>
       </w:hyperlink>
     </w:p>
-    <w:bookmarkEnd w:id="93"/>
-    <w:bookmarkStart w:id="95" w:name="Xa2086c2c3f6a9ac4b676f66b1cdbbd5efdb3b23"/>
+    <w:bookmarkEnd w:id="90"/>
+    <w:bookmarkStart w:id="92" w:name="Xa2086c2c3f6a9ac4b676f66b1cdbbd5efdb3b23"/>
     <w:p>
       <w:pPr>
         <w:pStyle w:val="Bibliography"/>
@@ -6573,7 +6573,7 @@
       <w:r>
         <w:t xml:space="preserve"> </w:t>
       </w:r>
-      <w:hyperlink r:id="rId94">
+      <w:hyperlink r:id="rId91">
         <w:r>
           <w:rPr>
             <w:rStyle w:val="Hyperlink"/>
@@ -6582,8 +6582,8 @@
         </w:r>
       </w:hyperlink>
     </w:p>
-    <w:bookmarkEnd w:id="95"/>
-    <w:bookmarkStart w:id="97" w:name="X93c1fc7f8e1220d02cbab90c02ac44248f2b23e"/>
+    <w:bookmarkEnd w:id="92"/>
+    <w:bookmarkStart w:id="94" w:name="X93c1fc7f8e1220d02cbab90c02ac44248f2b23e"/>
     <w:p>
       <w:pPr>
         <w:pStyle w:val="Bibliography"/>
@@ -6594,7 +6594,7 @@
       <w:r>
         <w:t xml:space="preserve"> </w:t>
       </w:r>
-      <w:hyperlink r:id="rId96">
+      <w:hyperlink r:id="rId93">
         <w:r>
           <w:rPr>
             <w:rStyle w:val="Hyperlink"/>
@@ -6603,8 +6603,8 @@
         </w:r>
       </w:hyperlink>
     </w:p>
-    <w:bookmarkEnd w:id="97"/>
-    <w:bookmarkStart w:id="99" w:name="ref-figueroa2024LossCognitiveFunction"/>
+    <w:bookmarkEnd w:id="94"/>
+    <w:bookmarkStart w:id="96" w:name="ref-figueroa2024LossCognitiveFunction"/>
     <w:p>
       <w:pPr>
         <w:pStyle w:val="Bibliography"/>
@@ -6627,7 +6627,7 @@
       <w:r>
         <w:t xml:space="preserve"> </w:t>
       </w:r>
-      <w:hyperlink r:id="rId98">
+      <w:hyperlink r:id="rId95">
         <w:r>
           <w:rPr>
             <w:rStyle w:val="Hyperlink"/>
@@ -6636,8 +6636,8 @@
         </w:r>
       </w:hyperlink>
     </w:p>
-    <w:bookmarkEnd w:id="99"/>
-    <w:bookmarkStart w:id="101" w:name="ref-mcfarland2022HalfUSPopulation"/>
+    <w:bookmarkEnd w:id="96"/>
+    <w:bookmarkStart w:id="98" w:name="ref-mcfarland2022HalfUSPopulation"/>
     <w:p>
       <w:pPr>
         <w:pStyle w:val="Bibliography"/>
@@ -6660,7 +6660,7 @@
       <w:r>
         <w:t xml:space="preserve"> </w:t>
       </w:r>
-      <w:hyperlink r:id="rId100">
+      <w:hyperlink r:id="rId97">
         <w:r>
           <w:rPr>
             <w:rStyle w:val="Hyperlink"/>
@@ -6669,8 +6669,8 @@
         </w:r>
       </w:hyperlink>
     </w:p>
-    <w:bookmarkEnd w:id="101"/>
-    <w:bookmarkStart w:id="103" w:name="ref-crump2013StatisticalReevaluationData"/>
+    <w:bookmarkEnd w:id="98"/>
+    <w:bookmarkStart w:id="100" w:name="ref-crump2013StatisticalReevaluationData"/>
     <w:p>
       <w:pPr>
         <w:pStyle w:val="Bibliography"/>
@@ -6693,7 +6693,7 @@
       <w:r>
         <w:t xml:space="preserve"> </w:t>
       </w:r>
-      <w:hyperlink r:id="rId102">
+      <w:hyperlink r:id="rId99">
         <w:r>
           <w:rPr>
             <w:rStyle w:val="Hyperlink"/>
@@ -6702,8 +6702,8 @@
         </w:r>
       </w:hyperlink>
     </w:p>
-    <w:bookmarkEnd w:id="103"/>
-    <w:bookmarkStart w:id="105" w:name="X33f03e29791f20cdbbbbf0729c723b16e55ed16"/>
+    <w:bookmarkEnd w:id="100"/>
+    <w:bookmarkStart w:id="102" w:name="X33f03e29791f20cdbbbbf0729c723b16e55ed16"/>
     <w:p>
       <w:pPr>
         <w:pStyle w:val="Bibliography"/>
@@ -6762,7 +6762,7 @@
       <w:r>
         <w:t xml:space="preserve"> </w:t>
       </w:r>
-      <w:hyperlink r:id="rId104">
+      <w:hyperlink r:id="rId101">
         <w:r>
           <w:rPr>
             <w:rStyle w:val="Hyperlink"/>
@@ -6771,8 +6771,8 @@
         </w:r>
       </w:hyperlink>
     </w:p>
-    <w:bookmarkEnd w:id="105"/>
-    <w:bookmarkStart w:id="107" w:name="X035620408d1fb22c7ed381e74f0468c30df4612"/>
+    <w:bookmarkEnd w:id="102"/>
+    <w:bookmarkStart w:id="104" w:name="X035620408d1fb22c7ed381e74f0468c30df4612"/>
     <w:p>
       <w:pPr>
         <w:pStyle w:val="Bibliography"/>
@@ -6810,7 +6810,7 @@
       <w:r>
         <w:t xml:space="preserve"> </w:t>
       </w:r>
-      <w:hyperlink r:id="rId106">
+      <w:hyperlink r:id="rId103">
         <w:r>
           <w:rPr>
             <w:rStyle w:val="Hyperlink"/>
@@ -6819,8 +6819,8 @@
         </w:r>
       </w:hyperlink>
     </w:p>
-    <w:bookmarkEnd w:id="107"/>
-    <w:bookmarkStart w:id="109" w:name="X837f91f784566061977da85c17a5755a81dedde"/>
+    <w:bookmarkEnd w:id="104"/>
+    <w:bookmarkStart w:id="106" w:name="X837f91f784566061977da85c17a5755a81dedde"/>
     <w:p>
       <w:pPr>
         <w:pStyle w:val="Bibliography"/>
@@ -6831,7 +6831,7 @@
       <w:r>
         <w:t xml:space="preserve"> </w:t>
       </w:r>
-      <w:hyperlink r:id="rId108">
+      <w:hyperlink r:id="rId105">
         <w:r>
           <w:rPr>
             <w:rStyle w:val="Hyperlink"/>
@@ -6840,8 +6840,8 @@
         </w:r>
       </w:hyperlink>
     </w:p>
-    <w:bookmarkEnd w:id="109"/>
-    <w:bookmarkStart w:id="111" w:name="ref-page2021PRISMA2020Statement"/>
+    <w:bookmarkEnd w:id="106"/>
+    <w:bookmarkStart w:id="108" w:name="ref-page2021PRISMA2020Statement"/>
     <w:p>
       <w:pPr>
         <w:pStyle w:val="Bibliography"/>
@@ -6864,7 +6864,7 @@
       <w:r>
         <w:t xml:space="preserve"> </w:t>
       </w:r>
-      <w:hyperlink r:id="rId110">
+      <w:hyperlink r:id="rId107">
         <w:r>
           <w:rPr>
             <w:rStyle w:val="Hyperlink"/>
@@ -6873,8 +6873,8 @@
         </w:r>
       </w:hyperlink>
     </w:p>
-    <w:bookmarkEnd w:id="111"/>
-    <w:bookmarkStart w:id="113" w:name="X5cae6442bbe0e1f5d8df6cd5008aab2dbfb65a6"/>
+    <w:bookmarkEnd w:id="108"/>
+    <w:bookmarkStart w:id="110" w:name="X5cae6442bbe0e1f5d8df6cd5008aab2dbfb65a6"/>
     <w:p>
       <w:pPr>
         <w:pStyle w:val="Bibliography"/>
@@ -6894,7 +6894,7 @@
       <w:r>
         <w:t xml:space="preserve"> </w:t>
       </w:r>
-      <w:hyperlink r:id="rId112">
+      <w:hyperlink r:id="rId109">
         <w:r>
           <w:rPr>
             <w:rStyle w:val="Hyperlink"/>
@@ -6903,8 +6903,8 @@
         </w:r>
       </w:hyperlink>
     </w:p>
-    <w:bookmarkEnd w:id="113"/>
-    <w:bookmarkStart w:id="115" w:name="ref-2026PartnershipAssessmentRisks"/>
+    <w:bookmarkEnd w:id="110"/>
+    <w:bookmarkStart w:id="112" w:name="ref-2026PartnershipAssessmentRisks"/>
     <w:p>
       <w:pPr>
         <w:pStyle w:val="Bibliography"/>
@@ -6948,7 +6948,7 @@
       <w:r>
         <w:t xml:space="preserve"> </w:t>
       </w:r>
-      <w:hyperlink r:id="rId114">
+      <w:hyperlink r:id="rId111">
         <w:r>
           <w:rPr>
             <w:rStyle w:val="Hyperlink"/>
@@ -6960,8 +6960,8 @@
         <w:t xml:space="preserve">. Accessed 5 June 2026</w:t>
       </w:r>
     </w:p>
-    <w:bookmarkEnd w:id="115"/>
-    <w:bookmarkStart w:id="116" w:name="Xf5486a80753c915bf34b5d8f3ad5e46aac479a7"/>
+    <w:bookmarkEnd w:id="112"/>
+    <w:bookmarkStart w:id="113" w:name="Xf5486a80753c915bf34b5d8f3ad5e46aac479a7"/>
     <w:p>
       <w:pPr>
         <w:pStyle w:val="Bibliography"/>
@@ -7015,8 +7015,8 @@
         <w:t xml:space="preserve">. 2019;</w:t>
       </w:r>
     </w:p>
-    <w:bookmarkEnd w:id="116"/>
-    <w:bookmarkStart w:id="118" w:name="ref-plate2024DevelopmentToolRapid"/>
+    <w:bookmarkEnd w:id="113"/>
+    <w:bookmarkStart w:id="115" w:name="ref-plate2024DevelopmentToolRapid"/>
     <w:p>
       <w:pPr>
         <w:pStyle w:val="Bibliography"/>
@@ -7027,7 +7027,7 @@
       <w:r>
         <w:t xml:space="preserve"> </w:t>
       </w:r>
-      <w:hyperlink r:id="rId117">
+      <w:hyperlink r:id="rId114">
         <w:r>
           <w:rPr>
             <w:rStyle w:val="Hyperlink"/>
@@ -7036,8 +7036,8 @@
         </w:r>
       </w:hyperlink>
     </w:p>
-    <w:bookmarkEnd w:id="118"/>
-    <w:bookmarkStart w:id="120" w:name="ref-halabicky2023LowLevelLead"/>
+    <w:bookmarkEnd w:id="115"/>
+    <w:bookmarkStart w:id="117" w:name="ref-halabicky2023LowLevelLead"/>
     <w:p>
       <w:pPr>
         <w:pStyle w:val="Bibliography"/>
@@ -7060,7 +7060,7 @@
       <w:r>
         <w:t xml:space="preserve"> </w:t>
       </w:r>
-      <w:hyperlink r:id="rId119">
+      <w:hyperlink r:id="rId116">
         <w:r>
           <w:rPr>
             <w:rStyle w:val="Hyperlink"/>
@@ -7069,8 +7069,8 @@
         </w:r>
       </w:hyperlink>
     </w:p>
-    <w:bookmarkEnd w:id="120"/>
-    <w:bookmarkStart w:id="122" w:name="ref-chen2005IQBloodLead"/>
+    <w:bookmarkEnd w:id="117"/>
+    <w:bookmarkStart w:id="119" w:name="ref-chen2005IQBloodLead"/>
     <w:p>
       <w:pPr>
         <w:pStyle w:val="Bibliography"/>
@@ -7192,7 +7192,7 @@
       <w:r>
         <w:t xml:space="preserve"> </w:t>
       </w:r>
-      <w:hyperlink r:id="rId121">
+      <w:hyperlink r:id="rId118">
         <w:r>
           <w:rPr>
             <w:rStyle w:val="Hyperlink"/>
@@ -7201,8 +7201,8 @@
         </w:r>
       </w:hyperlink>
     </w:p>
-    <w:bookmarkEnd w:id="122"/>
-    <w:bookmarkStart w:id="124" w:name="Xcf7993c3f58afaabaf73be6238c67f4f63053d9"/>
+    <w:bookmarkEnd w:id="119"/>
+    <w:bookmarkStart w:id="121" w:name="Xcf7993c3f58afaabaf73be6238c67f4f63053d9"/>
     <w:p>
       <w:pPr>
         <w:pStyle w:val="Bibliography"/>
@@ -7246,7 +7246,7 @@
       <w:r>
         <w:t xml:space="preserve"> </w:t>
       </w:r>
-      <w:hyperlink r:id="rId123">
+      <w:hyperlink r:id="rId120">
         <w:r>
           <w:rPr>
             <w:rStyle w:val="Hyperlink"/>
@@ -7255,8 +7255,8 @@
         </w:r>
       </w:hyperlink>
     </w:p>
-    <w:bookmarkEnd w:id="124"/>
-    <w:bookmarkStart w:id="125" w:name="X4bd034c52731e178b4de125c2c778bdc533803c"/>
+    <w:bookmarkEnd w:id="121"/>
+    <w:bookmarkStart w:id="122" w:name="X4bd034c52731e178b4de125c2c778bdc533803c"/>
     <w:p>
       <w:pPr>
         <w:pStyle w:val="Bibliography"/>
@@ -7298,8 +7298,8 @@
         <w:t xml:space="preserve">. Vienna, Austria: R Foundation for Statistical Computing; 2024.</w:t>
       </w:r>
     </w:p>
-    <w:bookmarkEnd w:id="125"/>
-    <w:bookmarkStart w:id="126" w:name="ref-2026GitHub"/>
+    <w:bookmarkEnd w:id="122"/>
+    <w:bookmarkStart w:id="123" w:name="ref-2026GitHub"/>
     <w:p>
       <w:pPr>
         <w:pStyle w:val="Bibliography"/>
@@ -7310,7 +7310,7 @@
       <w:r>
         <w:t xml:space="preserve"> </w:t>
       </w:r>
-      <w:hyperlink r:id="rId48">
+      <w:hyperlink r:id="rId45">
         <w:r>
           <w:rPr>
             <w:rStyle w:val="Hyperlink"/>
@@ -7322,8 +7322,8 @@
         <w:t xml:space="preserve">. Accessed 5 June 2026</w:t>
       </w:r>
     </w:p>
-    <w:bookmarkEnd w:id="126"/>
-    <w:bookmarkStart w:id="128" w:name="ref-burkner2017BrmsPackageBayesian"/>
+    <w:bookmarkEnd w:id="123"/>
+    <w:bookmarkStart w:id="125" w:name="ref-burkner2017BrmsPackageBayesian"/>
     <w:p>
       <w:pPr>
         <w:pStyle w:val="Bibliography"/>
@@ -7397,7 +7397,7 @@
       <w:r>
         <w:t xml:space="preserve"> </w:t>
       </w:r>
-      <w:hyperlink r:id="rId127">
+      <w:hyperlink r:id="rId124">
         <w:r>
           <w:rPr>
             <w:rStyle w:val="Hyperlink"/>
@@ -7406,8 +7406,8 @@
         </w:r>
       </w:hyperlink>
     </w:p>
-    <w:bookmarkEnd w:id="128"/>
-    <w:bookmarkStart w:id="129" w:name="X21bf392f662dc1b38e9a7fa4b314fc7a471696b"/>
+    <w:bookmarkEnd w:id="125"/>
+    <w:bookmarkStart w:id="126" w:name="X21bf392f662dc1b38e9a7fa4b314fc7a471696b"/>
     <w:p>
       <w:pPr>
         <w:pStyle w:val="Bibliography"/>
@@ -7437,8 +7437,8 @@
         <w:t xml:space="preserve">. 2025.</w:t>
       </w:r>
     </w:p>
-    <w:bookmarkEnd w:id="129"/>
-    <w:bookmarkStart w:id="131" w:name="X111bb06244f8f2a1a6d0d2f1f41c24b71f248e6"/>
+    <w:bookmarkEnd w:id="126"/>
+    <w:bookmarkStart w:id="128" w:name="X111bb06244f8f2a1a6d0d2f1f41c24b71f248e6"/>
     <w:p>
       <w:pPr>
         <w:pStyle w:val="Bibliography"/>
@@ -7470,7 +7470,7 @@
       <w:r>
         <w:t xml:space="preserve"> </w:t>
       </w:r>
-      <w:hyperlink r:id="rId130">
+      <w:hyperlink r:id="rId127">
         <w:r>
           <w:rPr>
             <w:rStyle w:val="Hyperlink"/>
@@ -7479,8 +7479,8 @@
         </w:r>
       </w:hyperlink>
     </w:p>
-    <w:bookmarkEnd w:id="131"/>
-    <w:bookmarkStart w:id="133" w:name="ref-earl2016LowlevelEnvironmentalLead"/>
+    <w:bookmarkEnd w:id="128"/>
+    <w:bookmarkStart w:id="130" w:name="ref-earl2016LowlevelEnvironmentalLead"/>
     <w:p>
       <w:pPr>
         <w:pStyle w:val="Bibliography"/>
@@ -7491,7 +7491,7 @@
       <w:r>
         <w:t xml:space="preserve"> </w:t>
       </w:r>
-      <w:hyperlink r:id="rId132">
+      <w:hyperlink r:id="rId129">
         <w:r>
           <w:rPr>
             <w:rStyle w:val="Hyperlink"/>
@@ -7500,8 +7500,8 @@
         </w:r>
       </w:hyperlink>
     </w:p>
-    <w:bookmarkEnd w:id="133"/>
-    <w:bookmarkStart w:id="135" w:name="ref-bauer2020AssociationsMetalMixture"/>
+    <w:bookmarkEnd w:id="130"/>
+    <w:bookmarkStart w:id="132" w:name="ref-bauer2020AssociationsMetalMixture"/>
     <w:p>
       <w:pPr>
         <w:pStyle w:val="Bibliography"/>
@@ -7578,7 +7578,7 @@
       <w:r>
         <w:t xml:space="preserve"> </w:t>
       </w:r>
-      <w:hyperlink r:id="rId134">
+      <w:hyperlink r:id="rId131">
         <w:r>
           <w:rPr>
             <w:rStyle w:val="Hyperlink"/>
@@ -7587,8 +7587,8 @@
         </w:r>
       </w:hyperlink>
     </w:p>
-    <w:bookmarkEnd w:id="135"/>
-    <w:bookmarkStart w:id="137" w:name="ref-hong2015EnvironmentalLeadExposure"/>
+    <w:bookmarkEnd w:id="132"/>
+    <w:bookmarkStart w:id="134" w:name="ref-hong2015EnvironmentalLeadExposure"/>
     <w:p>
       <w:pPr>
         <w:pStyle w:val="Bibliography"/>
@@ -7650,7 +7650,7 @@
       <w:r>
         <w:t xml:space="preserve"> </w:t>
       </w:r>
-      <w:hyperlink r:id="rId136">
+      <w:hyperlink r:id="rId133">
         <w:r>
           <w:rPr>
             <w:rStyle w:val="Hyperlink"/>
@@ -7659,8 +7659,8 @@
         </w:r>
       </w:hyperlink>
     </w:p>
-    <w:bookmarkEnd w:id="137"/>
-    <w:bookmarkStart w:id="139" w:name="Xb0421be95a139ca5af39ce6040517bf1be79427"/>
+    <w:bookmarkEnd w:id="134"/>
+    <w:bookmarkStart w:id="136" w:name="Xb0421be95a139ca5af39ce6040517bf1be79427"/>
     <w:p>
       <w:pPr>
         <w:pStyle w:val="Bibliography"/>
@@ -7683,7 +7683,7 @@
       <w:r>
         <w:t xml:space="preserve"> </w:t>
       </w:r>
-      <w:hyperlink r:id="rId138">
+      <w:hyperlink r:id="rId135">
         <w:r>
           <w:rPr>
             <w:rStyle w:val="Hyperlink"/>
@@ -7692,8 +7692,8 @@
         </w:r>
       </w:hyperlink>
     </w:p>
-    <w:bookmarkEnd w:id="139"/>
-    <w:bookmarkStart w:id="141" w:name="X716dc31ca13dac7355fea3a0f7dea95779ecabb"/>
+    <w:bookmarkEnd w:id="136"/>
+    <w:bookmarkStart w:id="138" w:name="X716dc31ca13dac7355fea3a0f7dea95779ecabb"/>
     <w:p>
       <w:pPr>
         <w:pStyle w:val="Bibliography"/>
@@ -7722,7 +7722,7 @@
       <w:r>
         <w:t xml:space="preserve"> </w:t>
       </w:r>
-      <w:hyperlink r:id="rId140">
+      <w:hyperlink r:id="rId137">
         <w:r>
           <w:rPr>
             <w:rStyle w:val="Hyperlink"/>
@@ -7731,8 +7731,8 @@
         </w:r>
       </w:hyperlink>
     </w:p>
-    <w:bookmarkEnd w:id="141"/>
-    <w:bookmarkStart w:id="143" w:name="ref-roy2013EffectModificationTransferrin"/>
+    <w:bookmarkEnd w:id="138"/>
+    <w:bookmarkStart w:id="140" w:name="ref-roy2013EffectModificationTransferrin"/>
     <w:p>
       <w:pPr>
         <w:pStyle w:val="Bibliography"/>
@@ -7764,7 +7764,7 @@
       <w:r>
         <w:t xml:space="preserve"> </w:t>
       </w:r>
-      <w:hyperlink r:id="rId142">
+      <w:hyperlink r:id="rId139">
         <w:r>
           <w:rPr>
             <w:rStyle w:val="Hyperlink"/>
@@ -7773,8 +7773,8 @@
         </w:r>
       </w:hyperlink>
     </w:p>
-    <w:bookmarkEnd w:id="143"/>
-    <w:bookmarkStart w:id="145" w:name="ref-dantzer2020ComparisonBloodToenails"/>
+    <w:bookmarkEnd w:id="140"/>
+    <w:bookmarkStart w:id="142" w:name="ref-dantzer2020ComparisonBloodToenails"/>
     <w:p>
       <w:pPr>
         <w:pStyle w:val="Bibliography"/>
@@ -7785,7 +7785,7 @@
       <w:r>
         <w:t xml:space="preserve"> </w:t>
       </w:r>
-      <w:hyperlink r:id="rId144">
+      <w:hyperlink r:id="rId141">
         <w:r>
           <w:rPr>
             <w:rStyle w:val="Hyperlink"/>
@@ -7794,8 +7794,8 @@
         </w:r>
       </w:hyperlink>
     </w:p>
-    <w:bookmarkEnd w:id="145"/>
-    <w:bookmarkStart w:id="147" w:name="X6bc65313eadd1b86059eb4ba10c8cf9d91be17d"/>
+    <w:bookmarkEnd w:id="142"/>
+    <w:bookmarkStart w:id="144" w:name="X6bc65313eadd1b86059eb4ba10c8cf9d91be17d"/>
     <w:p>
       <w:pPr>
         <w:pStyle w:val="Bibliography"/>
@@ -7830,7 +7830,7 @@
       <w:r>
         <w:t xml:space="preserve"> </w:t>
       </w:r>
-      <w:hyperlink r:id="rId146">
+      <w:hyperlink r:id="rId143">
         <w:r>
           <w:rPr>
             <w:rStyle w:val="Hyperlink"/>
@@ -7839,8 +7839,8 @@
         </w:r>
       </w:hyperlink>
     </w:p>
-    <w:bookmarkEnd w:id="147"/>
-    <w:bookmarkStart w:id="149" w:name="ref-lee2021PrenatalPostnatalExposures"/>
+    <w:bookmarkEnd w:id="144"/>
+    <w:bookmarkStart w:id="146" w:name="ref-lee2021PrenatalPostnatalExposures"/>
     <w:p>
       <w:pPr>
         <w:pStyle w:val="Bibliography"/>
@@ -7884,7 +7884,7 @@
       <w:r>
         <w:t xml:space="preserve"> </w:t>
       </w:r>
-      <w:hyperlink r:id="rId148">
+      <w:hyperlink r:id="rId145">
         <w:r>
           <w:rPr>
             <w:rStyle w:val="Hyperlink"/>
@@ -7893,8 +7893,8 @@
         </w:r>
       </w:hyperlink>
     </w:p>
-    <w:bookmarkEnd w:id="149"/>
-    <w:bookmarkStart w:id="150" w:name="X33fe7de6e8b65c86af337dbdb8d7cc8651c48a8"/>
+    <w:bookmarkEnd w:id="146"/>
+    <w:bookmarkStart w:id="147" w:name="X33fe7de6e8b65c86af337dbdb8d7cc8651c48a8"/>
     <w:p>
       <w:pPr>
         <w:pStyle w:val="Bibliography"/>
@@ -7960,8 +7960,8 @@
         <w:t xml:space="preserve">. Int J Environ Res Public Health. 2018;15:2418.</w:t>
       </w:r>
     </w:p>
-    <w:bookmarkEnd w:id="150"/>
-    <w:bookmarkStart w:id="152" w:name="ref-smith2018StepAwayStepwise"/>
+    <w:bookmarkEnd w:id="147"/>
+    <w:bookmarkStart w:id="149" w:name="ref-smith2018StepAwayStepwise"/>
     <w:p>
       <w:pPr>
         <w:pStyle w:val="Bibliography"/>
@@ -7972,7 +7972,7 @@
       <w:r>
         <w:t xml:space="preserve"> </w:t>
       </w:r>
-      <w:hyperlink r:id="rId151">
+      <w:hyperlink r:id="rId148">
         <w:r>
           <w:rPr>
             <w:rStyle w:val="Hyperlink"/>
@@ -7981,8 +7981,8 @@
         </w:r>
       </w:hyperlink>
     </w:p>
-    <w:bookmarkEnd w:id="152"/>
-    <w:bookmarkStart w:id="154" w:name="ref-kazi2026PvaluesBayesFactor"/>
+    <w:bookmarkEnd w:id="149"/>
+    <w:bookmarkStart w:id="151" w:name="ref-kazi2026PvaluesBayesFactor"/>
     <w:p>
       <w:pPr>
         <w:pStyle w:val="Bibliography"/>
@@ -8023,7 +8023,7 @@
       <w:r>
         <w:t xml:space="preserve"> </w:t>
       </w:r>
-      <w:hyperlink r:id="rId153">
+      <w:hyperlink r:id="rId150">
         <w:r>
           <w:rPr>
             <w:rStyle w:val="Hyperlink"/>
@@ -8032,8 +8032,8 @@
         </w:r>
       </w:hyperlink>
     </w:p>
-    <w:bookmarkEnd w:id="154"/>
-    <w:bookmarkStart w:id="156" w:name="X946754e67e3c74fad7a8806aa9d2819ed4ec186"/>
+    <w:bookmarkEnd w:id="151"/>
+    <w:bookmarkStart w:id="153" w:name="X946754e67e3c74fad7a8806aa9d2819ed4ec186"/>
     <w:p>
       <w:pPr>
         <w:pStyle w:val="Bibliography"/>
@@ -8044,7 +8044,7 @@
       <w:r>
         <w:t xml:space="preserve"> </w:t>
       </w:r>
-      <w:hyperlink r:id="rId155">
+      <w:hyperlink r:id="rId152">
         <w:r>
           <w:rPr>
             <w:rStyle w:val="Hyperlink"/>
@@ -8053,8 +8053,8 @@
         </w:r>
       </w:hyperlink>
     </w:p>
-    <w:bookmarkEnd w:id="156"/>
-    <w:bookmarkStart w:id="158" w:name="ref-ciyer2025BayesianMetaanalysis21st"/>
+    <w:bookmarkEnd w:id="153"/>
+    <w:bookmarkStart w:id="155" w:name="ref-ciyer2025BayesianMetaanalysis21st"/>
     <w:p>
       <w:pPr>
         <w:pStyle w:val="Bibliography"/>
@@ -8077,7 +8077,7 @@
       <w:r>
         <w:t xml:space="preserve"> </w:t>
       </w:r>
-      <w:hyperlink r:id="rId157">
+      <w:hyperlink r:id="rId154">
         <w:r>
           <w:rPr>
             <w:rStyle w:val="Hyperlink"/>
@@ -8086,8 +8086,8 @@
         </w:r>
       </w:hyperlink>
     </w:p>
-    <w:bookmarkEnd w:id="158"/>
-    <w:bookmarkStart w:id="160" w:name="ref-hong2013ComparingBayesianFrequentist"/>
+    <w:bookmarkEnd w:id="155"/>
+    <w:bookmarkStart w:id="157" w:name="ref-hong2013ComparingBayesianFrequentist"/>
     <w:p>
       <w:pPr>
         <w:pStyle w:val="Bibliography"/>
@@ -8131,7 +8131,7 @@
       <w:r>
         <w:t xml:space="preserve"> </w:t>
       </w:r>
-      <w:hyperlink r:id="rId159">
+      <w:hyperlink r:id="rId156">
         <w:r>
           <w:rPr>
             <w:rStyle w:val="Hyperlink"/>
@@ -8140,8 +8140,8 @@
         </w:r>
       </w:hyperlink>
     </w:p>
-    <w:bookmarkEnd w:id="160"/>
-    <w:bookmarkStart w:id="162" w:name="ref-sadeghirad2023TheoryPracticeBayesian"/>
+    <w:bookmarkEnd w:id="157"/>
+    <w:bookmarkStart w:id="159" w:name="ref-sadeghirad2023TheoryPracticeBayesian"/>
     <w:p>
       <w:pPr>
         <w:pStyle w:val="Bibliography"/>
@@ -8164,7 +8164,7 @@
       <w:r>
         <w:t xml:space="preserve"> </w:t>
       </w:r>
-      <w:hyperlink r:id="rId161">
+      <w:hyperlink r:id="rId158">
         <w:r>
           <w:rPr>
             <w:rStyle w:val="Hyperlink"/>
@@ -8173,8 +8173,8 @@
         </w:r>
       </w:hyperlink>
     </w:p>
-    <w:bookmarkEnd w:id="162"/>
-    <w:bookmarkStart w:id="164" w:name="X55ae1a8b757df519e0a47e2002b3acc0b2e73ec"/>
+    <w:bookmarkEnd w:id="159"/>
+    <w:bookmarkStart w:id="161" w:name="X55ae1a8b757df519e0a47e2002b3acc0b2e73ec"/>
     <w:p>
       <w:pPr>
         <w:pStyle w:val="Bibliography"/>
@@ -8197,7 +8197,7 @@
       <w:r>
         <w:t xml:space="preserve"> </w:t>
       </w:r>
-      <w:hyperlink r:id="rId163">
+      <w:hyperlink r:id="rId160">
         <w:r>
           <w:rPr>
             <w:rStyle w:val="Hyperlink"/>
@@ -8206,8 +8206,8 @@
         </w:r>
       </w:hyperlink>
     </w:p>
-    <w:bookmarkEnd w:id="164"/>
-    <w:bookmarkStart w:id="166" w:name="ref-gelman2013Chapter4Asymptotics"/>
+    <w:bookmarkEnd w:id="161"/>
+    <w:bookmarkStart w:id="163" w:name="ref-gelman2013Chapter4Asymptotics"/>
     <w:p>
       <w:pPr>
         <w:pStyle w:val="Bibliography"/>
@@ -8257,7 +8257,7 @@
       <w:r>
         <w:t xml:space="preserve"> </w:t>
       </w:r>
-      <w:hyperlink r:id="rId165">
+      <w:hyperlink r:id="rId162">
         <w:r>
           <w:rPr>
             <w:rStyle w:val="Hyperlink"/>
@@ -8266,8 +8266,8 @@
         </w:r>
       </w:hyperlink>
     </w:p>
-    <w:bookmarkEnd w:id="166"/>
-    <w:bookmarkStart w:id="168" w:name="ref-gelman2020BayesianWorkflow"/>
+    <w:bookmarkEnd w:id="163"/>
+    <w:bookmarkStart w:id="165" w:name="ref-gelman2020BayesianWorkflow"/>
     <w:p>
       <w:pPr>
         <w:pStyle w:val="Bibliography"/>
@@ -8287,7 +8287,7 @@
       <w:r>
         <w:t xml:space="preserve"> </w:t>
       </w:r>
-      <w:hyperlink r:id="rId167">
+      <w:hyperlink r:id="rId164">
         <w:r>
           <w:rPr>
             <w:rStyle w:val="Hyperlink"/>
@@ -8296,8 +8296,8 @@
         </w:r>
       </w:hyperlink>
     </w:p>
-    <w:bookmarkEnd w:id="168"/>
-    <w:bookmarkStart w:id="169" w:name="Xd915bcb040430c17655975a5ceb4d7b4bdd04ac"/>
+    <w:bookmarkEnd w:id="165"/>
+    <w:bookmarkStart w:id="166" w:name="Xd915bcb040430c17655975a5ceb4d7b4bdd04ac"/>
     <w:p>
       <w:pPr>
         <w:pStyle w:val="Bibliography"/>
@@ -8306,8 +8306,8 @@
         <w:t xml:space="preserve">61. Prüss-Üstün A, Mathers C, Corvalán C, Woodward A. Assessing the environmental burden of disease at national and local levels: Introduction and methods. Environ burd dis ser. 2003;</w:t>
       </w:r>
     </w:p>
-    <w:bookmarkEnd w:id="169"/>
-    <w:bookmarkStart w:id="171" w:name="ref-goodman2023SexDifferencePre"/>
+    <w:bookmarkEnd w:id="166"/>
+    <w:bookmarkStart w:id="168" w:name="ref-goodman2023SexDifferencePre"/>
     <w:p>
       <w:pPr>
         <w:pStyle w:val="Bibliography"/>
@@ -8318,7 +8318,7 @@
       <w:r>
         <w:t xml:space="preserve"> </w:t>
       </w:r>
-      <w:hyperlink r:id="rId170">
+      <w:hyperlink r:id="rId167">
         <w:r>
           <w:rPr>
             <w:rStyle w:val="Hyperlink"/>
@@ -8327,8 +8327,8 @@
         </w:r>
       </w:hyperlink>
     </w:p>
-    <w:bookmarkEnd w:id="171"/>
-    <w:bookmarkStart w:id="173" w:name="ref-pocock1994EnvironmentalLeadChildrens"/>
+    <w:bookmarkEnd w:id="168"/>
+    <w:bookmarkStart w:id="170" w:name="ref-pocock1994EnvironmentalLeadChildrens"/>
     <w:p>
       <w:pPr>
         <w:pStyle w:val="Bibliography"/>
@@ -8339,7 +8339,7 @@
       <w:r>
         <w:t xml:space="preserve"> </w:t>
       </w:r>
-      <w:hyperlink r:id="rId172">
+      <w:hyperlink r:id="rId169">
         <w:r>
           <w:rPr>
             <w:rStyle w:val="Hyperlink"/>
@@ -8348,8 +8348,8 @@
         </w:r>
       </w:hyperlink>
     </w:p>
-    <w:bookmarkEnd w:id="173"/>
-    <w:bookmarkStart w:id="175" w:name="ref-heidari2022EffectLeadExposurea"/>
+    <w:bookmarkEnd w:id="170"/>
+    <w:bookmarkStart w:id="172" w:name="ref-heidari2022EffectLeadExposurea"/>
     <w:p>
       <w:pPr>
         <w:pStyle w:val="Bibliography"/>
@@ -8372,7 +8372,7 @@
       <w:r>
         <w:t xml:space="preserve"> </w:t>
       </w:r>
-      <w:hyperlink r:id="rId174">
+      <w:hyperlink r:id="rId171">
         <w:r>
           <w:rPr>
             <w:rStyle w:val="Hyperlink"/>
@@ -8381,8 +8381,8 @@
         </w:r>
       </w:hyperlink>
     </w:p>
-    <w:bookmarkEnd w:id="175"/>
-    <w:bookmarkStart w:id="177" w:name="X99fa6bd9cd2521340285769f289a6c9d4bfe17b"/>
+    <w:bookmarkEnd w:id="172"/>
+    <w:bookmarkStart w:id="174" w:name="X99fa6bd9cd2521340285769f289a6c9d4bfe17b"/>
     <w:p>
       <w:pPr>
         <w:pStyle w:val="Bibliography"/>
@@ -8426,7 +8426,7 @@
       <w:r>
         <w:t xml:space="preserve"> </w:t>
       </w:r>
-      <w:hyperlink r:id="rId176">
+      <w:hyperlink r:id="rId173">
         <w:r>
           <w:rPr>
             <w:rStyle w:val="Hyperlink"/>
@@ -8435,8 +8435,8 @@
         </w:r>
       </w:hyperlink>
     </w:p>
-    <w:bookmarkEnd w:id="177"/>
-    <w:bookmarkStart w:id="179" w:name="Xec30ec7c912152a14c0f622040312567154bf15"/>
+    <w:bookmarkEnd w:id="174"/>
+    <w:bookmarkStart w:id="176" w:name="Xec30ec7c912152a14c0f622040312567154bf15"/>
     <w:p>
       <w:pPr>
         <w:pStyle w:val="Bibliography"/>
@@ -8507,7 +8507,7 @@
       <w:r>
         <w:t xml:space="preserve"> </w:t>
       </w:r>
-      <w:hyperlink r:id="rId178">
+      <w:hyperlink r:id="rId175">
         <w:r>
           <w:rPr>
             <w:rStyle w:val="Hyperlink"/>
@@ -8516,21 +8516,13 @@
         </w:r>
       </w:hyperlink>
     </w:p>
-    <w:bookmarkEnd w:id="179"/>
-    <w:bookmarkEnd w:id="180"/>
-    <w:bookmarkEnd w:id="181"/>
+    <w:bookmarkEnd w:id="176"/>
+    <w:bookmarkEnd w:id="177"/>
+    <w:bookmarkEnd w:id="178"/>
     <w:sectPr>
-      <w:footerReference r:id="rId3" w:type="default"/>
       <w:footnotePr>
-        <w:numFmt w:val="decimal"/>
+        <w:numRestart w:val="eachSect"/>
       </w:footnotePr>
-      <w:type w:val="nextPage"/>
-      <w:pgSz w:h="15840" w:w="12240"/>
-      <w:pgMar w:bottom="2199" w:footer="1440" w:gutter="0" w:header="0" w:left="1440" w:right="1440" w:top="1440"/>
-      <w:pgNumType w:fmt="decimal"/>
-      <w:formProt w:val="false"/>
-      <w:textDirection w:val="lrTb"/>
-      <w:docGrid w:charSpace="0" w:linePitch="100" w:type="default"/>
     </w:sectPr>
   </w:body>
 </w:document>
@@ -8538,40 +8530,6 @@
 
 <file path=word/comments.xml><?xml version="1.0" encoding="utf-8"?>
 <w:comments xmlns:w="http://schemas.openxmlformats.org/wordprocessingml/2006/main" xmlns:m="http://schemas.openxmlformats.org/officeDocument/2006/math" xmlns:r="http://schemas.openxmlformats.org/officeDocument/2006/relationships" xmlns:o="urn:schemas-microsoft-com:office:office" xmlns:v="urn:schemas-microsoft-com:vml" xmlns:w10="urn:schemas-microsoft-com:office:word" xmlns:a="http://schemas.openxmlformats.org/drawingml/2006/main" xmlns:pic="http://schemas.openxmlformats.org/drawingml/2006/picture" xmlns:wp="http://schemas.openxmlformats.org/drawingml/2006/wordprocessingDrawing"/>
-</file>
-
-<file path=word/footer1.xml><?xml version="1.0" encoding="utf-8"?>
-<w:ftr xmlns:o="urn:schemas-microsoft-com:office:office" xmlns:r="http://schemas.openxmlformats.org/officeDocument/2006/relationships" xmlns:v="urn:schemas-microsoft-com:vml" xmlns:w="http://schemas.openxmlformats.org/wordprocessingml/2006/main" xmlns:w10="urn:schemas-microsoft-com:office:word" xmlns:wp="http://schemas.openxmlformats.org/drawingml/2006/wordprocessingDrawing" xmlns:wps="http://schemas.microsoft.com/office/word/2010/wordprocessingShape" xmlns:wpg="http://schemas.microsoft.com/office/word/2010/wordprocessingGroup" xmlns:mc="http://schemas.openxmlformats.org/markup-compatibility/2006" xmlns:wp14="http://schemas.microsoft.com/office/word/2010/wordprocessingDrawing" xmlns:w14="http://schemas.microsoft.com/office/word/2010/wordml" xmlns:w15="http://schemas.microsoft.com/office/word/2012/wordml" mc:Ignorable="w14 wp14 w15">
-  <w:p>
-    <w:pPr>
-      <w:pStyle w:val="Footer"/>
-      <w:suppressLineNumbers/>
-      <w:spacing w:before="0" w:after="200"/>
-      <w:jc w:val="right"/>
-      <w:rPr/>
-    </w:pPr>
-    <w:r>
-      <w:rPr/>
-      <w:fldChar w:fldCharType="begin"/>
-    </w:r>
-    <w:r>
-      <w:rPr/>
-      <w:instrText xml:space="preserve"> PAGE </w:instrText>
-    </w:r>
-    <w:r>
-      <w:rPr/>
-      <w:fldChar w:fldCharType="separate"/>
-    </w:r>
-    <w:r>
-      <w:rPr/>
-      <w:t>1</w:t>
-    </w:r>
-    <w:r>
-      <w:rPr/>
-      <w:fldChar w:fldCharType="end"/>
-    </w:r>
-  </w:p>
-</w:ftr>
 </file>
 
 <file path=word/footnotes.xml><?xml version="1.0" encoding="utf-8"?>
@@ -8784,19 +8742,19 @@
 </file>
 
 <file path=word/styles.xml><?xml version="1.0" encoding="utf-8"?>
-<w:styles xmlns:mc="http://schemas.openxmlformats.org/markup-compatibility/2006" xmlns:w="http://schemas.openxmlformats.org/wordprocessingml/2006/main" xmlns:w14="http://schemas.microsoft.com/office/word/2010/wordml" mc:Ignorable="w14">
+<w:styles xmlns:r="http://schemas.openxmlformats.org/officeDocument/2006/relationships" xmlns:w="http://schemas.openxmlformats.org/wordprocessingml/2006/main">
   <w:docDefaults>
     <w:rPrDefault>
       <w:rPr>
-        <w:rFonts w:ascii="Aptos" w:asciiTheme="minorHAnsi" w:cs="" w:cstheme="minorBidi" w:eastAsia="Aptos" w:eastAsiaTheme="minorHAnsi" w:hAnsi="Aptos" w:hAnsiTheme="minorHAnsi"/>
+        <w:rFonts w:asciiTheme="minorHAnsi" w:cstheme="minorBidi" w:eastAsiaTheme="minorEastAsia" w:hAnsiTheme="minorHAnsi"/>
         <w:sz w:val="24"/>
         <w:szCs w:val="24"/>
-        <w:lang w:bidi="ar-SA" w:eastAsia="en-US" w:val="en-US"/>
+        <w:lang w:bidi="ar-SA" w:eastAsia="zh-CN" w:val="en-US"/>
       </w:rPr>
     </w:rPrDefault>
     <w:pPrDefault>
       <w:pPr>
-        <w:suppressAutoHyphens w:val="true"/>
+        <w:spacing w:after="200"/>
       </w:pPr>
     </w:pPrDefault>
   </w:docDefaults>
@@ -8804,45 +8762,186 @@
   <w:style w:default="1" w:styleId="Normal" w:type="paragraph">
     <w:name w:val="Normal"/>
     <w:qFormat/>
+  </w:style>
+  <w:style w:styleId="BodyText" w:type="paragraph">
+    <w:name w:val="Body Text"/>
+    <w:basedOn w:val="Normal"/>
+    <w:link w:val="BodyTextChar"/>
+    <w:qFormat/>
     <w:pPr>
-      <w:widowControl/>
-      <w:suppressAutoHyphens w:val="true"/>
-      <w:bidi w:val="0"/>
-      <w:spacing w:after="200" w:before="0"/>
-      <w:jc w:val="left"/>
+      <w:spacing w:after="180" w:before="180"/>
+    </w:pPr>
+  </w:style>
+  <w:style w:customStyle="1" w:styleId="FirstParagraph" w:type="paragraph">
+    <w:name w:val="First Paragraph"/>
+    <w:basedOn w:val="BodyText"/>
+    <w:next w:val="BodyText"/>
+    <w:qFormat/>
+  </w:style>
+  <w:style w:customStyle="1" w:styleId="Compact" w:type="paragraph">
+    <w:name w:val="Compact"/>
+    <w:basedOn w:val="BodyText"/>
+    <w:qFormat/>
+    <w:pPr>
+      <w:spacing w:after="36" w:before="36"/>
+    </w:pPr>
+  </w:style>
+  <w:style w:styleId="Title" w:type="paragraph">
+    <w:name w:val="Title"/>
+    <w:basedOn w:val="Normal"/>
+    <w:next w:val="BodyText"/>
+    <w:link w:val="TitleChar"/>
+    <w:uiPriority w:val="10"/>
+    <w:qFormat/>
+    <w:rsid w:val="00A10FD9"/>
+    <w:pPr>
+      <w:spacing w:after="80" w:line="240" w:lineRule="auto"/>
+      <w:contextualSpacing/>
+      <w:jc w:val="center"/>
     </w:pPr>
     <w:rPr>
-      <w:rFonts w:ascii="Aptos" w:asciiTheme="minorHAnsi" w:cs="" w:cstheme="minorBidi" w:eastAsia="Aptos" w:eastAsiaTheme="minorHAnsi" w:hAnsi="Aptos" w:hAnsiTheme="minorHAnsi"/>
-      <w:color w:val="auto"/>
-      <w:kern w:val="0"/>
+      <w:rFonts w:asciiTheme="majorHAnsi" w:cstheme="majorBidi" w:eastAsiaTheme="majorEastAsia" w:hAnsiTheme="majorHAnsi"/>
+      <w:sz w:val="56"/>
+      <w:szCs w:val="56"/>
+    </w:rPr>
+  </w:style>
+  <w:style w:customStyle="1" w:styleId="TitleChar" w:type="character">
+    <w:name w:val="Title Char"/>
+    <w:basedOn w:val="DefaultParagraphFont"/>
+    <w:link w:val="Title"/>
+    <w:uiPriority w:val="10"/>
+    <w:rsid w:val="00A10FD9"/>
+    <w:rPr>
+      <w:rFonts w:asciiTheme="majorHAnsi" w:cstheme="majorBidi" w:eastAsiaTheme="majorEastAsia" w:hAnsiTheme="majorHAnsi"/>
+      <w:sz w:val="56"/>
+      <w:szCs w:val="56"/>
+    </w:rPr>
+  </w:style>
+  <w:style w:styleId="Subtitle" w:type="paragraph">
+    <w:name w:val="Subtitle"/>
+    <w:basedOn w:val="Title"/>
+    <w:next w:val="BodyText"/>
+    <w:link w:val="SubtitleChar"/>
+    <w:uiPriority w:val="11"/>
+    <w:qFormat/>
+    <w:rsid w:val="00A10FD9"/>
+    <w:pPr>
+      <w:numPr>
+        <w:ilvl w:val="1"/>
+      </w:numPr>
+    </w:pPr>
+    <w:rPr>
+      <w:rFonts w:cstheme="majorBidi" w:eastAsiaTheme="majorEastAsia"/>
+      <w:spacing w:val="15"/>
+      <w:sz w:val="28"/>
+      <w:szCs w:val="28"/>
+    </w:rPr>
+  </w:style>
+  <w:style w:customStyle="1" w:styleId="SubtitleChar" w:type="character">
+    <w:name w:val="Subtitle Char"/>
+    <w:basedOn w:val="DefaultParagraphFont"/>
+    <w:link w:val="Subtitle"/>
+    <w:uiPriority w:val="11"/>
+    <w:rsid w:val="00A10FD9"/>
+    <w:rPr>
+      <w:rFonts w:cstheme="majorBidi" w:eastAsiaTheme="majorEastAsia"/>
+      <w:color w:themeColor="text1" w:themeTint="A6" w:val="595959"/>
+      <w:spacing w:val="15"/>
+      <w:sz w:val="28"/>
+      <w:szCs w:val="28"/>
+    </w:rPr>
+  </w:style>
+  <w:style w:customStyle="1" w:styleId="Author" w:type="paragraph">
+    <w:name w:val="Author"/>
+    <w:basedOn w:val="Title"/>
+    <w:next w:val="BodyText"/>
+    <w:qFormat/>
+    <w:pPr>
+      <w:keepNext/>
+      <w:keepLines/>
+    </w:pPr>
+    <w:rPr>
       <w:sz w:val="24"/>
       <w:szCs w:val="24"/>
-      <w:lang w:bidi="ar-SA" w:eastAsia="en-US" w:val="en-US"/>
     </w:rPr>
   </w:style>
+  <w:style w:styleId="Date" w:type="paragraph">
+    <w:name w:val="Date"/>
+    <w:basedOn w:val="Title"/>
+    <w:next w:val="BodyText"/>
+    <w:qFormat/>
+    <w:pPr>
+      <w:keepNext/>
+      <w:keepLines/>
+    </w:pPr>
+    <w:rPr>
+      <w:sz w:val="24"/>
+      <w:szCs w:val="24"/>
+    </w:rPr>
+  </w:style>
+  <w:style w:customStyle="1" w:styleId="AbstractTitle" w:type="paragraph">
+    <w:name w:val="Abstract Title"/>
+    <w:basedOn w:val="Normal"/>
+    <w:next w:val="Abstract"/>
+    <w:qFormat/>
+    <w:pPr>
+      <w:keepNext/>
+      <w:keepLines/>
+      <w:spacing w:after="0" w:before="300"/>
+      <w:jc w:val="center"/>
+    </w:pPr>
+    <w:rPr>
+      <w:b/>
+      <w:sz w:val="20"/>
+      <w:szCs w:val="20"/>
+    </w:rPr>
+  </w:style>
+  <w:style w:customStyle="1" w:styleId="Abstract" w:type="paragraph">
+    <w:name w:val="Abstract"/>
+    <w:basedOn w:val="Normal"/>
+    <w:next w:val="BodyText"/>
+    <w:qFormat/>
+    <w:pPr>
+      <w:keepNext/>
+      <w:keepLines/>
+      <w:spacing w:after="300" w:before="100"/>
+    </w:pPr>
+    <w:rPr>
+      <w:sz w:val="20"/>
+      <w:szCs w:val="20"/>
+    </w:rPr>
+  </w:style>
+  <w:style w:styleId="Bibliography" w:type="paragraph">
+    <w:name w:val="Bibliography"/>
+    <w:basedOn w:val="Normal"/>
+    <w:next w:val="Bibliography"/>
+    <w:qFormat/>
+    <w:pPr/>
+    <w:rPr/>
+  </w:style>
   <w:style w:styleId="Heading1" w:type="paragraph">
-    <w:name w:val="Heading 1"/>
+    <w:name w:val="heading 1"/>
     <w:basedOn w:val="Normal"/>
     <w:next w:val="BodyText"/>
     <w:link w:val="Heading1Char"/>
     <w:uiPriority w:val="9"/>
     <w:qFormat/>
-    <w:rsid w:val="00a10fd9"/>
+    <w:rsid w:val="00A10FD9"/>
     <w:pPr>
-      <w:keepNext w:val="true"/>
+      <w:keepNext/>
       <w:keepLines/>
       <w:spacing w:after="80" w:before="360"/>
       <w:outlineLvl w:val="0"/>
     </w:pPr>
     <w:rPr>
-      <w:rFonts w:ascii="Aptos Display" w:asciiTheme="majorHAnsi" w:cs="" w:cstheme="majorBidi" w:eastAsia="" w:eastAsiaTheme="majorEastAsia" w:hAnsi="Aptos Display" w:hAnsiTheme="majorHAnsi"/>
-      <w:color w:val="000000"/>
+      <w:rFonts w:asciiTheme="majorHAnsi" w:cstheme="majorBidi" w:eastAsiaTheme="majorEastAsia" w:hAnsiTheme="majorHAnsi"/>
+      <w:color w:themeColor="accent1" w:themeShade="BF" w:val="0F4761"/>
       <w:sz w:val="40"/>
       <w:szCs w:val="40"/>
     </w:rPr>
   </w:style>
   <w:style w:styleId="Heading2" w:type="paragraph">
-    <w:name w:val="Heading 2"/>
+    <w:name w:val="heading 2"/>
     <w:basedOn w:val="Normal"/>
     <w:next w:val="BodyText"/>
     <w:link w:val="Heading2Char"/>
@@ -8850,22 +8949,22 @@
     <w:semiHidden/>
     <w:unhideWhenUsed/>
     <w:qFormat/>
-    <w:rsid w:val="00a10fd9"/>
+    <w:rsid w:val="00A10FD9"/>
     <w:pPr>
-      <w:keepNext w:val="true"/>
+      <w:keepNext/>
       <w:keepLines/>
       <w:spacing w:after="80" w:before="160"/>
       <w:outlineLvl w:val="1"/>
     </w:pPr>
     <w:rPr>
-      <w:rFonts w:ascii="Aptos Display" w:asciiTheme="majorHAnsi" w:cs="" w:cstheme="majorBidi" w:eastAsia="" w:eastAsiaTheme="majorEastAsia" w:hAnsi="Aptos Display" w:hAnsiTheme="majorHAnsi"/>
-      <w:color w:val="000000"/>
+      <w:rFonts w:asciiTheme="majorHAnsi" w:cstheme="majorBidi" w:eastAsiaTheme="majorEastAsia" w:hAnsiTheme="majorHAnsi"/>
+      <w:color w:themeColor="accent1" w:themeShade="BF" w:val="0F4761"/>
       <w:sz w:val="32"/>
       <w:szCs w:val="32"/>
     </w:rPr>
   </w:style>
   <w:style w:styleId="Heading3" w:type="paragraph">
-    <w:name w:val="Heading 3"/>
+    <w:name w:val="heading 3"/>
     <w:basedOn w:val="Normal"/>
     <w:next w:val="BodyText"/>
     <w:link w:val="Heading3Char"/>
@@ -8873,22 +8972,22 @@
     <w:semiHidden/>
     <w:unhideWhenUsed/>
     <w:qFormat/>
-    <w:rsid w:val="00a10fd9"/>
+    <w:rsid w:val="00A10FD9"/>
     <w:pPr>
-      <w:keepNext w:val="true"/>
+      <w:keepNext/>
       <w:keepLines/>
       <w:spacing w:after="80" w:before="160"/>
       <w:outlineLvl w:val="2"/>
     </w:pPr>
     <w:rPr>
-      <w:rFonts w:cs="" w:cstheme="majorBidi" w:eastAsia="" w:eastAsiaTheme="majorEastAsia"/>
-      <w:color w:val="000000"/>
+      <w:rFonts w:cstheme="majorBidi" w:eastAsiaTheme="majorEastAsia"/>
+      <w:color w:themeColor="accent1" w:themeShade="BF" w:val="0F4761"/>
       <w:sz w:val="28"/>
       <w:szCs w:val="28"/>
     </w:rPr>
   </w:style>
   <w:style w:styleId="Heading4" w:type="paragraph">
-    <w:name w:val="Heading 4"/>
+    <w:name w:val="heading 4"/>
     <w:basedOn w:val="Normal"/>
     <w:next w:val="BodyText"/>
     <w:link w:val="Heading4Char"/>
@@ -8896,22 +8995,22 @@
     <w:semiHidden/>
     <w:unhideWhenUsed/>
     <w:qFormat/>
-    <w:rsid w:val="00a10fd9"/>
+    <w:rsid w:val="00A10FD9"/>
     <w:pPr>
-      <w:keepNext w:val="true"/>
+      <w:keepNext/>
       <w:keepLines/>
       <w:spacing w:after="40" w:before="80"/>
       <w:outlineLvl w:val="3"/>
     </w:pPr>
     <w:rPr>
-      <w:rFonts w:cs="" w:cstheme="majorBidi" w:eastAsia="" w:eastAsiaTheme="majorEastAsia"/>
+      <w:rFonts w:cstheme="majorBidi" w:eastAsiaTheme="majorEastAsia"/>
       <w:i/>
       <w:iCs/>
-      <w:color w:themeColor="accent1" w:themeShade="bf" w:val="0F4761"/>
+      <w:color w:themeColor="accent1" w:themeShade="BF" w:val="0F4761"/>
     </w:rPr>
   </w:style>
   <w:style w:styleId="Heading5" w:type="paragraph">
-    <w:name w:val="Heading 5"/>
+    <w:name w:val="heading 5"/>
     <w:basedOn w:val="Normal"/>
     <w:next w:val="BodyText"/>
     <w:link w:val="Heading5Char"/>
@@ -8919,20 +9018,20 @@
     <w:semiHidden/>
     <w:unhideWhenUsed/>
     <w:qFormat/>
-    <w:rsid w:val="00a10fd9"/>
+    <w:rsid w:val="00A10FD9"/>
     <w:pPr>
-      <w:keepNext w:val="true"/>
+      <w:keepNext/>
       <w:keepLines/>
       <w:spacing w:after="40" w:before="80"/>
       <w:outlineLvl w:val="4"/>
     </w:pPr>
     <w:rPr>
-      <w:rFonts w:cs="" w:cstheme="majorBidi" w:eastAsia="" w:eastAsiaTheme="majorEastAsia"/>
-      <w:color w:themeColor="accent1" w:themeShade="bf" w:val="0F4761"/>
+      <w:rFonts w:cstheme="majorBidi" w:eastAsiaTheme="majorEastAsia"/>
+      <w:color w:themeColor="accent1" w:themeShade="BF" w:val="0F4761"/>
     </w:rPr>
   </w:style>
   <w:style w:styleId="Heading6" w:type="paragraph">
-    <w:name w:val="Heading 6"/>
+    <w:name w:val="heading 6"/>
     <w:basedOn w:val="Normal"/>
     <w:next w:val="BodyText"/>
     <w:link w:val="Heading6Char"/>
@@ -8940,22 +9039,22 @@
     <w:semiHidden/>
     <w:unhideWhenUsed/>
     <w:qFormat/>
-    <w:rsid w:val="00a10fd9"/>
+    <w:rsid w:val="00A10FD9"/>
     <w:pPr>
-      <w:keepNext w:val="true"/>
+      <w:keepNext/>
       <w:keepLines/>
       <w:spacing w:after="0" w:before="40"/>
       <w:outlineLvl w:val="5"/>
     </w:pPr>
     <w:rPr>
-      <w:rFonts w:cs="" w:cstheme="majorBidi" w:eastAsia="" w:eastAsiaTheme="majorEastAsia"/>
+      <w:rFonts w:cstheme="majorBidi" w:eastAsiaTheme="majorEastAsia"/>
       <w:i/>
       <w:iCs/>
-      <w:color w:themeColor="text1" w:themeTint="a6" w:val="595959"/>
+      <w:color w:themeColor="text1" w:themeTint="A6" w:val="595959"/>
     </w:rPr>
   </w:style>
   <w:style w:styleId="Heading7" w:type="paragraph">
-    <w:name w:val="Heading 7"/>
+    <w:name w:val="heading 7"/>
     <w:basedOn w:val="Normal"/>
     <w:next w:val="BodyText"/>
     <w:link w:val="Heading7Char"/>
@@ -8963,20 +9062,20 @@
     <w:semiHidden/>
     <w:unhideWhenUsed/>
     <w:qFormat/>
-    <w:rsid w:val="00a10fd9"/>
+    <w:rsid w:val="00A10FD9"/>
     <w:pPr>
-      <w:keepNext w:val="true"/>
+      <w:keepNext/>
       <w:keepLines/>
       <w:spacing w:after="0" w:before="40"/>
       <w:outlineLvl w:val="6"/>
     </w:pPr>
     <w:rPr>
-      <w:rFonts w:cs="" w:cstheme="majorBidi" w:eastAsia="" w:eastAsiaTheme="majorEastAsia"/>
-      <w:color w:themeColor="text1" w:themeTint="a6" w:val="595959"/>
+      <w:rFonts w:cstheme="majorBidi" w:eastAsiaTheme="majorEastAsia"/>
+      <w:color w:themeColor="text1" w:themeTint="A6" w:val="595959"/>
     </w:rPr>
   </w:style>
   <w:style w:styleId="Heading8" w:type="paragraph">
-    <w:name w:val="Heading 8"/>
+    <w:name w:val="heading 8"/>
     <w:basedOn w:val="Normal"/>
     <w:next w:val="BodyText"/>
     <w:link w:val="Heading8Char"/>
@@ -8984,22 +9083,22 @@
     <w:semiHidden/>
     <w:unhideWhenUsed/>
     <w:qFormat/>
-    <w:rsid w:val="00a10fd9"/>
+    <w:rsid w:val="00A10FD9"/>
     <w:pPr>
-      <w:keepNext w:val="true"/>
+      <w:keepNext/>
       <w:keepLines/>
-      <w:spacing w:after="0" w:before="0"/>
+      <w:spacing w:after="0"/>
       <w:outlineLvl w:val="7"/>
     </w:pPr>
     <w:rPr>
-      <w:rFonts w:cs="" w:cstheme="majorBidi" w:eastAsia="" w:eastAsiaTheme="majorEastAsia"/>
+      <w:rFonts w:cstheme="majorBidi" w:eastAsiaTheme="majorEastAsia"/>
       <w:i/>
       <w:iCs/>
-      <w:color w:themeColor="text1" w:themeTint="d8" w:val="272727"/>
+      <w:color w:themeColor="text1" w:themeTint="D8" w:val="272727"/>
     </w:rPr>
   </w:style>
   <w:style w:styleId="Heading9" w:type="paragraph">
-    <w:name w:val="Heading 9"/>
+    <w:name w:val="heading 9"/>
     <w:basedOn w:val="Normal"/>
     <w:next w:val="BodyText"/>
     <w:link w:val="Heading9Char"/>
@@ -9007,46 +9106,16 @@
     <w:semiHidden/>
     <w:unhideWhenUsed/>
     <w:qFormat/>
-    <w:rsid w:val="00a10fd9"/>
+    <w:rsid w:val="00A10FD9"/>
     <w:pPr>
-      <w:keepNext w:val="true"/>
+      <w:keepNext/>
       <w:keepLines/>
-      <w:spacing w:after="0" w:before="0"/>
+      <w:spacing w:after="0"/>
       <w:outlineLvl w:val="8"/>
     </w:pPr>
     <w:rPr>
-      <w:rFonts w:cs="" w:cstheme="majorBidi" w:eastAsia="" w:eastAsiaTheme="majorEastAsia"/>
-      <w:color w:themeColor="text1" w:themeTint="d8" w:val="272727"/>
-    </w:rPr>
-  </w:style>
-  <w:style w:customStyle="1" w:styleId="TitleChar" w:type="character">
-    <w:name w:val="Title Char"/>
-    <w:basedOn w:val="DefaultParagraphFont"/>
-    <w:link w:val="Title"/>
-    <w:uiPriority w:val="10"/>
-    <w:qFormat/>
-    <w:rsid w:val="00a10fd9"/>
-    <w:rPr>
-      <w:rFonts w:ascii="Aptos Display" w:asciiTheme="majorHAnsi" w:cs="" w:cstheme="majorBidi" w:eastAsia="" w:eastAsiaTheme="majorEastAsia" w:hAnsi="Aptos Display" w:hAnsiTheme="majorHAnsi"/>
-      <w:spacing w:val="-10"/>
-      <w:kern w:val="2"/>
-      <w:sz w:val="56"/>
-      <w:szCs w:val="56"/>
-    </w:rPr>
-  </w:style>
-  <w:style w:customStyle="1" w:styleId="SubtitleChar" w:type="character">
-    <w:name w:val="Subtitle Char"/>
-    <w:basedOn w:val="DefaultParagraphFont"/>
-    <w:link w:val="Subtitle"/>
-    <w:uiPriority w:val="11"/>
-    <w:qFormat/>
-    <w:rsid w:val="00a10fd9"/>
-    <w:rPr>
-      <w:rFonts w:cs="" w:cstheme="majorBidi" w:eastAsia="" w:eastAsiaTheme="majorEastAsia"/>
-      <w:color w:themeColor="text1" w:themeTint="a6" w:val="595959"/>
-      <w:spacing w:val="15"/>
-      <w:sz w:val="28"/>
-      <w:szCs w:val="28"/>
+      <w:rFonts w:cstheme="majorBidi" w:eastAsiaTheme="majorEastAsia"/>
+      <w:color w:themeColor="text1" w:themeTint="D8" w:val="272727"/>
     </w:rPr>
   </w:style>
   <w:style w:customStyle="1" w:styleId="Heading1Char" w:type="character">
@@ -9054,11 +9123,10 @@
     <w:basedOn w:val="DefaultParagraphFont"/>
     <w:link w:val="Heading1"/>
     <w:uiPriority w:val="9"/>
-    <w:qFormat/>
-    <w:rsid w:val="00a10fd9"/>
+    <w:rsid w:val="00A10FD9"/>
     <w:rPr>
-      <w:rFonts w:ascii="Aptos Display" w:asciiTheme="majorHAnsi" w:cs="" w:cstheme="majorBidi" w:eastAsia="" w:eastAsiaTheme="majorEastAsia" w:hAnsi="Aptos Display" w:hAnsiTheme="majorHAnsi"/>
-      <w:color w:themeColor="accent1" w:themeShade="bf" w:val="0F4761"/>
+      <w:rFonts w:asciiTheme="majorHAnsi" w:cstheme="majorBidi" w:eastAsiaTheme="majorEastAsia" w:hAnsiTheme="majorHAnsi"/>
+      <w:color w:themeColor="accent1" w:themeShade="BF" w:val="0F4761"/>
       <w:sz w:val="40"/>
       <w:szCs w:val="40"/>
     </w:rPr>
@@ -9069,11 +9137,10 @@
     <w:link w:val="Heading2"/>
     <w:uiPriority w:val="9"/>
     <w:semiHidden/>
-    <w:qFormat/>
-    <w:rsid w:val="00a10fd9"/>
+    <w:rsid w:val="00A10FD9"/>
     <w:rPr>
-      <w:rFonts w:ascii="Aptos Display" w:asciiTheme="majorHAnsi" w:cs="" w:cstheme="majorBidi" w:eastAsia="" w:eastAsiaTheme="majorEastAsia" w:hAnsi="Aptos Display" w:hAnsiTheme="majorHAnsi"/>
-      <w:color w:themeColor="accent1" w:themeShade="bf" w:val="0F4761"/>
+      <w:rFonts w:asciiTheme="majorHAnsi" w:cstheme="majorBidi" w:eastAsiaTheme="majorEastAsia" w:hAnsiTheme="majorHAnsi"/>
+      <w:color w:themeColor="accent1" w:themeShade="BF" w:val="0F4761"/>
       <w:sz w:val="32"/>
       <w:szCs w:val="32"/>
     </w:rPr>
@@ -9084,11 +9151,10 @@
     <w:link w:val="Heading3"/>
     <w:uiPriority w:val="9"/>
     <w:semiHidden/>
-    <w:qFormat/>
-    <w:rsid w:val="00a10fd9"/>
+    <w:rsid w:val="00A10FD9"/>
     <w:rPr>
-      <w:rFonts w:cs="" w:cstheme="majorBidi" w:eastAsia="" w:eastAsiaTheme="majorEastAsia"/>
-      <w:color w:themeColor="accent1" w:themeShade="bf" w:val="0F4761"/>
+      <w:rFonts w:cstheme="majorBidi" w:eastAsiaTheme="majorEastAsia"/>
+      <w:color w:themeColor="accent1" w:themeShade="BF" w:val="0F4761"/>
       <w:sz w:val="28"/>
       <w:szCs w:val="28"/>
     </w:rPr>
@@ -9099,13 +9165,12 @@
     <w:link w:val="Heading4"/>
     <w:uiPriority w:val="9"/>
     <w:semiHidden/>
-    <w:qFormat/>
-    <w:rsid w:val="00a10fd9"/>
+    <w:rsid w:val="00A10FD9"/>
     <w:rPr>
-      <w:rFonts w:cs="" w:cstheme="majorBidi" w:eastAsia="" w:eastAsiaTheme="majorEastAsia"/>
+      <w:rFonts w:cstheme="majorBidi" w:eastAsiaTheme="majorEastAsia"/>
       <w:i/>
       <w:iCs/>
-      <w:color w:themeColor="accent1" w:themeShade="bf" w:val="0F4761"/>
+      <w:color w:themeColor="accent1" w:themeShade="BF" w:val="0F4761"/>
     </w:rPr>
   </w:style>
   <w:style w:customStyle="1" w:styleId="Heading5Char" w:type="character">
@@ -9114,11 +9179,10 @@
     <w:link w:val="Heading5"/>
     <w:uiPriority w:val="9"/>
     <w:semiHidden/>
-    <w:qFormat/>
-    <w:rsid w:val="00a10fd9"/>
+    <w:rsid w:val="00A10FD9"/>
     <w:rPr>
-      <w:rFonts w:cs="" w:cstheme="majorBidi" w:eastAsia="" w:eastAsiaTheme="majorEastAsia"/>
-      <w:color w:themeColor="accent1" w:themeShade="bf" w:val="0F4761"/>
+      <w:rFonts w:cstheme="majorBidi" w:eastAsiaTheme="majorEastAsia"/>
+      <w:color w:themeColor="accent1" w:themeShade="BF" w:val="0F4761"/>
     </w:rPr>
   </w:style>
   <w:style w:customStyle="1" w:styleId="Heading6Char" w:type="character">
@@ -9127,13 +9191,12 @@
     <w:link w:val="Heading6"/>
     <w:uiPriority w:val="9"/>
     <w:semiHidden/>
-    <w:qFormat/>
-    <w:rsid w:val="00a10fd9"/>
+    <w:rsid w:val="00A10FD9"/>
     <w:rPr>
-      <w:rFonts w:cs="" w:cstheme="majorBidi" w:eastAsia="" w:eastAsiaTheme="majorEastAsia"/>
+      <w:rFonts w:cstheme="majorBidi" w:eastAsiaTheme="majorEastAsia"/>
       <w:i/>
       <w:iCs/>
-      <w:color w:themeColor="text1" w:themeTint="a6" w:val="595959"/>
+      <w:color w:themeColor="text1" w:themeTint="A6" w:val="595959"/>
     </w:rPr>
   </w:style>
   <w:style w:customStyle="1" w:styleId="Heading7Char" w:type="character">
@@ -9142,11 +9205,10 @@
     <w:link w:val="Heading7"/>
     <w:uiPriority w:val="9"/>
     <w:semiHidden/>
-    <w:qFormat/>
-    <w:rsid w:val="00a10fd9"/>
+    <w:rsid w:val="00A10FD9"/>
     <w:rPr>
-      <w:rFonts w:cs="" w:cstheme="majorBidi" w:eastAsia="" w:eastAsiaTheme="majorEastAsia"/>
-      <w:color w:themeColor="text1" w:themeTint="a6" w:val="595959"/>
+      <w:rFonts w:cstheme="majorBidi" w:eastAsiaTheme="majorEastAsia"/>
+      <w:color w:themeColor="text1" w:themeTint="A6" w:val="595959"/>
     </w:rPr>
   </w:style>
   <w:style w:customStyle="1" w:styleId="Heading8Char" w:type="character">
@@ -9155,13 +9217,12 @@
     <w:link w:val="Heading8"/>
     <w:uiPriority w:val="9"/>
     <w:semiHidden/>
-    <w:qFormat/>
-    <w:rsid w:val="00a10fd9"/>
+    <w:rsid w:val="00A10FD9"/>
     <w:rPr>
-      <w:rFonts w:cs="" w:cstheme="majorBidi" w:eastAsia="" w:eastAsiaTheme="majorEastAsia"/>
+      <w:rFonts w:cstheme="majorBidi" w:eastAsiaTheme="majorEastAsia"/>
       <w:i/>
       <w:iCs/>
-      <w:color w:themeColor="text1" w:themeTint="d8" w:val="272727"/>
+      <w:color w:themeColor="text1" w:themeTint="D8" w:val="272727"/>
     </w:rPr>
   </w:style>
   <w:style w:customStyle="1" w:styleId="Heading9Char" w:type="character">
@@ -9170,30 +9231,131 @@
     <w:link w:val="Heading9"/>
     <w:uiPriority w:val="9"/>
     <w:semiHidden/>
+    <w:rsid w:val="00A10FD9"/>
+    <w:rPr>
+      <w:rFonts w:cstheme="majorBidi" w:eastAsiaTheme="majorEastAsia"/>
+      <w:color w:themeColor="text1" w:themeTint="D8" w:val="272727"/>
+    </w:rPr>
+  </w:style>
+  <w:style w:styleId="BlockText" w:type="paragraph">
+    <w:name w:val="Block Text"/>
+    <w:basedOn w:val="BodyText"/>
+    <w:next w:val="BodyText"/>
+    <w:uiPriority w:val="9"/>
+    <w:unhideWhenUsed/>
     <w:qFormat/>
-    <w:rsid w:val="00a10fd9"/>
-    <w:rPr>
-      <w:rFonts w:cs="" w:cstheme="majorBidi" w:eastAsia="" w:eastAsiaTheme="majorEastAsia"/>
-      <w:color w:themeColor="text1" w:themeTint="d8" w:val="272727"/>
-    </w:rPr>
+    <w:pPr>
+      <w:spacing w:after="100" w:before="100"/>
+      <w:ind w:firstLine="0" w:left="480" w:right="480"/>
+    </w:pPr>
+  </w:style>
+  <w:style w:styleId="FootnoteText" w:type="paragraph">
+    <w:name w:val="Footnote Text"/>
+    <w:basedOn w:val="Normal"/>
+    <w:next w:val="FootnoteText"/>
+    <w:uiPriority w:val="9"/>
+    <w:unhideWhenUsed/>
+    <w:qFormat/>
+  </w:style>
+  <w:style w:styleId="FootnoteBlockText" w:type="paragraph">
+    <w:name w:val="Footnote Block Text"/>
+    <w:basedOn w:val="FootnoteText"/>
+    <w:next w:val="FootnoteText"/>
+    <w:uiPriority w:val="9"/>
+    <w:unhideWhenUsed/>
+    <w:qFormat/>
+    <w:pPr>
+      <w:spacing w:after="100" w:before="100"/>
+      <w:ind w:firstLine="0" w:left="480" w:right="480"/>
+    </w:pPr>
   </w:style>
   <w:style w:default="1" w:styleId="DefaultParagraphFont" w:type="character">
     <w:name w:val="Default Paragraph Font"/>
     <w:semiHidden/>
     <w:unhideWhenUsed/>
+  </w:style>
+  <w:style w:default="1" w:styleId="Table" w:type="table">
+    <w:name w:val="Table"/>
+    <w:basedOn w:val="TableNormal"/>
+    <w:semiHidden/>
+    <w:unhideWhenUsed/>
     <w:qFormat/>
-    <w:rPr/>
+    <w:tblPr>
+      <w:tblInd w:type="dxa" w:w="0"/>
+      <w:tblCellMar>
+        <w:top w:type="dxa" w:w="0"/>
+        <w:left w:type="dxa" w:w="108"/>
+        <w:bottom w:type="dxa" w:w="0"/>
+        <w:right w:type="dxa" w:w="108"/>
+      </w:tblCellMar>
+    </w:tblPr>
+    <w:tblStylePr w:type="firstRow">
+      <w:tcPr>
+        <w:tcBorders>
+          <w:bottom w:val="single"/>
+        </w:tcBorders>
+        <w:vAlign w:val="bottom"/>
+      </w:tcPr>
+    </w:tblStylePr>
+  </w:style>
+  <w:style w:customStyle="1" w:styleId="DefinitionTerm" w:type="paragraph">
+    <w:name w:val="Definition Term"/>
+    <w:basedOn w:val="Normal"/>
+    <w:next w:val="Definition"/>
+    <w:pPr>
+      <w:keepNext/>
+      <w:keepLines/>
+      <w:spacing w:after="0"/>
+    </w:pPr>
+    <w:rPr>
+      <w:b/>
+    </w:rPr>
+  </w:style>
+  <w:style w:customStyle="1" w:styleId="Definition" w:type="paragraph">
+    <w:name w:val="Definition"/>
+    <w:basedOn w:val="Normal"/>
+  </w:style>
+  <w:style w:styleId="Caption" w:type="paragraph">
+    <w:name w:val="Caption"/>
+    <w:basedOn w:val="Normal"/>
+    <w:link w:val="BodyTextChar"/>
+    <w:pPr>
+      <w:spacing w:after="120" w:before="0"/>
+    </w:pPr>
+    <w:rPr>
+      <w:i/>
+    </w:rPr>
+  </w:style>
+  <w:style w:customStyle="1" w:styleId="TableCaption" w:type="paragraph">
+    <w:name w:val="Table Caption"/>
+    <w:basedOn w:val="Caption"/>
+    <w:pPr>
+      <w:keepNext/>
+    </w:pPr>
+  </w:style>
+  <w:style w:customStyle="1" w:styleId="ImageCaption" w:type="paragraph">
+    <w:name w:val="Image Caption"/>
+    <w:basedOn w:val="Caption"/>
+  </w:style>
+  <w:style w:customStyle="1" w:styleId="Figure" w:type="paragraph">
+    <w:name w:val="Figure"/>
+    <w:basedOn w:val="Normal"/>
+  </w:style>
+  <w:style w:customStyle="1" w:styleId="CaptionedFigure" w:type="paragraph">
+    <w:name w:val="Captioned Figure"/>
+    <w:basedOn w:val="Figure"/>
+    <w:pPr>
+      <w:keepNext/>
+    </w:pPr>
   </w:style>
   <w:style w:customStyle="1" w:styleId="BodyTextChar" w:type="character">
     <w:name w:val="Body Text Char"/>
     <w:basedOn w:val="DefaultParagraphFont"/>
-    <w:qFormat/>
-    <w:rPr/>
+    <w:link w:val="BodyText"/>
   </w:style>
   <w:style w:customStyle="1" w:styleId="VerbatimChar" w:type="character">
     <w:name w:val="Verbatim Char"/>
     <w:basedOn w:val="BodyTextChar"/>
-    <w:qFormat/>
     <w:rPr>
       <w:rFonts w:ascii="Consolas" w:hAnsi="Consolas"/>
       <w:sz w:val="22"/>
@@ -9202,18 +9364,10 @@
   <w:style w:customStyle="1" w:styleId="SectionNumber" w:type="character">
     <w:name w:val="Section Number"/>
     <w:basedOn w:val="BodyTextChar"/>
-    <w:qFormat/>
-    <w:rPr/>
-  </w:style>
-  <w:style w:styleId="FootnoteCharacters" w:type="character">
-    <w:name w:val="Footnote Characters"/>
-    <w:qFormat/>
-    <w:rPr>
-      <w:vertAlign w:val="superscript"/>
-    </w:rPr>
   </w:style>
   <w:style w:styleId="FootnoteReference" w:type="character">
     <w:name w:val="Footnote Reference"/>
+    <w:basedOn w:val="BodyTextChar"/>
     <w:rPr>
       <w:vertAlign w:val="superscript"/>
     </w:rPr>
@@ -9225,313 +9379,6 @@
       <w:color w:themeColor="accent1" w:val="4F81BD"/>
     </w:rPr>
   </w:style>
-  <w:style w:styleId="EndnoteCharacters" w:type="character">
-    <w:name w:val="Endnote Characters"/>
-    <w:qFormat/>
-    <w:rPr>
-      <w:vertAlign w:val="superscript"/>
-    </w:rPr>
-  </w:style>
-  <w:style w:styleId="EndnoteReference" w:type="character">
-    <w:name w:val="Endnote Reference"/>
-    <w:rPr>
-      <w:vertAlign w:val="superscript"/>
-    </w:rPr>
-  </w:style>
-  <w:style w:styleId="Heading" w:type="paragraph">
-    <w:name w:val="Heading"/>
-    <w:basedOn w:val="Normal"/>
-    <w:next w:val="BodyText"/>
-    <w:qFormat/>
-    <w:pPr>
-      <w:keepNext w:val="true"/>
-      <w:spacing w:after="120" w:before="240"/>
-    </w:pPr>
-    <w:rPr>
-      <w:rFonts w:ascii="Liberation Sans" w:cs="Arial Unicode MS" w:eastAsia="PingFang SC" w:hAnsi="Liberation Sans"/>
-      <w:sz w:val="28"/>
-      <w:szCs w:val="28"/>
-    </w:rPr>
-  </w:style>
-  <w:style w:styleId="BodyText" w:type="paragraph">
-    <w:name w:val="Body Text"/>
-    <w:basedOn w:val="Normal"/>
-    <w:link w:val="BodyTextChar"/>
-    <w:qFormat/>
-    <w:pPr>
-      <w:spacing w:after="180" w:before="180" w:line="276" w:lineRule="auto"/>
-      <w:jc w:val="both"/>
-    </w:pPr>
-    <w:rPr/>
-  </w:style>
-  <w:style w:styleId="List" w:type="paragraph">
-    <w:name w:val="List"/>
-    <w:basedOn w:val="BodyText"/>
-    <w:pPr/>
-    <w:rPr>
-      <w:rFonts w:ascii="Times New Roman" w:cs="Arial Unicode MS" w:hAnsi="Times New Roman"/>
-    </w:rPr>
-  </w:style>
-  <w:style w:styleId="Caption" w:type="paragraph">
-    <w:name w:val="Caption"/>
-    <w:basedOn w:val="Normal"/>
-    <w:link w:val="BodyTextChar"/>
-    <w:qFormat/>
-    <w:pPr>
-      <w:spacing w:after="120" w:before="0"/>
-    </w:pPr>
-    <w:rPr>
-      <w:i/>
-    </w:rPr>
-  </w:style>
-  <w:style w:styleId="Index" w:type="paragraph">
-    <w:name w:val="Index"/>
-    <w:basedOn w:val="Normal"/>
-    <w:qFormat/>
-    <w:pPr>
-      <w:suppressLineNumbers/>
-    </w:pPr>
-    <w:rPr>
-      <w:rFonts w:ascii="Times New Roman" w:cs="Arial Unicode MS" w:hAnsi="Times New Roman"/>
-    </w:rPr>
-  </w:style>
-  <w:style w:customStyle="1" w:styleId="FirstParagraph" w:type="paragraph">
-    <w:name w:val="First Paragraph"/>
-    <w:basedOn w:val="BodyText"/>
-    <w:next w:val="BodyText"/>
-    <w:qFormat/>
-    <w:pPr>
-      <w:spacing w:line="276" w:lineRule="auto"/>
-      <w:jc w:val="both"/>
-    </w:pPr>
-    <w:rPr/>
-  </w:style>
-  <w:style w:customStyle="1" w:styleId="Compact" w:type="paragraph">
-    <w:name w:val="Compact"/>
-    <w:basedOn w:val="BodyText"/>
-    <w:qFormat/>
-    <w:pPr>
-      <w:spacing w:after="36" w:before="36"/>
-    </w:pPr>
-    <w:rPr/>
-  </w:style>
-  <w:style w:styleId="Title" w:type="paragraph">
-    <w:name w:val="Title"/>
-    <w:basedOn w:val="Normal"/>
-    <w:next w:val="BodyText"/>
-    <w:link w:val="TitleChar"/>
-    <w:uiPriority w:val="10"/>
-    <w:qFormat/>
-    <w:rsid w:val="00a10fd9"/>
-    <w:pPr>
-      <w:spacing w:after="230" w:before="0" w:line="240" w:lineRule="auto"/>
-      <w:contextualSpacing/>
-      <w:jc w:val="center"/>
-    </w:pPr>
-    <w:rPr>
-      <w:rFonts w:ascii="Aptos Display" w:asciiTheme="majorHAnsi" w:cs="" w:cstheme="majorBidi" w:eastAsia="" w:eastAsiaTheme="majorEastAsia" w:hAnsi="Aptos Display" w:hAnsiTheme="majorHAnsi"/>
-      <w:spacing w:val="-10"/>
-      <w:kern w:val="2"/>
-      <w:sz w:val="52"/>
-      <w:szCs w:val="56"/>
-    </w:rPr>
-  </w:style>
-  <w:style w:styleId="Subtitle" w:type="paragraph">
-    <w:name w:val="Subtitle"/>
-    <w:basedOn w:val="Normal"/>
-    <w:next w:val="BodyText"/>
-    <w:link w:val="SubtitleChar"/>
-    <w:uiPriority w:val="11"/>
-    <w:qFormat/>
-    <w:rsid w:val="00a10fd9"/>
-    <w:pPr/>
-    <w:rPr>
-      <w:rFonts w:cs="" w:cstheme="majorBidi" w:eastAsia="" w:eastAsiaTheme="majorEastAsia"/>
-      <w:color w:themeColor="text1" w:themeTint="a6" w:val="595959"/>
-      <w:spacing w:val="15"/>
-      <w:sz w:val="28"/>
-      <w:szCs w:val="28"/>
-    </w:rPr>
-  </w:style>
-  <w:style w:customStyle="1" w:styleId="Author" w:type="paragraph">
-    <w:name w:val="Author"/>
-    <w:next w:val="BodyText"/>
-    <w:qFormat/>
-    <w:pPr>
-      <w:keepNext w:val="true"/>
-      <w:keepLines/>
-      <w:widowControl/>
-      <w:suppressAutoHyphens w:val="true"/>
-      <w:bidi w:val="0"/>
-      <w:spacing w:after="115" w:before="115"/>
-      <w:contextualSpacing/>
-      <w:jc w:val="center"/>
-    </w:pPr>
-    <w:rPr>
-      <w:rFonts w:ascii="Aptos" w:asciiTheme="minorHAnsi" w:cs="" w:cstheme="minorBidi" w:eastAsia="Aptos" w:eastAsiaTheme="minorHAnsi" w:hAnsi="Aptos" w:hAnsiTheme="minorHAnsi"/>
-      <w:color w:val="auto"/>
-      <w:kern w:val="0"/>
-      <w:sz w:val="24"/>
-      <w:szCs w:val="24"/>
-      <w:lang w:bidi="ar-SA" w:eastAsia="en-US" w:val="en-US"/>
-    </w:rPr>
-  </w:style>
-  <w:style w:styleId="Date" w:type="paragraph">
-    <w:name w:val="Date"/>
-    <w:next w:val="BodyText"/>
-    <w:qFormat/>
-    <w:pPr>
-      <w:keepNext w:val="true"/>
-      <w:keepLines/>
-      <w:widowControl/>
-      <w:suppressAutoHyphens w:val="true"/>
-      <w:bidi w:val="0"/>
-      <w:spacing w:after="115" w:before="0"/>
-      <w:jc w:val="center"/>
-    </w:pPr>
-    <w:rPr>
-      <w:rFonts w:ascii="Aptos" w:asciiTheme="minorHAnsi" w:cs="" w:cstheme="minorBidi" w:eastAsia="Aptos" w:eastAsiaTheme="minorHAnsi" w:hAnsi="Aptos" w:hAnsiTheme="minorHAnsi"/>
-      <w:color w:val="auto"/>
-      <w:kern w:val="0"/>
-      <w:sz w:val="24"/>
-      <w:szCs w:val="24"/>
-      <w:lang w:bidi="ar-SA" w:eastAsia="en-US" w:val="en-US"/>
-    </w:rPr>
-  </w:style>
-  <w:style w:customStyle="1" w:styleId="AbstractTitle" w:type="paragraph">
-    <w:name w:val="Abstract Title"/>
-    <w:basedOn w:val="Normal"/>
-    <w:next w:val="Abstract"/>
-    <w:qFormat/>
-    <w:pPr>
-      <w:keepNext w:val="true"/>
-      <w:keepLines/>
-      <w:spacing w:after="0" w:before="300"/>
-      <w:jc w:val="center"/>
-    </w:pPr>
-    <w:rPr>
-      <w:b/>
-      <w:color w:val="345A8A"/>
-      <w:sz w:val="20"/>
-      <w:szCs w:val="20"/>
-    </w:rPr>
-  </w:style>
-  <w:style w:customStyle="1" w:styleId="Abstract" w:type="paragraph">
-    <w:name w:val="Abstract"/>
-    <w:basedOn w:val="Normal"/>
-    <w:next w:val="BodyText"/>
-    <w:qFormat/>
-    <w:pPr>
-      <w:keepNext w:val="true"/>
-      <w:keepLines/>
-      <w:spacing w:after="300" w:before="100"/>
-    </w:pPr>
-    <w:rPr>
-      <w:sz w:val="20"/>
-      <w:szCs w:val="20"/>
-    </w:rPr>
-  </w:style>
-  <w:style w:styleId="Bibliography" w:type="paragraph">
-    <w:name w:val="Bibliography"/>
-    <w:basedOn w:val="Normal"/>
-    <w:qFormat/>
-    <w:pPr/>
-    <w:rPr/>
-  </w:style>
-  <w:style w:styleId="BlockText" w:type="paragraph">
-    <w:name w:val="Block Text"/>
-    <w:basedOn w:val="BodyText"/>
-    <w:next w:val="BodyText"/>
-    <w:uiPriority w:val="9"/>
-    <w:unhideWhenUsed/>
-    <w:qFormat/>
-    <w:pPr>
-      <w:spacing w:after="100" w:before="100"/>
-      <w:ind w:hanging="0" w:left="480" w:right="480"/>
-    </w:pPr>
-    <w:rPr/>
-  </w:style>
-  <w:style w:styleId="FootnoteText" w:type="paragraph">
-    <w:name w:val="Footnote Text"/>
-    <w:basedOn w:val="Normal"/>
-    <w:uiPriority w:val="9"/>
-    <w:unhideWhenUsed/>
-    <w:qFormat/>
-    <w:pPr/>
-    <w:rPr/>
-  </w:style>
-  <w:style w:styleId="FootnoteBlockText" w:type="paragraph">
-    <w:name w:val="Footnote Block Text"/>
-    <w:basedOn w:val="FootnoteText"/>
-    <w:next w:val="FootnoteText"/>
-    <w:uiPriority w:val="9"/>
-    <w:unhideWhenUsed/>
-    <w:qFormat/>
-    <w:pPr>
-      <w:spacing w:after="100" w:before="100"/>
-      <w:ind w:hanging="0" w:left="480" w:right="480"/>
-    </w:pPr>
-    <w:rPr/>
-  </w:style>
-  <w:style w:customStyle="1" w:styleId="DefinitionTerm" w:type="paragraph">
-    <w:name w:val="Definition Term"/>
-    <w:basedOn w:val="Normal"/>
-    <w:next w:val="Definition"/>
-    <w:qFormat/>
-    <w:pPr>
-      <w:keepNext w:val="true"/>
-      <w:keepLines/>
-      <w:spacing w:after="0" w:before="0"/>
-    </w:pPr>
-    <w:rPr>
-      <w:b/>
-    </w:rPr>
-  </w:style>
-  <w:style w:customStyle="1" w:styleId="Definition" w:type="paragraph">
-    <w:name w:val="Definition"/>
-    <w:basedOn w:val="Normal"/>
-    <w:qFormat/>
-    <w:pPr/>
-    <w:rPr/>
-  </w:style>
-  <w:style w:customStyle="1" w:styleId="TableCaption" w:type="paragraph">
-    <w:name w:val="Table Caption"/>
-    <w:basedOn w:val="Caption"/>
-    <w:qFormat/>
-    <w:pPr>
-      <w:keepNext w:val="true"/>
-    </w:pPr>
-    <w:rPr/>
-  </w:style>
-  <w:style w:customStyle="1" w:styleId="ImageCaption" w:type="paragraph">
-    <w:name w:val="Image Caption"/>
-    <w:basedOn w:val="Caption"/>
-    <w:qFormat/>
-    <w:pPr/>
-    <w:rPr/>
-  </w:style>
-  <w:style w:customStyle="1" w:styleId="Figure" w:type="paragraph">
-    <w:name w:val="Figure"/>
-    <w:basedOn w:val="Normal"/>
-    <w:qFormat/>
-    <w:pPr/>
-    <w:rPr/>
-  </w:style>
-  <w:style w:customStyle="1" w:styleId="CaptionedFigure" w:type="paragraph">
-    <w:name w:val="Captioned Figure"/>
-    <w:basedOn w:val="Figure"/>
-    <w:qFormat/>
-    <w:pPr>
-      <w:keepNext w:val="true"/>
-    </w:pPr>
-    <w:rPr/>
-  </w:style>
-  <w:style w:styleId="IndexHeading" w:type="paragraph">
-    <w:name w:val="Index Heading"/>
-    <w:basedOn w:val="Heading"/>
-    <w:pPr/>
-    <w:rPr/>
-  </w:style>
   <w:style w:styleId="TOCHeading" w:type="paragraph">
     <w:name w:val="TOC Heading"/>
     <w:basedOn w:val="Heading1"/>
@@ -9540,70 +9387,15 @@
     <w:unhideWhenUsed/>
     <w:qFormat/>
     <w:pPr>
-      <w:spacing w:after="80" w:before="240" w:line="259" w:lineRule="auto"/>
+      <w:spacing w:before="240" w:line="259" w:lineRule="auto"/>
       <w:outlineLvl w:val="9"/>
     </w:pPr>
     <w:rPr>
-      <w:rFonts w:ascii="Aptos Display" w:asciiTheme="majorHAnsi" w:cs="" w:cstheme="majorBidi" w:eastAsia="" w:eastAsiaTheme="majorEastAsia" w:hAnsi="Aptos Display" w:hAnsiTheme="majorHAnsi"/>
-      <w:b w:val="false"/>
-      <w:bCs w:val="false"/>
-      <w:color w:themeColor="accent1" w:themeShade="bf" w:val="365F91"/>
+      <w:rFonts w:asciiTheme="majorHAnsi" w:cstheme="majorBidi" w:eastAsiaTheme="majorEastAsia" w:hAnsiTheme="majorHAnsi"/>
+      <w:b w:val="0"/>
+      <w:bCs w:val="0"/>
+      <w:color w:themeColor="accent1" w:themeShade="BF" w:val="365F91"/>
     </w:rPr>
-  </w:style>
-  <w:style w:styleId="BodyTextIndent" w:type="paragraph">
-    <w:name w:val="Body Text Indent"/>
-    <w:basedOn w:val="BodyText"/>
-    <w:pPr>
-      <w:ind w:hanging="0" w:left="283"/>
-    </w:pPr>
-    <w:rPr/>
-  </w:style>
-  <w:style w:styleId="HeaderandFooter" w:type="paragraph">
-    <w:name w:val="Header and Footer"/>
-    <w:basedOn w:val="Normal"/>
-    <w:qFormat/>
-    <w:pPr>
-      <w:suppressLineNumbers/>
-      <w:tabs>
-        <w:tab w:pos="720" w:val="clear"/>
-        <w:tab w:leader="none" w:pos="4680" w:val="center"/>
-        <w:tab w:leader="none" w:pos="9360" w:val="right"/>
-      </w:tabs>
-    </w:pPr>
-    <w:rPr/>
-  </w:style>
-  <w:style w:styleId="Footer" w:type="paragraph">
-    <w:name w:val="Footer"/>
-    <w:basedOn w:val="HeaderandFooter"/>
-    <w:pPr>
-      <w:suppressLineNumbers/>
-      <w:jc w:val="right"/>
-    </w:pPr>
-    <w:rPr/>
-  </w:style>
-  <w:style w:default="1" w:styleId="Table" w:type="table">
-    <w:name w:val="Table"/>
-    <w:basedOn w:val="TableNormal"/>
-    <w:semiHidden/>
-    <w:unhideWhenUsed/>
-    <w:qFormat/>
-    <w:tblPr>
-      <w:tblCellMar>
-        <w:top w:type="dxa" w:w="0"/>
-        <w:left w:type="dxa" w:w="108"/>
-        <w:bottom w:type="dxa" w:w="0"/>
-        <w:right w:type="dxa" w:w="108"/>
-      </w:tblCellMar>
-    </w:tblPr>
-    <w:tblStylePr w:type="firstRow">
-      <w:tblPr/>
-      <w:tcPr>
-        <w:tcBorders>
-          <w:bottom w:val="single"/>
-        </w:tcBorders>
-        <w:vAlign w:val="bottom"/>
-      </w:tcPr>
-    </w:tblStylePr>
   </w:style>
   <w:style w:type="paragraph" w:customStyle="1" w:styleId="SourceCode">
     <w:name w:val="Source Code"/>
@@ -9871,97 +9663,195 @@
 </file>
 
 <file path=word/theme/theme1.xml><?xml version="1.0" encoding="utf-8"?>
-<a:theme xmlns:a="http://schemas.openxmlformats.org/drawingml/2006/main" xmlns:r="http://schemas.openxmlformats.org/officeDocument/2006/relationships" name="Office Theme">
+<a:theme xmlns:a="http://schemas.openxmlformats.org/drawingml/2006/main" name="Office Theme">
   <a:themeElements>
     <a:clrScheme name="Office">
       <a:dk1>
-        <a:srgbClr val="000000"/>
+        <a:sysClr val="windowText" lastClr="000000"/>
       </a:dk1>
       <a:lt1>
-        <a:srgbClr val="ffffff"/>
+        <a:sysClr val="window" lastClr="FFFFFF"/>
       </a:lt1>
       <a:dk2>
-        <a:srgbClr val="0e2841"/>
+        <a:srgbClr val="0E2841"/>
       </a:dk2>
       <a:lt2>
-        <a:srgbClr val="e8e8e8"/>
+        <a:srgbClr val="E8E8E8"/>
       </a:lt2>
       <a:accent1>
         <a:srgbClr val="156082"/>
       </a:accent1>
       <a:accent2>
-        <a:srgbClr val="e97132"/>
+        <a:srgbClr val="E97132"/>
       </a:accent2>
       <a:accent3>
-        <a:srgbClr val="196b24"/>
+        <a:srgbClr val="196B24"/>
       </a:accent3>
       <a:accent4>
-        <a:srgbClr val="0f9ed5"/>
+        <a:srgbClr val="0F9ED5"/>
       </a:accent4>
       <a:accent5>
-        <a:srgbClr val="a02b93"/>
+        <a:srgbClr val="A02B93"/>
       </a:accent5>
       <a:accent6>
-        <a:srgbClr val="4ea72e"/>
+        <a:srgbClr val="4EA72E"/>
       </a:accent6>
       <a:hlink>
         <a:srgbClr val="467886"/>
       </a:hlink>
       <a:folHlink>
-        <a:srgbClr val="96607d"/>
+        <a:srgbClr val="96607D"/>
       </a:folHlink>
     </a:clrScheme>
     <a:fontScheme name="Office">
       <a:majorFont>
-        <a:latin typeface="Aptos Display" panose="02110004020202020204" pitchFamily="0" charset="1"/>
+        <a:latin typeface="Aptos Display" panose="02110004020202020204"/>
         <a:ea typeface=""/>
         <a:cs typeface=""/>
+        <a:font script="Jpan" typeface="游ゴシック Light"/>
+        <a:font script="Hang" typeface="맑은 고딕"/>
+        <a:font script="Hans" typeface="等线 Light"/>
+        <a:font script="Hant" typeface="新細明體"/>
+        <a:font script="Arab" typeface="Times New Roman"/>
+        <a:font script="Hebr" typeface="Times New Roman"/>
+        <a:font script="Thai" typeface="Angsana New"/>
+        <a:font script="Ethi" typeface="Nyala"/>
+        <a:font script="Beng" typeface="Vrinda"/>
+        <a:font script="Gujr" typeface="Shruti"/>
+        <a:font script="Khmr" typeface="MoolBoran"/>
+        <a:font script="Knda" typeface="Tunga"/>
+        <a:font script="Guru" typeface="Raavi"/>
+        <a:font script="Cans" typeface="Euphemia"/>
+        <a:font script="Cher" typeface="Plantagenet Cherokee"/>
+        <a:font script="Yiii" typeface="Microsoft Yi Baiti"/>
+        <a:font script="Tibt" typeface="Microsoft Himalaya"/>
+        <a:font script="Thaa" typeface="MV Boli"/>
+        <a:font script="Deva" typeface="Mangal"/>
+        <a:font script="Telu" typeface="Gautami"/>
+        <a:font script="Taml" typeface="Latha"/>
+        <a:font script="Syrc" typeface="Estrangelo Edessa"/>
+        <a:font script="Orya" typeface="Kalinga"/>
+        <a:font script="Mlym" typeface="Kartika"/>
+        <a:font script="Laoo" typeface="DokChampa"/>
+        <a:font script="Sinh" typeface="Iskoola Pota"/>
+        <a:font script="Mong" typeface="Mongolian Baiti"/>
+        <a:font script="Viet" typeface="Times New Roman"/>
+        <a:font script="Uigh" typeface="Microsoft Uighur"/>
+        <a:font script="Geor" typeface="Sylfaen"/>
+        <a:font script="Armn" typeface="Arial"/>
+        <a:font script="Bugi" typeface="Leelawadee UI"/>
+        <a:font script="Bopo" typeface="Microsoft JhengHei"/>
+        <a:font script="Java" typeface="Javanese Text"/>
+        <a:font script="Lisu" typeface="Segoe UI"/>
+        <a:font script="Mymr" typeface="Myanmar Text"/>
+        <a:font script="Nkoo" typeface="Ebrima"/>
+        <a:font script="Olck" typeface="Nirmala UI"/>
+        <a:font script="Osma" typeface="Ebrima"/>
+        <a:font script="Phag" typeface="Phagspa"/>
+        <a:font script="Syrn" typeface="Estrangelo Edessa"/>
+        <a:font script="Syrj" typeface="Estrangelo Edessa"/>
+        <a:font script="Syre" typeface="Estrangelo Edessa"/>
+        <a:font script="Sora" typeface="Nirmala UI"/>
+        <a:font script="Tale" typeface="Microsoft Tai Le"/>
+        <a:font script="Talu" typeface="Microsoft New Tai Lue"/>
+        <a:font script="Tfng" typeface="Ebrima"/>
       </a:majorFont>
       <a:minorFont>
-        <a:latin typeface="Aptos" panose="02110004020202020204" pitchFamily="0" charset="1"/>
+        <a:latin typeface="Aptos" panose="02110004020202020204"/>
         <a:ea typeface=""/>
         <a:cs typeface=""/>
+        <a:font script="Jpan" typeface="游明朝"/>
+        <a:font script="Hang" typeface="맑은 고딕"/>
+        <a:font script="Hans" typeface="等线"/>
+        <a:font script="Hant" typeface="新細明體"/>
+        <a:font script="Arab" typeface="Arial"/>
+        <a:font script="Hebr" typeface="Arial"/>
+        <a:font script="Thai" typeface="Cordia New"/>
+        <a:font script="Ethi" typeface="Nyala"/>
+        <a:font script="Beng" typeface="Vrinda"/>
+        <a:font script="Gujr" typeface="Shruti"/>
+        <a:font script="Khmr" typeface="DaunPenh"/>
+        <a:font script="Knda" typeface="Tunga"/>
+        <a:font script="Guru" typeface="Raavi"/>
+        <a:font script="Cans" typeface="Euphemia"/>
+        <a:font script="Cher" typeface="Plantagenet Cherokee"/>
+        <a:font script="Yiii" typeface="Microsoft Yi Baiti"/>
+        <a:font script="Tibt" typeface="Microsoft Himalaya"/>
+        <a:font script="Thaa" typeface="MV Boli"/>
+        <a:font script="Deva" typeface="Mangal"/>
+        <a:font script="Telu" typeface="Gautami"/>
+        <a:font script="Taml" typeface="Latha"/>
+        <a:font script="Syrc" typeface="Estrangelo Edessa"/>
+        <a:font script="Orya" typeface="Kalinga"/>
+        <a:font script="Mlym" typeface="Kartika"/>
+        <a:font script="Laoo" typeface="DokChampa"/>
+        <a:font script="Sinh" typeface="Iskoola Pota"/>
+        <a:font script="Mong" typeface="Mongolian Baiti"/>
+        <a:font script="Viet" typeface="Arial"/>
+        <a:font script="Uigh" typeface="Microsoft Uighur"/>
+        <a:font script="Geor" typeface="Sylfaen"/>
+        <a:font script="Armn" typeface="Arial"/>
+        <a:font script="Bugi" typeface="Leelawadee UI"/>
+        <a:font script="Bopo" typeface="Microsoft JhengHei"/>
+        <a:font script="Java" typeface="Javanese Text"/>
+        <a:font script="Lisu" typeface="Segoe UI"/>
+        <a:font script="Mymr" typeface="Myanmar Text"/>
+        <a:font script="Nkoo" typeface="Ebrima"/>
+        <a:font script="Olck" typeface="Nirmala UI"/>
+        <a:font script="Osma" typeface="Ebrima"/>
+        <a:font script="Phag" typeface="Phagspa"/>
+        <a:font script="Syrn" typeface="Estrangelo Edessa"/>
+        <a:font script="Syrj" typeface="Estrangelo Edessa"/>
+        <a:font script="Syre" typeface="Estrangelo Edessa"/>
+        <a:font script="Sora" typeface="Nirmala UI"/>
+        <a:font script="Tale" typeface="Microsoft Tai Le"/>
+        <a:font script="Talu" typeface="Microsoft New Tai Lue"/>
+        <a:font script="Tfng" typeface="Ebrima"/>
       </a:minorFont>
     </a:fontScheme>
-    <a:fmtScheme>
+    <a:fmtScheme name="Office">
       <a:fillStyleLst>
         <a:solidFill>
           <a:schemeClr val="phClr"/>
         </a:solidFill>
-        <a:gradFill>
+        <a:gradFill rotWithShape="1">
           <a:gsLst>
             <a:gs pos="0">
               <a:schemeClr val="phClr">
                 <a:lumMod val="110000"/>
+                <a:satMod val="105000"/>
                 <a:tint val="67000"/>
               </a:schemeClr>
             </a:gs>
             <a:gs pos="50000">
               <a:schemeClr val="phClr">
                 <a:lumMod val="105000"/>
+                <a:satMod val="103000"/>
                 <a:tint val="73000"/>
               </a:schemeClr>
             </a:gs>
             <a:gs pos="100000">
               <a:schemeClr val="phClr">
                 <a:lumMod val="105000"/>
+                <a:satMod val="109000"/>
                 <a:tint val="81000"/>
               </a:schemeClr>
             </a:gs>
           </a:gsLst>
           <a:lin ang="5400000" scaled="0"/>
-          <a:tileRect l="0" t="0" r="0" b="0"/>
         </a:gradFill>
-        <a:gradFill>
+        <a:gradFill rotWithShape="1">
           <a:gsLst>
             <a:gs pos="0">
               <a:schemeClr val="phClr">
+                <a:satMod val="103000"/>
                 <a:lumMod val="102000"/>
                 <a:tint val="94000"/>
               </a:schemeClr>
             </a:gs>
             <a:gs pos="50000">
               <a:schemeClr val="phClr">
+                <a:satMod val="110000"/>
                 <a:lumMod val="100000"/>
                 <a:shade val="100000"/>
               </a:schemeClr>
@@ -9969,24 +9859,33 @@
             <a:gs pos="100000">
               <a:schemeClr val="phClr">
                 <a:lumMod val="99000"/>
+                <a:satMod val="120000"/>
                 <a:shade val="78000"/>
               </a:schemeClr>
             </a:gs>
           </a:gsLst>
           <a:lin ang="5400000" scaled="0"/>
-          <a:tileRect l="0" t="0" r="0" b="0"/>
         </a:gradFill>
       </a:fillStyleLst>
       <a:lnStyleLst>
         <a:ln w="6350" cap="flat" cmpd="sng" algn="ctr">
+          <a:solidFill>
+            <a:schemeClr val="phClr"/>
+          </a:solidFill>
           <a:prstDash val="solid"/>
           <a:miter lim="800000"/>
         </a:ln>
         <a:ln w="12700" cap="flat" cmpd="sng" algn="ctr">
+          <a:solidFill>
+            <a:schemeClr val="phClr"/>
+          </a:solidFill>
           <a:prstDash val="solid"/>
           <a:miter lim="800000"/>
         </a:ln>
         <a:ln w="19050" cap="flat" cmpd="sng" algn="ctr">
+          <a:solidFill>
+            <a:schemeClr val="phClr"/>
+          </a:solidFill>
           <a:prstDash val="solid"/>
           <a:miter lim="800000"/>
         </a:ln>
@@ -9999,7 +9898,13 @@
           <a:effectLst/>
         </a:effectStyle>
         <a:effectStyle>
-          <a:effectLst/>
+          <a:effectLst>
+            <a:outerShdw blurRad="57150" dist="19050" dir="5400000" algn="ctr" rotWithShape="0">
+              <a:srgbClr val="000000">
+                <a:alpha val="63000"/>
+              </a:srgbClr>
+            </a:outerShdw>
+          </a:effectLst>
         </a:effectStyle>
       </a:effectStyleLst>
       <a:bgFillStyleLst>
@@ -10009,13 +9914,15 @@
         <a:solidFill>
           <a:schemeClr val="phClr">
             <a:tint val="95000"/>
+            <a:satMod val="170000"/>
           </a:schemeClr>
         </a:solidFill>
-        <a:gradFill>
+        <a:gradFill rotWithShape="1">
           <a:gsLst>
             <a:gs pos="0">
               <a:schemeClr val="phClr">
                 <a:tint val="93000"/>
+                <a:satMod val="150000"/>
                 <a:shade val="98000"/>
                 <a:lumMod val="102000"/>
               </a:schemeClr>
@@ -10023,6 +9930,7 @@
             <a:gs pos="50000">
               <a:schemeClr val="phClr">
                 <a:tint val="98000"/>
+                <a:satMod val="130000"/>
                 <a:shade val="90000"/>
                 <a:lumMod val="103000"/>
               </a:schemeClr>
@@ -10030,14 +9938,21 @@
             <a:gs pos="100000">
               <a:schemeClr val="phClr">
                 <a:shade val="63000"/>
+                <a:satMod val="120000"/>
               </a:schemeClr>
             </a:gs>
           </a:gsLst>
           <a:lin ang="5400000" scaled="0"/>
-          <a:tileRect l="0" t="0" r="0" b="0"/>
         </a:gradFill>
       </a:bgFillStyleLst>
     </a:fmtScheme>
   </a:themeElements>
+  <a:objectDefaults/>
+  <a:extraClrSchemeLst/>
+  <a:extLst>
+    <a:ext uri="{05A4C25C-085E-4340-85A3-A5531E510DB2}">
+      <thm15:themeFamily xmlns:thm15="http://schemas.microsoft.com/office/thememl/2012/main" name="Office Theme" id="{2E142A2C-CD16-42D6-873A-C26D2A0506FA}" vid="{1BDDFF52-6CD6-40A5-AB3C-68EB2F1E4D0A}"/>
+    </a:ext>
+  </a:extLst>
 </a:theme>
 </file>
</xml_diff>